<commit_message>
doc2 / correcion de errores en acta
</commit_message>
<xml_diff>
--- a/DocumentoCompProyectoMercados_GCC.docx
+++ b/DocumentoCompProyectoMercados_GCC.docx
@@ -1442,7 +1442,14 @@
           <w:rFonts w:ascii="Arial" w:hAnsi="Arial" w:cs="Arial"/>
           <w:lang w:val="es-ES"/>
         </w:rPr>
-        <w:t>Gerente del Proyecto: Gadiel Cordova</w:t>
+        <w:t>Líder</w:t>
+      </w:r>
+      <w:r>
+        <w:rPr>
+          <w:rFonts w:ascii="Arial" w:hAnsi="Arial" w:cs="Arial"/>
+          <w:lang w:val="es-ES"/>
+        </w:rPr>
+        <w:t xml:space="preserve"> del Proyecto: Gadiel Cordova</w:t>
       </w:r>
     </w:p>
     <w:p>
@@ -2246,21 +2253,7 @@
           <w:rFonts w:ascii="Arial" w:hAnsi="Arial" w:cs="Arial"/>
           <w:lang w:val="es-ES"/>
         </w:rPr>
-        <w:t xml:space="preserve">1 </w:t>
-      </w:r>
-      <w:r>
-        <w:rPr>
-          <w:rFonts w:ascii="Arial" w:hAnsi="Arial" w:cs="Arial"/>
-          <w:lang w:val="es-ES"/>
-        </w:rPr>
-        <w:t>líder</w:t>
-      </w:r>
-      <w:r>
-        <w:rPr>
-          <w:rFonts w:ascii="Arial" w:hAnsi="Arial" w:cs="Arial"/>
-          <w:lang w:val="es-ES"/>
-        </w:rPr>
-        <w:t xml:space="preserve"> de Proyecto (Project Manager).</w:t>
+        <w:t>1 líder de Proyecto (Project Manager).</w:t>
       </w:r>
     </w:p>
     <w:p>
@@ -2287,21 +2280,7 @@
           <w:lang w:val="es-ES"/>
         </w:rPr>
         <w:lastRenderedPageBreak/>
-        <w:t xml:space="preserve">1 </w:t>
-      </w:r>
-      <w:r>
-        <w:rPr>
-          <w:rFonts w:ascii="Arial" w:hAnsi="Arial" w:cs="Arial"/>
-          <w:lang w:val="es-ES"/>
-        </w:rPr>
-        <w:t>desarrollador</w:t>
-      </w:r>
-      <w:r>
-        <w:rPr>
-          <w:rFonts w:ascii="Arial" w:hAnsi="Arial" w:cs="Arial"/>
-          <w:lang w:val="es-ES"/>
-        </w:rPr>
-        <w:t xml:space="preserve"> Senior.</w:t>
+        <w:t>1 desarrollador Senior.</w:t>
       </w:r>
     </w:p>
     <w:p>
@@ -2327,21 +2306,7 @@
           <w:rFonts w:ascii="Arial" w:hAnsi="Arial" w:cs="Arial"/>
           <w:lang w:val="es-ES"/>
         </w:rPr>
-        <w:t xml:space="preserve">2 </w:t>
-      </w:r>
-      <w:r>
-        <w:rPr>
-          <w:rFonts w:ascii="Arial" w:hAnsi="Arial" w:cs="Arial"/>
-          <w:lang w:val="es-ES"/>
-        </w:rPr>
-        <w:t>desarrolladores</w:t>
-      </w:r>
-      <w:r>
-        <w:rPr>
-          <w:rFonts w:ascii="Arial" w:hAnsi="Arial" w:cs="Arial"/>
-          <w:lang w:val="es-ES"/>
-        </w:rPr>
-        <w:t xml:space="preserve"> Junior.</w:t>
+        <w:t>2 desarrolladores Junior.</w:t>
       </w:r>
     </w:p>
     <w:p>
@@ -2367,21 +2332,7 @@
           <w:rFonts w:ascii="Arial" w:hAnsi="Arial" w:cs="Arial"/>
           <w:lang w:val="es-ES"/>
         </w:rPr>
-        <w:t xml:space="preserve">1 </w:t>
-      </w:r>
-      <w:r>
-        <w:rPr>
-          <w:rFonts w:ascii="Arial" w:hAnsi="Arial" w:cs="Arial"/>
-          <w:lang w:val="es-ES"/>
-        </w:rPr>
-        <w:t>analista</w:t>
-      </w:r>
-      <w:r>
-        <w:rPr>
-          <w:rFonts w:ascii="Arial" w:hAnsi="Arial" w:cs="Arial"/>
-          <w:lang w:val="es-ES"/>
-        </w:rPr>
-        <w:t xml:space="preserve"> de Calidad (QA).</w:t>
+        <w:t>1 analista de Calidad (QA).</w:t>
       </w:r>
     </w:p>
     <w:p>
@@ -2407,21 +2358,7 @@
           <w:rFonts w:ascii="Arial" w:hAnsi="Arial" w:cs="Arial"/>
           <w:lang w:val="es-ES"/>
         </w:rPr>
-        <w:t xml:space="preserve">1 </w:t>
-      </w:r>
-      <w:r>
-        <w:rPr>
-          <w:rFonts w:ascii="Arial" w:hAnsi="Arial" w:cs="Arial"/>
-          <w:lang w:val="es-ES"/>
-        </w:rPr>
-        <w:t>documentador</w:t>
-      </w:r>
-      <w:r>
-        <w:rPr>
-          <w:rFonts w:ascii="Arial" w:hAnsi="Arial" w:cs="Arial"/>
-          <w:lang w:val="es-ES"/>
-        </w:rPr>
-        <w:t>.</w:t>
+        <w:t>1 documentador.</w:t>
       </w:r>
     </w:p>
     <w:p>
@@ -4632,39 +4569,12 @@
   </w:num>
   <w:num w:numId="14">
     <w:abstractNumId w:val="7"/>
-    <w:lvlOverride w:ilvl="0"/>
-    <w:lvlOverride w:ilvl="1"/>
-    <w:lvlOverride w:ilvl="2"/>
-    <w:lvlOverride w:ilvl="3"/>
-    <w:lvlOverride w:ilvl="4"/>
-    <w:lvlOverride w:ilvl="5"/>
-    <w:lvlOverride w:ilvl="6"/>
-    <w:lvlOverride w:ilvl="7"/>
-    <w:lvlOverride w:ilvl="8"/>
   </w:num>
   <w:num w:numId="15">
     <w:abstractNumId w:val="13"/>
-    <w:lvlOverride w:ilvl="0"/>
-    <w:lvlOverride w:ilvl="1"/>
-    <w:lvlOverride w:ilvl="2"/>
-    <w:lvlOverride w:ilvl="3"/>
-    <w:lvlOverride w:ilvl="4"/>
-    <w:lvlOverride w:ilvl="5"/>
-    <w:lvlOverride w:ilvl="6"/>
-    <w:lvlOverride w:ilvl="7"/>
-    <w:lvlOverride w:ilvl="8"/>
   </w:num>
   <w:num w:numId="16">
     <w:abstractNumId w:val="1"/>
-    <w:lvlOverride w:ilvl="0"/>
-    <w:lvlOverride w:ilvl="1"/>
-    <w:lvlOverride w:ilvl="2"/>
-    <w:lvlOverride w:ilvl="3"/>
-    <w:lvlOverride w:ilvl="4"/>
-    <w:lvlOverride w:ilvl="5"/>
-    <w:lvlOverride w:ilvl="6"/>
-    <w:lvlOverride w:ilvl="7"/>
-    <w:lvlOverride w:ilvl="8"/>
   </w:num>
 </w:numbering>
 </file>
@@ -5156,6 +5066,7 @@
   <w:style w:type="character" w:default="1" w:styleId="Fuentedeprrafopredeter">
     <w:name w:val="Default Paragraph Font"/>
     <w:uiPriority w:val="1"/>
+    <w:semiHidden/>
     <w:unhideWhenUsed/>
   </w:style>
   <w:style w:type="table" w:default="1" w:styleId="Tablanormal">

</xml_diff>

<commit_message>
doc3 / definicion metodologia y solicitud de proyecto
</commit_message>
<xml_diff>
--- a/DocumentoCompProyectoMercados_GCC.docx
+++ b/DocumentoCompProyectoMercados_GCC.docx
@@ -2363,6 +2363,338 @@
     </w:p>
     <w:p>
       <w:pPr>
+        <w:rPr>
+          <w:rFonts w:ascii="Arial" w:hAnsi="Arial" w:cs="Arial"/>
+          <w:lang w:val="es-ES"/>
+        </w:rPr>
+      </w:pPr>
+    </w:p>
+    <w:p>
+      <w:pPr>
+        <w:pStyle w:val="Ttulo1"/>
+        <w:jc w:val="both"/>
+      </w:pPr>
+      <w:r>
+        <w:t>DOCUMENTO DE METODOLOGÍA DE DESARROLLO</w:t>
+      </w:r>
+    </w:p>
+    <w:p>
+      <w:pPr>
+        <w:pStyle w:val="Ttulo2"/>
+        <w:jc w:val="both"/>
+      </w:pPr>
+      <w:r>
+        <w:t>Enfoque Seleccionado: Metodología Híbrida</w:t>
+      </w:r>
+    </w:p>
+    <w:p>
+      <w:pPr>
+        <w:spacing w:line="360" w:lineRule="auto"/>
+        <w:ind w:left="708"/>
+        <w:jc w:val="both"/>
+        <w:rPr>
+          <w:rFonts w:ascii="Arial" w:hAnsi="Arial" w:cs="Arial"/>
+          <w:lang w:val="es-ES"/>
+        </w:rPr>
+      </w:pPr>
+      <w:r>
+        <w:rPr>
+          <w:rFonts w:ascii="Arial" w:hAnsi="Arial" w:cs="Arial"/>
+          <w:lang w:val="es-ES"/>
+        </w:rPr>
+        <w:t>Para el desarrollo del Sistema de Gestión para Mercados Municipales, el equipo técnico ha determinado la adopción de un Enfoque Híbrido. Este enfoque combina la predictibilidad y el control del modelo Tradicional (Cascada) con la flexibilidad operativa de los marcos Ágiles (Scrum).</w:t>
+      </w:r>
+    </w:p>
+    <w:p>
+      <w:pPr>
+        <w:pStyle w:val="Ttulo2"/>
+        <w:jc w:val="both"/>
+      </w:pPr>
+      <w:r>
+        <w:t>Justificación del Enfoque Híbrido</w:t>
+      </w:r>
+    </w:p>
+    <w:p>
+      <w:pPr>
+        <w:spacing w:line="360" w:lineRule="auto"/>
+        <w:ind w:left="708"/>
+        <w:jc w:val="both"/>
+        <w:rPr>
+          <w:rFonts w:ascii="Arial" w:hAnsi="Arial" w:cs="Arial"/>
+          <w:lang w:val="es-ES"/>
+        </w:rPr>
+      </w:pPr>
+      <w:r>
+        <w:rPr>
+          <w:rFonts w:ascii="Arial" w:hAnsi="Arial" w:cs="Arial"/>
+          <w:lang w:val="es-ES"/>
+        </w:rPr>
+        <w:t>La naturaleza del proyecto exige interactuar con dos entornos radicalmente distintos:</w:t>
+      </w:r>
+    </w:p>
+    <w:p>
+      <w:pPr>
+        <w:numPr>
+          <w:ilvl w:val="0"/>
+          <w:numId w:val="18"/>
+        </w:numPr>
+        <w:tabs>
+          <w:tab w:val="clear" w:pos="720"/>
+          <w:tab w:val="num" w:pos="1428"/>
+        </w:tabs>
+        <w:spacing w:line="360" w:lineRule="auto"/>
+        <w:ind w:left="1428"/>
+        <w:jc w:val="both"/>
+        <w:rPr>
+          <w:rFonts w:ascii="Arial" w:hAnsi="Arial" w:cs="Arial"/>
+          <w:lang w:val="es-ES"/>
+        </w:rPr>
+      </w:pPr>
+      <w:r>
+        <w:rPr>
+          <w:rFonts w:ascii="Arial" w:hAnsi="Arial" w:cs="Arial"/>
+          <w:lang w:val="es-ES"/>
+        </w:rPr>
+        <w:t>Enfoque Tradicional: El proyecto se rige por leyes municipales estrictas, auditorías de la Dirección de Ingresos, un presupuesto fijo inamovible (70,000 Bs) y un plazo de entrega legal de 6 meses. La documentación inicial, el Acta de Constitución y los informes de cumplimiento requieren un control formal y rígido.</w:t>
+      </w:r>
+    </w:p>
+    <w:p>
+      <w:pPr>
+        <w:numPr>
+          <w:ilvl w:val="0"/>
+          <w:numId w:val="18"/>
+        </w:numPr>
+        <w:tabs>
+          <w:tab w:val="clear" w:pos="720"/>
+          <w:tab w:val="num" w:pos="1428"/>
+        </w:tabs>
+        <w:spacing w:line="360" w:lineRule="auto"/>
+        <w:ind w:left="1428"/>
+        <w:jc w:val="both"/>
+        <w:rPr>
+          <w:rFonts w:ascii="Arial" w:hAnsi="Arial" w:cs="Arial"/>
+          <w:lang w:val="es-ES"/>
+        </w:rPr>
+      </w:pPr>
+      <w:r>
+        <w:rPr>
+          <w:rFonts w:ascii="Arial" w:hAnsi="Arial" w:cs="Arial"/>
+          <w:lang w:val="es-ES"/>
+        </w:rPr>
+        <w:t xml:space="preserve">Enfoque Ágil: La interfaz de usuario, la usabilidad de los módulos y el contacto directo con los comerciantes y administradores de los mercados (Campesino, Central, Entre Ríos) requieren un desarrollo iterativo. El software debe adaptarse rápidamente al </w:t>
+      </w:r>
+      <w:proofErr w:type="spellStart"/>
+      <w:r>
+        <w:rPr>
+          <w:rFonts w:ascii="Arial" w:hAnsi="Arial" w:cs="Arial"/>
+          <w:lang w:val="es-ES"/>
+        </w:rPr>
+        <w:t>feedback</w:t>
+      </w:r>
+      <w:proofErr w:type="spellEnd"/>
+      <w:r>
+        <w:rPr>
+          <w:rFonts w:ascii="Arial" w:hAnsi="Arial" w:cs="Arial"/>
+          <w:lang w:val="es-ES"/>
+        </w:rPr>
+        <w:t xml:space="preserve"> de los usuarios reales en el terreno de manera incremental.</w:t>
+      </w:r>
+    </w:p>
+    <w:p>
+      <w:pPr>
+        <w:pStyle w:val="Ttulo1"/>
+        <w:jc w:val="both"/>
+      </w:pPr>
+      <w:r>
+        <w:t>SOLICITUD DE PROYECTO</w:t>
+      </w:r>
+    </w:p>
+    <w:p>
+      <w:pPr>
+        <w:pStyle w:val="Ttulo2"/>
+        <w:jc w:val="both"/>
+      </w:pPr>
+      <w:r>
+        <w:t>Información del Solicitante</w:t>
+      </w:r>
+    </w:p>
+    <w:p>
+      <w:pPr>
+        <w:spacing w:line="360" w:lineRule="auto"/>
+        <w:ind w:left="708"/>
+        <w:jc w:val="both"/>
+        <w:rPr>
+          <w:rFonts w:ascii="Arial" w:hAnsi="Arial" w:cs="Arial"/>
+          <w:lang w:val="es-ES"/>
+        </w:rPr>
+      </w:pPr>
+      <w:r>
+        <w:rPr>
+          <w:rFonts w:ascii="Arial" w:hAnsi="Arial" w:cs="Arial"/>
+          <w:lang w:val="es-ES"/>
+        </w:rPr>
+        <w:t>Entidad Solicitante: Gobierno Autónomo Municipal de Sucre</w:t>
+      </w:r>
+    </w:p>
+    <w:p>
+      <w:pPr>
+        <w:spacing w:line="360" w:lineRule="auto"/>
+        <w:ind w:left="708"/>
+        <w:jc w:val="both"/>
+        <w:rPr>
+          <w:rFonts w:ascii="Arial" w:hAnsi="Arial" w:cs="Arial"/>
+          <w:lang w:val="es-ES"/>
+        </w:rPr>
+      </w:pPr>
+      <w:r>
+        <w:rPr>
+          <w:rFonts w:ascii="Arial" w:hAnsi="Arial" w:cs="Arial"/>
+          <w:lang w:val="es-ES"/>
+        </w:rPr>
+        <w:t>Área / Dependencia: Dirección de Ingresos Municipales</w:t>
+      </w:r>
+    </w:p>
+    <w:p>
+      <w:pPr>
+        <w:spacing w:line="360" w:lineRule="auto"/>
+        <w:ind w:left="708"/>
+        <w:jc w:val="both"/>
+        <w:rPr>
+          <w:rFonts w:ascii="Arial" w:hAnsi="Arial" w:cs="Arial"/>
+          <w:lang w:val="es-ES"/>
+        </w:rPr>
+      </w:pPr>
+      <w:r>
+        <w:rPr>
+          <w:rFonts w:ascii="Arial" w:hAnsi="Arial" w:cs="Arial"/>
+          <w:lang w:val="es-ES"/>
+        </w:rPr>
+        <w:t xml:space="preserve">Fecha de Solicitud: 15 de </w:t>
+      </w:r>
+      <w:proofErr w:type="gramStart"/>
+      <w:r>
+        <w:rPr>
+          <w:rFonts w:ascii="Arial" w:hAnsi="Arial" w:cs="Arial"/>
+          <w:lang w:val="es-ES"/>
+        </w:rPr>
+        <w:t>Enero</w:t>
+      </w:r>
+      <w:proofErr w:type="gramEnd"/>
+      <w:r>
+        <w:rPr>
+          <w:rFonts w:ascii="Arial" w:hAnsi="Arial" w:cs="Arial"/>
+          <w:lang w:val="es-ES"/>
+        </w:rPr>
+        <w:t xml:space="preserve"> de 2026</w:t>
+      </w:r>
+    </w:p>
+    <w:p>
+      <w:pPr>
+        <w:spacing w:line="360" w:lineRule="auto"/>
+        <w:ind w:left="708"/>
+        <w:jc w:val="both"/>
+        <w:rPr>
+          <w:rFonts w:ascii="Arial" w:hAnsi="Arial" w:cs="Arial"/>
+          <w:lang w:val="es-ES"/>
+        </w:rPr>
+      </w:pPr>
+      <w:r>
+        <w:rPr>
+          <w:rFonts w:ascii="Arial" w:hAnsi="Arial" w:cs="Arial"/>
+          <w:lang w:val="es-ES"/>
+        </w:rPr>
+        <w:lastRenderedPageBreak/>
+        <w:t>Responsable de la Solicitud: Dirección de Ingresos</w:t>
+      </w:r>
+    </w:p>
+    <w:p>
+      <w:pPr>
+        <w:pStyle w:val="Ttulo2"/>
+        <w:jc w:val="both"/>
+      </w:pPr>
+      <w:r>
+        <w:t>Descripción del Problema u Oportunidad</w:t>
+      </w:r>
+    </w:p>
+    <w:p>
+      <w:pPr>
+        <w:spacing w:line="360" w:lineRule="auto"/>
+        <w:ind w:left="708"/>
+        <w:jc w:val="both"/>
+        <w:rPr>
+          <w:rFonts w:ascii="Arial" w:hAnsi="Arial" w:cs="Arial"/>
+          <w:lang w:val="es-ES"/>
+        </w:rPr>
+      </w:pPr>
+      <w:r>
+        <w:rPr>
+          <w:rFonts w:ascii="Arial" w:hAnsi="Arial" w:cs="Arial"/>
+          <w:lang w:val="es-ES"/>
+        </w:rPr>
+        <w:t>La administración actual de los mercados municipales (Campesino y Central) presenta graves problemas de centralización, pérdida de información y falta de transparencia operativa. Los registros de comerciantes y la asignación de puestos se gestionan mediante libros físicos propensos al deterioro.</w:t>
+      </w:r>
+    </w:p>
+    <w:p>
+      <w:pPr>
+        <w:spacing w:line="360" w:lineRule="auto"/>
+        <w:ind w:left="708"/>
+        <w:jc w:val="both"/>
+        <w:rPr>
+          <w:rFonts w:ascii="Arial" w:hAnsi="Arial" w:cs="Arial"/>
+          <w:lang w:val="es-ES"/>
+        </w:rPr>
+      </w:pPr>
+      <w:r>
+        <w:rPr>
+          <w:rFonts w:ascii="Arial" w:hAnsi="Arial" w:cs="Arial"/>
+          <w:lang w:val="es-ES"/>
+        </w:rPr>
+        <w:t>Asimismo, la recaudación de tarifas diarias y el control de licencias sanitarias carecen de auditoría en tiempo real, lo que genera fugas económicas potenciales y dificulta la fiscalización por parte de la Dirección de Ingresos. Se identifica la oportunidad de modernizar la gestión pública mediante un sistema web a medida.</w:t>
+      </w:r>
+    </w:p>
+    <w:p>
+      <w:pPr>
+        <w:pStyle w:val="Ttulo2"/>
+        <w:jc w:val="both"/>
+      </w:pPr>
+      <w:r>
+        <w:t>Descripción de la Solución Propuesta</w:t>
+      </w:r>
+    </w:p>
+    <w:p>
+      <w:pPr>
+        <w:spacing w:line="360" w:lineRule="auto"/>
+        <w:ind w:left="708"/>
+        <w:jc w:val="both"/>
+        <w:rPr>
+          <w:rFonts w:ascii="Arial" w:hAnsi="Arial" w:cs="Arial"/>
+          <w:lang w:val="es-ES"/>
+        </w:rPr>
+      </w:pPr>
+      <w:r>
+        <w:rPr>
+          <w:rFonts w:ascii="Arial" w:hAnsi="Arial" w:cs="Arial"/>
+          <w:lang w:val="es-ES"/>
+        </w:rPr>
+        <w:t>Desarrollo e implementación de un Sistema de Gestión para Mercados Municipales (Plataforma Web) que automatice de extremo a extremo el ciclo administrativo de los centros de abasto. La solución debe centralizar el censo de comerciantes, digitalizar la cobranza diaria/mensual, emitir alertas tempranas sobre la vigencia de licencias sanitarias y consolidar la información en reportes financieros ejecutivos para la toma de decisiones de las autoridades municipales.</w:t>
+      </w:r>
+    </w:p>
+    <w:p>
+      <w:pPr>
+        <w:pStyle w:val="Ttulo2"/>
+        <w:jc w:val="both"/>
+      </w:pPr>
+      <w:r>
+        <w:t>Beneficios Esperados</w:t>
+      </w:r>
+    </w:p>
+    <w:p>
+      <w:pPr>
+        <w:pStyle w:val="Prrafodelista"/>
+        <w:numPr>
+          <w:ilvl w:val="0"/>
+          <w:numId w:val="19"/>
+        </w:numPr>
         <w:spacing w:line="360" w:lineRule="auto"/>
         <w:jc w:val="both"/>
         <w:rPr>
@@ -2370,20 +2702,192 @@
           <w:lang w:val="es-ES"/>
         </w:rPr>
       </w:pPr>
-    </w:p>
-    <w:p>
-      <w:pPr>
+      <w:r>
+        <w:rPr>
+          <w:rFonts w:ascii="Arial" w:hAnsi="Arial" w:cs="Arial"/>
+          <w:lang w:val="es-ES"/>
+        </w:rPr>
+        <w:t xml:space="preserve">Incremento en la </w:t>
+      </w:r>
+      <w:proofErr w:type="spellStart"/>
+      <w:r>
+        <w:rPr>
+          <w:rFonts w:ascii="Arial" w:hAnsi="Arial" w:cs="Arial"/>
+          <w:lang w:val="es-ES"/>
+        </w:rPr>
+        <w:t>Recaudaci</w:t>
+      </w:r>
+      <w:proofErr w:type="spellEnd"/>
+      <w:r>
+        <w:rPr>
+          <w:rFonts w:ascii="Arial" w:hAnsi="Arial" w:cs="Arial"/>
+          <w:lang w:val="es-ES"/>
+        </w:rPr>
+        <w:t xml:space="preserve"> </w:t>
+      </w:r>
+      <w:proofErr w:type="spellStart"/>
+      <w:r>
+        <w:rPr>
+          <w:rFonts w:ascii="Arial" w:hAnsi="Arial" w:cs="Arial"/>
+          <w:lang w:val="es-ES"/>
+        </w:rPr>
+        <w:t>ón</w:t>
+      </w:r>
+      <w:proofErr w:type="spellEnd"/>
+      <w:r>
+        <w:rPr>
+          <w:rFonts w:ascii="Arial" w:hAnsi="Arial" w:cs="Arial"/>
+          <w:lang w:val="es-ES"/>
+        </w:rPr>
+        <w:t>: Optimización y auditoría del 100% de los cobros de tarifas y patentes por puesto.</w:t>
+      </w:r>
+    </w:p>
+    <w:p>
+      <w:pPr>
+        <w:pStyle w:val="Prrafodelista"/>
+        <w:numPr>
+          <w:ilvl w:val="0"/>
+          <w:numId w:val="19"/>
+        </w:numPr>
         <w:spacing w:line="360" w:lineRule="auto"/>
         <w:jc w:val="both"/>
         <w:rPr>
           <w:rFonts w:ascii="Arial" w:hAnsi="Arial" w:cs="Arial"/>
-        </w:rPr>
-      </w:pPr>
-    </w:p>
-    <w:p>
-      <w:pPr>
-        <w:rPr>
-          <w:lang w:val="es-MX"/>
+          <w:lang w:val="es-ES"/>
+        </w:rPr>
+      </w:pPr>
+      <w:r>
+        <w:rPr>
+          <w:rFonts w:ascii="Arial" w:hAnsi="Arial" w:cs="Arial"/>
+          <w:lang w:val="es-ES"/>
+        </w:rPr>
+        <w:t>Transparencia: Reducción drástica del uso de papel y eliminación de la duplicidad de registros o puestos "fantasma".</w:t>
+      </w:r>
+    </w:p>
+    <w:p>
+      <w:pPr>
+        <w:pStyle w:val="Prrafodelista"/>
+        <w:numPr>
+          <w:ilvl w:val="0"/>
+          <w:numId w:val="19"/>
+        </w:numPr>
+        <w:spacing w:line="360" w:lineRule="auto"/>
+        <w:jc w:val="both"/>
+        <w:rPr>
+          <w:rFonts w:ascii="Arial" w:hAnsi="Arial" w:cs="Arial"/>
+          <w:lang w:val="es-ES"/>
+        </w:rPr>
+      </w:pPr>
+      <w:r>
+        <w:rPr>
+          <w:rFonts w:ascii="Arial" w:hAnsi="Arial" w:cs="Arial"/>
+          <w:lang w:val="es-ES"/>
+        </w:rPr>
+        <w:t>Control Sanitario: Monitoreo activo de la salud pública dentro de los mercados mediante alertas de licencias vencidas.</w:t>
+      </w:r>
+    </w:p>
+    <w:p>
+      <w:pPr>
+        <w:pStyle w:val="Prrafodelista"/>
+        <w:numPr>
+          <w:ilvl w:val="0"/>
+          <w:numId w:val="19"/>
+        </w:numPr>
+        <w:spacing w:line="360" w:lineRule="auto"/>
+        <w:jc w:val="both"/>
+        <w:rPr>
+          <w:rFonts w:ascii="Arial" w:hAnsi="Arial" w:cs="Arial"/>
+          <w:lang w:val="es-ES"/>
+        </w:rPr>
+      </w:pPr>
+      <w:r>
+        <w:rPr>
+          <w:rFonts w:ascii="Arial" w:hAnsi="Arial" w:cs="Arial"/>
+          <w:lang w:val="es-ES"/>
+        </w:rPr>
+        <w:t>Eficiencia Administrativa: Reducción del tiempo de consolidación de informes mensuales de días a solo unos clics.</w:t>
+      </w:r>
+    </w:p>
+    <w:p>
+      <w:pPr>
+        <w:pStyle w:val="Ttulo2"/>
+        <w:jc w:val="both"/>
+      </w:pPr>
+      <w:r>
+        <w:t>Restricciones Iniciales Conocidas</w:t>
+      </w:r>
+    </w:p>
+    <w:p>
+      <w:pPr>
+        <w:pStyle w:val="Prrafodelista"/>
+        <w:numPr>
+          <w:ilvl w:val="0"/>
+          <w:numId w:val="20"/>
+        </w:numPr>
+        <w:spacing w:line="360" w:lineRule="auto"/>
+        <w:jc w:val="both"/>
+        <w:rPr>
+          <w:rFonts w:ascii="Arial" w:hAnsi="Arial" w:cs="Arial"/>
+          <w:lang w:val="es-ES"/>
+        </w:rPr>
+      </w:pPr>
+      <w:r>
+        <w:rPr>
+          <w:rFonts w:ascii="Arial" w:hAnsi="Arial" w:cs="Arial"/>
+          <w:lang w:val="es-ES"/>
+        </w:rPr>
+        <w:t>Presupuesto Máximo Disponible: 70,000 Bs (Fondos IDH / Municipales asignados).</w:t>
+      </w:r>
+    </w:p>
+    <w:p>
+      <w:pPr>
+        <w:pStyle w:val="Prrafodelista"/>
+        <w:numPr>
+          <w:ilvl w:val="0"/>
+          <w:numId w:val="20"/>
+        </w:numPr>
+        <w:spacing w:line="360" w:lineRule="auto"/>
+        <w:jc w:val="both"/>
+        <w:rPr>
+          <w:rFonts w:ascii="Arial" w:hAnsi="Arial" w:cs="Arial"/>
+          <w:lang w:val="es-ES"/>
+        </w:rPr>
+      </w:pPr>
+      <w:r>
+        <w:rPr>
+          <w:rFonts w:ascii="Arial" w:hAnsi="Arial" w:cs="Arial"/>
+          <w:lang w:val="es-ES"/>
+        </w:rPr>
+        <w:t>Plazo de Entrega: Máximo 6 meses para la puesta en marcha del MVP.</w:t>
+      </w:r>
+    </w:p>
+    <w:p>
+      <w:pPr>
+        <w:pStyle w:val="Prrafodelista"/>
+        <w:numPr>
+          <w:ilvl w:val="0"/>
+          <w:numId w:val="20"/>
+        </w:numPr>
+        <w:spacing w:line="360" w:lineRule="auto"/>
+        <w:jc w:val="both"/>
+        <w:rPr>
+          <w:rFonts w:ascii="Arial" w:hAnsi="Arial" w:cs="Arial"/>
+          <w:lang w:val="es-ES"/>
+        </w:rPr>
+      </w:pPr>
+      <w:r>
+        <w:rPr>
+          <w:rFonts w:ascii="Arial" w:hAnsi="Arial" w:cs="Arial"/>
+          <w:lang w:val="es-ES"/>
+        </w:rPr>
+        <w:lastRenderedPageBreak/>
+        <w:t>Cumplimiento Normativo: El sistema debe ceñirse estrictamente a las Leyes Autonómicas Municipales de Sucre vigentes y las regulaciones del Ministerio de Salud (para licencias sanitarias).</w:t>
+      </w:r>
+    </w:p>
+    <w:p>
+      <w:pPr>
+        <w:rPr>
+          <w:lang w:val="es-ES"/>
         </w:rPr>
       </w:pPr>
     </w:p>
@@ -2654,6 +3158,119 @@
     </w:lvl>
   </w:abstractNum>
   <w:abstractNum w:abstractNumId="1" w15:restartNumberingAfterBreak="0">
+    <w:nsid w:val="0A870CBE"/>
+    <w:multiLevelType w:val="multilevel"/>
+    <w:tmpl w:val="19F407F2"/>
+    <w:lvl w:ilvl="0">
+      <w:start w:val="1"/>
+      <w:numFmt w:val="decimal"/>
+      <w:lvlText w:val="%1."/>
+      <w:lvlJc w:val="left"/>
+      <w:pPr>
+        <w:tabs>
+          <w:tab w:val="num" w:pos="720"/>
+        </w:tabs>
+        <w:ind w:left="720" w:hanging="360"/>
+      </w:pPr>
+    </w:lvl>
+    <w:lvl w:ilvl="1" w:tentative="1">
+      <w:start w:val="1"/>
+      <w:numFmt w:val="decimal"/>
+      <w:lvlText w:val="%2."/>
+      <w:lvlJc w:val="left"/>
+      <w:pPr>
+        <w:tabs>
+          <w:tab w:val="num" w:pos="1440"/>
+        </w:tabs>
+        <w:ind w:left="1440" w:hanging="360"/>
+      </w:pPr>
+    </w:lvl>
+    <w:lvl w:ilvl="2" w:tentative="1">
+      <w:start w:val="1"/>
+      <w:numFmt w:val="decimal"/>
+      <w:lvlText w:val="%3."/>
+      <w:lvlJc w:val="left"/>
+      <w:pPr>
+        <w:tabs>
+          <w:tab w:val="num" w:pos="2160"/>
+        </w:tabs>
+        <w:ind w:left="2160" w:hanging="360"/>
+      </w:pPr>
+    </w:lvl>
+    <w:lvl w:ilvl="3" w:tentative="1">
+      <w:start w:val="1"/>
+      <w:numFmt w:val="decimal"/>
+      <w:lvlText w:val="%4."/>
+      <w:lvlJc w:val="left"/>
+      <w:pPr>
+        <w:tabs>
+          <w:tab w:val="num" w:pos="2880"/>
+        </w:tabs>
+        <w:ind w:left="2880" w:hanging="360"/>
+      </w:pPr>
+    </w:lvl>
+    <w:lvl w:ilvl="4" w:tentative="1">
+      <w:start w:val="1"/>
+      <w:numFmt w:val="decimal"/>
+      <w:lvlText w:val="%5."/>
+      <w:lvlJc w:val="left"/>
+      <w:pPr>
+        <w:tabs>
+          <w:tab w:val="num" w:pos="3600"/>
+        </w:tabs>
+        <w:ind w:left="3600" w:hanging="360"/>
+      </w:pPr>
+    </w:lvl>
+    <w:lvl w:ilvl="5" w:tentative="1">
+      <w:start w:val="1"/>
+      <w:numFmt w:val="decimal"/>
+      <w:lvlText w:val="%6."/>
+      <w:lvlJc w:val="left"/>
+      <w:pPr>
+        <w:tabs>
+          <w:tab w:val="num" w:pos="4320"/>
+        </w:tabs>
+        <w:ind w:left="4320" w:hanging="360"/>
+      </w:pPr>
+    </w:lvl>
+    <w:lvl w:ilvl="6" w:tentative="1">
+      <w:start w:val="1"/>
+      <w:numFmt w:val="decimal"/>
+      <w:lvlText w:val="%7."/>
+      <w:lvlJc w:val="left"/>
+      <w:pPr>
+        <w:tabs>
+          <w:tab w:val="num" w:pos="5040"/>
+        </w:tabs>
+        <w:ind w:left="5040" w:hanging="360"/>
+      </w:pPr>
+    </w:lvl>
+    <w:lvl w:ilvl="7" w:tentative="1">
+      <w:start w:val="1"/>
+      <w:numFmt w:val="decimal"/>
+      <w:lvlText w:val="%8."/>
+      <w:lvlJc w:val="left"/>
+      <w:pPr>
+        <w:tabs>
+          <w:tab w:val="num" w:pos="5760"/>
+        </w:tabs>
+        <w:ind w:left="5760" w:hanging="360"/>
+      </w:pPr>
+    </w:lvl>
+    <w:lvl w:ilvl="8" w:tentative="1">
+      <w:start w:val="1"/>
+      <w:numFmt w:val="decimal"/>
+      <w:lvlText w:val="%9."/>
+      <w:lvlJc w:val="left"/>
+      <w:pPr>
+        <w:tabs>
+          <w:tab w:val="num" w:pos="6480"/>
+        </w:tabs>
+        <w:ind w:left="6480" w:hanging="360"/>
+      </w:pPr>
+    </w:lvl>
+  </w:abstractNum>
+  <w:abstractNum w:abstractNumId="2" w15:restartNumberingAfterBreak="0">
     <w:nsid w:val="1B0075D4"/>
     <w:multiLevelType w:val="multilevel"/>
     <w:tmpl w:val="0F0E05D0"/>
@@ -2802,7 +3419,7 @@
       </w:rPr>
     </w:lvl>
   </w:abstractNum>
-  <w:abstractNum w:abstractNumId="2" w15:restartNumberingAfterBreak="0">
+  <w:abstractNum w:abstractNumId="3" w15:restartNumberingAfterBreak="0">
     <w:nsid w:val="1CA93EFF"/>
     <w:multiLevelType w:val="multilevel"/>
     <w:tmpl w:val="DE76F78C"/>
@@ -2951,7 +3568,7 @@
       </w:rPr>
     </w:lvl>
   </w:abstractNum>
-  <w:abstractNum w:abstractNumId="3" w15:restartNumberingAfterBreak="0">
+  <w:abstractNum w:abstractNumId="4" w15:restartNumberingAfterBreak="0">
     <w:nsid w:val="222F26EB"/>
     <w:multiLevelType w:val="hybridMultilevel"/>
     <w:tmpl w:val="8826B1A8"/>
@@ -3064,7 +3681,7 @@
       </w:rPr>
     </w:lvl>
   </w:abstractNum>
-  <w:abstractNum w:abstractNumId="4" w15:restartNumberingAfterBreak="0">
+  <w:abstractNum w:abstractNumId="5" w15:restartNumberingAfterBreak="0">
     <w:nsid w:val="351225BE"/>
     <w:multiLevelType w:val="multilevel"/>
     <w:tmpl w:val="420C3678"/>
@@ -3177,7 +3794,7 @@
       </w:pPr>
     </w:lvl>
   </w:abstractNum>
-  <w:abstractNum w:abstractNumId="5" w15:restartNumberingAfterBreak="0">
+  <w:abstractNum w:abstractNumId="6" w15:restartNumberingAfterBreak="0">
     <w:nsid w:val="38821839"/>
     <w:multiLevelType w:val="multilevel"/>
     <w:tmpl w:val="0382157A"/>
@@ -3326,7 +3943,7 @@
       </w:rPr>
     </w:lvl>
   </w:abstractNum>
-  <w:abstractNum w:abstractNumId="6" w15:restartNumberingAfterBreak="0">
+  <w:abstractNum w:abstractNumId="7" w15:restartNumberingAfterBreak="0">
     <w:nsid w:val="3C9973EF"/>
     <w:multiLevelType w:val="multilevel"/>
     <w:tmpl w:val="C804C468"/>
@@ -3475,7 +4092,7 @@
       </w:rPr>
     </w:lvl>
   </w:abstractNum>
-  <w:abstractNum w:abstractNumId="7" w15:restartNumberingAfterBreak="0">
+  <w:abstractNum w:abstractNumId="8" w15:restartNumberingAfterBreak="0">
     <w:nsid w:val="415521CD"/>
     <w:multiLevelType w:val="multilevel"/>
     <w:tmpl w:val="E0AA99D4"/>
@@ -3624,7 +4241,120 @@
       </w:rPr>
     </w:lvl>
   </w:abstractNum>
-  <w:abstractNum w:abstractNumId="8" w15:restartNumberingAfterBreak="0">
+  <w:abstractNum w:abstractNumId="9" w15:restartNumberingAfterBreak="0">
+    <w:nsid w:val="45632781"/>
+    <w:multiLevelType w:val="hybridMultilevel"/>
+    <w:tmpl w:val="7C28A2BA"/>
+    <w:lvl w:ilvl="0" w:tplc="0C0A0001">
+      <w:start w:val="1"/>
+      <w:numFmt w:val="bullet"/>
+      <w:lvlText w:val=""/>
+      <w:lvlJc w:val="left"/>
+      <w:pPr>
+        <w:ind w:left="720" w:hanging="360"/>
+      </w:pPr>
+      <w:rPr>
+        <w:rFonts w:ascii="Symbol" w:hAnsi="Symbol" w:hint="default"/>
+      </w:rPr>
+    </w:lvl>
+    <w:lvl w:ilvl="1" w:tplc="0C0A0003" w:tentative="1">
+      <w:start w:val="1"/>
+      <w:numFmt w:val="bullet"/>
+      <w:lvlText w:val="o"/>
+      <w:lvlJc w:val="left"/>
+      <w:pPr>
+        <w:ind w:left="1440" w:hanging="360"/>
+      </w:pPr>
+      <w:rPr>
+        <w:rFonts w:ascii="Courier New" w:hAnsi="Courier New" w:cs="Courier New" w:hint="default"/>
+      </w:rPr>
+    </w:lvl>
+    <w:lvl w:ilvl="2" w:tplc="0C0A0005" w:tentative="1">
+      <w:start w:val="1"/>
+      <w:numFmt w:val="bullet"/>
+      <w:lvlText w:val=""/>
+      <w:lvlJc w:val="left"/>
+      <w:pPr>
+        <w:ind w:left="2160" w:hanging="360"/>
+      </w:pPr>
+      <w:rPr>
+        <w:rFonts w:ascii="Wingdings" w:hAnsi="Wingdings" w:hint="default"/>
+      </w:rPr>
+    </w:lvl>
+    <w:lvl w:ilvl="3" w:tplc="0C0A0001" w:tentative="1">
+      <w:start w:val="1"/>
+      <w:numFmt w:val="bullet"/>
+      <w:lvlText w:val=""/>
+      <w:lvlJc w:val="left"/>
+      <w:pPr>
+        <w:ind w:left="2880" w:hanging="360"/>
+      </w:pPr>
+      <w:rPr>
+        <w:rFonts w:ascii="Symbol" w:hAnsi="Symbol" w:hint="default"/>
+      </w:rPr>
+    </w:lvl>
+    <w:lvl w:ilvl="4" w:tplc="0C0A0003" w:tentative="1">
+      <w:start w:val="1"/>
+      <w:numFmt w:val="bullet"/>
+      <w:lvlText w:val="o"/>
+      <w:lvlJc w:val="left"/>
+      <w:pPr>
+        <w:ind w:left="3600" w:hanging="360"/>
+      </w:pPr>
+      <w:rPr>
+        <w:rFonts w:ascii="Courier New" w:hAnsi="Courier New" w:cs="Courier New" w:hint="default"/>
+      </w:rPr>
+    </w:lvl>
+    <w:lvl w:ilvl="5" w:tplc="0C0A0005" w:tentative="1">
+      <w:start w:val="1"/>
+      <w:numFmt w:val="bullet"/>
+      <w:lvlText w:val=""/>
+      <w:lvlJc w:val="left"/>
+      <w:pPr>
+        <w:ind w:left="4320" w:hanging="360"/>
+      </w:pPr>
+      <w:rPr>
+        <w:rFonts w:ascii="Wingdings" w:hAnsi="Wingdings" w:hint="default"/>
+      </w:rPr>
+    </w:lvl>
+    <w:lvl w:ilvl="6" w:tplc="0C0A0001" w:tentative="1">
+      <w:start w:val="1"/>
+      <w:numFmt w:val="bullet"/>
+      <w:lvlText w:val=""/>
+      <w:lvlJc w:val="left"/>
+      <w:pPr>
+        <w:ind w:left="5040" w:hanging="360"/>
+      </w:pPr>
+      <w:rPr>
+        <w:rFonts w:ascii="Symbol" w:hAnsi="Symbol" w:hint="default"/>
+      </w:rPr>
+    </w:lvl>
+    <w:lvl w:ilvl="7" w:tplc="0C0A0003" w:tentative="1">
+      <w:start w:val="1"/>
+      <w:numFmt w:val="bullet"/>
+      <w:lvlText w:val="o"/>
+      <w:lvlJc w:val="left"/>
+      <w:pPr>
+        <w:ind w:left="5760" w:hanging="360"/>
+      </w:pPr>
+      <w:rPr>
+        <w:rFonts w:ascii="Courier New" w:hAnsi="Courier New" w:cs="Courier New" w:hint="default"/>
+      </w:rPr>
+    </w:lvl>
+    <w:lvl w:ilvl="8" w:tplc="0C0A0005" w:tentative="1">
+      <w:start w:val="1"/>
+      <w:numFmt w:val="bullet"/>
+      <w:lvlText w:val=""/>
+      <w:lvlJc w:val="left"/>
+      <w:pPr>
+        <w:ind w:left="6480" w:hanging="360"/>
+      </w:pPr>
+      <w:rPr>
+        <w:rFonts w:ascii="Wingdings" w:hAnsi="Wingdings" w:hint="default"/>
+      </w:rPr>
+    </w:lvl>
+  </w:abstractNum>
+  <w:abstractNum w:abstractNumId="10" w15:restartNumberingAfterBreak="0">
     <w:nsid w:val="50DF3A72"/>
     <w:multiLevelType w:val="multilevel"/>
     <w:tmpl w:val="66C2A37E"/>
@@ -3711,7 +4441,7 @@
       </w:pPr>
     </w:lvl>
   </w:abstractNum>
-  <w:abstractNum w:abstractNumId="9" w15:restartNumberingAfterBreak="0">
+  <w:abstractNum w:abstractNumId="11" w15:restartNumberingAfterBreak="0">
     <w:nsid w:val="616072A1"/>
     <w:multiLevelType w:val="multilevel"/>
     <w:tmpl w:val="B15495DA"/>
@@ -3860,7 +4590,7 @@
       </w:rPr>
     </w:lvl>
   </w:abstractNum>
-  <w:abstractNum w:abstractNumId="10" w15:restartNumberingAfterBreak="0">
+  <w:abstractNum w:abstractNumId="12" w15:restartNumberingAfterBreak="0">
     <w:nsid w:val="685E294E"/>
     <w:multiLevelType w:val="multilevel"/>
     <w:tmpl w:val="A7947952"/>
@@ -4009,7 +4739,7 @@
       </w:rPr>
     </w:lvl>
   </w:abstractNum>
-  <w:abstractNum w:abstractNumId="11" w15:restartNumberingAfterBreak="0">
+  <w:abstractNum w:abstractNumId="13" w15:restartNumberingAfterBreak="0">
     <w:nsid w:val="6B7242DF"/>
     <w:multiLevelType w:val="multilevel"/>
     <w:tmpl w:val="35FEE1B6"/>
@@ -4158,7 +4888,120 @@
       </w:rPr>
     </w:lvl>
   </w:abstractNum>
-  <w:abstractNum w:abstractNumId="12" w15:restartNumberingAfterBreak="0">
+  <w:abstractNum w:abstractNumId="14" w15:restartNumberingAfterBreak="0">
+    <w:nsid w:val="6CF655A5"/>
+    <w:multiLevelType w:val="multilevel"/>
+    <w:tmpl w:val="AA120C74"/>
+    <w:lvl w:ilvl="0">
+      <w:start w:val="2"/>
+      <w:numFmt w:val="decimal"/>
+      <w:lvlText w:val="%1."/>
+      <w:lvlJc w:val="left"/>
+      <w:pPr>
+        <w:tabs>
+          <w:tab w:val="num" w:pos="720"/>
+        </w:tabs>
+        <w:ind w:left="720" w:hanging="360"/>
+      </w:pPr>
+    </w:lvl>
+    <w:lvl w:ilvl="1" w:tentative="1">
+      <w:start w:val="1"/>
+      <w:numFmt w:val="decimal"/>
+      <w:lvlText w:val="%2."/>
+      <w:lvlJc w:val="left"/>
+      <w:pPr>
+        <w:tabs>
+          <w:tab w:val="num" w:pos="1440"/>
+        </w:tabs>
+        <w:ind w:left="1440" w:hanging="360"/>
+      </w:pPr>
+    </w:lvl>
+    <w:lvl w:ilvl="2" w:tentative="1">
+      <w:start w:val="1"/>
+      <w:numFmt w:val="decimal"/>
+      <w:lvlText w:val="%3."/>
+      <w:lvlJc w:val="left"/>
+      <w:pPr>
+        <w:tabs>
+          <w:tab w:val="num" w:pos="2160"/>
+        </w:tabs>
+        <w:ind w:left="2160" w:hanging="360"/>
+      </w:pPr>
+    </w:lvl>
+    <w:lvl w:ilvl="3" w:tentative="1">
+      <w:start w:val="1"/>
+      <w:numFmt w:val="decimal"/>
+      <w:lvlText w:val="%4."/>
+      <w:lvlJc w:val="left"/>
+      <w:pPr>
+        <w:tabs>
+          <w:tab w:val="num" w:pos="2880"/>
+        </w:tabs>
+        <w:ind w:left="2880" w:hanging="360"/>
+      </w:pPr>
+    </w:lvl>
+    <w:lvl w:ilvl="4" w:tentative="1">
+      <w:start w:val="1"/>
+      <w:numFmt w:val="decimal"/>
+      <w:lvlText w:val="%5."/>
+      <w:lvlJc w:val="left"/>
+      <w:pPr>
+        <w:tabs>
+          <w:tab w:val="num" w:pos="3600"/>
+        </w:tabs>
+        <w:ind w:left="3600" w:hanging="360"/>
+      </w:pPr>
+    </w:lvl>
+    <w:lvl w:ilvl="5" w:tentative="1">
+      <w:start w:val="1"/>
+      <w:numFmt w:val="decimal"/>
+      <w:lvlText w:val="%6."/>
+      <w:lvlJc w:val="left"/>
+      <w:pPr>
+        <w:tabs>
+          <w:tab w:val="num" w:pos="4320"/>
+        </w:tabs>
+        <w:ind w:left="4320" w:hanging="360"/>
+      </w:pPr>
+    </w:lvl>
+    <w:lvl w:ilvl="6" w:tentative="1">
+      <w:start w:val="1"/>
+      <w:numFmt w:val="decimal"/>
+      <w:lvlText w:val="%7."/>
+      <w:lvlJc w:val="left"/>
+      <w:pPr>
+        <w:tabs>
+          <w:tab w:val="num" w:pos="5040"/>
+        </w:tabs>
+        <w:ind w:left="5040" w:hanging="360"/>
+      </w:pPr>
+    </w:lvl>
+    <w:lvl w:ilvl="7" w:tentative="1">
+      <w:start w:val="1"/>
+      <w:numFmt w:val="decimal"/>
+      <w:lvlText w:val="%8."/>
+      <w:lvlJc w:val="left"/>
+      <w:pPr>
+        <w:tabs>
+          <w:tab w:val="num" w:pos="5760"/>
+        </w:tabs>
+        <w:ind w:left="5760" w:hanging="360"/>
+      </w:pPr>
+    </w:lvl>
+    <w:lvl w:ilvl="8" w:tentative="1">
+      <w:start w:val="1"/>
+      <w:numFmt w:val="decimal"/>
+      <w:lvlText w:val="%9."/>
+      <w:lvlJc w:val="left"/>
+      <w:pPr>
+        <w:tabs>
+          <w:tab w:val="num" w:pos="6480"/>
+        </w:tabs>
+        <w:ind w:left="6480" w:hanging="360"/>
+      </w:pPr>
+    </w:lvl>
+  </w:abstractNum>
+  <w:abstractNum w:abstractNumId="15" w15:restartNumberingAfterBreak="0">
     <w:nsid w:val="6D6048EB"/>
     <w:multiLevelType w:val="hybridMultilevel"/>
     <w:tmpl w:val="496637C8"/>
@@ -4271,7 +5114,7 @@
       </w:rPr>
     </w:lvl>
   </w:abstractNum>
-  <w:abstractNum w:abstractNumId="13" w15:restartNumberingAfterBreak="0">
+  <w:abstractNum w:abstractNumId="16" w15:restartNumberingAfterBreak="0">
     <w:nsid w:val="6D9E2373"/>
     <w:multiLevelType w:val="multilevel"/>
     <w:tmpl w:val="7798721C"/>
@@ -4417,6 +5260,119 @@
       <w:rPr>
         <w:rFonts w:ascii="Wingdings" w:hAnsi="Wingdings" w:hint="default"/>
         <w:sz w:val="20"/>
+      </w:rPr>
+    </w:lvl>
+  </w:abstractNum>
+  <w:abstractNum w:abstractNumId="17" w15:restartNumberingAfterBreak="0">
+    <w:nsid w:val="7CB5752A"/>
+    <w:multiLevelType w:val="hybridMultilevel"/>
+    <w:tmpl w:val="3E8855C0"/>
+    <w:lvl w:ilvl="0" w:tplc="0C0A0001">
+      <w:start w:val="1"/>
+      <w:numFmt w:val="bullet"/>
+      <w:lvlText w:val=""/>
+      <w:lvlJc w:val="left"/>
+      <w:pPr>
+        <w:ind w:left="720" w:hanging="360"/>
+      </w:pPr>
+      <w:rPr>
+        <w:rFonts w:ascii="Symbol" w:hAnsi="Symbol" w:hint="default"/>
+      </w:rPr>
+    </w:lvl>
+    <w:lvl w:ilvl="1" w:tplc="0C0A0003" w:tentative="1">
+      <w:start w:val="1"/>
+      <w:numFmt w:val="bullet"/>
+      <w:lvlText w:val="o"/>
+      <w:lvlJc w:val="left"/>
+      <w:pPr>
+        <w:ind w:left="1440" w:hanging="360"/>
+      </w:pPr>
+      <w:rPr>
+        <w:rFonts w:ascii="Courier New" w:hAnsi="Courier New" w:cs="Courier New" w:hint="default"/>
+      </w:rPr>
+    </w:lvl>
+    <w:lvl w:ilvl="2" w:tplc="0C0A0005" w:tentative="1">
+      <w:start w:val="1"/>
+      <w:numFmt w:val="bullet"/>
+      <w:lvlText w:val=""/>
+      <w:lvlJc w:val="left"/>
+      <w:pPr>
+        <w:ind w:left="2160" w:hanging="360"/>
+      </w:pPr>
+      <w:rPr>
+        <w:rFonts w:ascii="Wingdings" w:hAnsi="Wingdings" w:hint="default"/>
+      </w:rPr>
+    </w:lvl>
+    <w:lvl w:ilvl="3" w:tplc="0C0A0001" w:tentative="1">
+      <w:start w:val="1"/>
+      <w:numFmt w:val="bullet"/>
+      <w:lvlText w:val=""/>
+      <w:lvlJc w:val="left"/>
+      <w:pPr>
+        <w:ind w:left="2880" w:hanging="360"/>
+      </w:pPr>
+      <w:rPr>
+        <w:rFonts w:ascii="Symbol" w:hAnsi="Symbol" w:hint="default"/>
+      </w:rPr>
+    </w:lvl>
+    <w:lvl w:ilvl="4" w:tplc="0C0A0003" w:tentative="1">
+      <w:start w:val="1"/>
+      <w:numFmt w:val="bullet"/>
+      <w:lvlText w:val="o"/>
+      <w:lvlJc w:val="left"/>
+      <w:pPr>
+        <w:ind w:left="3600" w:hanging="360"/>
+      </w:pPr>
+      <w:rPr>
+        <w:rFonts w:ascii="Courier New" w:hAnsi="Courier New" w:cs="Courier New" w:hint="default"/>
+      </w:rPr>
+    </w:lvl>
+    <w:lvl w:ilvl="5" w:tplc="0C0A0005" w:tentative="1">
+      <w:start w:val="1"/>
+      <w:numFmt w:val="bullet"/>
+      <w:lvlText w:val=""/>
+      <w:lvlJc w:val="left"/>
+      <w:pPr>
+        <w:ind w:left="4320" w:hanging="360"/>
+      </w:pPr>
+      <w:rPr>
+        <w:rFonts w:ascii="Wingdings" w:hAnsi="Wingdings" w:hint="default"/>
+      </w:rPr>
+    </w:lvl>
+    <w:lvl w:ilvl="6" w:tplc="0C0A0001" w:tentative="1">
+      <w:start w:val="1"/>
+      <w:numFmt w:val="bullet"/>
+      <w:lvlText w:val=""/>
+      <w:lvlJc w:val="left"/>
+      <w:pPr>
+        <w:ind w:left="5040" w:hanging="360"/>
+      </w:pPr>
+      <w:rPr>
+        <w:rFonts w:ascii="Symbol" w:hAnsi="Symbol" w:hint="default"/>
+      </w:rPr>
+    </w:lvl>
+    <w:lvl w:ilvl="7" w:tplc="0C0A0003" w:tentative="1">
+      <w:start w:val="1"/>
+      <w:numFmt w:val="bullet"/>
+      <w:lvlText w:val="o"/>
+      <w:lvlJc w:val="left"/>
+      <w:pPr>
+        <w:ind w:left="5760" w:hanging="360"/>
+      </w:pPr>
+      <w:rPr>
+        <w:rFonts w:ascii="Courier New" w:hAnsi="Courier New" w:cs="Courier New" w:hint="default"/>
+      </w:rPr>
+    </w:lvl>
+    <w:lvl w:ilvl="8" w:tplc="0C0A0005" w:tentative="1">
+      <w:start w:val="1"/>
+      <w:numFmt w:val="bullet"/>
+      <w:lvlText w:val=""/>
+      <w:lvlJc w:val="left"/>
+      <w:pPr>
+        <w:ind w:left="6480" w:hanging="360"/>
+      </w:pPr>
+      <w:rPr>
+        <w:rFonts w:ascii="Wingdings" w:hAnsi="Wingdings" w:hint="default"/>
       </w:rPr>
     </w:lvl>
   </w:abstractNum>
@@ -4424,7 +5380,7 @@
     <w:abstractNumId w:val="0"/>
   </w:num>
   <w:num w:numId="2">
-    <w:abstractNumId w:val="12"/>
+    <w:abstractNumId w:val="15"/>
   </w:num>
   <w:num w:numId="3">
     <w:abstractNumId w:val="0"/>
@@ -4457,7 +5413,7 @@
     </w:lvlOverride>
   </w:num>
   <w:num w:numId="4">
-    <w:abstractNumId w:val="8"/>
+    <w:abstractNumId w:val="10"/>
     <w:lvlOverride w:ilvl="0">
       <w:startOverride w:val="1"/>
     </w:lvlOverride>
@@ -4517,28 +5473,28 @@
     </w:lvlOverride>
   </w:num>
   <w:num w:numId="6">
+    <w:abstractNumId w:val="13"/>
+  </w:num>
+  <w:num w:numId="7">
+    <w:abstractNumId w:val="12"/>
+  </w:num>
+  <w:num w:numId="8">
     <w:abstractNumId w:val="11"/>
   </w:num>
-  <w:num w:numId="7">
-    <w:abstractNumId w:val="10"/>
+  <w:num w:numId="9">
+    <w:abstractNumId w:val="7"/>
   </w:num>
-  <w:num w:numId="8">
-    <w:abstractNumId w:val="9"/>
+  <w:num w:numId="10">
+    <w:abstractNumId w:val="3"/>
   </w:num>
-  <w:num w:numId="9">
+  <w:num w:numId="11">
+    <w:abstractNumId w:val="4"/>
+  </w:num>
+  <w:num w:numId="12">
     <w:abstractNumId w:val="6"/>
   </w:num>
-  <w:num w:numId="10">
-    <w:abstractNumId w:val="2"/>
-  </w:num>
-  <w:num w:numId="11">
-    <w:abstractNumId w:val="3"/>
-  </w:num>
-  <w:num w:numId="12">
+  <w:num w:numId="13">
     <w:abstractNumId w:val="5"/>
-  </w:num>
-  <w:num w:numId="13">
-    <w:abstractNumId w:val="4"/>
     <w:lvlOverride w:ilvl="0">
       <w:startOverride w:val="1"/>
     </w:lvlOverride>
@@ -4568,13 +5524,25 @@
     </w:lvlOverride>
   </w:num>
   <w:num w:numId="14">
-    <w:abstractNumId w:val="7"/>
+    <w:abstractNumId w:val="8"/>
   </w:num>
   <w:num w:numId="15">
-    <w:abstractNumId w:val="13"/>
+    <w:abstractNumId w:val="16"/>
   </w:num>
   <w:num w:numId="16">
+    <w:abstractNumId w:val="2"/>
+  </w:num>
+  <w:num w:numId="17">
+    <w:abstractNumId w:val="14"/>
+  </w:num>
+  <w:num w:numId="18">
     <w:abstractNumId w:val="1"/>
+  </w:num>
+  <w:num w:numId="19">
+    <w:abstractNumId w:val="9"/>
+  </w:num>
+  <w:num w:numId="20">
+    <w:abstractNumId w:val="17"/>
   </w:num>
 </w:numbering>
 </file>
@@ -5066,7 +6034,6 @@
   <w:style w:type="character" w:default="1" w:styleId="Fuentedeprrafopredeter">
     <w:name w:val="Default Paragraph Font"/>
     <w:uiPriority w:val="1"/>
-    <w:semiHidden/>
     <w:unhideWhenUsed/>
   </w:style>
   <w:style w:type="table" w:default="1" w:styleId="Tablanormal">

</xml_diff>

<commit_message>
doc3.1 / Correcion de errores en doc_metodologia y solicitud
</commit_message>
<xml_diff>
--- a/DocumentoCompProyectoMercados_GCC.docx
+++ b/DocumentoCompProyectoMercados_GCC.docx
@@ -1755,6 +1755,39 @@
     </w:p>
     <w:p>
       <w:pPr>
+        <w:numPr>
+          <w:ilvl w:val="0"/>
+          <w:numId w:val="14"/>
+        </w:numPr>
+        <w:tabs>
+          <w:tab w:val="clear" w:pos="720"/>
+          <w:tab w:val="num" w:pos="1152"/>
+        </w:tabs>
+        <w:spacing w:line="360" w:lineRule="auto"/>
+        <w:ind w:left="1512"/>
+        <w:jc w:val="both"/>
+        <w:rPr>
+          <w:rFonts w:ascii="Arial" w:hAnsi="Arial" w:cs="Arial"/>
+          <w:lang w:val="es-ES"/>
+        </w:rPr>
+      </w:pPr>
+      <w:r>
+        <w:rPr>
+          <w:rFonts w:ascii="Arial" w:hAnsi="Arial" w:cs="Arial"/>
+          <w:lang w:val="es-ES"/>
+        </w:rPr>
+        <w:t xml:space="preserve">Mercado Entre </w:t>
+      </w:r>
+      <w:r>
+        <w:rPr>
+          <w:rFonts w:ascii="Arial" w:hAnsi="Arial" w:cs="Arial"/>
+          <w:lang w:val="es-ES"/>
+        </w:rPr>
+        <w:t>Ríos</w:t>
+      </w:r>
+    </w:p>
+    <w:p>
+      <w:pPr>
         <w:pStyle w:val="Ttulo3"/>
       </w:pPr>
       <w:bookmarkStart w:id="7" w:name="_Toc232354998"/>
@@ -1908,7 +1941,6 @@
           <w:b/>
           <w:bCs/>
         </w:rPr>
-        <w:lastRenderedPageBreak/>
         <w:t>Módulo de Reportes</w:t>
       </w:r>
     </w:p>
@@ -2253,6 +2285,7 @@
           <w:rFonts w:ascii="Arial" w:hAnsi="Arial" w:cs="Arial"/>
           <w:lang w:val="es-ES"/>
         </w:rPr>
+        <w:lastRenderedPageBreak/>
         <w:t>1 líder de Proyecto (Project Manager).</w:t>
       </w:r>
     </w:p>
@@ -2279,7 +2312,6 @@
           <w:rFonts w:ascii="Arial" w:hAnsi="Arial" w:cs="Arial"/>
           <w:lang w:val="es-ES"/>
         </w:rPr>
-        <w:lastRenderedPageBreak/>
         <w:t>1 desarrollador Senior.</w:t>
       </w:r>
     </w:p>
@@ -2569,6 +2601,7 @@
           <w:rFonts w:ascii="Arial" w:hAnsi="Arial" w:cs="Arial"/>
           <w:lang w:val="es-ES"/>
         </w:rPr>
+        <w:lastRenderedPageBreak/>
         <w:t xml:space="preserve">Fecha de Solicitud: 15 de </w:t>
       </w:r>
       <w:proofErr w:type="gramStart"/>
@@ -2603,7 +2636,6 @@
           <w:rFonts w:ascii="Arial" w:hAnsi="Arial" w:cs="Arial"/>
           <w:lang w:val="es-ES"/>
         </w:rPr>
-        <w:lastRenderedPageBreak/>
         <w:t>Responsable de la Solicitud: Dirección de Ingresos</w:t>
       </w:r>
     </w:p>
@@ -2631,7 +2663,35 @@
           <w:rFonts w:ascii="Arial" w:hAnsi="Arial" w:cs="Arial"/>
           <w:lang w:val="es-ES"/>
         </w:rPr>
-        <w:t>La administración actual de los mercados municipales (Campesino y Central) presenta graves problemas de centralización, pérdida de información y falta de transparencia operativa. Los registros de comerciantes y la asignación de puestos se gestionan mediante libros físicos propensos al deterioro.</w:t>
+        <w:t>La administración actual de los mercados municipales (Campesino</w:t>
+      </w:r>
+      <w:r>
+        <w:rPr>
+          <w:rFonts w:ascii="Arial" w:hAnsi="Arial" w:cs="Arial"/>
+          <w:lang w:val="es-ES"/>
+        </w:rPr>
+        <w:t>,</w:t>
+      </w:r>
+      <w:r>
+        <w:rPr>
+          <w:rFonts w:ascii="Arial" w:hAnsi="Arial" w:cs="Arial"/>
+          <w:lang w:val="es-ES"/>
+        </w:rPr>
+        <w:t xml:space="preserve"> Central</w:t>
+      </w:r>
+      <w:r>
+        <w:rPr>
+          <w:rFonts w:ascii="Arial" w:hAnsi="Arial" w:cs="Arial"/>
+          <w:lang w:val="es-ES"/>
+        </w:rPr>
+        <w:t>, Entre Ríos</w:t>
+      </w:r>
+      <w:r>
+        <w:rPr>
+          <w:rFonts w:ascii="Arial" w:hAnsi="Arial" w:cs="Arial"/>
+          <w:lang w:val="es-ES"/>
+        </w:rPr>
+        <w:t>) presenta graves problemas de centralización, pérdida de información y falta de transparencia operativa. Los registros de comerciantes y la asignación de puestos se gestionan mediante libros físicos propensos al deterioro.</w:t>
       </w:r>
     </w:p>
     <w:p>
@@ -2707,39 +2767,7 @@
           <w:rFonts w:ascii="Arial" w:hAnsi="Arial" w:cs="Arial"/>
           <w:lang w:val="es-ES"/>
         </w:rPr>
-        <w:t xml:space="preserve">Incremento en la </w:t>
-      </w:r>
-      <w:proofErr w:type="spellStart"/>
-      <w:r>
-        <w:rPr>
-          <w:rFonts w:ascii="Arial" w:hAnsi="Arial" w:cs="Arial"/>
-          <w:lang w:val="es-ES"/>
-        </w:rPr>
-        <w:t>Recaudaci</w:t>
-      </w:r>
-      <w:proofErr w:type="spellEnd"/>
-      <w:r>
-        <w:rPr>
-          <w:rFonts w:ascii="Arial" w:hAnsi="Arial" w:cs="Arial"/>
-          <w:lang w:val="es-ES"/>
-        </w:rPr>
-        <w:t xml:space="preserve"> </w:t>
-      </w:r>
-      <w:proofErr w:type="spellStart"/>
-      <w:r>
-        <w:rPr>
-          <w:rFonts w:ascii="Arial" w:hAnsi="Arial" w:cs="Arial"/>
-          <w:lang w:val="es-ES"/>
-        </w:rPr>
-        <w:t>ón</w:t>
-      </w:r>
-      <w:proofErr w:type="spellEnd"/>
-      <w:r>
-        <w:rPr>
-          <w:rFonts w:ascii="Arial" w:hAnsi="Arial" w:cs="Arial"/>
-          <w:lang w:val="es-ES"/>
-        </w:rPr>
-        <w:t>: Optimización y auditoría del 100% de los cobros de tarifas y patentes por puesto.</w:t>
+        <w:t>Incremento en la Recaudación: Optimización y auditoría del 100% de los cobros de tarifas y patentes por puesto.</w:t>
       </w:r>
     </w:p>
     <w:p>
@@ -6034,6 +6062,7 @@
   <w:style w:type="character" w:default="1" w:styleId="Fuentedeprrafopredeter">
     <w:name w:val="Default Paragraph Font"/>
     <w:uiPriority w:val="1"/>
+    <w:semiHidden/>
     <w:unhideWhenUsed/>
   </w:style>
   <w:style w:type="table" w:default="1" w:styleId="Tablanormal">

</xml_diff>

<commit_message>
doc3.2 / Correcion caratula documento completo
</commit_message>
<xml_diff>
--- a/DocumentoCompProyectoMercados_GCC.docx
+++ b/DocumentoCompProyectoMercados_GCC.docx
@@ -153,7 +153,40 @@
           <w:szCs w:val="32"/>
           <w:lang w:val="es-ES"/>
         </w:rPr>
-        <w:t xml:space="preserve">DOCUMANTACION DE USER STORY MAPPING </w:t>
+        <w:t xml:space="preserve">DOCUMANTACION DE </w:t>
+      </w:r>
+      <w:r>
+        <w:rPr>
+          <w:rFonts w:ascii="Arial" w:hAnsi="Arial" w:cs="Arial"/>
+          <w:b/>
+          <w:bCs/>
+          <w:sz w:val="32"/>
+          <w:szCs w:val="32"/>
+          <w:lang w:val="es-ES"/>
+        </w:rPr>
+        <w:t>PROYECTO DE GESTION DE MERCADOS</w:t>
+      </w:r>
+      <w:r>
+        <w:rPr>
+          <w:rFonts w:ascii="Arial" w:hAnsi="Arial" w:cs="Arial"/>
+          <w:b/>
+          <w:bCs/>
+          <w:sz w:val="32"/>
+          <w:szCs w:val="32"/>
+          <w:lang w:val="es-ES"/>
+        </w:rPr>
+        <w:t xml:space="preserve"> </w:t>
+      </w:r>
+      <w:r>
+        <w:rPr>
+          <w:rFonts w:ascii="Arial" w:hAnsi="Arial" w:cs="Arial"/>
+          <w:b/>
+          <w:bCs/>
+          <w:sz w:val="32"/>
+          <w:szCs w:val="32"/>
+          <w:lang w:val="es-ES"/>
+        </w:rPr>
+        <w:t>MUNICIPALES</w:t>
       </w:r>
     </w:p>
     <w:p>
@@ -237,7 +270,6 @@
           <w:lang w:val="en-US"/>
         </w:rPr>
       </w:pPr>
-      <w:proofErr w:type="spellStart"/>
       <w:r>
         <w:rPr>
           <w:rFonts w:ascii="Arial" w:hAnsi="Arial" w:cs="Arial"/>
@@ -245,9 +277,8 @@
           <w:szCs w:val="28"/>
           <w:lang w:val="en-US"/>
         </w:rPr>
-        <w:t>Fecha</w:t>
-      </w:r>
-      <w:proofErr w:type="spellEnd"/>
+        <w:t xml:space="preserve">Fecha: </w:t>
+      </w:r>
       <w:r>
         <w:rPr>
           <w:rFonts w:ascii="Arial" w:hAnsi="Arial" w:cs="Arial"/>
@@ -255,17 +286,44 @@
           <w:szCs w:val="28"/>
           <w:lang w:val="en-US"/>
         </w:rPr>
-        <w:t>: 03/04/2025</w:t>
-      </w:r>
-    </w:p>
-    <w:p>
-      <w:pPr>
+        <w:t>16</w:t>
+      </w:r>
+      <w:r>
         <w:rPr>
           <w:rFonts w:ascii="Arial" w:hAnsi="Arial" w:cs="Arial"/>
           <w:sz w:val="28"/>
           <w:szCs w:val="28"/>
           <w:lang w:val="en-US"/>
         </w:rPr>
+        <w:t>/0</w:t>
+      </w:r>
+      <w:r>
+        <w:rPr>
+          <w:rFonts w:ascii="Arial" w:hAnsi="Arial" w:cs="Arial"/>
+          <w:sz w:val="28"/>
+          <w:szCs w:val="28"/>
+          <w:lang w:val="en-US"/>
+        </w:rPr>
+        <w:t>6</w:t>
+      </w:r>
+      <w:r>
+        <w:rPr>
+          <w:rFonts w:ascii="Arial" w:hAnsi="Arial" w:cs="Arial"/>
+          <w:sz w:val="28"/>
+          <w:szCs w:val="28"/>
+          <w:lang w:val="en-US"/>
+        </w:rPr>
+        <w:t>/2025</w:t>
+      </w:r>
+    </w:p>
+    <w:p>
+      <w:pPr>
+        <w:rPr>
+          <w:rFonts w:ascii="Arial" w:hAnsi="Arial" w:cs="Arial"/>
+          <w:sz w:val="28"/>
+          <w:szCs w:val="28"/>
+          <w:lang w:val="en-US"/>
+        </w:rPr>
       </w:pPr>
     </w:p>
     <w:p>
@@ -329,7 +387,7 @@
           <w:rFonts w:ascii="Arial" w:hAnsi="Arial" w:cs="Arial"/>
           <w:lang w:val="es-ES"/>
         </w:rPr>
-        <w:t>5</w:t>
+        <w:t>6</w:t>
       </w:r>
     </w:p>
     <w:sdt>
@@ -1959,23 +2017,7 @@
           <w:rFonts w:ascii="Arial" w:hAnsi="Arial" w:cs="Arial"/>
           <w:lang w:val="es-ES"/>
         </w:rPr>
-        <w:t>Proporcionará paneles de control con indicadores clave de desempeño (</w:t>
-      </w:r>
-      <w:proofErr w:type="spellStart"/>
-      <w:r>
-        <w:rPr>
-          <w:rFonts w:ascii="Arial" w:hAnsi="Arial" w:cs="Arial"/>
-          <w:lang w:val="es-ES"/>
-        </w:rPr>
-        <w:t>KPIs</w:t>
-      </w:r>
-      <w:proofErr w:type="spellEnd"/>
-      <w:r>
-        <w:rPr>
-          <w:rFonts w:ascii="Arial" w:hAnsi="Arial" w:cs="Arial"/>
-          <w:lang w:val="es-ES"/>
-        </w:rPr>
-        <w:t>), reportes financieros y reportes mensuales automatizados para la Dirección de Ingresos.</w:t>
+        <w:t>Proporcionará paneles de control con indicadores clave de desempeño (KPIs), reportes financieros y reportes mensuales automatizados para la Dirección de Ingresos.</w:t>
       </w:r>
     </w:p>
     <w:p>
@@ -2221,23 +2263,7 @@
           <w:rFonts w:ascii="Arial" w:hAnsi="Arial" w:cs="Arial"/>
           <w:lang w:val="es-ES"/>
         </w:rPr>
-        <w:t xml:space="preserve">70.000 </w:t>
-      </w:r>
-      <w:proofErr w:type="gramStart"/>
-      <w:r>
-        <w:rPr>
-          <w:rFonts w:ascii="Arial" w:hAnsi="Arial" w:cs="Arial"/>
-          <w:lang w:val="es-ES"/>
-        </w:rPr>
-        <w:t>Bolivianos</w:t>
-      </w:r>
-      <w:proofErr w:type="gramEnd"/>
-      <w:r>
-        <w:rPr>
-          <w:rFonts w:ascii="Arial" w:hAnsi="Arial" w:cs="Arial"/>
-          <w:lang w:val="es-ES"/>
-        </w:rPr>
-        <w:t xml:space="preserve"> (Bs.)</w:t>
+        <w:t>70.000 Bolivianos (Bs.)</w:t>
       </w:r>
     </w:p>
     <w:p>
@@ -2513,23 +2539,7 @@
           <w:rFonts w:ascii="Arial" w:hAnsi="Arial" w:cs="Arial"/>
           <w:lang w:val="es-ES"/>
         </w:rPr>
-        <w:t xml:space="preserve">Enfoque Ágil: La interfaz de usuario, la usabilidad de los módulos y el contacto directo con los comerciantes y administradores de los mercados (Campesino, Central, Entre Ríos) requieren un desarrollo iterativo. El software debe adaptarse rápidamente al </w:t>
-      </w:r>
-      <w:proofErr w:type="spellStart"/>
-      <w:r>
-        <w:rPr>
-          <w:rFonts w:ascii="Arial" w:hAnsi="Arial" w:cs="Arial"/>
-          <w:lang w:val="es-ES"/>
-        </w:rPr>
-        <w:t>feedback</w:t>
-      </w:r>
-      <w:proofErr w:type="spellEnd"/>
-      <w:r>
-        <w:rPr>
-          <w:rFonts w:ascii="Arial" w:hAnsi="Arial" w:cs="Arial"/>
-          <w:lang w:val="es-ES"/>
-        </w:rPr>
-        <w:t xml:space="preserve"> de los usuarios reales en el terreno de manera incremental.</w:t>
+        <w:t>Enfoque Ágil: La interfaz de usuario, la usabilidad de los módulos y el contacto directo con los comerciantes y administradores de los mercados (Campesino, Central, Entre Ríos) requieren un desarrollo iterativo. El software debe adaptarse rápidamente al feedback de los usuarios reales en el terreno de manera incremental.</w:t>
       </w:r>
     </w:p>
     <w:p>
@@ -2602,23 +2612,7 @@
           <w:lang w:val="es-ES"/>
         </w:rPr>
         <w:lastRenderedPageBreak/>
-        <w:t xml:space="preserve">Fecha de Solicitud: 15 de </w:t>
-      </w:r>
-      <w:proofErr w:type="gramStart"/>
-      <w:r>
-        <w:rPr>
-          <w:rFonts w:ascii="Arial" w:hAnsi="Arial" w:cs="Arial"/>
-          <w:lang w:val="es-ES"/>
-        </w:rPr>
-        <w:t>Enero</w:t>
-      </w:r>
-      <w:proofErr w:type="gramEnd"/>
-      <w:r>
-        <w:rPr>
-          <w:rFonts w:ascii="Arial" w:hAnsi="Arial" w:cs="Arial"/>
-          <w:lang w:val="es-ES"/>
-        </w:rPr>
-        <w:t xml:space="preserve"> de 2026</w:t>
+        <w:t>Fecha de Solicitud: 15 de Enero de 2026</w:t>
       </w:r>
     </w:p>
     <w:p>

</xml_diff>

<commit_message>
doc4 / Documento de inception
</commit_message>
<xml_diff>
--- a/DocumentoCompProyectoMercados_GCC.docx
+++ b/DocumentoCompProyectoMercados_GCC.docx
@@ -247,7 +247,6 @@
           <w:rFonts w:ascii="Arial" w:hAnsi="Arial" w:cs="Arial"/>
           <w:sz w:val="28"/>
           <w:szCs w:val="28"/>
-          <w:lang w:val="en-US"/>
         </w:rPr>
       </w:pPr>
       <w:r>
@@ -255,74 +254,74 @@
           <w:rFonts w:ascii="Arial" w:hAnsi="Arial" w:cs="Arial"/>
           <w:sz w:val="28"/>
           <w:szCs w:val="28"/>
-          <w:lang w:val="en-US"/>
-        </w:rPr>
-        <w:t>Materia: MANAGEMENT INFORMATION SYSTEMS</w:t>
-      </w:r>
-    </w:p>
-    <w:p>
-      <w:pPr>
-        <w:jc w:val="center"/>
+        </w:rPr>
+        <w:t xml:space="preserve">Materia: </w:t>
+      </w:r>
+      <w:r>
         <w:rPr>
           <w:rFonts w:ascii="Arial" w:hAnsi="Arial" w:cs="Arial"/>
           <w:sz w:val="28"/>
           <w:szCs w:val="28"/>
-          <w:lang w:val="en-US"/>
-        </w:rPr>
-      </w:pPr>
-      <w:r>
+        </w:rPr>
+        <w:t>SOFTWARE PROJECT MANAGEMENT</w:t>
+      </w:r>
+    </w:p>
+    <w:p>
+      <w:pPr>
+        <w:jc w:val="center"/>
         <w:rPr>
           <w:rFonts w:ascii="Arial" w:hAnsi="Arial" w:cs="Arial"/>
           <w:sz w:val="28"/>
           <w:szCs w:val="28"/>
-          <w:lang w:val="en-US"/>
-        </w:rPr>
-        <w:t xml:space="preserve">Fecha: </w:t>
-      </w:r>
+        </w:rPr>
+      </w:pPr>
       <w:r>
         <w:rPr>
           <w:rFonts w:ascii="Arial" w:hAnsi="Arial" w:cs="Arial"/>
           <w:sz w:val="28"/>
           <w:szCs w:val="28"/>
-          <w:lang w:val="en-US"/>
-        </w:rPr>
-        <w:t>16</w:t>
+        </w:rPr>
+        <w:t xml:space="preserve">Fecha: </w:t>
       </w:r>
       <w:r>
         <w:rPr>
           <w:rFonts w:ascii="Arial" w:hAnsi="Arial" w:cs="Arial"/>
           <w:sz w:val="28"/>
           <w:szCs w:val="28"/>
-          <w:lang w:val="en-US"/>
-        </w:rPr>
-        <w:t>/0</w:t>
+        </w:rPr>
+        <w:t>16</w:t>
       </w:r>
       <w:r>
         <w:rPr>
           <w:rFonts w:ascii="Arial" w:hAnsi="Arial" w:cs="Arial"/>
           <w:sz w:val="28"/>
           <w:szCs w:val="28"/>
-          <w:lang w:val="en-US"/>
-        </w:rPr>
-        <w:t>6</w:t>
+        </w:rPr>
+        <w:t>/0</w:t>
       </w:r>
       <w:r>
         <w:rPr>
           <w:rFonts w:ascii="Arial" w:hAnsi="Arial" w:cs="Arial"/>
           <w:sz w:val="28"/>
           <w:szCs w:val="28"/>
-          <w:lang w:val="en-US"/>
-        </w:rPr>
-        <w:t>/2025</w:t>
-      </w:r>
-    </w:p>
-    <w:p>
-      <w:pPr>
+        </w:rPr>
+        <w:t>6</w:t>
+      </w:r>
+      <w:r>
         <w:rPr>
           <w:rFonts w:ascii="Arial" w:hAnsi="Arial" w:cs="Arial"/>
           <w:sz w:val="28"/>
           <w:szCs w:val="28"/>
-          <w:lang w:val="en-US"/>
+        </w:rPr>
+        <w:t>/2025</w:t>
+      </w:r>
+    </w:p>
+    <w:p>
+      <w:pPr>
+        <w:rPr>
+          <w:rFonts w:ascii="Arial" w:hAnsi="Arial" w:cs="Arial"/>
+          <w:sz w:val="28"/>
+          <w:szCs w:val="28"/>
         </w:rPr>
       </w:pPr>
     </w:p>
@@ -445,7 +444,7 @@
           <w:r>
             <w:fldChar w:fldCharType="separate"/>
           </w:r>
-          <w:hyperlink w:anchor="_Toc232354991" w:history="1">
+          <w:hyperlink w:anchor="_Toc232523450" w:history="1">
             <w:r>
               <w:rPr>
                 <w:rStyle w:val="Hipervnculo"/>
@@ -487,7 +486,7 @@
                 <w:noProof/>
                 <w:webHidden/>
               </w:rPr>
-              <w:instrText xml:space="preserve"> PAGEREF _Toc232354991 \h </w:instrText>
+              <w:instrText xml:space="preserve"> PAGEREF _Toc232523450 \h </w:instrText>
             </w:r>
             <w:r>
               <w:rPr>
@@ -531,7 +530,7 @@
               <w:lang w:val="es-ES" w:eastAsia="es-ES"/>
             </w:rPr>
           </w:pPr>
-          <w:hyperlink w:anchor="_Toc232354992" w:history="1">
+          <w:hyperlink w:anchor="_Toc232523451" w:history="1">
             <w:r>
               <w:rPr>
                 <w:rStyle w:val="Hipervnculo"/>
@@ -573,7 +572,7 @@
                 <w:noProof/>
                 <w:webHidden/>
               </w:rPr>
-              <w:instrText xml:space="preserve"> PAGEREF _Toc232354992 \h </w:instrText>
+              <w:instrText xml:space="preserve"> PAGEREF _Toc232523451 \h </w:instrText>
             </w:r>
             <w:r>
               <w:rPr>
@@ -617,7 +616,7 @@
               <w:lang w:val="es-ES" w:eastAsia="es-ES"/>
             </w:rPr>
           </w:pPr>
-          <w:hyperlink w:anchor="_Toc232354993" w:history="1">
+          <w:hyperlink w:anchor="_Toc232523452" w:history="1">
             <w:r>
               <w:rPr>
                 <w:rStyle w:val="Hipervnculo"/>
@@ -659,7 +658,7 @@
                 <w:noProof/>
                 <w:webHidden/>
               </w:rPr>
-              <w:instrText xml:space="preserve"> PAGEREF _Toc232354993 \h </w:instrText>
+              <w:instrText xml:space="preserve"> PAGEREF _Toc232523452 \h </w:instrText>
             </w:r>
             <w:r>
               <w:rPr>
@@ -703,7 +702,7 @@
               <w:lang w:val="es-ES" w:eastAsia="es-ES"/>
             </w:rPr>
           </w:pPr>
-          <w:hyperlink w:anchor="_Toc232354994" w:history="1">
+          <w:hyperlink w:anchor="_Toc232523453" w:history="1">
             <w:r>
               <w:rPr>
                 <w:rStyle w:val="Hipervnculo"/>
@@ -745,7 +744,7 @@
                 <w:noProof/>
                 <w:webHidden/>
               </w:rPr>
-              <w:instrText xml:space="preserve"> PAGEREF _Toc232354994 \h </w:instrText>
+              <w:instrText xml:space="preserve"> PAGEREF _Toc232523453 \h </w:instrText>
             </w:r>
             <w:r>
               <w:rPr>
@@ -789,7 +788,7 @@
               <w:lang w:val="es-ES" w:eastAsia="es-ES"/>
             </w:rPr>
           </w:pPr>
-          <w:hyperlink w:anchor="_Toc232354995" w:history="1">
+          <w:hyperlink w:anchor="_Toc232523454" w:history="1">
             <w:r>
               <w:rPr>
                 <w:rStyle w:val="Hipervnculo"/>
@@ -831,7 +830,7 @@
                 <w:noProof/>
                 <w:webHidden/>
               </w:rPr>
-              <w:instrText xml:space="preserve"> PAGEREF _Toc232354995 \h </w:instrText>
+              <w:instrText xml:space="preserve"> PAGEREF _Toc232523454 \h </w:instrText>
             </w:r>
             <w:r>
               <w:rPr>
@@ -875,7 +874,7 @@
               <w:lang w:val="es-ES" w:eastAsia="es-ES"/>
             </w:rPr>
           </w:pPr>
-          <w:hyperlink w:anchor="_Toc232354996" w:history="1">
+          <w:hyperlink w:anchor="_Toc232523455" w:history="1">
             <w:r>
               <w:rPr>
                 <w:rStyle w:val="Hipervnculo"/>
@@ -917,7 +916,7 @@
                 <w:noProof/>
                 <w:webHidden/>
               </w:rPr>
-              <w:instrText xml:space="preserve"> PAGEREF _Toc232354996 \h </w:instrText>
+              <w:instrText xml:space="preserve"> PAGEREF _Toc232523455 \h </w:instrText>
             </w:r>
             <w:r>
               <w:rPr>
@@ -961,7 +960,7 @@
               <w:lang w:val="es-ES" w:eastAsia="es-ES"/>
             </w:rPr>
           </w:pPr>
-          <w:hyperlink w:anchor="_Toc232354997" w:history="1">
+          <w:hyperlink w:anchor="_Toc232523456" w:history="1">
             <w:r>
               <w:rPr>
                 <w:rStyle w:val="Hipervnculo"/>
@@ -1003,7 +1002,7 @@
                 <w:noProof/>
                 <w:webHidden/>
               </w:rPr>
-              <w:instrText xml:space="preserve"> PAGEREF _Toc232354997 \h </w:instrText>
+              <w:instrText xml:space="preserve"> PAGEREF _Toc232523456 \h </w:instrText>
             </w:r>
             <w:r>
               <w:rPr>
@@ -1047,7 +1046,7 @@
               <w:lang w:val="es-ES" w:eastAsia="es-ES"/>
             </w:rPr>
           </w:pPr>
-          <w:hyperlink w:anchor="_Toc232354998" w:history="1">
+          <w:hyperlink w:anchor="_Toc232523457" w:history="1">
             <w:r>
               <w:rPr>
                 <w:rStyle w:val="Hipervnculo"/>
@@ -1089,7 +1088,7 @@
                 <w:noProof/>
                 <w:webHidden/>
               </w:rPr>
-              <w:instrText xml:space="preserve"> PAGEREF _Toc232354998 \h </w:instrText>
+              <w:instrText xml:space="preserve"> PAGEREF _Toc232523457 \h </w:instrText>
             </w:r>
             <w:r>
               <w:rPr>
@@ -1133,7 +1132,7 @@
               <w:lang w:val="es-ES" w:eastAsia="es-ES"/>
             </w:rPr>
           </w:pPr>
-          <w:hyperlink w:anchor="_Toc232354999" w:history="1">
+          <w:hyperlink w:anchor="_Toc232523458" w:history="1">
             <w:r>
               <w:rPr>
                 <w:rStyle w:val="Hipervnculo"/>
@@ -1175,7 +1174,7 @@
                 <w:noProof/>
                 <w:webHidden/>
               </w:rPr>
-              <w:instrText xml:space="preserve"> PAGEREF _Toc232354999 \h </w:instrText>
+              <w:instrText xml:space="preserve"> PAGEREF _Toc232523458 \h </w:instrText>
             </w:r>
             <w:r>
               <w:rPr>
@@ -1219,7 +1218,7 @@
               <w:lang w:val="es-ES" w:eastAsia="es-ES"/>
             </w:rPr>
           </w:pPr>
-          <w:hyperlink w:anchor="_Toc232355000" w:history="1">
+          <w:hyperlink w:anchor="_Toc232523459" w:history="1">
             <w:r>
               <w:rPr>
                 <w:rStyle w:val="Hipervnculo"/>
@@ -1261,7 +1260,7 @@
                 <w:noProof/>
                 <w:webHidden/>
               </w:rPr>
-              <w:instrText xml:space="preserve"> PAGEREF _Toc232355000 \h </w:instrText>
+              <w:instrText xml:space="preserve"> PAGEREF _Toc232523459 \h </w:instrText>
             </w:r>
             <w:r>
               <w:rPr>
@@ -1305,7 +1304,7 @@
               <w:lang w:val="es-ES" w:eastAsia="es-ES"/>
             </w:rPr>
           </w:pPr>
-          <w:hyperlink w:anchor="_Toc232355001" w:history="1">
+          <w:hyperlink w:anchor="_Toc232523460" w:history="1">
             <w:r>
               <w:rPr>
                 <w:rStyle w:val="Hipervnculo"/>
@@ -1347,7 +1346,7 @@
                 <w:noProof/>
                 <w:webHidden/>
               </w:rPr>
-              <w:instrText xml:space="preserve"> PAGEREF _Toc232355001 \h </w:instrText>
+              <w:instrText xml:space="preserve"> PAGEREF _Toc232523460 \h </w:instrText>
             </w:r>
             <w:r>
               <w:rPr>
@@ -1368,6 +1367,1296 @@
                 <w:webHidden/>
               </w:rPr>
               <w:t>4</w:t>
+            </w:r>
+            <w:r>
+              <w:rPr>
+                <w:noProof/>
+                <w:webHidden/>
+              </w:rPr>
+              <w:fldChar w:fldCharType="end"/>
+            </w:r>
+          </w:hyperlink>
+        </w:p>
+        <w:p>
+          <w:pPr>
+            <w:pStyle w:val="TDC2"/>
+            <w:tabs>
+              <w:tab w:val="left" w:pos="880"/>
+              <w:tab w:val="right" w:leader="dot" w:pos="9395"/>
+            </w:tabs>
+            <w:rPr>
+              <w:rFonts w:eastAsiaTheme="minorEastAsia"/>
+              <w:noProof/>
+              <w:lang w:val="es-ES" w:eastAsia="es-ES"/>
+            </w:rPr>
+          </w:pPr>
+          <w:hyperlink w:anchor="_Toc232523461" w:history="1">
+            <w:r>
+              <w:rPr>
+                <w:rStyle w:val="Hipervnculo"/>
+                <w:noProof/>
+              </w:rPr>
+              <w:t>1.6.</w:t>
+            </w:r>
+            <w:r>
+              <w:rPr>
+                <w:rFonts w:eastAsiaTheme="minorEastAsia"/>
+                <w:noProof/>
+                <w:lang w:val="es-ES" w:eastAsia="es-ES"/>
+              </w:rPr>
+              <w:tab/>
+            </w:r>
+            <w:r>
+              <w:rPr>
+                <w:rStyle w:val="Hipervnculo"/>
+                <w:noProof/>
+              </w:rPr>
+              <w:t>Presupuesto y Recursos Iniciales</w:t>
+            </w:r>
+            <w:r>
+              <w:rPr>
+                <w:noProof/>
+                <w:webHidden/>
+              </w:rPr>
+              <w:tab/>
+            </w:r>
+            <w:r>
+              <w:rPr>
+                <w:noProof/>
+                <w:webHidden/>
+              </w:rPr>
+              <w:fldChar w:fldCharType="begin"/>
+            </w:r>
+            <w:r>
+              <w:rPr>
+                <w:noProof/>
+                <w:webHidden/>
+              </w:rPr>
+              <w:instrText xml:space="preserve"> PAGEREF _Toc232523461 \h </w:instrText>
+            </w:r>
+            <w:r>
+              <w:rPr>
+                <w:noProof/>
+                <w:webHidden/>
+              </w:rPr>
+            </w:r>
+            <w:r>
+              <w:rPr>
+                <w:noProof/>
+                <w:webHidden/>
+              </w:rPr>
+              <w:fldChar w:fldCharType="separate"/>
+            </w:r>
+            <w:r>
+              <w:rPr>
+                <w:noProof/>
+                <w:webHidden/>
+              </w:rPr>
+              <w:t>4</w:t>
+            </w:r>
+            <w:r>
+              <w:rPr>
+                <w:noProof/>
+                <w:webHidden/>
+              </w:rPr>
+              <w:fldChar w:fldCharType="end"/>
+            </w:r>
+          </w:hyperlink>
+        </w:p>
+        <w:p>
+          <w:pPr>
+            <w:pStyle w:val="TDC1"/>
+            <w:tabs>
+              <w:tab w:val="left" w:pos="440"/>
+              <w:tab w:val="right" w:leader="dot" w:pos="9395"/>
+            </w:tabs>
+            <w:rPr>
+              <w:rFonts w:eastAsiaTheme="minorEastAsia"/>
+              <w:noProof/>
+              <w:lang w:val="es-ES" w:eastAsia="es-ES"/>
+            </w:rPr>
+          </w:pPr>
+          <w:hyperlink w:anchor="_Toc232523462" w:history="1">
+            <w:r>
+              <w:rPr>
+                <w:rStyle w:val="Hipervnculo"/>
+                <w:noProof/>
+              </w:rPr>
+              <w:t>2.</w:t>
+            </w:r>
+            <w:r>
+              <w:rPr>
+                <w:rFonts w:eastAsiaTheme="minorEastAsia"/>
+                <w:noProof/>
+                <w:lang w:val="es-ES" w:eastAsia="es-ES"/>
+              </w:rPr>
+              <w:tab/>
+            </w:r>
+            <w:r>
+              <w:rPr>
+                <w:rStyle w:val="Hipervnculo"/>
+                <w:noProof/>
+              </w:rPr>
+              <w:t>DOCUMENTO DE METODOLOGÍA DE DESARROLLO</w:t>
+            </w:r>
+            <w:r>
+              <w:rPr>
+                <w:noProof/>
+                <w:webHidden/>
+              </w:rPr>
+              <w:tab/>
+            </w:r>
+            <w:r>
+              <w:rPr>
+                <w:noProof/>
+                <w:webHidden/>
+              </w:rPr>
+              <w:fldChar w:fldCharType="begin"/>
+            </w:r>
+            <w:r>
+              <w:rPr>
+                <w:noProof/>
+                <w:webHidden/>
+              </w:rPr>
+              <w:instrText xml:space="preserve"> PAGEREF _Toc232523462 \h </w:instrText>
+            </w:r>
+            <w:r>
+              <w:rPr>
+                <w:noProof/>
+                <w:webHidden/>
+              </w:rPr>
+            </w:r>
+            <w:r>
+              <w:rPr>
+                <w:noProof/>
+                <w:webHidden/>
+              </w:rPr>
+              <w:fldChar w:fldCharType="separate"/>
+            </w:r>
+            <w:r>
+              <w:rPr>
+                <w:noProof/>
+                <w:webHidden/>
+              </w:rPr>
+              <w:t>5</w:t>
+            </w:r>
+            <w:r>
+              <w:rPr>
+                <w:noProof/>
+                <w:webHidden/>
+              </w:rPr>
+              <w:fldChar w:fldCharType="end"/>
+            </w:r>
+          </w:hyperlink>
+        </w:p>
+        <w:p>
+          <w:pPr>
+            <w:pStyle w:val="TDC2"/>
+            <w:tabs>
+              <w:tab w:val="left" w:pos="880"/>
+              <w:tab w:val="right" w:leader="dot" w:pos="9395"/>
+            </w:tabs>
+            <w:rPr>
+              <w:rFonts w:eastAsiaTheme="minorEastAsia"/>
+              <w:noProof/>
+              <w:lang w:val="es-ES" w:eastAsia="es-ES"/>
+            </w:rPr>
+          </w:pPr>
+          <w:hyperlink w:anchor="_Toc232523463" w:history="1">
+            <w:r>
+              <w:rPr>
+                <w:rStyle w:val="Hipervnculo"/>
+                <w:noProof/>
+              </w:rPr>
+              <w:t>2.1.</w:t>
+            </w:r>
+            <w:r>
+              <w:rPr>
+                <w:rFonts w:eastAsiaTheme="minorEastAsia"/>
+                <w:noProof/>
+                <w:lang w:val="es-ES" w:eastAsia="es-ES"/>
+              </w:rPr>
+              <w:tab/>
+            </w:r>
+            <w:r>
+              <w:rPr>
+                <w:rStyle w:val="Hipervnculo"/>
+                <w:noProof/>
+              </w:rPr>
+              <w:t>Enfoque Seleccionado: Metodología Híbrida</w:t>
+            </w:r>
+            <w:r>
+              <w:rPr>
+                <w:noProof/>
+                <w:webHidden/>
+              </w:rPr>
+              <w:tab/>
+            </w:r>
+            <w:r>
+              <w:rPr>
+                <w:noProof/>
+                <w:webHidden/>
+              </w:rPr>
+              <w:fldChar w:fldCharType="begin"/>
+            </w:r>
+            <w:r>
+              <w:rPr>
+                <w:noProof/>
+                <w:webHidden/>
+              </w:rPr>
+              <w:instrText xml:space="preserve"> PAGEREF _Toc232523463 \h </w:instrText>
+            </w:r>
+            <w:r>
+              <w:rPr>
+                <w:noProof/>
+                <w:webHidden/>
+              </w:rPr>
+            </w:r>
+            <w:r>
+              <w:rPr>
+                <w:noProof/>
+                <w:webHidden/>
+              </w:rPr>
+              <w:fldChar w:fldCharType="separate"/>
+            </w:r>
+            <w:r>
+              <w:rPr>
+                <w:noProof/>
+                <w:webHidden/>
+              </w:rPr>
+              <w:t>5</w:t>
+            </w:r>
+            <w:r>
+              <w:rPr>
+                <w:noProof/>
+                <w:webHidden/>
+              </w:rPr>
+              <w:fldChar w:fldCharType="end"/>
+            </w:r>
+          </w:hyperlink>
+        </w:p>
+        <w:p>
+          <w:pPr>
+            <w:pStyle w:val="TDC2"/>
+            <w:tabs>
+              <w:tab w:val="left" w:pos="880"/>
+              <w:tab w:val="right" w:leader="dot" w:pos="9395"/>
+            </w:tabs>
+            <w:rPr>
+              <w:rFonts w:eastAsiaTheme="minorEastAsia"/>
+              <w:noProof/>
+              <w:lang w:val="es-ES" w:eastAsia="es-ES"/>
+            </w:rPr>
+          </w:pPr>
+          <w:hyperlink w:anchor="_Toc232523464" w:history="1">
+            <w:r>
+              <w:rPr>
+                <w:rStyle w:val="Hipervnculo"/>
+                <w:noProof/>
+              </w:rPr>
+              <w:t>2.2.</w:t>
+            </w:r>
+            <w:r>
+              <w:rPr>
+                <w:rFonts w:eastAsiaTheme="minorEastAsia"/>
+                <w:noProof/>
+                <w:lang w:val="es-ES" w:eastAsia="es-ES"/>
+              </w:rPr>
+              <w:tab/>
+            </w:r>
+            <w:r>
+              <w:rPr>
+                <w:rStyle w:val="Hipervnculo"/>
+                <w:noProof/>
+              </w:rPr>
+              <w:t>Justificación del Enfoque Híbrido</w:t>
+            </w:r>
+            <w:r>
+              <w:rPr>
+                <w:noProof/>
+                <w:webHidden/>
+              </w:rPr>
+              <w:tab/>
+            </w:r>
+            <w:r>
+              <w:rPr>
+                <w:noProof/>
+                <w:webHidden/>
+              </w:rPr>
+              <w:fldChar w:fldCharType="begin"/>
+            </w:r>
+            <w:r>
+              <w:rPr>
+                <w:noProof/>
+                <w:webHidden/>
+              </w:rPr>
+              <w:instrText xml:space="preserve"> PAGEREF _Toc232523464 \h </w:instrText>
+            </w:r>
+            <w:r>
+              <w:rPr>
+                <w:noProof/>
+                <w:webHidden/>
+              </w:rPr>
+            </w:r>
+            <w:r>
+              <w:rPr>
+                <w:noProof/>
+                <w:webHidden/>
+              </w:rPr>
+              <w:fldChar w:fldCharType="separate"/>
+            </w:r>
+            <w:r>
+              <w:rPr>
+                <w:noProof/>
+                <w:webHidden/>
+              </w:rPr>
+              <w:t>5</w:t>
+            </w:r>
+            <w:r>
+              <w:rPr>
+                <w:noProof/>
+                <w:webHidden/>
+              </w:rPr>
+              <w:fldChar w:fldCharType="end"/>
+            </w:r>
+          </w:hyperlink>
+        </w:p>
+        <w:p>
+          <w:pPr>
+            <w:pStyle w:val="TDC1"/>
+            <w:tabs>
+              <w:tab w:val="left" w:pos="440"/>
+              <w:tab w:val="right" w:leader="dot" w:pos="9395"/>
+            </w:tabs>
+            <w:rPr>
+              <w:rFonts w:eastAsiaTheme="minorEastAsia"/>
+              <w:noProof/>
+              <w:lang w:val="es-ES" w:eastAsia="es-ES"/>
+            </w:rPr>
+          </w:pPr>
+          <w:hyperlink w:anchor="_Toc232523465" w:history="1">
+            <w:r>
+              <w:rPr>
+                <w:rStyle w:val="Hipervnculo"/>
+                <w:noProof/>
+              </w:rPr>
+              <w:t>3.</w:t>
+            </w:r>
+            <w:r>
+              <w:rPr>
+                <w:rFonts w:eastAsiaTheme="minorEastAsia"/>
+                <w:noProof/>
+                <w:lang w:val="es-ES" w:eastAsia="es-ES"/>
+              </w:rPr>
+              <w:tab/>
+            </w:r>
+            <w:r>
+              <w:rPr>
+                <w:rStyle w:val="Hipervnculo"/>
+                <w:noProof/>
+              </w:rPr>
+              <w:t>SOLICITUD DE PROYECTO</w:t>
+            </w:r>
+            <w:r>
+              <w:rPr>
+                <w:noProof/>
+                <w:webHidden/>
+              </w:rPr>
+              <w:tab/>
+            </w:r>
+            <w:r>
+              <w:rPr>
+                <w:noProof/>
+                <w:webHidden/>
+              </w:rPr>
+              <w:fldChar w:fldCharType="begin"/>
+            </w:r>
+            <w:r>
+              <w:rPr>
+                <w:noProof/>
+                <w:webHidden/>
+              </w:rPr>
+              <w:instrText xml:space="preserve"> PAGEREF _Toc232523465 \h </w:instrText>
+            </w:r>
+            <w:r>
+              <w:rPr>
+                <w:noProof/>
+                <w:webHidden/>
+              </w:rPr>
+            </w:r>
+            <w:r>
+              <w:rPr>
+                <w:noProof/>
+                <w:webHidden/>
+              </w:rPr>
+              <w:fldChar w:fldCharType="separate"/>
+            </w:r>
+            <w:r>
+              <w:rPr>
+                <w:noProof/>
+                <w:webHidden/>
+              </w:rPr>
+              <w:t>5</w:t>
+            </w:r>
+            <w:r>
+              <w:rPr>
+                <w:noProof/>
+                <w:webHidden/>
+              </w:rPr>
+              <w:fldChar w:fldCharType="end"/>
+            </w:r>
+          </w:hyperlink>
+        </w:p>
+        <w:p>
+          <w:pPr>
+            <w:pStyle w:val="TDC2"/>
+            <w:tabs>
+              <w:tab w:val="left" w:pos="880"/>
+              <w:tab w:val="right" w:leader="dot" w:pos="9395"/>
+            </w:tabs>
+            <w:rPr>
+              <w:rFonts w:eastAsiaTheme="minorEastAsia"/>
+              <w:noProof/>
+              <w:lang w:val="es-ES" w:eastAsia="es-ES"/>
+            </w:rPr>
+          </w:pPr>
+          <w:hyperlink w:anchor="_Toc232523466" w:history="1">
+            <w:r>
+              <w:rPr>
+                <w:rStyle w:val="Hipervnculo"/>
+                <w:noProof/>
+              </w:rPr>
+              <w:t>3.1.</w:t>
+            </w:r>
+            <w:r>
+              <w:rPr>
+                <w:rFonts w:eastAsiaTheme="minorEastAsia"/>
+                <w:noProof/>
+                <w:lang w:val="es-ES" w:eastAsia="es-ES"/>
+              </w:rPr>
+              <w:tab/>
+            </w:r>
+            <w:r>
+              <w:rPr>
+                <w:rStyle w:val="Hipervnculo"/>
+                <w:noProof/>
+              </w:rPr>
+              <w:t>Información del Solicitante</w:t>
+            </w:r>
+            <w:r>
+              <w:rPr>
+                <w:noProof/>
+                <w:webHidden/>
+              </w:rPr>
+              <w:tab/>
+            </w:r>
+            <w:r>
+              <w:rPr>
+                <w:noProof/>
+                <w:webHidden/>
+              </w:rPr>
+              <w:fldChar w:fldCharType="begin"/>
+            </w:r>
+            <w:r>
+              <w:rPr>
+                <w:noProof/>
+                <w:webHidden/>
+              </w:rPr>
+              <w:instrText xml:space="preserve"> PAGEREF _Toc232523466 \h </w:instrText>
+            </w:r>
+            <w:r>
+              <w:rPr>
+                <w:noProof/>
+                <w:webHidden/>
+              </w:rPr>
+            </w:r>
+            <w:r>
+              <w:rPr>
+                <w:noProof/>
+                <w:webHidden/>
+              </w:rPr>
+              <w:fldChar w:fldCharType="separate"/>
+            </w:r>
+            <w:r>
+              <w:rPr>
+                <w:noProof/>
+                <w:webHidden/>
+              </w:rPr>
+              <w:t>5</w:t>
+            </w:r>
+            <w:r>
+              <w:rPr>
+                <w:noProof/>
+                <w:webHidden/>
+              </w:rPr>
+              <w:fldChar w:fldCharType="end"/>
+            </w:r>
+          </w:hyperlink>
+        </w:p>
+        <w:p>
+          <w:pPr>
+            <w:pStyle w:val="TDC2"/>
+            <w:tabs>
+              <w:tab w:val="left" w:pos="880"/>
+              <w:tab w:val="right" w:leader="dot" w:pos="9395"/>
+            </w:tabs>
+            <w:rPr>
+              <w:rFonts w:eastAsiaTheme="minorEastAsia"/>
+              <w:noProof/>
+              <w:lang w:val="es-ES" w:eastAsia="es-ES"/>
+            </w:rPr>
+          </w:pPr>
+          <w:hyperlink w:anchor="_Toc232523467" w:history="1">
+            <w:r>
+              <w:rPr>
+                <w:rStyle w:val="Hipervnculo"/>
+                <w:noProof/>
+              </w:rPr>
+              <w:t>3.2.</w:t>
+            </w:r>
+            <w:r>
+              <w:rPr>
+                <w:rFonts w:eastAsiaTheme="minorEastAsia"/>
+                <w:noProof/>
+                <w:lang w:val="es-ES" w:eastAsia="es-ES"/>
+              </w:rPr>
+              <w:tab/>
+            </w:r>
+            <w:r>
+              <w:rPr>
+                <w:rStyle w:val="Hipervnculo"/>
+                <w:noProof/>
+              </w:rPr>
+              <w:t>Descripción del Problema u Oportunidad</w:t>
+            </w:r>
+            <w:r>
+              <w:rPr>
+                <w:noProof/>
+                <w:webHidden/>
+              </w:rPr>
+              <w:tab/>
+            </w:r>
+            <w:r>
+              <w:rPr>
+                <w:noProof/>
+                <w:webHidden/>
+              </w:rPr>
+              <w:fldChar w:fldCharType="begin"/>
+            </w:r>
+            <w:r>
+              <w:rPr>
+                <w:noProof/>
+                <w:webHidden/>
+              </w:rPr>
+              <w:instrText xml:space="preserve"> PAGEREF _Toc232523467 \h </w:instrText>
+            </w:r>
+            <w:r>
+              <w:rPr>
+                <w:noProof/>
+                <w:webHidden/>
+              </w:rPr>
+            </w:r>
+            <w:r>
+              <w:rPr>
+                <w:noProof/>
+                <w:webHidden/>
+              </w:rPr>
+              <w:fldChar w:fldCharType="separate"/>
+            </w:r>
+            <w:r>
+              <w:rPr>
+                <w:noProof/>
+                <w:webHidden/>
+              </w:rPr>
+              <w:t>6</w:t>
+            </w:r>
+            <w:r>
+              <w:rPr>
+                <w:noProof/>
+                <w:webHidden/>
+              </w:rPr>
+              <w:fldChar w:fldCharType="end"/>
+            </w:r>
+          </w:hyperlink>
+        </w:p>
+        <w:p>
+          <w:pPr>
+            <w:pStyle w:val="TDC2"/>
+            <w:tabs>
+              <w:tab w:val="left" w:pos="880"/>
+              <w:tab w:val="right" w:leader="dot" w:pos="9395"/>
+            </w:tabs>
+            <w:rPr>
+              <w:rFonts w:eastAsiaTheme="minorEastAsia"/>
+              <w:noProof/>
+              <w:lang w:val="es-ES" w:eastAsia="es-ES"/>
+            </w:rPr>
+          </w:pPr>
+          <w:hyperlink w:anchor="_Toc232523468" w:history="1">
+            <w:r>
+              <w:rPr>
+                <w:rStyle w:val="Hipervnculo"/>
+                <w:noProof/>
+              </w:rPr>
+              <w:t>3.3.</w:t>
+            </w:r>
+            <w:r>
+              <w:rPr>
+                <w:rFonts w:eastAsiaTheme="minorEastAsia"/>
+                <w:noProof/>
+                <w:lang w:val="es-ES" w:eastAsia="es-ES"/>
+              </w:rPr>
+              <w:tab/>
+            </w:r>
+            <w:r>
+              <w:rPr>
+                <w:rStyle w:val="Hipervnculo"/>
+                <w:noProof/>
+              </w:rPr>
+              <w:t>Descripción de la Solución Propuesta</w:t>
+            </w:r>
+            <w:r>
+              <w:rPr>
+                <w:noProof/>
+                <w:webHidden/>
+              </w:rPr>
+              <w:tab/>
+            </w:r>
+            <w:r>
+              <w:rPr>
+                <w:noProof/>
+                <w:webHidden/>
+              </w:rPr>
+              <w:fldChar w:fldCharType="begin"/>
+            </w:r>
+            <w:r>
+              <w:rPr>
+                <w:noProof/>
+                <w:webHidden/>
+              </w:rPr>
+              <w:instrText xml:space="preserve"> PAGEREF _Toc232523468 \h </w:instrText>
+            </w:r>
+            <w:r>
+              <w:rPr>
+                <w:noProof/>
+                <w:webHidden/>
+              </w:rPr>
+            </w:r>
+            <w:r>
+              <w:rPr>
+                <w:noProof/>
+                <w:webHidden/>
+              </w:rPr>
+              <w:fldChar w:fldCharType="separate"/>
+            </w:r>
+            <w:r>
+              <w:rPr>
+                <w:noProof/>
+                <w:webHidden/>
+              </w:rPr>
+              <w:t>6</w:t>
+            </w:r>
+            <w:r>
+              <w:rPr>
+                <w:noProof/>
+                <w:webHidden/>
+              </w:rPr>
+              <w:fldChar w:fldCharType="end"/>
+            </w:r>
+          </w:hyperlink>
+        </w:p>
+        <w:p>
+          <w:pPr>
+            <w:pStyle w:val="TDC2"/>
+            <w:tabs>
+              <w:tab w:val="left" w:pos="880"/>
+              <w:tab w:val="right" w:leader="dot" w:pos="9395"/>
+            </w:tabs>
+            <w:rPr>
+              <w:rFonts w:eastAsiaTheme="minorEastAsia"/>
+              <w:noProof/>
+              <w:lang w:val="es-ES" w:eastAsia="es-ES"/>
+            </w:rPr>
+          </w:pPr>
+          <w:hyperlink w:anchor="_Toc232523469" w:history="1">
+            <w:r>
+              <w:rPr>
+                <w:rStyle w:val="Hipervnculo"/>
+                <w:noProof/>
+              </w:rPr>
+              <w:t>3.4.</w:t>
+            </w:r>
+            <w:r>
+              <w:rPr>
+                <w:rFonts w:eastAsiaTheme="minorEastAsia"/>
+                <w:noProof/>
+                <w:lang w:val="es-ES" w:eastAsia="es-ES"/>
+              </w:rPr>
+              <w:tab/>
+            </w:r>
+            <w:r>
+              <w:rPr>
+                <w:rStyle w:val="Hipervnculo"/>
+                <w:noProof/>
+              </w:rPr>
+              <w:t>Beneficios Esperados</w:t>
+            </w:r>
+            <w:r>
+              <w:rPr>
+                <w:noProof/>
+                <w:webHidden/>
+              </w:rPr>
+              <w:tab/>
+            </w:r>
+            <w:r>
+              <w:rPr>
+                <w:noProof/>
+                <w:webHidden/>
+              </w:rPr>
+              <w:fldChar w:fldCharType="begin"/>
+            </w:r>
+            <w:r>
+              <w:rPr>
+                <w:noProof/>
+                <w:webHidden/>
+              </w:rPr>
+              <w:instrText xml:space="preserve"> PAGEREF _Toc232523469 \h </w:instrText>
+            </w:r>
+            <w:r>
+              <w:rPr>
+                <w:noProof/>
+                <w:webHidden/>
+              </w:rPr>
+            </w:r>
+            <w:r>
+              <w:rPr>
+                <w:noProof/>
+                <w:webHidden/>
+              </w:rPr>
+              <w:fldChar w:fldCharType="separate"/>
+            </w:r>
+            <w:r>
+              <w:rPr>
+                <w:noProof/>
+                <w:webHidden/>
+              </w:rPr>
+              <w:t>6</w:t>
+            </w:r>
+            <w:r>
+              <w:rPr>
+                <w:noProof/>
+                <w:webHidden/>
+              </w:rPr>
+              <w:fldChar w:fldCharType="end"/>
+            </w:r>
+          </w:hyperlink>
+        </w:p>
+        <w:p>
+          <w:pPr>
+            <w:pStyle w:val="TDC2"/>
+            <w:tabs>
+              <w:tab w:val="left" w:pos="880"/>
+              <w:tab w:val="right" w:leader="dot" w:pos="9395"/>
+            </w:tabs>
+            <w:rPr>
+              <w:rFonts w:eastAsiaTheme="minorEastAsia"/>
+              <w:noProof/>
+              <w:lang w:val="es-ES" w:eastAsia="es-ES"/>
+            </w:rPr>
+          </w:pPr>
+          <w:hyperlink w:anchor="_Toc232523470" w:history="1">
+            <w:r>
+              <w:rPr>
+                <w:rStyle w:val="Hipervnculo"/>
+                <w:noProof/>
+              </w:rPr>
+              <w:t>3.5.</w:t>
+            </w:r>
+            <w:r>
+              <w:rPr>
+                <w:rFonts w:eastAsiaTheme="minorEastAsia"/>
+                <w:noProof/>
+                <w:lang w:val="es-ES" w:eastAsia="es-ES"/>
+              </w:rPr>
+              <w:tab/>
+            </w:r>
+            <w:r>
+              <w:rPr>
+                <w:rStyle w:val="Hipervnculo"/>
+                <w:noProof/>
+              </w:rPr>
+              <w:t>Restricciones Iniciales Conocidas</w:t>
+            </w:r>
+            <w:r>
+              <w:rPr>
+                <w:noProof/>
+                <w:webHidden/>
+              </w:rPr>
+              <w:tab/>
+            </w:r>
+            <w:r>
+              <w:rPr>
+                <w:noProof/>
+                <w:webHidden/>
+              </w:rPr>
+              <w:fldChar w:fldCharType="begin"/>
+            </w:r>
+            <w:r>
+              <w:rPr>
+                <w:noProof/>
+                <w:webHidden/>
+              </w:rPr>
+              <w:instrText xml:space="preserve"> PAGEREF _Toc232523470 \h </w:instrText>
+            </w:r>
+            <w:r>
+              <w:rPr>
+                <w:noProof/>
+                <w:webHidden/>
+              </w:rPr>
+            </w:r>
+            <w:r>
+              <w:rPr>
+                <w:noProof/>
+                <w:webHidden/>
+              </w:rPr>
+              <w:fldChar w:fldCharType="separate"/>
+            </w:r>
+            <w:r>
+              <w:rPr>
+                <w:noProof/>
+                <w:webHidden/>
+              </w:rPr>
+              <w:t>6</w:t>
+            </w:r>
+            <w:r>
+              <w:rPr>
+                <w:noProof/>
+                <w:webHidden/>
+              </w:rPr>
+              <w:fldChar w:fldCharType="end"/>
+            </w:r>
+          </w:hyperlink>
+        </w:p>
+        <w:p>
+          <w:pPr>
+            <w:pStyle w:val="TDC1"/>
+            <w:tabs>
+              <w:tab w:val="left" w:pos="440"/>
+              <w:tab w:val="right" w:leader="dot" w:pos="9395"/>
+            </w:tabs>
+            <w:rPr>
+              <w:rFonts w:eastAsiaTheme="minorEastAsia"/>
+              <w:noProof/>
+              <w:lang w:val="es-ES" w:eastAsia="es-ES"/>
+            </w:rPr>
+          </w:pPr>
+          <w:hyperlink w:anchor="_Toc232523471" w:history="1">
+            <w:r>
+              <w:rPr>
+                <w:rStyle w:val="Hipervnculo"/>
+                <w:noProof/>
+              </w:rPr>
+              <w:t>4.</w:t>
+            </w:r>
+            <w:r>
+              <w:rPr>
+                <w:rFonts w:eastAsiaTheme="minorEastAsia"/>
+                <w:noProof/>
+                <w:lang w:val="es-ES" w:eastAsia="es-ES"/>
+              </w:rPr>
+              <w:tab/>
+            </w:r>
+            <w:r>
+              <w:rPr>
+                <w:rStyle w:val="Hipervnculo"/>
+                <w:noProof/>
+              </w:rPr>
+              <w:t>DOCUMENTO DE INCEPTION DEL PROYECTO</w:t>
+            </w:r>
+            <w:r>
+              <w:rPr>
+                <w:noProof/>
+                <w:webHidden/>
+              </w:rPr>
+              <w:tab/>
+            </w:r>
+            <w:r>
+              <w:rPr>
+                <w:noProof/>
+                <w:webHidden/>
+              </w:rPr>
+              <w:fldChar w:fldCharType="begin"/>
+            </w:r>
+            <w:r>
+              <w:rPr>
+                <w:noProof/>
+                <w:webHidden/>
+              </w:rPr>
+              <w:instrText xml:space="preserve"> PAGEREF _Toc232523471 \h </w:instrText>
+            </w:r>
+            <w:r>
+              <w:rPr>
+                <w:noProof/>
+                <w:webHidden/>
+              </w:rPr>
+            </w:r>
+            <w:r>
+              <w:rPr>
+                <w:noProof/>
+                <w:webHidden/>
+              </w:rPr>
+              <w:fldChar w:fldCharType="separate"/>
+            </w:r>
+            <w:r>
+              <w:rPr>
+                <w:noProof/>
+                <w:webHidden/>
+              </w:rPr>
+              <w:t>7</w:t>
+            </w:r>
+            <w:r>
+              <w:rPr>
+                <w:noProof/>
+                <w:webHidden/>
+              </w:rPr>
+              <w:fldChar w:fldCharType="end"/>
+            </w:r>
+          </w:hyperlink>
+        </w:p>
+        <w:p>
+          <w:pPr>
+            <w:pStyle w:val="TDC2"/>
+            <w:tabs>
+              <w:tab w:val="left" w:pos="880"/>
+              <w:tab w:val="right" w:leader="dot" w:pos="9395"/>
+            </w:tabs>
+            <w:rPr>
+              <w:rFonts w:eastAsiaTheme="minorEastAsia"/>
+              <w:noProof/>
+              <w:lang w:val="es-ES" w:eastAsia="es-ES"/>
+            </w:rPr>
+          </w:pPr>
+          <w:hyperlink w:anchor="_Toc232523472" w:history="1">
+            <w:r>
+              <w:rPr>
+                <w:rStyle w:val="Hipervnculo"/>
+                <w:noProof/>
+              </w:rPr>
+              <w:t>4.1.</w:t>
+            </w:r>
+            <w:r>
+              <w:rPr>
+                <w:rFonts w:eastAsiaTheme="minorEastAsia"/>
+                <w:noProof/>
+                <w:lang w:val="es-ES" w:eastAsia="es-ES"/>
+              </w:rPr>
+              <w:tab/>
+            </w:r>
+            <w:r>
+              <w:rPr>
+                <w:rStyle w:val="Hipervnculo"/>
+                <w:noProof/>
+              </w:rPr>
+              <w:t>El Ascensor (Elevator Pitch)</w:t>
+            </w:r>
+            <w:r>
+              <w:rPr>
+                <w:noProof/>
+                <w:webHidden/>
+              </w:rPr>
+              <w:tab/>
+            </w:r>
+            <w:r>
+              <w:rPr>
+                <w:noProof/>
+                <w:webHidden/>
+              </w:rPr>
+              <w:fldChar w:fldCharType="begin"/>
+            </w:r>
+            <w:r>
+              <w:rPr>
+                <w:noProof/>
+                <w:webHidden/>
+              </w:rPr>
+              <w:instrText xml:space="preserve"> PAGEREF _Toc232523472 \h </w:instrText>
+            </w:r>
+            <w:r>
+              <w:rPr>
+                <w:noProof/>
+                <w:webHidden/>
+              </w:rPr>
+            </w:r>
+            <w:r>
+              <w:rPr>
+                <w:noProof/>
+                <w:webHidden/>
+              </w:rPr>
+              <w:fldChar w:fldCharType="separate"/>
+            </w:r>
+            <w:r>
+              <w:rPr>
+                <w:noProof/>
+                <w:webHidden/>
+              </w:rPr>
+              <w:t>7</w:t>
+            </w:r>
+            <w:r>
+              <w:rPr>
+                <w:noProof/>
+                <w:webHidden/>
+              </w:rPr>
+              <w:fldChar w:fldCharType="end"/>
+            </w:r>
+          </w:hyperlink>
+        </w:p>
+        <w:p>
+          <w:pPr>
+            <w:pStyle w:val="TDC2"/>
+            <w:tabs>
+              <w:tab w:val="left" w:pos="880"/>
+              <w:tab w:val="right" w:leader="dot" w:pos="9395"/>
+            </w:tabs>
+            <w:rPr>
+              <w:rFonts w:eastAsiaTheme="minorEastAsia"/>
+              <w:noProof/>
+              <w:lang w:val="es-ES" w:eastAsia="es-ES"/>
+            </w:rPr>
+          </w:pPr>
+          <w:hyperlink w:anchor="_Toc232523473" w:history="1">
+            <w:r>
+              <w:rPr>
+                <w:rStyle w:val="Hipervnculo"/>
+                <w:noProof/>
+              </w:rPr>
+              <w:t>4.2.</w:t>
+            </w:r>
+            <w:r>
+              <w:rPr>
+                <w:rFonts w:eastAsiaTheme="minorEastAsia"/>
+                <w:noProof/>
+                <w:lang w:val="es-ES" w:eastAsia="es-ES"/>
+              </w:rPr>
+              <w:tab/>
+            </w:r>
+            <w:r>
+              <w:rPr>
+                <w:rStyle w:val="Hipervnculo"/>
+                <w:noProof/>
+              </w:rPr>
+              <w:t>La Caja del Producto (Product Box)</w:t>
+            </w:r>
+            <w:r>
+              <w:rPr>
+                <w:noProof/>
+                <w:webHidden/>
+              </w:rPr>
+              <w:tab/>
+            </w:r>
+            <w:r>
+              <w:rPr>
+                <w:noProof/>
+                <w:webHidden/>
+              </w:rPr>
+              <w:fldChar w:fldCharType="begin"/>
+            </w:r>
+            <w:r>
+              <w:rPr>
+                <w:noProof/>
+                <w:webHidden/>
+              </w:rPr>
+              <w:instrText xml:space="preserve"> PAGEREF _Toc232523473 \h </w:instrText>
+            </w:r>
+            <w:r>
+              <w:rPr>
+                <w:noProof/>
+                <w:webHidden/>
+              </w:rPr>
+            </w:r>
+            <w:r>
+              <w:rPr>
+                <w:noProof/>
+                <w:webHidden/>
+              </w:rPr>
+              <w:fldChar w:fldCharType="separate"/>
+            </w:r>
+            <w:r>
+              <w:rPr>
+                <w:noProof/>
+                <w:webHidden/>
+              </w:rPr>
+              <w:t>7</w:t>
+            </w:r>
+            <w:r>
+              <w:rPr>
+                <w:noProof/>
+                <w:webHidden/>
+              </w:rPr>
+              <w:fldChar w:fldCharType="end"/>
+            </w:r>
+          </w:hyperlink>
+        </w:p>
+        <w:p>
+          <w:pPr>
+            <w:pStyle w:val="TDC2"/>
+            <w:tabs>
+              <w:tab w:val="left" w:pos="880"/>
+              <w:tab w:val="right" w:leader="dot" w:pos="9395"/>
+            </w:tabs>
+            <w:rPr>
+              <w:rFonts w:eastAsiaTheme="minorEastAsia"/>
+              <w:noProof/>
+              <w:lang w:val="es-ES" w:eastAsia="es-ES"/>
+            </w:rPr>
+          </w:pPr>
+          <w:hyperlink w:anchor="_Toc232523474" w:history="1">
+            <w:r>
+              <w:rPr>
+                <w:rStyle w:val="Hipervnculo"/>
+                <w:noProof/>
+              </w:rPr>
+              <w:t>4.3.</w:t>
+            </w:r>
+            <w:r>
+              <w:rPr>
+                <w:rFonts w:eastAsiaTheme="minorEastAsia"/>
+                <w:noProof/>
+                <w:lang w:val="es-ES" w:eastAsia="es-ES"/>
+              </w:rPr>
+              <w:tab/>
+            </w:r>
+            <w:r>
+              <w:rPr>
+                <w:rStyle w:val="Hipervnculo"/>
+                <w:noProof/>
+              </w:rPr>
+              <w:t>Lista de "Lo que es" y "Lo que NO es"</w:t>
+            </w:r>
+            <w:r>
+              <w:rPr>
+                <w:noProof/>
+                <w:webHidden/>
+              </w:rPr>
+              <w:tab/>
+            </w:r>
+            <w:r>
+              <w:rPr>
+                <w:noProof/>
+                <w:webHidden/>
+              </w:rPr>
+              <w:fldChar w:fldCharType="begin"/>
+            </w:r>
+            <w:r>
+              <w:rPr>
+                <w:noProof/>
+                <w:webHidden/>
+              </w:rPr>
+              <w:instrText xml:space="preserve"> PAGEREF _Toc232523474 \h </w:instrText>
+            </w:r>
+            <w:r>
+              <w:rPr>
+                <w:noProof/>
+                <w:webHidden/>
+              </w:rPr>
+            </w:r>
+            <w:r>
+              <w:rPr>
+                <w:noProof/>
+                <w:webHidden/>
+              </w:rPr>
+              <w:fldChar w:fldCharType="separate"/>
+            </w:r>
+            <w:r>
+              <w:rPr>
+                <w:noProof/>
+                <w:webHidden/>
+              </w:rPr>
+              <w:t>8</w:t>
+            </w:r>
+            <w:r>
+              <w:rPr>
+                <w:noProof/>
+                <w:webHidden/>
+              </w:rPr>
+              <w:fldChar w:fldCharType="end"/>
+            </w:r>
+          </w:hyperlink>
+        </w:p>
+        <w:p>
+          <w:pPr>
+            <w:pStyle w:val="TDC2"/>
+            <w:tabs>
+              <w:tab w:val="left" w:pos="880"/>
+              <w:tab w:val="right" w:leader="dot" w:pos="9395"/>
+            </w:tabs>
+            <w:rPr>
+              <w:rFonts w:eastAsiaTheme="minorEastAsia"/>
+              <w:noProof/>
+              <w:lang w:val="es-ES" w:eastAsia="es-ES"/>
+            </w:rPr>
+          </w:pPr>
+          <w:hyperlink w:anchor="_Toc232523475" w:history="1">
+            <w:r>
+              <w:rPr>
+                <w:rStyle w:val="Hipervnculo"/>
+                <w:noProof/>
+              </w:rPr>
+              <w:t>4.4.</w:t>
+            </w:r>
+            <w:r>
+              <w:rPr>
+                <w:rFonts w:eastAsiaTheme="minorEastAsia"/>
+                <w:noProof/>
+                <w:lang w:val="es-ES" w:eastAsia="es-ES"/>
+              </w:rPr>
+              <w:tab/>
+            </w:r>
+            <w:r>
+              <w:rPr>
+                <w:rStyle w:val="Hipervnculo"/>
+                <w:noProof/>
+              </w:rPr>
+              <w:t>Vecinos Cercanos (Interfases e Integraciones)</w:t>
+            </w:r>
+            <w:r>
+              <w:rPr>
+                <w:noProof/>
+                <w:webHidden/>
+              </w:rPr>
+              <w:tab/>
+            </w:r>
+            <w:r>
+              <w:rPr>
+                <w:noProof/>
+                <w:webHidden/>
+              </w:rPr>
+              <w:fldChar w:fldCharType="begin"/>
+            </w:r>
+            <w:r>
+              <w:rPr>
+                <w:noProof/>
+                <w:webHidden/>
+              </w:rPr>
+              <w:instrText xml:space="preserve"> PAGEREF _Toc232523475 \h </w:instrText>
+            </w:r>
+            <w:r>
+              <w:rPr>
+                <w:noProof/>
+                <w:webHidden/>
+              </w:rPr>
+            </w:r>
+            <w:r>
+              <w:rPr>
+                <w:noProof/>
+                <w:webHidden/>
+              </w:rPr>
+              <w:fldChar w:fldCharType="separate"/>
+            </w:r>
+            <w:r>
+              <w:rPr>
+                <w:noProof/>
+                <w:webHidden/>
+              </w:rPr>
+              <w:t>8</w:t>
             </w:r>
             <w:r>
               <w:rPr>
@@ -1415,7 +2704,7 @@
       <w:pPr>
         <w:pStyle w:val="Ttulo1"/>
       </w:pPr>
-      <w:bookmarkStart w:id="0" w:name="_Toc232354991"/>
+      <w:bookmarkStart w:id="0" w:name="_Toc232523450"/>
       <w:r>
         <w:t>ACTA DE CONSTITUCIÓN DEL PROYECTO</w:t>
       </w:r>
@@ -1425,7 +2714,7 @@
       <w:pPr>
         <w:pStyle w:val="Ttulo2"/>
       </w:pPr>
-      <w:bookmarkStart w:id="1" w:name="_Toc232354992"/>
+      <w:bookmarkStart w:id="1" w:name="_Toc232523451"/>
       <w:r>
         <w:t>Información General del Proyecto</w:t>
       </w:r>
@@ -1524,7 +2813,7 @@
       <w:pPr>
         <w:pStyle w:val="Ttulo2"/>
       </w:pPr>
-      <w:bookmarkStart w:id="2" w:name="_Toc232354993"/>
+      <w:bookmarkStart w:id="2" w:name="_Toc232523452"/>
       <w:r>
         <w:t>Propósito y Justificación del Proyecto</w:t>
       </w:r>
@@ -1580,7 +2869,7 @@
       <w:pPr>
         <w:pStyle w:val="Ttulo2"/>
       </w:pPr>
-      <w:bookmarkStart w:id="3" w:name="_Toc232354994"/>
+      <w:bookmarkStart w:id="3" w:name="_Toc232523453"/>
       <w:r>
         <w:t>Objetivos del Proyecto</w:t>
       </w:r>
@@ -1590,7 +2879,7 @@
       <w:pPr>
         <w:pStyle w:val="Ttulo3"/>
       </w:pPr>
-      <w:bookmarkStart w:id="4" w:name="_Toc232354995"/>
+      <w:bookmarkStart w:id="4" w:name="_Toc232523454"/>
       <w:r>
         <w:t>Objetivo General</w:t>
       </w:r>
@@ -1618,7 +2907,7 @@
       <w:pPr>
         <w:pStyle w:val="Ttulo3"/>
       </w:pPr>
-      <w:bookmarkStart w:id="5" w:name="_Toc232354996"/>
+      <w:bookmarkStart w:id="5" w:name="_Toc232523455"/>
       <w:r>
         <w:t>Objetivos Específicos</w:t>
       </w:r>
@@ -1735,7 +3024,7 @@
       <w:pPr>
         <w:pStyle w:val="Ttulo2"/>
       </w:pPr>
-      <w:bookmarkStart w:id="6" w:name="_Toc232354997"/>
+      <w:bookmarkStart w:id="6" w:name="_Toc232523456"/>
       <w:r>
         <w:t>Alcance Inicial del Proyecto</w:t>
       </w:r>
@@ -1848,7 +3137,7 @@
       <w:pPr>
         <w:pStyle w:val="Ttulo3"/>
       </w:pPr>
-      <w:bookmarkStart w:id="7" w:name="_Toc232354998"/>
+      <w:bookmarkStart w:id="7" w:name="_Toc232523457"/>
       <w:r>
         <w:t>Módulos Incluidos en el MVP</w:t>
       </w:r>
@@ -2017,7 +3306,23 @@
           <w:rFonts w:ascii="Arial" w:hAnsi="Arial" w:cs="Arial"/>
           <w:lang w:val="es-ES"/>
         </w:rPr>
-        <w:t>Proporcionará paneles de control con indicadores clave de desempeño (KPIs), reportes financieros y reportes mensuales automatizados para la Dirección de Ingresos.</w:t>
+        <w:t>Proporcionará paneles de control con indicadores clave de desempeño (</w:t>
+      </w:r>
+      <w:proofErr w:type="spellStart"/>
+      <w:r>
+        <w:rPr>
+          <w:rFonts w:ascii="Arial" w:hAnsi="Arial" w:cs="Arial"/>
+          <w:lang w:val="es-ES"/>
+        </w:rPr>
+        <w:t>KPIs</w:t>
+      </w:r>
+      <w:proofErr w:type="spellEnd"/>
+      <w:r>
+        <w:rPr>
+          <w:rFonts w:ascii="Arial" w:hAnsi="Arial" w:cs="Arial"/>
+          <w:lang w:val="es-ES"/>
+        </w:rPr>
+        <w:t>), reportes financieros y reportes mensuales automatizados para la Dirección de Ingresos.</w:t>
       </w:r>
     </w:p>
     <w:p>
@@ -2034,7 +3339,7 @@
       <w:pPr>
         <w:pStyle w:val="Ttulo2"/>
       </w:pPr>
-      <w:bookmarkStart w:id="8" w:name="_Toc232354999"/>
+      <w:bookmarkStart w:id="8" w:name="_Toc232523458"/>
       <w:r>
         <w:t>Restricciones y Supuestos</w:t>
       </w:r>
@@ -2044,7 +3349,7 @@
       <w:pPr>
         <w:pStyle w:val="Ttulo3"/>
       </w:pPr>
-      <w:bookmarkStart w:id="9" w:name="_Toc232355000"/>
+      <w:bookmarkStart w:id="9" w:name="_Toc232523459"/>
       <w:r>
         <w:t>Restricciones</w:t>
       </w:r>
@@ -2130,7 +3435,7 @@
       <w:pPr>
         <w:pStyle w:val="Ttulo3"/>
       </w:pPr>
-      <w:bookmarkStart w:id="10" w:name="_Toc232355001"/>
+      <w:bookmarkStart w:id="10" w:name="_Toc232523460"/>
       <w:r>
         <w:t>Supuestos</w:t>
       </w:r>
@@ -2222,9 +3527,11 @@
       <w:pPr>
         <w:pStyle w:val="Ttulo2"/>
       </w:pPr>
+      <w:bookmarkStart w:id="11" w:name="_Toc232523461"/>
       <w:r>
         <w:t>Presupuesto y Recursos Iniciales</w:t>
       </w:r>
+      <w:bookmarkEnd w:id="11"/>
     </w:p>
     <w:p>
       <w:pPr>
@@ -2263,7 +3570,23 @@
           <w:rFonts w:ascii="Arial" w:hAnsi="Arial" w:cs="Arial"/>
           <w:lang w:val="es-ES"/>
         </w:rPr>
-        <w:t>70.000 Bolivianos (Bs.)</w:t>
+        <w:t xml:space="preserve">70.000 </w:t>
+      </w:r>
+      <w:proofErr w:type="gramStart"/>
+      <w:r>
+        <w:rPr>
+          <w:rFonts w:ascii="Arial" w:hAnsi="Arial" w:cs="Arial"/>
+          <w:lang w:val="es-ES"/>
+        </w:rPr>
+        <w:t>Bolivianos</w:t>
+      </w:r>
+      <w:proofErr w:type="gramEnd"/>
+      <w:r>
+        <w:rPr>
+          <w:rFonts w:ascii="Arial" w:hAnsi="Arial" w:cs="Arial"/>
+          <w:lang w:val="es-ES"/>
+        </w:rPr>
+        <w:t xml:space="preserve"> (Bs.)</w:t>
       </w:r>
     </w:p>
     <w:p>
@@ -2432,18 +3755,22 @@
         <w:pStyle w:val="Ttulo1"/>
         <w:jc w:val="both"/>
       </w:pPr>
+      <w:bookmarkStart w:id="12" w:name="_Toc232523462"/>
       <w:r>
         <w:t>DOCUMENTO DE METODOLOGÍA DE DESARROLLO</w:t>
       </w:r>
+      <w:bookmarkEnd w:id="12"/>
     </w:p>
     <w:p>
       <w:pPr>
         <w:pStyle w:val="Ttulo2"/>
         <w:jc w:val="both"/>
       </w:pPr>
+      <w:bookmarkStart w:id="13" w:name="_Toc232523463"/>
       <w:r>
         <w:t>Enfoque Seleccionado: Metodología Híbrida</w:t>
       </w:r>
+      <w:bookmarkEnd w:id="13"/>
     </w:p>
     <w:p>
       <w:pPr>
@@ -2468,9 +3795,11 @@
         <w:pStyle w:val="Ttulo2"/>
         <w:jc w:val="both"/>
       </w:pPr>
+      <w:bookmarkStart w:id="14" w:name="_Toc232523464"/>
       <w:r>
         <w:t>Justificación del Enfoque Híbrido</w:t>
       </w:r>
+      <w:bookmarkEnd w:id="14"/>
     </w:p>
     <w:p>
       <w:pPr>
@@ -2539,7 +3868,23 @@
           <w:rFonts w:ascii="Arial" w:hAnsi="Arial" w:cs="Arial"/>
           <w:lang w:val="es-ES"/>
         </w:rPr>
-        <w:t>Enfoque Ágil: La interfaz de usuario, la usabilidad de los módulos y el contacto directo con los comerciantes y administradores de los mercados (Campesino, Central, Entre Ríos) requieren un desarrollo iterativo. El software debe adaptarse rápidamente al feedback de los usuarios reales en el terreno de manera incremental.</w:t>
+        <w:t xml:space="preserve">Enfoque Ágil: La interfaz de usuario, la usabilidad de los módulos y el contacto directo con los comerciantes y administradores de los mercados (Campesino, Central, Entre Ríos) requieren un desarrollo iterativo. El software debe adaptarse rápidamente al </w:t>
+      </w:r>
+      <w:proofErr w:type="spellStart"/>
+      <w:r>
+        <w:rPr>
+          <w:rFonts w:ascii="Arial" w:hAnsi="Arial" w:cs="Arial"/>
+          <w:lang w:val="es-ES"/>
+        </w:rPr>
+        <w:t>feedback</w:t>
+      </w:r>
+      <w:proofErr w:type="spellEnd"/>
+      <w:r>
+        <w:rPr>
+          <w:rFonts w:ascii="Arial" w:hAnsi="Arial" w:cs="Arial"/>
+          <w:lang w:val="es-ES"/>
+        </w:rPr>
+        <w:t xml:space="preserve"> de los usuarios reales en el terreno de manera incremental.</w:t>
       </w:r>
     </w:p>
     <w:p>
@@ -2547,18 +3892,22 @@
         <w:pStyle w:val="Ttulo1"/>
         <w:jc w:val="both"/>
       </w:pPr>
+      <w:bookmarkStart w:id="15" w:name="_Toc232523465"/>
       <w:r>
         <w:t>SOLICITUD DE PROYECTO</w:t>
       </w:r>
+      <w:bookmarkEnd w:id="15"/>
     </w:p>
     <w:p>
       <w:pPr>
         <w:pStyle w:val="Ttulo2"/>
         <w:jc w:val="both"/>
       </w:pPr>
+      <w:bookmarkStart w:id="16" w:name="_Toc232523466"/>
       <w:r>
         <w:t>Información del Solicitante</w:t>
       </w:r>
+      <w:bookmarkEnd w:id="16"/>
     </w:p>
     <w:p>
       <w:pPr>
@@ -2612,7 +3961,23 @@
           <w:lang w:val="es-ES"/>
         </w:rPr>
         <w:lastRenderedPageBreak/>
-        <w:t>Fecha de Solicitud: 15 de Enero de 2026</w:t>
+        <w:t xml:space="preserve">Fecha de Solicitud: 15 de </w:t>
+      </w:r>
+      <w:proofErr w:type="gramStart"/>
+      <w:r>
+        <w:rPr>
+          <w:rFonts w:ascii="Arial" w:hAnsi="Arial" w:cs="Arial"/>
+          <w:lang w:val="es-ES"/>
+        </w:rPr>
+        <w:t>Enero</w:t>
+      </w:r>
+      <w:proofErr w:type="gramEnd"/>
+      <w:r>
+        <w:rPr>
+          <w:rFonts w:ascii="Arial" w:hAnsi="Arial" w:cs="Arial"/>
+          <w:lang w:val="es-ES"/>
+        </w:rPr>
+        <w:t xml:space="preserve"> de 2026</w:t>
       </w:r>
     </w:p>
     <w:p>
@@ -2638,9 +4003,11 @@
         <w:pStyle w:val="Ttulo2"/>
         <w:jc w:val="both"/>
       </w:pPr>
+      <w:bookmarkStart w:id="17" w:name="_Toc232523467"/>
       <w:r>
         <w:t>Descripción del Problema u Oportunidad</w:t>
       </w:r>
+      <w:bookmarkEnd w:id="17"/>
     </w:p>
     <w:p>
       <w:pPr>
@@ -2711,9 +4078,11 @@
         <w:pStyle w:val="Ttulo2"/>
         <w:jc w:val="both"/>
       </w:pPr>
+      <w:bookmarkStart w:id="18" w:name="_Toc232523468"/>
       <w:r>
         <w:t>Descripción de la Solución Propuesta</w:t>
       </w:r>
+      <w:bookmarkEnd w:id="18"/>
     </w:p>
     <w:p>
       <w:pPr>
@@ -2738,9 +4107,11 @@
         <w:pStyle w:val="Ttulo2"/>
         <w:jc w:val="both"/>
       </w:pPr>
+      <w:bookmarkStart w:id="19" w:name="_Toc232523469"/>
       <w:r>
         <w:t>Beneficios Esperados</w:t>
       </w:r>
+      <w:bookmarkEnd w:id="19"/>
     </w:p>
     <w:p>
       <w:pPr>
@@ -2835,9 +4206,11 @@
         <w:pStyle w:val="Ttulo2"/>
         <w:jc w:val="both"/>
       </w:pPr>
+      <w:bookmarkStart w:id="20" w:name="_Toc232523470"/>
       <w:r>
         <w:t>Restricciones Iniciales Conocidas</w:t>
       </w:r>
+      <w:bookmarkEnd w:id="20"/>
     </w:p>
     <w:p>
       <w:pPr>
@@ -2904,6 +4277,646 @@
         </w:rPr>
         <w:lastRenderedPageBreak/>
         <w:t>Cumplimiento Normativo: El sistema debe ceñirse estrictamente a las Leyes Autonómicas Municipales de Sucre vigentes y las regulaciones del Ministerio de Salud (para licencias sanitarias).</w:t>
+      </w:r>
+    </w:p>
+    <w:p>
+      <w:pPr>
+        <w:pStyle w:val="Ttulo1"/>
+      </w:pPr>
+      <w:bookmarkStart w:id="21" w:name="_Toc232523471"/>
+      <w:r>
+        <w:t>DOCUMENTO</w:t>
+      </w:r>
+      <w:r>
+        <w:t xml:space="preserve"> </w:t>
+      </w:r>
+      <w:r>
+        <w:t>DE</w:t>
+      </w:r>
+      <w:r>
+        <w:t xml:space="preserve"> </w:t>
+      </w:r>
+      <w:r>
+        <w:t>INCEPTION</w:t>
+      </w:r>
+      <w:r>
+        <w:t xml:space="preserve"> </w:t>
+      </w:r>
+      <w:r>
+        <w:t xml:space="preserve">DEL </w:t>
+      </w:r>
+      <w:r>
+        <w:t>P</w:t>
+      </w:r>
+      <w:r>
+        <w:t>ROYECTO</w:t>
+      </w:r>
+      <w:bookmarkEnd w:id="21"/>
+    </w:p>
+    <w:p>
+      <w:pPr>
+        <w:spacing w:line="360" w:lineRule="auto"/>
+        <w:rPr>
+          <w:rFonts w:ascii="Arial" w:hAnsi="Arial" w:cs="Arial"/>
+          <w:lang w:val="es-ES"/>
+        </w:rPr>
+      </w:pPr>
+      <w:r>
+        <w:rPr>
+          <w:rFonts w:ascii="Arial" w:hAnsi="Arial" w:cs="Arial"/>
+          <w:lang w:val="es-ES"/>
+        </w:rPr>
+        <w:t>Este documento resume los acuerdos logrados en las sesiones de alineación inicial entre el equipo de desarrollo y los representantes técnicos de la Alcaldía de Sucre para definir la visión compartida del sistema.</w:t>
+      </w:r>
+    </w:p>
+    <w:p>
+      <w:pPr>
+        <w:pStyle w:val="Ttulo2"/>
+      </w:pPr>
+      <w:bookmarkStart w:id="22" w:name="_Toc232523472"/>
+      <w:r>
+        <w:t>El Ascensor (</w:t>
+      </w:r>
+      <w:proofErr w:type="spellStart"/>
+      <w:r>
+        <w:t>Elevator</w:t>
+      </w:r>
+      <w:proofErr w:type="spellEnd"/>
+      <w:r>
+        <w:t xml:space="preserve"> Pitch)</w:t>
+      </w:r>
+      <w:bookmarkEnd w:id="22"/>
+    </w:p>
+    <w:p>
+      <w:pPr>
+        <w:spacing w:line="360" w:lineRule="auto"/>
+        <w:ind w:left="792"/>
+        <w:rPr>
+          <w:rFonts w:ascii="Arial" w:hAnsi="Arial" w:cs="Arial"/>
+          <w:lang w:val="es-ES"/>
+        </w:rPr>
+      </w:pPr>
+      <w:r>
+        <w:rPr>
+          <w:rFonts w:ascii="Arial" w:hAnsi="Arial" w:cs="Arial"/>
+          <w:lang w:val="es-ES"/>
+        </w:rPr>
+        <w:t>Para la Dirección de Ingresos de la Alcaldía de Sucre, que sufre de ineficiencias y pérdidas económicas debido al control manual de puestos y cobro de patentes, el Sistema de Gestión para Mercados Municipales es una plataforma web centralizada. A diferencia del registro actual en libros físicos obsoletos, nuestro producto permite automatizar la recaudación, auditar de forma transparente el estado legal de los comerciantes y controlar las licencias sanitarias en tiempo real, garantizando la entrega de un MVP funcional y auditable en un plazo estricto de 6 meses con un presupuesto optimizado.</w:t>
+      </w:r>
+    </w:p>
+    <w:p>
+      <w:pPr>
+        <w:pStyle w:val="Ttulo2"/>
+      </w:pPr>
+      <w:bookmarkStart w:id="23" w:name="_Toc232523473"/>
+      <w:r>
+        <w:t>La Caja del Producto (</w:t>
+      </w:r>
+      <w:proofErr w:type="spellStart"/>
+      <w:r>
+        <w:t>Product</w:t>
+      </w:r>
+      <w:proofErr w:type="spellEnd"/>
+      <w:r>
+        <w:t xml:space="preserve"> Box)</w:t>
+      </w:r>
+      <w:bookmarkEnd w:id="23"/>
+    </w:p>
+    <w:p>
+      <w:pPr>
+        <w:spacing w:line="360" w:lineRule="auto"/>
+        <w:ind w:left="708"/>
+        <w:rPr>
+          <w:rFonts w:ascii="Arial" w:hAnsi="Arial" w:cs="Arial"/>
+          <w:lang w:val="es-ES"/>
+        </w:rPr>
+      </w:pPr>
+      <w:r>
+        <w:rPr>
+          <w:rFonts w:ascii="Arial" w:hAnsi="Arial" w:cs="Arial"/>
+          <w:lang w:val="es-ES"/>
+        </w:rPr>
+        <w:t>Si el sistema se vendiera en una caja en una tienda, estos serían sus tres mensajes principales de marketing técnico:</w:t>
+      </w:r>
+    </w:p>
+    <w:p>
+      <w:pPr>
+        <w:numPr>
+          <w:ilvl w:val="0"/>
+          <w:numId w:val="21"/>
+        </w:numPr>
+        <w:tabs>
+          <w:tab w:val="clear" w:pos="720"/>
+          <w:tab w:val="num" w:pos="1428"/>
+        </w:tabs>
+        <w:spacing w:line="360" w:lineRule="auto"/>
+        <w:ind w:left="1428"/>
+        <w:rPr>
+          <w:rFonts w:ascii="Arial" w:hAnsi="Arial" w:cs="Arial"/>
+          <w:lang w:val="es-ES"/>
+        </w:rPr>
+      </w:pPr>
+      <w:r>
+        <w:rPr>
+          <w:rFonts w:ascii="Arial" w:hAnsi="Arial" w:cs="Arial"/>
+          <w:b/>
+          <w:bCs/>
+          <w:lang w:val="es-ES"/>
+        </w:rPr>
+        <w:t>Recaudación Cero Fugas:</w:t>
+      </w:r>
+      <w:r>
+        <w:rPr>
+          <w:rFonts w:ascii="Arial" w:hAnsi="Arial" w:cs="Arial"/>
+          <w:lang w:val="es-ES"/>
+        </w:rPr>
+        <w:t xml:space="preserve"> Monitoreo financiero minuto a minuto de las tarifas de los mercados Central, Campesino y Entre Ríos.</w:t>
+      </w:r>
+    </w:p>
+    <w:p>
+      <w:pPr>
+        <w:numPr>
+          <w:ilvl w:val="0"/>
+          <w:numId w:val="21"/>
+        </w:numPr>
+        <w:tabs>
+          <w:tab w:val="clear" w:pos="720"/>
+          <w:tab w:val="num" w:pos="1428"/>
+        </w:tabs>
+        <w:spacing w:line="360" w:lineRule="auto"/>
+        <w:ind w:left="1428"/>
+        <w:rPr>
+          <w:rFonts w:ascii="Arial" w:hAnsi="Arial" w:cs="Arial"/>
+          <w:lang w:val="es-ES"/>
+        </w:rPr>
+      </w:pPr>
+      <w:r>
+        <w:rPr>
+          <w:rFonts w:ascii="Arial" w:hAnsi="Arial" w:cs="Arial"/>
+          <w:b/>
+          <w:bCs/>
+          <w:lang w:val="es-ES"/>
+        </w:rPr>
+        <w:t>Sanidad Bajo Control:</w:t>
+      </w:r>
+      <w:r>
+        <w:rPr>
+          <w:rFonts w:ascii="Arial" w:hAnsi="Arial" w:cs="Arial"/>
+          <w:lang w:val="es-ES"/>
+        </w:rPr>
+        <w:t xml:space="preserve"> Alertas automáticas para evitar que comerciantes con licencias de salud vencidas operen en los puestos.</w:t>
+      </w:r>
+    </w:p>
+    <w:p>
+      <w:pPr>
+        <w:numPr>
+          <w:ilvl w:val="0"/>
+          <w:numId w:val="21"/>
+        </w:numPr>
+        <w:tabs>
+          <w:tab w:val="clear" w:pos="720"/>
+          <w:tab w:val="num" w:pos="1428"/>
+        </w:tabs>
+        <w:spacing w:line="360" w:lineRule="auto"/>
+        <w:ind w:left="1428"/>
+        <w:rPr>
+          <w:rFonts w:ascii="Arial" w:hAnsi="Arial" w:cs="Arial"/>
+          <w:lang w:val="es-ES"/>
+        </w:rPr>
+      </w:pPr>
+      <w:r>
+        <w:rPr>
+          <w:rFonts w:ascii="Arial" w:hAnsi="Arial" w:cs="Arial"/>
+          <w:b/>
+          <w:bCs/>
+          <w:lang w:val="es-ES"/>
+        </w:rPr>
+        <w:t>Reportes a un Clic:</w:t>
+      </w:r>
+      <w:r>
+        <w:rPr>
+          <w:rFonts w:ascii="Arial" w:hAnsi="Arial" w:cs="Arial"/>
+          <w:lang w:val="es-ES"/>
+        </w:rPr>
+        <w:t xml:space="preserve"> Olvídese de consolidar datos durante semanas; envíe el informe mensual a la Dirección de Ingresos de forma automática.</w:t>
+      </w:r>
+    </w:p>
+    <w:p>
+      <w:pPr>
+        <w:spacing w:line="360" w:lineRule="auto"/>
+        <w:ind w:left="1428"/>
+        <w:rPr>
+          <w:rFonts w:ascii="Arial" w:hAnsi="Arial" w:cs="Arial"/>
+          <w:b/>
+          <w:bCs/>
+          <w:lang w:val="es-ES"/>
+        </w:rPr>
+      </w:pPr>
+    </w:p>
+    <w:p>
+      <w:pPr>
+        <w:spacing w:line="360" w:lineRule="auto"/>
+        <w:ind w:left="1428"/>
+        <w:rPr>
+          <w:rFonts w:ascii="Arial" w:hAnsi="Arial" w:cs="Arial"/>
+          <w:b/>
+          <w:bCs/>
+          <w:lang w:val="es-ES"/>
+        </w:rPr>
+      </w:pPr>
+    </w:p>
+    <w:p>
+      <w:pPr>
+        <w:spacing w:line="360" w:lineRule="auto"/>
+        <w:ind w:left="1428"/>
+        <w:rPr>
+          <w:rFonts w:ascii="Arial" w:hAnsi="Arial" w:cs="Arial"/>
+          <w:lang w:val="es-ES"/>
+        </w:rPr>
+      </w:pPr>
+    </w:p>
+    <w:p>
+      <w:pPr>
+        <w:pStyle w:val="Ttulo2"/>
+      </w:pPr>
+      <w:bookmarkStart w:id="24" w:name="_Toc232523474"/>
+      <w:r>
+        <w:lastRenderedPageBreak/>
+        <w:t>Lista de "Lo que es" y "Lo que NO es"</w:t>
+      </w:r>
+      <w:bookmarkEnd w:id="24"/>
+    </w:p>
+    <w:tbl>
+      <w:tblPr>
+        <w:tblStyle w:val="Tablaconcuadrcula"/>
+        <w:tblW w:w="0" w:type="auto"/>
+        <w:tblLook w:val="04A0" w:firstRow="1" w:lastRow="0" w:firstColumn="1" w:lastColumn="0" w:noHBand="0" w:noVBand="1"/>
+      </w:tblPr>
+      <w:tblGrid>
+        <w:gridCol w:w="4374"/>
+        <w:gridCol w:w="4976"/>
+      </w:tblGrid>
+      <w:tr>
+        <w:tc>
+          <w:tcPr>
+            <w:tcW w:w="0" w:type="auto"/>
+            <w:hideMark/>
+          </w:tcPr>
+          <w:p>
+            <w:pPr>
+              <w:spacing w:after="160" w:line="360" w:lineRule="auto"/>
+              <w:rPr>
+                <w:rFonts w:ascii="Arial" w:hAnsi="Arial" w:cs="Arial"/>
+                <w:b/>
+                <w:bCs/>
+                <w:lang w:val="es-ES"/>
+              </w:rPr>
+            </w:pPr>
+            <w:r>
+              <w:rPr>
+                <w:rFonts w:ascii="Arial" w:hAnsi="Arial" w:cs="Arial"/>
+                <w:b/>
+                <w:bCs/>
+                <w:lang w:val="es-ES"/>
+              </w:rPr>
+              <w:t>Lo que el Sistema ES</w:t>
+            </w:r>
+          </w:p>
+        </w:tc>
+        <w:tc>
+          <w:tcPr>
+            <w:tcW w:w="0" w:type="auto"/>
+            <w:hideMark/>
+          </w:tcPr>
+          <w:p>
+            <w:pPr>
+              <w:spacing w:after="160" w:line="360" w:lineRule="auto"/>
+              <w:rPr>
+                <w:rFonts w:ascii="Arial" w:hAnsi="Arial" w:cs="Arial"/>
+                <w:b/>
+                <w:bCs/>
+                <w:lang w:val="es-ES"/>
+              </w:rPr>
+            </w:pPr>
+            <w:r>
+              <w:rPr>
+                <w:rFonts w:ascii="Arial" w:hAnsi="Arial" w:cs="Arial"/>
+                <w:b/>
+                <w:bCs/>
+                <w:lang w:val="es-ES"/>
+              </w:rPr>
+              <w:t>Lo que el Sistema NO ES</w:t>
+            </w:r>
+          </w:p>
+        </w:tc>
+      </w:tr>
+      <w:tr>
+        <w:tc>
+          <w:tcPr>
+            <w:tcW w:w="0" w:type="auto"/>
+            <w:hideMark/>
+          </w:tcPr>
+          <w:p>
+            <w:pPr>
+              <w:spacing w:after="160" w:line="360" w:lineRule="auto"/>
+              <w:rPr>
+                <w:rFonts w:ascii="Arial" w:hAnsi="Arial" w:cs="Arial"/>
+                <w:lang w:val="es-ES"/>
+              </w:rPr>
+            </w:pPr>
+            <w:r>
+              <w:rPr>
+                <w:rFonts w:ascii="Arial" w:hAnsi="Arial" w:cs="Arial"/>
+                <w:lang w:val="es-ES"/>
+              </w:rPr>
+              <w:t>Es una plataforma web para la administración interna de la Alcaldía.</w:t>
+            </w:r>
+          </w:p>
+        </w:tc>
+        <w:tc>
+          <w:tcPr>
+            <w:tcW w:w="0" w:type="auto"/>
+            <w:hideMark/>
+          </w:tcPr>
+          <w:p>
+            <w:pPr>
+              <w:spacing w:after="160" w:line="360" w:lineRule="auto"/>
+              <w:rPr>
+                <w:rFonts w:ascii="Arial" w:hAnsi="Arial" w:cs="Arial"/>
+                <w:lang w:val="es-ES"/>
+              </w:rPr>
+            </w:pPr>
+            <w:r>
+              <w:rPr>
+                <w:rFonts w:ascii="Arial" w:hAnsi="Arial" w:cs="Arial"/>
+                <w:lang w:val="es-ES"/>
+              </w:rPr>
+              <w:t>No es una app móvil para que los ciudadanos compren productos del mercado.</w:t>
+            </w:r>
+          </w:p>
+        </w:tc>
+      </w:tr>
+      <w:tr>
+        <w:tc>
+          <w:tcPr>
+            <w:tcW w:w="0" w:type="auto"/>
+            <w:hideMark/>
+          </w:tcPr>
+          <w:p>
+            <w:pPr>
+              <w:spacing w:after="160" w:line="360" w:lineRule="auto"/>
+              <w:rPr>
+                <w:rFonts w:ascii="Arial" w:hAnsi="Arial" w:cs="Arial"/>
+                <w:lang w:val="es-ES"/>
+              </w:rPr>
+            </w:pPr>
+            <w:r>
+              <w:rPr>
+                <w:rFonts w:ascii="Arial" w:hAnsi="Arial" w:cs="Arial"/>
+                <w:lang w:val="es-ES"/>
+              </w:rPr>
+              <w:t>Es un registro del censo de comerciantes y sus puestos.</w:t>
+            </w:r>
+          </w:p>
+        </w:tc>
+        <w:tc>
+          <w:tcPr>
+            <w:tcW w:w="0" w:type="auto"/>
+            <w:hideMark/>
+          </w:tcPr>
+          <w:p>
+            <w:pPr>
+              <w:spacing w:after="160" w:line="360" w:lineRule="auto"/>
+              <w:rPr>
+                <w:rFonts w:ascii="Arial" w:hAnsi="Arial" w:cs="Arial"/>
+                <w:lang w:val="es-ES"/>
+              </w:rPr>
+            </w:pPr>
+            <w:r>
+              <w:rPr>
+                <w:rFonts w:ascii="Arial" w:hAnsi="Arial" w:cs="Arial"/>
+                <w:lang w:val="es-ES"/>
+              </w:rPr>
+              <w:t>No es un sistema de inventario o control de stock de los productos de cada comerciante.</w:t>
+            </w:r>
+          </w:p>
+        </w:tc>
+      </w:tr>
+      <w:tr>
+        <w:tc>
+          <w:tcPr>
+            <w:tcW w:w="0" w:type="auto"/>
+            <w:hideMark/>
+          </w:tcPr>
+          <w:p>
+            <w:pPr>
+              <w:spacing w:after="160" w:line="360" w:lineRule="auto"/>
+              <w:rPr>
+                <w:rFonts w:ascii="Arial" w:hAnsi="Arial" w:cs="Arial"/>
+                <w:lang w:val="es-ES"/>
+              </w:rPr>
+            </w:pPr>
+            <w:r>
+              <w:rPr>
+                <w:rFonts w:ascii="Arial" w:hAnsi="Arial" w:cs="Arial"/>
+                <w:lang w:val="es-ES"/>
+              </w:rPr>
+              <w:t>Es un módulo de control y registro de pagos manuales y emisión de recibos.</w:t>
+            </w:r>
+          </w:p>
+        </w:tc>
+        <w:tc>
+          <w:tcPr>
+            <w:tcW w:w="0" w:type="auto"/>
+            <w:hideMark/>
+          </w:tcPr>
+          <w:p>
+            <w:pPr>
+              <w:spacing w:after="160" w:line="360" w:lineRule="auto"/>
+              <w:rPr>
+                <w:rFonts w:ascii="Arial" w:hAnsi="Arial" w:cs="Arial"/>
+                <w:lang w:val="es-ES"/>
+              </w:rPr>
+            </w:pPr>
+            <w:r>
+              <w:rPr>
+                <w:rFonts w:ascii="Arial" w:hAnsi="Arial" w:cs="Arial"/>
+                <w:lang w:val="es-ES"/>
+              </w:rPr>
+              <w:t>No incluye (en su versión inicial) una pasarela de pago bancario en línea (colecturía virtual).</w:t>
+            </w:r>
+          </w:p>
+        </w:tc>
+      </w:tr>
+      <w:tr>
+        <w:tc>
+          <w:tcPr>
+            <w:tcW w:w="0" w:type="auto"/>
+            <w:hideMark/>
+          </w:tcPr>
+          <w:p>
+            <w:pPr>
+              <w:spacing w:after="160" w:line="360" w:lineRule="auto"/>
+              <w:rPr>
+                <w:rFonts w:ascii="Arial" w:hAnsi="Arial" w:cs="Arial"/>
+                <w:lang w:val="es-ES"/>
+              </w:rPr>
+            </w:pPr>
+            <w:r>
+              <w:rPr>
+                <w:rFonts w:ascii="Arial" w:hAnsi="Arial" w:cs="Arial"/>
+                <w:lang w:val="es-ES"/>
+              </w:rPr>
+              <w:t>Es un consolidador de informes mensuales para la Dirección de Ingresos.</w:t>
+            </w:r>
+          </w:p>
+        </w:tc>
+        <w:tc>
+          <w:tcPr>
+            <w:tcW w:w="0" w:type="auto"/>
+            <w:hideMark/>
+          </w:tcPr>
+          <w:p>
+            <w:pPr>
+              <w:spacing w:after="160" w:line="360" w:lineRule="auto"/>
+              <w:rPr>
+                <w:rFonts w:ascii="Arial" w:hAnsi="Arial" w:cs="Arial"/>
+                <w:lang w:val="es-ES"/>
+              </w:rPr>
+            </w:pPr>
+            <w:r>
+              <w:rPr>
+                <w:rFonts w:ascii="Arial" w:hAnsi="Arial" w:cs="Arial"/>
+                <w:lang w:val="es-ES"/>
+              </w:rPr>
+              <w:t>No es un sistema contable general para toda la Alcaldía.</w:t>
+            </w:r>
+          </w:p>
+        </w:tc>
+      </w:tr>
+    </w:tbl>
+    <w:p>
+      <w:pPr>
+        <w:spacing w:line="360" w:lineRule="auto"/>
+        <w:rPr>
+          <w:rFonts w:ascii="Arial" w:hAnsi="Arial" w:cs="Arial"/>
+          <w:b/>
+          <w:bCs/>
+          <w:lang w:val="es-ES"/>
+        </w:rPr>
+      </w:pPr>
+    </w:p>
+    <w:p>
+      <w:pPr>
+        <w:pStyle w:val="Ttulo2"/>
+      </w:pPr>
+      <w:bookmarkStart w:id="25" w:name="_Toc232523475"/>
+      <w:r>
+        <w:t>Vecinos Cercanos (Interfases e Integraciones)</w:t>
+      </w:r>
+      <w:bookmarkEnd w:id="25"/>
+    </w:p>
+    <w:p>
+      <w:pPr>
+        <w:spacing w:line="360" w:lineRule="auto"/>
+        <w:rPr>
+          <w:rFonts w:ascii="Arial" w:hAnsi="Arial" w:cs="Arial"/>
+          <w:lang w:val="es-ES"/>
+        </w:rPr>
+      </w:pPr>
+      <w:r>
+        <w:rPr>
+          <w:rFonts w:ascii="Arial" w:hAnsi="Arial" w:cs="Arial"/>
+          <w:lang w:val="es-ES"/>
+        </w:rPr>
+        <w:t>Para que el MVP funcione, interactuará estrechamente con:</w:t>
+      </w:r>
+    </w:p>
+    <w:p>
+      <w:pPr>
+        <w:numPr>
+          <w:ilvl w:val="0"/>
+          <w:numId w:val="22"/>
+        </w:numPr>
+        <w:spacing w:line="360" w:lineRule="auto"/>
+        <w:rPr>
+          <w:rFonts w:ascii="Arial" w:hAnsi="Arial" w:cs="Arial"/>
+          <w:lang w:val="es-ES"/>
+        </w:rPr>
+      </w:pPr>
+      <w:r>
+        <w:rPr>
+          <w:rFonts w:ascii="Arial" w:hAnsi="Arial" w:cs="Arial"/>
+          <w:b/>
+          <w:bCs/>
+          <w:lang w:val="es-ES"/>
+        </w:rPr>
+        <w:t>Administradores de los Mercados:</w:t>
+      </w:r>
+      <w:r>
+        <w:rPr>
+          <w:rFonts w:ascii="Arial" w:hAnsi="Arial" w:cs="Arial"/>
+          <w:lang w:val="es-ES"/>
+        </w:rPr>
+        <w:t xml:space="preserve"> Usuarios que alimentan el sistema en el día a día (registro de cobros y novedades).</w:t>
+      </w:r>
+    </w:p>
+    <w:p>
+      <w:pPr>
+        <w:numPr>
+          <w:ilvl w:val="0"/>
+          <w:numId w:val="22"/>
+        </w:numPr>
+        <w:spacing w:line="360" w:lineRule="auto"/>
+        <w:rPr>
+          <w:rFonts w:ascii="Arial" w:hAnsi="Arial" w:cs="Arial"/>
+          <w:lang w:val="es-ES"/>
+        </w:rPr>
+      </w:pPr>
+      <w:r>
+        <w:rPr>
+          <w:rFonts w:ascii="Arial" w:hAnsi="Arial" w:cs="Arial"/>
+          <w:b/>
+          <w:bCs/>
+          <w:lang w:val="es-ES"/>
+        </w:rPr>
+        <w:t>Dirección de Ingresos:</w:t>
+      </w:r>
+      <w:r>
+        <w:rPr>
+          <w:rFonts w:ascii="Arial" w:hAnsi="Arial" w:cs="Arial"/>
+          <w:lang w:val="es-ES"/>
+        </w:rPr>
+        <w:t xml:space="preserve"> Consumidores finales de los reportes gerenciales e informes mensuales.</w:t>
+      </w:r>
+    </w:p>
+    <w:p>
+      <w:pPr>
+        <w:numPr>
+          <w:ilvl w:val="0"/>
+          <w:numId w:val="22"/>
+        </w:numPr>
+        <w:spacing w:line="360" w:lineRule="auto"/>
+        <w:rPr>
+          <w:rFonts w:ascii="Arial" w:hAnsi="Arial" w:cs="Arial"/>
+          <w:lang w:val="es-ES"/>
+        </w:rPr>
+      </w:pPr>
+      <w:r>
+        <w:rPr>
+          <w:rFonts w:ascii="Arial" w:hAnsi="Arial" w:cs="Arial"/>
+          <w:b/>
+          <w:bCs/>
+          <w:lang w:val="es-ES"/>
+        </w:rPr>
+        <w:t>Inspectores de Sanidad:</w:t>
+      </w:r>
+      <w:r>
+        <w:rPr>
+          <w:rFonts w:ascii="Arial" w:hAnsi="Arial" w:cs="Arial"/>
+          <w:lang w:val="es-ES"/>
+        </w:rPr>
+        <w:t xml:space="preserve"> Encargados de validar los certificados médicos y licencias de manipulación de alimentos.</w:t>
       </w:r>
     </w:p>
     <w:p>
@@ -4264,6 +6277,119 @@
     </w:lvl>
   </w:abstractNum>
   <w:abstractNum w:abstractNumId="9" w15:restartNumberingAfterBreak="0">
+    <w:nsid w:val="41DA779B"/>
+    <w:multiLevelType w:val="multilevel"/>
+    <w:tmpl w:val="8FFAF41A"/>
+    <w:lvl w:ilvl="0">
+      <w:start w:val="1"/>
+      <w:numFmt w:val="decimal"/>
+      <w:lvlText w:val="%1."/>
+      <w:lvlJc w:val="left"/>
+      <w:pPr>
+        <w:tabs>
+          <w:tab w:val="num" w:pos="720"/>
+        </w:tabs>
+        <w:ind w:left="720" w:hanging="360"/>
+      </w:pPr>
+    </w:lvl>
+    <w:lvl w:ilvl="1" w:tentative="1">
+      <w:start w:val="1"/>
+      <w:numFmt w:val="decimal"/>
+      <w:lvlText w:val="%2."/>
+      <w:lvlJc w:val="left"/>
+      <w:pPr>
+        <w:tabs>
+          <w:tab w:val="num" w:pos="1440"/>
+        </w:tabs>
+        <w:ind w:left="1440" w:hanging="360"/>
+      </w:pPr>
+    </w:lvl>
+    <w:lvl w:ilvl="2" w:tentative="1">
+      <w:start w:val="1"/>
+      <w:numFmt w:val="decimal"/>
+      <w:lvlText w:val="%3."/>
+      <w:lvlJc w:val="left"/>
+      <w:pPr>
+        <w:tabs>
+          <w:tab w:val="num" w:pos="2160"/>
+        </w:tabs>
+        <w:ind w:left="2160" w:hanging="360"/>
+      </w:pPr>
+    </w:lvl>
+    <w:lvl w:ilvl="3" w:tentative="1">
+      <w:start w:val="1"/>
+      <w:numFmt w:val="decimal"/>
+      <w:lvlText w:val="%4."/>
+      <w:lvlJc w:val="left"/>
+      <w:pPr>
+        <w:tabs>
+          <w:tab w:val="num" w:pos="2880"/>
+        </w:tabs>
+        <w:ind w:left="2880" w:hanging="360"/>
+      </w:pPr>
+    </w:lvl>
+    <w:lvl w:ilvl="4" w:tentative="1">
+      <w:start w:val="1"/>
+      <w:numFmt w:val="decimal"/>
+      <w:lvlText w:val="%5."/>
+      <w:lvlJc w:val="left"/>
+      <w:pPr>
+        <w:tabs>
+          <w:tab w:val="num" w:pos="3600"/>
+        </w:tabs>
+        <w:ind w:left="3600" w:hanging="360"/>
+      </w:pPr>
+    </w:lvl>
+    <w:lvl w:ilvl="5" w:tentative="1">
+      <w:start w:val="1"/>
+      <w:numFmt w:val="decimal"/>
+      <w:lvlText w:val="%6."/>
+      <w:lvlJc w:val="left"/>
+      <w:pPr>
+        <w:tabs>
+          <w:tab w:val="num" w:pos="4320"/>
+        </w:tabs>
+        <w:ind w:left="4320" w:hanging="360"/>
+      </w:pPr>
+    </w:lvl>
+    <w:lvl w:ilvl="6" w:tentative="1">
+      <w:start w:val="1"/>
+      <w:numFmt w:val="decimal"/>
+      <w:lvlText w:val="%7."/>
+      <w:lvlJc w:val="left"/>
+      <w:pPr>
+        <w:tabs>
+          <w:tab w:val="num" w:pos="5040"/>
+        </w:tabs>
+        <w:ind w:left="5040" w:hanging="360"/>
+      </w:pPr>
+    </w:lvl>
+    <w:lvl w:ilvl="7" w:tentative="1">
+      <w:start w:val="1"/>
+      <w:numFmt w:val="decimal"/>
+      <w:lvlText w:val="%8."/>
+      <w:lvlJc w:val="left"/>
+      <w:pPr>
+        <w:tabs>
+          <w:tab w:val="num" w:pos="5760"/>
+        </w:tabs>
+        <w:ind w:left="5760" w:hanging="360"/>
+      </w:pPr>
+    </w:lvl>
+    <w:lvl w:ilvl="8" w:tentative="1">
+      <w:start w:val="1"/>
+      <w:numFmt w:val="decimal"/>
+      <w:lvlText w:val="%9."/>
+      <w:lvlJc w:val="left"/>
+      <w:pPr>
+        <w:tabs>
+          <w:tab w:val="num" w:pos="6480"/>
+        </w:tabs>
+        <w:ind w:left="6480" w:hanging="360"/>
+      </w:pPr>
+    </w:lvl>
+  </w:abstractNum>
+  <w:abstractNum w:abstractNumId="10" w15:restartNumberingAfterBreak="0">
     <w:nsid w:val="45632781"/>
     <w:multiLevelType w:val="hybridMultilevel"/>
     <w:tmpl w:val="7C28A2BA"/>
@@ -4376,7 +6502,7 @@
       </w:rPr>
     </w:lvl>
   </w:abstractNum>
-  <w:abstractNum w:abstractNumId="10" w15:restartNumberingAfterBreak="0">
+  <w:abstractNum w:abstractNumId="11" w15:restartNumberingAfterBreak="0">
     <w:nsid w:val="50DF3A72"/>
     <w:multiLevelType w:val="multilevel"/>
     <w:tmpl w:val="66C2A37E"/>
@@ -4463,7 +6589,7 @@
       </w:pPr>
     </w:lvl>
   </w:abstractNum>
-  <w:abstractNum w:abstractNumId="11" w15:restartNumberingAfterBreak="0">
+  <w:abstractNum w:abstractNumId="12" w15:restartNumberingAfterBreak="0">
     <w:nsid w:val="616072A1"/>
     <w:multiLevelType w:val="multilevel"/>
     <w:tmpl w:val="B15495DA"/>
@@ -4612,7 +6738,7 @@
       </w:rPr>
     </w:lvl>
   </w:abstractNum>
-  <w:abstractNum w:abstractNumId="12" w15:restartNumberingAfterBreak="0">
+  <w:abstractNum w:abstractNumId="13" w15:restartNumberingAfterBreak="0">
     <w:nsid w:val="685E294E"/>
     <w:multiLevelType w:val="multilevel"/>
     <w:tmpl w:val="A7947952"/>
@@ -4761,7 +6887,7 @@
       </w:rPr>
     </w:lvl>
   </w:abstractNum>
-  <w:abstractNum w:abstractNumId="13" w15:restartNumberingAfterBreak="0">
+  <w:abstractNum w:abstractNumId="14" w15:restartNumberingAfterBreak="0">
     <w:nsid w:val="6B7242DF"/>
     <w:multiLevelType w:val="multilevel"/>
     <w:tmpl w:val="35FEE1B6"/>
@@ -4910,7 +7036,7 @@
       </w:rPr>
     </w:lvl>
   </w:abstractNum>
-  <w:abstractNum w:abstractNumId="14" w15:restartNumberingAfterBreak="0">
+  <w:abstractNum w:abstractNumId="15" w15:restartNumberingAfterBreak="0">
     <w:nsid w:val="6CF655A5"/>
     <w:multiLevelType w:val="multilevel"/>
     <w:tmpl w:val="AA120C74"/>
@@ -5023,7 +7149,7 @@
       </w:pPr>
     </w:lvl>
   </w:abstractNum>
-  <w:abstractNum w:abstractNumId="15" w15:restartNumberingAfterBreak="0">
+  <w:abstractNum w:abstractNumId="16" w15:restartNumberingAfterBreak="0">
     <w:nsid w:val="6D6048EB"/>
     <w:multiLevelType w:val="hybridMultilevel"/>
     <w:tmpl w:val="496637C8"/>
@@ -5136,7 +7262,7 @@
       </w:rPr>
     </w:lvl>
   </w:abstractNum>
-  <w:abstractNum w:abstractNumId="16" w15:restartNumberingAfterBreak="0">
+  <w:abstractNum w:abstractNumId="17" w15:restartNumberingAfterBreak="0">
     <w:nsid w:val="6D9E2373"/>
     <w:multiLevelType w:val="multilevel"/>
     <w:tmpl w:val="7798721C"/>
@@ -5285,7 +7411,7 @@
       </w:rPr>
     </w:lvl>
   </w:abstractNum>
-  <w:abstractNum w:abstractNumId="17" w15:restartNumberingAfterBreak="0">
+  <w:abstractNum w:abstractNumId="18" w15:restartNumberingAfterBreak="0">
     <w:nsid w:val="7CB5752A"/>
     <w:multiLevelType w:val="hybridMultilevel"/>
     <w:tmpl w:val="3E8855C0"/>
@@ -5395,6 +7521,155 @@
       </w:pPr>
       <w:rPr>
         <w:rFonts w:ascii="Wingdings" w:hAnsi="Wingdings" w:hint="default"/>
+      </w:rPr>
+    </w:lvl>
+  </w:abstractNum>
+  <w:abstractNum w:abstractNumId="19" w15:restartNumberingAfterBreak="0">
+    <w:nsid w:val="7E764224"/>
+    <w:multiLevelType w:val="multilevel"/>
+    <w:tmpl w:val="5248F0BA"/>
+    <w:lvl w:ilvl="0">
+      <w:start w:val="1"/>
+      <w:numFmt w:val="bullet"/>
+      <w:lvlText w:val=""/>
+      <w:lvlJc w:val="left"/>
+      <w:pPr>
+        <w:tabs>
+          <w:tab w:val="num" w:pos="720"/>
+        </w:tabs>
+        <w:ind w:left="720" w:hanging="360"/>
+      </w:pPr>
+      <w:rPr>
+        <w:rFonts w:ascii="Symbol" w:hAnsi="Symbol" w:hint="default"/>
+        <w:sz w:val="20"/>
+      </w:rPr>
+    </w:lvl>
+    <w:lvl w:ilvl="1" w:tentative="1">
+      <w:start w:val="1"/>
+      <w:numFmt w:val="bullet"/>
+      <w:lvlText w:val="o"/>
+      <w:lvlJc w:val="left"/>
+      <w:pPr>
+        <w:tabs>
+          <w:tab w:val="num" w:pos="1440"/>
+        </w:tabs>
+        <w:ind w:left="1440" w:hanging="360"/>
+      </w:pPr>
+      <w:rPr>
+        <w:rFonts w:ascii="Courier New" w:hAnsi="Courier New" w:hint="default"/>
+        <w:sz w:val="20"/>
+      </w:rPr>
+    </w:lvl>
+    <w:lvl w:ilvl="2" w:tentative="1">
+      <w:start w:val="1"/>
+      <w:numFmt w:val="bullet"/>
+      <w:lvlText w:val=""/>
+      <w:lvlJc w:val="left"/>
+      <w:pPr>
+        <w:tabs>
+          <w:tab w:val="num" w:pos="2160"/>
+        </w:tabs>
+        <w:ind w:left="2160" w:hanging="360"/>
+      </w:pPr>
+      <w:rPr>
+        <w:rFonts w:ascii="Wingdings" w:hAnsi="Wingdings" w:hint="default"/>
+        <w:sz w:val="20"/>
+      </w:rPr>
+    </w:lvl>
+    <w:lvl w:ilvl="3" w:tentative="1">
+      <w:start w:val="1"/>
+      <w:numFmt w:val="bullet"/>
+      <w:lvlText w:val=""/>
+      <w:lvlJc w:val="left"/>
+      <w:pPr>
+        <w:tabs>
+          <w:tab w:val="num" w:pos="2880"/>
+        </w:tabs>
+        <w:ind w:left="2880" w:hanging="360"/>
+      </w:pPr>
+      <w:rPr>
+        <w:rFonts w:ascii="Wingdings" w:hAnsi="Wingdings" w:hint="default"/>
+        <w:sz w:val="20"/>
+      </w:rPr>
+    </w:lvl>
+    <w:lvl w:ilvl="4" w:tentative="1">
+      <w:start w:val="1"/>
+      <w:numFmt w:val="bullet"/>
+      <w:lvlText w:val=""/>
+      <w:lvlJc w:val="left"/>
+      <w:pPr>
+        <w:tabs>
+          <w:tab w:val="num" w:pos="3600"/>
+        </w:tabs>
+        <w:ind w:left="3600" w:hanging="360"/>
+      </w:pPr>
+      <w:rPr>
+        <w:rFonts w:ascii="Wingdings" w:hAnsi="Wingdings" w:hint="default"/>
+        <w:sz w:val="20"/>
+      </w:rPr>
+    </w:lvl>
+    <w:lvl w:ilvl="5" w:tentative="1">
+      <w:start w:val="1"/>
+      <w:numFmt w:val="bullet"/>
+      <w:lvlText w:val=""/>
+      <w:lvlJc w:val="left"/>
+      <w:pPr>
+        <w:tabs>
+          <w:tab w:val="num" w:pos="4320"/>
+        </w:tabs>
+        <w:ind w:left="4320" w:hanging="360"/>
+      </w:pPr>
+      <w:rPr>
+        <w:rFonts w:ascii="Wingdings" w:hAnsi="Wingdings" w:hint="default"/>
+        <w:sz w:val="20"/>
+      </w:rPr>
+    </w:lvl>
+    <w:lvl w:ilvl="6" w:tentative="1">
+      <w:start w:val="1"/>
+      <w:numFmt w:val="bullet"/>
+      <w:lvlText w:val=""/>
+      <w:lvlJc w:val="left"/>
+      <w:pPr>
+        <w:tabs>
+          <w:tab w:val="num" w:pos="5040"/>
+        </w:tabs>
+        <w:ind w:left="5040" w:hanging="360"/>
+      </w:pPr>
+      <w:rPr>
+        <w:rFonts w:ascii="Wingdings" w:hAnsi="Wingdings" w:hint="default"/>
+        <w:sz w:val="20"/>
+      </w:rPr>
+    </w:lvl>
+    <w:lvl w:ilvl="7" w:tentative="1">
+      <w:start w:val="1"/>
+      <w:numFmt w:val="bullet"/>
+      <w:lvlText w:val=""/>
+      <w:lvlJc w:val="left"/>
+      <w:pPr>
+        <w:tabs>
+          <w:tab w:val="num" w:pos="5760"/>
+        </w:tabs>
+        <w:ind w:left="5760" w:hanging="360"/>
+      </w:pPr>
+      <w:rPr>
+        <w:rFonts w:ascii="Wingdings" w:hAnsi="Wingdings" w:hint="default"/>
+        <w:sz w:val="20"/>
+      </w:rPr>
+    </w:lvl>
+    <w:lvl w:ilvl="8" w:tentative="1">
+      <w:start w:val="1"/>
+      <w:numFmt w:val="bullet"/>
+      <w:lvlText w:val=""/>
+      <w:lvlJc w:val="left"/>
+      <w:pPr>
+        <w:tabs>
+          <w:tab w:val="num" w:pos="6480"/>
+        </w:tabs>
+        <w:ind w:left="6480" w:hanging="360"/>
+      </w:pPr>
+      <w:rPr>
+        <w:rFonts w:ascii="Wingdings" w:hAnsi="Wingdings" w:hint="default"/>
+        <w:sz w:val="20"/>
       </w:rPr>
     </w:lvl>
   </w:abstractNum>
@@ -5402,7 +7677,7 @@
     <w:abstractNumId w:val="0"/>
   </w:num>
   <w:num w:numId="2">
-    <w:abstractNumId w:val="15"/>
+    <w:abstractNumId w:val="16"/>
   </w:num>
   <w:num w:numId="3">
     <w:abstractNumId w:val="0"/>
@@ -5435,7 +7710,7 @@
     </w:lvlOverride>
   </w:num>
   <w:num w:numId="4">
-    <w:abstractNumId w:val="10"/>
+    <w:abstractNumId w:val="11"/>
     <w:lvlOverride w:ilvl="0">
       <w:startOverride w:val="1"/>
     </w:lvlOverride>
@@ -5495,13 +7770,13 @@
     </w:lvlOverride>
   </w:num>
   <w:num w:numId="6">
+    <w:abstractNumId w:val="14"/>
+  </w:num>
+  <w:num w:numId="7">
     <w:abstractNumId w:val="13"/>
   </w:num>
-  <w:num w:numId="7">
+  <w:num w:numId="8">
     <w:abstractNumId w:val="12"/>
-  </w:num>
-  <w:num w:numId="8">
-    <w:abstractNumId w:val="11"/>
   </w:num>
   <w:num w:numId="9">
     <w:abstractNumId w:val="7"/>
@@ -5549,22 +7824,28 @@
     <w:abstractNumId w:val="8"/>
   </w:num>
   <w:num w:numId="15">
-    <w:abstractNumId w:val="16"/>
+    <w:abstractNumId w:val="17"/>
   </w:num>
   <w:num w:numId="16">
     <w:abstractNumId w:val="2"/>
   </w:num>
   <w:num w:numId="17">
-    <w:abstractNumId w:val="14"/>
+    <w:abstractNumId w:val="15"/>
   </w:num>
   <w:num w:numId="18">
     <w:abstractNumId w:val="1"/>
   </w:num>
   <w:num w:numId="19">
+    <w:abstractNumId w:val="10"/>
+  </w:num>
+  <w:num w:numId="20">
+    <w:abstractNumId w:val="18"/>
+  </w:num>
+  <w:num w:numId="21">
     <w:abstractNumId w:val="9"/>
   </w:num>
-  <w:num w:numId="20">
-    <w:abstractNumId w:val="17"/>
+  <w:num w:numId="22">
+    <w:abstractNumId w:val="19"/>
   </w:num>
 </w:numbering>
 </file>
@@ -6056,7 +8337,6 @@
   <w:style w:type="character" w:default="1" w:styleId="Fuentedeprrafopredeter">
     <w:name w:val="Default Paragraph Font"/>
     <w:uiPriority w:val="1"/>
-    <w:semiHidden/>
     <w:unhideWhenUsed/>
   </w:style>
   <w:style w:type="table" w:default="1" w:styleId="Tablanormal">

</xml_diff>

<commit_message>
doc5 / especificacion de requerimientos
</commit_message>
<xml_diff>
--- a/DocumentoCompProyectoMercados_GCC.docx
+++ b/DocumentoCompProyectoMercados_GCC.docx
@@ -4917,6 +4917,997 @@
           <w:lang w:val="es-ES"/>
         </w:rPr>
         <w:t xml:space="preserve"> Encargados de validar los certificados médicos y licencias de manipulación de alimentos.</w:t>
+      </w:r>
+    </w:p>
+    <w:p>
+      <w:pPr>
+        <w:spacing w:line="360" w:lineRule="auto"/>
+        <w:rPr>
+          <w:rFonts w:ascii="Arial" w:hAnsi="Arial" w:cs="Arial"/>
+          <w:lang w:val="es-ES"/>
+        </w:rPr>
+      </w:pPr>
+    </w:p>
+    <w:p>
+      <w:pPr>
+        <w:pStyle w:val="Ttulo1"/>
+      </w:pPr>
+      <w:r>
+        <w:t>ESPECIFICACIÓN DE</w:t>
+      </w:r>
+      <w:r>
+        <w:t xml:space="preserve"> </w:t>
+      </w:r>
+      <w:r>
+        <w:t>REQUERIMIENTOS</w:t>
+      </w:r>
+      <w:r>
+        <w:t xml:space="preserve"> </w:t>
+      </w:r>
+      <w:r>
+        <w:t>DE</w:t>
+      </w:r>
+      <w:r>
+        <w:t xml:space="preserve"> S</w:t>
+      </w:r>
+      <w:r>
+        <w:t>OFTWARE</w:t>
+      </w:r>
+      <w:r>
+        <w:t xml:space="preserve"> (ERS)</w:t>
+      </w:r>
+    </w:p>
+    <w:p>
+      <w:pPr>
+        <w:pStyle w:val="Ttulo2"/>
+      </w:pPr>
+      <w:r>
+        <w:t>Requerimientos Funcionales (RF)</w:t>
+      </w:r>
+    </w:p>
+    <w:p>
+      <w:pPr>
+        <w:spacing w:line="360" w:lineRule="auto"/>
+        <w:ind w:left="360"/>
+        <w:rPr>
+          <w:rFonts w:ascii="Arial" w:hAnsi="Arial" w:cs="Arial"/>
+          <w:b/>
+          <w:bCs/>
+          <w:lang w:val="es-ES"/>
+        </w:rPr>
+      </w:pPr>
+      <w:r>
+        <w:rPr>
+          <w:rFonts w:ascii="Arial" w:hAnsi="Arial" w:cs="Arial"/>
+          <w:b/>
+          <w:bCs/>
+          <w:lang w:val="es-ES"/>
+        </w:rPr>
+        <w:t>Módulo 1: Registro de Puestos y Comerciantes</w:t>
+      </w:r>
+    </w:p>
+    <w:p>
+      <w:pPr>
+        <w:pStyle w:val="Prrafodelista"/>
+        <w:numPr>
+          <w:ilvl w:val="0"/>
+          <w:numId w:val="29"/>
+        </w:numPr>
+        <w:spacing w:line="360" w:lineRule="auto"/>
+        <w:rPr>
+          <w:rFonts w:ascii="Arial" w:hAnsi="Arial" w:cs="Arial"/>
+          <w:lang w:val="es-ES"/>
+        </w:rPr>
+      </w:pPr>
+      <w:r>
+        <w:rPr>
+          <w:rFonts w:ascii="Arial" w:hAnsi="Arial" w:cs="Arial"/>
+          <w:b/>
+          <w:bCs/>
+          <w:lang w:val="es-ES"/>
+        </w:rPr>
+        <w:t>RF-1.1:</w:t>
+      </w:r>
+      <w:r>
+        <w:rPr>
+          <w:rFonts w:ascii="Arial" w:hAnsi="Arial" w:cs="Arial"/>
+          <w:lang w:val="es-ES"/>
+        </w:rPr>
+        <w:t xml:space="preserve"> El sistema debe permitir el alta, baja y modificación de comerciantes, capturando: C.I., Nombre Completo, Teléfono, Rubro y Mercado Asignado.</w:t>
+      </w:r>
+    </w:p>
+    <w:p>
+      <w:pPr>
+        <w:pStyle w:val="Prrafodelista"/>
+        <w:numPr>
+          <w:ilvl w:val="0"/>
+          <w:numId w:val="29"/>
+        </w:numPr>
+        <w:spacing w:line="360" w:lineRule="auto"/>
+        <w:rPr>
+          <w:rFonts w:ascii="Arial" w:hAnsi="Arial" w:cs="Arial"/>
+          <w:lang w:val="es-ES"/>
+        </w:rPr>
+      </w:pPr>
+      <w:r>
+        <w:rPr>
+          <w:rFonts w:ascii="Arial" w:hAnsi="Arial" w:cs="Arial"/>
+          <w:b/>
+          <w:bCs/>
+          <w:lang w:val="es-ES"/>
+        </w:rPr>
+        <w:lastRenderedPageBreak/>
+        <w:t>RF-1.2:</w:t>
+      </w:r>
+      <w:r>
+        <w:rPr>
+          <w:rFonts w:ascii="Arial" w:hAnsi="Arial" w:cs="Arial"/>
+          <w:lang w:val="es-ES"/>
+        </w:rPr>
+        <w:t xml:space="preserve"> El sistema debe permitir la creación de puestos virtuales agrupados por Mercado (Campesino, Central, Entre Ríos) y Sector (Carnes, Verduras, Abarrotes, etc.).</w:t>
+      </w:r>
+    </w:p>
+    <w:p>
+      <w:pPr>
+        <w:pStyle w:val="Prrafodelista"/>
+        <w:numPr>
+          <w:ilvl w:val="0"/>
+          <w:numId w:val="29"/>
+        </w:numPr>
+        <w:spacing w:line="360" w:lineRule="auto"/>
+        <w:rPr>
+          <w:rFonts w:ascii="Arial" w:hAnsi="Arial" w:cs="Arial"/>
+          <w:lang w:val="es-ES"/>
+        </w:rPr>
+      </w:pPr>
+      <w:r>
+        <w:rPr>
+          <w:rFonts w:ascii="Arial" w:hAnsi="Arial" w:cs="Arial"/>
+          <w:b/>
+          <w:bCs/>
+          <w:lang w:val="es-ES"/>
+        </w:rPr>
+        <w:t>RF-1.3:</w:t>
+      </w:r>
+      <w:r>
+        <w:rPr>
+          <w:rFonts w:ascii="Arial" w:hAnsi="Arial" w:cs="Arial"/>
+          <w:lang w:val="es-ES"/>
+        </w:rPr>
+        <w:t xml:space="preserve"> El sistema debe permitir la vinculación formal de un comerciante a uno o más puestos específicos, validando que no existan duplicidades de asignación.</w:t>
+      </w:r>
+    </w:p>
+    <w:p>
+      <w:pPr>
+        <w:spacing w:line="360" w:lineRule="auto"/>
+        <w:ind w:left="360"/>
+        <w:rPr>
+          <w:rFonts w:ascii="Arial" w:hAnsi="Arial" w:cs="Arial"/>
+          <w:b/>
+          <w:bCs/>
+          <w:lang w:val="es-ES"/>
+        </w:rPr>
+      </w:pPr>
+      <w:r>
+        <w:rPr>
+          <w:rFonts w:ascii="Arial" w:hAnsi="Arial" w:cs="Arial"/>
+          <w:b/>
+          <w:bCs/>
+          <w:lang w:val="es-ES"/>
+        </w:rPr>
+        <w:t>Módulo 2: Cobro de Tarifas y Patentes</w:t>
+      </w:r>
+    </w:p>
+    <w:p>
+      <w:pPr>
+        <w:pStyle w:val="Prrafodelista"/>
+        <w:numPr>
+          <w:ilvl w:val="0"/>
+          <w:numId w:val="30"/>
+        </w:numPr>
+        <w:spacing w:line="360" w:lineRule="auto"/>
+        <w:rPr>
+          <w:rFonts w:ascii="Arial" w:hAnsi="Arial" w:cs="Arial"/>
+          <w:lang w:val="es-ES"/>
+        </w:rPr>
+      </w:pPr>
+      <w:r>
+        <w:rPr>
+          <w:rFonts w:ascii="Arial" w:hAnsi="Arial" w:cs="Arial"/>
+          <w:b/>
+          <w:bCs/>
+          <w:lang w:val="es-ES"/>
+        </w:rPr>
+        <w:t>RF-2.1:</w:t>
+      </w:r>
+      <w:r>
+        <w:rPr>
+          <w:rFonts w:ascii="Arial" w:hAnsi="Arial" w:cs="Arial"/>
+          <w:lang w:val="es-ES"/>
+        </w:rPr>
+        <w:t xml:space="preserve"> El sistema debe permitir el registro diario del cobro de la tarifa municipal por puesto.</w:t>
+      </w:r>
+    </w:p>
+    <w:p>
+      <w:pPr>
+        <w:pStyle w:val="Prrafodelista"/>
+        <w:numPr>
+          <w:ilvl w:val="0"/>
+          <w:numId w:val="30"/>
+        </w:numPr>
+        <w:spacing w:line="360" w:lineRule="auto"/>
+        <w:rPr>
+          <w:rFonts w:ascii="Arial" w:hAnsi="Arial" w:cs="Arial"/>
+          <w:lang w:val="es-ES"/>
+        </w:rPr>
+      </w:pPr>
+      <w:r>
+        <w:rPr>
+          <w:rFonts w:ascii="Arial" w:hAnsi="Arial" w:cs="Arial"/>
+          <w:b/>
+          <w:bCs/>
+          <w:lang w:val="es-ES"/>
+        </w:rPr>
+        <w:t>RF-2.2:</w:t>
+      </w:r>
+      <w:r>
+        <w:rPr>
+          <w:rFonts w:ascii="Arial" w:hAnsi="Arial" w:cs="Arial"/>
+          <w:lang w:val="es-ES"/>
+        </w:rPr>
+        <w:t xml:space="preserve"> El sistema debe emitir un comprobante digital/recibo de pago imprimible con un código único de auditoría interna.</w:t>
+      </w:r>
+    </w:p>
+    <w:p>
+      <w:pPr>
+        <w:pStyle w:val="Prrafodelista"/>
+        <w:numPr>
+          <w:ilvl w:val="0"/>
+          <w:numId w:val="30"/>
+        </w:numPr>
+        <w:spacing w:line="360" w:lineRule="auto"/>
+        <w:rPr>
+          <w:rFonts w:ascii="Arial" w:hAnsi="Arial" w:cs="Arial"/>
+          <w:lang w:val="es-ES"/>
+        </w:rPr>
+      </w:pPr>
+      <w:r>
+        <w:rPr>
+          <w:rFonts w:ascii="Arial" w:hAnsi="Arial" w:cs="Arial"/>
+          <w:b/>
+          <w:bCs/>
+          <w:lang w:val="es-ES"/>
+        </w:rPr>
+        <w:t>RF-2.3:</w:t>
+      </w:r>
+      <w:r>
+        <w:rPr>
+          <w:rFonts w:ascii="Arial" w:hAnsi="Arial" w:cs="Arial"/>
+          <w:lang w:val="es-ES"/>
+        </w:rPr>
+        <w:t xml:space="preserve"> El sistema debe alertar visualmente (color rojo) en el panel del administrador aquellos puestos que presenten deudas acumuladas de más de 5 días.</w:t>
+      </w:r>
+    </w:p>
+    <w:p>
+      <w:pPr>
+        <w:spacing w:line="360" w:lineRule="auto"/>
+        <w:ind w:left="360"/>
+        <w:rPr>
+          <w:rFonts w:ascii="Arial" w:hAnsi="Arial" w:cs="Arial"/>
+          <w:b/>
+          <w:bCs/>
+          <w:lang w:val="es-ES"/>
+        </w:rPr>
+      </w:pPr>
+      <w:r>
+        <w:rPr>
+          <w:rFonts w:ascii="Arial" w:hAnsi="Arial" w:cs="Arial"/>
+          <w:b/>
+          <w:bCs/>
+          <w:lang w:val="es-ES"/>
+        </w:rPr>
+        <w:t>Módulo 3: Control de Licencias Sanitarias</w:t>
+      </w:r>
+    </w:p>
+    <w:p>
+      <w:pPr>
+        <w:pStyle w:val="Prrafodelista"/>
+        <w:numPr>
+          <w:ilvl w:val="0"/>
+          <w:numId w:val="31"/>
+        </w:numPr>
+        <w:spacing w:line="360" w:lineRule="auto"/>
+        <w:rPr>
+          <w:rFonts w:ascii="Arial" w:hAnsi="Arial" w:cs="Arial"/>
+          <w:lang w:val="es-ES"/>
+        </w:rPr>
+      </w:pPr>
+      <w:r>
+        <w:rPr>
+          <w:rFonts w:ascii="Arial" w:hAnsi="Arial" w:cs="Arial"/>
+          <w:b/>
+          <w:bCs/>
+          <w:lang w:val="es-ES"/>
+        </w:rPr>
+        <w:t>RF-3.1:</w:t>
+      </w:r>
+      <w:r>
+        <w:rPr>
+          <w:rFonts w:ascii="Arial" w:hAnsi="Arial" w:cs="Arial"/>
+          <w:lang w:val="es-ES"/>
+        </w:rPr>
+        <w:t xml:space="preserve"> El sistema debe permitir registrar la fecha de emisión y vencimiento del carnet sanitario de cada comerciante.</w:t>
+      </w:r>
+    </w:p>
+    <w:p>
+      <w:pPr>
+        <w:pStyle w:val="Prrafodelista"/>
+        <w:numPr>
+          <w:ilvl w:val="0"/>
+          <w:numId w:val="31"/>
+        </w:numPr>
+        <w:spacing w:line="360" w:lineRule="auto"/>
+        <w:rPr>
+          <w:rFonts w:ascii="Arial" w:hAnsi="Arial" w:cs="Arial"/>
+          <w:lang w:val="es-ES"/>
+        </w:rPr>
+      </w:pPr>
+      <w:r>
+        <w:rPr>
+          <w:rFonts w:ascii="Arial" w:hAnsi="Arial" w:cs="Arial"/>
+          <w:b/>
+          <w:bCs/>
+          <w:lang w:val="es-ES"/>
+        </w:rPr>
+        <w:t>RF-3.2:</w:t>
+      </w:r>
+      <w:r>
+        <w:rPr>
+          <w:rFonts w:ascii="Arial" w:hAnsi="Arial" w:cs="Arial"/>
+          <w:lang w:val="es-ES"/>
+        </w:rPr>
+        <w:t xml:space="preserve"> El sistema debe enviar una alerta interna en el tablero principal 15 días antes de que expire la licencia sanitaria de un comerciante.</w:t>
+      </w:r>
+    </w:p>
+    <w:p>
+      <w:pPr>
+        <w:pStyle w:val="Prrafodelista"/>
+        <w:numPr>
+          <w:ilvl w:val="0"/>
+          <w:numId w:val="31"/>
+        </w:numPr>
+        <w:spacing w:line="360" w:lineRule="auto"/>
+        <w:rPr>
+          <w:rFonts w:ascii="Arial" w:hAnsi="Arial" w:cs="Arial"/>
+          <w:b/>
+          <w:bCs/>
+          <w:lang w:val="es-ES"/>
+        </w:rPr>
+      </w:pPr>
+      <w:r>
+        <w:rPr>
+          <w:rFonts w:ascii="Arial" w:hAnsi="Arial" w:cs="Arial"/>
+          <w:b/>
+          <w:bCs/>
+          <w:lang w:val="es-ES"/>
+        </w:rPr>
+        <w:t>Módulo 4: Informes para la Dirección de Ingresos</w:t>
+      </w:r>
+    </w:p>
+    <w:p>
+      <w:pPr>
+        <w:pStyle w:val="Prrafodelista"/>
+        <w:numPr>
+          <w:ilvl w:val="0"/>
+          <w:numId w:val="31"/>
+        </w:numPr>
+        <w:spacing w:line="360" w:lineRule="auto"/>
+        <w:rPr>
+          <w:rFonts w:ascii="Arial" w:hAnsi="Arial" w:cs="Arial"/>
+          <w:lang w:val="es-ES"/>
+        </w:rPr>
+      </w:pPr>
+      <w:r>
+        <w:rPr>
+          <w:rFonts w:ascii="Arial" w:hAnsi="Arial" w:cs="Arial"/>
+          <w:b/>
+          <w:bCs/>
+          <w:lang w:val="es-ES"/>
+        </w:rPr>
+        <w:t>RF-4.1:</w:t>
+      </w:r>
+      <w:r>
+        <w:rPr>
+          <w:rFonts w:ascii="Arial" w:hAnsi="Arial" w:cs="Arial"/>
+          <w:lang w:val="es-ES"/>
+        </w:rPr>
+        <w:t xml:space="preserve"> El sistema debe generar automáticamente el "Informe de Recaudación Mensual" desglosado por mercado, sector y fecha.</w:t>
+      </w:r>
+    </w:p>
+    <w:p>
+      <w:pPr>
+        <w:pStyle w:val="Prrafodelista"/>
+        <w:numPr>
+          <w:ilvl w:val="0"/>
+          <w:numId w:val="31"/>
+        </w:numPr>
+        <w:spacing w:line="360" w:lineRule="auto"/>
+        <w:rPr>
+          <w:rFonts w:ascii="Arial" w:hAnsi="Arial" w:cs="Arial"/>
+          <w:lang w:val="es-ES"/>
+        </w:rPr>
+      </w:pPr>
+      <w:r>
+        <w:rPr>
+          <w:rFonts w:ascii="Arial" w:hAnsi="Arial" w:cs="Arial"/>
+          <w:b/>
+          <w:bCs/>
+          <w:lang w:val="es-ES"/>
+        </w:rPr>
+        <w:t>RF-4.2:</w:t>
+      </w:r>
+      <w:r>
+        <w:rPr>
+          <w:rFonts w:ascii="Arial" w:hAnsi="Arial" w:cs="Arial"/>
+          <w:lang w:val="es-ES"/>
+        </w:rPr>
+        <w:t xml:space="preserve"> El sistema debe permitir la exportación de todos los reportes consolidados a formatos PDF y Excel para su fiscalización externa.</w:t>
+      </w:r>
+    </w:p>
+    <w:p>
+      <w:pPr>
+        <w:pStyle w:val="Ttulo2"/>
+      </w:pPr>
+      <w:r>
+        <w:t>Requerimientos No Funcionales (RNF)</w:t>
+      </w:r>
+    </w:p>
+    <w:p>
+      <w:pPr>
+        <w:pStyle w:val="Prrafodelista"/>
+        <w:numPr>
+          <w:ilvl w:val="0"/>
+          <w:numId w:val="32"/>
+        </w:numPr>
+        <w:spacing w:line="360" w:lineRule="auto"/>
+        <w:rPr>
+          <w:rFonts w:ascii="Arial" w:hAnsi="Arial" w:cs="Arial"/>
+          <w:lang w:val="es-ES"/>
+        </w:rPr>
+      </w:pPr>
+      <w:r>
+        <w:rPr>
+          <w:rFonts w:ascii="Arial" w:hAnsi="Arial" w:cs="Arial"/>
+          <w:b/>
+          <w:bCs/>
+          <w:lang w:val="es-ES"/>
+        </w:rPr>
+        <w:t>RNF-1 (Seguridad):</w:t>
+      </w:r>
+      <w:r>
+        <w:rPr>
+          <w:rFonts w:ascii="Arial" w:hAnsi="Arial" w:cs="Arial"/>
+          <w:lang w:val="es-ES"/>
+        </w:rPr>
+        <w:t xml:space="preserve"> El sistema debe implementar un control de acceso basado en roles (RBAC), distinguiendo entre: </w:t>
+      </w:r>
+      <w:proofErr w:type="spellStart"/>
+      <w:r>
+        <w:rPr>
+          <w:rFonts w:ascii="Arial" w:hAnsi="Arial" w:cs="Arial"/>
+          <w:lang w:val="es-ES"/>
+        </w:rPr>
+        <w:t>SuperAdministrador</w:t>
+      </w:r>
+      <w:proofErr w:type="spellEnd"/>
+      <w:r>
+        <w:rPr>
+          <w:rFonts w:ascii="Arial" w:hAnsi="Arial" w:cs="Arial"/>
+          <w:lang w:val="es-ES"/>
+        </w:rPr>
+        <w:t xml:space="preserve"> (Alcaldía), Administrador de Mercado, e Inspector Sanitario.</w:t>
+      </w:r>
+    </w:p>
+    <w:p>
+      <w:pPr>
+        <w:pStyle w:val="Prrafodelista"/>
+        <w:numPr>
+          <w:ilvl w:val="0"/>
+          <w:numId w:val="32"/>
+        </w:numPr>
+        <w:spacing w:line="360" w:lineRule="auto"/>
+        <w:rPr>
+          <w:rFonts w:ascii="Arial" w:hAnsi="Arial" w:cs="Arial"/>
+          <w:lang w:val="es-ES"/>
+        </w:rPr>
+      </w:pPr>
+      <w:r>
+        <w:rPr>
+          <w:rFonts w:ascii="Arial" w:hAnsi="Arial" w:cs="Arial"/>
+          <w:b/>
+          <w:bCs/>
+          <w:lang w:val="es-ES"/>
+        </w:rPr>
+        <w:t>RNF-2 (Disponibilidad):</w:t>
+      </w:r>
+      <w:r>
+        <w:rPr>
+          <w:rFonts w:ascii="Arial" w:hAnsi="Arial" w:cs="Arial"/>
+          <w:lang w:val="es-ES"/>
+        </w:rPr>
+        <w:t xml:space="preserve"> La plataforma web debe garantizar una disponibilidad del 99.5% durante el horario de operación de los mercados (05:00 a 22:00).</w:t>
+      </w:r>
+    </w:p>
+    <w:p>
+      <w:pPr>
+        <w:pStyle w:val="Prrafodelista"/>
+        <w:numPr>
+          <w:ilvl w:val="0"/>
+          <w:numId w:val="32"/>
+        </w:numPr>
+        <w:spacing w:line="360" w:lineRule="auto"/>
+        <w:rPr>
+          <w:rFonts w:ascii="Arial" w:hAnsi="Arial" w:cs="Arial"/>
+          <w:lang w:val="es-ES"/>
+        </w:rPr>
+      </w:pPr>
+      <w:r>
+        <w:rPr>
+          <w:rFonts w:ascii="Arial" w:hAnsi="Arial" w:cs="Arial"/>
+          <w:b/>
+          <w:bCs/>
+          <w:lang w:val="es-ES"/>
+        </w:rPr>
+        <w:lastRenderedPageBreak/>
+        <w:t>RNF-3 (Rendimiento):</w:t>
+      </w:r>
+      <w:r>
+        <w:rPr>
+          <w:rFonts w:ascii="Arial" w:hAnsi="Arial" w:cs="Arial"/>
+          <w:lang w:val="es-ES"/>
+        </w:rPr>
+        <w:t xml:space="preserve"> El tiempo de carga de las consultas de reportes mensuales no debe exceder los 3 segundos con un volumen de hasta 5,000 registros simultáneos.</w:t>
+      </w:r>
+    </w:p>
+    <w:p>
+      <w:pPr>
+        <w:pStyle w:val="Prrafodelista"/>
+        <w:numPr>
+          <w:ilvl w:val="0"/>
+          <w:numId w:val="32"/>
+        </w:numPr>
+        <w:spacing w:line="360" w:lineRule="auto"/>
+        <w:rPr>
+          <w:rFonts w:ascii="Arial" w:hAnsi="Arial" w:cs="Arial"/>
+          <w:lang w:val="es-ES"/>
+        </w:rPr>
+      </w:pPr>
+      <w:r>
+        <w:rPr>
+          <w:rFonts w:ascii="Arial" w:hAnsi="Arial" w:cs="Arial"/>
+          <w:b/>
+          <w:bCs/>
+          <w:lang w:val="es-ES"/>
+        </w:rPr>
+        <w:t>RNF-4 (Portabilidad):</w:t>
+      </w:r>
+      <w:r>
+        <w:rPr>
+          <w:rFonts w:ascii="Arial" w:hAnsi="Arial" w:cs="Arial"/>
+          <w:lang w:val="es-ES"/>
+        </w:rPr>
+        <w:t xml:space="preserve"> El sistema debe ser responsivo y compatible con los navegadores modernos (Google Chrome, Mozilla Firefox, Microsoft Edge) sin requerir </w:t>
+      </w:r>
+      <w:proofErr w:type="spellStart"/>
+      <w:r>
+        <w:rPr>
+          <w:rFonts w:ascii="Arial" w:hAnsi="Arial" w:cs="Arial"/>
+          <w:lang w:val="es-ES"/>
+        </w:rPr>
+        <w:t>plugins</w:t>
+      </w:r>
+      <w:proofErr w:type="spellEnd"/>
+      <w:r>
+        <w:rPr>
+          <w:rFonts w:ascii="Arial" w:hAnsi="Arial" w:cs="Arial"/>
+          <w:lang w:val="es-ES"/>
+        </w:rPr>
+        <w:t xml:space="preserve"> adicionales.</w:t>
+      </w:r>
+    </w:p>
+    <w:p>
+      <w:pPr>
+        <w:spacing w:line="360" w:lineRule="auto"/>
+        <w:rPr>
+          <w:rFonts w:ascii="Arial" w:hAnsi="Arial" w:cs="Arial"/>
+        </w:rPr>
+      </w:pPr>
+    </w:p>
+    <w:p>
+      <w:pPr>
+        <w:rPr>
+          <w:lang w:val="es-ES"/>
+        </w:rPr>
+      </w:pPr>
+    </w:p>
+    <w:p>
+      <w:pPr>
+        <w:rPr>
+          <w:lang w:val="es-ES"/>
+        </w:rPr>
+      </w:pPr>
+    </w:p>
+    <w:p>
+      <w:pPr>
+        <w:rPr>
+          <w:lang w:val="es-ES"/>
+        </w:rPr>
+      </w:pPr>
+    </w:p>
+    <w:p>
+      <w:pPr>
+        <w:rPr>
+          <w:lang w:val="es-ES"/>
+        </w:rPr>
+      </w:pPr>
+    </w:p>
+    <w:p>
+      <w:pPr>
+        <w:rPr>
+          <w:lang w:val="es-ES"/>
+        </w:rPr>
+      </w:pPr>
+    </w:p>
+    <w:p>
+      <w:pPr>
+        <w:rPr>
+          <w:lang w:val="es-ES"/>
+        </w:rPr>
+      </w:pPr>
+    </w:p>
+    <w:p>
+      <w:pPr>
+        <w:rPr>
+          <w:lang w:val="es-ES"/>
+        </w:rPr>
+      </w:pPr>
+    </w:p>
+    <w:p>
+      <w:pPr>
+        <w:rPr>
+          <w:lang w:val="es-ES"/>
+        </w:rPr>
+      </w:pPr>
+    </w:p>
+    <w:p>
+      <w:pPr>
+        <w:rPr>
+          <w:lang w:val="es-ES"/>
+        </w:rPr>
+      </w:pPr>
+      <w:r>
+        <w:rPr>
+          <w:lang w:val="es-ES"/>
+        </w:rPr>
+        <w:t> Acta de Constitución (ej. Al finalizar el presente documento)</w:t>
+      </w:r>
+    </w:p>
+    <w:p>
+      <w:pPr>
+        <w:rPr>
+          <w:lang w:val="es-ES"/>
+        </w:rPr>
+      </w:pPr>
+      <w:r>
+        <w:rPr>
+          <w:lang w:val="es-ES"/>
+        </w:rPr>
+        <w:t>· Documento de Metodología (Tradicional o Ágil)</w:t>
+      </w:r>
+    </w:p>
+    <w:p>
+      <w:pPr>
+        <w:rPr>
+          <w:lang w:val="es-ES"/>
+        </w:rPr>
+      </w:pPr>
+      <w:r>
+        <w:rPr>
+          <w:lang w:val="es-ES"/>
+        </w:rPr>
+        <w:t>· Solicitud de Proyecto</w:t>
+      </w:r>
+    </w:p>
+    <w:p>
+      <w:pPr>
+        <w:rPr>
+          <w:lang w:val="es-ES"/>
+        </w:rPr>
+      </w:pPr>
+      <w:r>
+        <w:rPr>
+          <w:lang w:val="es-ES"/>
+        </w:rPr>
+        <w:t>· Especificación de Requerimientos</w:t>
+      </w:r>
+    </w:p>
+    <w:p>
+      <w:pPr>
+        <w:rPr>
+          <w:lang w:val="es-ES"/>
+        </w:rPr>
+      </w:pPr>
+      <w:r>
+        <w:rPr>
+          <w:lang w:val="es-ES"/>
+        </w:rPr>
+        <w:t xml:space="preserve">· Documento de </w:t>
+      </w:r>
+      <w:proofErr w:type="spellStart"/>
+      <w:r>
+        <w:rPr>
+          <w:lang w:val="es-ES"/>
+        </w:rPr>
+        <w:t>Inception</w:t>
+      </w:r>
+      <w:proofErr w:type="spellEnd"/>
+    </w:p>
+    <w:p>
+      <w:pPr>
+        <w:rPr>
+          <w:lang w:val="es-ES"/>
+        </w:rPr>
+      </w:pPr>
+      <w:r>
+        <w:rPr>
+          <w:lang w:val="es-ES"/>
+        </w:rPr>
+        <w:t>· Matriz de Priorización</w:t>
+      </w:r>
+    </w:p>
+    <w:p>
+      <w:pPr>
+        <w:rPr>
+          <w:lang w:val="es-ES"/>
+        </w:rPr>
+      </w:pPr>
+      <w:r>
+        <w:rPr>
+          <w:lang w:val="es-ES"/>
+        </w:rPr>
+        <w:t>· Cronograma</w:t>
+      </w:r>
+    </w:p>
+    <w:p>
+      <w:pPr>
+        <w:rPr>
+          <w:lang w:val="es-ES"/>
+        </w:rPr>
+      </w:pPr>
+      <w:r>
+        <w:rPr>
+          <w:lang w:val="es-ES"/>
+        </w:rPr>
+        <w:t>· Presupuesto (70000bs)</w:t>
+      </w:r>
+    </w:p>
+    <w:p>
+      <w:pPr>
+        <w:rPr>
+          <w:lang w:val="es-ES"/>
+        </w:rPr>
+      </w:pPr>
+      <w:r>
+        <w:rPr>
+          <w:lang w:val="es-ES"/>
+        </w:rPr>
+        <w:t>· Plan de Recursos (Como se dividirían)</w:t>
+      </w:r>
+    </w:p>
+    <w:p>
+      <w:pPr>
+        <w:rPr>
+          <w:lang w:val="es-ES"/>
+        </w:rPr>
+      </w:pPr>
+      <w:r>
+        <w:rPr>
+          <w:lang w:val="es-ES"/>
+        </w:rPr>
+        <w:t>· Registro de Riesgos</w:t>
+      </w:r>
+    </w:p>
+    <w:p>
+      <w:pPr>
+        <w:rPr>
+          <w:lang w:val="es-ES"/>
+        </w:rPr>
+      </w:pPr>
+      <w:r>
+        <w:rPr>
+          <w:lang w:val="es-ES"/>
+        </w:rPr>
+        <w:t>· Informes de Avance</w:t>
+      </w:r>
+    </w:p>
+    <w:p>
+      <w:pPr>
+        <w:rPr>
+          <w:lang w:val="es-ES"/>
+        </w:rPr>
+      </w:pPr>
+      <w:r>
+        <w:rPr>
+          <w:lang w:val="es-ES"/>
+        </w:rPr>
+        <w:t>· Tablero de Seguimiento KPI</w:t>
+      </w:r>
+    </w:p>
+    <w:p>
+      <w:pPr>
+        <w:rPr>
+          <w:lang w:val="es-ES"/>
+        </w:rPr>
+      </w:pPr>
+      <w:r>
+        <w:rPr>
+          <w:lang w:val="es-ES"/>
+        </w:rPr>
+        <w:t>· Registro de Incidencias</w:t>
+      </w:r>
+    </w:p>
+    <w:p>
+      <w:pPr>
+        <w:rPr>
+          <w:lang w:val="es-ES"/>
+        </w:rPr>
+      </w:pPr>
+      <w:r>
+        <w:rPr>
+          <w:lang w:val="es-ES"/>
+        </w:rPr>
+        <w:t>· Plan de Mejora Continua</w:t>
+      </w:r>
+    </w:p>
+    <w:p>
+      <w:pPr>
+        <w:rPr>
+          <w:lang w:val="es-ES"/>
+        </w:rPr>
+      </w:pPr>
+      <w:r>
+        <w:rPr>
+          <w:lang w:val="es-ES"/>
+        </w:rPr>
+        <w:lastRenderedPageBreak/>
+        <w:t>· Solicitud de Cambios</w:t>
+      </w:r>
+    </w:p>
+    <w:p>
+      <w:pPr>
+        <w:rPr>
+          <w:lang w:val="es-ES"/>
+        </w:rPr>
+      </w:pPr>
+      <w:r>
+        <w:rPr>
+          <w:lang w:val="es-ES"/>
+        </w:rPr>
+        <w:t>· Registro de Riesgos Actualizado</w:t>
+      </w:r>
+    </w:p>
+    <w:p>
+      <w:pPr>
+        <w:rPr>
+          <w:lang w:val="es-ES"/>
+        </w:rPr>
+      </w:pPr>
+      <w:r>
+        <w:rPr>
+          <w:lang w:val="es-ES"/>
+        </w:rPr>
+        <w:t>· Acta de Cierre</w:t>
+      </w:r>
+    </w:p>
+    <w:p>
+      <w:pPr>
+        <w:rPr>
+          <w:lang w:val="es-ES"/>
+        </w:rPr>
+      </w:pPr>
+      <w:r>
+        <w:rPr>
+          <w:lang w:val="es-ES"/>
+        </w:rPr>
+        <w:t>· Lecciones Aprendidas</w:t>
+      </w:r>
+    </w:p>
+    <w:p>
+      <w:pPr>
+        <w:rPr>
+          <w:lang w:val="es-ES"/>
+        </w:rPr>
+      </w:pPr>
+      <w:r>
+        <w:rPr>
+          <w:lang w:val="es-ES"/>
+        </w:rPr>
+        <w:t>· Informe de Validación del Producto</w:t>
+      </w:r>
+    </w:p>
+    <w:p>
+      <w:pPr>
+        <w:rPr>
+          <w:lang w:val="es-ES"/>
+        </w:rPr>
+      </w:pPr>
+      <w:r>
+        <w:rPr>
+          <w:lang w:val="es-ES"/>
+        </w:rPr>
+        <w:t>· Evaluación de las 4P</w:t>
+      </w:r>
+    </w:p>
+    <w:p>
+      <w:pPr>
+        <w:rPr>
+          <w:lang w:val="es-ES"/>
+        </w:rPr>
+      </w:pPr>
+      <w:r>
+        <w:rPr>
+          <w:lang w:val="es-ES"/>
+        </w:rPr>
+        <w:t xml:space="preserve">· </w:t>
+      </w:r>
+      <w:proofErr w:type="spellStart"/>
+      <w:r>
+        <w:rPr>
+          <w:lang w:val="es-ES"/>
+        </w:rPr>
+        <w:t>Value</w:t>
+      </w:r>
+      <w:proofErr w:type="spellEnd"/>
+      <w:r>
+        <w:rPr>
+          <w:lang w:val="es-ES"/>
+        </w:rPr>
+        <w:t xml:space="preserve"> </w:t>
+      </w:r>
+      <w:proofErr w:type="spellStart"/>
+      <w:r>
+        <w:rPr>
+          <w:lang w:val="es-ES"/>
+        </w:rPr>
+        <w:t>Stream</w:t>
+      </w:r>
+      <w:proofErr w:type="spellEnd"/>
+      <w:r>
+        <w:rPr>
+          <w:lang w:val="es-ES"/>
+        </w:rPr>
+        <w:t xml:space="preserve"> </w:t>
+      </w:r>
+      <w:proofErr w:type="spellStart"/>
+      <w:r>
+        <w:rPr>
+          <w:lang w:val="es-ES"/>
+        </w:rPr>
+        <w:t>Mapping</w:t>
+      </w:r>
+      <w:proofErr w:type="spellEnd"/>
+    </w:p>
+    <w:p>
+      <w:pPr>
+        <w:rPr>
+          <w:lang w:val="es-ES"/>
+        </w:rPr>
+      </w:pPr>
+      <w:r>
+        <w:rPr>
+          <w:lang w:val="es-ES"/>
+        </w:rPr>
+        <w:t>· Plan de Escalado Organizacional</w:t>
       </w:r>
     </w:p>
     <w:p>
@@ -5306,6 +6297,119 @@
     </w:lvl>
   </w:abstractNum>
   <w:abstractNum w:abstractNumId="2" w15:restartNumberingAfterBreak="0">
+    <w:nsid w:val="170B32CE"/>
+    <w:multiLevelType w:val="hybridMultilevel"/>
+    <w:tmpl w:val="814810B0"/>
+    <w:lvl w:ilvl="0" w:tplc="0C0A0001">
+      <w:start w:val="1"/>
+      <w:numFmt w:val="bullet"/>
+      <w:lvlText w:val=""/>
+      <w:lvlJc w:val="left"/>
+      <w:pPr>
+        <w:ind w:left="1080" w:hanging="360"/>
+      </w:pPr>
+      <w:rPr>
+        <w:rFonts w:ascii="Symbol" w:hAnsi="Symbol" w:hint="default"/>
+      </w:rPr>
+    </w:lvl>
+    <w:lvl w:ilvl="1" w:tplc="0C0A0003" w:tentative="1">
+      <w:start w:val="1"/>
+      <w:numFmt w:val="bullet"/>
+      <w:lvlText w:val="o"/>
+      <w:lvlJc w:val="left"/>
+      <w:pPr>
+        <w:ind w:left="1800" w:hanging="360"/>
+      </w:pPr>
+      <w:rPr>
+        <w:rFonts w:ascii="Courier New" w:hAnsi="Courier New" w:cs="Courier New" w:hint="default"/>
+      </w:rPr>
+    </w:lvl>
+    <w:lvl w:ilvl="2" w:tplc="0C0A0005" w:tentative="1">
+      <w:start w:val="1"/>
+      <w:numFmt w:val="bullet"/>
+      <w:lvlText w:val=""/>
+      <w:lvlJc w:val="left"/>
+      <w:pPr>
+        <w:ind w:left="2520" w:hanging="360"/>
+      </w:pPr>
+      <w:rPr>
+        <w:rFonts w:ascii="Wingdings" w:hAnsi="Wingdings" w:hint="default"/>
+      </w:rPr>
+    </w:lvl>
+    <w:lvl w:ilvl="3" w:tplc="0C0A0001" w:tentative="1">
+      <w:start w:val="1"/>
+      <w:numFmt w:val="bullet"/>
+      <w:lvlText w:val=""/>
+      <w:lvlJc w:val="left"/>
+      <w:pPr>
+        <w:ind w:left="3240" w:hanging="360"/>
+      </w:pPr>
+      <w:rPr>
+        <w:rFonts w:ascii="Symbol" w:hAnsi="Symbol" w:hint="default"/>
+      </w:rPr>
+    </w:lvl>
+    <w:lvl w:ilvl="4" w:tplc="0C0A0003" w:tentative="1">
+      <w:start w:val="1"/>
+      <w:numFmt w:val="bullet"/>
+      <w:lvlText w:val="o"/>
+      <w:lvlJc w:val="left"/>
+      <w:pPr>
+        <w:ind w:left="3960" w:hanging="360"/>
+      </w:pPr>
+      <w:rPr>
+        <w:rFonts w:ascii="Courier New" w:hAnsi="Courier New" w:cs="Courier New" w:hint="default"/>
+      </w:rPr>
+    </w:lvl>
+    <w:lvl w:ilvl="5" w:tplc="0C0A0005" w:tentative="1">
+      <w:start w:val="1"/>
+      <w:numFmt w:val="bullet"/>
+      <w:lvlText w:val=""/>
+      <w:lvlJc w:val="left"/>
+      <w:pPr>
+        <w:ind w:left="4680" w:hanging="360"/>
+      </w:pPr>
+      <w:rPr>
+        <w:rFonts w:ascii="Wingdings" w:hAnsi="Wingdings" w:hint="default"/>
+      </w:rPr>
+    </w:lvl>
+    <w:lvl w:ilvl="6" w:tplc="0C0A0001" w:tentative="1">
+      <w:start w:val="1"/>
+      <w:numFmt w:val="bullet"/>
+      <w:lvlText w:val=""/>
+      <w:lvlJc w:val="left"/>
+      <w:pPr>
+        <w:ind w:left="5400" w:hanging="360"/>
+      </w:pPr>
+      <w:rPr>
+        <w:rFonts w:ascii="Symbol" w:hAnsi="Symbol" w:hint="default"/>
+      </w:rPr>
+    </w:lvl>
+    <w:lvl w:ilvl="7" w:tplc="0C0A0003" w:tentative="1">
+      <w:start w:val="1"/>
+      <w:numFmt w:val="bullet"/>
+      <w:lvlText w:val="o"/>
+      <w:lvlJc w:val="left"/>
+      <w:pPr>
+        <w:ind w:left="6120" w:hanging="360"/>
+      </w:pPr>
+      <w:rPr>
+        <w:rFonts w:ascii="Courier New" w:hAnsi="Courier New" w:cs="Courier New" w:hint="default"/>
+      </w:rPr>
+    </w:lvl>
+    <w:lvl w:ilvl="8" w:tplc="0C0A0005" w:tentative="1">
+      <w:start w:val="1"/>
+      <w:numFmt w:val="bullet"/>
+      <w:lvlText w:val=""/>
+      <w:lvlJc w:val="left"/>
+      <w:pPr>
+        <w:ind w:left="6840" w:hanging="360"/>
+      </w:pPr>
+      <w:rPr>
+        <w:rFonts w:ascii="Wingdings" w:hAnsi="Wingdings" w:hint="default"/>
+      </w:rPr>
+    </w:lvl>
+  </w:abstractNum>
+  <w:abstractNum w:abstractNumId="3" w15:restartNumberingAfterBreak="0">
     <w:nsid w:val="1B0075D4"/>
     <w:multiLevelType w:val="multilevel"/>
     <w:tmpl w:val="0F0E05D0"/>
@@ -5454,7 +6558,7 @@
       </w:rPr>
     </w:lvl>
   </w:abstractNum>
-  <w:abstractNum w:abstractNumId="3" w15:restartNumberingAfterBreak="0">
+  <w:abstractNum w:abstractNumId="4" w15:restartNumberingAfterBreak="0">
     <w:nsid w:val="1CA93EFF"/>
     <w:multiLevelType w:val="multilevel"/>
     <w:tmpl w:val="DE76F78C"/>
@@ -5603,7 +6707,156 @@
       </w:rPr>
     </w:lvl>
   </w:abstractNum>
-  <w:abstractNum w:abstractNumId="4" w15:restartNumberingAfterBreak="0">
+  <w:abstractNum w:abstractNumId="5" w15:restartNumberingAfterBreak="0">
+    <w:nsid w:val="1FF706EB"/>
+    <w:multiLevelType w:val="multilevel"/>
+    <w:tmpl w:val="303A87D8"/>
+    <w:lvl w:ilvl="0">
+      <w:start w:val="1"/>
+      <w:numFmt w:val="bullet"/>
+      <w:lvlText w:val=""/>
+      <w:lvlJc w:val="left"/>
+      <w:pPr>
+        <w:tabs>
+          <w:tab w:val="num" w:pos="720"/>
+        </w:tabs>
+        <w:ind w:left="720" w:hanging="360"/>
+      </w:pPr>
+      <w:rPr>
+        <w:rFonts w:ascii="Symbol" w:hAnsi="Symbol" w:hint="default"/>
+        <w:sz w:val="20"/>
+      </w:rPr>
+    </w:lvl>
+    <w:lvl w:ilvl="1" w:tentative="1">
+      <w:start w:val="1"/>
+      <w:numFmt w:val="bullet"/>
+      <w:lvlText w:val="o"/>
+      <w:lvlJc w:val="left"/>
+      <w:pPr>
+        <w:tabs>
+          <w:tab w:val="num" w:pos="1440"/>
+        </w:tabs>
+        <w:ind w:left="1440" w:hanging="360"/>
+      </w:pPr>
+      <w:rPr>
+        <w:rFonts w:ascii="Courier New" w:hAnsi="Courier New" w:hint="default"/>
+        <w:sz w:val="20"/>
+      </w:rPr>
+    </w:lvl>
+    <w:lvl w:ilvl="2" w:tentative="1">
+      <w:start w:val="1"/>
+      <w:numFmt w:val="bullet"/>
+      <w:lvlText w:val=""/>
+      <w:lvlJc w:val="left"/>
+      <w:pPr>
+        <w:tabs>
+          <w:tab w:val="num" w:pos="2160"/>
+        </w:tabs>
+        <w:ind w:left="2160" w:hanging="360"/>
+      </w:pPr>
+      <w:rPr>
+        <w:rFonts w:ascii="Wingdings" w:hAnsi="Wingdings" w:hint="default"/>
+        <w:sz w:val="20"/>
+      </w:rPr>
+    </w:lvl>
+    <w:lvl w:ilvl="3" w:tentative="1">
+      <w:start w:val="1"/>
+      <w:numFmt w:val="bullet"/>
+      <w:lvlText w:val=""/>
+      <w:lvlJc w:val="left"/>
+      <w:pPr>
+        <w:tabs>
+          <w:tab w:val="num" w:pos="2880"/>
+        </w:tabs>
+        <w:ind w:left="2880" w:hanging="360"/>
+      </w:pPr>
+      <w:rPr>
+        <w:rFonts w:ascii="Wingdings" w:hAnsi="Wingdings" w:hint="default"/>
+        <w:sz w:val="20"/>
+      </w:rPr>
+    </w:lvl>
+    <w:lvl w:ilvl="4" w:tentative="1">
+      <w:start w:val="1"/>
+      <w:numFmt w:val="bullet"/>
+      <w:lvlText w:val=""/>
+      <w:lvlJc w:val="left"/>
+      <w:pPr>
+        <w:tabs>
+          <w:tab w:val="num" w:pos="3600"/>
+        </w:tabs>
+        <w:ind w:left="3600" w:hanging="360"/>
+      </w:pPr>
+      <w:rPr>
+        <w:rFonts w:ascii="Wingdings" w:hAnsi="Wingdings" w:hint="default"/>
+        <w:sz w:val="20"/>
+      </w:rPr>
+    </w:lvl>
+    <w:lvl w:ilvl="5" w:tentative="1">
+      <w:start w:val="1"/>
+      <w:numFmt w:val="bullet"/>
+      <w:lvlText w:val=""/>
+      <w:lvlJc w:val="left"/>
+      <w:pPr>
+        <w:tabs>
+          <w:tab w:val="num" w:pos="4320"/>
+        </w:tabs>
+        <w:ind w:left="4320" w:hanging="360"/>
+      </w:pPr>
+      <w:rPr>
+        <w:rFonts w:ascii="Wingdings" w:hAnsi="Wingdings" w:hint="default"/>
+        <w:sz w:val="20"/>
+      </w:rPr>
+    </w:lvl>
+    <w:lvl w:ilvl="6" w:tentative="1">
+      <w:start w:val="1"/>
+      <w:numFmt w:val="bullet"/>
+      <w:lvlText w:val=""/>
+      <w:lvlJc w:val="left"/>
+      <w:pPr>
+        <w:tabs>
+          <w:tab w:val="num" w:pos="5040"/>
+        </w:tabs>
+        <w:ind w:left="5040" w:hanging="360"/>
+      </w:pPr>
+      <w:rPr>
+        <w:rFonts w:ascii="Wingdings" w:hAnsi="Wingdings" w:hint="default"/>
+        <w:sz w:val="20"/>
+      </w:rPr>
+    </w:lvl>
+    <w:lvl w:ilvl="7" w:tentative="1">
+      <w:start w:val="1"/>
+      <w:numFmt w:val="bullet"/>
+      <w:lvlText w:val=""/>
+      <w:lvlJc w:val="left"/>
+      <w:pPr>
+        <w:tabs>
+          <w:tab w:val="num" w:pos="5760"/>
+        </w:tabs>
+        <w:ind w:left="5760" w:hanging="360"/>
+      </w:pPr>
+      <w:rPr>
+        <w:rFonts w:ascii="Wingdings" w:hAnsi="Wingdings" w:hint="default"/>
+        <w:sz w:val="20"/>
+      </w:rPr>
+    </w:lvl>
+    <w:lvl w:ilvl="8" w:tentative="1">
+      <w:start w:val="1"/>
+      <w:numFmt w:val="bullet"/>
+      <w:lvlText w:val=""/>
+      <w:lvlJc w:val="left"/>
+      <w:pPr>
+        <w:tabs>
+          <w:tab w:val="num" w:pos="6480"/>
+        </w:tabs>
+        <w:ind w:left="6480" w:hanging="360"/>
+      </w:pPr>
+      <w:rPr>
+        <w:rFonts w:ascii="Wingdings" w:hAnsi="Wingdings" w:hint="default"/>
+        <w:sz w:val="20"/>
+      </w:rPr>
+    </w:lvl>
+  </w:abstractNum>
+  <w:abstractNum w:abstractNumId="6" w15:restartNumberingAfterBreak="0">
     <w:nsid w:val="222F26EB"/>
     <w:multiLevelType w:val="hybridMultilevel"/>
     <w:tmpl w:val="8826B1A8"/>
@@ -5716,7 +6969,156 @@
       </w:rPr>
     </w:lvl>
   </w:abstractNum>
-  <w:abstractNum w:abstractNumId="5" w15:restartNumberingAfterBreak="0">
+  <w:abstractNum w:abstractNumId="7" w15:restartNumberingAfterBreak="0">
+    <w:nsid w:val="29415097"/>
+    <w:multiLevelType w:val="multilevel"/>
+    <w:tmpl w:val="D670006E"/>
+    <w:lvl w:ilvl="0">
+      <w:start w:val="1"/>
+      <w:numFmt w:val="bullet"/>
+      <w:lvlText w:val=""/>
+      <w:lvlJc w:val="left"/>
+      <w:pPr>
+        <w:tabs>
+          <w:tab w:val="num" w:pos="720"/>
+        </w:tabs>
+        <w:ind w:left="720" w:hanging="360"/>
+      </w:pPr>
+      <w:rPr>
+        <w:rFonts w:ascii="Symbol" w:hAnsi="Symbol" w:hint="default"/>
+        <w:sz w:val="20"/>
+      </w:rPr>
+    </w:lvl>
+    <w:lvl w:ilvl="1" w:tentative="1">
+      <w:start w:val="1"/>
+      <w:numFmt w:val="bullet"/>
+      <w:lvlText w:val="o"/>
+      <w:lvlJc w:val="left"/>
+      <w:pPr>
+        <w:tabs>
+          <w:tab w:val="num" w:pos="1440"/>
+        </w:tabs>
+        <w:ind w:left="1440" w:hanging="360"/>
+      </w:pPr>
+      <w:rPr>
+        <w:rFonts w:ascii="Courier New" w:hAnsi="Courier New" w:hint="default"/>
+        <w:sz w:val="20"/>
+      </w:rPr>
+    </w:lvl>
+    <w:lvl w:ilvl="2" w:tentative="1">
+      <w:start w:val="1"/>
+      <w:numFmt w:val="bullet"/>
+      <w:lvlText w:val=""/>
+      <w:lvlJc w:val="left"/>
+      <w:pPr>
+        <w:tabs>
+          <w:tab w:val="num" w:pos="2160"/>
+        </w:tabs>
+        <w:ind w:left="2160" w:hanging="360"/>
+      </w:pPr>
+      <w:rPr>
+        <w:rFonts w:ascii="Wingdings" w:hAnsi="Wingdings" w:hint="default"/>
+        <w:sz w:val="20"/>
+      </w:rPr>
+    </w:lvl>
+    <w:lvl w:ilvl="3" w:tentative="1">
+      <w:start w:val="1"/>
+      <w:numFmt w:val="bullet"/>
+      <w:lvlText w:val=""/>
+      <w:lvlJc w:val="left"/>
+      <w:pPr>
+        <w:tabs>
+          <w:tab w:val="num" w:pos="2880"/>
+        </w:tabs>
+        <w:ind w:left="2880" w:hanging="360"/>
+      </w:pPr>
+      <w:rPr>
+        <w:rFonts w:ascii="Wingdings" w:hAnsi="Wingdings" w:hint="default"/>
+        <w:sz w:val="20"/>
+      </w:rPr>
+    </w:lvl>
+    <w:lvl w:ilvl="4" w:tentative="1">
+      <w:start w:val="1"/>
+      <w:numFmt w:val="bullet"/>
+      <w:lvlText w:val=""/>
+      <w:lvlJc w:val="left"/>
+      <w:pPr>
+        <w:tabs>
+          <w:tab w:val="num" w:pos="3600"/>
+        </w:tabs>
+        <w:ind w:left="3600" w:hanging="360"/>
+      </w:pPr>
+      <w:rPr>
+        <w:rFonts w:ascii="Wingdings" w:hAnsi="Wingdings" w:hint="default"/>
+        <w:sz w:val="20"/>
+      </w:rPr>
+    </w:lvl>
+    <w:lvl w:ilvl="5" w:tentative="1">
+      <w:start w:val="1"/>
+      <w:numFmt w:val="bullet"/>
+      <w:lvlText w:val=""/>
+      <w:lvlJc w:val="left"/>
+      <w:pPr>
+        <w:tabs>
+          <w:tab w:val="num" w:pos="4320"/>
+        </w:tabs>
+        <w:ind w:left="4320" w:hanging="360"/>
+      </w:pPr>
+      <w:rPr>
+        <w:rFonts w:ascii="Wingdings" w:hAnsi="Wingdings" w:hint="default"/>
+        <w:sz w:val="20"/>
+      </w:rPr>
+    </w:lvl>
+    <w:lvl w:ilvl="6" w:tentative="1">
+      <w:start w:val="1"/>
+      <w:numFmt w:val="bullet"/>
+      <w:lvlText w:val=""/>
+      <w:lvlJc w:val="left"/>
+      <w:pPr>
+        <w:tabs>
+          <w:tab w:val="num" w:pos="5040"/>
+        </w:tabs>
+        <w:ind w:left="5040" w:hanging="360"/>
+      </w:pPr>
+      <w:rPr>
+        <w:rFonts w:ascii="Wingdings" w:hAnsi="Wingdings" w:hint="default"/>
+        <w:sz w:val="20"/>
+      </w:rPr>
+    </w:lvl>
+    <w:lvl w:ilvl="7" w:tentative="1">
+      <w:start w:val="1"/>
+      <w:numFmt w:val="bullet"/>
+      <w:lvlText w:val=""/>
+      <w:lvlJc w:val="left"/>
+      <w:pPr>
+        <w:tabs>
+          <w:tab w:val="num" w:pos="5760"/>
+        </w:tabs>
+        <w:ind w:left="5760" w:hanging="360"/>
+      </w:pPr>
+      <w:rPr>
+        <w:rFonts w:ascii="Wingdings" w:hAnsi="Wingdings" w:hint="default"/>
+        <w:sz w:val="20"/>
+      </w:rPr>
+    </w:lvl>
+    <w:lvl w:ilvl="8" w:tentative="1">
+      <w:start w:val="1"/>
+      <w:numFmt w:val="bullet"/>
+      <w:lvlText w:val=""/>
+      <w:lvlJc w:val="left"/>
+      <w:pPr>
+        <w:tabs>
+          <w:tab w:val="num" w:pos="6480"/>
+        </w:tabs>
+        <w:ind w:left="6480" w:hanging="360"/>
+      </w:pPr>
+      <w:rPr>
+        <w:rFonts w:ascii="Wingdings" w:hAnsi="Wingdings" w:hint="default"/>
+        <w:sz w:val="20"/>
+      </w:rPr>
+    </w:lvl>
+  </w:abstractNum>
+  <w:abstractNum w:abstractNumId="8" w15:restartNumberingAfterBreak="0">
     <w:nsid w:val="351225BE"/>
     <w:multiLevelType w:val="multilevel"/>
     <w:tmpl w:val="420C3678"/>
@@ -5829,7 +7231,7 @@
       </w:pPr>
     </w:lvl>
   </w:abstractNum>
-  <w:abstractNum w:abstractNumId="6" w15:restartNumberingAfterBreak="0">
+  <w:abstractNum w:abstractNumId="9" w15:restartNumberingAfterBreak="0">
     <w:nsid w:val="38821839"/>
     <w:multiLevelType w:val="multilevel"/>
     <w:tmpl w:val="0382157A"/>
@@ -5978,7 +7380,7 @@
       </w:rPr>
     </w:lvl>
   </w:abstractNum>
-  <w:abstractNum w:abstractNumId="7" w15:restartNumberingAfterBreak="0">
+  <w:abstractNum w:abstractNumId="10" w15:restartNumberingAfterBreak="0">
     <w:nsid w:val="3C9973EF"/>
     <w:multiLevelType w:val="multilevel"/>
     <w:tmpl w:val="C804C468"/>
@@ -6127,7 +7529,7 @@
       </w:rPr>
     </w:lvl>
   </w:abstractNum>
-  <w:abstractNum w:abstractNumId="8" w15:restartNumberingAfterBreak="0">
+  <w:abstractNum w:abstractNumId="11" w15:restartNumberingAfterBreak="0">
     <w:nsid w:val="415521CD"/>
     <w:multiLevelType w:val="multilevel"/>
     <w:tmpl w:val="E0AA99D4"/>
@@ -6276,7 +7678,7 @@
       </w:rPr>
     </w:lvl>
   </w:abstractNum>
-  <w:abstractNum w:abstractNumId="9" w15:restartNumberingAfterBreak="0">
+  <w:abstractNum w:abstractNumId="12" w15:restartNumberingAfterBreak="0">
     <w:nsid w:val="41DA779B"/>
     <w:multiLevelType w:val="multilevel"/>
     <w:tmpl w:val="8FFAF41A"/>
@@ -6389,7 +7791,120 @@
       </w:pPr>
     </w:lvl>
   </w:abstractNum>
-  <w:abstractNum w:abstractNumId="10" w15:restartNumberingAfterBreak="0">
+  <w:abstractNum w:abstractNumId="13" w15:restartNumberingAfterBreak="0">
+    <w:nsid w:val="444D03FA"/>
+    <w:multiLevelType w:val="hybridMultilevel"/>
+    <w:tmpl w:val="80EC6116"/>
+    <w:lvl w:ilvl="0" w:tplc="0C0A0001">
+      <w:start w:val="1"/>
+      <w:numFmt w:val="bullet"/>
+      <w:lvlText w:val=""/>
+      <w:lvlJc w:val="left"/>
+      <w:pPr>
+        <w:ind w:left="1080" w:hanging="360"/>
+      </w:pPr>
+      <w:rPr>
+        <w:rFonts w:ascii="Symbol" w:hAnsi="Symbol" w:hint="default"/>
+      </w:rPr>
+    </w:lvl>
+    <w:lvl w:ilvl="1" w:tplc="0C0A0003" w:tentative="1">
+      <w:start w:val="1"/>
+      <w:numFmt w:val="bullet"/>
+      <w:lvlText w:val="o"/>
+      <w:lvlJc w:val="left"/>
+      <w:pPr>
+        <w:ind w:left="1800" w:hanging="360"/>
+      </w:pPr>
+      <w:rPr>
+        <w:rFonts w:ascii="Courier New" w:hAnsi="Courier New" w:cs="Courier New" w:hint="default"/>
+      </w:rPr>
+    </w:lvl>
+    <w:lvl w:ilvl="2" w:tplc="0C0A0005" w:tentative="1">
+      <w:start w:val="1"/>
+      <w:numFmt w:val="bullet"/>
+      <w:lvlText w:val=""/>
+      <w:lvlJc w:val="left"/>
+      <w:pPr>
+        <w:ind w:left="2520" w:hanging="360"/>
+      </w:pPr>
+      <w:rPr>
+        <w:rFonts w:ascii="Wingdings" w:hAnsi="Wingdings" w:hint="default"/>
+      </w:rPr>
+    </w:lvl>
+    <w:lvl w:ilvl="3" w:tplc="0C0A0001" w:tentative="1">
+      <w:start w:val="1"/>
+      <w:numFmt w:val="bullet"/>
+      <w:lvlText w:val=""/>
+      <w:lvlJc w:val="left"/>
+      <w:pPr>
+        <w:ind w:left="3240" w:hanging="360"/>
+      </w:pPr>
+      <w:rPr>
+        <w:rFonts w:ascii="Symbol" w:hAnsi="Symbol" w:hint="default"/>
+      </w:rPr>
+    </w:lvl>
+    <w:lvl w:ilvl="4" w:tplc="0C0A0003" w:tentative="1">
+      <w:start w:val="1"/>
+      <w:numFmt w:val="bullet"/>
+      <w:lvlText w:val="o"/>
+      <w:lvlJc w:val="left"/>
+      <w:pPr>
+        <w:ind w:left="3960" w:hanging="360"/>
+      </w:pPr>
+      <w:rPr>
+        <w:rFonts w:ascii="Courier New" w:hAnsi="Courier New" w:cs="Courier New" w:hint="default"/>
+      </w:rPr>
+    </w:lvl>
+    <w:lvl w:ilvl="5" w:tplc="0C0A0005" w:tentative="1">
+      <w:start w:val="1"/>
+      <w:numFmt w:val="bullet"/>
+      <w:lvlText w:val=""/>
+      <w:lvlJc w:val="left"/>
+      <w:pPr>
+        <w:ind w:left="4680" w:hanging="360"/>
+      </w:pPr>
+      <w:rPr>
+        <w:rFonts w:ascii="Wingdings" w:hAnsi="Wingdings" w:hint="default"/>
+      </w:rPr>
+    </w:lvl>
+    <w:lvl w:ilvl="6" w:tplc="0C0A0001" w:tentative="1">
+      <w:start w:val="1"/>
+      <w:numFmt w:val="bullet"/>
+      <w:lvlText w:val=""/>
+      <w:lvlJc w:val="left"/>
+      <w:pPr>
+        <w:ind w:left="5400" w:hanging="360"/>
+      </w:pPr>
+      <w:rPr>
+        <w:rFonts w:ascii="Symbol" w:hAnsi="Symbol" w:hint="default"/>
+      </w:rPr>
+    </w:lvl>
+    <w:lvl w:ilvl="7" w:tplc="0C0A0003" w:tentative="1">
+      <w:start w:val="1"/>
+      <w:numFmt w:val="bullet"/>
+      <w:lvlText w:val="o"/>
+      <w:lvlJc w:val="left"/>
+      <w:pPr>
+        <w:ind w:left="6120" w:hanging="360"/>
+      </w:pPr>
+      <w:rPr>
+        <w:rFonts w:ascii="Courier New" w:hAnsi="Courier New" w:cs="Courier New" w:hint="default"/>
+      </w:rPr>
+    </w:lvl>
+    <w:lvl w:ilvl="8" w:tplc="0C0A0005" w:tentative="1">
+      <w:start w:val="1"/>
+      <w:numFmt w:val="bullet"/>
+      <w:lvlText w:val=""/>
+      <w:lvlJc w:val="left"/>
+      <w:pPr>
+        <w:ind w:left="6840" w:hanging="360"/>
+      </w:pPr>
+      <w:rPr>
+        <w:rFonts w:ascii="Wingdings" w:hAnsi="Wingdings" w:hint="default"/>
+      </w:rPr>
+    </w:lvl>
+  </w:abstractNum>
+  <w:abstractNum w:abstractNumId="14" w15:restartNumberingAfterBreak="0">
     <w:nsid w:val="45632781"/>
     <w:multiLevelType w:val="hybridMultilevel"/>
     <w:tmpl w:val="7C28A2BA"/>
@@ -6502,7 +8017,7 @@
       </w:rPr>
     </w:lvl>
   </w:abstractNum>
-  <w:abstractNum w:abstractNumId="11" w15:restartNumberingAfterBreak="0">
+  <w:abstractNum w:abstractNumId="15" w15:restartNumberingAfterBreak="0">
     <w:nsid w:val="50DF3A72"/>
     <w:multiLevelType w:val="multilevel"/>
     <w:tmpl w:val="66C2A37E"/>
@@ -6589,7 +8104,382 @@
       </w:pPr>
     </w:lvl>
   </w:abstractNum>
-  <w:abstractNum w:abstractNumId="12" w15:restartNumberingAfterBreak="0">
+  <w:abstractNum w:abstractNumId="16" w15:restartNumberingAfterBreak="0">
+    <w:nsid w:val="53790B1E"/>
+    <w:multiLevelType w:val="hybridMultilevel"/>
+    <w:tmpl w:val="7A06AD96"/>
+    <w:lvl w:ilvl="0" w:tplc="0C0A0001">
+      <w:start w:val="1"/>
+      <w:numFmt w:val="bullet"/>
+      <w:lvlText w:val=""/>
+      <w:lvlJc w:val="left"/>
+      <w:pPr>
+        <w:ind w:left="1080" w:hanging="360"/>
+      </w:pPr>
+      <w:rPr>
+        <w:rFonts w:ascii="Symbol" w:hAnsi="Symbol" w:hint="default"/>
+      </w:rPr>
+    </w:lvl>
+    <w:lvl w:ilvl="1" w:tplc="0C0A0003" w:tentative="1">
+      <w:start w:val="1"/>
+      <w:numFmt w:val="bullet"/>
+      <w:lvlText w:val="o"/>
+      <w:lvlJc w:val="left"/>
+      <w:pPr>
+        <w:ind w:left="1800" w:hanging="360"/>
+      </w:pPr>
+      <w:rPr>
+        <w:rFonts w:ascii="Courier New" w:hAnsi="Courier New" w:cs="Courier New" w:hint="default"/>
+      </w:rPr>
+    </w:lvl>
+    <w:lvl w:ilvl="2" w:tplc="0C0A0005" w:tentative="1">
+      <w:start w:val="1"/>
+      <w:numFmt w:val="bullet"/>
+      <w:lvlText w:val=""/>
+      <w:lvlJc w:val="left"/>
+      <w:pPr>
+        <w:ind w:left="2520" w:hanging="360"/>
+      </w:pPr>
+      <w:rPr>
+        <w:rFonts w:ascii="Wingdings" w:hAnsi="Wingdings" w:hint="default"/>
+      </w:rPr>
+    </w:lvl>
+    <w:lvl w:ilvl="3" w:tplc="0C0A0001" w:tentative="1">
+      <w:start w:val="1"/>
+      <w:numFmt w:val="bullet"/>
+      <w:lvlText w:val=""/>
+      <w:lvlJc w:val="left"/>
+      <w:pPr>
+        <w:ind w:left="3240" w:hanging="360"/>
+      </w:pPr>
+      <w:rPr>
+        <w:rFonts w:ascii="Symbol" w:hAnsi="Symbol" w:hint="default"/>
+      </w:rPr>
+    </w:lvl>
+    <w:lvl w:ilvl="4" w:tplc="0C0A0003" w:tentative="1">
+      <w:start w:val="1"/>
+      <w:numFmt w:val="bullet"/>
+      <w:lvlText w:val="o"/>
+      <w:lvlJc w:val="left"/>
+      <w:pPr>
+        <w:ind w:left="3960" w:hanging="360"/>
+      </w:pPr>
+      <w:rPr>
+        <w:rFonts w:ascii="Courier New" w:hAnsi="Courier New" w:cs="Courier New" w:hint="default"/>
+      </w:rPr>
+    </w:lvl>
+    <w:lvl w:ilvl="5" w:tplc="0C0A0005" w:tentative="1">
+      <w:start w:val="1"/>
+      <w:numFmt w:val="bullet"/>
+      <w:lvlText w:val=""/>
+      <w:lvlJc w:val="left"/>
+      <w:pPr>
+        <w:ind w:left="4680" w:hanging="360"/>
+      </w:pPr>
+      <w:rPr>
+        <w:rFonts w:ascii="Wingdings" w:hAnsi="Wingdings" w:hint="default"/>
+      </w:rPr>
+    </w:lvl>
+    <w:lvl w:ilvl="6" w:tplc="0C0A0001" w:tentative="1">
+      <w:start w:val="1"/>
+      <w:numFmt w:val="bullet"/>
+      <w:lvlText w:val=""/>
+      <w:lvlJc w:val="left"/>
+      <w:pPr>
+        <w:ind w:left="5400" w:hanging="360"/>
+      </w:pPr>
+      <w:rPr>
+        <w:rFonts w:ascii="Symbol" w:hAnsi="Symbol" w:hint="default"/>
+      </w:rPr>
+    </w:lvl>
+    <w:lvl w:ilvl="7" w:tplc="0C0A0003" w:tentative="1">
+      <w:start w:val="1"/>
+      <w:numFmt w:val="bullet"/>
+      <w:lvlText w:val="o"/>
+      <w:lvlJc w:val="left"/>
+      <w:pPr>
+        <w:ind w:left="6120" w:hanging="360"/>
+      </w:pPr>
+      <w:rPr>
+        <w:rFonts w:ascii="Courier New" w:hAnsi="Courier New" w:cs="Courier New" w:hint="default"/>
+      </w:rPr>
+    </w:lvl>
+    <w:lvl w:ilvl="8" w:tplc="0C0A0005" w:tentative="1">
+      <w:start w:val="1"/>
+      <w:numFmt w:val="bullet"/>
+      <w:lvlText w:val=""/>
+      <w:lvlJc w:val="left"/>
+      <w:pPr>
+        <w:ind w:left="6840" w:hanging="360"/>
+      </w:pPr>
+      <w:rPr>
+        <w:rFonts w:ascii="Wingdings" w:hAnsi="Wingdings" w:hint="default"/>
+      </w:rPr>
+    </w:lvl>
+  </w:abstractNum>
+  <w:abstractNum w:abstractNumId="17" w15:restartNumberingAfterBreak="0">
+    <w:nsid w:val="563F08B6"/>
+    <w:multiLevelType w:val="hybridMultilevel"/>
+    <w:tmpl w:val="CD70BDDE"/>
+    <w:lvl w:ilvl="0" w:tplc="0C0A0001">
+      <w:start w:val="1"/>
+      <w:numFmt w:val="bullet"/>
+      <w:lvlText w:val=""/>
+      <w:lvlJc w:val="left"/>
+      <w:pPr>
+        <w:ind w:left="1080" w:hanging="360"/>
+      </w:pPr>
+      <w:rPr>
+        <w:rFonts w:ascii="Symbol" w:hAnsi="Symbol" w:hint="default"/>
+      </w:rPr>
+    </w:lvl>
+    <w:lvl w:ilvl="1" w:tplc="0C0A0003" w:tentative="1">
+      <w:start w:val="1"/>
+      <w:numFmt w:val="bullet"/>
+      <w:lvlText w:val="o"/>
+      <w:lvlJc w:val="left"/>
+      <w:pPr>
+        <w:ind w:left="1800" w:hanging="360"/>
+      </w:pPr>
+      <w:rPr>
+        <w:rFonts w:ascii="Courier New" w:hAnsi="Courier New" w:cs="Courier New" w:hint="default"/>
+      </w:rPr>
+    </w:lvl>
+    <w:lvl w:ilvl="2" w:tplc="0C0A0005" w:tentative="1">
+      <w:start w:val="1"/>
+      <w:numFmt w:val="bullet"/>
+      <w:lvlText w:val=""/>
+      <w:lvlJc w:val="left"/>
+      <w:pPr>
+        <w:ind w:left="2520" w:hanging="360"/>
+      </w:pPr>
+      <w:rPr>
+        <w:rFonts w:ascii="Wingdings" w:hAnsi="Wingdings" w:hint="default"/>
+      </w:rPr>
+    </w:lvl>
+    <w:lvl w:ilvl="3" w:tplc="0C0A0001" w:tentative="1">
+      <w:start w:val="1"/>
+      <w:numFmt w:val="bullet"/>
+      <w:lvlText w:val=""/>
+      <w:lvlJc w:val="left"/>
+      <w:pPr>
+        <w:ind w:left="3240" w:hanging="360"/>
+      </w:pPr>
+      <w:rPr>
+        <w:rFonts w:ascii="Symbol" w:hAnsi="Symbol" w:hint="default"/>
+      </w:rPr>
+    </w:lvl>
+    <w:lvl w:ilvl="4" w:tplc="0C0A0003" w:tentative="1">
+      <w:start w:val="1"/>
+      <w:numFmt w:val="bullet"/>
+      <w:lvlText w:val="o"/>
+      <w:lvlJc w:val="left"/>
+      <w:pPr>
+        <w:ind w:left="3960" w:hanging="360"/>
+      </w:pPr>
+      <w:rPr>
+        <w:rFonts w:ascii="Courier New" w:hAnsi="Courier New" w:cs="Courier New" w:hint="default"/>
+      </w:rPr>
+    </w:lvl>
+    <w:lvl w:ilvl="5" w:tplc="0C0A0005" w:tentative="1">
+      <w:start w:val="1"/>
+      <w:numFmt w:val="bullet"/>
+      <w:lvlText w:val=""/>
+      <w:lvlJc w:val="left"/>
+      <w:pPr>
+        <w:ind w:left="4680" w:hanging="360"/>
+      </w:pPr>
+      <w:rPr>
+        <w:rFonts w:ascii="Wingdings" w:hAnsi="Wingdings" w:hint="default"/>
+      </w:rPr>
+    </w:lvl>
+    <w:lvl w:ilvl="6" w:tplc="0C0A0001" w:tentative="1">
+      <w:start w:val="1"/>
+      <w:numFmt w:val="bullet"/>
+      <w:lvlText w:val=""/>
+      <w:lvlJc w:val="left"/>
+      <w:pPr>
+        <w:ind w:left="5400" w:hanging="360"/>
+      </w:pPr>
+      <w:rPr>
+        <w:rFonts w:ascii="Symbol" w:hAnsi="Symbol" w:hint="default"/>
+      </w:rPr>
+    </w:lvl>
+    <w:lvl w:ilvl="7" w:tplc="0C0A0003" w:tentative="1">
+      <w:start w:val="1"/>
+      <w:numFmt w:val="bullet"/>
+      <w:lvlText w:val="o"/>
+      <w:lvlJc w:val="left"/>
+      <w:pPr>
+        <w:ind w:left="6120" w:hanging="360"/>
+      </w:pPr>
+      <w:rPr>
+        <w:rFonts w:ascii="Courier New" w:hAnsi="Courier New" w:cs="Courier New" w:hint="default"/>
+      </w:rPr>
+    </w:lvl>
+    <w:lvl w:ilvl="8" w:tplc="0C0A0005" w:tentative="1">
+      <w:start w:val="1"/>
+      <w:numFmt w:val="bullet"/>
+      <w:lvlText w:val=""/>
+      <w:lvlJc w:val="left"/>
+      <w:pPr>
+        <w:ind w:left="6840" w:hanging="360"/>
+      </w:pPr>
+      <w:rPr>
+        <w:rFonts w:ascii="Wingdings" w:hAnsi="Wingdings" w:hint="default"/>
+      </w:rPr>
+    </w:lvl>
+  </w:abstractNum>
+  <w:abstractNum w:abstractNumId="18" w15:restartNumberingAfterBreak="0">
+    <w:nsid w:val="59640F76"/>
+    <w:multiLevelType w:val="multilevel"/>
+    <w:tmpl w:val="915056BE"/>
+    <w:lvl w:ilvl="0">
+      <w:start w:val="1"/>
+      <w:numFmt w:val="bullet"/>
+      <w:lvlText w:val=""/>
+      <w:lvlJc w:val="left"/>
+      <w:pPr>
+        <w:tabs>
+          <w:tab w:val="num" w:pos="720"/>
+        </w:tabs>
+        <w:ind w:left="720" w:hanging="360"/>
+      </w:pPr>
+      <w:rPr>
+        <w:rFonts w:ascii="Symbol" w:hAnsi="Symbol" w:hint="default"/>
+        <w:sz w:val="20"/>
+      </w:rPr>
+    </w:lvl>
+    <w:lvl w:ilvl="1" w:tentative="1">
+      <w:start w:val="1"/>
+      <w:numFmt w:val="bullet"/>
+      <w:lvlText w:val="o"/>
+      <w:lvlJc w:val="left"/>
+      <w:pPr>
+        <w:tabs>
+          <w:tab w:val="num" w:pos="1440"/>
+        </w:tabs>
+        <w:ind w:left="1440" w:hanging="360"/>
+      </w:pPr>
+      <w:rPr>
+        <w:rFonts w:ascii="Courier New" w:hAnsi="Courier New" w:hint="default"/>
+        <w:sz w:val="20"/>
+      </w:rPr>
+    </w:lvl>
+    <w:lvl w:ilvl="2" w:tentative="1">
+      <w:start w:val="1"/>
+      <w:numFmt w:val="bullet"/>
+      <w:lvlText w:val=""/>
+      <w:lvlJc w:val="left"/>
+      <w:pPr>
+        <w:tabs>
+          <w:tab w:val="num" w:pos="2160"/>
+        </w:tabs>
+        <w:ind w:left="2160" w:hanging="360"/>
+      </w:pPr>
+      <w:rPr>
+        <w:rFonts w:ascii="Wingdings" w:hAnsi="Wingdings" w:hint="default"/>
+        <w:sz w:val="20"/>
+      </w:rPr>
+    </w:lvl>
+    <w:lvl w:ilvl="3" w:tentative="1">
+      <w:start w:val="1"/>
+      <w:numFmt w:val="bullet"/>
+      <w:lvlText w:val=""/>
+      <w:lvlJc w:val="left"/>
+      <w:pPr>
+        <w:tabs>
+          <w:tab w:val="num" w:pos="2880"/>
+        </w:tabs>
+        <w:ind w:left="2880" w:hanging="360"/>
+      </w:pPr>
+      <w:rPr>
+        <w:rFonts w:ascii="Wingdings" w:hAnsi="Wingdings" w:hint="default"/>
+        <w:sz w:val="20"/>
+      </w:rPr>
+    </w:lvl>
+    <w:lvl w:ilvl="4" w:tentative="1">
+      <w:start w:val="1"/>
+      <w:numFmt w:val="bullet"/>
+      <w:lvlText w:val=""/>
+      <w:lvlJc w:val="left"/>
+      <w:pPr>
+        <w:tabs>
+          <w:tab w:val="num" w:pos="3600"/>
+        </w:tabs>
+        <w:ind w:left="3600" w:hanging="360"/>
+      </w:pPr>
+      <w:rPr>
+        <w:rFonts w:ascii="Wingdings" w:hAnsi="Wingdings" w:hint="default"/>
+        <w:sz w:val="20"/>
+      </w:rPr>
+    </w:lvl>
+    <w:lvl w:ilvl="5" w:tentative="1">
+      <w:start w:val="1"/>
+      <w:numFmt w:val="bullet"/>
+      <w:lvlText w:val=""/>
+      <w:lvlJc w:val="left"/>
+      <w:pPr>
+        <w:tabs>
+          <w:tab w:val="num" w:pos="4320"/>
+        </w:tabs>
+        <w:ind w:left="4320" w:hanging="360"/>
+      </w:pPr>
+      <w:rPr>
+        <w:rFonts w:ascii="Wingdings" w:hAnsi="Wingdings" w:hint="default"/>
+        <w:sz w:val="20"/>
+      </w:rPr>
+    </w:lvl>
+    <w:lvl w:ilvl="6" w:tentative="1">
+      <w:start w:val="1"/>
+      <w:numFmt w:val="bullet"/>
+      <w:lvlText w:val=""/>
+      <w:lvlJc w:val="left"/>
+      <w:pPr>
+        <w:tabs>
+          <w:tab w:val="num" w:pos="5040"/>
+        </w:tabs>
+        <w:ind w:left="5040" w:hanging="360"/>
+      </w:pPr>
+      <w:rPr>
+        <w:rFonts w:ascii="Wingdings" w:hAnsi="Wingdings" w:hint="default"/>
+        <w:sz w:val="20"/>
+      </w:rPr>
+    </w:lvl>
+    <w:lvl w:ilvl="7" w:tentative="1">
+      <w:start w:val="1"/>
+      <w:numFmt w:val="bullet"/>
+      <w:lvlText w:val=""/>
+      <w:lvlJc w:val="left"/>
+      <w:pPr>
+        <w:tabs>
+          <w:tab w:val="num" w:pos="5760"/>
+        </w:tabs>
+        <w:ind w:left="5760" w:hanging="360"/>
+      </w:pPr>
+      <w:rPr>
+        <w:rFonts w:ascii="Wingdings" w:hAnsi="Wingdings" w:hint="default"/>
+        <w:sz w:val="20"/>
+      </w:rPr>
+    </w:lvl>
+    <w:lvl w:ilvl="8" w:tentative="1">
+      <w:start w:val="1"/>
+      <w:numFmt w:val="bullet"/>
+      <w:lvlText w:val=""/>
+      <w:lvlJc w:val="left"/>
+      <w:pPr>
+        <w:tabs>
+          <w:tab w:val="num" w:pos="6480"/>
+        </w:tabs>
+        <w:ind w:left="6480" w:hanging="360"/>
+      </w:pPr>
+      <w:rPr>
+        <w:rFonts w:ascii="Wingdings" w:hAnsi="Wingdings" w:hint="default"/>
+        <w:sz w:val="20"/>
+      </w:rPr>
+    </w:lvl>
+  </w:abstractNum>
+  <w:abstractNum w:abstractNumId="19" w15:restartNumberingAfterBreak="0">
     <w:nsid w:val="616072A1"/>
     <w:multiLevelType w:val="multilevel"/>
     <w:tmpl w:val="B15495DA"/>
@@ -6738,7 +8628,156 @@
       </w:rPr>
     </w:lvl>
   </w:abstractNum>
-  <w:abstractNum w:abstractNumId="13" w15:restartNumberingAfterBreak="0">
+  <w:abstractNum w:abstractNumId="20" w15:restartNumberingAfterBreak="0">
+    <w:nsid w:val="670A3EDD"/>
+    <w:multiLevelType w:val="multilevel"/>
+    <w:tmpl w:val="D9F886DE"/>
+    <w:lvl w:ilvl="0">
+      <w:start w:val="1"/>
+      <w:numFmt w:val="bullet"/>
+      <w:lvlText w:val=""/>
+      <w:lvlJc w:val="left"/>
+      <w:pPr>
+        <w:tabs>
+          <w:tab w:val="num" w:pos="720"/>
+        </w:tabs>
+        <w:ind w:left="720" w:hanging="360"/>
+      </w:pPr>
+      <w:rPr>
+        <w:rFonts w:ascii="Symbol" w:hAnsi="Symbol" w:hint="default"/>
+        <w:sz w:val="20"/>
+      </w:rPr>
+    </w:lvl>
+    <w:lvl w:ilvl="1" w:tentative="1">
+      <w:start w:val="1"/>
+      <w:numFmt w:val="bullet"/>
+      <w:lvlText w:val="o"/>
+      <w:lvlJc w:val="left"/>
+      <w:pPr>
+        <w:tabs>
+          <w:tab w:val="num" w:pos="1440"/>
+        </w:tabs>
+        <w:ind w:left="1440" w:hanging="360"/>
+      </w:pPr>
+      <w:rPr>
+        <w:rFonts w:ascii="Courier New" w:hAnsi="Courier New" w:hint="default"/>
+        <w:sz w:val="20"/>
+      </w:rPr>
+    </w:lvl>
+    <w:lvl w:ilvl="2" w:tentative="1">
+      <w:start w:val="1"/>
+      <w:numFmt w:val="bullet"/>
+      <w:lvlText w:val=""/>
+      <w:lvlJc w:val="left"/>
+      <w:pPr>
+        <w:tabs>
+          <w:tab w:val="num" w:pos="2160"/>
+        </w:tabs>
+        <w:ind w:left="2160" w:hanging="360"/>
+      </w:pPr>
+      <w:rPr>
+        <w:rFonts w:ascii="Wingdings" w:hAnsi="Wingdings" w:hint="default"/>
+        <w:sz w:val="20"/>
+      </w:rPr>
+    </w:lvl>
+    <w:lvl w:ilvl="3" w:tentative="1">
+      <w:start w:val="1"/>
+      <w:numFmt w:val="bullet"/>
+      <w:lvlText w:val=""/>
+      <w:lvlJc w:val="left"/>
+      <w:pPr>
+        <w:tabs>
+          <w:tab w:val="num" w:pos="2880"/>
+        </w:tabs>
+        <w:ind w:left="2880" w:hanging="360"/>
+      </w:pPr>
+      <w:rPr>
+        <w:rFonts w:ascii="Wingdings" w:hAnsi="Wingdings" w:hint="default"/>
+        <w:sz w:val="20"/>
+      </w:rPr>
+    </w:lvl>
+    <w:lvl w:ilvl="4" w:tentative="1">
+      <w:start w:val="1"/>
+      <w:numFmt w:val="bullet"/>
+      <w:lvlText w:val=""/>
+      <w:lvlJc w:val="left"/>
+      <w:pPr>
+        <w:tabs>
+          <w:tab w:val="num" w:pos="3600"/>
+        </w:tabs>
+        <w:ind w:left="3600" w:hanging="360"/>
+      </w:pPr>
+      <w:rPr>
+        <w:rFonts w:ascii="Wingdings" w:hAnsi="Wingdings" w:hint="default"/>
+        <w:sz w:val="20"/>
+      </w:rPr>
+    </w:lvl>
+    <w:lvl w:ilvl="5" w:tentative="1">
+      <w:start w:val="1"/>
+      <w:numFmt w:val="bullet"/>
+      <w:lvlText w:val=""/>
+      <w:lvlJc w:val="left"/>
+      <w:pPr>
+        <w:tabs>
+          <w:tab w:val="num" w:pos="4320"/>
+        </w:tabs>
+        <w:ind w:left="4320" w:hanging="360"/>
+      </w:pPr>
+      <w:rPr>
+        <w:rFonts w:ascii="Wingdings" w:hAnsi="Wingdings" w:hint="default"/>
+        <w:sz w:val="20"/>
+      </w:rPr>
+    </w:lvl>
+    <w:lvl w:ilvl="6" w:tentative="1">
+      <w:start w:val="1"/>
+      <w:numFmt w:val="bullet"/>
+      <w:lvlText w:val=""/>
+      <w:lvlJc w:val="left"/>
+      <w:pPr>
+        <w:tabs>
+          <w:tab w:val="num" w:pos="5040"/>
+        </w:tabs>
+        <w:ind w:left="5040" w:hanging="360"/>
+      </w:pPr>
+      <w:rPr>
+        <w:rFonts w:ascii="Wingdings" w:hAnsi="Wingdings" w:hint="default"/>
+        <w:sz w:val="20"/>
+      </w:rPr>
+    </w:lvl>
+    <w:lvl w:ilvl="7" w:tentative="1">
+      <w:start w:val="1"/>
+      <w:numFmt w:val="bullet"/>
+      <w:lvlText w:val=""/>
+      <w:lvlJc w:val="left"/>
+      <w:pPr>
+        <w:tabs>
+          <w:tab w:val="num" w:pos="5760"/>
+        </w:tabs>
+        <w:ind w:left="5760" w:hanging="360"/>
+      </w:pPr>
+      <w:rPr>
+        <w:rFonts w:ascii="Wingdings" w:hAnsi="Wingdings" w:hint="default"/>
+        <w:sz w:val="20"/>
+      </w:rPr>
+    </w:lvl>
+    <w:lvl w:ilvl="8" w:tentative="1">
+      <w:start w:val="1"/>
+      <w:numFmt w:val="bullet"/>
+      <w:lvlText w:val=""/>
+      <w:lvlJc w:val="left"/>
+      <w:pPr>
+        <w:tabs>
+          <w:tab w:val="num" w:pos="6480"/>
+        </w:tabs>
+        <w:ind w:left="6480" w:hanging="360"/>
+      </w:pPr>
+      <w:rPr>
+        <w:rFonts w:ascii="Wingdings" w:hAnsi="Wingdings" w:hint="default"/>
+        <w:sz w:val="20"/>
+      </w:rPr>
+    </w:lvl>
+  </w:abstractNum>
+  <w:abstractNum w:abstractNumId="21" w15:restartNumberingAfterBreak="0">
     <w:nsid w:val="685E294E"/>
     <w:multiLevelType w:val="multilevel"/>
     <w:tmpl w:val="A7947952"/>
@@ -6887,7 +8926,7 @@
       </w:rPr>
     </w:lvl>
   </w:abstractNum>
-  <w:abstractNum w:abstractNumId="14" w15:restartNumberingAfterBreak="0">
+  <w:abstractNum w:abstractNumId="22" w15:restartNumberingAfterBreak="0">
     <w:nsid w:val="6B7242DF"/>
     <w:multiLevelType w:val="multilevel"/>
     <w:tmpl w:val="35FEE1B6"/>
@@ -7036,7 +9075,7 @@
       </w:rPr>
     </w:lvl>
   </w:abstractNum>
-  <w:abstractNum w:abstractNumId="15" w15:restartNumberingAfterBreak="0">
+  <w:abstractNum w:abstractNumId="23" w15:restartNumberingAfterBreak="0">
     <w:nsid w:val="6CF655A5"/>
     <w:multiLevelType w:val="multilevel"/>
     <w:tmpl w:val="AA120C74"/>
@@ -7149,7 +9188,7 @@
       </w:pPr>
     </w:lvl>
   </w:abstractNum>
-  <w:abstractNum w:abstractNumId="16" w15:restartNumberingAfterBreak="0">
+  <w:abstractNum w:abstractNumId="24" w15:restartNumberingAfterBreak="0">
     <w:nsid w:val="6D6048EB"/>
     <w:multiLevelType w:val="hybridMultilevel"/>
     <w:tmpl w:val="496637C8"/>
@@ -7262,7 +9301,7 @@
       </w:rPr>
     </w:lvl>
   </w:abstractNum>
-  <w:abstractNum w:abstractNumId="17" w15:restartNumberingAfterBreak="0">
+  <w:abstractNum w:abstractNumId="25" w15:restartNumberingAfterBreak="0">
     <w:nsid w:val="6D9E2373"/>
     <w:multiLevelType w:val="multilevel"/>
     <w:tmpl w:val="7798721C"/>
@@ -7411,7 +9450,156 @@
       </w:rPr>
     </w:lvl>
   </w:abstractNum>
-  <w:abstractNum w:abstractNumId="18" w15:restartNumberingAfterBreak="0">
+  <w:abstractNum w:abstractNumId="26" w15:restartNumberingAfterBreak="0">
+    <w:nsid w:val="76492344"/>
+    <w:multiLevelType w:val="multilevel"/>
+    <w:tmpl w:val="5526F338"/>
+    <w:lvl w:ilvl="0">
+      <w:start w:val="1"/>
+      <w:numFmt w:val="bullet"/>
+      <w:lvlText w:val=""/>
+      <w:lvlJc w:val="left"/>
+      <w:pPr>
+        <w:tabs>
+          <w:tab w:val="num" w:pos="720"/>
+        </w:tabs>
+        <w:ind w:left="720" w:hanging="360"/>
+      </w:pPr>
+      <w:rPr>
+        <w:rFonts w:ascii="Symbol" w:hAnsi="Symbol" w:hint="default"/>
+        <w:sz w:val="20"/>
+      </w:rPr>
+    </w:lvl>
+    <w:lvl w:ilvl="1" w:tentative="1">
+      <w:start w:val="1"/>
+      <w:numFmt w:val="bullet"/>
+      <w:lvlText w:val="o"/>
+      <w:lvlJc w:val="left"/>
+      <w:pPr>
+        <w:tabs>
+          <w:tab w:val="num" w:pos="1440"/>
+        </w:tabs>
+        <w:ind w:left="1440" w:hanging="360"/>
+      </w:pPr>
+      <w:rPr>
+        <w:rFonts w:ascii="Courier New" w:hAnsi="Courier New" w:hint="default"/>
+        <w:sz w:val="20"/>
+      </w:rPr>
+    </w:lvl>
+    <w:lvl w:ilvl="2" w:tentative="1">
+      <w:start w:val="1"/>
+      <w:numFmt w:val="bullet"/>
+      <w:lvlText w:val=""/>
+      <w:lvlJc w:val="left"/>
+      <w:pPr>
+        <w:tabs>
+          <w:tab w:val="num" w:pos="2160"/>
+        </w:tabs>
+        <w:ind w:left="2160" w:hanging="360"/>
+      </w:pPr>
+      <w:rPr>
+        <w:rFonts w:ascii="Wingdings" w:hAnsi="Wingdings" w:hint="default"/>
+        <w:sz w:val="20"/>
+      </w:rPr>
+    </w:lvl>
+    <w:lvl w:ilvl="3" w:tentative="1">
+      <w:start w:val="1"/>
+      <w:numFmt w:val="bullet"/>
+      <w:lvlText w:val=""/>
+      <w:lvlJc w:val="left"/>
+      <w:pPr>
+        <w:tabs>
+          <w:tab w:val="num" w:pos="2880"/>
+        </w:tabs>
+        <w:ind w:left="2880" w:hanging="360"/>
+      </w:pPr>
+      <w:rPr>
+        <w:rFonts w:ascii="Wingdings" w:hAnsi="Wingdings" w:hint="default"/>
+        <w:sz w:val="20"/>
+      </w:rPr>
+    </w:lvl>
+    <w:lvl w:ilvl="4" w:tentative="1">
+      <w:start w:val="1"/>
+      <w:numFmt w:val="bullet"/>
+      <w:lvlText w:val=""/>
+      <w:lvlJc w:val="left"/>
+      <w:pPr>
+        <w:tabs>
+          <w:tab w:val="num" w:pos="3600"/>
+        </w:tabs>
+        <w:ind w:left="3600" w:hanging="360"/>
+      </w:pPr>
+      <w:rPr>
+        <w:rFonts w:ascii="Wingdings" w:hAnsi="Wingdings" w:hint="default"/>
+        <w:sz w:val="20"/>
+      </w:rPr>
+    </w:lvl>
+    <w:lvl w:ilvl="5" w:tentative="1">
+      <w:start w:val="1"/>
+      <w:numFmt w:val="bullet"/>
+      <w:lvlText w:val=""/>
+      <w:lvlJc w:val="left"/>
+      <w:pPr>
+        <w:tabs>
+          <w:tab w:val="num" w:pos="4320"/>
+        </w:tabs>
+        <w:ind w:left="4320" w:hanging="360"/>
+      </w:pPr>
+      <w:rPr>
+        <w:rFonts w:ascii="Wingdings" w:hAnsi="Wingdings" w:hint="default"/>
+        <w:sz w:val="20"/>
+      </w:rPr>
+    </w:lvl>
+    <w:lvl w:ilvl="6" w:tentative="1">
+      <w:start w:val="1"/>
+      <w:numFmt w:val="bullet"/>
+      <w:lvlText w:val=""/>
+      <w:lvlJc w:val="left"/>
+      <w:pPr>
+        <w:tabs>
+          <w:tab w:val="num" w:pos="5040"/>
+        </w:tabs>
+        <w:ind w:left="5040" w:hanging="360"/>
+      </w:pPr>
+      <w:rPr>
+        <w:rFonts w:ascii="Wingdings" w:hAnsi="Wingdings" w:hint="default"/>
+        <w:sz w:val="20"/>
+      </w:rPr>
+    </w:lvl>
+    <w:lvl w:ilvl="7" w:tentative="1">
+      <w:start w:val="1"/>
+      <w:numFmt w:val="bullet"/>
+      <w:lvlText w:val=""/>
+      <w:lvlJc w:val="left"/>
+      <w:pPr>
+        <w:tabs>
+          <w:tab w:val="num" w:pos="5760"/>
+        </w:tabs>
+        <w:ind w:left="5760" w:hanging="360"/>
+      </w:pPr>
+      <w:rPr>
+        <w:rFonts w:ascii="Wingdings" w:hAnsi="Wingdings" w:hint="default"/>
+        <w:sz w:val="20"/>
+      </w:rPr>
+    </w:lvl>
+    <w:lvl w:ilvl="8" w:tentative="1">
+      <w:start w:val="1"/>
+      <w:numFmt w:val="bullet"/>
+      <w:lvlText w:val=""/>
+      <w:lvlJc w:val="left"/>
+      <w:pPr>
+        <w:tabs>
+          <w:tab w:val="num" w:pos="6480"/>
+        </w:tabs>
+        <w:ind w:left="6480" w:hanging="360"/>
+      </w:pPr>
+      <w:rPr>
+        <w:rFonts w:ascii="Wingdings" w:hAnsi="Wingdings" w:hint="default"/>
+        <w:sz w:val="20"/>
+      </w:rPr>
+    </w:lvl>
+  </w:abstractNum>
+  <w:abstractNum w:abstractNumId="27" w15:restartNumberingAfterBreak="0">
     <w:nsid w:val="7CB5752A"/>
     <w:multiLevelType w:val="hybridMultilevel"/>
     <w:tmpl w:val="3E8855C0"/>
@@ -7524,7 +9712,120 @@
       </w:rPr>
     </w:lvl>
   </w:abstractNum>
-  <w:abstractNum w:abstractNumId="19" w15:restartNumberingAfterBreak="0">
+  <w:abstractNum w:abstractNumId="28" w15:restartNumberingAfterBreak="0">
+    <w:nsid w:val="7D905054"/>
+    <w:multiLevelType w:val="hybridMultilevel"/>
+    <w:tmpl w:val="B5EE156C"/>
+    <w:lvl w:ilvl="0" w:tplc="0C0A0001">
+      <w:start w:val="1"/>
+      <w:numFmt w:val="bullet"/>
+      <w:lvlText w:val=""/>
+      <w:lvlJc w:val="left"/>
+      <w:pPr>
+        <w:ind w:left="1068" w:hanging="360"/>
+      </w:pPr>
+      <w:rPr>
+        <w:rFonts w:ascii="Symbol" w:hAnsi="Symbol" w:hint="default"/>
+      </w:rPr>
+    </w:lvl>
+    <w:lvl w:ilvl="1" w:tplc="0C0A0003" w:tentative="1">
+      <w:start w:val="1"/>
+      <w:numFmt w:val="bullet"/>
+      <w:lvlText w:val="o"/>
+      <w:lvlJc w:val="left"/>
+      <w:pPr>
+        <w:ind w:left="1788" w:hanging="360"/>
+      </w:pPr>
+      <w:rPr>
+        <w:rFonts w:ascii="Courier New" w:hAnsi="Courier New" w:cs="Courier New" w:hint="default"/>
+      </w:rPr>
+    </w:lvl>
+    <w:lvl w:ilvl="2" w:tplc="0C0A0005" w:tentative="1">
+      <w:start w:val="1"/>
+      <w:numFmt w:val="bullet"/>
+      <w:lvlText w:val=""/>
+      <w:lvlJc w:val="left"/>
+      <w:pPr>
+        <w:ind w:left="2508" w:hanging="360"/>
+      </w:pPr>
+      <w:rPr>
+        <w:rFonts w:ascii="Wingdings" w:hAnsi="Wingdings" w:hint="default"/>
+      </w:rPr>
+    </w:lvl>
+    <w:lvl w:ilvl="3" w:tplc="0C0A0001" w:tentative="1">
+      <w:start w:val="1"/>
+      <w:numFmt w:val="bullet"/>
+      <w:lvlText w:val=""/>
+      <w:lvlJc w:val="left"/>
+      <w:pPr>
+        <w:ind w:left="3228" w:hanging="360"/>
+      </w:pPr>
+      <w:rPr>
+        <w:rFonts w:ascii="Symbol" w:hAnsi="Symbol" w:hint="default"/>
+      </w:rPr>
+    </w:lvl>
+    <w:lvl w:ilvl="4" w:tplc="0C0A0003" w:tentative="1">
+      <w:start w:val="1"/>
+      <w:numFmt w:val="bullet"/>
+      <w:lvlText w:val="o"/>
+      <w:lvlJc w:val="left"/>
+      <w:pPr>
+        <w:ind w:left="3948" w:hanging="360"/>
+      </w:pPr>
+      <w:rPr>
+        <w:rFonts w:ascii="Courier New" w:hAnsi="Courier New" w:cs="Courier New" w:hint="default"/>
+      </w:rPr>
+    </w:lvl>
+    <w:lvl w:ilvl="5" w:tplc="0C0A0005" w:tentative="1">
+      <w:start w:val="1"/>
+      <w:numFmt w:val="bullet"/>
+      <w:lvlText w:val=""/>
+      <w:lvlJc w:val="left"/>
+      <w:pPr>
+        <w:ind w:left="4668" w:hanging="360"/>
+      </w:pPr>
+      <w:rPr>
+        <w:rFonts w:ascii="Wingdings" w:hAnsi="Wingdings" w:hint="default"/>
+      </w:rPr>
+    </w:lvl>
+    <w:lvl w:ilvl="6" w:tplc="0C0A0001" w:tentative="1">
+      <w:start w:val="1"/>
+      <w:numFmt w:val="bullet"/>
+      <w:lvlText w:val=""/>
+      <w:lvlJc w:val="left"/>
+      <w:pPr>
+        <w:ind w:left="5388" w:hanging="360"/>
+      </w:pPr>
+      <w:rPr>
+        <w:rFonts w:ascii="Symbol" w:hAnsi="Symbol" w:hint="default"/>
+      </w:rPr>
+    </w:lvl>
+    <w:lvl w:ilvl="7" w:tplc="0C0A0003" w:tentative="1">
+      <w:start w:val="1"/>
+      <w:numFmt w:val="bullet"/>
+      <w:lvlText w:val="o"/>
+      <w:lvlJc w:val="left"/>
+      <w:pPr>
+        <w:ind w:left="6108" w:hanging="360"/>
+      </w:pPr>
+      <w:rPr>
+        <w:rFonts w:ascii="Courier New" w:hAnsi="Courier New" w:cs="Courier New" w:hint="default"/>
+      </w:rPr>
+    </w:lvl>
+    <w:lvl w:ilvl="8" w:tplc="0C0A0005" w:tentative="1">
+      <w:start w:val="1"/>
+      <w:numFmt w:val="bullet"/>
+      <w:lvlText w:val=""/>
+      <w:lvlJc w:val="left"/>
+      <w:pPr>
+        <w:ind w:left="6828" w:hanging="360"/>
+      </w:pPr>
+      <w:rPr>
+        <w:rFonts w:ascii="Wingdings" w:hAnsi="Wingdings" w:hint="default"/>
+      </w:rPr>
+    </w:lvl>
+  </w:abstractNum>
+  <w:abstractNum w:abstractNumId="29" w15:restartNumberingAfterBreak="0">
     <w:nsid w:val="7E764224"/>
     <w:multiLevelType w:val="multilevel"/>
     <w:tmpl w:val="5248F0BA"/>
@@ -7677,7 +9978,7 @@
     <w:abstractNumId w:val="0"/>
   </w:num>
   <w:num w:numId="2">
-    <w:abstractNumId w:val="16"/>
+    <w:abstractNumId w:val="24"/>
   </w:num>
   <w:num w:numId="3">
     <w:abstractNumId w:val="0"/>
@@ -7710,7 +10011,7 @@
     </w:lvlOverride>
   </w:num>
   <w:num w:numId="4">
-    <w:abstractNumId w:val="11"/>
+    <w:abstractNumId w:val="15"/>
     <w:lvlOverride w:ilvl="0">
       <w:startOverride w:val="1"/>
     </w:lvlOverride>
@@ -7770,28 +10071,28 @@
     </w:lvlOverride>
   </w:num>
   <w:num w:numId="6">
-    <w:abstractNumId w:val="14"/>
+    <w:abstractNumId w:val="22"/>
   </w:num>
   <w:num w:numId="7">
-    <w:abstractNumId w:val="13"/>
+    <w:abstractNumId w:val="21"/>
   </w:num>
   <w:num w:numId="8">
-    <w:abstractNumId w:val="12"/>
+    <w:abstractNumId w:val="19"/>
   </w:num>
   <w:num w:numId="9">
-    <w:abstractNumId w:val="7"/>
+    <w:abstractNumId w:val="10"/>
   </w:num>
   <w:num w:numId="10">
-    <w:abstractNumId w:val="3"/>
+    <w:abstractNumId w:val="4"/>
   </w:num>
   <w:num w:numId="11">
-    <w:abstractNumId w:val="4"/>
+    <w:abstractNumId w:val="6"/>
   </w:num>
   <w:num w:numId="12">
-    <w:abstractNumId w:val="6"/>
+    <w:abstractNumId w:val="9"/>
   </w:num>
   <w:num w:numId="13">
-    <w:abstractNumId w:val="5"/>
+    <w:abstractNumId w:val="8"/>
     <w:lvlOverride w:ilvl="0">
       <w:startOverride w:val="1"/>
     </w:lvlOverride>
@@ -7821,31 +10122,61 @@
     </w:lvlOverride>
   </w:num>
   <w:num w:numId="14">
-    <w:abstractNumId w:val="8"/>
+    <w:abstractNumId w:val="11"/>
   </w:num>
   <w:num w:numId="15">
-    <w:abstractNumId w:val="17"/>
+    <w:abstractNumId w:val="25"/>
   </w:num>
   <w:num w:numId="16">
-    <w:abstractNumId w:val="2"/>
+    <w:abstractNumId w:val="3"/>
   </w:num>
   <w:num w:numId="17">
-    <w:abstractNumId w:val="15"/>
+    <w:abstractNumId w:val="23"/>
   </w:num>
   <w:num w:numId="18">
     <w:abstractNumId w:val="1"/>
   </w:num>
   <w:num w:numId="19">
-    <w:abstractNumId w:val="10"/>
+    <w:abstractNumId w:val="14"/>
   </w:num>
   <w:num w:numId="20">
+    <w:abstractNumId w:val="27"/>
+  </w:num>
+  <w:num w:numId="21">
+    <w:abstractNumId w:val="12"/>
+  </w:num>
+  <w:num w:numId="22">
+    <w:abstractNumId w:val="29"/>
+  </w:num>
+  <w:num w:numId="23">
     <w:abstractNumId w:val="18"/>
   </w:num>
-  <w:num w:numId="21">
-    <w:abstractNumId w:val="9"/>
+  <w:num w:numId="24">
+    <w:abstractNumId w:val="5"/>
   </w:num>
-  <w:num w:numId="22">
-    <w:abstractNumId w:val="19"/>
+  <w:num w:numId="25">
+    <w:abstractNumId w:val="20"/>
+  </w:num>
+  <w:num w:numId="26">
+    <w:abstractNumId w:val="7"/>
+  </w:num>
+  <w:num w:numId="27">
+    <w:abstractNumId w:val="26"/>
+  </w:num>
+  <w:num w:numId="28">
+    <w:abstractNumId w:val="17"/>
+  </w:num>
+  <w:num w:numId="29">
+    <w:abstractNumId w:val="13"/>
+  </w:num>
+  <w:num w:numId="30">
+    <w:abstractNumId w:val="16"/>
+  </w:num>
+  <w:num w:numId="31">
+    <w:abstractNumId w:val="2"/>
+  </w:num>
+  <w:num w:numId="32">
+    <w:abstractNumId w:val="28"/>
   </w:num>
 </w:numbering>
 </file>

</xml_diff>

<commit_message>
doc6 / matriz de priorizacion
</commit_message>
<xml_diff>
--- a/DocumentoCompProyectoMercados_GCC.docx
+++ b/DocumentoCompProyectoMercados_GCC.docx
@@ -5525,10 +5525,546 @@
     </w:p>
     <w:p>
       <w:pPr>
-        <w:rPr>
-          <w:lang w:val="es-ES"/>
-        </w:rPr>
-      </w:pPr>
+        <w:pStyle w:val="Ttulo1"/>
+      </w:pPr>
+      <w:r>
+        <w:t>Matriz de Priorización de Requerimientos</w:t>
+      </w:r>
+    </w:p>
+    <w:p>
+      <w:pPr>
+        <w:rPr>
+          <w:rFonts w:ascii="Arial" w:hAnsi="Arial" w:cs="Arial"/>
+          <w:lang w:val="es-ES"/>
+        </w:rPr>
+      </w:pPr>
+      <w:r>
+        <w:rPr>
+          <w:rFonts w:ascii="Arial" w:hAnsi="Arial" w:cs="Arial"/>
+          <w:lang w:val="es-ES"/>
+        </w:rPr>
+        <w:t xml:space="preserve">Utilizando el método </w:t>
+      </w:r>
+      <w:proofErr w:type="spellStart"/>
+      <w:r>
+        <w:rPr>
+          <w:rFonts w:ascii="Arial" w:hAnsi="Arial" w:cs="Arial"/>
+          <w:lang w:val="es-ES"/>
+        </w:rPr>
+        <w:t>MoSCoW</w:t>
+      </w:r>
+      <w:proofErr w:type="spellEnd"/>
+      <w:r>
+        <w:rPr>
+          <w:rFonts w:ascii="Arial" w:hAnsi="Arial" w:cs="Arial"/>
+          <w:lang w:val="es-ES"/>
+        </w:rPr>
+        <w:t>, clasificamos los requisitos del MVP para asegurar que el equipo se enfoque en el valor crítico del negocio, protegiendo el proyecto contra la escasez de tiempo (6 meses).</w:t>
+      </w:r>
+    </w:p>
+    <w:p>
+      <w:pPr>
+        <w:pStyle w:val="Ttulo2"/>
+      </w:pPr>
+      <w:r>
+        <w:t xml:space="preserve">Cuadro de Priorización </w:t>
+      </w:r>
+      <w:proofErr w:type="spellStart"/>
+      <w:r>
+        <w:t>MoSCoW</w:t>
+      </w:r>
+      <w:proofErr w:type="spellEnd"/>
+    </w:p>
+    <w:p>
+      <w:pPr>
+        <w:ind w:left="708"/>
+        <w:rPr>
+          <w:rFonts w:ascii="Arial" w:hAnsi="Arial" w:cs="Arial"/>
+          <w:b/>
+          <w:bCs/>
+          <w:lang w:val="es-ES"/>
+        </w:rPr>
+      </w:pPr>
+      <w:proofErr w:type="spellStart"/>
+      <w:r>
+        <w:rPr>
+          <w:rFonts w:ascii="Arial" w:hAnsi="Arial" w:cs="Arial"/>
+          <w:b/>
+          <w:bCs/>
+          <w:lang w:val="es-ES"/>
+        </w:rPr>
+        <w:t>Must</w:t>
+      </w:r>
+      <w:proofErr w:type="spellEnd"/>
+      <w:r>
+        <w:rPr>
+          <w:rFonts w:ascii="Arial" w:hAnsi="Arial" w:cs="Arial"/>
+          <w:b/>
+          <w:bCs/>
+          <w:lang w:val="es-ES"/>
+        </w:rPr>
+        <w:t xml:space="preserve"> </w:t>
+      </w:r>
+      <w:proofErr w:type="spellStart"/>
+      <w:r>
+        <w:rPr>
+          <w:rFonts w:ascii="Arial" w:hAnsi="Arial" w:cs="Arial"/>
+          <w:b/>
+          <w:bCs/>
+          <w:lang w:val="es-ES"/>
+        </w:rPr>
+        <w:t>Have</w:t>
+      </w:r>
+      <w:proofErr w:type="spellEnd"/>
+      <w:r>
+        <w:rPr>
+          <w:rFonts w:ascii="Arial" w:hAnsi="Arial" w:cs="Arial"/>
+          <w:b/>
+          <w:bCs/>
+          <w:lang w:val="es-ES"/>
+        </w:rPr>
+        <w:t xml:space="preserve"> (Obligatorio para el MVP)</w:t>
+      </w:r>
+    </w:p>
+    <w:p>
+      <w:pPr>
+        <w:ind w:left="708"/>
+        <w:rPr>
+          <w:rFonts w:ascii="Arial" w:hAnsi="Arial" w:cs="Arial"/>
+          <w:lang w:val="es-ES"/>
+        </w:rPr>
+      </w:pPr>
+      <w:r>
+        <w:rPr>
+          <w:rFonts w:ascii="Arial" w:hAnsi="Arial" w:cs="Arial"/>
+          <w:b/>
+          <w:bCs/>
+          <w:lang w:val="es-ES"/>
+        </w:rPr>
+        <w:t>RF-1.1 al RF-1.3:</w:t>
+      </w:r>
+      <w:r>
+        <w:rPr>
+          <w:rFonts w:ascii="Arial" w:hAnsi="Arial" w:cs="Arial"/>
+          <w:lang w:val="es-ES"/>
+        </w:rPr>
+        <w:t xml:space="preserve"> Censo digital de comerciantes y mapeo lógico de puestos (Sin esto no hay sistema).</w:t>
+      </w:r>
+    </w:p>
+    <w:p>
+      <w:pPr>
+        <w:ind w:left="708"/>
+        <w:rPr>
+          <w:rFonts w:ascii="Arial" w:hAnsi="Arial" w:cs="Arial"/>
+          <w:lang w:val="es-ES"/>
+        </w:rPr>
+      </w:pPr>
+      <w:r>
+        <w:rPr>
+          <w:rFonts w:ascii="Arial" w:hAnsi="Arial" w:cs="Arial"/>
+          <w:b/>
+          <w:bCs/>
+          <w:lang w:val="es-ES"/>
+        </w:rPr>
+        <w:t>RF-2.1 y RF-2.2:</w:t>
+      </w:r>
+      <w:r>
+        <w:rPr>
+          <w:rFonts w:ascii="Arial" w:hAnsi="Arial" w:cs="Arial"/>
+          <w:lang w:val="es-ES"/>
+        </w:rPr>
+        <w:t xml:space="preserve"> Registro de cobros diarios y emisión de comprobantes básicos.</w:t>
+      </w:r>
+    </w:p>
+    <w:p>
+      <w:pPr>
+        <w:ind w:left="708"/>
+        <w:rPr>
+          <w:rFonts w:ascii="Arial" w:hAnsi="Arial" w:cs="Arial"/>
+          <w:lang w:val="es-ES"/>
+        </w:rPr>
+      </w:pPr>
+      <w:r>
+        <w:rPr>
+          <w:rFonts w:ascii="Arial" w:hAnsi="Arial" w:cs="Arial"/>
+          <w:b/>
+          <w:bCs/>
+          <w:lang w:val="es-ES"/>
+        </w:rPr>
+        <w:t>RF-4.1:</w:t>
+      </w:r>
+      <w:r>
+        <w:rPr>
+          <w:rFonts w:ascii="Arial" w:hAnsi="Arial" w:cs="Arial"/>
+          <w:lang w:val="es-ES"/>
+        </w:rPr>
+        <w:t xml:space="preserve"> Generación del informe consolidado mensual para la Dirección de Ingresos (Compromiso legal del proyecto).</w:t>
+      </w:r>
+    </w:p>
+    <w:p>
+      <w:pPr>
+        <w:ind w:left="708"/>
+        <w:rPr>
+          <w:rFonts w:ascii="Arial" w:hAnsi="Arial" w:cs="Arial"/>
+          <w:lang w:val="es-ES"/>
+        </w:rPr>
+      </w:pPr>
+      <w:r>
+        <w:rPr>
+          <w:rFonts w:ascii="Arial" w:hAnsi="Arial" w:cs="Arial"/>
+          <w:b/>
+          <w:bCs/>
+          <w:lang w:val="es-ES"/>
+        </w:rPr>
+        <w:t>RNF-1:</w:t>
+      </w:r>
+      <w:r>
+        <w:rPr>
+          <w:rFonts w:ascii="Arial" w:hAnsi="Arial" w:cs="Arial"/>
+          <w:lang w:val="es-ES"/>
+        </w:rPr>
+        <w:t xml:space="preserve"> Seguridad por roles para evitar fraudes en la recaudación.</w:t>
+      </w:r>
+    </w:p>
+    <w:p>
+      <w:pPr>
+        <w:ind w:left="708"/>
+        <w:rPr>
+          <w:rFonts w:ascii="Arial" w:hAnsi="Arial" w:cs="Arial"/>
+          <w:lang w:val="es-ES"/>
+        </w:rPr>
+      </w:pPr>
+    </w:p>
+    <w:p>
+      <w:pPr>
+        <w:ind w:left="708"/>
+        <w:rPr>
+          <w:rFonts w:ascii="Arial" w:hAnsi="Arial" w:cs="Arial"/>
+          <w:b/>
+          <w:bCs/>
+          <w:lang w:val="es-ES"/>
+        </w:rPr>
+      </w:pPr>
+      <w:proofErr w:type="spellStart"/>
+      <w:r>
+        <w:rPr>
+          <w:rFonts w:ascii="Arial" w:hAnsi="Arial" w:cs="Arial"/>
+          <w:b/>
+          <w:bCs/>
+          <w:lang w:val="es-ES"/>
+        </w:rPr>
+        <w:t>Should</w:t>
+      </w:r>
+      <w:proofErr w:type="spellEnd"/>
+      <w:r>
+        <w:rPr>
+          <w:rFonts w:ascii="Arial" w:hAnsi="Arial" w:cs="Arial"/>
+          <w:b/>
+          <w:bCs/>
+          <w:lang w:val="es-ES"/>
+        </w:rPr>
+        <w:t xml:space="preserve"> </w:t>
+      </w:r>
+      <w:proofErr w:type="spellStart"/>
+      <w:r>
+        <w:rPr>
+          <w:rFonts w:ascii="Arial" w:hAnsi="Arial" w:cs="Arial"/>
+          <w:b/>
+          <w:bCs/>
+          <w:lang w:val="es-ES"/>
+        </w:rPr>
+        <w:t>Have</w:t>
+      </w:r>
+      <w:proofErr w:type="spellEnd"/>
+      <w:r>
+        <w:rPr>
+          <w:rFonts w:ascii="Arial" w:hAnsi="Arial" w:cs="Arial"/>
+          <w:b/>
+          <w:bCs/>
+          <w:lang w:val="es-ES"/>
+        </w:rPr>
+        <w:t xml:space="preserve"> (Debería incluirse si hay recursos)</w:t>
+      </w:r>
+    </w:p>
+    <w:p>
+      <w:pPr>
+        <w:ind w:left="708"/>
+        <w:rPr>
+          <w:rFonts w:ascii="Arial" w:hAnsi="Arial" w:cs="Arial"/>
+          <w:lang w:val="es-ES"/>
+        </w:rPr>
+      </w:pPr>
+      <w:r>
+        <w:rPr>
+          <w:rFonts w:ascii="Arial" w:hAnsi="Arial" w:cs="Arial"/>
+          <w:b/>
+          <w:bCs/>
+          <w:lang w:val="es-ES"/>
+        </w:rPr>
+        <w:t>RF-3.1 y RF-3.2:</w:t>
+      </w:r>
+      <w:r>
+        <w:rPr>
+          <w:rFonts w:ascii="Arial" w:hAnsi="Arial" w:cs="Arial"/>
+          <w:lang w:val="es-ES"/>
+        </w:rPr>
+        <w:t xml:space="preserve"> Control de licencias sanitarias y alertas de vencimiento. </w:t>
+      </w:r>
+      <w:r>
+        <w:rPr>
+          <w:rFonts w:ascii="Arial" w:hAnsi="Arial" w:cs="Arial"/>
+          <w:i/>
+          <w:iCs/>
+          <w:lang w:val="es-ES"/>
+        </w:rPr>
+        <w:t>Nota: Crítico para la alcaldía, pero si el tiempo aprieta, puede iniciarse con registros manuales temporales.</w:t>
+      </w:r>
+    </w:p>
+    <w:p>
+      <w:pPr>
+        <w:ind w:left="708"/>
+        <w:rPr>
+          <w:rFonts w:ascii="Arial" w:hAnsi="Arial" w:cs="Arial"/>
+          <w:lang w:val="es-ES"/>
+        </w:rPr>
+      </w:pPr>
+      <w:r>
+        <w:rPr>
+          <w:rFonts w:ascii="Arial" w:hAnsi="Arial" w:cs="Arial"/>
+          <w:b/>
+          <w:bCs/>
+          <w:lang w:val="es-ES"/>
+        </w:rPr>
+        <w:t>RF-2.3:</w:t>
+      </w:r>
+      <w:r>
+        <w:rPr>
+          <w:rFonts w:ascii="Arial" w:hAnsi="Arial" w:cs="Arial"/>
+          <w:lang w:val="es-ES"/>
+        </w:rPr>
+        <w:t xml:space="preserve"> Alerta visual de puestos morosos en el panel.</w:t>
+      </w:r>
+    </w:p>
+    <w:p>
+      <w:pPr>
+        <w:ind w:left="708"/>
+        <w:rPr>
+          <w:rFonts w:ascii="Arial" w:hAnsi="Arial" w:cs="Arial"/>
+          <w:lang w:val="es-ES"/>
+        </w:rPr>
+      </w:pPr>
+    </w:p>
+    <w:p>
+      <w:pPr>
+        <w:ind w:left="708"/>
+        <w:rPr>
+          <w:rFonts w:ascii="Arial" w:hAnsi="Arial" w:cs="Arial"/>
+          <w:b/>
+          <w:bCs/>
+          <w:lang w:val="es-ES"/>
+        </w:rPr>
+      </w:pPr>
+      <w:proofErr w:type="spellStart"/>
+      <w:r>
+        <w:rPr>
+          <w:rFonts w:ascii="Arial" w:hAnsi="Arial" w:cs="Arial"/>
+          <w:b/>
+          <w:bCs/>
+          <w:lang w:val="es-ES"/>
+        </w:rPr>
+        <w:t>Could</w:t>
+      </w:r>
+      <w:proofErr w:type="spellEnd"/>
+      <w:r>
+        <w:rPr>
+          <w:rFonts w:ascii="Arial" w:hAnsi="Arial" w:cs="Arial"/>
+          <w:b/>
+          <w:bCs/>
+          <w:lang w:val="es-ES"/>
+        </w:rPr>
+        <w:t xml:space="preserve"> </w:t>
+      </w:r>
+      <w:proofErr w:type="spellStart"/>
+      <w:r>
+        <w:rPr>
+          <w:rFonts w:ascii="Arial" w:hAnsi="Arial" w:cs="Arial"/>
+          <w:b/>
+          <w:bCs/>
+          <w:lang w:val="es-ES"/>
+        </w:rPr>
+        <w:t>Have</w:t>
+      </w:r>
+      <w:proofErr w:type="spellEnd"/>
+      <w:r>
+        <w:rPr>
+          <w:rFonts w:ascii="Arial" w:hAnsi="Arial" w:cs="Arial"/>
+          <w:b/>
+          <w:bCs/>
+          <w:lang w:val="es-ES"/>
+        </w:rPr>
+        <w:t xml:space="preserve"> (Podría incluirse si sobra tiempo)</w:t>
+      </w:r>
+    </w:p>
+    <w:p>
+      <w:pPr>
+        <w:ind w:left="708"/>
+        <w:rPr>
+          <w:rFonts w:ascii="Arial" w:hAnsi="Arial" w:cs="Arial"/>
+          <w:lang w:val="es-ES"/>
+        </w:rPr>
+      </w:pPr>
+      <w:r>
+        <w:rPr>
+          <w:rFonts w:ascii="Arial" w:hAnsi="Arial" w:cs="Arial"/>
+          <w:b/>
+          <w:bCs/>
+          <w:lang w:val="es-ES"/>
+        </w:rPr>
+        <w:t>RF-4.2:</w:t>
+      </w:r>
+      <w:r>
+        <w:rPr>
+          <w:rFonts w:ascii="Arial" w:hAnsi="Arial" w:cs="Arial"/>
+          <w:lang w:val="es-ES"/>
+        </w:rPr>
+        <w:t xml:space="preserve"> Exportación avanzada a formatos Excel (Se prioriza PDF como salida oficial).</w:t>
+      </w:r>
+    </w:p>
+    <w:p>
+      <w:pPr>
+        <w:ind w:left="708"/>
+        <w:rPr>
+          <w:rFonts w:ascii="Arial" w:hAnsi="Arial" w:cs="Arial"/>
+          <w:lang w:val="es-ES"/>
+        </w:rPr>
+      </w:pPr>
+      <w:r>
+        <w:rPr>
+          <w:rFonts w:ascii="Arial" w:hAnsi="Arial" w:cs="Arial"/>
+          <w:b/>
+          <w:bCs/>
+          <w:lang w:val="es-ES"/>
+        </w:rPr>
+        <w:t>F-Extra:</w:t>
+      </w:r>
+      <w:r>
+        <w:rPr>
+          <w:rFonts w:ascii="Arial" w:hAnsi="Arial" w:cs="Arial"/>
+          <w:lang w:val="es-ES"/>
+        </w:rPr>
+        <w:t xml:space="preserve"> Envío de recordatorios de pago de patentes vía SMS a los comerciantes.</w:t>
+      </w:r>
+    </w:p>
+    <w:p>
+      <w:pPr>
+        <w:ind w:left="708"/>
+        <w:rPr>
+          <w:rFonts w:ascii="Arial" w:hAnsi="Arial" w:cs="Arial"/>
+          <w:lang w:val="es-ES"/>
+        </w:rPr>
+      </w:pPr>
+    </w:p>
+    <w:p>
+      <w:pPr>
+        <w:ind w:left="708"/>
+        <w:rPr>
+          <w:rFonts w:ascii="Arial" w:hAnsi="Arial" w:cs="Arial"/>
+          <w:b/>
+          <w:bCs/>
+          <w:lang w:val="es-ES"/>
+        </w:rPr>
+      </w:pPr>
+      <w:proofErr w:type="spellStart"/>
+      <w:r>
+        <w:rPr>
+          <w:rFonts w:ascii="Arial" w:hAnsi="Arial" w:cs="Arial"/>
+          <w:b/>
+          <w:bCs/>
+          <w:lang w:val="es-ES"/>
+        </w:rPr>
+        <w:t>Won't</w:t>
+      </w:r>
+      <w:proofErr w:type="spellEnd"/>
+      <w:r>
+        <w:rPr>
+          <w:rFonts w:ascii="Arial" w:hAnsi="Arial" w:cs="Arial"/>
+          <w:b/>
+          <w:bCs/>
+          <w:lang w:val="es-ES"/>
+        </w:rPr>
+        <w:t xml:space="preserve"> </w:t>
+      </w:r>
+      <w:proofErr w:type="spellStart"/>
+      <w:r>
+        <w:rPr>
+          <w:rFonts w:ascii="Arial" w:hAnsi="Arial" w:cs="Arial"/>
+          <w:b/>
+          <w:bCs/>
+          <w:lang w:val="es-ES"/>
+        </w:rPr>
+        <w:t>Have</w:t>
+      </w:r>
+      <w:proofErr w:type="spellEnd"/>
+      <w:r>
+        <w:rPr>
+          <w:rFonts w:ascii="Arial" w:hAnsi="Arial" w:cs="Arial"/>
+          <w:b/>
+          <w:bCs/>
+          <w:lang w:val="es-ES"/>
+        </w:rPr>
+        <w:t xml:space="preserve"> (No se incluirá en esta fase - Fuera de Alcance)</w:t>
+      </w:r>
+    </w:p>
+    <w:p>
+      <w:pPr>
+        <w:ind w:left="708"/>
+        <w:rPr>
+          <w:rFonts w:ascii="Arial" w:hAnsi="Arial" w:cs="Arial"/>
+          <w:lang w:val="es-ES"/>
+        </w:rPr>
+      </w:pPr>
+      <w:r>
+        <w:rPr>
+          <w:rFonts w:ascii="Arial" w:hAnsi="Arial" w:cs="Arial"/>
+          <w:b/>
+          <w:bCs/>
+          <w:lang w:val="es-ES"/>
+        </w:rPr>
+        <w:lastRenderedPageBreak/>
+        <w:t>Módulo de Geolocalización Interactiva:</w:t>
+      </w:r>
+      <w:r>
+        <w:rPr>
+          <w:rFonts w:ascii="Arial" w:hAnsi="Arial" w:cs="Arial"/>
+          <w:lang w:val="es-ES"/>
+        </w:rPr>
+        <w:t xml:space="preserve"> Mapeo satelital o GPS de puestos (Solicitado en la semana 10; requiere un proceso formal de control de cambios antes de pasar a otra categoría).</w:t>
+      </w:r>
+    </w:p>
+    <w:p>
+      <w:pPr>
+        <w:ind w:left="708"/>
+        <w:rPr>
+          <w:rFonts w:ascii="Arial" w:hAnsi="Arial" w:cs="Arial"/>
+          <w:lang w:val="es-ES"/>
+        </w:rPr>
+      </w:pPr>
+      <w:r>
+        <w:rPr>
+          <w:rFonts w:ascii="Arial" w:hAnsi="Arial" w:cs="Arial"/>
+          <w:b/>
+          <w:bCs/>
+          <w:lang w:val="es-ES"/>
+        </w:rPr>
+        <w:t>Pasarela de pagos en línea:</w:t>
+      </w:r>
+      <w:r>
+        <w:rPr>
+          <w:rFonts w:ascii="Arial" w:hAnsi="Arial" w:cs="Arial"/>
+          <w:lang w:val="es-ES"/>
+        </w:rPr>
+        <w:t xml:space="preserve"> Integración con bancos mediante códigos QR automáticos.</w:t>
+      </w:r>
     </w:p>
     <w:p>
       <w:pPr>
@@ -5779,59 +6315,59 @@
         <w:rPr>
           <w:lang w:val="es-ES"/>
         </w:rPr>
+        <w:t>· Solicitud de Cambios</w:t>
+      </w:r>
+    </w:p>
+    <w:p>
+      <w:pPr>
+        <w:rPr>
+          <w:lang w:val="es-ES"/>
+        </w:rPr>
+      </w:pPr>
+      <w:r>
+        <w:rPr>
+          <w:lang w:val="es-ES"/>
+        </w:rPr>
+        <w:t>· Registro de Riesgos Actualizado</w:t>
+      </w:r>
+    </w:p>
+    <w:p>
+      <w:pPr>
+        <w:rPr>
+          <w:lang w:val="es-ES"/>
+        </w:rPr>
+      </w:pPr>
+      <w:r>
+        <w:rPr>
+          <w:lang w:val="es-ES"/>
+        </w:rPr>
+        <w:t>· Acta de Cierre</w:t>
+      </w:r>
+    </w:p>
+    <w:p>
+      <w:pPr>
+        <w:rPr>
+          <w:lang w:val="es-ES"/>
+        </w:rPr>
+      </w:pPr>
+      <w:r>
+        <w:rPr>
+          <w:lang w:val="es-ES"/>
+        </w:rPr>
+        <w:t>· Lecciones Aprendidas</w:t>
+      </w:r>
+    </w:p>
+    <w:p>
+      <w:pPr>
+        <w:rPr>
+          <w:lang w:val="es-ES"/>
+        </w:rPr>
+      </w:pPr>
+      <w:r>
+        <w:rPr>
+          <w:lang w:val="es-ES"/>
+        </w:rPr>
         <w:lastRenderedPageBreak/>
-        <w:t>· Solicitud de Cambios</w:t>
-      </w:r>
-    </w:p>
-    <w:p>
-      <w:pPr>
-        <w:rPr>
-          <w:lang w:val="es-ES"/>
-        </w:rPr>
-      </w:pPr>
-      <w:r>
-        <w:rPr>
-          <w:lang w:val="es-ES"/>
-        </w:rPr>
-        <w:t>· Registro de Riesgos Actualizado</w:t>
-      </w:r>
-    </w:p>
-    <w:p>
-      <w:pPr>
-        <w:rPr>
-          <w:lang w:val="es-ES"/>
-        </w:rPr>
-      </w:pPr>
-      <w:r>
-        <w:rPr>
-          <w:lang w:val="es-ES"/>
-        </w:rPr>
-        <w:t>· Acta de Cierre</w:t>
-      </w:r>
-    </w:p>
-    <w:p>
-      <w:pPr>
-        <w:rPr>
-          <w:lang w:val="es-ES"/>
-        </w:rPr>
-      </w:pPr>
-      <w:r>
-        <w:rPr>
-          <w:lang w:val="es-ES"/>
-        </w:rPr>
-        <w:t>· Lecciones Aprendidas</w:t>
-      </w:r>
-    </w:p>
-    <w:p>
-      <w:pPr>
-        <w:rPr>
-          <w:lang w:val="es-ES"/>
-        </w:rPr>
-      </w:pPr>
-      <w:r>
-        <w:rPr>
-          <w:lang w:val="es-ES"/>
-        </w:rPr>
         <w:t>· Informe de Validación del Producto</w:t>
       </w:r>
     </w:p>
@@ -6708,6 +7244,155 @@
     </w:lvl>
   </w:abstractNum>
   <w:abstractNum w:abstractNumId="5" w15:restartNumberingAfterBreak="0">
+    <w:nsid w:val="1FD73CE6"/>
+    <w:multiLevelType w:val="multilevel"/>
+    <w:tmpl w:val="22B86896"/>
+    <w:lvl w:ilvl="0">
+      <w:start w:val="1"/>
+      <w:numFmt w:val="bullet"/>
+      <w:lvlText w:val=""/>
+      <w:lvlJc w:val="left"/>
+      <w:pPr>
+        <w:tabs>
+          <w:tab w:val="num" w:pos="720"/>
+        </w:tabs>
+        <w:ind w:left="720" w:hanging="360"/>
+      </w:pPr>
+      <w:rPr>
+        <w:rFonts w:ascii="Symbol" w:hAnsi="Symbol" w:hint="default"/>
+        <w:sz w:val="20"/>
+      </w:rPr>
+    </w:lvl>
+    <w:lvl w:ilvl="1" w:tentative="1">
+      <w:start w:val="1"/>
+      <w:numFmt w:val="bullet"/>
+      <w:lvlText w:val="o"/>
+      <w:lvlJc w:val="left"/>
+      <w:pPr>
+        <w:tabs>
+          <w:tab w:val="num" w:pos="1440"/>
+        </w:tabs>
+        <w:ind w:left="1440" w:hanging="360"/>
+      </w:pPr>
+      <w:rPr>
+        <w:rFonts w:ascii="Courier New" w:hAnsi="Courier New" w:hint="default"/>
+        <w:sz w:val="20"/>
+      </w:rPr>
+    </w:lvl>
+    <w:lvl w:ilvl="2" w:tentative="1">
+      <w:start w:val="1"/>
+      <w:numFmt w:val="bullet"/>
+      <w:lvlText w:val=""/>
+      <w:lvlJc w:val="left"/>
+      <w:pPr>
+        <w:tabs>
+          <w:tab w:val="num" w:pos="2160"/>
+        </w:tabs>
+        <w:ind w:left="2160" w:hanging="360"/>
+      </w:pPr>
+      <w:rPr>
+        <w:rFonts w:ascii="Wingdings" w:hAnsi="Wingdings" w:hint="default"/>
+        <w:sz w:val="20"/>
+      </w:rPr>
+    </w:lvl>
+    <w:lvl w:ilvl="3" w:tentative="1">
+      <w:start w:val="1"/>
+      <w:numFmt w:val="bullet"/>
+      <w:lvlText w:val=""/>
+      <w:lvlJc w:val="left"/>
+      <w:pPr>
+        <w:tabs>
+          <w:tab w:val="num" w:pos="2880"/>
+        </w:tabs>
+        <w:ind w:left="2880" w:hanging="360"/>
+      </w:pPr>
+      <w:rPr>
+        <w:rFonts w:ascii="Wingdings" w:hAnsi="Wingdings" w:hint="default"/>
+        <w:sz w:val="20"/>
+      </w:rPr>
+    </w:lvl>
+    <w:lvl w:ilvl="4" w:tentative="1">
+      <w:start w:val="1"/>
+      <w:numFmt w:val="bullet"/>
+      <w:lvlText w:val=""/>
+      <w:lvlJc w:val="left"/>
+      <w:pPr>
+        <w:tabs>
+          <w:tab w:val="num" w:pos="3600"/>
+        </w:tabs>
+        <w:ind w:left="3600" w:hanging="360"/>
+      </w:pPr>
+      <w:rPr>
+        <w:rFonts w:ascii="Wingdings" w:hAnsi="Wingdings" w:hint="default"/>
+        <w:sz w:val="20"/>
+      </w:rPr>
+    </w:lvl>
+    <w:lvl w:ilvl="5" w:tentative="1">
+      <w:start w:val="1"/>
+      <w:numFmt w:val="bullet"/>
+      <w:lvlText w:val=""/>
+      <w:lvlJc w:val="left"/>
+      <w:pPr>
+        <w:tabs>
+          <w:tab w:val="num" w:pos="4320"/>
+        </w:tabs>
+        <w:ind w:left="4320" w:hanging="360"/>
+      </w:pPr>
+      <w:rPr>
+        <w:rFonts w:ascii="Wingdings" w:hAnsi="Wingdings" w:hint="default"/>
+        <w:sz w:val="20"/>
+      </w:rPr>
+    </w:lvl>
+    <w:lvl w:ilvl="6" w:tentative="1">
+      <w:start w:val="1"/>
+      <w:numFmt w:val="bullet"/>
+      <w:lvlText w:val=""/>
+      <w:lvlJc w:val="left"/>
+      <w:pPr>
+        <w:tabs>
+          <w:tab w:val="num" w:pos="5040"/>
+        </w:tabs>
+        <w:ind w:left="5040" w:hanging="360"/>
+      </w:pPr>
+      <w:rPr>
+        <w:rFonts w:ascii="Wingdings" w:hAnsi="Wingdings" w:hint="default"/>
+        <w:sz w:val="20"/>
+      </w:rPr>
+    </w:lvl>
+    <w:lvl w:ilvl="7" w:tentative="1">
+      <w:start w:val="1"/>
+      <w:numFmt w:val="bullet"/>
+      <w:lvlText w:val=""/>
+      <w:lvlJc w:val="left"/>
+      <w:pPr>
+        <w:tabs>
+          <w:tab w:val="num" w:pos="5760"/>
+        </w:tabs>
+        <w:ind w:left="5760" w:hanging="360"/>
+      </w:pPr>
+      <w:rPr>
+        <w:rFonts w:ascii="Wingdings" w:hAnsi="Wingdings" w:hint="default"/>
+        <w:sz w:val="20"/>
+      </w:rPr>
+    </w:lvl>
+    <w:lvl w:ilvl="8" w:tentative="1">
+      <w:start w:val="1"/>
+      <w:numFmt w:val="bullet"/>
+      <w:lvlText w:val=""/>
+      <w:lvlJc w:val="left"/>
+      <w:pPr>
+        <w:tabs>
+          <w:tab w:val="num" w:pos="6480"/>
+        </w:tabs>
+        <w:ind w:left="6480" w:hanging="360"/>
+      </w:pPr>
+      <w:rPr>
+        <w:rFonts w:ascii="Wingdings" w:hAnsi="Wingdings" w:hint="default"/>
+        <w:sz w:val="20"/>
+      </w:rPr>
+    </w:lvl>
+  </w:abstractNum>
+  <w:abstractNum w:abstractNumId="6" w15:restartNumberingAfterBreak="0">
     <w:nsid w:val="1FF706EB"/>
     <w:multiLevelType w:val="multilevel"/>
     <w:tmpl w:val="303A87D8"/>
@@ -6856,7 +7541,7 @@
       </w:rPr>
     </w:lvl>
   </w:abstractNum>
-  <w:abstractNum w:abstractNumId="6" w15:restartNumberingAfterBreak="0">
+  <w:abstractNum w:abstractNumId="7" w15:restartNumberingAfterBreak="0">
     <w:nsid w:val="222F26EB"/>
     <w:multiLevelType w:val="hybridMultilevel"/>
     <w:tmpl w:val="8826B1A8"/>
@@ -6969,7 +7654,7 @@
       </w:rPr>
     </w:lvl>
   </w:abstractNum>
-  <w:abstractNum w:abstractNumId="7" w15:restartNumberingAfterBreak="0">
+  <w:abstractNum w:abstractNumId="8" w15:restartNumberingAfterBreak="0">
     <w:nsid w:val="29415097"/>
     <w:multiLevelType w:val="multilevel"/>
     <w:tmpl w:val="D670006E"/>
@@ -7118,7 +7803,7 @@
       </w:rPr>
     </w:lvl>
   </w:abstractNum>
-  <w:abstractNum w:abstractNumId="8" w15:restartNumberingAfterBreak="0">
+  <w:abstractNum w:abstractNumId="9" w15:restartNumberingAfterBreak="0">
     <w:nsid w:val="351225BE"/>
     <w:multiLevelType w:val="multilevel"/>
     <w:tmpl w:val="420C3678"/>
@@ -7231,7 +7916,7 @@
       </w:pPr>
     </w:lvl>
   </w:abstractNum>
-  <w:abstractNum w:abstractNumId="9" w15:restartNumberingAfterBreak="0">
+  <w:abstractNum w:abstractNumId="10" w15:restartNumberingAfterBreak="0">
     <w:nsid w:val="38821839"/>
     <w:multiLevelType w:val="multilevel"/>
     <w:tmpl w:val="0382157A"/>
@@ -7380,7 +8065,7 @@
       </w:rPr>
     </w:lvl>
   </w:abstractNum>
-  <w:abstractNum w:abstractNumId="10" w15:restartNumberingAfterBreak="0">
+  <w:abstractNum w:abstractNumId="11" w15:restartNumberingAfterBreak="0">
     <w:nsid w:val="3C9973EF"/>
     <w:multiLevelType w:val="multilevel"/>
     <w:tmpl w:val="C804C468"/>
@@ -7529,7 +8214,7 @@
       </w:rPr>
     </w:lvl>
   </w:abstractNum>
-  <w:abstractNum w:abstractNumId="11" w15:restartNumberingAfterBreak="0">
+  <w:abstractNum w:abstractNumId="12" w15:restartNumberingAfterBreak="0">
     <w:nsid w:val="415521CD"/>
     <w:multiLevelType w:val="multilevel"/>
     <w:tmpl w:val="E0AA99D4"/>
@@ -7678,7 +8363,7 @@
       </w:rPr>
     </w:lvl>
   </w:abstractNum>
-  <w:abstractNum w:abstractNumId="12" w15:restartNumberingAfterBreak="0">
+  <w:abstractNum w:abstractNumId="13" w15:restartNumberingAfterBreak="0">
     <w:nsid w:val="41DA779B"/>
     <w:multiLevelType w:val="multilevel"/>
     <w:tmpl w:val="8FFAF41A"/>
@@ -7791,7 +8476,7 @@
       </w:pPr>
     </w:lvl>
   </w:abstractNum>
-  <w:abstractNum w:abstractNumId="13" w15:restartNumberingAfterBreak="0">
+  <w:abstractNum w:abstractNumId="14" w15:restartNumberingAfterBreak="0">
     <w:nsid w:val="444D03FA"/>
     <w:multiLevelType w:val="hybridMultilevel"/>
     <w:tmpl w:val="80EC6116"/>
@@ -7904,7 +8589,7 @@
       </w:rPr>
     </w:lvl>
   </w:abstractNum>
-  <w:abstractNum w:abstractNumId="14" w15:restartNumberingAfterBreak="0">
+  <w:abstractNum w:abstractNumId="15" w15:restartNumberingAfterBreak="0">
     <w:nsid w:val="45632781"/>
     <w:multiLevelType w:val="hybridMultilevel"/>
     <w:tmpl w:val="7C28A2BA"/>
@@ -8017,7 +8702,7 @@
       </w:rPr>
     </w:lvl>
   </w:abstractNum>
-  <w:abstractNum w:abstractNumId="15" w15:restartNumberingAfterBreak="0">
+  <w:abstractNum w:abstractNumId="16" w15:restartNumberingAfterBreak="0">
     <w:nsid w:val="50DF3A72"/>
     <w:multiLevelType w:val="multilevel"/>
     <w:tmpl w:val="66C2A37E"/>
@@ -8104,7 +8789,7 @@
       </w:pPr>
     </w:lvl>
   </w:abstractNum>
-  <w:abstractNum w:abstractNumId="16" w15:restartNumberingAfterBreak="0">
+  <w:abstractNum w:abstractNumId="17" w15:restartNumberingAfterBreak="0">
     <w:nsid w:val="53790B1E"/>
     <w:multiLevelType w:val="hybridMultilevel"/>
     <w:tmpl w:val="7A06AD96"/>
@@ -8217,7 +8902,7 @@
       </w:rPr>
     </w:lvl>
   </w:abstractNum>
-  <w:abstractNum w:abstractNumId="17" w15:restartNumberingAfterBreak="0">
+  <w:abstractNum w:abstractNumId="18" w15:restartNumberingAfterBreak="0">
     <w:nsid w:val="563F08B6"/>
     <w:multiLevelType w:val="hybridMultilevel"/>
     <w:tmpl w:val="CD70BDDE"/>
@@ -8330,7 +9015,7 @@
       </w:rPr>
     </w:lvl>
   </w:abstractNum>
-  <w:abstractNum w:abstractNumId="18" w15:restartNumberingAfterBreak="0">
+  <w:abstractNum w:abstractNumId="19" w15:restartNumberingAfterBreak="0">
     <w:nsid w:val="59640F76"/>
     <w:multiLevelType w:val="multilevel"/>
     <w:tmpl w:val="915056BE"/>
@@ -8479,7 +9164,305 @@
       </w:rPr>
     </w:lvl>
   </w:abstractNum>
-  <w:abstractNum w:abstractNumId="19" w15:restartNumberingAfterBreak="0">
+  <w:abstractNum w:abstractNumId="20" w15:restartNumberingAfterBreak="0">
+    <w:nsid w:val="5B854F71"/>
+    <w:multiLevelType w:val="multilevel"/>
+    <w:tmpl w:val="AA7CEAA4"/>
+    <w:lvl w:ilvl="0">
+      <w:start w:val="1"/>
+      <w:numFmt w:val="bullet"/>
+      <w:lvlText w:val=""/>
+      <w:lvlJc w:val="left"/>
+      <w:pPr>
+        <w:tabs>
+          <w:tab w:val="num" w:pos="720"/>
+        </w:tabs>
+        <w:ind w:left="720" w:hanging="360"/>
+      </w:pPr>
+      <w:rPr>
+        <w:rFonts w:ascii="Symbol" w:hAnsi="Symbol" w:hint="default"/>
+        <w:sz w:val="20"/>
+      </w:rPr>
+    </w:lvl>
+    <w:lvl w:ilvl="1" w:tentative="1">
+      <w:start w:val="1"/>
+      <w:numFmt w:val="bullet"/>
+      <w:lvlText w:val="o"/>
+      <w:lvlJc w:val="left"/>
+      <w:pPr>
+        <w:tabs>
+          <w:tab w:val="num" w:pos="1440"/>
+        </w:tabs>
+        <w:ind w:left="1440" w:hanging="360"/>
+      </w:pPr>
+      <w:rPr>
+        <w:rFonts w:ascii="Courier New" w:hAnsi="Courier New" w:hint="default"/>
+        <w:sz w:val="20"/>
+      </w:rPr>
+    </w:lvl>
+    <w:lvl w:ilvl="2" w:tentative="1">
+      <w:start w:val="1"/>
+      <w:numFmt w:val="bullet"/>
+      <w:lvlText w:val=""/>
+      <w:lvlJc w:val="left"/>
+      <w:pPr>
+        <w:tabs>
+          <w:tab w:val="num" w:pos="2160"/>
+        </w:tabs>
+        <w:ind w:left="2160" w:hanging="360"/>
+      </w:pPr>
+      <w:rPr>
+        <w:rFonts w:ascii="Wingdings" w:hAnsi="Wingdings" w:hint="default"/>
+        <w:sz w:val="20"/>
+      </w:rPr>
+    </w:lvl>
+    <w:lvl w:ilvl="3" w:tentative="1">
+      <w:start w:val="1"/>
+      <w:numFmt w:val="bullet"/>
+      <w:lvlText w:val=""/>
+      <w:lvlJc w:val="left"/>
+      <w:pPr>
+        <w:tabs>
+          <w:tab w:val="num" w:pos="2880"/>
+        </w:tabs>
+        <w:ind w:left="2880" w:hanging="360"/>
+      </w:pPr>
+      <w:rPr>
+        <w:rFonts w:ascii="Wingdings" w:hAnsi="Wingdings" w:hint="default"/>
+        <w:sz w:val="20"/>
+      </w:rPr>
+    </w:lvl>
+    <w:lvl w:ilvl="4" w:tentative="1">
+      <w:start w:val="1"/>
+      <w:numFmt w:val="bullet"/>
+      <w:lvlText w:val=""/>
+      <w:lvlJc w:val="left"/>
+      <w:pPr>
+        <w:tabs>
+          <w:tab w:val="num" w:pos="3600"/>
+        </w:tabs>
+        <w:ind w:left="3600" w:hanging="360"/>
+      </w:pPr>
+      <w:rPr>
+        <w:rFonts w:ascii="Wingdings" w:hAnsi="Wingdings" w:hint="default"/>
+        <w:sz w:val="20"/>
+      </w:rPr>
+    </w:lvl>
+    <w:lvl w:ilvl="5" w:tentative="1">
+      <w:start w:val="1"/>
+      <w:numFmt w:val="bullet"/>
+      <w:lvlText w:val=""/>
+      <w:lvlJc w:val="left"/>
+      <w:pPr>
+        <w:tabs>
+          <w:tab w:val="num" w:pos="4320"/>
+        </w:tabs>
+        <w:ind w:left="4320" w:hanging="360"/>
+      </w:pPr>
+      <w:rPr>
+        <w:rFonts w:ascii="Wingdings" w:hAnsi="Wingdings" w:hint="default"/>
+        <w:sz w:val="20"/>
+      </w:rPr>
+    </w:lvl>
+    <w:lvl w:ilvl="6" w:tentative="1">
+      <w:start w:val="1"/>
+      <w:numFmt w:val="bullet"/>
+      <w:lvlText w:val=""/>
+      <w:lvlJc w:val="left"/>
+      <w:pPr>
+        <w:tabs>
+          <w:tab w:val="num" w:pos="5040"/>
+        </w:tabs>
+        <w:ind w:left="5040" w:hanging="360"/>
+      </w:pPr>
+      <w:rPr>
+        <w:rFonts w:ascii="Wingdings" w:hAnsi="Wingdings" w:hint="default"/>
+        <w:sz w:val="20"/>
+      </w:rPr>
+    </w:lvl>
+    <w:lvl w:ilvl="7" w:tentative="1">
+      <w:start w:val="1"/>
+      <w:numFmt w:val="bullet"/>
+      <w:lvlText w:val=""/>
+      <w:lvlJc w:val="left"/>
+      <w:pPr>
+        <w:tabs>
+          <w:tab w:val="num" w:pos="5760"/>
+        </w:tabs>
+        <w:ind w:left="5760" w:hanging="360"/>
+      </w:pPr>
+      <w:rPr>
+        <w:rFonts w:ascii="Wingdings" w:hAnsi="Wingdings" w:hint="default"/>
+        <w:sz w:val="20"/>
+      </w:rPr>
+    </w:lvl>
+    <w:lvl w:ilvl="8" w:tentative="1">
+      <w:start w:val="1"/>
+      <w:numFmt w:val="bullet"/>
+      <w:lvlText w:val=""/>
+      <w:lvlJc w:val="left"/>
+      <w:pPr>
+        <w:tabs>
+          <w:tab w:val="num" w:pos="6480"/>
+        </w:tabs>
+        <w:ind w:left="6480" w:hanging="360"/>
+      </w:pPr>
+      <w:rPr>
+        <w:rFonts w:ascii="Wingdings" w:hAnsi="Wingdings" w:hint="default"/>
+        <w:sz w:val="20"/>
+      </w:rPr>
+    </w:lvl>
+  </w:abstractNum>
+  <w:abstractNum w:abstractNumId="21" w15:restartNumberingAfterBreak="0">
+    <w:nsid w:val="5CBF46A5"/>
+    <w:multiLevelType w:val="multilevel"/>
+    <w:tmpl w:val="BACA6AF6"/>
+    <w:lvl w:ilvl="0">
+      <w:start w:val="1"/>
+      <w:numFmt w:val="bullet"/>
+      <w:lvlText w:val=""/>
+      <w:lvlJc w:val="left"/>
+      <w:pPr>
+        <w:tabs>
+          <w:tab w:val="num" w:pos="720"/>
+        </w:tabs>
+        <w:ind w:left="720" w:hanging="360"/>
+      </w:pPr>
+      <w:rPr>
+        <w:rFonts w:ascii="Symbol" w:hAnsi="Symbol" w:hint="default"/>
+        <w:sz w:val="20"/>
+      </w:rPr>
+    </w:lvl>
+    <w:lvl w:ilvl="1" w:tentative="1">
+      <w:start w:val="1"/>
+      <w:numFmt w:val="bullet"/>
+      <w:lvlText w:val="o"/>
+      <w:lvlJc w:val="left"/>
+      <w:pPr>
+        <w:tabs>
+          <w:tab w:val="num" w:pos="1440"/>
+        </w:tabs>
+        <w:ind w:left="1440" w:hanging="360"/>
+      </w:pPr>
+      <w:rPr>
+        <w:rFonts w:ascii="Courier New" w:hAnsi="Courier New" w:hint="default"/>
+        <w:sz w:val="20"/>
+      </w:rPr>
+    </w:lvl>
+    <w:lvl w:ilvl="2" w:tentative="1">
+      <w:start w:val="1"/>
+      <w:numFmt w:val="bullet"/>
+      <w:lvlText w:val=""/>
+      <w:lvlJc w:val="left"/>
+      <w:pPr>
+        <w:tabs>
+          <w:tab w:val="num" w:pos="2160"/>
+        </w:tabs>
+        <w:ind w:left="2160" w:hanging="360"/>
+      </w:pPr>
+      <w:rPr>
+        <w:rFonts w:ascii="Wingdings" w:hAnsi="Wingdings" w:hint="default"/>
+        <w:sz w:val="20"/>
+      </w:rPr>
+    </w:lvl>
+    <w:lvl w:ilvl="3" w:tentative="1">
+      <w:start w:val="1"/>
+      <w:numFmt w:val="bullet"/>
+      <w:lvlText w:val=""/>
+      <w:lvlJc w:val="left"/>
+      <w:pPr>
+        <w:tabs>
+          <w:tab w:val="num" w:pos="2880"/>
+        </w:tabs>
+        <w:ind w:left="2880" w:hanging="360"/>
+      </w:pPr>
+      <w:rPr>
+        <w:rFonts w:ascii="Wingdings" w:hAnsi="Wingdings" w:hint="default"/>
+        <w:sz w:val="20"/>
+      </w:rPr>
+    </w:lvl>
+    <w:lvl w:ilvl="4" w:tentative="1">
+      <w:start w:val="1"/>
+      <w:numFmt w:val="bullet"/>
+      <w:lvlText w:val=""/>
+      <w:lvlJc w:val="left"/>
+      <w:pPr>
+        <w:tabs>
+          <w:tab w:val="num" w:pos="3600"/>
+        </w:tabs>
+        <w:ind w:left="3600" w:hanging="360"/>
+      </w:pPr>
+      <w:rPr>
+        <w:rFonts w:ascii="Wingdings" w:hAnsi="Wingdings" w:hint="default"/>
+        <w:sz w:val="20"/>
+      </w:rPr>
+    </w:lvl>
+    <w:lvl w:ilvl="5" w:tentative="1">
+      <w:start w:val="1"/>
+      <w:numFmt w:val="bullet"/>
+      <w:lvlText w:val=""/>
+      <w:lvlJc w:val="left"/>
+      <w:pPr>
+        <w:tabs>
+          <w:tab w:val="num" w:pos="4320"/>
+        </w:tabs>
+        <w:ind w:left="4320" w:hanging="360"/>
+      </w:pPr>
+      <w:rPr>
+        <w:rFonts w:ascii="Wingdings" w:hAnsi="Wingdings" w:hint="default"/>
+        <w:sz w:val="20"/>
+      </w:rPr>
+    </w:lvl>
+    <w:lvl w:ilvl="6" w:tentative="1">
+      <w:start w:val="1"/>
+      <w:numFmt w:val="bullet"/>
+      <w:lvlText w:val=""/>
+      <w:lvlJc w:val="left"/>
+      <w:pPr>
+        <w:tabs>
+          <w:tab w:val="num" w:pos="5040"/>
+        </w:tabs>
+        <w:ind w:left="5040" w:hanging="360"/>
+      </w:pPr>
+      <w:rPr>
+        <w:rFonts w:ascii="Wingdings" w:hAnsi="Wingdings" w:hint="default"/>
+        <w:sz w:val="20"/>
+      </w:rPr>
+    </w:lvl>
+    <w:lvl w:ilvl="7" w:tentative="1">
+      <w:start w:val="1"/>
+      <w:numFmt w:val="bullet"/>
+      <w:lvlText w:val=""/>
+      <w:lvlJc w:val="left"/>
+      <w:pPr>
+        <w:tabs>
+          <w:tab w:val="num" w:pos="5760"/>
+        </w:tabs>
+        <w:ind w:left="5760" w:hanging="360"/>
+      </w:pPr>
+      <w:rPr>
+        <w:rFonts w:ascii="Wingdings" w:hAnsi="Wingdings" w:hint="default"/>
+        <w:sz w:val="20"/>
+      </w:rPr>
+    </w:lvl>
+    <w:lvl w:ilvl="8" w:tentative="1">
+      <w:start w:val="1"/>
+      <w:numFmt w:val="bullet"/>
+      <w:lvlText w:val=""/>
+      <w:lvlJc w:val="left"/>
+      <w:pPr>
+        <w:tabs>
+          <w:tab w:val="num" w:pos="6480"/>
+        </w:tabs>
+        <w:ind w:left="6480" w:hanging="360"/>
+      </w:pPr>
+      <w:rPr>
+        <w:rFonts w:ascii="Wingdings" w:hAnsi="Wingdings" w:hint="default"/>
+        <w:sz w:val="20"/>
+      </w:rPr>
+    </w:lvl>
+  </w:abstractNum>
+  <w:abstractNum w:abstractNumId="22" w15:restartNumberingAfterBreak="0">
     <w:nsid w:val="616072A1"/>
     <w:multiLevelType w:val="multilevel"/>
     <w:tmpl w:val="B15495DA"/>
@@ -8628,7 +9611,7 @@
       </w:rPr>
     </w:lvl>
   </w:abstractNum>
-  <w:abstractNum w:abstractNumId="20" w15:restartNumberingAfterBreak="0">
+  <w:abstractNum w:abstractNumId="23" w15:restartNumberingAfterBreak="0">
     <w:nsid w:val="670A3EDD"/>
     <w:multiLevelType w:val="multilevel"/>
     <w:tmpl w:val="D9F886DE"/>
@@ -8777,7 +9760,7 @@
       </w:rPr>
     </w:lvl>
   </w:abstractNum>
-  <w:abstractNum w:abstractNumId="21" w15:restartNumberingAfterBreak="0">
+  <w:abstractNum w:abstractNumId="24" w15:restartNumberingAfterBreak="0">
     <w:nsid w:val="685E294E"/>
     <w:multiLevelType w:val="multilevel"/>
     <w:tmpl w:val="A7947952"/>
@@ -8926,7 +9909,7 @@
       </w:rPr>
     </w:lvl>
   </w:abstractNum>
-  <w:abstractNum w:abstractNumId="22" w15:restartNumberingAfterBreak="0">
+  <w:abstractNum w:abstractNumId="25" w15:restartNumberingAfterBreak="0">
     <w:nsid w:val="6B7242DF"/>
     <w:multiLevelType w:val="multilevel"/>
     <w:tmpl w:val="35FEE1B6"/>
@@ -9075,7 +10058,7 @@
       </w:rPr>
     </w:lvl>
   </w:abstractNum>
-  <w:abstractNum w:abstractNumId="23" w15:restartNumberingAfterBreak="0">
+  <w:abstractNum w:abstractNumId="26" w15:restartNumberingAfterBreak="0">
     <w:nsid w:val="6CF655A5"/>
     <w:multiLevelType w:val="multilevel"/>
     <w:tmpl w:val="AA120C74"/>
@@ -9188,7 +10171,7 @@
       </w:pPr>
     </w:lvl>
   </w:abstractNum>
-  <w:abstractNum w:abstractNumId="24" w15:restartNumberingAfterBreak="0">
+  <w:abstractNum w:abstractNumId="27" w15:restartNumberingAfterBreak="0">
     <w:nsid w:val="6D6048EB"/>
     <w:multiLevelType w:val="hybridMultilevel"/>
     <w:tmpl w:val="496637C8"/>
@@ -9301,7 +10284,7 @@
       </w:rPr>
     </w:lvl>
   </w:abstractNum>
-  <w:abstractNum w:abstractNumId="25" w15:restartNumberingAfterBreak="0">
+  <w:abstractNum w:abstractNumId="28" w15:restartNumberingAfterBreak="0">
     <w:nsid w:val="6D9E2373"/>
     <w:multiLevelType w:val="multilevel"/>
     <w:tmpl w:val="7798721C"/>
@@ -9450,7 +10433,7 @@
       </w:rPr>
     </w:lvl>
   </w:abstractNum>
-  <w:abstractNum w:abstractNumId="26" w15:restartNumberingAfterBreak="0">
+  <w:abstractNum w:abstractNumId="29" w15:restartNumberingAfterBreak="0">
     <w:nsid w:val="76492344"/>
     <w:multiLevelType w:val="multilevel"/>
     <w:tmpl w:val="5526F338"/>
@@ -9599,7 +10582,156 @@
       </w:rPr>
     </w:lvl>
   </w:abstractNum>
-  <w:abstractNum w:abstractNumId="27" w15:restartNumberingAfterBreak="0">
+  <w:abstractNum w:abstractNumId="30" w15:restartNumberingAfterBreak="0">
+    <w:nsid w:val="7AF96EBD"/>
+    <w:multiLevelType w:val="multilevel"/>
+    <w:tmpl w:val="40C4EB88"/>
+    <w:lvl w:ilvl="0">
+      <w:start w:val="1"/>
+      <w:numFmt w:val="bullet"/>
+      <w:lvlText w:val=""/>
+      <w:lvlJc w:val="left"/>
+      <w:pPr>
+        <w:tabs>
+          <w:tab w:val="num" w:pos="720"/>
+        </w:tabs>
+        <w:ind w:left="720" w:hanging="360"/>
+      </w:pPr>
+      <w:rPr>
+        <w:rFonts w:ascii="Symbol" w:hAnsi="Symbol" w:hint="default"/>
+        <w:sz w:val="20"/>
+      </w:rPr>
+    </w:lvl>
+    <w:lvl w:ilvl="1" w:tentative="1">
+      <w:start w:val="1"/>
+      <w:numFmt w:val="bullet"/>
+      <w:lvlText w:val="o"/>
+      <w:lvlJc w:val="left"/>
+      <w:pPr>
+        <w:tabs>
+          <w:tab w:val="num" w:pos="1440"/>
+        </w:tabs>
+        <w:ind w:left="1440" w:hanging="360"/>
+      </w:pPr>
+      <w:rPr>
+        <w:rFonts w:ascii="Courier New" w:hAnsi="Courier New" w:hint="default"/>
+        <w:sz w:val="20"/>
+      </w:rPr>
+    </w:lvl>
+    <w:lvl w:ilvl="2" w:tentative="1">
+      <w:start w:val="1"/>
+      <w:numFmt w:val="bullet"/>
+      <w:lvlText w:val=""/>
+      <w:lvlJc w:val="left"/>
+      <w:pPr>
+        <w:tabs>
+          <w:tab w:val="num" w:pos="2160"/>
+        </w:tabs>
+        <w:ind w:left="2160" w:hanging="360"/>
+      </w:pPr>
+      <w:rPr>
+        <w:rFonts w:ascii="Wingdings" w:hAnsi="Wingdings" w:hint="default"/>
+        <w:sz w:val="20"/>
+      </w:rPr>
+    </w:lvl>
+    <w:lvl w:ilvl="3" w:tentative="1">
+      <w:start w:val="1"/>
+      <w:numFmt w:val="bullet"/>
+      <w:lvlText w:val=""/>
+      <w:lvlJc w:val="left"/>
+      <w:pPr>
+        <w:tabs>
+          <w:tab w:val="num" w:pos="2880"/>
+        </w:tabs>
+        <w:ind w:left="2880" w:hanging="360"/>
+      </w:pPr>
+      <w:rPr>
+        <w:rFonts w:ascii="Wingdings" w:hAnsi="Wingdings" w:hint="default"/>
+        <w:sz w:val="20"/>
+      </w:rPr>
+    </w:lvl>
+    <w:lvl w:ilvl="4" w:tentative="1">
+      <w:start w:val="1"/>
+      <w:numFmt w:val="bullet"/>
+      <w:lvlText w:val=""/>
+      <w:lvlJc w:val="left"/>
+      <w:pPr>
+        <w:tabs>
+          <w:tab w:val="num" w:pos="3600"/>
+        </w:tabs>
+        <w:ind w:left="3600" w:hanging="360"/>
+      </w:pPr>
+      <w:rPr>
+        <w:rFonts w:ascii="Wingdings" w:hAnsi="Wingdings" w:hint="default"/>
+        <w:sz w:val="20"/>
+      </w:rPr>
+    </w:lvl>
+    <w:lvl w:ilvl="5" w:tentative="1">
+      <w:start w:val="1"/>
+      <w:numFmt w:val="bullet"/>
+      <w:lvlText w:val=""/>
+      <w:lvlJc w:val="left"/>
+      <w:pPr>
+        <w:tabs>
+          <w:tab w:val="num" w:pos="4320"/>
+        </w:tabs>
+        <w:ind w:left="4320" w:hanging="360"/>
+      </w:pPr>
+      <w:rPr>
+        <w:rFonts w:ascii="Wingdings" w:hAnsi="Wingdings" w:hint="default"/>
+        <w:sz w:val="20"/>
+      </w:rPr>
+    </w:lvl>
+    <w:lvl w:ilvl="6" w:tentative="1">
+      <w:start w:val="1"/>
+      <w:numFmt w:val="bullet"/>
+      <w:lvlText w:val=""/>
+      <w:lvlJc w:val="left"/>
+      <w:pPr>
+        <w:tabs>
+          <w:tab w:val="num" w:pos="5040"/>
+        </w:tabs>
+        <w:ind w:left="5040" w:hanging="360"/>
+      </w:pPr>
+      <w:rPr>
+        <w:rFonts w:ascii="Wingdings" w:hAnsi="Wingdings" w:hint="default"/>
+        <w:sz w:val="20"/>
+      </w:rPr>
+    </w:lvl>
+    <w:lvl w:ilvl="7" w:tentative="1">
+      <w:start w:val="1"/>
+      <w:numFmt w:val="bullet"/>
+      <w:lvlText w:val=""/>
+      <w:lvlJc w:val="left"/>
+      <w:pPr>
+        <w:tabs>
+          <w:tab w:val="num" w:pos="5760"/>
+        </w:tabs>
+        <w:ind w:left="5760" w:hanging="360"/>
+      </w:pPr>
+      <w:rPr>
+        <w:rFonts w:ascii="Wingdings" w:hAnsi="Wingdings" w:hint="default"/>
+        <w:sz w:val="20"/>
+      </w:rPr>
+    </w:lvl>
+    <w:lvl w:ilvl="8" w:tentative="1">
+      <w:start w:val="1"/>
+      <w:numFmt w:val="bullet"/>
+      <w:lvlText w:val=""/>
+      <w:lvlJc w:val="left"/>
+      <w:pPr>
+        <w:tabs>
+          <w:tab w:val="num" w:pos="6480"/>
+        </w:tabs>
+        <w:ind w:left="6480" w:hanging="360"/>
+      </w:pPr>
+      <w:rPr>
+        <w:rFonts w:ascii="Wingdings" w:hAnsi="Wingdings" w:hint="default"/>
+        <w:sz w:val="20"/>
+      </w:rPr>
+    </w:lvl>
+  </w:abstractNum>
+  <w:abstractNum w:abstractNumId="31" w15:restartNumberingAfterBreak="0">
     <w:nsid w:val="7CB5752A"/>
     <w:multiLevelType w:val="hybridMultilevel"/>
     <w:tmpl w:val="3E8855C0"/>
@@ -9712,10 +10844,10 @@
       </w:rPr>
     </w:lvl>
   </w:abstractNum>
-  <w:abstractNum w:abstractNumId="28" w15:restartNumberingAfterBreak="0">
+  <w:abstractNum w:abstractNumId="32" w15:restartNumberingAfterBreak="0">
     <w:nsid w:val="7D905054"/>
     <w:multiLevelType w:val="hybridMultilevel"/>
-    <w:tmpl w:val="B5EE156C"/>
+    <w:tmpl w:val="9CB40FDE"/>
     <w:lvl w:ilvl="0" w:tplc="0C0A0001">
       <w:start w:val="1"/>
       <w:numFmt w:val="bullet"/>
@@ -9825,7 +10957,7 @@
       </w:rPr>
     </w:lvl>
   </w:abstractNum>
-  <w:abstractNum w:abstractNumId="29" w15:restartNumberingAfterBreak="0">
+  <w:abstractNum w:abstractNumId="33" w15:restartNumberingAfterBreak="0">
     <w:nsid w:val="7E764224"/>
     <w:multiLevelType w:val="multilevel"/>
     <w:tmpl w:val="5248F0BA"/>
@@ -9978,7 +11110,7 @@
     <w:abstractNumId w:val="0"/>
   </w:num>
   <w:num w:numId="2">
-    <w:abstractNumId w:val="24"/>
+    <w:abstractNumId w:val="27"/>
   </w:num>
   <w:num w:numId="3">
     <w:abstractNumId w:val="0"/>
@@ -10011,7 +11143,7 @@
     </w:lvlOverride>
   </w:num>
   <w:num w:numId="4">
-    <w:abstractNumId w:val="15"/>
+    <w:abstractNumId w:val="16"/>
     <w:lvlOverride w:ilvl="0">
       <w:startOverride w:val="1"/>
     </w:lvlOverride>
@@ -10071,28 +11203,28 @@
     </w:lvlOverride>
   </w:num>
   <w:num w:numId="6">
+    <w:abstractNumId w:val="25"/>
+  </w:num>
+  <w:num w:numId="7">
+    <w:abstractNumId w:val="24"/>
+  </w:num>
+  <w:num w:numId="8">
     <w:abstractNumId w:val="22"/>
   </w:num>
-  <w:num w:numId="7">
-    <w:abstractNumId w:val="21"/>
-  </w:num>
-  <w:num w:numId="8">
-    <w:abstractNumId w:val="19"/>
-  </w:num>
   <w:num w:numId="9">
-    <w:abstractNumId w:val="10"/>
+    <w:abstractNumId w:val="11"/>
   </w:num>
   <w:num w:numId="10">
     <w:abstractNumId w:val="4"/>
   </w:num>
   <w:num w:numId="11">
-    <w:abstractNumId w:val="6"/>
+    <w:abstractNumId w:val="7"/>
   </w:num>
   <w:num w:numId="12">
-    <w:abstractNumId w:val="9"/>
+    <w:abstractNumId w:val="10"/>
   </w:num>
   <w:num w:numId="13">
-    <w:abstractNumId w:val="8"/>
+    <w:abstractNumId w:val="9"/>
     <w:lvlOverride w:ilvl="0">
       <w:startOverride w:val="1"/>
     </w:lvlOverride>
@@ -10122,61 +11254,73 @@
     </w:lvlOverride>
   </w:num>
   <w:num w:numId="14">
-    <w:abstractNumId w:val="11"/>
+    <w:abstractNumId w:val="12"/>
   </w:num>
   <w:num w:numId="15">
-    <w:abstractNumId w:val="25"/>
+    <w:abstractNumId w:val="28"/>
   </w:num>
   <w:num w:numId="16">
     <w:abstractNumId w:val="3"/>
   </w:num>
   <w:num w:numId="17">
-    <w:abstractNumId w:val="23"/>
+    <w:abstractNumId w:val="26"/>
   </w:num>
   <w:num w:numId="18">
     <w:abstractNumId w:val="1"/>
   </w:num>
   <w:num w:numId="19">
+    <w:abstractNumId w:val="15"/>
+  </w:num>
+  <w:num w:numId="20">
+    <w:abstractNumId w:val="31"/>
+  </w:num>
+  <w:num w:numId="21">
+    <w:abstractNumId w:val="13"/>
+  </w:num>
+  <w:num w:numId="22">
+    <w:abstractNumId w:val="33"/>
+  </w:num>
+  <w:num w:numId="23">
+    <w:abstractNumId w:val="19"/>
+  </w:num>
+  <w:num w:numId="24">
+    <w:abstractNumId w:val="6"/>
+  </w:num>
+  <w:num w:numId="25">
+    <w:abstractNumId w:val="23"/>
+  </w:num>
+  <w:num w:numId="26">
+    <w:abstractNumId w:val="8"/>
+  </w:num>
+  <w:num w:numId="27">
+    <w:abstractNumId w:val="29"/>
+  </w:num>
+  <w:num w:numId="28">
+    <w:abstractNumId w:val="18"/>
+  </w:num>
+  <w:num w:numId="29">
     <w:abstractNumId w:val="14"/>
   </w:num>
-  <w:num w:numId="20">
-    <w:abstractNumId w:val="27"/>
-  </w:num>
-  <w:num w:numId="21">
-    <w:abstractNumId w:val="12"/>
-  </w:num>
-  <w:num w:numId="22">
-    <w:abstractNumId w:val="29"/>
-  </w:num>
-  <w:num w:numId="23">
-    <w:abstractNumId w:val="18"/>
-  </w:num>
-  <w:num w:numId="24">
-    <w:abstractNumId w:val="5"/>
-  </w:num>
-  <w:num w:numId="25">
-    <w:abstractNumId w:val="20"/>
-  </w:num>
-  <w:num w:numId="26">
-    <w:abstractNumId w:val="7"/>
-  </w:num>
-  <w:num w:numId="27">
-    <w:abstractNumId w:val="26"/>
-  </w:num>
-  <w:num w:numId="28">
+  <w:num w:numId="30">
     <w:abstractNumId w:val="17"/>
-  </w:num>
-  <w:num w:numId="29">
-    <w:abstractNumId w:val="13"/>
-  </w:num>
-  <w:num w:numId="30">
-    <w:abstractNumId w:val="16"/>
   </w:num>
   <w:num w:numId="31">
     <w:abstractNumId w:val="2"/>
   </w:num>
   <w:num w:numId="32">
-    <w:abstractNumId w:val="28"/>
+    <w:abstractNumId w:val="32"/>
+  </w:num>
+  <w:num w:numId="33">
+    <w:abstractNumId w:val="21"/>
+  </w:num>
+  <w:num w:numId="34">
+    <w:abstractNumId w:val="30"/>
+  </w:num>
+  <w:num w:numId="35">
+    <w:abstractNumId w:val="5"/>
+  </w:num>
+  <w:num w:numId="36">
+    <w:abstractNumId w:val="20"/>
   </w:num>
 </w:numbering>
 </file>

</xml_diff>

<commit_message>
doc9 / plan de recursos
</commit_message>
<xml_diff>
--- a/DocumentoCompProyectoMercados_GCC.docx
+++ b/DocumentoCompProyectoMercados_GCC.docx
@@ -8485,6 +8485,328 @@
           <w:lang w:val="es-ES"/>
         </w:rPr>
       </w:pPr>
+    </w:p>
+    <w:p>
+      <w:pPr>
+        <w:pStyle w:val="Ttulo1"/>
+      </w:pPr>
+      <w:r>
+        <w:t>PLAN</w:t>
+      </w:r>
+      <w:r>
+        <w:t xml:space="preserve"> </w:t>
+      </w:r>
+      <w:r>
+        <w:t>DE</w:t>
+      </w:r>
+      <w:r>
+        <w:t xml:space="preserve"> R</w:t>
+      </w:r>
+      <w:r>
+        <w:t>ECURSOS</w:t>
+      </w:r>
+      <w:r>
+        <w:t xml:space="preserve"> H</w:t>
+      </w:r>
+      <w:r>
+        <w:t>UMANOS</w:t>
+      </w:r>
+      <w:r>
+        <w:t xml:space="preserve"> </w:t>
+      </w:r>
+      <w:r>
+        <w:t>Y</w:t>
+      </w:r>
+      <w:r>
+        <w:t xml:space="preserve"> D</w:t>
+      </w:r>
+      <w:r>
+        <w:t>ISTRIBUCIÓN</w:t>
+      </w:r>
+      <w:r>
+        <w:t xml:space="preserve"> </w:t>
+      </w:r>
+      <w:r>
+        <w:t>DEL</w:t>
+      </w:r>
+      <w:r>
+        <w:t xml:space="preserve"> E</w:t>
+      </w:r>
+      <w:r>
+        <w:t>QUIPO</w:t>
+      </w:r>
+    </w:p>
+    <w:p>
+      <w:pPr>
+        <w:rPr>
+          <w:rFonts w:ascii="Arial" w:hAnsi="Arial" w:cs="Arial"/>
+          <w:lang w:val="es-ES"/>
+        </w:rPr>
+      </w:pPr>
+      <w:r>
+        <w:rPr>
+          <w:rFonts w:ascii="Arial" w:hAnsi="Arial" w:cs="Arial"/>
+          <w:lang w:val="es-ES"/>
+        </w:rPr>
+        <w:t>Este documento detalla la estructura inicial del equipo de desarrollo encargada de construir el MVP durante los 6 meses de plazo.</w:t>
+      </w:r>
+    </w:p>
+    <w:p>
+      <w:pPr>
+        <w:pStyle w:val="Ttulo2"/>
+      </w:pPr>
+      <w:r>
+        <w:t>Roles, Responsabilidades y Distribución del Salario Inicial</w:t>
+      </w:r>
+    </w:p>
+    <w:p>
+      <w:pPr>
+        <w:pStyle w:val="Prrafodelista"/>
+        <w:numPr>
+          <w:ilvl w:val="0"/>
+          <w:numId w:val="45"/>
+        </w:numPr>
+        <w:rPr>
+          <w:rFonts w:ascii="Arial" w:hAnsi="Arial" w:cs="Arial"/>
+          <w:lang w:val="es-ES"/>
+        </w:rPr>
+      </w:pPr>
+      <w:r>
+        <w:rPr>
+          <w:rFonts w:ascii="Arial" w:hAnsi="Arial" w:cs="Arial"/>
+          <w:lang w:val="es-ES"/>
+        </w:rPr>
+        <w:t>Gerente de Proyecto (Project Manager - PM)</w:t>
+      </w:r>
+    </w:p>
+    <w:p>
+      <w:pPr>
+        <w:ind w:left="708"/>
+        <w:rPr>
+          <w:rFonts w:ascii="Arial" w:hAnsi="Arial" w:cs="Arial"/>
+          <w:lang w:val="es-ES"/>
+        </w:rPr>
+      </w:pPr>
+      <w:r>
+        <w:rPr>
+          <w:rFonts w:ascii="Arial" w:hAnsi="Arial" w:cs="Arial"/>
+          <w:lang w:val="es-ES"/>
+        </w:rPr>
+        <w:t>Responsabilidad: Gestión de interesados, control del presupuesto, informes semanales a la Alcaldía y liderazgo del proceso de control de cambios.</w:t>
+      </w:r>
+    </w:p>
+    <w:p>
+      <w:pPr>
+        <w:ind w:left="708"/>
+        <w:rPr>
+          <w:rFonts w:ascii="Arial" w:hAnsi="Arial" w:cs="Arial"/>
+          <w:lang w:val="es-ES"/>
+        </w:rPr>
+      </w:pPr>
+      <w:r>
+        <w:rPr>
+          <w:rFonts w:ascii="Arial" w:hAnsi="Arial" w:cs="Arial"/>
+          <w:lang w:val="es-ES"/>
+        </w:rPr>
+        <w:t xml:space="preserve">    Asignación Presupuestaria:2,500 Bs/mes (Total: 15,000 Bs).</w:t>
+      </w:r>
+    </w:p>
+    <w:p>
+      <w:pPr>
+        <w:pStyle w:val="Prrafodelista"/>
+        <w:numPr>
+          <w:ilvl w:val="0"/>
+          <w:numId w:val="45"/>
+        </w:numPr>
+        <w:rPr>
+          <w:rFonts w:ascii="Arial" w:hAnsi="Arial" w:cs="Arial"/>
+          <w:lang w:val="es-ES"/>
+        </w:rPr>
+      </w:pPr>
+      <w:r>
+        <w:rPr>
+          <w:rFonts w:ascii="Arial" w:hAnsi="Arial" w:cs="Arial"/>
+          <w:lang w:val="es-ES"/>
+        </w:rPr>
+        <w:t>Desarrolladores Senior (2 plazas - Recursos Clave)</w:t>
+      </w:r>
+    </w:p>
+    <w:p>
+      <w:pPr>
+        <w:ind w:left="708"/>
+        <w:rPr>
+          <w:rFonts w:ascii="Arial" w:hAnsi="Arial" w:cs="Arial"/>
+          <w:lang w:val="es-ES"/>
+        </w:rPr>
+      </w:pPr>
+      <w:r>
+        <w:rPr>
+          <w:rFonts w:ascii="Arial" w:hAnsi="Arial" w:cs="Arial"/>
+          <w:lang w:val="es-ES"/>
+        </w:rPr>
+        <w:t>Responsabilidad: Arquitectura de la base de datos, lógica del módulo de cobros, seguridad del código y mentoría técnica.</w:t>
+      </w:r>
+    </w:p>
+    <w:p>
+      <w:pPr>
+        <w:ind w:left="708"/>
+        <w:rPr>
+          <w:rFonts w:ascii="Arial" w:hAnsi="Arial" w:cs="Arial"/>
+          <w:lang w:val="es-ES"/>
+        </w:rPr>
+      </w:pPr>
+      <w:r>
+        <w:rPr>
+          <w:rFonts w:ascii="Arial" w:hAnsi="Arial" w:cs="Arial"/>
+          <w:lang w:val="es-ES"/>
+        </w:rPr>
+        <w:t xml:space="preserve">    Asignación Presupuestaria: 2,000 Bs / mes por desarrollador (Total: 24,000 Bs combinados).</w:t>
+      </w:r>
+    </w:p>
+    <w:p>
+      <w:pPr>
+        <w:ind w:left="708"/>
+        <w:rPr>
+          <w:rFonts w:ascii="Arial" w:hAnsi="Arial" w:cs="Arial"/>
+          <w:lang w:val="es-ES"/>
+        </w:rPr>
+      </w:pPr>
+      <w:r>
+        <w:rPr>
+          <w:rFonts w:ascii="Arial" w:hAnsi="Arial" w:cs="Arial"/>
+          <w:lang w:val="es-ES"/>
+        </w:rPr>
+        <w:t>Nota Crítica: Estos puestos representan la columna vertebral técnica del proyecto. Su salida paraliza la línea de producción de código.</w:t>
+      </w:r>
+    </w:p>
+    <w:p>
+      <w:pPr>
+        <w:numPr>
+          <w:ilvl w:val="0"/>
+          <w:numId w:val="44"/>
+        </w:numPr>
+        <w:rPr>
+          <w:rFonts w:ascii="Arial" w:hAnsi="Arial" w:cs="Arial"/>
+          <w:lang w:val="es-ES"/>
+        </w:rPr>
+      </w:pPr>
+      <w:r>
+        <w:rPr>
+          <w:rFonts w:ascii="Arial" w:hAnsi="Arial" w:cs="Arial"/>
+          <w:lang w:val="es-ES"/>
+        </w:rPr>
+        <w:t xml:space="preserve">Desarrolladores </w:t>
+      </w:r>
+      <w:proofErr w:type="spellStart"/>
+      <w:r>
+        <w:rPr>
+          <w:rFonts w:ascii="Arial" w:hAnsi="Arial" w:cs="Arial"/>
+          <w:lang w:val="es-ES"/>
+        </w:rPr>
+        <w:t>Mid</w:t>
+      </w:r>
+      <w:proofErr w:type="spellEnd"/>
+      <w:r>
+        <w:rPr>
+          <w:rFonts w:ascii="Arial" w:hAnsi="Arial" w:cs="Arial"/>
+          <w:lang w:val="es-ES"/>
+        </w:rPr>
+        <w:t>/Junior (2 plazas)</w:t>
+      </w:r>
+    </w:p>
+    <w:p>
+      <w:pPr>
+        <w:ind w:left="708"/>
+        <w:rPr>
+          <w:rFonts w:ascii="Arial" w:hAnsi="Arial" w:cs="Arial"/>
+          <w:lang w:val="es-ES"/>
+        </w:rPr>
+      </w:pPr>
+      <w:r>
+        <w:rPr>
+          <w:rFonts w:ascii="Arial" w:hAnsi="Arial" w:cs="Arial"/>
+          <w:lang w:val="es-ES"/>
+        </w:rPr>
+        <w:t>Responsabilidad: Creación de interfaces web, reportes planos en PDF, lógica secundaria de formularios de registro y soporte general.</w:t>
+      </w:r>
+    </w:p>
+    <w:p>
+      <w:pPr>
+        <w:ind w:left="708"/>
+        <w:rPr>
+          <w:rFonts w:ascii="Arial" w:hAnsi="Arial" w:cs="Arial"/>
+          <w:lang w:val="es-ES"/>
+        </w:rPr>
+      </w:pPr>
+      <w:r>
+        <w:rPr>
+          <w:rFonts w:ascii="Arial" w:hAnsi="Arial" w:cs="Arial"/>
+          <w:lang w:val="es-ES"/>
+        </w:rPr>
+        <w:t xml:space="preserve">    Asignación Presupuestaria: 1,000 Bs / mes por desarrollador (Total: 12,000 Bs combinados).</w:t>
+      </w:r>
+    </w:p>
+    <w:p>
+      <w:pPr>
+        <w:ind w:left="708"/>
+        <w:rPr>
+          <w:rFonts w:ascii="Arial" w:hAnsi="Arial" w:cs="Arial"/>
+          <w:lang w:val="es-ES"/>
+        </w:rPr>
+      </w:pPr>
+    </w:p>
+    <w:p>
+      <w:pPr>
+        <w:pStyle w:val="Prrafodelista"/>
+        <w:numPr>
+          <w:ilvl w:val="0"/>
+          <w:numId w:val="45"/>
+        </w:numPr>
+        <w:rPr>
+          <w:rFonts w:ascii="Arial" w:hAnsi="Arial" w:cs="Arial"/>
+          <w:lang w:val="es-ES"/>
+        </w:rPr>
+      </w:pPr>
+      <w:r>
+        <w:rPr>
+          <w:rFonts w:ascii="Arial" w:hAnsi="Arial" w:cs="Arial"/>
+          <w:lang w:val="es-ES"/>
+        </w:rPr>
+        <w:lastRenderedPageBreak/>
+        <w:t>Diseñador UI/UX y Analista de Aseguramiento de la Calidad (QA)</w:t>
+      </w:r>
+    </w:p>
+    <w:p>
+      <w:pPr>
+        <w:ind w:left="708"/>
+        <w:rPr>
+          <w:rFonts w:ascii="Arial" w:hAnsi="Arial" w:cs="Arial"/>
+          <w:lang w:val="es-ES"/>
+        </w:rPr>
+      </w:pPr>
+      <w:r>
+        <w:rPr>
+          <w:rFonts w:ascii="Arial" w:hAnsi="Arial" w:cs="Arial"/>
+          <w:lang w:val="es-ES"/>
+        </w:rPr>
+        <w:t>Responsabilidad: Diseño responsivo del sistema para pantallas de escritorio, ejecución de pruebas funcionales y validación del flujo de cobros sin errores.</w:t>
+      </w:r>
+    </w:p>
+    <w:p>
+      <w:pPr>
+        <w:ind w:left="708"/>
+        <w:rPr>
+          <w:rFonts w:ascii="Arial" w:hAnsi="Arial" w:cs="Arial"/>
+          <w:lang w:val="es-ES"/>
+        </w:rPr>
+      </w:pPr>
+      <w:r>
+        <w:rPr>
+          <w:rFonts w:ascii="Arial" w:hAnsi="Arial" w:cs="Arial"/>
+          <w:lang w:val="es-ES"/>
+        </w:rPr>
+        <w:t xml:space="preserve">    Asignación Presupuestaria:1,000 Bs/mes (Total: 6,000 Bs).</w:t>
+      </w:r>
     </w:p>
     <w:p>
       <w:pPr>
@@ -11132,6 +11454,119 @@
     </w:lvl>
   </w:abstractNum>
   <w:abstractNum w:abstractNumId="15" w15:restartNumberingAfterBreak="0">
+    <w:nsid w:val="3D9C5985"/>
+    <w:multiLevelType w:val="multilevel"/>
+    <w:tmpl w:val="277AD260"/>
+    <w:lvl w:ilvl="0">
+      <w:start w:val="3"/>
+      <w:numFmt w:val="decimal"/>
+      <w:lvlText w:val="%1."/>
+      <w:lvlJc w:val="left"/>
+      <w:pPr>
+        <w:tabs>
+          <w:tab w:val="num" w:pos="720"/>
+        </w:tabs>
+        <w:ind w:left="720" w:hanging="360"/>
+      </w:pPr>
+    </w:lvl>
+    <w:lvl w:ilvl="1" w:tentative="1">
+      <w:start w:val="1"/>
+      <w:numFmt w:val="decimal"/>
+      <w:lvlText w:val="%2."/>
+      <w:lvlJc w:val="left"/>
+      <w:pPr>
+        <w:tabs>
+          <w:tab w:val="num" w:pos="1440"/>
+        </w:tabs>
+        <w:ind w:left="1440" w:hanging="360"/>
+      </w:pPr>
+    </w:lvl>
+    <w:lvl w:ilvl="2" w:tentative="1">
+      <w:start w:val="1"/>
+      <w:numFmt w:val="decimal"/>
+      <w:lvlText w:val="%3."/>
+      <w:lvlJc w:val="left"/>
+      <w:pPr>
+        <w:tabs>
+          <w:tab w:val="num" w:pos="2160"/>
+        </w:tabs>
+        <w:ind w:left="2160" w:hanging="360"/>
+      </w:pPr>
+    </w:lvl>
+    <w:lvl w:ilvl="3" w:tentative="1">
+      <w:start w:val="1"/>
+      <w:numFmt w:val="decimal"/>
+      <w:lvlText w:val="%4."/>
+      <w:lvlJc w:val="left"/>
+      <w:pPr>
+        <w:tabs>
+          <w:tab w:val="num" w:pos="2880"/>
+        </w:tabs>
+        <w:ind w:left="2880" w:hanging="360"/>
+      </w:pPr>
+    </w:lvl>
+    <w:lvl w:ilvl="4" w:tentative="1">
+      <w:start w:val="1"/>
+      <w:numFmt w:val="decimal"/>
+      <w:lvlText w:val="%5."/>
+      <w:lvlJc w:val="left"/>
+      <w:pPr>
+        <w:tabs>
+          <w:tab w:val="num" w:pos="3600"/>
+        </w:tabs>
+        <w:ind w:left="3600" w:hanging="360"/>
+      </w:pPr>
+    </w:lvl>
+    <w:lvl w:ilvl="5" w:tentative="1">
+      <w:start w:val="1"/>
+      <w:numFmt w:val="decimal"/>
+      <w:lvlText w:val="%6."/>
+      <w:lvlJc w:val="left"/>
+      <w:pPr>
+        <w:tabs>
+          <w:tab w:val="num" w:pos="4320"/>
+        </w:tabs>
+        <w:ind w:left="4320" w:hanging="360"/>
+      </w:pPr>
+    </w:lvl>
+    <w:lvl w:ilvl="6" w:tentative="1">
+      <w:start w:val="1"/>
+      <w:numFmt w:val="decimal"/>
+      <w:lvlText w:val="%7."/>
+      <w:lvlJc w:val="left"/>
+      <w:pPr>
+        <w:tabs>
+          <w:tab w:val="num" w:pos="5040"/>
+        </w:tabs>
+        <w:ind w:left="5040" w:hanging="360"/>
+      </w:pPr>
+    </w:lvl>
+    <w:lvl w:ilvl="7" w:tentative="1">
+      <w:start w:val="1"/>
+      <w:numFmt w:val="decimal"/>
+      <w:lvlText w:val="%8."/>
+      <w:lvlJc w:val="left"/>
+      <w:pPr>
+        <w:tabs>
+          <w:tab w:val="num" w:pos="5760"/>
+        </w:tabs>
+        <w:ind w:left="5760" w:hanging="360"/>
+      </w:pPr>
+    </w:lvl>
+    <w:lvl w:ilvl="8" w:tentative="1">
+      <w:start w:val="1"/>
+      <w:numFmt w:val="decimal"/>
+      <w:lvlText w:val="%9."/>
+      <w:lvlJc w:val="left"/>
+      <w:pPr>
+        <w:tabs>
+          <w:tab w:val="num" w:pos="6480"/>
+        </w:tabs>
+        <w:ind w:left="6480" w:hanging="360"/>
+      </w:pPr>
+    </w:lvl>
+  </w:abstractNum>
+  <w:abstractNum w:abstractNumId="16" w15:restartNumberingAfterBreak="0">
     <w:nsid w:val="415521CD"/>
     <w:multiLevelType w:val="multilevel"/>
     <w:tmpl w:val="E0AA99D4"/>
@@ -11280,7 +11715,7 @@
       </w:rPr>
     </w:lvl>
   </w:abstractNum>
-  <w:abstractNum w:abstractNumId="16" w15:restartNumberingAfterBreak="0">
+  <w:abstractNum w:abstractNumId="17" w15:restartNumberingAfterBreak="0">
     <w:nsid w:val="41DA779B"/>
     <w:multiLevelType w:val="multilevel"/>
     <w:tmpl w:val="8FFAF41A"/>
@@ -11393,7 +11828,7 @@
       </w:pPr>
     </w:lvl>
   </w:abstractNum>
-  <w:abstractNum w:abstractNumId="17" w15:restartNumberingAfterBreak="0">
+  <w:abstractNum w:abstractNumId="18" w15:restartNumberingAfterBreak="0">
     <w:nsid w:val="444D03FA"/>
     <w:multiLevelType w:val="hybridMultilevel"/>
     <w:tmpl w:val="80EC6116"/>
@@ -11506,7 +11941,7 @@
       </w:rPr>
     </w:lvl>
   </w:abstractNum>
-  <w:abstractNum w:abstractNumId="18" w15:restartNumberingAfterBreak="0">
+  <w:abstractNum w:abstractNumId="19" w15:restartNumberingAfterBreak="0">
     <w:nsid w:val="45632781"/>
     <w:multiLevelType w:val="hybridMultilevel"/>
     <w:tmpl w:val="7C28A2BA"/>
@@ -11619,7 +12054,7 @@
       </w:rPr>
     </w:lvl>
   </w:abstractNum>
-  <w:abstractNum w:abstractNumId="19" w15:restartNumberingAfterBreak="0">
+  <w:abstractNum w:abstractNumId="20" w15:restartNumberingAfterBreak="0">
     <w:nsid w:val="50DF3A72"/>
     <w:multiLevelType w:val="multilevel"/>
     <w:tmpl w:val="66C2A37E"/>
@@ -11706,7 +12141,7 @@
       </w:pPr>
     </w:lvl>
   </w:abstractNum>
-  <w:abstractNum w:abstractNumId="20" w15:restartNumberingAfterBreak="0">
+  <w:abstractNum w:abstractNumId="21" w15:restartNumberingAfterBreak="0">
     <w:nsid w:val="53790B1E"/>
     <w:multiLevelType w:val="hybridMultilevel"/>
     <w:tmpl w:val="7A06AD96"/>
@@ -11819,7 +12254,7 @@
       </w:rPr>
     </w:lvl>
   </w:abstractNum>
-  <w:abstractNum w:abstractNumId="21" w15:restartNumberingAfterBreak="0">
+  <w:abstractNum w:abstractNumId="22" w15:restartNumberingAfterBreak="0">
     <w:nsid w:val="546B45AF"/>
     <w:multiLevelType w:val="hybridMultilevel"/>
     <w:tmpl w:val="0F6ACFF4"/>
@@ -11905,7 +12340,7 @@
       </w:pPr>
     </w:lvl>
   </w:abstractNum>
-  <w:abstractNum w:abstractNumId="22" w15:restartNumberingAfterBreak="0">
+  <w:abstractNum w:abstractNumId="23" w15:restartNumberingAfterBreak="0">
     <w:nsid w:val="563F08B6"/>
     <w:multiLevelType w:val="hybridMultilevel"/>
     <w:tmpl w:val="CD70BDDE"/>
@@ -12018,7 +12453,120 @@
       </w:rPr>
     </w:lvl>
   </w:abstractNum>
-  <w:abstractNum w:abstractNumId="23" w15:restartNumberingAfterBreak="0">
+  <w:abstractNum w:abstractNumId="24" w15:restartNumberingAfterBreak="0">
+    <w:nsid w:val="58C7008D"/>
+    <w:multiLevelType w:val="multilevel"/>
+    <w:tmpl w:val="8C9A5468"/>
+    <w:lvl w:ilvl="0">
+      <w:start w:val="1"/>
+      <w:numFmt w:val="decimal"/>
+      <w:lvlText w:val="%1."/>
+      <w:lvlJc w:val="left"/>
+      <w:pPr>
+        <w:tabs>
+          <w:tab w:val="num" w:pos="720"/>
+        </w:tabs>
+        <w:ind w:left="720" w:hanging="360"/>
+      </w:pPr>
+    </w:lvl>
+    <w:lvl w:ilvl="1" w:tentative="1">
+      <w:start w:val="1"/>
+      <w:numFmt w:val="decimal"/>
+      <w:lvlText w:val="%2."/>
+      <w:lvlJc w:val="left"/>
+      <w:pPr>
+        <w:tabs>
+          <w:tab w:val="num" w:pos="1440"/>
+        </w:tabs>
+        <w:ind w:left="1440" w:hanging="360"/>
+      </w:pPr>
+    </w:lvl>
+    <w:lvl w:ilvl="2" w:tentative="1">
+      <w:start w:val="1"/>
+      <w:numFmt w:val="decimal"/>
+      <w:lvlText w:val="%3."/>
+      <w:lvlJc w:val="left"/>
+      <w:pPr>
+        <w:tabs>
+          <w:tab w:val="num" w:pos="2160"/>
+        </w:tabs>
+        <w:ind w:left="2160" w:hanging="360"/>
+      </w:pPr>
+    </w:lvl>
+    <w:lvl w:ilvl="3" w:tentative="1">
+      <w:start w:val="1"/>
+      <w:numFmt w:val="decimal"/>
+      <w:lvlText w:val="%4."/>
+      <w:lvlJc w:val="left"/>
+      <w:pPr>
+        <w:tabs>
+          <w:tab w:val="num" w:pos="2880"/>
+        </w:tabs>
+        <w:ind w:left="2880" w:hanging="360"/>
+      </w:pPr>
+    </w:lvl>
+    <w:lvl w:ilvl="4" w:tentative="1">
+      <w:start w:val="1"/>
+      <w:numFmt w:val="decimal"/>
+      <w:lvlText w:val="%5."/>
+      <w:lvlJc w:val="left"/>
+      <w:pPr>
+        <w:tabs>
+          <w:tab w:val="num" w:pos="3600"/>
+        </w:tabs>
+        <w:ind w:left="3600" w:hanging="360"/>
+      </w:pPr>
+    </w:lvl>
+    <w:lvl w:ilvl="5" w:tentative="1">
+      <w:start w:val="1"/>
+      <w:numFmt w:val="decimal"/>
+      <w:lvlText w:val="%6."/>
+      <w:lvlJc w:val="left"/>
+      <w:pPr>
+        <w:tabs>
+          <w:tab w:val="num" w:pos="4320"/>
+        </w:tabs>
+        <w:ind w:left="4320" w:hanging="360"/>
+      </w:pPr>
+    </w:lvl>
+    <w:lvl w:ilvl="6" w:tentative="1">
+      <w:start w:val="1"/>
+      <w:numFmt w:val="decimal"/>
+      <w:lvlText w:val="%7."/>
+      <w:lvlJc w:val="left"/>
+      <w:pPr>
+        <w:tabs>
+          <w:tab w:val="num" w:pos="5040"/>
+        </w:tabs>
+        <w:ind w:left="5040" w:hanging="360"/>
+      </w:pPr>
+    </w:lvl>
+    <w:lvl w:ilvl="7" w:tentative="1">
+      <w:start w:val="1"/>
+      <w:numFmt w:val="decimal"/>
+      <w:lvlText w:val="%8."/>
+      <w:lvlJc w:val="left"/>
+      <w:pPr>
+        <w:tabs>
+          <w:tab w:val="num" w:pos="5760"/>
+        </w:tabs>
+        <w:ind w:left="5760" w:hanging="360"/>
+      </w:pPr>
+    </w:lvl>
+    <w:lvl w:ilvl="8" w:tentative="1">
+      <w:start w:val="1"/>
+      <w:numFmt w:val="decimal"/>
+      <w:lvlText w:val="%9."/>
+      <w:lvlJc w:val="left"/>
+      <w:pPr>
+        <w:tabs>
+          <w:tab w:val="num" w:pos="6480"/>
+        </w:tabs>
+        <w:ind w:left="6480" w:hanging="360"/>
+      </w:pPr>
+    </w:lvl>
+  </w:abstractNum>
+  <w:abstractNum w:abstractNumId="25" w15:restartNumberingAfterBreak="0">
     <w:nsid w:val="59640F76"/>
     <w:multiLevelType w:val="multilevel"/>
     <w:tmpl w:val="915056BE"/>
@@ -12167,7 +12715,7 @@
       </w:rPr>
     </w:lvl>
   </w:abstractNum>
-  <w:abstractNum w:abstractNumId="24" w15:restartNumberingAfterBreak="0">
+  <w:abstractNum w:abstractNumId="26" w15:restartNumberingAfterBreak="0">
     <w:nsid w:val="5B854F71"/>
     <w:multiLevelType w:val="multilevel"/>
     <w:tmpl w:val="AA7CEAA4"/>
@@ -12316,7 +12864,7 @@
       </w:rPr>
     </w:lvl>
   </w:abstractNum>
-  <w:abstractNum w:abstractNumId="25" w15:restartNumberingAfterBreak="0">
+  <w:abstractNum w:abstractNumId="27" w15:restartNumberingAfterBreak="0">
     <w:nsid w:val="5C2C428B"/>
     <w:multiLevelType w:val="hybridMultilevel"/>
     <w:tmpl w:val="0452F75A"/>
@@ -12405,7 +12953,7 @@
       </w:pPr>
     </w:lvl>
   </w:abstractNum>
-  <w:abstractNum w:abstractNumId="26" w15:restartNumberingAfterBreak="0">
+  <w:abstractNum w:abstractNumId="28" w15:restartNumberingAfterBreak="0">
     <w:nsid w:val="5CBF46A5"/>
     <w:multiLevelType w:val="multilevel"/>
     <w:tmpl w:val="BACA6AF6"/>
@@ -12554,7 +13102,7 @@
       </w:rPr>
     </w:lvl>
   </w:abstractNum>
-  <w:abstractNum w:abstractNumId="27" w15:restartNumberingAfterBreak="0">
+  <w:abstractNum w:abstractNumId="29" w15:restartNumberingAfterBreak="0">
     <w:nsid w:val="616072A1"/>
     <w:multiLevelType w:val="multilevel"/>
     <w:tmpl w:val="B15495DA"/>
@@ -12703,7 +13251,93 @@
       </w:rPr>
     </w:lvl>
   </w:abstractNum>
-  <w:abstractNum w:abstractNumId="28" w15:restartNumberingAfterBreak="0">
+  <w:abstractNum w:abstractNumId="30" w15:restartNumberingAfterBreak="0">
+    <w:nsid w:val="66824B31"/>
+    <w:multiLevelType w:val="hybridMultilevel"/>
+    <w:tmpl w:val="FB76797A"/>
+    <w:lvl w:ilvl="0" w:tplc="0C0A000F">
+      <w:start w:val="1"/>
+      <w:numFmt w:val="decimal"/>
+      <w:lvlText w:val="%1."/>
+      <w:lvlJc w:val="left"/>
+      <w:pPr>
+        <w:ind w:left="720" w:hanging="360"/>
+      </w:pPr>
+    </w:lvl>
+    <w:lvl w:ilvl="1" w:tplc="0C0A0019" w:tentative="1">
+      <w:start w:val="1"/>
+      <w:numFmt w:val="lowerLetter"/>
+      <w:lvlText w:val="%2."/>
+      <w:lvlJc w:val="left"/>
+      <w:pPr>
+        <w:ind w:left="1440" w:hanging="360"/>
+      </w:pPr>
+    </w:lvl>
+    <w:lvl w:ilvl="2" w:tplc="0C0A001B" w:tentative="1">
+      <w:start w:val="1"/>
+      <w:numFmt w:val="lowerRoman"/>
+      <w:lvlText w:val="%3."/>
+      <w:lvlJc w:val="right"/>
+      <w:pPr>
+        <w:ind w:left="2160" w:hanging="180"/>
+      </w:pPr>
+    </w:lvl>
+    <w:lvl w:ilvl="3" w:tplc="0C0A000F" w:tentative="1">
+      <w:start w:val="1"/>
+      <w:numFmt w:val="decimal"/>
+      <w:lvlText w:val="%4."/>
+      <w:lvlJc w:val="left"/>
+      <w:pPr>
+        <w:ind w:left="2880" w:hanging="360"/>
+      </w:pPr>
+    </w:lvl>
+    <w:lvl w:ilvl="4" w:tplc="0C0A0019" w:tentative="1">
+      <w:start w:val="1"/>
+      <w:numFmt w:val="lowerLetter"/>
+      <w:lvlText w:val="%5."/>
+      <w:lvlJc w:val="left"/>
+      <w:pPr>
+        <w:ind w:left="3600" w:hanging="360"/>
+      </w:pPr>
+    </w:lvl>
+    <w:lvl w:ilvl="5" w:tplc="0C0A001B" w:tentative="1">
+      <w:start w:val="1"/>
+      <w:numFmt w:val="lowerRoman"/>
+      <w:lvlText w:val="%6."/>
+      <w:lvlJc w:val="right"/>
+      <w:pPr>
+        <w:ind w:left="4320" w:hanging="180"/>
+      </w:pPr>
+    </w:lvl>
+    <w:lvl w:ilvl="6" w:tplc="0C0A000F" w:tentative="1">
+      <w:start w:val="1"/>
+      <w:numFmt w:val="decimal"/>
+      <w:lvlText w:val="%7."/>
+      <w:lvlJc w:val="left"/>
+      <w:pPr>
+        <w:ind w:left="5040" w:hanging="360"/>
+      </w:pPr>
+    </w:lvl>
+    <w:lvl w:ilvl="7" w:tplc="0C0A0019" w:tentative="1">
+      <w:start w:val="1"/>
+      <w:numFmt w:val="lowerLetter"/>
+      <w:lvlText w:val="%8."/>
+      <w:lvlJc w:val="left"/>
+      <w:pPr>
+        <w:ind w:left="5760" w:hanging="360"/>
+      </w:pPr>
+    </w:lvl>
+    <w:lvl w:ilvl="8" w:tplc="0C0A001B" w:tentative="1">
+      <w:start w:val="1"/>
+      <w:numFmt w:val="lowerRoman"/>
+      <w:lvlText w:val="%9."/>
+      <w:lvlJc w:val="right"/>
+      <w:pPr>
+        <w:ind w:left="6480" w:hanging="180"/>
+      </w:pPr>
+    </w:lvl>
+  </w:abstractNum>
+  <w:abstractNum w:abstractNumId="31" w15:restartNumberingAfterBreak="0">
     <w:nsid w:val="670A3EDD"/>
     <w:multiLevelType w:val="multilevel"/>
     <w:tmpl w:val="D9F886DE"/>
@@ -12852,7 +13486,7 @@
       </w:rPr>
     </w:lvl>
   </w:abstractNum>
-  <w:abstractNum w:abstractNumId="29" w15:restartNumberingAfterBreak="0">
+  <w:abstractNum w:abstractNumId="32" w15:restartNumberingAfterBreak="0">
     <w:nsid w:val="685E294E"/>
     <w:multiLevelType w:val="multilevel"/>
     <w:tmpl w:val="A7947952"/>
@@ -13001,7 +13635,7 @@
       </w:rPr>
     </w:lvl>
   </w:abstractNum>
-  <w:abstractNum w:abstractNumId="30" w15:restartNumberingAfterBreak="0">
+  <w:abstractNum w:abstractNumId="33" w15:restartNumberingAfterBreak="0">
     <w:nsid w:val="6B7242DF"/>
     <w:multiLevelType w:val="multilevel"/>
     <w:tmpl w:val="35FEE1B6"/>
@@ -13150,7 +13784,7 @@
       </w:rPr>
     </w:lvl>
   </w:abstractNum>
-  <w:abstractNum w:abstractNumId="31" w15:restartNumberingAfterBreak="0">
+  <w:abstractNum w:abstractNumId="34" w15:restartNumberingAfterBreak="0">
     <w:nsid w:val="6CF655A5"/>
     <w:multiLevelType w:val="multilevel"/>
     <w:tmpl w:val="AA120C74"/>
@@ -13263,7 +13897,7 @@
       </w:pPr>
     </w:lvl>
   </w:abstractNum>
-  <w:abstractNum w:abstractNumId="32" w15:restartNumberingAfterBreak="0">
+  <w:abstractNum w:abstractNumId="35" w15:restartNumberingAfterBreak="0">
     <w:nsid w:val="6D6048EB"/>
     <w:multiLevelType w:val="hybridMultilevel"/>
     <w:tmpl w:val="496637C8"/>
@@ -13376,7 +14010,7 @@
       </w:rPr>
     </w:lvl>
   </w:abstractNum>
-  <w:abstractNum w:abstractNumId="33" w15:restartNumberingAfterBreak="0">
+  <w:abstractNum w:abstractNumId="36" w15:restartNumberingAfterBreak="0">
     <w:nsid w:val="6D9E2373"/>
     <w:multiLevelType w:val="multilevel"/>
     <w:tmpl w:val="7798721C"/>
@@ -13525,7 +14159,7 @@
       </w:rPr>
     </w:lvl>
   </w:abstractNum>
-  <w:abstractNum w:abstractNumId="34" w15:restartNumberingAfterBreak="0">
+  <w:abstractNum w:abstractNumId="37" w15:restartNumberingAfterBreak="0">
     <w:nsid w:val="71A226AB"/>
     <w:multiLevelType w:val="hybridMultilevel"/>
     <w:tmpl w:val="4EC0872C"/>
@@ -13611,7 +14245,7 @@
       </w:pPr>
     </w:lvl>
   </w:abstractNum>
-  <w:abstractNum w:abstractNumId="35" w15:restartNumberingAfterBreak="0">
+  <w:abstractNum w:abstractNumId="38" w15:restartNumberingAfterBreak="0">
     <w:nsid w:val="76492344"/>
     <w:multiLevelType w:val="multilevel"/>
     <w:tmpl w:val="5526F338"/>
@@ -13760,7 +14394,7 @@
       </w:rPr>
     </w:lvl>
   </w:abstractNum>
-  <w:abstractNum w:abstractNumId="36" w15:restartNumberingAfterBreak="0">
+  <w:abstractNum w:abstractNumId="39" w15:restartNumberingAfterBreak="0">
     <w:nsid w:val="7AF96EBD"/>
     <w:multiLevelType w:val="multilevel"/>
     <w:tmpl w:val="40C4EB88"/>
@@ -13909,7 +14543,7 @@
       </w:rPr>
     </w:lvl>
   </w:abstractNum>
-  <w:abstractNum w:abstractNumId="37" w15:restartNumberingAfterBreak="0">
+  <w:abstractNum w:abstractNumId="40" w15:restartNumberingAfterBreak="0">
     <w:nsid w:val="7CB5752A"/>
     <w:multiLevelType w:val="hybridMultilevel"/>
     <w:tmpl w:val="3E8855C0"/>
@@ -14022,7 +14656,7 @@
       </w:rPr>
     </w:lvl>
   </w:abstractNum>
-  <w:abstractNum w:abstractNumId="38" w15:restartNumberingAfterBreak="0">
+  <w:abstractNum w:abstractNumId="41" w15:restartNumberingAfterBreak="0">
     <w:nsid w:val="7D905054"/>
     <w:multiLevelType w:val="hybridMultilevel"/>
     <w:tmpl w:val="9CB40FDE"/>
@@ -14135,7 +14769,7 @@
       </w:rPr>
     </w:lvl>
   </w:abstractNum>
-  <w:abstractNum w:abstractNumId="39" w15:restartNumberingAfterBreak="0">
+  <w:abstractNum w:abstractNumId="42" w15:restartNumberingAfterBreak="0">
     <w:nsid w:val="7E764224"/>
     <w:multiLevelType w:val="multilevel"/>
     <w:tmpl w:val="5248F0BA"/>
@@ -14288,7 +14922,7 @@
     <w:abstractNumId w:val="1"/>
   </w:num>
   <w:num w:numId="2">
-    <w:abstractNumId w:val="32"/>
+    <w:abstractNumId w:val="35"/>
   </w:num>
   <w:num w:numId="3">
     <w:abstractNumId w:val="1"/>
@@ -14321,7 +14955,7 @@
     </w:lvlOverride>
   </w:num>
   <w:num w:numId="4">
-    <w:abstractNumId w:val="19"/>
+    <w:abstractNumId w:val="20"/>
     <w:lvlOverride w:ilvl="0">
       <w:startOverride w:val="1"/>
     </w:lvlOverride>
@@ -14381,13 +15015,13 @@
     </w:lvlOverride>
   </w:num>
   <w:num w:numId="6">
-    <w:abstractNumId w:val="30"/>
+    <w:abstractNumId w:val="33"/>
   </w:num>
   <w:num w:numId="7">
-    <w:abstractNumId w:val="29"/>
+    <w:abstractNumId w:val="32"/>
   </w:num>
   <w:num w:numId="8">
-    <w:abstractNumId w:val="27"/>
+    <w:abstractNumId w:val="29"/>
   </w:num>
   <w:num w:numId="9">
     <w:abstractNumId w:val="14"/>
@@ -14432,73 +15066,73 @@
     </w:lvlOverride>
   </w:num>
   <w:num w:numId="14">
-    <w:abstractNumId w:val="15"/>
+    <w:abstractNumId w:val="16"/>
   </w:num>
   <w:num w:numId="15">
-    <w:abstractNumId w:val="33"/>
+    <w:abstractNumId w:val="36"/>
   </w:num>
   <w:num w:numId="16">
     <w:abstractNumId w:val="4"/>
   </w:num>
   <w:num w:numId="17">
-    <w:abstractNumId w:val="31"/>
+    <w:abstractNumId w:val="34"/>
   </w:num>
   <w:num w:numId="18">
     <w:abstractNumId w:val="2"/>
   </w:num>
   <w:num w:numId="19">
-    <w:abstractNumId w:val="18"/>
+    <w:abstractNumId w:val="19"/>
   </w:num>
   <w:num w:numId="20">
-    <w:abstractNumId w:val="37"/>
+    <w:abstractNumId w:val="40"/>
   </w:num>
   <w:num w:numId="21">
-    <w:abstractNumId w:val="16"/>
+    <w:abstractNumId w:val="17"/>
   </w:num>
   <w:num w:numId="22">
-    <w:abstractNumId w:val="39"/>
+    <w:abstractNumId w:val="42"/>
   </w:num>
   <w:num w:numId="23">
-    <w:abstractNumId w:val="23"/>
+    <w:abstractNumId w:val="25"/>
   </w:num>
   <w:num w:numId="24">
     <w:abstractNumId w:val="7"/>
   </w:num>
   <w:num w:numId="25">
-    <w:abstractNumId w:val="28"/>
+    <w:abstractNumId w:val="31"/>
   </w:num>
   <w:num w:numId="26">
     <w:abstractNumId w:val="10"/>
   </w:num>
   <w:num w:numId="27">
-    <w:abstractNumId w:val="35"/>
+    <w:abstractNumId w:val="38"/>
   </w:num>
   <w:num w:numId="28">
-    <w:abstractNumId w:val="22"/>
+    <w:abstractNumId w:val="23"/>
   </w:num>
   <w:num w:numId="29">
-    <w:abstractNumId w:val="17"/>
+    <w:abstractNumId w:val="18"/>
   </w:num>
   <w:num w:numId="30">
-    <w:abstractNumId w:val="20"/>
+    <w:abstractNumId w:val="21"/>
   </w:num>
   <w:num w:numId="31">
     <w:abstractNumId w:val="3"/>
   </w:num>
   <w:num w:numId="32">
-    <w:abstractNumId w:val="38"/>
+    <w:abstractNumId w:val="41"/>
   </w:num>
   <w:num w:numId="33">
-    <w:abstractNumId w:val="26"/>
+    <w:abstractNumId w:val="28"/>
   </w:num>
   <w:num w:numId="34">
-    <w:abstractNumId w:val="36"/>
+    <w:abstractNumId w:val="39"/>
   </w:num>
   <w:num w:numId="35">
     <w:abstractNumId w:val="6"/>
   </w:num>
   <w:num w:numId="36">
-    <w:abstractNumId w:val="24"/>
+    <w:abstractNumId w:val="26"/>
   </w:num>
   <w:num w:numId="37">
     <w:abstractNumId w:val="0"/>
@@ -14507,16 +15141,25 @@
     <w:abstractNumId w:val="11"/>
   </w:num>
   <w:num w:numId="39">
-    <w:abstractNumId w:val="25"/>
+    <w:abstractNumId w:val="27"/>
   </w:num>
   <w:num w:numId="40">
-    <w:abstractNumId w:val="21"/>
+    <w:abstractNumId w:val="22"/>
   </w:num>
   <w:num w:numId="41">
     <w:abstractNumId w:val="8"/>
   </w:num>
   <w:num w:numId="42">
-    <w:abstractNumId w:val="34"/>
+    <w:abstractNumId w:val="37"/>
+  </w:num>
+  <w:num w:numId="43">
+    <w:abstractNumId w:val="24"/>
+  </w:num>
+  <w:num w:numId="44">
+    <w:abstractNumId w:val="15"/>
+  </w:num>
+  <w:num w:numId="45">
+    <w:abstractNumId w:val="30"/>
   </w:num>
 </w:numbering>
 </file>
@@ -14933,7 +15576,6 @@
         <w:numId w:val="1"/>
       </w:numPr>
       <w:spacing w:line="360" w:lineRule="auto"/>
-      <w:ind w:left="786"/>
       <w:outlineLvl w:val="0"/>
     </w:pPr>
     <w:rPr>

</xml_diff>

<commit_message>
doc10 / registro de riesgos inicial
</commit_message>
<xml_diff>
--- a/DocumentoCompProyectoMercados_GCC.docx
+++ b/DocumentoCompProyectoMercados_GCC.docx
@@ -8817,451 +8817,1153 @@
     </w:p>
     <w:p>
       <w:pPr>
-        <w:rPr>
-          <w:lang w:val="es-ES"/>
-        </w:rPr>
-      </w:pPr>
-    </w:p>
-    <w:p>
-      <w:pPr>
-        <w:rPr>
-          <w:lang w:val="es-ES"/>
-        </w:rPr>
-      </w:pPr>
-    </w:p>
-    <w:p>
-      <w:pPr>
-        <w:pStyle w:val="Prrafodelista"/>
+        <w:pStyle w:val="Ttulo1"/>
+      </w:pPr>
+      <w:r>
+        <w:t>REGISTRO</w:t>
+      </w:r>
+      <w:r>
+        <w:t xml:space="preserve"> </w:t>
+      </w:r>
+      <w:r>
+        <w:t>DE</w:t>
+      </w:r>
+      <w:r>
+        <w:t xml:space="preserve"> R</w:t>
+      </w:r>
+      <w:r>
+        <w:t>IESGOS</w:t>
+      </w:r>
+      <w:r>
+        <w:t xml:space="preserve"> I</w:t>
+      </w:r>
+      <w:r>
+        <w:t>NICIAL</w:t>
+      </w:r>
+      <w:r>
+        <w:t xml:space="preserve"> (L</w:t>
+      </w:r>
+      <w:r>
+        <w:t>ÍNEA</w:t>
+      </w:r>
+      <w:r>
+        <w:t xml:space="preserve"> B</w:t>
+      </w:r>
+      <w:r>
+        <w:t>ASE</w:t>
+      </w:r>
+      <w:r>
+        <w:t>)</w:t>
+      </w:r>
+    </w:p>
+    <w:p>
+      <w:pPr>
+        <w:ind w:left="360"/>
+        <w:rPr>
+          <w:rFonts w:ascii="Arial" w:hAnsi="Arial" w:cs="Arial"/>
+          <w:lang w:val="es-ES"/>
+        </w:rPr>
+      </w:pPr>
+      <w:r>
+        <w:rPr>
+          <w:rFonts w:ascii="Arial" w:hAnsi="Arial" w:cs="Arial"/>
+          <w:lang w:val="es-ES"/>
+        </w:rPr>
+        <w:t>Este documento identifica de forma proactiva los riesgos potenciales al inicio del proyecto, estableciendo planes de mitigación y contingencia antes de comenzar la fase de desarrollo.</w:t>
+      </w:r>
+    </w:p>
+    <w:p>
+      <w:pPr>
+        <w:pStyle w:val="Ttulo2"/>
+      </w:pPr>
+      <w:r>
+        <w:t>Matriz de Riesgos Inicial</w:t>
+      </w:r>
+    </w:p>
+    <w:tbl>
+      <w:tblPr>
+        <w:tblStyle w:val="Tablaconcuadrcula"/>
+        <w:tblW w:w="9776" w:type="dxa"/>
+        <w:tblLayout w:type="fixed"/>
+        <w:tblLook w:val="04A0" w:firstRow="1" w:lastRow="0" w:firstColumn="1" w:lastColumn="0" w:noHBand="0" w:noVBand="1"/>
+      </w:tblPr>
+      <w:tblGrid>
+        <w:gridCol w:w="704"/>
+        <w:gridCol w:w="1707"/>
+        <w:gridCol w:w="1270"/>
+        <w:gridCol w:w="1559"/>
+        <w:gridCol w:w="1134"/>
+        <w:gridCol w:w="1559"/>
+        <w:gridCol w:w="1843"/>
+      </w:tblGrid>
+      <w:tr>
+        <w:tc>
+          <w:tcPr>
+            <w:tcW w:w="704" w:type="dxa"/>
+            <w:hideMark/>
+          </w:tcPr>
+          <w:p>
+            <w:pPr>
+              <w:spacing w:after="160" w:line="259" w:lineRule="auto"/>
+              <w:rPr>
+                <w:rFonts w:ascii="Arial" w:hAnsi="Arial" w:cs="Arial"/>
+                <w:b/>
+                <w:bCs/>
+                <w:lang w:val="es-ES"/>
+              </w:rPr>
+            </w:pPr>
+            <w:r>
+              <w:rPr>
+                <w:rFonts w:ascii="Arial" w:hAnsi="Arial" w:cs="Arial"/>
+                <w:b/>
+                <w:bCs/>
+                <w:lang w:val="es-ES"/>
+              </w:rPr>
+              <w:t>ID</w:t>
+            </w:r>
+          </w:p>
+        </w:tc>
+        <w:tc>
+          <w:tcPr>
+            <w:tcW w:w="1707" w:type="dxa"/>
+            <w:hideMark/>
+          </w:tcPr>
+          <w:p>
+            <w:pPr>
+              <w:spacing w:after="160" w:line="259" w:lineRule="auto"/>
+              <w:rPr>
+                <w:rFonts w:ascii="Arial" w:hAnsi="Arial" w:cs="Arial"/>
+                <w:b/>
+                <w:bCs/>
+                <w:lang w:val="es-ES"/>
+              </w:rPr>
+            </w:pPr>
+            <w:r>
+              <w:rPr>
+                <w:rFonts w:ascii="Arial" w:hAnsi="Arial" w:cs="Arial"/>
+                <w:b/>
+                <w:bCs/>
+                <w:lang w:val="es-ES"/>
+              </w:rPr>
+              <w:t>Descripción del Riesgo</w:t>
+            </w:r>
+          </w:p>
+        </w:tc>
+        <w:tc>
+          <w:tcPr>
+            <w:tcW w:w="1270" w:type="dxa"/>
+            <w:hideMark/>
+          </w:tcPr>
+          <w:p>
+            <w:pPr>
+              <w:spacing w:after="160" w:line="259" w:lineRule="auto"/>
+              <w:rPr>
+                <w:rFonts w:ascii="Arial" w:hAnsi="Arial" w:cs="Arial"/>
+                <w:b/>
+                <w:bCs/>
+                <w:lang w:val="es-ES"/>
+              </w:rPr>
+            </w:pPr>
+            <w:r>
+              <w:rPr>
+                <w:rFonts w:ascii="Arial" w:hAnsi="Arial" w:cs="Arial"/>
+                <w:b/>
+                <w:bCs/>
+                <w:lang w:val="es-ES"/>
+              </w:rPr>
+              <w:t>Categoría</w:t>
+            </w:r>
+          </w:p>
+        </w:tc>
+        <w:tc>
+          <w:tcPr>
+            <w:tcW w:w="1559" w:type="dxa"/>
+            <w:hideMark/>
+          </w:tcPr>
+          <w:p>
+            <w:pPr>
+              <w:spacing w:after="160" w:line="259" w:lineRule="auto"/>
+              <w:rPr>
+                <w:rFonts w:ascii="Arial" w:hAnsi="Arial" w:cs="Arial"/>
+                <w:b/>
+                <w:bCs/>
+                <w:lang w:val="es-ES"/>
+              </w:rPr>
+            </w:pPr>
+            <w:r>
+              <w:rPr>
+                <w:rFonts w:ascii="Arial" w:hAnsi="Arial" w:cs="Arial"/>
+                <w:b/>
+                <w:bCs/>
+                <w:lang w:val="es-ES"/>
+              </w:rPr>
+              <w:t>Probabilidad</w:t>
+            </w:r>
+          </w:p>
+        </w:tc>
+        <w:tc>
+          <w:tcPr>
+            <w:tcW w:w="1134" w:type="dxa"/>
+            <w:hideMark/>
+          </w:tcPr>
+          <w:p>
+            <w:pPr>
+              <w:spacing w:after="160" w:line="259" w:lineRule="auto"/>
+              <w:rPr>
+                <w:rFonts w:ascii="Arial" w:hAnsi="Arial" w:cs="Arial"/>
+                <w:b/>
+                <w:bCs/>
+                <w:lang w:val="es-ES"/>
+              </w:rPr>
+            </w:pPr>
+            <w:r>
+              <w:rPr>
+                <w:rFonts w:ascii="Arial" w:hAnsi="Arial" w:cs="Arial"/>
+                <w:b/>
+                <w:bCs/>
+                <w:lang w:val="es-ES"/>
+              </w:rPr>
+              <w:t>Impacto</w:t>
+            </w:r>
+          </w:p>
+        </w:tc>
+        <w:tc>
+          <w:tcPr>
+            <w:tcW w:w="1559" w:type="dxa"/>
+            <w:hideMark/>
+          </w:tcPr>
+          <w:p>
+            <w:pPr>
+              <w:spacing w:after="160" w:line="259" w:lineRule="auto"/>
+              <w:rPr>
+                <w:rFonts w:ascii="Arial" w:hAnsi="Arial" w:cs="Arial"/>
+                <w:b/>
+                <w:bCs/>
+                <w:lang w:val="es-ES"/>
+              </w:rPr>
+            </w:pPr>
+            <w:r>
+              <w:rPr>
+                <w:rFonts w:ascii="Arial" w:hAnsi="Arial" w:cs="Arial"/>
+                <w:b/>
+                <w:bCs/>
+                <w:lang w:val="es-ES"/>
+              </w:rPr>
+              <w:t>Puntuación (</w:t>
+            </w:r>
+            <w:proofErr w:type="spellStart"/>
+            <w:r>
+              <w:rPr>
+                <w:rFonts w:ascii="Arial" w:hAnsi="Arial" w:cs="Arial"/>
+                <w:b/>
+                <w:bCs/>
+                <w:lang w:val="es-ES"/>
+              </w:rPr>
+              <w:t>PxI</w:t>
+            </w:r>
+            <w:proofErr w:type="spellEnd"/>
+            <w:r>
+              <w:rPr>
+                <w:rFonts w:ascii="Arial" w:hAnsi="Arial" w:cs="Arial"/>
+                <w:b/>
+                <w:bCs/>
+                <w:lang w:val="es-ES"/>
+              </w:rPr>
+              <w:t>)</w:t>
+            </w:r>
+          </w:p>
+        </w:tc>
+        <w:tc>
+          <w:tcPr>
+            <w:tcW w:w="1843" w:type="dxa"/>
+            <w:hideMark/>
+          </w:tcPr>
+          <w:p>
+            <w:pPr>
+              <w:spacing w:after="160" w:line="259" w:lineRule="auto"/>
+              <w:rPr>
+                <w:rFonts w:ascii="Arial" w:hAnsi="Arial" w:cs="Arial"/>
+                <w:b/>
+                <w:bCs/>
+                <w:lang w:val="es-ES"/>
+              </w:rPr>
+            </w:pPr>
+            <w:r>
+              <w:rPr>
+                <w:rFonts w:ascii="Arial" w:hAnsi="Arial" w:cs="Arial"/>
+                <w:b/>
+                <w:bCs/>
+                <w:lang w:val="es-ES"/>
+              </w:rPr>
+              <w:t>Plan de Mitigación / Acción Preventiva</w:t>
+            </w:r>
+          </w:p>
+        </w:tc>
+      </w:tr>
+      <w:tr>
+        <w:tc>
+          <w:tcPr>
+            <w:tcW w:w="704" w:type="dxa"/>
+            <w:hideMark/>
+          </w:tcPr>
+          <w:p>
+            <w:pPr>
+              <w:spacing w:after="160" w:line="259" w:lineRule="auto"/>
+              <w:rPr>
+                <w:rFonts w:ascii="Arial" w:hAnsi="Arial" w:cs="Arial"/>
+                <w:lang w:val="es-ES"/>
+              </w:rPr>
+            </w:pPr>
+            <w:r>
+              <w:rPr>
+                <w:rFonts w:ascii="Arial" w:hAnsi="Arial" w:cs="Arial"/>
+                <w:b/>
+                <w:bCs/>
+                <w:lang w:val="es-ES"/>
+              </w:rPr>
+              <w:t>R-01</w:t>
+            </w:r>
+          </w:p>
+        </w:tc>
+        <w:tc>
+          <w:tcPr>
+            <w:tcW w:w="1707" w:type="dxa"/>
+            <w:hideMark/>
+          </w:tcPr>
+          <w:p>
+            <w:pPr>
+              <w:spacing w:after="160" w:line="259" w:lineRule="auto"/>
+              <w:rPr>
+                <w:rFonts w:ascii="Arial" w:hAnsi="Arial" w:cs="Arial"/>
+                <w:lang w:val="es-ES"/>
+              </w:rPr>
+            </w:pPr>
+            <w:r>
+              <w:rPr>
+                <w:rFonts w:ascii="Arial" w:hAnsi="Arial" w:cs="Arial"/>
+                <w:lang w:val="es-ES"/>
+              </w:rPr>
+              <w:t>Cambios drásticos o adición de requisitos fuera del alcance original por parte de la Alcaldía.</w:t>
+            </w:r>
+          </w:p>
+        </w:tc>
+        <w:tc>
+          <w:tcPr>
+            <w:tcW w:w="1270" w:type="dxa"/>
+            <w:hideMark/>
+          </w:tcPr>
+          <w:p>
+            <w:pPr>
+              <w:spacing w:after="160" w:line="259" w:lineRule="auto"/>
+              <w:rPr>
+                <w:rFonts w:ascii="Arial" w:hAnsi="Arial" w:cs="Arial"/>
+                <w:lang w:val="es-ES"/>
+              </w:rPr>
+            </w:pPr>
+            <w:r>
+              <w:rPr>
+                <w:rFonts w:ascii="Arial" w:hAnsi="Arial" w:cs="Arial"/>
+                <w:lang w:val="es-ES"/>
+              </w:rPr>
+              <w:t>Alcance</w:t>
+            </w:r>
+          </w:p>
+        </w:tc>
+        <w:tc>
+          <w:tcPr>
+            <w:tcW w:w="1559" w:type="dxa"/>
+            <w:hideMark/>
+          </w:tcPr>
+          <w:p>
+            <w:pPr>
+              <w:spacing w:after="160" w:line="259" w:lineRule="auto"/>
+              <w:rPr>
+                <w:rFonts w:ascii="Arial" w:hAnsi="Arial" w:cs="Arial"/>
+                <w:lang w:val="es-ES"/>
+              </w:rPr>
+            </w:pPr>
+            <w:r>
+              <w:rPr>
+                <w:rFonts w:ascii="Arial" w:hAnsi="Arial" w:cs="Arial"/>
+                <w:lang w:val="es-ES"/>
+              </w:rPr>
+              <w:t>Alta</w:t>
+            </w:r>
+          </w:p>
+        </w:tc>
+        <w:tc>
+          <w:tcPr>
+            <w:tcW w:w="1134" w:type="dxa"/>
+            <w:hideMark/>
+          </w:tcPr>
+          <w:p>
+            <w:pPr>
+              <w:spacing w:after="160" w:line="259" w:lineRule="auto"/>
+              <w:rPr>
+                <w:rFonts w:ascii="Arial" w:hAnsi="Arial" w:cs="Arial"/>
+                <w:lang w:val="es-ES"/>
+              </w:rPr>
+            </w:pPr>
+            <w:r>
+              <w:rPr>
+                <w:rFonts w:ascii="Arial" w:hAnsi="Arial" w:cs="Arial"/>
+                <w:lang w:val="es-ES"/>
+              </w:rPr>
+              <w:t>Medio</w:t>
+            </w:r>
+          </w:p>
+        </w:tc>
+        <w:tc>
+          <w:tcPr>
+            <w:tcW w:w="1559" w:type="dxa"/>
+            <w:hideMark/>
+          </w:tcPr>
+          <w:p>
+            <w:pPr>
+              <w:spacing w:after="160" w:line="259" w:lineRule="auto"/>
+              <w:rPr>
+                <w:rFonts w:ascii="Arial" w:hAnsi="Arial" w:cs="Arial"/>
+                <w:lang w:val="es-ES"/>
+              </w:rPr>
+            </w:pPr>
+            <w:r>
+              <w:rPr>
+                <w:rFonts w:ascii="Arial" w:hAnsi="Arial" w:cs="Arial"/>
+                <w:b/>
+                <w:bCs/>
+                <w:lang w:val="es-ES"/>
+              </w:rPr>
+              <w:t>Alto</w:t>
+            </w:r>
+          </w:p>
+        </w:tc>
+        <w:tc>
+          <w:tcPr>
+            <w:tcW w:w="1843" w:type="dxa"/>
+            <w:hideMark/>
+          </w:tcPr>
+          <w:p>
+            <w:pPr>
+              <w:spacing w:after="160" w:line="259" w:lineRule="auto"/>
+              <w:rPr>
+                <w:rFonts w:ascii="Arial" w:hAnsi="Arial" w:cs="Arial"/>
+                <w:lang w:val="es-ES"/>
+              </w:rPr>
+            </w:pPr>
+            <w:r>
+              <w:rPr>
+                <w:rFonts w:ascii="Arial" w:hAnsi="Arial" w:cs="Arial"/>
+                <w:lang w:val="es-ES"/>
+              </w:rPr>
+              <w:t>Establecer un proceso rígido de control de cambios desde el día 1 con firmas de aprobación del patrocinador.</w:t>
+            </w:r>
+          </w:p>
+        </w:tc>
+      </w:tr>
+      <w:tr>
+        <w:tc>
+          <w:tcPr>
+            <w:tcW w:w="704" w:type="dxa"/>
+            <w:hideMark/>
+          </w:tcPr>
+          <w:p>
+            <w:pPr>
+              <w:spacing w:after="160" w:line="259" w:lineRule="auto"/>
+              <w:rPr>
+                <w:rFonts w:ascii="Arial" w:hAnsi="Arial" w:cs="Arial"/>
+                <w:lang w:val="es-ES"/>
+              </w:rPr>
+            </w:pPr>
+            <w:r>
+              <w:rPr>
+                <w:rFonts w:ascii="Arial" w:hAnsi="Arial" w:cs="Arial"/>
+                <w:b/>
+                <w:bCs/>
+                <w:lang w:val="es-ES"/>
+              </w:rPr>
+              <w:t>R-02</w:t>
+            </w:r>
+          </w:p>
+        </w:tc>
+        <w:tc>
+          <w:tcPr>
+            <w:tcW w:w="1707" w:type="dxa"/>
+            <w:hideMark/>
+          </w:tcPr>
+          <w:p>
+            <w:pPr>
+              <w:spacing w:after="160" w:line="259" w:lineRule="auto"/>
+              <w:rPr>
+                <w:rFonts w:ascii="Arial" w:hAnsi="Arial" w:cs="Arial"/>
+                <w:lang w:val="es-ES"/>
+              </w:rPr>
+            </w:pPr>
+            <w:r>
+              <w:rPr>
+                <w:rFonts w:ascii="Arial" w:hAnsi="Arial" w:cs="Arial"/>
+                <w:b/>
+                <w:bCs/>
+                <w:lang w:val="es-ES"/>
+              </w:rPr>
+              <w:t>Renuncia de personal técnico clave (Desarrolladores Senior) durante la fase de desarrollo.</w:t>
+            </w:r>
+          </w:p>
+        </w:tc>
+        <w:tc>
+          <w:tcPr>
+            <w:tcW w:w="1270" w:type="dxa"/>
+            <w:hideMark/>
+          </w:tcPr>
+          <w:p>
+            <w:pPr>
+              <w:spacing w:after="160" w:line="259" w:lineRule="auto"/>
+              <w:rPr>
+                <w:rFonts w:ascii="Arial" w:hAnsi="Arial" w:cs="Arial"/>
+                <w:lang w:val="es-ES"/>
+              </w:rPr>
+            </w:pPr>
+            <w:r>
+              <w:rPr>
+                <w:rFonts w:ascii="Arial" w:hAnsi="Arial" w:cs="Arial"/>
+                <w:b/>
+                <w:bCs/>
+                <w:lang w:val="es-ES"/>
+              </w:rPr>
+              <w:t>Recursos H.</w:t>
+            </w:r>
+          </w:p>
+        </w:tc>
+        <w:tc>
+          <w:tcPr>
+            <w:tcW w:w="1559" w:type="dxa"/>
+            <w:hideMark/>
+          </w:tcPr>
+          <w:p>
+            <w:pPr>
+              <w:spacing w:after="160" w:line="259" w:lineRule="auto"/>
+              <w:rPr>
+                <w:rFonts w:ascii="Arial" w:hAnsi="Arial" w:cs="Arial"/>
+                <w:lang w:val="es-ES"/>
+              </w:rPr>
+            </w:pPr>
+            <w:r>
+              <w:rPr>
+                <w:rFonts w:ascii="Arial" w:hAnsi="Arial" w:cs="Arial"/>
+                <w:b/>
+                <w:bCs/>
+                <w:lang w:val="es-ES"/>
+              </w:rPr>
+              <w:t>Media</w:t>
+            </w:r>
+          </w:p>
+        </w:tc>
+        <w:tc>
+          <w:tcPr>
+            <w:tcW w:w="1134" w:type="dxa"/>
+            <w:hideMark/>
+          </w:tcPr>
+          <w:p>
+            <w:pPr>
+              <w:spacing w:after="160" w:line="259" w:lineRule="auto"/>
+              <w:rPr>
+                <w:rFonts w:ascii="Arial" w:hAnsi="Arial" w:cs="Arial"/>
+                <w:lang w:val="es-ES"/>
+              </w:rPr>
+            </w:pPr>
+            <w:r>
+              <w:rPr>
+                <w:rFonts w:ascii="Arial" w:hAnsi="Arial" w:cs="Arial"/>
+                <w:b/>
+                <w:bCs/>
+                <w:lang w:val="es-ES"/>
+              </w:rPr>
+              <w:t>Alto</w:t>
+            </w:r>
+          </w:p>
+        </w:tc>
+        <w:tc>
+          <w:tcPr>
+            <w:tcW w:w="1559" w:type="dxa"/>
+            <w:hideMark/>
+          </w:tcPr>
+          <w:p>
+            <w:pPr>
+              <w:spacing w:after="160" w:line="259" w:lineRule="auto"/>
+              <w:rPr>
+                <w:rFonts w:ascii="Arial" w:hAnsi="Arial" w:cs="Arial"/>
+                <w:lang w:val="es-ES"/>
+              </w:rPr>
+            </w:pPr>
+            <w:r>
+              <w:rPr>
+                <w:rFonts w:ascii="Arial" w:hAnsi="Arial" w:cs="Arial"/>
+                <w:b/>
+                <w:bCs/>
+                <w:lang w:val="es-ES"/>
+              </w:rPr>
+              <w:t>Alto</w:t>
+            </w:r>
+          </w:p>
+        </w:tc>
+        <w:tc>
+          <w:tcPr>
+            <w:tcW w:w="1843" w:type="dxa"/>
+            <w:hideMark/>
+          </w:tcPr>
+          <w:p>
+            <w:pPr>
+              <w:spacing w:after="160" w:line="259" w:lineRule="auto"/>
+              <w:rPr>
+                <w:rFonts w:ascii="Arial" w:hAnsi="Arial" w:cs="Arial"/>
+                <w:lang w:val="es-ES"/>
+              </w:rPr>
+            </w:pPr>
+            <w:r>
+              <w:rPr>
+                <w:rFonts w:ascii="Arial" w:hAnsi="Arial" w:cs="Arial"/>
+                <w:b/>
+                <w:bCs/>
+                <w:lang w:val="es-ES"/>
+              </w:rPr>
+              <w:t>Mitigación:</w:t>
+            </w:r>
+            <w:r>
+              <w:rPr>
+                <w:rFonts w:ascii="Arial" w:hAnsi="Arial" w:cs="Arial"/>
+                <w:lang w:val="es-ES"/>
+              </w:rPr>
+              <w:t xml:space="preserve"> Documentar el código diariamente usando Git, mantener estándares de arquitectura claros y asegurar que los desarrolladores Junior participen en la revisión de código para evitar silos de conocimiento.</w:t>
+            </w:r>
+          </w:p>
+        </w:tc>
+      </w:tr>
+      <w:tr>
+        <w:tc>
+          <w:tcPr>
+            <w:tcW w:w="704" w:type="dxa"/>
+            <w:hideMark/>
+          </w:tcPr>
+          <w:p>
+            <w:pPr>
+              <w:spacing w:after="160" w:line="259" w:lineRule="auto"/>
+              <w:rPr>
+                <w:rFonts w:ascii="Arial" w:hAnsi="Arial" w:cs="Arial"/>
+                <w:lang w:val="es-ES"/>
+              </w:rPr>
+            </w:pPr>
+            <w:r>
+              <w:rPr>
+                <w:rFonts w:ascii="Arial" w:hAnsi="Arial" w:cs="Arial"/>
+                <w:b/>
+                <w:bCs/>
+                <w:lang w:val="es-ES"/>
+              </w:rPr>
+              <w:lastRenderedPageBreak/>
+              <w:t>R-03</w:t>
+            </w:r>
+          </w:p>
+        </w:tc>
+        <w:tc>
+          <w:tcPr>
+            <w:tcW w:w="1707" w:type="dxa"/>
+            <w:hideMark/>
+          </w:tcPr>
+          <w:p>
+            <w:pPr>
+              <w:spacing w:after="160" w:line="259" w:lineRule="auto"/>
+              <w:rPr>
+                <w:rFonts w:ascii="Arial" w:hAnsi="Arial" w:cs="Arial"/>
+                <w:lang w:val="es-ES"/>
+              </w:rPr>
+            </w:pPr>
+            <w:r>
+              <w:rPr>
+                <w:rFonts w:ascii="Arial" w:hAnsi="Arial" w:cs="Arial"/>
+                <w:lang w:val="es-ES"/>
+              </w:rPr>
+              <w:t>Modificaciones repentinas en las normativas municipales de licencias sanitarias.</w:t>
+            </w:r>
+          </w:p>
+        </w:tc>
+        <w:tc>
+          <w:tcPr>
+            <w:tcW w:w="1270" w:type="dxa"/>
+            <w:hideMark/>
+          </w:tcPr>
+          <w:p>
+            <w:pPr>
+              <w:spacing w:after="160" w:line="259" w:lineRule="auto"/>
+              <w:rPr>
+                <w:rFonts w:ascii="Arial" w:hAnsi="Arial" w:cs="Arial"/>
+                <w:lang w:val="es-ES"/>
+              </w:rPr>
+            </w:pPr>
+            <w:r>
+              <w:rPr>
+                <w:rFonts w:ascii="Arial" w:hAnsi="Arial" w:cs="Arial"/>
+                <w:lang w:val="es-ES"/>
+              </w:rPr>
+              <w:t>Legal</w:t>
+            </w:r>
+          </w:p>
+        </w:tc>
+        <w:tc>
+          <w:tcPr>
+            <w:tcW w:w="1559" w:type="dxa"/>
+            <w:hideMark/>
+          </w:tcPr>
+          <w:p>
+            <w:pPr>
+              <w:spacing w:after="160" w:line="259" w:lineRule="auto"/>
+              <w:rPr>
+                <w:rFonts w:ascii="Arial" w:hAnsi="Arial" w:cs="Arial"/>
+                <w:lang w:val="es-ES"/>
+              </w:rPr>
+            </w:pPr>
+            <w:r>
+              <w:rPr>
+                <w:rFonts w:ascii="Arial" w:hAnsi="Arial" w:cs="Arial"/>
+                <w:lang w:val="es-ES"/>
+              </w:rPr>
+              <w:t>Media</w:t>
+            </w:r>
+          </w:p>
+        </w:tc>
+        <w:tc>
+          <w:tcPr>
+            <w:tcW w:w="1134" w:type="dxa"/>
+            <w:hideMark/>
+          </w:tcPr>
+          <w:p>
+            <w:pPr>
+              <w:spacing w:after="160" w:line="259" w:lineRule="auto"/>
+              <w:rPr>
+                <w:rFonts w:ascii="Arial" w:hAnsi="Arial" w:cs="Arial"/>
+                <w:lang w:val="es-ES"/>
+              </w:rPr>
+            </w:pPr>
+            <w:r>
+              <w:rPr>
+                <w:rFonts w:ascii="Arial" w:hAnsi="Arial" w:cs="Arial"/>
+                <w:lang w:val="es-ES"/>
+              </w:rPr>
+              <w:t>Medio</w:t>
+            </w:r>
+          </w:p>
+        </w:tc>
+        <w:tc>
+          <w:tcPr>
+            <w:tcW w:w="1559" w:type="dxa"/>
+            <w:hideMark/>
+          </w:tcPr>
+          <w:p>
+            <w:pPr>
+              <w:spacing w:after="160" w:line="259" w:lineRule="auto"/>
+              <w:rPr>
+                <w:rFonts w:ascii="Arial" w:hAnsi="Arial" w:cs="Arial"/>
+                <w:lang w:val="es-ES"/>
+              </w:rPr>
+            </w:pPr>
+            <w:r>
+              <w:rPr>
+                <w:rFonts w:ascii="Arial" w:hAnsi="Arial" w:cs="Arial"/>
+                <w:b/>
+                <w:bCs/>
+                <w:lang w:val="es-ES"/>
+              </w:rPr>
+              <w:t>Medio</w:t>
+            </w:r>
+          </w:p>
+        </w:tc>
+        <w:tc>
+          <w:tcPr>
+            <w:tcW w:w="1843" w:type="dxa"/>
+            <w:hideMark/>
+          </w:tcPr>
+          <w:p>
+            <w:pPr>
+              <w:spacing w:after="160" w:line="259" w:lineRule="auto"/>
+              <w:rPr>
+                <w:rFonts w:ascii="Arial" w:hAnsi="Arial" w:cs="Arial"/>
+                <w:lang w:val="es-ES"/>
+              </w:rPr>
+            </w:pPr>
+            <w:r>
+              <w:rPr>
+                <w:rFonts w:ascii="Arial" w:hAnsi="Arial" w:cs="Arial"/>
+                <w:lang w:val="es-ES"/>
+              </w:rPr>
+              <w:t>Mantener reuniones quincenales con el equipo legal de la Dirección de Ingresos para prever cambios normativos.</w:t>
+            </w:r>
+          </w:p>
+        </w:tc>
+      </w:tr>
+      <w:tr>
+        <w:tc>
+          <w:tcPr>
+            <w:tcW w:w="704" w:type="dxa"/>
+            <w:hideMark/>
+          </w:tcPr>
+          <w:p>
+            <w:pPr>
+              <w:spacing w:after="160" w:line="259" w:lineRule="auto"/>
+              <w:rPr>
+                <w:rFonts w:ascii="Arial" w:hAnsi="Arial" w:cs="Arial"/>
+                <w:lang w:val="es-ES"/>
+              </w:rPr>
+            </w:pPr>
+            <w:r>
+              <w:rPr>
+                <w:rFonts w:ascii="Arial" w:hAnsi="Arial" w:cs="Arial"/>
+                <w:b/>
+                <w:bCs/>
+                <w:lang w:val="es-ES"/>
+              </w:rPr>
+              <w:t>R-04</w:t>
+            </w:r>
+          </w:p>
+        </w:tc>
+        <w:tc>
+          <w:tcPr>
+            <w:tcW w:w="1707" w:type="dxa"/>
+            <w:hideMark/>
+          </w:tcPr>
+          <w:p>
+            <w:pPr>
+              <w:spacing w:after="160" w:line="259" w:lineRule="auto"/>
+              <w:rPr>
+                <w:rFonts w:ascii="Arial" w:hAnsi="Arial" w:cs="Arial"/>
+                <w:lang w:val="es-ES"/>
+              </w:rPr>
+            </w:pPr>
+            <w:r>
+              <w:rPr>
+                <w:rFonts w:ascii="Arial" w:hAnsi="Arial" w:cs="Arial"/>
+                <w:lang w:val="es-ES"/>
+              </w:rPr>
+              <w:t>Resistencia de los comerciantes de los mercados a registrarse en la plataforma digital.</w:t>
+            </w:r>
+          </w:p>
+        </w:tc>
+        <w:tc>
+          <w:tcPr>
+            <w:tcW w:w="1270" w:type="dxa"/>
+            <w:hideMark/>
+          </w:tcPr>
+          <w:p>
+            <w:pPr>
+              <w:spacing w:after="160" w:line="259" w:lineRule="auto"/>
+              <w:rPr>
+                <w:rFonts w:ascii="Arial" w:hAnsi="Arial" w:cs="Arial"/>
+                <w:lang w:val="es-ES"/>
+              </w:rPr>
+            </w:pPr>
+            <w:r>
+              <w:rPr>
+                <w:rFonts w:ascii="Arial" w:hAnsi="Arial" w:cs="Arial"/>
+                <w:lang w:val="es-ES"/>
+              </w:rPr>
+              <w:t>Social</w:t>
+            </w:r>
+          </w:p>
+        </w:tc>
+        <w:tc>
+          <w:tcPr>
+            <w:tcW w:w="1559" w:type="dxa"/>
+            <w:hideMark/>
+          </w:tcPr>
+          <w:p>
+            <w:pPr>
+              <w:spacing w:after="160" w:line="259" w:lineRule="auto"/>
+              <w:rPr>
+                <w:rFonts w:ascii="Arial" w:hAnsi="Arial" w:cs="Arial"/>
+                <w:lang w:val="es-ES"/>
+              </w:rPr>
+            </w:pPr>
+            <w:r>
+              <w:rPr>
+                <w:rFonts w:ascii="Arial" w:hAnsi="Arial" w:cs="Arial"/>
+                <w:lang w:val="es-ES"/>
+              </w:rPr>
+              <w:t>Baja</w:t>
+            </w:r>
+          </w:p>
+        </w:tc>
+        <w:tc>
+          <w:tcPr>
+            <w:tcW w:w="1134" w:type="dxa"/>
+            <w:hideMark/>
+          </w:tcPr>
+          <w:p>
+            <w:pPr>
+              <w:spacing w:after="160" w:line="259" w:lineRule="auto"/>
+              <w:rPr>
+                <w:rFonts w:ascii="Arial" w:hAnsi="Arial" w:cs="Arial"/>
+                <w:lang w:val="es-ES"/>
+              </w:rPr>
+            </w:pPr>
+            <w:r>
+              <w:rPr>
+                <w:rFonts w:ascii="Arial" w:hAnsi="Arial" w:cs="Arial"/>
+                <w:lang w:val="es-ES"/>
+              </w:rPr>
+              <w:t>Alto</w:t>
+            </w:r>
+          </w:p>
+        </w:tc>
+        <w:tc>
+          <w:tcPr>
+            <w:tcW w:w="1559" w:type="dxa"/>
+            <w:hideMark/>
+          </w:tcPr>
+          <w:p>
+            <w:pPr>
+              <w:spacing w:after="160" w:line="259" w:lineRule="auto"/>
+              <w:rPr>
+                <w:rFonts w:ascii="Arial" w:hAnsi="Arial" w:cs="Arial"/>
+                <w:lang w:val="es-ES"/>
+              </w:rPr>
+            </w:pPr>
+            <w:r>
+              <w:rPr>
+                <w:rFonts w:ascii="Arial" w:hAnsi="Arial" w:cs="Arial"/>
+                <w:b/>
+                <w:bCs/>
+                <w:lang w:val="es-ES"/>
+              </w:rPr>
+              <w:t>Medio</w:t>
+            </w:r>
+          </w:p>
+        </w:tc>
+        <w:tc>
+          <w:tcPr>
+            <w:tcW w:w="1843" w:type="dxa"/>
+            <w:hideMark/>
+          </w:tcPr>
+          <w:p>
+            <w:pPr>
+              <w:spacing w:after="160" w:line="259" w:lineRule="auto"/>
+              <w:rPr>
+                <w:rFonts w:ascii="Arial" w:hAnsi="Arial" w:cs="Arial"/>
+                <w:lang w:val="es-ES"/>
+              </w:rPr>
+            </w:pPr>
+            <w:r>
+              <w:rPr>
+                <w:rFonts w:ascii="Arial" w:hAnsi="Arial" w:cs="Arial"/>
+                <w:lang w:val="es-ES"/>
+              </w:rPr>
+              <w:t>Coordinar con los dirigentes de los mercados (Central, Campesino, Entre Ríos) talleres de socialización y sensibilización.</w:t>
+            </w:r>
+          </w:p>
+        </w:tc>
+      </w:tr>
+    </w:tbl>
+    <w:p>
+      <w:pPr>
+        <w:rPr>
+          <w:rFonts w:ascii="Arial" w:hAnsi="Arial" w:cs="Arial"/>
+          <w:b/>
+          <w:bCs/>
+          <w:lang w:val="es-ES"/>
+        </w:rPr>
+      </w:pPr>
+    </w:p>
+    <w:p>
+      <w:pPr>
+        <w:pStyle w:val="Ttulo2"/>
+      </w:pPr>
+      <w:r>
+        <w:t>E</w:t>
+      </w:r>
+      <w:proofErr w:type="spellStart"/>
+      <w:r>
+        <w:rPr>
+          <w:rStyle w:val="Ttulo2Car"/>
+          <w:lang w:val="es-ES"/>
+        </w:rPr>
+        <w:t>strategia</w:t>
+      </w:r>
+      <w:proofErr w:type="spellEnd"/>
+      <w:r>
+        <w:rPr>
+          <w:rStyle w:val="Ttulo2Car"/>
+          <w:lang w:val="es-ES"/>
+        </w:rPr>
+        <w:t xml:space="preserve"> de Contingencia para el Riesgo R-02 (Bajas de Personal)</w:t>
+      </w:r>
+    </w:p>
+    <w:p>
+      <w:pPr>
+        <w:ind w:left="708"/>
+        <w:rPr>
+          <w:rFonts w:ascii="Arial" w:hAnsi="Arial" w:cs="Arial"/>
+          <w:lang w:val="es-ES"/>
+        </w:rPr>
+      </w:pPr>
+      <w:proofErr w:type="spellStart"/>
+      <w:r>
+        <w:rPr>
+          <w:rFonts w:ascii="Arial" w:hAnsi="Arial" w:cs="Arial"/>
+          <w:b/>
+          <w:bCs/>
+          <w:lang w:val="es-ES"/>
+        </w:rPr>
+        <w:t>Trigger</w:t>
+      </w:r>
+      <w:proofErr w:type="spellEnd"/>
+      <w:r>
+        <w:rPr>
+          <w:rFonts w:ascii="Arial" w:hAnsi="Arial" w:cs="Arial"/>
+          <w:b/>
+          <w:bCs/>
+          <w:lang w:val="es-ES"/>
+        </w:rPr>
+        <w:t>:</w:t>
+      </w:r>
+      <w:r>
+        <w:rPr>
+          <w:rFonts w:ascii="Arial" w:hAnsi="Arial" w:cs="Arial"/>
+          <w:lang w:val="es-ES"/>
+        </w:rPr>
+        <w:t xml:space="preserve"> Notificación formal de renuncia por parte de uno o más desarrolladores clave.</w:t>
+      </w:r>
+    </w:p>
+    <w:p>
+      <w:pPr>
+        <w:ind w:left="708"/>
+        <w:rPr>
+          <w:rFonts w:ascii="Arial" w:hAnsi="Arial" w:cs="Arial"/>
+          <w:lang w:val="es-ES"/>
+        </w:rPr>
+      </w:pPr>
+      <w:r>
+        <w:rPr>
+          <w:rFonts w:ascii="Arial" w:hAnsi="Arial" w:cs="Arial"/>
+          <w:b/>
+          <w:bCs/>
+          <w:lang w:val="es-ES"/>
+        </w:rPr>
+        <w:t>Acción de Contingencia:</w:t>
+      </w:r>
+    </w:p>
+    <w:p>
+      <w:pPr>
         <w:numPr>
           <w:ilvl w:val="0"/>
-          <w:numId w:val="40"/>
+          <w:numId w:val="46"/>
         </w:numPr>
-        <w:rPr>
-          <w:lang w:val="es-ES"/>
-        </w:rPr>
-      </w:pPr>
-      <w:r>
-        <w:rPr>
-          <w:lang w:val="es-ES"/>
-        </w:rPr>
-        <w:t>Acta de Constitución (ej. Al finalizar el presente documento)</w:t>
-      </w:r>
-    </w:p>
-    <w:p>
-      <w:pPr>
-        <w:pStyle w:val="Prrafodelista"/>
+        <w:tabs>
+          <w:tab w:val="clear" w:pos="720"/>
+          <w:tab w:val="num" w:pos="1428"/>
+        </w:tabs>
+        <w:ind w:left="1428"/>
+        <w:rPr>
+          <w:rFonts w:ascii="Arial" w:hAnsi="Arial" w:cs="Arial"/>
+          <w:lang w:val="es-ES"/>
+        </w:rPr>
+      </w:pPr>
+      <w:r>
+        <w:rPr>
+          <w:rFonts w:ascii="Arial" w:hAnsi="Arial" w:cs="Arial"/>
+          <w:lang w:val="es-ES"/>
+        </w:rPr>
+        <w:t>Congelar inmediatamente los entregables no críticos del sprint actual.</w:t>
+      </w:r>
+    </w:p>
+    <w:p>
+      <w:pPr>
         <w:numPr>
           <w:ilvl w:val="0"/>
-          <w:numId w:val="40"/>
+          <w:numId w:val="46"/>
         </w:numPr>
-        <w:rPr>
-          <w:lang w:val="es-ES"/>
-        </w:rPr>
-      </w:pPr>
-      <w:r>
-        <w:rPr>
-          <w:lang w:val="es-ES"/>
-        </w:rPr>
-        <w:t>Documento de Metodología (Tradicional o Ágil)</w:t>
-      </w:r>
-    </w:p>
-    <w:p>
-      <w:pPr>
-        <w:pStyle w:val="Prrafodelista"/>
+        <w:tabs>
+          <w:tab w:val="clear" w:pos="720"/>
+          <w:tab w:val="num" w:pos="1068"/>
+        </w:tabs>
+        <w:ind w:left="1428"/>
+        <w:rPr>
+          <w:rFonts w:ascii="Arial" w:hAnsi="Arial" w:cs="Arial"/>
+          <w:lang w:val="es-ES"/>
+        </w:rPr>
+      </w:pPr>
+      <w:r>
+        <w:rPr>
+          <w:rFonts w:ascii="Arial" w:hAnsi="Arial" w:cs="Arial"/>
+          <w:lang w:val="es-ES"/>
+        </w:rPr>
+        <w:t xml:space="preserve">Utilizar de forma inmediata la </w:t>
+      </w:r>
+      <w:r>
+        <w:rPr>
+          <w:rFonts w:ascii="Arial" w:hAnsi="Arial" w:cs="Arial"/>
+          <w:b/>
+          <w:bCs/>
+          <w:lang w:val="es-ES"/>
+        </w:rPr>
+        <w:t>Reserva de Contingencia Financiera (5,000 Bs)</w:t>
+      </w:r>
+      <w:r>
+        <w:rPr>
+          <w:rFonts w:ascii="Arial" w:hAnsi="Arial" w:cs="Arial"/>
+          <w:lang w:val="es-ES"/>
+        </w:rPr>
+        <w:t xml:space="preserve"> para lanzar una convocatoria de contratación de emergencia o subcontratación de un consultor externo por producto.</w:t>
+      </w:r>
+    </w:p>
+    <w:p>
+      <w:pPr>
         <w:numPr>
           <w:ilvl w:val="0"/>
-          <w:numId w:val="40"/>
+          <w:numId w:val="46"/>
         </w:numPr>
-        <w:rPr>
-          <w:lang w:val="es-ES"/>
-        </w:rPr>
-      </w:pPr>
-      <w:r>
-        <w:rPr>
-          <w:lang w:val="es-ES"/>
-        </w:rPr>
-        <w:t>Solicitud de Proyecto</w:t>
-      </w:r>
-    </w:p>
-    <w:p>
-      <w:pPr>
-        <w:pStyle w:val="Prrafodelista"/>
-        <w:numPr>
-          <w:ilvl w:val="0"/>
-          <w:numId w:val="40"/>
-        </w:numPr>
-        <w:rPr>
-          <w:lang w:val="es-ES"/>
-        </w:rPr>
-      </w:pPr>
-      <w:r>
-        <w:rPr>
-          <w:lang w:val="es-ES"/>
-        </w:rPr>
-        <w:t>Especificación de Requerimientos</w:t>
-      </w:r>
-    </w:p>
-    <w:p>
-      <w:pPr>
-        <w:pStyle w:val="Prrafodelista"/>
-        <w:numPr>
-          <w:ilvl w:val="0"/>
-          <w:numId w:val="40"/>
-        </w:numPr>
-        <w:rPr>
-          <w:lang w:val="es-ES"/>
-        </w:rPr>
-      </w:pPr>
-      <w:r>
-        <w:rPr>
-          <w:lang w:val="es-ES"/>
-        </w:rPr>
-        <w:t xml:space="preserve">Documento de </w:t>
+        <w:tabs>
+          <w:tab w:val="clear" w:pos="720"/>
+          <w:tab w:val="num" w:pos="1068"/>
+        </w:tabs>
+        <w:ind w:left="1428"/>
+        <w:rPr>
+          <w:rFonts w:ascii="Arial" w:hAnsi="Arial" w:cs="Arial"/>
+          <w:lang w:val="es-ES"/>
+        </w:rPr>
+      </w:pPr>
+      <w:r>
+        <w:rPr>
+          <w:rFonts w:ascii="Arial" w:hAnsi="Arial" w:cs="Arial"/>
+          <w:lang w:val="es-ES"/>
+        </w:rPr>
+        <w:t xml:space="preserve">Promover temporalmente al desarrollador </w:t>
       </w:r>
       <w:proofErr w:type="spellStart"/>
       <w:r>
         <w:rPr>
-          <w:lang w:val="es-ES"/>
-        </w:rPr>
-        <w:t>Inception</w:t>
+          <w:rFonts w:ascii="Arial" w:hAnsi="Arial" w:cs="Arial"/>
+          <w:lang w:val="es-ES"/>
+        </w:rPr>
+        <w:t>Mid</w:t>
       </w:r>
       <w:proofErr w:type="spellEnd"/>
-    </w:p>
-    <w:p>
-      <w:pPr>
-        <w:pStyle w:val="Prrafodelista"/>
-        <w:numPr>
-          <w:ilvl w:val="0"/>
-          <w:numId w:val="40"/>
-        </w:numPr>
-        <w:rPr>
-          <w:lang w:val="es-ES"/>
-        </w:rPr>
-      </w:pPr>
-      <w:r>
-        <w:rPr>
-          <w:lang w:val="es-ES"/>
-        </w:rPr>
-        <w:t>Matriz de Priorización</w:t>
-      </w:r>
-    </w:p>
-    <w:p>
-      <w:pPr>
-        <w:pStyle w:val="Prrafodelista"/>
-        <w:numPr>
-          <w:ilvl w:val="0"/>
-          <w:numId w:val="40"/>
-        </w:numPr>
-        <w:rPr>
-          <w:lang w:val="es-ES"/>
-        </w:rPr>
-      </w:pPr>
-      <w:r>
-        <w:rPr>
-          <w:lang w:val="es-ES"/>
-        </w:rPr>
-        <w:t>Cronograma</w:t>
-      </w:r>
-    </w:p>
-    <w:p>
-      <w:pPr>
-        <w:pStyle w:val="Prrafodelista"/>
-        <w:numPr>
-          <w:ilvl w:val="0"/>
-          <w:numId w:val="40"/>
-        </w:numPr>
-        <w:rPr>
-          <w:lang w:val="es-ES"/>
-        </w:rPr>
-      </w:pPr>
-      <w:r>
-        <w:rPr>
-          <w:lang w:val="es-ES"/>
-        </w:rPr>
-        <w:t>Presupuesto (70000bs)</w:t>
-      </w:r>
-    </w:p>
-    <w:p>
-      <w:pPr>
-        <w:pStyle w:val="Prrafodelista"/>
-        <w:numPr>
-          <w:ilvl w:val="0"/>
-          <w:numId w:val="40"/>
-        </w:numPr>
-        <w:rPr>
-          <w:lang w:val="es-ES"/>
-        </w:rPr>
-      </w:pPr>
-      <w:r>
-        <w:rPr>
-          <w:lang w:val="es-ES"/>
-        </w:rPr>
-        <w:t>Plan de Recursos (Como se dividirían)</w:t>
-      </w:r>
-    </w:p>
-    <w:p>
-      <w:pPr>
-        <w:pStyle w:val="Prrafodelista"/>
-        <w:numPr>
-          <w:ilvl w:val="0"/>
-          <w:numId w:val="40"/>
-        </w:numPr>
-        <w:rPr>
-          <w:lang w:val="es-ES"/>
-        </w:rPr>
-      </w:pPr>
-      <w:r>
-        <w:rPr>
-          <w:lang w:val="es-ES"/>
-        </w:rPr>
-        <w:t>Registro de Riesgos</w:t>
-      </w:r>
-    </w:p>
-    <w:p>
-      <w:pPr>
-        <w:pStyle w:val="Prrafodelista"/>
-        <w:numPr>
-          <w:ilvl w:val="0"/>
-          <w:numId w:val="40"/>
-        </w:numPr>
-        <w:rPr>
-          <w:lang w:val="es-ES"/>
-        </w:rPr>
-      </w:pPr>
-      <w:r>
-        <w:rPr>
-          <w:lang w:val="es-ES"/>
-        </w:rPr>
-        <w:t>Informes de Avance</w:t>
-      </w:r>
-    </w:p>
-    <w:p>
-      <w:pPr>
-        <w:pStyle w:val="Prrafodelista"/>
-        <w:numPr>
-          <w:ilvl w:val="0"/>
-          <w:numId w:val="40"/>
-        </w:numPr>
-        <w:rPr>
-          <w:lang w:val="es-ES"/>
-        </w:rPr>
-      </w:pPr>
-      <w:r>
-        <w:rPr>
-          <w:lang w:val="es-ES"/>
-        </w:rPr>
-        <w:t>Tablero de Seguimiento KPI</w:t>
-      </w:r>
-    </w:p>
-    <w:p>
-      <w:pPr>
-        <w:pStyle w:val="Prrafodelista"/>
-        <w:numPr>
-          <w:ilvl w:val="0"/>
-          <w:numId w:val="40"/>
-        </w:numPr>
-        <w:rPr>
-          <w:lang w:val="es-ES"/>
-        </w:rPr>
-      </w:pPr>
-      <w:r>
-        <w:rPr>
-          <w:lang w:val="es-ES"/>
-        </w:rPr>
-        <w:t>Registro de Incidencias</w:t>
-      </w:r>
-    </w:p>
-    <w:p>
-      <w:pPr>
-        <w:pStyle w:val="Prrafodelista"/>
-        <w:numPr>
-          <w:ilvl w:val="0"/>
-          <w:numId w:val="40"/>
-        </w:numPr>
-        <w:rPr>
-          <w:lang w:val="es-ES"/>
-        </w:rPr>
-      </w:pPr>
-      <w:r>
-        <w:rPr>
-          <w:lang w:val="es-ES"/>
-        </w:rPr>
-        <w:t>Plan de Mejora Continua</w:t>
-      </w:r>
-    </w:p>
-    <w:p>
-      <w:pPr>
-        <w:pStyle w:val="Prrafodelista"/>
-        <w:numPr>
-          <w:ilvl w:val="0"/>
-          <w:numId w:val="40"/>
-        </w:numPr>
-        <w:rPr>
-          <w:lang w:val="es-ES"/>
-        </w:rPr>
-      </w:pPr>
-      <w:r>
-        <w:rPr>
-          <w:lang w:val="es-ES"/>
-        </w:rPr>
-        <w:t>Solicitud de Cambios</w:t>
-      </w:r>
-    </w:p>
-    <w:p>
-      <w:pPr>
-        <w:pStyle w:val="Prrafodelista"/>
-        <w:numPr>
-          <w:ilvl w:val="0"/>
-          <w:numId w:val="40"/>
-        </w:numPr>
-        <w:rPr>
-          <w:lang w:val="es-ES"/>
-        </w:rPr>
-      </w:pPr>
-      <w:r>
-        <w:rPr>
-          <w:lang w:val="es-ES"/>
-        </w:rPr>
-        <w:t>Registro de Riesgos Actualizado</w:t>
-      </w:r>
-    </w:p>
-    <w:p>
-      <w:pPr>
-        <w:pStyle w:val="Prrafodelista"/>
-        <w:numPr>
-          <w:ilvl w:val="0"/>
-          <w:numId w:val="40"/>
-        </w:numPr>
-        <w:rPr>
-          <w:lang w:val="es-ES"/>
-        </w:rPr>
-      </w:pPr>
-      <w:r>
-        <w:rPr>
-          <w:lang w:val="es-ES"/>
-        </w:rPr>
-        <w:t>Acta de Cierre</w:t>
-      </w:r>
-    </w:p>
-    <w:p>
-      <w:pPr>
-        <w:pStyle w:val="Prrafodelista"/>
-        <w:numPr>
-          <w:ilvl w:val="0"/>
-          <w:numId w:val="40"/>
-        </w:numPr>
-        <w:rPr>
-          <w:lang w:val="es-ES"/>
-        </w:rPr>
-      </w:pPr>
-      <w:r>
-        <w:rPr>
-          <w:lang w:val="es-ES"/>
-        </w:rPr>
-        <w:t>Lecciones Aprendidas</w:t>
-      </w:r>
-    </w:p>
-    <w:p>
-      <w:pPr>
-        <w:pStyle w:val="Prrafodelista"/>
-        <w:numPr>
-          <w:ilvl w:val="0"/>
-          <w:numId w:val="40"/>
-        </w:numPr>
-        <w:rPr>
-          <w:lang w:val="es-ES"/>
-        </w:rPr>
-      </w:pPr>
-      <w:r>
-        <w:rPr>
-          <w:lang w:val="es-ES"/>
-        </w:rPr>
-        <w:t>Informe de Validación del Producto</w:t>
-      </w:r>
-    </w:p>
-    <w:p>
-      <w:pPr>
-        <w:pStyle w:val="Prrafodelista"/>
-        <w:numPr>
-          <w:ilvl w:val="0"/>
-          <w:numId w:val="40"/>
-        </w:numPr>
-        <w:rPr>
-          <w:lang w:val="es-ES"/>
-        </w:rPr>
-      </w:pPr>
-      <w:r>
-        <w:rPr>
-          <w:lang w:val="es-ES"/>
-        </w:rPr>
-        <w:t>Evaluación de las 4P</w:t>
-      </w:r>
-    </w:p>
-    <w:p>
-      <w:pPr>
-        <w:pStyle w:val="Prrafodelista"/>
-        <w:numPr>
-          <w:ilvl w:val="0"/>
-          <w:numId w:val="40"/>
-        </w:numPr>
-        <w:rPr>
-          <w:lang w:val="es-ES"/>
-        </w:rPr>
-      </w:pPr>
-      <w:proofErr w:type="spellStart"/>
-      <w:r>
-        <w:rPr>
-          <w:lang w:val="es-ES"/>
-        </w:rPr>
-        <w:t>Value</w:t>
-      </w:r>
-      <w:proofErr w:type="spellEnd"/>
-      <w:r>
-        <w:rPr>
-          <w:lang w:val="es-ES"/>
-        </w:rPr>
-        <w:t xml:space="preserve"> </w:t>
-      </w:r>
-      <w:proofErr w:type="spellStart"/>
-      <w:r>
-        <w:rPr>
-          <w:lang w:val="es-ES"/>
-        </w:rPr>
-        <w:t>Stream</w:t>
-      </w:r>
-      <w:proofErr w:type="spellEnd"/>
-      <w:r>
-        <w:rPr>
-          <w:lang w:val="es-ES"/>
-        </w:rPr>
-        <w:t xml:space="preserve"> </w:t>
-      </w:r>
-      <w:proofErr w:type="spellStart"/>
-      <w:r>
-        <w:rPr>
-          <w:lang w:val="es-ES"/>
-        </w:rPr>
-        <w:t>Mapping</w:t>
-      </w:r>
-      <w:proofErr w:type="spellEnd"/>
-    </w:p>
-    <w:p>
-      <w:pPr>
-        <w:pStyle w:val="Prrafodelista"/>
-        <w:numPr>
-          <w:ilvl w:val="0"/>
-          <w:numId w:val="40"/>
-        </w:numPr>
-        <w:rPr>
-          <w:lang w:val="es-ES"/>
-        </w:rPr>
-      </w:pPr>
-      <w:r>
-        <w:rPr>
-          <w:lang w:val="es-ES"/>
-        </w:rPr>
-        <w:t>Plan de Escalado Organizacional</w:t>
-      </w:r>
+      <w:r>
+        <w:rPr>
+          <w:rFonts w:ascii="Arial" w:hAnsi="Arial" w:cs="Arial"/>
+          <w:lang w:val="es-ES"/>
+        </w:rPr>
+        <w:t>/Junior con mayor experiencia para asegurar la continuidad de la arquitectura de la base de datos.</w:t>
+      </w:r>
+    </w:p>
+    <w:p>
+      <w:pPr>
+        <w:rPr>
+          <w:lang w:val="es-ES"/>
+        </w:rPr>
+      </w:pPr>
+    </w:p>
+    <w:p>
+      <w:pPr>
+        <w:rPr>
+          <w:lang w:val="es-ES"/>
+        </w:rPr>
+      </w:pPr>
     </w:p>
     <w:p>
       <w:pPr>
@@ -10930,6 +11632,119 @@
     </w:lvl>
   </w:abstractNum>
   <w:abstractNum w:abstractNumId="11" w15:restartNumberingAfterBreak="0">
+    <w:nsid w:val="2FAB6A05"/>
+    <w:multiLevelType w:val="hybridMultilevel"/>
+    <w:tmpl w:val="0158CD24"/>
+    <w:lvl w:ilvl="0" w:tplc="0C0A0001">
+      <w:start w:val="1"/>
+      <w:numFmt w:val="bullet"/>
+      <w:lvlText w:val=""/>
+      <w:lvlJc w:val="left"/>
+      <w:pPr>
+        <w:ind w:left="1080" w:hanging="360"/>
+      </w:pPr>
+      <w:rPr>
+        <w:rFonts w:ascii="Symbol" w:hAnsi="Symbol" w:hint="default"/>
+      </w:rPr>
+    </w:lvl>
+    <w:lvl w:ilvl="1" w:tplc="0C0A0003" w:tentative="1">
+      <w:start w:val="1"/>
+      <w:numFmt w:val="bullet"/>
+      <w:lvlText w:val="o"/>
+      <w:lvlJc w:val="left"/>
+      <w:pPr>
+        <w:ind w:left="1800" w:hanging="360"/>
+      </w:pPr>
+      <w:rPr>
+        <w:rFonts w:ascii="Courier New" w:hAnsi="Courier New" w:cs="Courier New" w:hint="default"/>
+      </w:rPr>
+    </w:lvl>
+    <w:lvl w:ilvl="2" w:tplc="0C0A0005" w:tentative="1">
+      <w:start w:val="1"/>
+      <w:numFmt w:val="bullet"/>
+      <w:lvlText w:val=""/>
+      <w:lvlJc w:val="left"/>
+      <w:pPr>
+        <w:ind w:left="2520" w:hanging="360"/>
+      </w:pPr>
+      <w:rPr>
+        <w:rFonts w:ascii="Wingdings" w:hAnsi="Wingdings" w:hint="default"/>
+      </w:rPr>
+    </w:lvl>
+    <w:lvl w:ilvl="3" w:tplc="0C0A0001" w:tentative="1">
+      <w:start w:val="1"/>
+      <w:numFmt w:val="bullet"/>
+      <w:lvlText w:val=""/>
+      <w:lvlJc w:val="left"/>
+      <w:pPr>
+        <w:ind w:left="3240" w:hanging="360"/>
+      </w:pPr>
+      <w:rPr>
+        <w:rFonts w:ascii="Symbol" w:hAnsi="Symbol" w:hint="default"/>
+      </w:rPr>
+    </w:lvl>
+    <w:lvl w:ilvl="4" w:tplc="0C0A0003" w:tentative="1">
+      <w:start w:val="1"/>
+      <w:numFmt w:val="bullet"/>
+      <w:lvlText w:val="o"/>
+      <w:lvlJc w:val="left"/>
+      <w:pPr>
+        <w:ind w:left="3960" w:hanging="360"/>
+      </w:pPr>
+      <w:rPr>
+        <w:rFonts w:ascii="Courier New" w:hAnsi="Courier New" w:cs="Courier New" w:hint="default"/>
+      </w:rPr>
+    </w:lvl>
+    <w:lvl w:ilvl="5" w:tplc="0C0A0005" w:tentative="1">
+      <w:start w:val="1"/>
+      <w:numFmt w:val="bullet"/>
+      <w:lvlText w:val=""/>
+      <w:lvlJc w:val="left"/>
+      <w:pPr>
+        <w:ind w:left="4680" w:hanging="360"/>
+      </w:pPr>
+      <w:rPr>
+        <w:rFonts w:ascii="Wingdings" w:hAnsi="Wingdings" w:hint="default"/>
+      </w:rPr>
+    </w:lvl>
+    <w:lvl w:ilvl="6" w:tplc="0C0A0001" w:tentative="1">
+      <w:start w:val="1"/>
+      <w:numFmt w:val="bullet"/>
+      <w:lvlText w:val=""/>
+      <w:lvlJc w:val="left"/>
+      <w:pPr>
+        <w:ind w:left="5400" w:hanging="360"/>
+      </w:pPr>
+      <w:rPr>
+        <w:rFonts w:ascii="Symbol" w:hAnsi="Symbol" w:hint="default"/>
+      </w:rPr>
+    </w:lvl>
+    <w:lvl w:ilvl="7" w:tplc="0C0A0003" w:tentative="1">
+      <w:start w:val="1"/>
+      <w:numFmt w:val="bullet"/>
+      <w:lvlText w:val="o"/>
+      <w:lvlJc w:val="left"/>
+      <w:pPr>
+        <w:ind w:left="6120" w:hanging="360"/>
+      </w:pPr>
+      <w:rPr>
+        <w:rFonts w:ascii="Courier New" w:hAnsi="Courier New" w:cs="Courier New" w:hint="default"/>
+      </w:rPr>
+    </w:lvl>
+    <w:lvl w:ilvl="8" w:tplc="0C0A0005" w:tentative="1">
+      <w:start w:val="1"/>
+      <w:numFmt w:val="bullet"/>
+      <w:lvlText w:val=""/>
+      <w:lvlJc w:val="left"/>
+      <w:pPr>
+        <w:ind w:left="6840" w:hanging="360"/>
+      </w:pPr>
+      <w:rPr>
+        <w:rFonts w:ascii="Wingdings" w:hAnsi="Wingdings" w:hint="default"/>
+      </w:rPr>
+    </w:lvl>
+  </w:abstractNum>
+  <w:abstractNum w:abstractNumId="12" w15:restartNumberingAfterBreak="0">
     <w:nsid w:val="328027F2"/>
     <w:multiLevelType w:val="hybridMultilevel"/>
     <w:tmpl w:val="7610D09A"/>
@@ -11042,7 +11857,7 @@
       </w:rPr>
     </w:lvl>
   </w:abstractNum>
-  <w:abstractNum w:abstractNumId="12" w15:restartNumberingAfterBreak="0">
+  <w:abstractNum w:abstractNumId="13" w15:restartNumberingAfterBreak="0">
     <w:nsid w:val="351225BE"/>
     <w:multiLevelType w:val="multilevel"/>
     <w:tmpl w:val="420C3678"/>
@@ -11155,7 +11970,7 @@
       </w:pPr>
     </w:lvl>
   </w:abstractNum>
-  <w:abstractNum w:abstractNumId="13" w15:restartNumberingAfterBreak="0">
+  <w:abstractNum w:abstractNumId="14" w15:restartNumberingAfterBreak="0">
     <w:nsid w:val="38821839"/>
     <w:multiLevelType w:val="multilevel"/>
     <w:tmpl w:val="0382157A"/>
@@ -11304,7 +12119,7 @@
       </w:rPr>
     </w:lvl>
   </w:abstractNum>
-  <w:abstractNum w:abstractNumId="14" w15:restartNumberingAfterBreak="0">
+  <w:abstractNum w:abstractNumId="15" w15:restartNumberingAfterBreak="0">
     <w:nsid w:val="3C9973EF"/>
     <w:multiLevelType w:val="multilevel"/>
     <w:tmpl w:val="C804C468"/>
@@ -11453,7 +12268,7 @@
       </w:rPr>
     </w:lvl>
   </w:abstractNum>
-  <w:abstractNum w:abstractNumId="15" w15:restartNumberingAfterBreak="0">
+  <w:abstractNum w:abstractNumId="16" w15:restartNumberingAfterBreak="0">
     <w:nsid w:val="3D9C5985"/>
     <w:multiLevelType w:val="multilevel"/>
     <w:tmpl w:val="277AD260"/>
@@ -11566,7 +12381,120 @@
       </w:pPr>
     </w:lvl>
   </w:abstractNum>
-  <w:abstractNum w:abstractNumId="16" w15:restartNumberingAfterBreak="0">
+  <w:abstractNum w:abstractNumId="17" w15:restartNumberingAfterBreak="0">
+    <w:nsid w:val="40B40177"/>
+    <w:multiLevelType w:val="hybridMultilevel"/>
+    <w:tmpl w:val="9B6E6296"/>
+    <w:lvl w:ilvl="0" w:tplc="0C0A0001">
+      <w:start w:val="1"/>
+      <w:numFmt w:val="bullet"/>
+      <w:lvlText w:val=""/>
+      <w:lvlJc w:val="left"/>
+      <w:pPr>
+        <w:ind w:left="720" w:hanging="360"/>
+      </w:pPr>
+      <w:rPr>
+        <w:rFonts w:ascii="Symbol" w:hAnsi="Symbol" w:hint="default"/>
+      </w:rPr>
+    </w:lvl>
+    <w:lvl w:ilvl="1" w:tplc="0C0A0003" w:tentative="1">
+      <w:start w:val="1"/>
+      <w:numFmt w:val="bullet"/>
+      <w:lvlText w:val="o"/>
+      <w:lvlJc w:val="left"/>
+      <w:pPr>
+        <w:ind w:left="1440" w:hanging="360"/>
+      </w:pPr>
+      <w:rPr>
+        <w:rFonts w:ascii="Courier New" w:hAnsi="Courier New" w:cs="Courier New" w:hint="default"/>
+      </w:rPr>
+    </w:lvl>
+    <w:lvl w:ilvl="2" w:tplc="0C0A0005" w:tentative="1">
+      <w:start w:val="1"/>
+      <w:numFmt w:val="bullet"/>
+      <w:lvlText w:val=""/>
+      <w:lvlJc w:val="left"/>
+      <w:pPr>
+        <w:ind w:left="2160" w:hanging="360"/>
+      </w:pPr>
+      <w:rPr>
+        <w:rFonts w:ascii="Wingdings" w:hAnsi="Wingdings" w:hint="default"/>
+      </w:rPr>
+    </w:lvl>
+    <w:lvl w:ilvl="3" w:tplc="0C0A0001" w:tentative="1">
+      <w:start w:val="1"/>
+      <w:numFmt w:val="bullet"/>
+      <w:lvlText w:val=""/>
+      <w:lvlJc w:val="left"/>
+      <w:pPr>
+        <w:ind w:left="2880" w:hanging="360"/>
+      </w:pPr>
+      <w:rPr>
+        <w:rFonts w:ascii="Symbol" w:hAnsi="Symbol" w:hint="default"/>
+      </w:rPr>
+    </w:lvl>
+    <w:lvl w:ilvl="4" w:tplc="0C0A0003" w:tentative="1">
+      <w:start w:val="1"/>
+      <w:numFmt w:val="bullet"/>
+      <w:lvlText w:val="o"/>
+      <w:lvlJc w:val="left"/>
+      <w:pPr>
+        <w:ind w:left="3600" w:hanging="360"/>
+      </w:pPr>
+      <w:rPr>
+        <w:rFonts w:ascii="Courier New" w:hAnsi="Courier New" w:cs="Courier New" w:hint="default"/>
+      </w:rPr>
+    </w:lvl>
+    <w:lvl w:ilvl="5" w:tplc="0C0A0005" w:tentative="1">
+      <w:start w:val="1"/>
+      <w:numFmt w:val="bullet"/>
+      <w:lvlText w:val=""/>
+      <w:lvlJc w:val="left"/>
+      <w:pPr>
+        <w:ind w:left="4320" w:hanging="360"/>
+      </w:pPr>
+      <w:rPr>
+        <w:rFonts w:ascii="Wingdings" w:hAnsi="Wingdings" w:hint="default"/>
+      </w:rPr>
+    </w:lvl>
+    <w:lvl w:ilvl="6" w:tplc="0C0A0001" w:tentative="1">
+      <w:start w:val="1"/>
+      <w:numFmt w:val="bullet"/>
+      <w:lvlText w:val=""/>
+      <w:lvlJc w:val="left"/>
+      <w:pPr>
+        <w:ind w:left="5040" w:hanging="360"/>
+      </w:pPr>
+      <w:rPr>
+        <w:rFonts w:ascii="Symbol" w:hAnsi="Symbol" w:hint="default"/>
+      </w:rPr>
+    </w:lvl>
+    <w:lvl w:ilvl="7" w:tplc="0C0A0003" w:tentative="1">
+      <w:start w:val="1"/>
+      <w:numFmt w:val="bullet"/>
+      <w:lvlText w:val="o"/>
+      <w:lvlJc w:val="left"/>
+      <w:pPr>
+        <w:ind w:left="5760" w:hanging="360"/>
+      </w:pPr>
+      <w:rPr>
+        <w:rFonts w:ascii="Courier New" w:hAnsi="Courier New" w:cs="Courier New" w:hint="default"/>
+      </w:rPr>
+    </w:lvl>
+    <w:lvl w:ilvl="8" w:tplc="0C0A0005" w:tentative="1">
+      <w:start w:val="1"/>
+      <w:numFmt w:val="bullet"/>
+      <w:lvlText w:val=""/>
+      <w:lvlJc w:val="left"/>
+      <w:pPr>
+        <w:ind w:left="6480" w:hanging="360"/>
+      </w:pPr>
+      <w:rPr>
+        <w:rFonts w:ascii="Wingdings" w:hAnsi="Wingdings" w:hint="default"/>
+      </w:rPr>
+    </w:lvl>
+  </w:abstractNum>
+  <w:abstractNum w:abstractNumId="18" w15:restartNumberingAfterBreak="0">
     <w:nsid w:val="415521CD"/>
     <w:multiLevelType w:val="multilevel"/>
     <w:tmpl w:val="E0AA99D4"/>
@@ -11715,7 +12643,7 @@
       </w:rPr>
     </w:lvl>
   </w:abstractNum>
-  <w:abstractNum w:abstractNumId="17" w15:restartNumberingAfterBreak="0">
+  <w:abstractNum w:abstractNumId="19" w15:restartNumberingAfterBreak="0">
     <w:nsid w:val="41DA779B"/>
     <w:multiLevelType w:val="multilevel"/>
     <w:tmpl w:val="8FFAF41A"/>
@@ -11828,7 +12756,7 @@
       </w:pPr>
     </w:lvl>
   </w:abstractNum>
-  <w:abstractNum w:abstractNumId="18" w15:restartNumberingAfterBreak="0">
+  <w:abstractNum w:abstractNumId="20" w15:restartNumberingAfterBreak="0">
     <w:nsid w:val="444D03FA"/>
     <w:multiLevelType w:val="hybridMultilevel"/>
     <w:tmpl w:val="80EC6116"/>
@@ -11941,7 +12869,7 @@
       </w:rPr>
     </w:lvl>
   </w:abstractNum>
-  <w:abstractNum w:abstractNumId="19" w15:restartNumberingAfterBreak="0">
+  <w:abstractNum w:abstractNumId="21" w15:restartNumberingAfterBreak="0">
     <w:nsid w:val="45632781"/>
     <w:multiLevelType w:val="hybridMultilevel"/>
     <w:tmpl w:val="7C28A2BA"/>
@@ -12054,7 +12982,7 @@
       </w:rPr>
     </w:lvl>
   </w:abstractNum>
-  <w:abstractNum w:abstractNumId="20" w15:restartNumberingAfterBreak="0">
+  <w:abstractNum w:abstractNumId="22" w15:restartNumberingAfterBreak="0">
     <w:nsid w:val="50DF3A72"/>
     <w:multiLevelType w:val="multilevel"/>
     <w:tmpl w:val="66C2A37E"/>
@@ -12141,7 +13069,7 @@
       </w:pPr>
     </w:lvl>
   </w:abstractNum>
-  <w:abstractNum w:abstractNumId="21" w15:restartNumberingAfterBreak="0">
+  <w:abstractNum w:abstractNumId="23" w15:restartNumberingAfterBreak="0">
     <w:nsid w:val="53790B1E"/>
     <w:multiLevelType w:val="hybridMultilevel"/>
     <w:tmpl w:val="7A06AD96"/>
@@ -12254,7 +13182,7 @@
       </w:rPr>
     </w:lvl>
   </w:abstractNum>
-  <w:abstractNum w:abstractNumId="22" w15:restartNumberingAfterBreak="0">
+  <w:abstractNum w:abstractNumId="24" w15:restartNumberingAfterBreak="0">
     <w:nsid w:val="546B45AF"/>
     <w:multiLevelType w:val="hybridMultilevel"/>
     <w:tmpl w:val="0F6ACFF4"/>
@@ -12340,7 +13268,7 @@
       </w:pPr>
     </w:lvl>
   </w:abstractNum>
-  <w:abstractNum w:abstractNumId="23" w15:restartNumberingAfterBreak="0">
+  <w:abstractNum w:abstractNumId="25" w15:restartNumberingAfterBreak="0">
     <w:nsid w:val="563F08B6"/>
     <w:multiLevelType w:val="hybridMultilevel"/>
     <w:tmpl w:val="CD70BDDE"/>
@@ -12453,7 +13381,7 @@
       </w:rPr>
     </w:lvl>
   </w:abstractNum>
-  <w:abstractNum w:abstractNumId="24" w15:restartNumberingAfterBreak="0">
+  <w:abstractNum w:abstractNumId="26" w15:restartNumberingAfterBreak="0">
     <w:nsid w:val="58C7008D"/>
     <w:multiLevelType w:val="multilevel"/>
     <w:tmpl w:val="8C9A5468"/>
@@ -12566,7 +13494,7 @@
       </w:pPr>
     </w:lvl>
   </w:abstractNum>
-  <w:abstractNum w:abstractNumId="25" w15:restartNumberingAfterBreak="0">
+  <w:abstractNum w:abstractNumId="27" w15:restartNumberingAfterBreak="0">
     <w:nsid w:val="59640F76"/>
     <w:multiLevelType w:val="multilevel"/>
     <w:tmpl w:val="915056BE"/>
@@ -12715,7 +13643,7 @@
       </w:rPr>
     </w:lvl>
   </w:abstractNum>
-  <w:abstractNum w:abstractNumId="26" w15:restartNumberingAfterBreak="0">
+  <w:abstractNum w:abstractNumId="28" w15:restartNumberingAfterBreak="0">
     <w:nsid w:val="5B854F71"/>
     <w:multiLevelType w:val="multilevel"/>
     <w:tmpl w:val="AA7CEAA4"/>
@@ -12864,7 +13792,7 @@
       </w:rPr>
     </w:lvl>
   </w:abstractNum>
-  <w:abstractNum w:abstractNumId="27" w15:restartNumberingAfterBreak="0">
+  <w:abstractNum w:abstractNumId="29" w15:restartNumberingAfterBreak="0">
     <w:nsid w:val="5C2C428B"/>
     <w:multiLevelType w:val="hybridMultilevel"/>
     <w:tmpl w:val="0452F75A"/>
@@ -12953,7 +13881,7 @@
       </w:pPr>
     </w:lvl>
   </w:abstractNum>
-  <w:abstractNum w:abstractNumId="28" w15:restartNumberingAfterBreak="0">
+  <w:abstractNum w:abstractNumId="30" w15:restartNumberingAfterBreak="0">
     <w:nsid w:val="5CBF46A5"/>
     <w:multiLevelType w:val="multilevel"/>
     <w:tmpl w:val="BACA6AF6"/>
@@ -13102,7 +14030,7 @@
       </w:rPr>
     </w:lvl>
   </w:abstractNum>
-  <w:abstractNum w:abstractNumId="29" w15:restartNumberingAfterBreak="0">
+  <w:abstractNum w:abstractNumId="31" w15:restartNumberingAfterBreak="0">
     <w:nsid w:val="616072A1"/>
     <w:multiLevelType w:val="multilevel"/>
     <w:tmpl w:val="B15495DA"/>
@@ -13251,7 +14179,152 @@
       </w:rPr>
     </w:lvl>
   </w:abstractNum>
-  <w:abstractNum w:abstractNumId="30" w15:restartNumberingAfterBreak="0">
+  <w:abstractNum w:abstractNumId="32" w15:restartNumberingAfterBreak="0">
+    <w:nsid w:val="65FE7B33"/>
+    <w:multiLevelType w:val="multilevel"/>
+    <w:tmpl w:val="19F407F2"/>
+    <w:lvl w:ilvl="0">
+      <w:start w:val="1"/>
+      <w:numFmt w:val="decimal"/>
+      <w:lvlText w:val="%1."/>
+      <w:lvlJc w:val="left"/>
+      <w:pPr>
+        <w:tabs>
+          <w:tab w:val="num" w:pos="720"/>
+        </w:tabs>
+        <w:ind w:left="720" w:hanging="360"/>
+      </w:pPr>
+      <w:rPr>
+        <w:rFonts w:hint="default"/>
+        <w:sz w:val="20"/>
+      </w:rPr>
+    </w:lvl>
+    <w:lvl w:ilvl="1" w:tentative="1">
+      <w:start w:val="1"/>
+      <w:numFmt w:val="decimal"/>
+      <w:lvlText w:val="%2."/>
+      <w:lvlJc w:val="left"/>
+      <w:pPr>
+        <w:tabs>
+          <w:tab w:val="num" w:pos="1440"/>
+        </w:tabs>
+        <w:ind w:left="1440" w:hanging="360"/>
+      </w:pPr>
+    </w:lvl>
+    <w:lvl w:ilvl="2" w:tentative="1">
+      <w:start w:val="1"/>
+      <w:numFmt w:val="decimal"/>
+      <w:lvlText w:val="%3."/>
+      <w:lvlJc w:val="left"/>
+      <w:pPr>
+        <w:tabs>
+          <w:tab w:val="num" w:pos="2160"/>
+        </w:tabs>
+        <w:ind w:left="2160" w:hanging="360"/>
+      </w:pPr>
+      <w:rPr>
+        <w:rFonts w:hint="default"/>
+        <w:sz w:val="20"/>
+      </w:rPr>
+    </w:lvl>
+    <w:lvl w:ilvl="3" w:tentative="1">
+      <w:start w:val="1"/>
+      <w:numFmt w:val="decimal"/>
+      <w:lvlText w:val="%4."/>
+      <w:lvlJc w:val="left"/>
+      <w:pPr>
+        <w:tabs>
+          <w:tab w:val="num" w:pos="2880"/>
+        </w:tabs>
+        <w:ind w:left="2880" w:hanging="360"/>
+      </w:pPr>
+      <w:rPr>
+        <w:rFonts w:hint="default"/>
+        <w:sz w:val="20"/>
+      </w:rPr>
+    </w:lvl>
+    <w:lvl w:ilvl="4" w:tentative="1">
+      <w:start w:val="1"/>
+      <w:numFmt w:val="decimal"/>
+      <w:lvlText w:val="%5."/>
+      <w:lvlJc w:val="left"/>
+      <w:pPr>
+        <w:tabs>
+          <w:tab w:val="num" w:pos="3600"/>
+        </w:tabs>
+        <w:ind w:left="3600" w:hanging="360"/>
+      </w:pPr>
+      <w:rPr>
+        <w:rFonts w:hint="default"/>
+        <w:sz w:val="20"/>
+      </w:rPr>
+    </w:lvl>
+    <w:lvl w:ilvl="5" w:tentative="1">
+      <w:start w:val="1"/>
+      <w:numFmt w:val="decimal"/>
+      <w:lvlText w:val="%6."/>
+      <w:lvlJc w:val="left"/>
+      <w:pPr>
+        <w:tabs>
+          <w:tab w:val="num" w:pos="4320"/>
+        </w:tabs>
+        <w:ind w:left="4320" w:hanging="360"/>
+      </w:pPr>
+      <w:rPr>
+        <w:rFonts w:hint="default"/>
+        <w:sz w:val="20"/>
+      </w:rPr>
+    </w:lvl>
+    <w:lvl w:ilvl="6" w:tentative="1">
+      <w:start w:val="1"/>
+      <w:numFmt w:val="decimal"/>
+      <w:lvlText w:val="%7."/>
+      <w:lvlJc w:val="left"/>
+      <w:pPr>
+        <w:tabs>
+          <w:tab w:val="num" w:pos="5040"/>
+        </w:tabs>
+        <w:ind w:left="5040" w:hanging="360"/>
+      </w:pPr>
+      <w:rPr>
+        <w:rFonts w:hint="default"/>
+        <w:sz w:val="20"/>
+      </w:rPr>
+    </w:lvl>
+    <w:lvl w:ilvl="7" w:tentative="1">
+      <w:start w:val="1"/>
+      <w:numFmt w:val="decimal"/>
+      <w:lvlText w:val="%8."/>
+      <w:lvlJc w:val="left"/>
+      <w:pPr>
+        <w:tabs>
+          <w:tab w:val="num" w:pos="5760"/>
+        </w:tabs>
+        <w:ind w:left="5760" w:hanging="360"/>
+      </w:pPr>
+      <w:rPr>
+        <w:rFonts w:hint="default"/>
+        <w:sz w:val="20"/>
+      </w:rPr>
+    </w:lvl>
+    <w:lvl w:ilvl="8" w:tentative="1">
+      <w:start w:val="1"/>
+      <w:numFmt w:val="decimal"/>
+      <w:lvlText w:val="%9."/>
+      <w:lvlJc w:val="left"/>
+      <w:pPr>
+        <w:tabs>
+          <w:tab w:val="num" w:pos="6480"/>
+        </w:tabs>
+        <w:ind w:left="6480" w:hanging="360"/>
+      </w:pPr>
+      <w:rPr>
+        <w:rFonts w:hint="default"/>
+        <w:sz w:val="20"/>
+      </w:rPr>
+    </w:lvl>
+  </w:abstractNum>
+  <w:abstractNum w:abstractNumId="33" w15:restartNumberingAfterBreak="0">
     <w:nsid w:val="66824B31"/>
     <w:multiLevelType w:val="hybridMultilevel"/>
     <w:tmpl w:val="FB76797A"/>
@@ -13337,7 +14410,7 @@
       </w:pPr>
     </w:lvl>
   </w:abstractNum>
-  <w:abstractNum w:abstractNumId="31" w15:restartNumberingAfterBreak="0">
+  <w:abstractNum w:abstractNumId="34" w15:restartNumberingAfterBreak="0">
     <w:nsid w:val="670A3EDD"/>
     <w:multiLevelType w:val="multilevel"/>
     <w:tmpl w:val="D9F886DE"/>
@@ -13486,7 +14559,7 @@
       </w:rPr>
     </w:lvl>
   </w:abstractNum>
-  <w:abstractNum w:abstractNumId="32" w15:restartNumberingAfterBreak="0">
+  <w:abstractNum w:abstractNumId="35" w15:restartNumberingAfterBreak="0">
     <w:nsid w:val="685E294E"/>
     <w:multiLevelType w:val="multilevel"/>
     <w:tmpl w:val="A7947952"/>
@@ -13635,7 +14708,7 @@
       </w:rPr>
     </w:lvl>
   </w:abstractNum>
-  <w:abstractNum w:abstractNumId="33" w15:restartNumberingAfterBreak="0">
+  <w:abstractNum w:abstractNumId="36" w15:restartNumberingAfterBreak="0">
     <w:nsid w:val="6B7242DF"/>
     <w:multiLevelType w:val="multilevel"/>
     <w:tmpl w:val="35FEE1B6"/>
@@ -13784,7 +14857,7 @@
       </w:rPr>
     </w:lvl>
   </w:abstractNum>
-  <w:abstractNum w:abstractNumId="34" w15:restartNumberingAfterBreak="0">
+  <w:abstractNum w:abstractNumId="37" w15:restartNumberingAfterBreak="0">
     <w:nsid w:val="6CF655A5"/>
     <w:multiLevelType w:val="multilevel"/>
     <w:tmpl w:val="AA120C74"/>
@@ -13897,7 +14970,7 @@
       </w:pPr>
     </w:lvl>
   </w:abstractNum>
-  <w:abstractNum w:abstractNumId="35" w15:restartNumberingAfterBreak="0">
+  <w:abstractNum w:abstractNumId="38" w15:restartNumberingAfterBreak="0">
     <w:nsid w:val="6D6048EB"/>
     <w:multiLevelType w:val="hybridMultilevel"/>
     <w:tmpl w:val="496637C8"/>
@@ -14010,7 +15083,7 @@
       </w:rPr>
     </w:lvl>
   </w:abstractNum>
-  <w:abstractNum w:abstractNumId="36" w15:restartNumberingAfterBreak="0">
+  <w:abstractNum w:abstractNumId="39" w15:restartNumberingAfterBreak="0">
     <w:nsid w:val="6D9E2373"/>
     <w:multiLevelType w:val="multilevel"/>
     <w:tmpl w:val="7798721C"/>
@@ -14159,7 +15232,7 @@
       </w:rPr>
     </w:lvl>
   </w:abstractNum>
-  <w:abstractNum w:abstractNumId="37" w15:restartNumberingAfterBreak="0">
+  <w:abstractNum w:abstractNumId="40" w15:restartNumberingAfterBreak="0">
     <w:nsid w:val="71A226AB"/>
     <w:multiLevelType w:val="hybridMultilevel"/>
     <w:tmpl w:val="4EC0872C"/>
@@ -14245,7 +15318,7 @@
       </w:pPr>
     </w:lvl>
   </w:abstractNum>
-  <w:abstractNum w:abstractNumId="38" w15:restartNumberingAfterBreak="0">
+  <w:abstractNum w:abstractNumId="41" w15:restartNumberingAfterBreak="0">
     <w:nsid w:val="76492344"/>
     <w:multiLevelType w:val="multilevel"/>
     <w:tmpl w:val="5526F338"/>
@@ -14394,7 +15467,7 @@
       </w:rPr>
     </w:lvl>
   </w:abstractNum>
-  <w:abstractNum w:abstractNumId="39" w15:restartNumberingAfterBreak="0">
+  <w:abstractNum w:abstractNumId="42" w15:restartNumberingAfterBreak="0">
     <w:nsid w:val="7AF96EBD"/>
     <w:multiLevelType w:val="multilevel"/>
     <w:tmpl w:val="40C4EB88"/>
@@ -14543,7 +15616,7 @@
       </w:rPr>
     </w:lvl>
   </w:abstractNum>
-  <w:abstractNum w:abstractNumId="40" w15:restartNumberingAfterBreak="0">
+  <w:abstractNum w:abstractNumId="43" w15:restartNumberingAfterBreak="0">
     <w:nsid w:val="7CB5752A"/>
     <w:multiLevelType w:val="hybridMultilevel"/>
     <w:tmpl w:val="3E8855C0"/>
@@ -14656,7 +15729,7 @@
       </w:rPr>
     </w:lvl>
   </w:abstractNum>
-  <w:abstractNum w:abstractNumId="41" w15:restartNumberingAfterBreak="0">
+  <w:abstractNum w:abstractNumId="44" w15:restartNumberingAfterBreak="0">
     <w:nsid w:val="7D905054"/>
     <w:multiLevelType w:val="hybridMultilevel"/>
     <w:tmpl w:val="9CB40FDE"/>
@@ -14769,7 +15842,7 @@
       </w:rPr>
     </w:lvl>
   </w:abstractNum>
-  <w:abstractNum w:abstractNumId="42" w15:restartNumberingAfterBreak="0">
+  <w:abstractNum w:abstractNumId="45" w15:restartNumberingAfterBreak="0">
     <w:nsid w:val="7E764224"/>
     <w:multiLevelType w:val="multilevel"/>
     <w:tmpl w:val="5248F0BA"/>
@@ -14922,7 +15995,7 @@
     <w:abstractNumId w:val="1"/>
   </w:num>
   <w:num w:numId="2">
-    <w:abstractNumId w:val="35"/>
+    <w:abstractNumId w:val="38"/>
   </w:num>
   <w:num w:numId="3">
     <w:abstractNumId w:val="1"/>
@@ -14955,7 +16028,7 @@
     </w:lvlOverride>
   </w:num>
   <w:num w:numId="4">
-    <w:abstractNumId w:val="20"/>
+    <w:abstractNumId w:val="22"/>
     <w:lvlOverride w:ilvl="0">
       <w:startOverride w:val="1"/>
     </w:lvlOverride>
@@ -15015,16 +16088,16 @@
     </w:lvlOverride>
   </w:num>
   <w:num w:numId="6">
-    <w:abstractNumId w:val="33"/>
+    <w:abstractNumId w:val="36"/>
   </w:num>
   <w:num w:numId="7">
-    <w:abstractNumId w:val="32"/>
+    <w:abstractNumId w:val="35"/>
   </w:num>
   <w:num w:numId="8">
-    <w:abstractNumId w:val="29"/>
+    <w:abstractNumId w:val="31"/>
   </w:num>
   <w:num w:numId="9">
-    <w:abstractNumId w:val="14"/>
+    <w:abstractNumId w:val="15"/>
   </w:num>
   <w:num w:numId="10">
     <w:abstractNumId w:val="5"/>
@@ -15033,10 +16106,10 @@
     <w:abstractNumId w:val="9"/>
   </w:num>
   <w:num w:numId="12">
-    <w:abstractNumId w:val="13"/>
+    <w:abstractNumId w:val="14"/>
   </w:num>
   <w:num w:numId="13">
-    <w:abstractNumId w:val="12"/>
+    <w:abstractNumId w:val="13"/>
     <w:lvlOverride w:ilvl="0">
       <w:startOverride w:val="1"/>
     </w:lvlOverride>
@@ -15066,100 +16139,109 @@
     </w:lvlOverride>
   </w:num>
   <w:num w:numId="14">
-    <w:abstractNumId w:val="16"/>
+    <w:abstractNumId w:val="18"/>
   </w:num>
   <w:num w:numId="15">
-    <w:abstractNumId w:val="36"/>
+    <w:abstractNumId w:val="39"/>
   </w:num>
   <w:num w:numId="16">
     <w:abstractNumId w:val="4"/>
   </w:num>
   <w:num w:numId="17">
-    <w:abstractNumId w:val="34"/>
+    <w:abstractNumId w:val="37"/>
   </w:num>
   <w:num w:numId="18">
     <w:abstractNumId w:val="2"/>
   </w:num>
   <w:num w:numId="19">
+    <w:abstractNumId w:val="21"/>
+  </w:num>
+  <w:num w:numId="20">
+    <w:abstractNumId w:val="43"/>
+  </w:num>
+  <w:num w:numId="21">
     <w:abstractNumId w:val="19"/>
   </w:num>
-  <w:num w:numId="20">
-    <w:abstractNumId w:val="40"/>
-  </w:num>
-  <w:num w:numId="21">
-    <w:abstractNumId w:val="17"/>
-  </w:num>
   <w:num w:numId="22">
-    <w:abstractNumId w:val="42"/>
+    <w:abstractNumId w:val="45"/>
   </w:num>
   <w:num w:numId="23">
-    <w:abstractNumId w:val="25"/>
+    <w:abstractNumId w:val="27"/>
   </w:num>
   <w:num w:numId="24">
     <w:abstractNumId w:val="7"/>
   </w:num>
   <w:num w:numId="25">
-    <w:abstractNumId w:val="31"/>
+    <w:abstractNumId w:val="34"/>
   </w:num>
   <w:num w:numId="26">
     <w:abstractNumId w:val="10"/>
   </w:num>
   <w:num w:numId="27">
-    <w:abstractNumId w:val="38"/>
+    <w:abstractNumId w:val="41"/>
   </w:num>
   <w:num w:numId="28">
-    <w:abstractNumId w:val="23"/>
+    <w:abstractNumId w:val="25"/>
   </w:num>
   <w:num w:numId="29">
-    <w:abstractNumId w:val="18"/>
+    <w:abstractNumId w:val="20"/>
   </w:num>
   <w:num w:numId="30">
-    <w:abstractNumId w:val="21"/>
+    <w:abstractNumId w:val="23"/>
   </w:num>
   <w:num w:numId="31">
     <w:abstractNumId w:val="3"/>
   </w:num>
   <w:num w:numId="32">
-    <w:abstractNumId w:val="41"/>
+    <w:abstractNumId w:val="44"/>
   </w:num>
   <w:num w:numId="33">
-    <w:abstractNumId w:val="28"/>
+    <w:abstractNumId w:val="30"/>
   </w:num>
   <w:num w:numId="34">
-    <w:abstractNumId w:val="39"/>
+    <w:abstractNumId w:val="42"/>
   </w:num>
   <w:num w:numId="35">
     <w:abstractNumId w:val="6"/>
   </w:num>
   <w:num w:numId="36">
-    <w:abstractNumId w:val="26"/>
+    <w:abstractNumId w:val="28"/>
   </w:num>
   <w:num w:numId="37">
     <w:abstractNumId w:val="0"/>
   </w:num>
   <w:num w:numId="38">
-    <w:abstractNumId w:val="11"/>
+    <w:abstractNumId w:val="12"/>
   </w:num>
   <w:num w:numId="39">
-    <w:abstractNumId w:val="27"/>
+    <w:abstractNumId w:val="29"/>
   </w:num>
   <w:num w:numId="40">
-    <w:abstractNumId w:val="22"/>
+    <w:abstractNumId w:val="24"/>
   </w:num>
   <w:num w:numId="41">
     <w:abstractNumId w:val="8"/>
   </w:num>
   <w:num w:numId="42">
-    <w:abstractNumId w:val="37"/>
+    <w:abstractNumId w:val="40"/>
   </w:num>
   <w:num w:numId="43">
-    <w:abstractNumId w:val="24"/>
+    <w:abstractNumId w:val="26"/>
   </w:num>
   <w:num w:numId="44">
-    <w:abstractNumId w:val="15"/>
+    <w:abstractNumId w:val="16"/>
   </w:num>
   <w:num w:numId="45">
-    <w:abstractNumId w:val="30"/>
+    <w:abstractNumId w:val="33"/>
+  </w:num>
+  <w:num w:numId="46">
+    <w:abstractNumId w:val="32"/>
+  </w:num>
+  <w:num w:numId="47">
+    <w:abstractNumId w:val="17"/>
+  </w:num>
+  <w:num w:numId="48">
+    <w:abstractNumId w:val="11"/>
   </w:num>
 </w:numbering>
 </file>

</xml_diff>

<commit_message>
doc12 / registro de riesgos actulaizado
</commit_message>
<xml_diff>
--- a/DocumentoCompProyectoMercados_GCC.docx
+++ b/DocumentoCompProyectoMercados_GCC.docx
@@ -448,7 +448,7 @@
           <w:r>
             <w:fldChar w:fldCharType="separate"/>
           </w:r>
-          <w:hyperlink w:anchor="_Toc232542587" w:history="1">
+          <w:hyperlink w:anchor="_Toc232544607" w:history="1">
             <w:r>
               <w:rPr>
                 <w:rStyle w:val="Hipervnculo"/>
@@ -490,7 +490,7 @@
                 <w:noProof/>
                 <w:webHidden/>
               </w:rPr>
-              <w:instrText xml:space="preserve"> PAGEREF _Toc232542587 \h </w:instrText>
+              <w:instrText xml:space="preserve"> PAGEREF _Toc232544607 \h </w:instrText>
             </w:r>
             <w:r>
               <w:rPr>
@@ -534,7 +534,7 @@
               <w:lang w:val="es-ES" w:eastAsia="es-ES"/>
             </w:rPr>
           </w:pPr>
-          <w:hyperlink w:anchor="_Toc232542588" w:history="1">
+          <w:hyperlink w:anchor="_Toc232544608" w:history="1">
             <w:r>
               <w:rPr>
                 <w:rStyle w:val="Hipervnculo"/>
@@ -576,7 +576,7 @@
                 <w:noProof/>
                 <w:webHidden/>
               </w:rPr>
-              <w:instrText xml:space="preserve"> PAGEREF _Toc232542588 \h </w:instrText>
+              <w:instrText xml:space="preserve"> PAGEREF _Toc232544608 \h </w:instrText>
             </w:r>
             <w:r>
               <w:rPr>
@@ -620,7 +620,7 @@
               <w:lang w:val="es-ES" w:eastAsia="es-ES"/>
             </w:rPr>
           </w:pPr>
-          <w:hyperlink w:anchor="_Toc232542589" w:history="1">
+          <w:hyperlink w:anchor="_Toc232544609" w:history="1">
             <w:r>
               <w:rPr>
                 <w:rStyle w:val="Hipervnculo"/>
@@ -662,7 +662,7 @@
                 <w:noProof/>
                 <w:webHidden/>
               </w:rPr>
-              <w:instrText xml:space="preserve"> PAGEREF _Toc232542589 \h </w:instrText>
+              <w:instrText xml:space="preserve"> PAGEREF _Toc232544609 \h </w:instrText>
             </w:r>
             <w:r>
               <w:rPr>
@@ -706,7 +706,7 @@
               <w:lang w:val="es-ES" w:eastAsia="es-ES"/>
             </w:rPr>
           </w:pPr>
-          <w:hyperlink w:anchor="_Toc232542590" w:history="1">
+          <w:hyperlink w:anchor="_Toc232544610" w:history="1">
             <w:r>
               <w:rPr>
                 <w:rStyle w:val="Hipervnculo"/>
@@ -748,7 +748,7 @@
                 <w:noProof/>
                 <w:webHidden/>
               </w:rPr>
-              <w:instrText xml:space="preserve"> PAGEREF _Toc232542590 \h </w:instrText>
+              <w:instrText xml:space="preserve"> PAGEREF _Toc232544610 \h </w:instrText>
             </w:r>
             <w:r>
               <w:rPr>
@@ -792,7 +792,7 @@
               <w:lang w:val="es-ES" w:eastAsia="es-ES"/>
             </w:rPr>
           </w:pPr>
-          <w:hyperlink w:anchor="_Toc232542591" w:history="1">
+          <w:hyperlink w:anchor="_Toc232544611" w:history="1">
             <w:r>
               <w:rPr>
                 <w:rStyle w:val="Hipervnculo"/>
@@ -834,7 +834,7 @@
                 <w:noProof/>
                 <w:webHidden/>
               </w:rPr>
-              <w:instrText xml:space="preserve"> PAGEREF _Toc232542591 \h </w:instrText>
+              <w:instrText xml:space="preserve"> PAGEREF _Toc232544611 \h </w:instrText>
             </w:r>
             <w:r>
               <w:rPr>
@@ -878,7 +878,7 @@
               <w:lang w:val="es-ES" w:eastAsia="es-ES"/>
             </w:rPr>
           </w:pPr>
-          <w:hyperlink w:anchor="_Toc232542592" w:history="1">
+          <w:hyperlink w:anchor="_Toc232544612" w:history="1">
             <w:r>
               <w:rPr>
                 <w:rStyle w:val="Hipervnculo"/>
@@ -920,7 +920,7 @@
                 <w:noProof/>
                 <w:webHidden/>
               </w:rPr>
-              <w:instrText xml:space="preserve"> PAGEREF _Toc232542592 \h </w:instrText>
+              <w:instrText xml:space="preserve"> PAGEREF _Toc232544612 \h </w:instrText>
             </w:r>
             <w:r>
               <w:rPr>
@@ -964,7 +964,7 @@
               <w:lang w:val="es-ES" w:eastAsia="es-ES"/>
             </w:rPr>
           </w:pPr>
-          <w:hyperlink w:anchor="_Toc232542593" w:history="1">
+          <w:hyperlink w:anchor="_Toc232544613" w:history="1">
             <w:r>
               <w:rPr>
                 <w:rStyle w:val="Hipervnculo"/>
@@ -1006,7 +1006,7 @@
                 <w:noProof/>
                 <w:webHidden/>
               </w:rPr>
-              <w:instrText xml:space="preserve"> PAGEREF _Toc232542593 \h </w:instrText>
+              <w:instrText xml:space="preserve"> PAGEREF _Toc232544613 \h </w:instrText>
             </w:r>
             <w:r>
               <w:rPr>
@@ -1050,7 +1050,7 @@
               <w:lang w:val="es-ES" w:eastAsia="es-ES"/>
             </w:rPr>
           </w:pPr>
-          <w:hyperlink w:anchor="_Toc232542594" w:history="1">
+          <w:hyperlink w:anchor="_Toc232544614" w:history="1">
             <w:r>
               <w:rPr>
                 <w:rStyle w:val="Hipervnculo"/>
@@ -1092,7 +1092,7 @@
                 <w:noProof/>
                 <w:webHidden/>
               </w:rPr>
-              <w:instrText xml:space="preserve"> PAGEREF _Toc232542594 \h </w:instrText>
+              <w:instrText xml:space="preserve"> PAGEREF _Toc232544614 \h </w:instrText>
             </w:r>
             <w:r>
               <w:rPr>
@@ -1136,7 +1136,7 @@
               <w:lang w:val="es-ES" w:eastAsia="es-ES"/>
             </w:rPr>
           </w:pPr>
-          <w:hyperlink w:anchor="_Toc232542595" w:history="1">
+          <w:hyperlink w:anchor="_Toc232544615" w:history="1">
             <w:r>
               <w:rPr>
                 <w:rStyle w:val="Hipervnculo"/>
@@ -1178,7 +1178,7 @@
                 <w:noProof/>
                 <w:webHidden/>
               </w:rPr>
-              <w:instrText xml:space="preserve"> PAGEREF _Toc232542595 \h </w:instrText>
+              <w:instrText xml:space="preserve"> PAGEREF _Toc232544615 \h </w:instrText>
             </w:r>
             <w:r>
               <w:rPr>
@@ -1222,7 +1222,7 @@
               <w:lang w:val="es-ES" w:eastAsia="es-ES"/>
             </w:rPr>
           </w:pPr>
-          <w:hyperlink w:anchor="_Toc232542596" w:history="1">
+          <w:hyperlink w:anchor="_Toc232544616" w:history="1">
             <w:r>
               <w:rPr>
                 <w:rStyle w:val="Hipervnculo"/>
@@ -1264,7 +1264,7 @@
                 <w:noProof/>
                 <w:webHidden/>
               </w:rPr>
-              <w:instrText xml:space="preserve"> PAGEREF _Toc232542596 \h </w:instrText>
+              <w:instrText xml:space="preserve"> PAGEREF _Toc232544616 \h </w:instrText>
             </w:r>
             <w:r>
               <w:rPr>
@@ -1308,7 +1308,7 @@
               <w:lang w:val="es-ES" w:eastAsia="es-ES"/>
             </w:rPr>
           </w:pPr>
-          <w:hyperlink w:anchor="_Toc232542597" w:history="1">
+          <w:hyperlink w:anchor="_Toc232544617" w:history="1">
             <w:r>
               <w:rPr>
                 <w:rStyle w:val="Hipervnculo"/>
@@ -1350,7 +1350,7 @@
                 <w:noProof/>
                 <w:webHidden/>
               </w:rPr>
-              <w:instrText xml:space="preserve"> PAGEREF _Toc232542597 \h </w:instrText>
+              <w:instrText xml:space="preserve"> PAGEREF _Toc232544617 \h </w:instrText>
             </w:r>
             <w:r>
               <w:rPr>
@@ -1394,7 +1394,7 @@
               <w:lang w:val="es-ES" w:eastAsia="es-ES"/>
             </w:rPr>
           </w:pPr>
-          <w:hyperlink w:anchor="_Toc232542598" w:history="1">
+          <w:hyperlink w:anchor="_Toc232544618" w:history="1">
             <w:r>
               <w:rPr>
                 <w:rStyle w:val="Hipervnculo"/>
@@ -1436,7 +1436,7 @@
                 <w:noProof/>
                 <w:webHidden/>
               </w:rPr>
-              <w:instrText xml:space="preserve"> PAGEREF _Toc232542598 \h </w:instrText>
+              <w:instrText xml:space="preserve"> PAGEREF _Toc232544618 \h </w:instrText>
             </w:r>
             <w:r>
               <w:rPr>
@@ -1480,7 +1480,7 @@
               <w:lang w:val="es-ES" w:eastAsia="es-ES"/>
             </w:rPr>
           </w:pPr>
-          <w:hyperlink w:anchor="_Toc232542599" w:history="1">
+          <w:hyperlink w:anchor="_Toc232544619" w:history="1">
             <w:r>
               <w:rPr>
                 <w:rStyle w:val="Hipervnculo"/>
@@ -1522,7 +1522,7 @@
                 <w:noProof/>
                 <w:webHidden/>
               </w:rPr>
-              <w:instrText xml:space="preserve"> PAGEREF _Toc232542599 \h </w:instrText>
+              <w:instrText xml:space="preserve"> PAGEREF _Toc232544619 \h </w:instrText>
             </w:r>
             <w:r>
               <w:rPr>
@@ -1566,7 +1566,7 @@
               <w:lang w:val="es-ES" w:eastAsia="es-ES"/>
             </w:rPr>
           </w:pPr>
-          <w:hyperlink w:anchor="_Toc232542600" w:history="1">
+          <w:hyperlink w:anchor="_Toc232544620" w:history="1">
             <w:r>
               <w:rPr>
                 <w:rStyle w:val="Hipervnculo"/>
@@ -1608,7 +1608,7 @@
                 <w:noProof/>
                 <w:webHidden/>
               </w:rPr>
-              <w:instrText xml:space="preserve"> PAGEREF _Toc232542600 \h </w:instrText>
+              <w:instrText xml:space="preserve"> PAGEREF _Toc232544620 \h </w:instrText>
             </w:r>
             <w:r>
               <w:rPr>
@@ -1652,7 +1652,7 @@
               <w:lang w:val="es-ES" w:eastAsia="es-ES"/>
             </w:rPr>
           </w:pPr>
-          <w:hyperlink w:anchor="_Toc232542601" w:history="1">
+          <w:hyperlink w:anchor="_Toc232544621" w:history="1">
             <w:r>
               <w:rPr>
                 <w:rStyle w:val="Hipervnculo"/>
@@ -1694,7 +1694,7 @@
                 <w:noProof/>
                 <w:webHidden/>
               </w:rPr>
-              <w:instrText xml:space="preserve"> PAGEREF _Toc232542601 \h </w:instrText>
+              <w:instrText xml:space="preserve"> PAGEREF _Toc232544621 \h </w:instrText>
             </w:r>
             <w:r>
               <w:rPr>
@@ -1738,7 +1738,7 @@
               <w:lang w:val="es-ES" w:eastAsia="es-ES"/>
             </w:rPr>
           </w:pPr>
-          <w:hyperlink w:anchor="_Toc232542602" w:history="1">
+          <w:hyperlink w:anchor="_Toc232544622" w:history="1">
             <w:r>
               <w:rPr>
                 <w:rStyle w:val="Hipervnculo"/>
@@ -1780,7 +1780,7 @@
                 <w:noProof/>
                 <w:webHidden/>
               </w:rPr>
-              <w:instrText xml:space="preserve"> PAGEREF _Toc232542602 \h </w:instrText>
+              <w:instrText xml:space="preserve"> PAGEREF _Toc232544622 \h </w:instrText>
             </w:r>
             <w:r>
               <w:rPr>
@@ -1824,7 +1824,7 @@
               <w:lang w:val="es-ES" w:eastAsia="es-ES"/>
             </w:rPr>
           </w:pPr>
-          <w:hyperlink w:anchor="_Toc232542603" w:history="1">
+          <w:hyperlink w:anchor="_Toc232544623" w:history="1">
             <w:r>
               <w:rPr>
                 <w:rStyle w:val="Hipervnculo"/>
@@ -1866,7 +1866,7 @@
                 <w:noProof/>
                 <w:webHidden/>
               </w:rPr>
-              <w:instrText xml:space="preserve"> PAGEREF _Toc232542603 \h </w:instrText>
+              <w:instrText xml:space="preserve"> PAGEREF _Toc232544623 \h </w:instrText>
             </w:r>
             <w:r>
               <w:rPr>
@@ -1910,7 +1910,7 @@
               <w:lang w:val="es-ES" w:eastAsia="es-ES"/>
             </w:rPr>
           </w:pPr>
-          <w:hyperlink w:anchor="_Toc232542604" w:history="1">
+          <w:hyperlink w:anchor="_Toc232544624" w:history="1">
             <w:r>
               <w:rPr>
                 <w:rStyle w:val="Hipervnculo"/>
@@ -1952,7 +1952,7 @@
                 <w:noProof/>
                 <w:webHidden/>
               </w:rPr>
-              <w:instrText xml:space="preserve"> PAGEREF _Toc232542604 \h </w:instrText>
+              <w:instrText xml:space="preserve"> PAGEREF _Toc232544624 \h </w:instrText>
             </w:r>
             <w:r>
               <w:rPr>
@@ -1996,7 +1996,7 @@
               <w:lang w:val="es-ES" w:eastAsia="es-ES"/>
             </w:rPr>
           </w:pPr>
-          <w:hyperlink w:anchor="_Toc232542605" w:history="1">
+          <w:hyperlink w:anchor="_Toc232544625" w:history="1">
             <w:r>
               <w:rPr>
                 <w:rStyle w:val="Hipervnculo"/>
@@ -2038,7 +2038,7 @@
                 <w:noProof/>
                 <w:webHidden/>
               </w:rPr>
-              <w:instrText xml:space="preserve"> PAGEREF _Toc232542605 \h </w:instrText>
+              <w:instrText xml:space="preserve"> PAGEREF _Toc232544625 \h </w:instrText>
             </w:r>
             <w:r>
               <w:rPr>
@@ -2082,7 +2082,7 @@
               <w:lang w:val="es-ES" w:eastAsia="es-ES"/>
             </w:rPr>
           </w:pPr>
-          <w:hyperlink w:anchor="_Toc232542606" w:history="1">
+          <w:hyperlink w:anchor="_Toc232544626" w:history="1">
             <w:r>
               <w:rPr>
                 <w:rStyle w:val="Hipervnculo"/>
@@ -2124,7 +2124,7 @@
                 <w:noProof/>
                 <w:webHidden/>
               </w:rPr>
-              <w:instrText xml:space="preserve"> PAGEREF _Toc232542606 \h </w:instrText>
+              <w:instrText xml:space="preserve"> PAGEREF _Toc232544626 \h </w:instrText>
             </w:r>
             <w:r>
               <w:rPr>
@@ -2168,7 +2168,7 @@
               <w:lang w:val="es-ES" w:eastAsia="es-ES"/>
             </w:rPr>
           </w:pPr>
-          <w:hyperlink w:anchor="_Toc232542607" w:history="1">
+          <w:hyperlink w:anchor="_Toc232544627" w:history="1">
             <w:r>
               <w:rPr>
                 <w:rStyle w:val="Hipervnculo"/>
@@ -2210,7 +2210,7 @@
                 <w:noProof/>
                 <w:webHidden/>
               </w:rPr>
-              <w:instrText xml:space="preserve"> PAGEREF _Toc232542607 \h </w:instrText>
+              <w:instrText xml:space="preserve"> PAGEREF _Toc232544627 \h </w:instrText>
             </w:r>
             <w:r>
               <w:rPr>
@@ -2254,7 +2254,7 @@
               <w:lang w:val="es-ES" w:eastAsia="es-ES"/>
             </w:rPr>
           </w:pPr>
-          <w:hyperlink w:anchor="_Toc232542608" w:history="1">
+          <w:hyperlink w:anchor="_Toc232544628" w:history="1">
             <w:r>
               <w:rPr>
                 <w:rStyle w:val="Hipervnculo"/>
@@ -2296,7 +2296,7 @@
                 <w:noProof/>
                 <w:webHidden/>
               </w:rPr>
-              <w:instrText xml:space="preserve"> PAGEREF _Toc232542608 \h </w:instrText>
+              <w:instrText xml:space="preserve"> PAGEREF _Toc232544628 \h </w:instrText>
             </w:r>
             <w:r>
               <w:rPr>
@@ -2340,7 +2340,7 @@
               <w:lang w:val="es-ES" w:eastAsia="es-ES"/>
             </w:rPr>
           </w:pPr>
-          <w:hyperlink w:anchor="_Toc232542609" w:history="1">
+          <w:hyperlink w:anchor="_Toc232544629" w:history="1">
             <w:r>
               <w:rPr>
                 <w:rStyle w:val="Hipervnculo"/>
@@ -2382,7 +2382,7 @@
                 <w:noProof/>
                 <w:webHidden/>
               </w:rPr>
-              <w:instrText xml:space="preserve"> PAGEREF _Toc232542609 \h </w:instrText>
+              <w:instrText xml:space="preserve"> PAGEREF _Toc232544629 \h </w:instrText>
             </w:r>
             <w:r>
               <w:rPr>
@@ -2426,7 +2426,7 @@
               <w:lang w:val="es-ES" w:eastAsia="es-ES"/>
             </w:rPr>
           </w:pPr>
-          <w:hyperlink w:anchor="_Toc232542610" w:history="1">
+          <w:hyperlink w:anchor="_Toc232544630" w:history="1">
             <w:r>
               <w:rPr>
                 <w:rStyle w:val="Hipervnculo"/>
@@ -2468,7 +2468,7 @@
                 <w:noProof/>
                 <w:webHidden/>
               </w:rPr>
-              <w:instrText xml:space="preserve"> PAGEREF _Toc232542610 \h </w:instrText>
+              <w:instrText xml:space="preserve"> PAGEREF _Toc232544630 \h </w:instrText>
             </w:r>
             <w:r>
               <w:rPr>
@@ -2512,7 +2512,7 @@
               <w:lang w:val="es-ES" w:eastAsia="es-ES"/>
             </w:rPr>
           </w:pPr>
-          <w:hyperlink w:anchor="_Toc232542611" w:history="1">
+          <w:hyperlink w:anchor="_Toc232544631" w:history="1">
             <w:r>
               <w:rPr>
                 <w:rStyle w:val="Hipervnculo"/>
@@ -2554,7 +2554,7 @@
                 <w:noProof/>
                 <w:webHidden/>
               </w:rPr>
-              <w:instrText xml:space="preserve"> PAGEREF _Toc232542611 \h </w:instrText>
+              <w:instrText xml:space="preserve"> PAGEREF _Toc232544631 \h </w:instrText>
             </w:r>
             <w:r>
               <w:rPr>
@@ -2598,7 +2598,7 @@
               <w:lang w:val="es-ES" w:eastAsia="es-ES"/>
             </w:rPr>
           </w:pPr>
-          <w:hyperlink w:anchor="_Toc232542612" w:history="1">
+          <w:hyperlink w:anchor="_Toc232544632" w:history="1">
             <w:r>
               <w:rPr>
                 <w:rStyle w:val="Hipervnculo"/>
@@ -2640,7 +2640,7 @@
                 <w:noProof/>
                 <w:webHidden/>
               </w:rPr>
-              <w:instrText xml:space="preserve"> PAGEREF _Toc232542612 \h </w:instrText>
+              <w:instrText xml:space="preserve"> PAGEREF _Toc232544632 \h </w:instrText>
             </w:r>
             <w:r>
               <w:rPr>
@@ -2684,7 +2684,7 @@
               <w:lang w:val="es-ES" w:eastAsia="es-ES"/>
             </w:rPr>
           </w:pPr>
-          <w:hyperlink w:anchor="_Toc232542613" w:history="1">
+          <w:hyperlink w:anchor="_Toc232544633" w:history="1">
             <w:r>
               <w:rPr>
                 <w:rStyle w:val="Hipervnculo"/>
@@ -2726,7 +2726,7 @@
                 <w:noProof/>
                 <w:webHidden/>
               </w:rPr>
-              <w:instrText xml:space="preserve"> PAGEREF _Toc232542613 \h </w:instrText>
+              <w:instrText xml:space="preserve"> PAGEREF _Toc232544633 \h </w:instrText>
             </w:r>
             <w:r>
               <w:rPr>
@@ -2770,7 +2770,7 @@
               <w:lang w:val="es-ES" w:eastAsia="es-ES"/>
             </w:rPr>
           </w:pPr>
-          <w:hyperlink w:anchor="_Toc232542614" w:history="1">
+          <w:hyperlink w:anchor="_Toc232544634" w:history="1">
             <w:r>
               <w:rPr>
                 <w:rStyle w:val="Hipervnculo"/>
@@ -2812,7 +2812,7 @@
                 <w:noProof/>
                 <w:webHidden/>
               </w:rPr>
-              <w:instrText xml:space="preserve"> PAGEREF _Toc232542614 \h </w:instrText>
+              <w:instrText xml:space="preserve"> PAGEREF _Toc232544634 \h </w:instrText>
             </w:r>
             <w:r>
               <w:rPr>
@@ -2856,7 +2856,7 @@
               <w:lang w:val="es-ES" w:eastAsia="es-ES"/>
             </w:rPr>
           </w:pPr>
-          <w:hyperlink w:anchor="_Toc232542615" w:history="1">
+          <w:hyperlink w:anchor="_Toc232544635" w:history="1">
             <w:r>
               <w:rPr>
                 <w:rStyle w:val="Hipervnculo"/>
@@ -2898,7 +2898,7 @@
                 <w:noProof/>
                 <w:webHidden/>
               </w:rPr>
-              <w:instrText xml:space="preserve"> PAGEREF _Toc232542615 \h </w:instrText>
+              <w:instrText xml:space="preserve"> PAGEREF _Toc232544635 \h </w:instrText>
             </w:r>
             <w:r>
               <w:rPr>
@@ -2942,7 +2942,7 @@
               <w:lang w:val="es-ES" w:eastAsia="es-ES"/>
             </w:rPr>
           </w:pPr>
-          <w:hyperlink w:anchor="_Toc232542616" w:history="1">
+          <w:hyperlink w:anchor="_Toc232544636" w:history="1">
             <w:r>
               <w:rPr>
                 <w:rStyle w:val="Hipervnculo"/>
@@ -2984,7 +2984,7 @@
                 <w:noProof/>
                 <w:webHidden/>
               </w:rPr>
-              <w:instrText xml:space="preserve"> PAGEREF _Toc232542616 \h </w:instrText>
+              <w:instrText xml:space="preserve"> PAGEREF _Toc232544636 \h </w:instrText>
             </w:r>
             <w:r>
               <w:rPr>
@@ -3028,7 +3028,7 @@
               <w:lang w:val="es-ES" w:eastAsia="es-ES"/>
             </w:rPr>
           </w:pPr>
-          <w:hyperlink w:anchor="_Toc232542617" w:history="1">
+          <w:hyperlink w:anchor="_Toc232544637" w:history="1">
             <w:r>
               <w:rPr>
                 <w:rStyle w:val="Hipervnculo"/>
@@ -3070,7 +3070,7 @@
                 <w:noProof/>
                 <w:webHidden/>
               </w:rPr>
-              <w:instrText xml:space="preserve"> PAGEREF _Toc232542617 \h </w:instrText>
+              <w:instrText xml:space="preserve"> PAGEREF _Toc232544637 \h </w:instrText>
             </w:r>
             <w:r>
               <w:rPr>
@@ -3114,7 +3114,7 @@
               <w:lang w:val="es-ES" w:eastAsia="es-ES"/>
             </w:rPr>
           </w:pPr>
-          <w:hyperlink w:anchor="_Toc232542618" w:history="1">
+          <w:hyperlink w:anchor="_Toc232544638" w:history="1">
             <w:r>
               <w:rPr>
                 <w:rStyle w:val="Hipervnculo"/>
@@ -3240,7 +3240,7 @@
                 <w:noProof/>
                 <w:webHidden/>
               </w:rPr>
-              <w:instrText xml:space="preserve"> PAGEREF _Toc232542618 \h </w:instrText>
+              <w:instrText xml:space="preserve"> PAGEREF _Toc232544638 \h </w:instrText>
             </w:r>
             <w:r>
               <w:rPr>
@@ -3284,7 +3284,7 @@
               <w:lang w:val="es-ES" w:eastAsia="es-ES"/>
             </w:rPr>
           </w:pPr>
-          <w:hyperlink w:anchor="_Toc232542619" w:history="1">
+          <w:hyperlink w:anchor="_Toc232544639" w:history="1">
             <w:r>
               <w:rPr>
                 <w:rStyle w:val="Hipervnculo"/>
@@ -3326,7 +3326,7 @@
                 <w:noProof/>
                 <w:webHidden/>
               </w:rPr>
-              <w:instrText xml:space="preserve"> PAGEREF _Toc232542619 \h </w:instrText>
+              <w:instrText xml:space="preserve"> PAGEREF _Toc232544639 \h </w:instrText>
             </w:r>
             <w:r>
               <w:rPr>
@@ -3370,7 +3370,7 @@
               <w:lang w:val="es-ES" w:eastAsia="es-ES"/>
             </w:rPr>
           </w:pPr>
-          <w:hyperlink w:anchor="_Toc232542620" w:history="1">
+          <w:hyperlink w:anchor="_Toc232544640" w:history="1">
             <w:r>
               <w:rPr>
                 <w:rStyle w:val="Hipervnculo"/>
@@ -3412,7 +3412,7 @@
                 <w:noProof/>
                 <w:webHidden/>
               </w:rPr>
-              <w:instrText xml:space="preserve"> PAGEREF _Toc232542620 \h </w:instrText>
+              <w:instrText xml:space="preserve"> PAGEREF _Toc232544640 \h </w:instrText>
             </w:r>
             <w:r>
               <w:rPr>
@@ -3456,7 +3456,7 @@
               <w:lang w:val="es-ES" w:eastAsia="es-ES"/>
             </w:rPr>
           </w:pPr>
-          <w:hyperlink w:anchor="_Toc232542621" w:history="1">
+          <w:hyperlink w:anchor="_Toc232544641" w:history="1">
             <w:r>
               <w:rPr>
                 <w:rStyle w:val="Hipervnculo"/>
@@ -3498,7 +3498,7 @@
                 <w:noProof/>
                 <w:webHidden/>
               </w:rPr>
-              <w:instrText xml:space="preserve"> PAGEREF _Toc232542621 \h </w:instrText>
+              <w:instrText xml:space="preserve"> PAGEREF _Toc232544641 \h </w:instrText>
             </w:r>
             <w:r>
               <w:rPr>
@@ -3542,7 +3542,7 @@
               <w:lang w:val="es-ES" w:eastAsia="es-ES"/>
             </w:rPr>
           </w:pPr>
-          <w:hyperlink w:anchor="_Toc232542622" w:history="1">
+          <w:hyperlink w:anchor="_Toc232544642" w:history="1">
             <w:r>
               <w:rPr>
                 <w:rStyle w:val="Hipervnculo"/>
@@ -3584,7 +3584,7 @@
                 <w:noProof/>
                 <w:webHidden/>
               </w:rPr>
-              <w:instrText xml:space="preserve"> PAGEREF _Toc232542622 \h </w:instrText>
+              <w:instrText xml:space="preserve"> PAGEREF _Toc232544642 \h </w:instrText>
             </w:r>
             <w:r>
               <w:rPr>
@@ -3628,7 +3628,7 @@
               <w:lang w:val="es-ES" w:eastAsia="es-ES"/>
             </w:rPr>
           </w:pPr>
-          <w:hyperlink w:anchor="_Toc232542623" w:history="1">
+          <w:hyperlink w:anchor="_Toc232544643" w:history="1">
             <w:r>
               <w:rPr>
                 <w:rStyle w:val="Hipervnculo"/>
@@ -3670,7 +3670,7 @@
                 <w:noProof/>
                 <w:webHidden/>
               </w:rPr>
-              <w:instrText xml:space="preserve"> PAGEREF _Toc232542623 \h </w:instrText>
+              <w:instrText xml:space="preserve"> PAGEREF _Toc232544643 \h </w:instrText>
             </w:r>
             <w:r>
               <w:rPr>
@@ -3714,7 +3714,7 @@
               <w:lang w:val="es-ES" w:eastAsia="es-ES"/>
             </w:rPr>
           </w:pPr>
-          <w:hyperlink w:anchor="_Toc232542624" w:history="1">
+          <w:hyperlink w:anchor="_Toc232544644" w:history="1">
             <w:r>
               <w:rPr>
                 <w:rStyle w:val="Hipervnculo"/>
@@ -3756,7 +3756,7 @@
                 <w:noProof/>
                 <w:webHidden/>
               </w:rPr>
-              <w:instrText xml:space="preserve"> PAGEREF _Toc232542624 \h </w:instrText>
+              <w:instrText xml:space="preserve"> PAGEREF _Toc232544644 \h </w:instrText>
             </w:r>
             <w:r>
               <w:rPr>
@@ -3800,7 +3800,7 @@
               <w:lang w:val="es-ES" w:eastAsia="es-ES"/>
             </w:rPr>
           </w:pPr>
-          <w:hyperlink w:anchor="_Toc232542625" w:history="1">
+          <w:hyperlink w:anchor="_Toc232544645" w:history="1">
             <w:r>
               <w:rPr>
                 <w:rStyle w:val="Hipervnculo"/>
@@ -3842,7 +3842,7 @@
                 <w:noProof/>
                 <w:webHidden/>
               </w:rPr>
-              <w:instrText xml:space="preserve"> PAGEREF _Toc232542625 \h </w:instrText>
+              <w:instrText xml:space="preserve"> PAGEREF _Toc232544645 \h </w:instrText>
             </w:r>
             <w:r>
               <w:rPr>
@@ -3886,7 +3886,7 @@
               <w:lang w:val="es-ES" w:eastAsia="es-ES"/>
             </w:rPr>
           </w:pPr>
-          <w:hyperlink w:anchor="_Toc232542626" w:history="1">
+          <w:hyperlink w:anchor="_Toc232544646" w:history="1">
             <w:r>
               <w:rPr>
                 <w:rStyle w:val="Hipervnculo"/>
@@ -3928,7 +3928,7 @@
                 <w:noProof/>
                 <w:webHidden/>
               </w:rPr>
-              <w:instrText xml:space="preserve"> PAGEREF _Toc232542626 \h </w:instrText>
+              <w:instrText xml:space="preserve"> PAGEREF _Toc232544646 \h </w:instrText>
             </w:r>
             <w:r>
               <w:rPr>
@@ -3972,7 +3972,7 @@
               <w:lang w:val="es-ES" w:eastAsia="es-ES"/>
             </w:rPr>
           </w:pPr>
-          <w:hyperlink w:anchor="_Toc232542627" w:history="1">
+          <w:hyperlink w:anchor="_Toc232544647" w:history="1">
             <w:r>
               <w:rPr>
                 <w:rStyle w:val="Hipervnculo"/>
@@ -4014,7 +4014,7 @@
                 <w:noProof/>
                 <w:webHidden/>
               </w:rPr>
-              <w:instrText xml:space="preserve"> PAGEREF _Toc232542627 \h </w:instrText>
+              <w:instrText xml:space="preserve"> PAGEREF _Toc232544647 \h </w:instrText>
             </w:r>
             <w:r>
               <w:rPr>
@@ -4058,7 +4058,7 @@
               <w:lang w:val="es-ES" w:eastAsia="es-ES"/>
             </w:rPr>
           </w:pPr>
-          <w:hyperlink w:anchor="_Toc232542628" w:history="1">
+          <w:hyperlink w:anchor="_Toc232544648" w:history="1">
             <w:r>
               <w:rPr>
                 <w:rStyle w:val="Hipervnculo"/>
@@ -4108,7 +4108,7 @@
                 <w:noProof/>
                 <w:webHidden/>
               </w:rPr>
-              <w:instrText xml:space="preserve"> PAGEREF _Toc232542628 \h </w:instrText>
+              <w:instrText xml:space="preserve"> PAGEREF _Toc232544648 \h </w:instrText>
             </w:r>
             <w:r>
               <w:rPr>
@@ -4129,6 +4129,780 @@
                 <w:webHidden/>
               </w:rPr>
               <w:t>16</w:t>
+            </w:r>
+            <w:r>
+              <w:rPr>
+                <w:noProof/>
+                <w:webHidden/>
+              </w:rPr>
+              <w:fldChar w:fldCharType="end"/>
+            </w:r>
+          </w:hyperlink>
+        </w:p>
+        <w:p>
+          <w:pPr>
+            <w:pStyle w:val="TDC1"/>
+            <w:tabs>
+              <w:tab w:val="left" w:pos="660"/>
+              <w:tab w:val="right" w:leader="dot" w:pos="9395"/>
+            </w:tabs>
+            <w:rPr>
+              <w:rFonts w:eastAsiaTheme="minorEastAsia"/>
+              <w:noProof/>
+              <w:lang w:val="es-ES" w:eastAsia="es-ES"/>
+            </w:rPr>
+          </w:pPr>
+          <w:hyperlink w:anchor="_Toc232544649" w:history="1">
+            <w:r>
+              <w:rPr>
+                <w:rStyle w:val="Hipervnculo"/>
+                <w:noProof/>
+              </w:rPr>
+              <w:t>11.</w:t>
+            </w:r>
+            <w:r>
+              <w:rPr>
+                <w:rFonts w:eastAsiaTheme="minorEastAsia"/>
+                <w:noProof/>
+                <w:lang w:val="es-ES" w:eastAsia="es-ES"/>
+              </w:rPr>
+              <w:tab/>
+            </w:r>
+            <w:r>
+              <w:rPr>
+                <w:rStyle w:val="Hipervnculo"/>
+                <w:noProof/>
+              </w:rPr>
+              <w:t>SOLICITUD DE CAMBIO FORMAL: MÓDULO DE GEOLOCALIZACIÓN</w:t>
+            </w:r>
+            <w:r>
+              <w:rPr>
+                <w:noProof/>
+                <w:webHidden/>
+              </w:rPr>
+              <w:tab/>
+            </w:r>
+            <w:r>
+              <w:rPr>
+                <w:noProof/>
+                <w:webHidden/>
+              </w:rPr>
+              <w:fldChar w:fldCharType="begin"/>
+            </w:r>
+            <w:r>
+              <w:rPr>
+                <w:noProof/>
+                <w:webHidden/>
+              </w:rPr>
+              <w:instrText xml:space="preserve"> PAGEREF _Toc232544649 \h </w:instrText>
+            </w:r>
+            <w:r>
+              <w:rPr>
+                <w:noProof/>
+                <w:webHidden/>
+              </w:rPr>
+            </w:r>
+            <w:r>
+              <w:rPr>
+                <w:noProof/>
+                <w:webHidden/>
+              </w:rPr>
+              <w:fldChar w:fldCharType="separate"/>
+            </w:r>
+            <w:r>
+              <w:rPr>
+                <w:noProof/>
+                <w:webHidden/>
+              </w:rPr>
+              <w:t>16</w:t>
+            </w:r>
+            <w:r>
+              <w:rPr>
+                <w:noProof/>
+                <w:webHidden/>
+              </w:rPr>
+              <w:fldChar w:fldCharType="end"/>
+            </w:r>
+          </w:hyperlink>
+        </w:p>
+        <w:p>
+          <w:pPr>
+            <w:pStyle w:val="TDC2"/>
+            <w:tabs>
+              <w:tab w:val="left" w:pos="1100"/>
+              <w:tab w:val="right" w:leader="dot" w:pos="9395"/>
+            </w:tabs>
+            <w:rPr>
+              <w:rFonts w:eastAsiaTheme="minorEastAsia"/>
+              <w:noProof/>
+              <w:lang w:val="es-ES" w:eastAsia="es-ES"/>
+            </w:rPr>
+          </w:pPr>
+          <w:hyperlink w:anchor="_Toc232544650" w:history="1">
+            <w:r>
+              <w:rPr>
+                <w:rStyle w:val="Hipervnculo"/>
+                <w:noProof/>
+              </w:rPr>
+              <w:t>11.1.</w:t>
+            </w:r>
+            <w:r>
+              <w:rPr>
+                <w:rFonts w:eastAsiaTheme="minorEastAsia"/>
+                <w:noProof/>
+                <w:lang w:val="es-ES" w:eastAsia="es-ES"/>
+              </w:rPr>
+              <w:tab/>
+            </w:r>
+            <w:r>
+              <w:rPr>
+                <w:rStyle w:val="Hipervnculo"/>
+                <w:noProof/>
+              </w:rPr>
+              <w:t>Descripción del Cambio Solicitado</w:t>
+            </w:r>
+            <w:r>
+              <w:rPr>
+                <w:noProof/>
+                <w:webHidden/>
+              </w:rPr>
+              <w:tab/>
+            </w:r>
+            <w:r>
+              <w:rPr>
+                <w:noProof/>
+                <w:webHidden/>
+              </w:rPr>
+              <w:fldChar w:fldCharType="begin"/>
+            </w:r>
+            <w:r>
+              <w:rPr>
+                <w:noProof/>
+                <w:webHidden/>
+              </w:rPr>
+              <w:instrText xml:space="preserve"> PAGEREF _Toc232544650 \h </w:instrText>
+            </w:r>
+            <w:r>
+              <w:rPr>
+                <w:noProof/>
+                <w:webHidden/>
+              </w:rPr>
+            </w:r>
+            <w:r>
+              <w:rPr>
+                <w:noProof/>
+                <w:webHidden/>
+              </w:rPr>
+              <w:fldChar w:fldCharType="separate"/>
+            </w:r>
+            <w:r>
+              <w:rPr>
+                <w:noProof/>
+                <w:webHidden/>
+              </w:rPr>
+              <w:t>17</w:t>
+            </w:r>
+            <w:r>
+              <w:rPr>
+                <w:noProof/>
+                <w:webHidden/>
+              </w:rPr>
+              <w:fldChar w:fldCharType="end"/>
+            </w:r>
+          </w:hyperlink>
+        </w:p>
+        <w:p>
+          <w:pPr>
+            <w:pStyle w:val="TDC2"/>
+            <w:tabs>
+              <w:tab w:val="left" w:pos="1100"/>
+              <w:tab w:val="right" w:leader="dot" w:pos="9395"/>
+            </w:tabs>
+            <w:rPr>
+              <w:rFonts w:eastAsiaTheme="minorEastAsia"/>
+              <w:noProof/>
+              <w:lang w:val="es-ES" w:eastAsia="es-ES"/>
+            </w:rPr>
+          </w:pPr>
+          <w:hyperlink w:anchor="_Toc232544651" w:history="1">
+            <w:r>
+              <w:rPr>
+                <w:rStyle w:val="Hipervnculo"/>
+                <w:noProof/>
+              </w:rPr>
+              <w:t>11.2.</w:t>
+            </w:r>
+            <w:r>
+              <w:rPr>
+                <w:rFonts w:eastAsiaTheme="minorEastAsia"/>
+                <w:noProof/>
+                <w:lang w:val="es-ES" w:eastAsia="es-ES"/>
+              </w:rPr>
+              <w:tab/>
+            </w:r>
+            <w:r>
+              <w:rPr>
+                <w:rStyle w:val="Hipervnculo"/>
+                <w:noProof/>
+              </w:rPr>
+              <w:t>Justificación del Cambio</w:t>
+            </w:r>
+            <w:r>
+              <w:rPr>
+                <w:noProof/>
+                <w:webHidden/>
+              </w:rPr>
+              <w:tab/>
+            </w:r>
+            <w:r>
+              <w:rPr>
+                <w:noProof/>
+                <w:webHidden/>
+              </w:rPr>
+              <w:fldChar w:fldCharType="begin"/>
+            </w:r>
+            <w:r>
+              <w:rPr>
+                <w:noProof/>
+                <w:webHidden/>
+              </w:rPr>
+              <w:instrText xml:space="preserve"> PAGEREF _Toc232544651 \h </w:instrText>
+            </w:r>
+            <w:r>
+              <w:rPr>
+                <w:noProof/>
+                <w:webHidden/>
+              </w:rPr>
+            </w:r>
+            <w:r>
+              <w:rPr>
+                <w:noProof/>
+                <w:webHidden/>
+              </w:rPr>
+              <w:fldChar w:fldCharType="separate"/>
+            </w:r>
+            <w:r>
+              <w:rPr>
+                <w:noProof/>
+                <w:webHidden/>
+              </w:rPr>
+              <w:t>17</w:t>
+            </w:r>
+            <w:r>
+              <w:rPr>
+                <w:noProof/>
+                <w:webHidden/>
+              </w:rPr>
+              <w:fldChar w:fldCharType="end"/>
+            </w:r>
+          </w:hyperlink>
+        </w:p>
+        <w:p>
+          <w:pPr>
+            <w:pStyle w:val="TDC2"/>
+            <w:tabs>
+              <w:tab w:val="left" w:pos="1100"/>
+              <w:tab w:val="right" w:leader="dot" w:pos="9395"/>
+            </w:tabs>
+            <w:rPr>
+              <w:rFonts w:eastAsiaTheme="minorEastAsia"/>
+              <w:noProof/>
+              <w:lang w:val="es-ES" w:eastAsia="es-ES"/>
+            </w:rPr>
+          </w:pPr>
+          <w:hyperlink w:anchor="_Toc232544652" w:history="1">
+            <w:r>
+              <w:rPr>
+                <w:rStyle w:val="Hipervnculo"/>
+                <w:noProof/>
+              </w:rPr>
+              <w:t>11.3.</w:t>
+            </w:r>
+            <w:r>
+              <w:rPr>
+                <w:rFonts w:eastAsiaTheme="minorEastAsia"/>
+                <w:noProof/>
+                <w:lang w:val="es-ES" w:eastAsia="es-ES"/>
+              </w:rPr>
+              <w:tab/>
+            </w:r>
+            <w:r>
+              <w:rPr>
+                <w:rStyle w:val="Hipervnculo"/>
+                <w:noProof/>
+              </w:rPr>
+              <w:t>Evaluación de Impacto (Análisis del Project Manager)</w:t>
+            </w:r>
+            <w:r>
+              <w:rPr>
+                <w:noProof/>
+                <w:webHidden/>
+              </w:rPr>
+              <w:tab/>
+            </w:r>
+            <w:r>
+              <w:rPr>
+                <w:noProof/>
+                <w:webHidden/>
+              </w:rPr>
+              <w:fldChar w:fldCharType="begin"/>
+            </w:r>
+            <w:r>
+              <w:rPr>
+                <w:noProof/>
+                <w:webHidden/>
+              </w:rPr>
+              <w:instrText xml:space="preserve"> PAGEREF _Toc232544652 \h </w:instrText>
+            </w:r>
+            <w:r>
+              <w:rPr>
+                <w:noProof/>
+                <w:webHidden/>
+              </w:rPr>
+            </w:r>
+            <w:r>
+              <w:rPr>
+                <w:noProof/>
+                <w:webHidden/>
+              </w:rPr>
+              <w:fldChar w:fldCharType="separate"/>
+            </w:r>
+            <w:r>
+              <w:rPr>
+                <w:noProof/>
+                <w:webHidden/>
+              </w:rPr>
+              <w:t>17</w:t>
+            </w:r>
+            <w:r>
+              <w:rPr>
+                <w:noProof/>
+                <w:webHidden/>
+              </w:rPr>
+              <w:fldChar w:fldCharType="end"/>
+            </w:r>
+          </w:hyperlink>
+        </w:p>
+        <w:p>
+          <w:pPr>
+            <w:pStyle w:val="TDC2"/>
+            <w:tabs>
+              <w:tab w:val="left" w:pos="1100"/>
+              <w:tab w:val="right" w:leader="dot" w:pos="9395"/>
+            </w:tabs>
+            <w:rPr>
+              <w:rFonts w:eastAsiaTheme="minorEastAsia"/>
+              <w:noProof/>
+              <w:lang w:val="es-ES" w:eastAsia="es-ES"/>
+            </w:rPr>
+          </w:pPr>
+          <w:hyperlink w:anchor="_Toc232544653" w:history="1">
+            <w:r>
+              <w:rPr>
+                <w:rStyle w:val="Hipervnculo"/>
+                <w:noProof/>
+              </w:rPr>
+              <w:t>11.4.</w:t>
+            </w:r>
+            <w:r>
+              <w:rPr>
+                <w:rFonts w:eastAsiaTheme="minorEastAsia"/>
+                <w:noProof/>
+                <w:lang w:val="es-ES" w:eastAsia="es-ES"/>
+              </w:rPr>
+              <w:tab/>
+            </w:r>
+            <w:r>
+              <w:rPr>
+                <w:rStyle w:val="Hipervnculo"/>
+                <w:noProof/>
+              </w:rPr>
+              <w:t>Proceso Formal de Gestión y Resolución Sugerida</w:t>
+            </w:r>
+            <w:r>
+              <w:rPr>
+                <w:noProof/>
+                <w:webHidden/>
+              </w:rPr>
+              <w:tab/>
+            </w:r>
+            <w:r>
+              <w:rPr>
+                <w:noProof/>
+                <w:webHidden/>
+              </w:rPr>
+              <w:fldChar w:fldCharType="begin"/>
+            </w:r>
+            <w:r>
+              <w:rPr>
+                <w:noProof/>
+                <w:webHidden/>
+              </w:rPr>
+              <w:instrText xml:space="preserve"> PAGEREF _Toc232544653 \h </w:instrText>
+            </w:r>
+            <w:r>
+              <w:rPr>
+                <w:noProof/>
+                <w:webHidden/>
+              </w:rPr>
+            </w:r>
+            <w:r>
+              <w:rPr>
+                <w:noProof/>
+                <w:webHidden/>
+              </w:rPr>
+              <w:fldChar w:fldCharType="separate"/>
+            </w:r>
+            <w:r>
+              <w:rPr>
+                <w:noProof/>
+                <w:webHidden/>
+              </w:rPr>
+              <w:t>17</w:t>
+            </w:r>
+            <w:r>
+              <w:rPr>
+                <w:noProof/>
+                <w:webHidden/>
+              </w:rPr>
+              <w:fldChar w:fldCharType="end"/>
+            </w:r>
+          </w:hyperlink>
+        </w:p>
+        <w:p>
+          <w:pPr>
+            <w:pStyle w:val="TDC2"/>
+            <w:tabs>
+              <w:tab w:val="left" w:pos="1100"/>
+              <w:tab w:val="right" w:leader="dot" w:pos="9395"/>
+            </w:tabs>
+            <w:rPr>
+              <w:rFonts w:eastAsiaTheme="minorEastAsia"/>
+              <w:noProof/>
+              <w:lang w:val="es-ES" w:eastAsia="es-ES"/>
+            </w:rPr>
+          </w:pPr>
+          <w:hyperlink w:anchor="_Toc232544654" w:history="1">
+            <w:r>
+              <w:rPr>
+                <w:rStyle w:val="Hipervnculo"/>
+                <w:noProof/>
+              </w:rPr>
+              <w:t>11.5.</w:t>
+            </w:r>
+            <w:r>
+              <w:rPr>
+                <w:rFonts w:eastAsiaTheme="minorEastAsia"/>
+                <w:noProof/>
+                <w:lang w:val="es-ES" w:eastAsia="es-ES"/>
+              </w:rPr>
+              <w:tab/>
+            </w:r>
+            <w:r>
+              <w:rPr>
+                <w:rStyle w:val="Hipervnculo"/>
+                <w:noProof/>
+              </w:rPr>
+              <w:t>Roles Involucrados en la Decisión</w:t>
+            </w:r>
+            <w:r>
+              <w:rPr>
+                <w:noProof/>
+                <w:webHidden/>
+              </w:rPr>
+              <w:tab/>
+            </w:r>
+            <w:r>
+              <w:rPr>
+                <w:noProof/>
+                <w:webHidden/>
+              </w:rPr>
+              <w:fldChar w:fldCharType="begin"/>
+            </w:r>
+            <w:r>
+              <w:rPr>
+                <w:noProof/>
+                <w:webHidden/>
+              </w:rPr>
+              <w:instrText xml:space="preserve"> PAGEREF _Toc232544654 \h </w:instrText>
+            </w:r>
+            <w:r>
+              <w:rPr>
+                <w:noProof/>
+                <w:webHidden/>
+              </w:rPr>
+            </w:r>
+            <w:r>
+              <w:rPr>
+                <w:noProof/>
+                <w:webHidden/>
+              </w:rPr>
+              <w:fldChar w:fldCharType="separate"/>
+            </w:r>
+            <w:r>
+              <w:rPr>
+                <w:noProof/>
+                <w:webHidden/>
+              </w:rPr>
+              <w:t>18</w:t>
+            </w:r>
+            <w:r>
+              <w:rPr>
+                <w:noProof/>
+                <w:webHidden/>
+              </w:rPr>
+              <w:fldChar w:fldCharType="end"/>
+            </w:r>
+          </w:hyperlink>
+        </w:p>
+        <w:p>
+          <w:pPr>
+            <w:pStyle w:val="TDC1"/>
+            <w:tabs>
+              <w:tab w:val="left" w:pos="660"/>
+              <w:tab w:val="right" w:leader="dot" w:pos="9395"/>
+            </w:tabs>
+            <w:rPr>
+              <w:rFonts w:eastAsiaTheme="minorEastAsia"/>
+              <w:noProof/>
+              <w:lang w:val="es-ES" w:eastAsia="es-ES"/>
+            </w:rPr>
+          </w:pPr>
+          <w:hyperlink w:anchor="_Toc232544655" w:history="1">
+            <w:r>
+              <w:rPr>
+                <w:rStyle w:val="Hipervnculo"/>
+                <w:noProof/>
+              </w:rPr>
+              <w:t>12.</w:t>
+            </w:r>
+            <w:r>
+              <w:rPr>
+                <w:rFonts w:eastAsiaTheme="minorEastAsia"/>
+                <w:noProof/>
+                <w:lang w:val="es-ES" w:eastAsia="es-ES"/>
+              </w:rPr>
+              <w:tab/>
+            </w:r>
+            <w:r>
+              <w:rPr>
+                <w:rStyle w:val="Hipervnculo"/>
+                <w:noProof/>
+              </w:rPr>
+              <w:t>REGISTRO DE RIESGOS ACTUALIZADO (Semana 10)</w:t>
+            </w:r>
+            <w:r>
+              <w:rPr>
+                <w:noProof/>
+                <w:webHidden/>
+              </w:rPr>
+              <w:tab/>
+            </w:r>
+            <w:r>
+              <w:rPr>
+                <w:noProof/>
+                <w:webHidden/>
+              </w:rPr>
+              <w:fldChar w:fldCharType="begin"/>
+            </w:r>
+            <w:r>
+              <w:rPr>
+                <w:noProof/>
+                <w:webHidden/>
+              </w:rPr>
+              <w:instrText xml:space="preserve"> PAGEREF _Toc232544655 \h </w:instrText>
+            </w:r>
+            <w:r>
+              <w:rPr>
+                <w:noProof/>
+                <w:webHidden/>
+              </w:rPr>
+            </w:r>
+            <w:r>
+              <w:rPr>
+                <w:noProof/>
+                <w:webHidden/>
+              </w:rPr>
+              <w:fldChar w:fldCharType="separate"/>
+            </w:r>
+            <w:r>
+              <w:rPr>
+                <w:noProof/>
+                <w:webHidden/>
+              </w:rPr>
+              <w:t>18</w:t>
+            </w:r>
+            <w:r>
+              <w:rPr>
+                <w:noProof/>
+                <w:webHidden/>
+              </w:rPr>
+              <w:fldChar w:fldCharType="end"/>
+            </w:r>
+          </w:hyperlink>
+        </w:p>
+        <w:p>
+          <w:pPr>
+            <w:pStyle w:val="TDC2"/>
+            <w:tabs>
+              <w:tab w:val="left" w:pos="1100"/>
+              <w:tab w:val="right" w:leader="dot" w:pos="9395"/>
+            </w:tabs>
+            <w:rPr>
+              <w:rFonts w:eastAsiaTheme="minorEastAsia"/>
+              <w:noProof/>
+              <w:lang w:val="es-ES" w:eastAsia="es-ES"/>
+            </w:rPr>
+          </w:pPr>
+          <w:hyperlink w:anchor="_Toc232544656" w:history="1">
+            <w:r>
+              <w:rPr>
+                <w:rStyle w:val="Hipervnculo"/>
+                <w:noProof/>
+              </w:rPr>
+              <w:t>12.1.</w:t>
+            </w:r>
+            <w:r>
+              <w:rPr>
+                <w:rFonts w:eastAsiaTheme="minorEastAsia"/>
+                <w:noProof/>
+                <w:lang w:val="es-ES" w:eastAsia="es-ES"/>
+              </w:rPr>
+              <w:tab/>
+            </w:r>
+            <w:r>
+              <w:rPr>
+                <w:rStyle w:val="Hipervnculo"/>
+                <w:noProof/>
+              </w:rPr>
+              <w:t>Modificación del Estado de Riesgos</w:t>
+            </w:r>
+            <w:r>
+              <w:rPr>
+                <w:noProof/>
+                <w:webHidden/>
+              </w:rPr>
+              <w:tab/>
+            </w:r>
+            <w:r>
+              <w:rPr>
+                <w:noProof/>
+                <w:webHidden/>
+              </w:rPr>
+              <w:fldChar w:fldCharType="begin"/>
+            </w:r>
+            <w:r>
+              <w:rPr>
+                <w:noProof/>
+                <w:webHidden/>
+              </w:rPr>
+              <w:instrText xml:space="preserve"> PAGEREF _Toc232544656 \h </w:instrText>
+            </w:r>
+            <w:r>
+              <w:rPr>
+                <w:noProof/>
+                <w:webHidden/>
+              </w:rPr>
+            </w:r>
+            <w:r>
+              <w:rPr>
+                <w:noProof/>
+                <w:webHidden/>
+              </w:rPr>
+              <w:fldChar w:fldCharType="separate"/>
+            </w:r>
+            <w:r>
+              <w:rPr>
+                <w:noProof/>
+                <w:webHidden/>
+              </w:rPr>
+              <w:t>18</w:t>
+            </w:r>
+            <w:r>
+              <w:rPr>
+                <w:noProof/>
+                <w:webHidden/>
+              </w:rPr>
+              <w:fldChar w:fldCharType="end"/>
+            </w:r>
+          </w:hyperlink>
+        </w:p>
+        <w:p>
+          <w:pPr>
+            <w:pStyle w:val="TDC2"/>
+            <w:tabs>
+              <w:tab w:val="left" w:pos="1100"/>
+              <w:tab w:val="right" w:leader="dot" w:pos="9395"/>
+            </w:tabs>
+            <w:rPr>
+              <w:rFonts w:eastAsiaTheme="minorEastAsia"/>
+              <w:noProof/>
+              <w:lang w:val="es-ES" w:eastAsia="es-ES"/>
+            </w:rPr>
+          </w:pPr>
+          <w:hyperlink w:anchor="_Toc232544657" w:history="1">
+            <w:r>
+              <w:rPr>
+                <w:rStyle w:val="Hipervnculo"/>
+                <w:noProof/>
+              </w:rPr>
+              <w:t>12.2.</w:t>
+            </w:r>
+            <w:r>
+              <w:rPr>
+                <w:rFonts w:eastAsiaTheme="minorEastAsia"/>
+                <w:noProof/>
+                <w:lang w:val="es-ES" w:eastAsia="es-ES"/>
+              </w:rPr>
+              <w:tab/>
+            </w:r>
+            <w:r>
+              <w:rPr>
+                <w:rStyle w:val="Hipervnculo"/>
+                <w:noProof/>
+              </w:rPr>
+              <w:t>Conclusión del Análisis de Riesgos Actualizado</w:t>
+            </w:r>
+            <w:r>
+              <w:rPr>
+                <w:noProof/>
+                <w:webHidden/>
+              </w:rPr>
+              <w:tab/>
+            </w:r>
+            <w:r>
+              <w:rPr>
+                <w:noProof/>
+                <w:webHidden/>
+              </w:rPr>
+              <w:fldChar w:fldCharType="begin"/>
+            </w:r>
+            <w:r>
+              <w:rPr>
+                <w:noProof/>
+                <w:webHidden/>
+              </w:rPr>
+              <w:instrText xml:space="preserve"> PAGEREF _Toc232544657 \h </w:instrText>
+            </w:r>
+            <w:r>
+              <w:rPr>
+                <w:noProof/>
+                <w:webHidden/>
+              </w:rPr>
+            </w:r>
+            <w:r>
+              <w:rPr>
+                <w:noProof/>
+                <w:webHidden/>
+              </w:rPr>
+              <w:fldChar w:fldCharType="separate"/>
+            </w:r>
+            <w:r>
+              <w:rPr>
+                <w:noProof/>
+                <w:webHidden/>
+              </w:rPr>
+              <w:t>19</w:t>
             </w:r>
             <w:r>
               <w:rPr>
@@ -4176,7 +4950,7 @@
       <w:pPr>
         <w:pStyle w:val="Ttulo1"/>
       </w:pPr>
-      <w:bookmarkStart w:id="0" w:name="_Toc232542587"/>
+      <w:bookmarkStart w:id="0" w:name="_Toc232544607"/>
       <w:r>
         <w:t>ACTA DE CONSTITUCIÓN DEL PROYECTO</w:t>
       </w:r>
@@ -4186,7 +4960,7 @@
       <w:pPr>
         <w:pStyle w:val="Ttulo2"/>
       </w:pPr>
-      <w:bookmarkStart w:id="1" w:name="_Toc232542588"/>
+      <w:bookmarkStart w:id="1" w:name="_Toc232544608"/>
       <w:r>
         <w:t>Información General del Proyecto</w:t>
       </w:r>
@@ -4285,7 +5059,7 @@
       <w:pPr>
         <w:pStyle w:val="Ttulo2"/>
       </w:pPr>
-      <w:bookmarkStart w:id="2" w:name="_Toc232542589"/>
+      <w:bookmarkStart w:id="2" w:name="_Toc232544609"/>
       <w:r>
         <w:t>Propósito y Justificación del Proyecto</w:t>
       </w:r>
@@ -4341,7 +5115,7 @@
       <w:pPr>
         <w:pStyle w:val="Ttulo2"/>
       </w:pPr>
-      <w:bookmarkStart w:id="3" w:name="_Toc232542590"/>
+      <w:bookmarkStart w:id="3" w:name="_Toc232544610"/>
       <w:r>
         <w:t>Objetivos del Proyecto</w:t>
       </w:r>
@@ -4351,7 +5125,7 @@
       <w:pPr>
         <w:pStyle w:val="Ttulo3"/>
       </w:pPr>
-      <w:bookmarkStart w:id="4" w:name="_Toc232542591"/>
+      <w:bookmarkStart w:id="4" w:name="_Toc232544611"/>
       <w:r>
         <w:t>Objetivo General</w:t>
       </w:r>
@@ -4379,7 +5153,7 @@
       <w:pPr>
         <w:pStyle w:val="Ttulo3"/>
       </w:pPr>
-      <w:bookmarkStart w:id="5" w:name="_Toc232542592"/>
+      <w:bookmarkStart w:id="5" w:name="_Toc232544612"/>
       <w:r>
         <w:t>Objetivos Específicos</w:t>
       </w:r>
@@ -4496,7 +5270,7 @@
       <w:pPr>
         <w:pStyle w:val="Ttulo2"/>
       </w:pPr>
-      <w:bookmarkStart w:id="6" w:name="_Toc232542593"/>
+      <w:bookmarkStart w:id="6" w:name="_Toc232544613"/>
       <w:r>
         <w:t>Alcance Inicial del Proyecto</w:t>
       </w:r>
@@ -4609,7 +5383,7 @@
       <w:pPr>
         <w:pStyle w:val="Ttulo3"/>
       </w:pPr>
-      <w:bookmarkStart w:id="7" w:name="_Toc232542594"/>
+      <w:bookmarkStart w:id="7" w:name="_Toc232544614"/>
       <w:r>
         <w:t>Módulos Incluidos en el MVP</w:t>
       </w:r>
@@ -4811,7 +5585,7 @@
       <w:pPr>
         <w:pStyle w:val="Ttulo2"/>
       </w:pPr>
-      <w:bookmarkStart w:id="8" w:name="_Toc232542595"/>
+      <w:bookmarkStart w:id="8" w:name="_Toc232544615"/>
       <w:r>
         <w:t>Restricciones y Supuestos</w:t>
       </w:r>
@@ -4821,7 +5595,7 @@
       <w:pPr>
         <w:pStyle w:val="Ttulo3"/>
       </w:pPr>
-      <w:bookmarkStart w:id="9" w:name="_Toc232542596"/>
+      <w:bookmarkStart w:id="9" w:name="_Toc232544616"/>
       <w:r>
         <w:t>Restricciones</w:t>
       </w:r>
@@ -4907,7 +5681,7 @@
       <w:pPr>
         <w:pStyle w:val="Ttulo3"/>
       </w:pPr>
-      <w:bookmarkStart w:id="10" w:name="_Toc232542597"/>
+      <w:bookmarkStart w:id="10" w:name="_Toc232544617"/>
       <w:r>
         <w:t>Supuestos</w:t>
       </w:r>
@@ -4999,7 +5773,7 @@
       <w:pPr>
         <w:pStyle w:val="Ttulo2"/>
       </w:pPr>
-      <w:bookmarkStart w:id="11" w:name="_Toc232542598"/>
+      <w:bookmarkStart w:id="11" w:name="_Toc232544618"/>
       <w:r>
         <w:t>Presupuesto y Recursos Iniciales</w:t>
       </w:r>
@@ -5227,7 +6001,7 @@
         <w:pStyle w:val="Ttulo1"/>
         <w:jc w:val="both"/>
       </w:pPr>
-      <w:bookmarkStart w:id="12" w:name="_Toc232542599"/>
+      <w:bookmarkStart w:id="12" w:name="_Toc232544619"/>
       <w:r>
         <w:t>DOCUMENTO DE METODOLOGÍA DE DESARROLLO</w:t>
       </w:r>
@@ -5238,7 +6012,7 @@
         <w:pStyle w:val="Ttulo2"/>
         <w:jc w:val="both"/>
       </w:pPr>
-      <w:bookmarkStart w:id="13" w:name="_Toc232542600"/>
+      <w:bookmarkStart w:id="13" w:name="_Toc232544620"/>
       <w:r>
         <w:t>Enfoque Seleccionado: Metodología Híbrida</w:t>
       </w:r>
@@ -5267,7 +6041,7 @@
         <w:pStyle w:val="Ttulo2"/>
         <w:jc w:val="both"/>
       </w:pPr>
-      <w:bookmarkStart w:id="14" w:name="_Toc232542601"/>
+      <w:bookmarkStart w:id="14" w:name="_Toc232544621"/>
       <w:r>
         <w:t>Justificación del Enfoque Híbrido</w:t>
       </w:r>
@@ -5364,7 +6138,7 @@
         <w:pStyle w:val="Ttulo1"/>
         <w:jc w:val="both"/>
       </w:pPr>
-      <w:bookmarkStart w:id="15" w:name="_Toc232542602"/>
+      <w:bookmarkStart w:id="15" w:name="_Toc232544622"/>
       <w:r>
         <w:t>SOLICITUD DE PROYECTO</w:t>
       </w:r>
@@ -5375,7 +6149,7 @@
         <w:pStyle w:val="Ttulo2"/>
         <w:jc w:val="both"/>
       </w:pPr>
-      <w:bookmarkStart w:id="16" w:name="_Toc232542603"/>
+      <w:bookmarkStart w:id="16" w:name="_Toc232544623"/>
       <w:r>
         <w:t>Información del Solicitante</w:t>
       </w:r>
@@ -5475,7 +6249,7 @@
         <w:pStyle w:val="Ttulo2"/>
         <w:jc w:val="both"/>
       </w:pPr>
-      <w:bookmarkStart w:id="17" w:name="_Toc232542604"/>
+      <w:bookmarkStart w:id="17" w:name="_Toc232544624"/>
       <w:r>
         <w:t>Descripción del Problema u Oportunidad</w:t>
       </w:r>
@@ -5550,7 +6324,7 @@
         <w:pStyle w:val="Ttulo2"/>
         <w:jc w:val="both"/>
       </w:pPr>
-      <w:bookmarkStart w:id="18" w:name="_Toc232542605"/>
+      <w:bookmarkStart w:id="18" w:name="_Toc232544625"/>
       <w:r>
         <w:t>Descripción de la Solución Propuesta</w:t>
       </w:r>
@@ -5579,7 +6353,7 @@
         <w:pStyle w:val="Ttulo2"/>
         <w:jc w:val="both"/>
       </w:pPr>
-      <w:bookmarkStart w:id="19" w:name="_Toc232542606"/>
+      <w:bookmarkStart w:id="19" w:name="_Toc232544626"/>
       <w:r>
         <w:t>Beneficios Esperados</w:t>
       </w:r>
@@ -5678,7 +6452,7 @@
         <w:pStyle w:val="Ttulo2"/>
         <w:jc w:val="both"/>
       </w:pPr>
-      <w:bookmarkStart w:id="20" w:name="_Toc232542607"/>
+      <w:bookmarkStart w:id="20" w:name="_Toc232544627"/>
       <w:r>
         <w:t>Restricciones Iniciales Conocidas</w:t>
       </w:r>
@@ -5755,7 +6529,7 @@
       <w:pPr>
         <w:pStyle w:val="Ttulo1"/>
       </w:pPr>
-      <w:bookmarkStart w:id="21" w:name="_Toc232542608"/>
+      <w:bookmarkStart w:id="21" w:name="_Toc232544628"/>
       <w:r>
         <w:t>DOCUMENTO</w:t>
       </w:r>
@@ -5805,7 +6579,7 @@
       <w:pPr>
         <w:pStyle w:val="Ttulo2"/>
       </w:pPr>
-      <w:bookmarkStart w:id="22" w:name="_Toc232542609"/>
+      <w:bookmarkStart w:id="22" w:name="_Toc232544629"/>
       <w:r>
         <w:t>El Ascensor (</w:t>
       </w:r>
@@ -5840,7 +6614,7 @@
       <w:pPr>
         <w:pStyle w:val="Ttulo2"/>
       </w:pPr>
-      <w:bookmarkStart w:id="23" w:name="_Toc232542610"/>
+      <w:bookmarkStart w:id="23" w:name="_Toc232544630"/>
       <w:r>
         <w:t>La Caja del Producto (</w:t>
       </w:r>
@@ -6011,7 +6785,7 @@
       <w:pPr>
         <w:pStyle w:val="Ttulo2"/>
       </w:pPr>
-      <w:bookmarkStart w:id="24" w:name="_Toc232542611"/>
+      <w:bookmarkStart w:id="24" w:name="_Toc232544631"/>
       <w:r>
         <w:lastRenderedPageBreak/>
         <w:t>Lista de "Lo que es" y "Lo que NO es"</w:t>
@@ -6282,7 +7056,7 @@
       <w:pPr>
         <w:pStyle w:val="Ttulo2"/>
       </w:pPr>
-      <w:bookmarkStart w:id="25" w:name="_Toc232542612"/>
+      <w:bookmarkStart w:id="25" w:name="_Toc232544632"/>
       <w:r>
         <w:t>Vecinos Cercanos (Interfases e Integraciones)</w:t>
       </w:r>
@@ -6404,7 +7178,7 @@
       <w:pPr>
         <w:pStyle w:val="Ttulo1"/>
       </w:pPr>
-      <w:bookmarkStart w:id="26" w:name="_Toc232542613"/>
+      <w:bookmarkStart w:id="26" w:name="_Toc232544633"/>
       <w:r>
         <w:t>ESPECIFICACIÓN DE</w:t>
       </w:r>
@@ -6435,7 +7209,7 @@
       <w:pPr>
         <w:pStyle w:val="Ttulo2"/>
       </w:pPr>
-      <w:bookmarkStart w:id="27" w:name="_Toc232542614"/>
+      <w:bookmarkStart w:id="27" w:name="_Toc232544634"/>
       <w:r>
         <w:t>Requerimientos Funcionales (RF)</w:t>
       </w:r>
@@ -6834,7 +7608,7 @@
       <w:pPr>
         <w:pStyle w:val="Ttulo2"/>
       </w:pPr>
-      <w:bookmarkStart w:id="28" w:name="_Toc232542615"/>
+      <w:bookmarkStart w:id="28" w:name="_Toc232544635"/>
       <w:r>
         <w:t>Requerimientos No Funcionales (RNF)</w:t>
       </w:r>
@@ -7005,7 +7779,7 @@
       <w:pPr>
         <w:pStyle w:val="Ttulo1"/>
       </w:pPr>
-      <w:bookmarkStart w:id="29" w:name="_Toc232542616"/>
+      <w:bookmarkStart w:id="29" w:name="_Toc232544636"/>
       <w:r>
         <w:t>Matriz de Priorización de Requerimientos</w:t>
       </w:r>
@@ -7046,7 +7820,7 @@
       <w:pPr>
         <w:pStyle w:val="Ttulo2"/>
       </w:pPr>
-      <w:bookmarkStart w:id="30" w:name="_Toc232542617"/>
+      <w:bookmarkStart w:id="30" w:name="_Toc232544637"/>
       <w:r>
         <w:t xml:space="preserve">Cuadro de Priorización </w:t>
       </w:r>
@@ -7582,7 +8356,7 @@
           <w:lang w:val="es-ES"/>
         </w:rPr>
       </w:pPr>
-      <w:bookmarkStart w:id="31" w:name="_Toc232542618"/>
+      <w:bookmarkStart w:id="31" w:name="_Toc232544638"/>
       <w:r>
         <w:rPr>
           <w:rStyle w:val="Ttulo1Car"/>
@@ -7730,7 +8504,7 @@
       <w:pPr>
         <w:pStyle w:val="Ttulo2"/>
       </w:pPr>
-      <w:bookmarkStart w:id="32" w:name="_Toc232542619"/>
+      <w:bookmarkStart w:id="32" w:name="_Toc232544639"/>
       <w:r>
         <w:t>Cronograma</w:t>
       </w:r>
@@ -8554,7 +9328,7 @@
       <w:pPr>
         <w:pStyle w:val="Ttulo2"/>
       </w:pPr>
-      <w:bookmarkStart w:id="33" w:name="_Toc232542620"/>
+      <w:bookmarkStart w:id="33" w:name="_Toc232544640"/>
       <w:r>
         <w:lastRenderedPageBreak/>
         <w:t xml:space="preserve">Estructura de </w:t>
@@ -8837,7 +9611,7 @@
       <w:pPr>
         <w:pStyle w:val="Ttulo1"/>
       </w:pPr>
-      <w:bookmarkStart w:id="34" w:name="_Toc232542621"/>
+      <w:bookmarkStart w:id="34" w:name="_Toc232544641"/>
       <w:r>
         <w:t>PRESUPUESTO</w:t>
       </w:r>
@@ -8909,7 +9683,7 @@
       <w:pPr>
         <w:pStyle w:val="Ttulo2"/>
       </w:pPr>
-      <w:bookmarkStart w:id="35" w:name="_Toc232542622"/>
+      <w:bookmarkStart w:id="35" w:name="_Toc232544642"/>
       <w:r>
         <w:t>Desglose de Costos del Proyecto</w:t>
       </w:r>
@@ -9910,7 +10684,7 @@
       <w:pPr>
         <w:pStyle w:val="Ttulo2"/>
       </w:pPr>
-      <w:bookmarkStart w:id="36" w:name="_Toc232542623"/>
+      <w:bookmarkStart w:id="36" w:name="_Toc232544643"/>
       <w:r>
         <w:t>Reglas de Control Financiero</w:t>
       </w:r>
@@ -9984,7 +10758,7 @@
       <w:pPr>
         <w:pStyle w:val="Ttulo1"/>
       </w:pPr>
-      <w:bookmarkStart w:id="37" w:name="_Toc232542624"/>
+      <w:bookmarkStart w:id="37" w:name="_Toc232544644"/>
       <w:r>
         <w:t>PLAN</w:t>
       </w:r>
@@ -10051,7 +10825,7 @@
       <w:pPr>
         <w:pStyle w:val="Ttulo2"/>
       </w:pPr>
-      <w:bookmarkStart w:id="38" w:name="_Toc232542625"/>
+      <w:bookmarkStart w:id="38" w:name="_Toc232544645"/>
       <w:r>
         <w:t>Roles, Responsabilidades y Distribución del Salario Inicial</w:t>
       </w:r>
@@ -10317,7 +11091,7 @@
       <w:pPr>
         <w:pStyle w:val="Ttulo1"/>
       </w:pPr>
-      <w:bookmarkStart w:id="39" w:name="_Toc232542626"/>
+      <w:bookmarkStart w:id="39" w:name="_Toc232544646"/>
       <w:r>
         <w:t>REGISTRO</w:t>
       </w:r>
@@ -10376,7 +11150,7 @@
       <w:pPr>
         <w:pStyle w:val="Ttulo2"/>
       </w:pPr>
-      <w:bookmarkStart w:id="40" w:name="_Toc232542627"/>
+      <w:bookmarkStart w:id="40" w:name="_Toc232544647"/>
       <w:r>
         <w:t>Matriz de Riesgos Inicial</w:t>
       </w:r>
@@ -11275,7 +12049,7 @@
       <w:pPr>
         <w:pStyle w:val="Ttulo2"/>
       </w:pPr>
-      <w:bookmarkStart w:id="41" w:name="_Toc232542628"/>
+      <w:bookmarkStart w:id="41" w:name="_Toc232544648"/>
       <w:r>
         <w:t>E</w:t>
       </w:r>
@@ -11466,6 +12240,7 @@
       <w:pPr>
         <w:pStyle w:val="Ttulo1"/>
       </w:pPr>
+      <w:bookmarkStart w:id="42" w:name="_Toc232544649"/>
       <w:r>
         <w:t>SOLICITUD</w:t>
       </w:r>
@@ -11505,6 +12280,7 @@
       <w:r>
         <w:t>EOLOCALIZACIÓN</w:t>
       </w:r>
+      <w:bookmarkEnd w:id="42"/>
     </w:p>
     <w:p>
       <w:pPr>
@@ -11638,10 +12414,12 @@
       <w:pPr>
         <w:pStyle w:val="Ttulo2"/>
       </w:pPr>
+      <w:bookmarkStart w:id="43" w:name="_Toc232544650"/>
       <w:r>
         <w:lastRenderedPageBreak/>
         <w:t>Descripción del Cambio Solicitado</w:t>
       </w:r>
+      <w:bookmarkEnd w:id="43"/>
     </w:p>
     <w:p>
       <w:pPr>
@@ -11663,9 +12441,11 @@
       <w:pPr>
         <w:pStyle w:val="Ttulo2"/>
       </w:pPr>
+      <w:bookmarkStart w:id="44" w:name="_Toc232544651"/>
       <w:r>
         <w:t>Justificación del Cambio</w:t>
       </w:r>
+      <w:bookmarkEnd w:id="44"/>
     </w:p>
     <w:p>
       <w:pPr>
@@ -11687,9 +12467,11 @@
       <w:pPr>
         <w:pStyle w:val="Ttulo2"/>
       </w:pPr>
+      <w:bookmarkStart w:id="45" w:name="_Toc232544652"/>
       <w:r>
         <w:t>Evaluación de Impacto (Análisis del Project Manager)</w:t>
       </w:r>
+      <w:bookmarkEnd w:id="45"/>
     </w:p>
     <w:p>
       <w:pPr>
@@ -11906,9 +12688,11 @@
       <w:pPr>
         <w:pStyle w:val="Ttulo2"/>
       </w:pPr>
+      <w:bookmarkStart w:id="46" w:name="_Toc232544653"/>
       <w:r>
         <w:t>Proceso Formal de Gestión y Resolución Sugerida</w:t>
       </w:r>
+      <w:bookmarkEnd w:id="46"/>
     </w:p>
     <w:p>
       <w:pPr>
@@ -12153,9 +12937,11 @@
       <w:pPr>
         <w:pStyle w:val="Ttulo2"/>
       </w:pPr>
+      <w:bookmarkStart w:id="47" w:name="_Toc232544654"/>
       <w:r>
         <w:t>Roles Involucrados en la Decisión</w:t>
       </w:r>
+      <w:bookmarkEnd w:id="47"/>
     </w:p>
     <w:p>
       <w:pPr>
@@ -12195,6 +12981,692 @@
           <w:lang w:val="es-ES"/>
         </w:rPr>
       </w:pPr>
+    </w:p>
+    <w:p>
+      <w:pPr>
+        <w:pStyle w:val="Ttulo1"/>
+      </w:pPr>
+      <w:bookmarkStart w:id="48" w:name="_Toc232544655"/>
+      <w:r>
+        <w:t>REGISTRO DE RIESGOS ACTUALIZADO</w:t>
+      </w:r>
+      <w:r>
+        <w:t xml:space="preserve"> (Semana 10)</w:t>
+      </w:r>
+      <w:bookmarkEnd w:id="48"/>
+    </w:p>
+    <w:p>
+      <w:pPr>
+        <w:ind w:left="360"/>
+        <w:rPr>
+          <w:lang w:val="es-ES"/>
+        </w:rPr>
+      </w:pPr>
+      <w:r>
+        <w:rPr>
+          <w:b/>
+          <w:bCs/>
+          <w:lang w:val="es-ES"/>
+        </w:rPr>
+        <w:t>Fecha de Actualización:</w:t>
+      </w:r>
+      <w:r>
+        <w:rPr>
+          <w:lang w:val="es-ES"/>
+        </w:rPr>
+        <w:t xml:space="preserve"> Semana 10 (</w:t>
+      </w:r>
+      <w:proofErr w:type="gramStart"/>
+      <w:r>
+        <w:rPr>
+          <w:lang w:val="es-ES"/>
+        </w:rPr>
+        <w:t>Junio</w:t>
+      </w:r>
+      <w:proofErr w:type="gramEnd"/>
+      <w:r>
+        <w:rPr>
+          <w:lang w:val="es-ES"/>
+        </w:rPr>
+        <w:t xml:space="preserve"> de 2026)</w:t>
+      </w:r>
+    </w:p>
+    <w:p>
+      <w:pPr>
+        <w:ind w:left="360"/>
+        <w:rPr>
+          <w:lang w:val="es-ES"/>
+        </w:rPr>
+      </w:pPr>
+      <w:r>
+        <w:rPr>
+          <w:b/>
+          <w:bCs/>
+          <w:lang w:val="es-ES"/>
+        </w:rPr>
+        <w:t>Estado General del Proyecto:</w:t>
+      </w:r>
+      <w:r>
+        <w:rPr>
+          <w:lang w:val="es-ES"/>
+        </w:rPr>
+        <w:t xml:space="preserve"> Alerta Amarilla (Fase de Contingencia Activa)</w:t>
+      </w:r>
+    </w:p>
+    <w:p>
+      <w:pPr>
+        <w:ind w:left="360"/>
+        <w:rPr>
+          <w:lang w:val="es-ES"/>
+        </w:rPr>
+      </w:pPr>
+      <w:r>
+        <w:rPr>
+          <w:lang w:val="es-ES"/>
+        </w:rPr>
+        <w:t>Este documento actualiza el estado de los riesgos iniciales tras los eventos ocurridos en la semana 10 del proyecto (solicitud de cambio de alcance y bajas del personal técnico).</w:t>
+      </w:r>
+    </w:p>
+    <w:p>
+      <w:pPr>
+        <w:pStyle w:val="Ttulo2"/>
+      </w:pPr>
+      <w:bookmarkStart w:id="49" w:name="_Toc232544656"/>
+      <w:r>
+        <w:t>Modificación del Estado de Riesgos</w:t>
+      </w:r>
+      <w:bookmarkEnd w:id="49"/>
+    </w:p>
+    <w:tbl>
+      <w:tblPr>
+        <w:tblStyle w:val="Tablaconcuadrcula"/>
+        <w:tblW w:w="0" w:type="auto"/>
+        <w:tblLook w:val="04A0" w:firstRow="1" w:lastRow="0" w:firstColumn="1" w:lastColumn="0" w:noHBand="0" w:noVBand="1"/>
+      </w:tblPr>
+      <w:tblGrid>
+        <w:gridCol w:w="705"/>
+        <w:gridCol w:w="1873"/>
+        <w:gridCol w:w="1010"/>
+        <w:gridCol w:w="1604"/>
+        <w:gridCol w:w="4158"/>
+      </w:tblGrid>
+      <w:tr>
+        <w:tc>
+          <w:tcPr>
+            <w:tcW w:w="704" w:type="dxa"/>
+            <w:hideMark/>
+          </w:tcPr>
+          <w:p>
+            <w:pPr>
+              <w:spacing w:after="160" w:line="259" w:lineRule="auto"/>
+              <w:rPr>
+                <w:b/>
+                <w:bCs/>
+                <w:lang w:val="es-ES"/>
+              </w:rPr>
+            </w:pPr>
+            <w:r>
+              <w:rPr>
+                <w:b/>
+                <w:bCs/>
+                <w:lang w:val="es-ES"/>
+              </w:rPr>
+              <w:t>ID</w:t>
+            </w:r>
+          </w:p>
+        </w:tc>
+        <w:tc>
+          <w:tcPr>
+            <w:tcW w:w="1873" w:type="dxa"/>
+            <w:hideMark/>
+          </w:tcPr>
+          <w:p>
+            <w:pPr>
+              <w:spacing w:after="160" w:line="259" w:lineRule="auto"/>
+              <w:rPr>
+                <w:b/>
+                <w:bCs/>
+                <w:lang w:val="es-ES"/>
+              </w:rPr>
+            </w:pPr>
+            <w:r>
+              <w:rPr>
+                <w:b/>
+                <w:bCs/>
+                <w:lang w:val="es-ES"/>
+              </w:rPr>
+              <w:t>Riesgo Identificado</w:t>
+            </w:r>
+          </w:p>
+        </w:tc>
+        <w:tc>
+          <w:tcPr>
+            <w:tcW w:w="0" w:type="auto"/>
+            <w:hideMark/>
+          </w:tcPr>
+          <w:p>
+            <w:pPr>
+              <w:spacing w:after="160" w:line="259" w:lineRule="auto"/>
+              <w:rPr>
+                <w:b/>
+                <w:bCs/>
+                <w:lang w:val="es-ES"/>
+              </w:rPr>
+            </w:pPr>
+            <w:r>
+              <w:rPr>
+                <w:b/>
+                <w:bCs/>
+                <w:lang w:val="es-ES"/>
+              </w:rPr>
+              <w:t>Impacto Real</w:t>
+            </w:r>
+          </w:p>
+        </w:tc>
+        <w:tc>
+          <w:tcPr>
+            <w:tcW w:w="0" w:type="auto"/>
+            <w:hideMark/>
+          </w:tcPr>
+          <w:p>
+            <w:pPr>
+              <w:spacing w:after="160" w:line="259" w:lineRule="auto"/>
+              <w:rPr>
+                <w:b/>
+                <w:bCs/>
+                <w:lang w:val="es-ES"/>
+              </w:rPr>
+            </w:pPr>
+            <w:r>
+              <w:rPr>
+                <w:b/>
+                <w:bCs/>
+                <w:lang w:val="es-ES"/>
+              </w:rPr>
+              <w:t>Estado Actual</w:t>
+            </w:r>
+          </w:p>
+        </w:tc>
+        <w:tc>
+          <w:tcPr>
+            <w:tcW w:w="0" w:type="auto"/>
+            <w:hideMark/>
+          </w:tcPr>
+          <w:p>
+            <w:pPr>
+              <w:spacing w:after="160" w:line="259" w:lineRule="auto"/>
+              <w:rPr>
+                <w:b/>
+                <w:bCs/>
+                <w:lang w:val="es-ES"/>
+              </w:rPr>
+            </w:pPr>
+            <w:r>
+              <w:rPr>
+                <w:b/>
+                <w:bCs/>
+                <w:lang w:val="es-ES"/>
+              </w:rPr>
+              <w:t>Acciones Correctivas Ejecutadas / Plan de Contingencia Aplicado</w:t>
+            </w:r>
+          </w:p>
+        </w:tc>
+      </w:tr>
+      <w:tr>
+        <w:tc>
+          <w:tcPr>
+            <w:tcW w:w="704" w:type="dxa"/>
+            <w:hideMark/>
+          </w:tcPr>
+          <w:p>
+            <w:pPr>
+              <w:spacing w:after="160" w:line="259" w:lineRule="auto"/>
+              <w:rPr>
+                <w:lang w:val="es-ES"/>
+              </w:rPr>
+            </w:pPr>
+            <w:r>
+              <w:rPr>
+                <w:b/>
+                <w:bCs/>
+                <w:lang w:val="es-ES"/>
+              </w:rPr>
+              <w:t>R-01</w:t>
+            </w:r>
+          </w:p>
+        </w:tc>
+        <w:tc>
+          <w:tcPr>
+            <w:tcW w:w="1873" w:type="dxa"/>
+            <w:hideMark/>
+          </w:tcPr>
+          <w:p>
+            <w:pPr>
+              <w:spacing w:after="160" w:line="259" w:lineRule="auto"/>
+              <w:rPr>
+                <w:lang w:val="es-ES"/>
+              </w:rPr>
+            </w:pPr>
+            <w:r>
+              <w:rPr>
+                <w:lang w:val="es-ES"/>
+              </w:rPr>
+              <w:t>Cambios/adición de requisitos fuera del alcance por la Alcaldía.</w:t>
+            </w:r>
+          </w:p>
+        </w:tc>
+        <w:tc>
+          <w:tcPr>
+            <w:tcW w:w="0" w:type="auto"/>
+            <w:hideMark/>
+          </w:tcPr>
+          <w:p>
+            <w:pPr>
+              <w:spacing w:after="160" w:line="259" w:lineRule="auto"/>
+              <w:rPr>
+                <w:lang w:val="es-ES"/>
+              </w:rPr>
+            </w:pPr>
+            <w:r>
+              <w:rPr>
+                <w:lang w:val="es-ES"/>
+              </w:rPr>
+              <w:t>Medio</w:t>
+            </w:r>
+          </w:p>
+        </w:tc>
+        <w:tc>
+          <w:tcPr>
+            <w:tcW w:w="0" w:type="auto"/>
+            <w:hideMark/>
+          </w:tcPr>
+          <w:p>
+            <w:pPr>
+              <w:spacing w:after="160" w:line="259" w:lineRule="auto"/>
+              <w:rPr>
+                <w:lang w:val="es-ES"/>
+              </w:rPr>
+            </w:pPr>
+            <w:r>
+              <w:rPr>
+                <w:b/>
+                <w:bCs/>
+                <w:lang w:val="es-ES"/>
+              </w:rPr>
+              <w:t>Materializado / Activo</w:t>
+            </w:r>
+          </w:p>
+        </w:tc>
+        <w:tc>
+          <w:tcPr>
+            <w:tcW w:w="0" w:type="auto"/>
+            <w:hideMark/>
+          </w:tcPr>
+          <w:p>
+            <w:pPr>
+              <w:spacing w:after="160" w:line="259" w:lineRule="auto"/>
+              <w:rPr>
+                <w:lang w:val="es-ES"/>
+              </w:rPr>
+            </w:pPr>
+            <w:r>
+              <w:rPr>
+                <w:lang w:val="es-ES"/>
+              </w:rPr>
+              <w:t>Se registró formalmente la solicitud de geolocalización (CRF-001). Se remitió la evaluación de impacto al Comité de Control de Cambios recomendando postergar el módulo a la Fase 2 para proteger el MVP.</w:t>
+            </w:r>
+          </w:p>
+        </w:tc>
+      </w:tr>
+      <w:tr>
+        <w:tc>
+          <w:tcPr>
+            <w:tcW w:w="704" w:type="dxa"/>
+            <w:hideMark/>
+          </w:tcPr>
+          <w:p>
+            <w:pPr>
+              <w:spacing w:after="160" w:line="259" w:lineRule="auto"/>
+              <w:rPr>
+                <w:lang w:val="es-ES"/>
+              </w:rPr>
+            </w:pPr>
+            <w:r>
+              <w:rPr>
+                <w:b/>
+                <w:bCs/>
+                <w:lang w:val="es-ES"/>
+              </w:rPr>
+              <w:t>R-02</w:t>
+            </w:r>
+          </w:p>
+        </w:tc>
+        <w:tc>
+          <w:tcPr>
+            <w:tcW w:w="1873" w:type="dxa"/>
+            <w:hideMark/>
+          </w:tcPr>
+          <w:p>
+            <w:pPr>
+              <w:spacing w:after="160" w:line="259" w:lineRule="auto"/>
+              <w:rPr>
+                <w:lang w:val="es-ES"/>
+              </w:rPr>
+            </w:pPr>
+            <w:r>
+              <w:rPr>
+                <w:b/>
+                <w:bCs/>
+                <w:lang w:val="es-ES"/>
+              </w:rPr>
+              <w:t>Renuncia de dos desarrolladores Senior clave.</w:t>
+            </w:r>
+          </w:p>
+        </w:tc>
+        <w:tc>
+          <w:tcPr>
+            <w:tcW w:w="0" w:type="auto"/>
+            <w:hideMark/>
+          </w:tcPr>
+          <w:p>
+            <w:pPr>
+              <w:spacing w:after="160" w:line="259" w:lineRule="auto"/>
+              <w:rPr>
+                <w:lang w:val="es-ES"/>
+              </w:rPr>
+            </w:pPr>
+            <w:r>
+              <w:rPr>
+                <w:b/>
+                <w:bCs/>
+                <w:lang w:val="es-ES"/>
+              </w:rPr>
+              <w:t>Crítico</w:t>
+            </w:r>
+          </w:p>
+        </w:tc>
+        <w:tc>
+          <w:tcPr>
+            <w:tcW w:w="0" w:type="auto"/>
+            <w:hideMark/>
+          </w:tcPr>
+          <w:p>
+            <w:pPr>
+              <w:spacing w:after="160" w:line="259" w:lineRule="auto"/>
+              <w:rPr>
+                <w:lang w:val="es-ES"/>
+              </w:rPr>
+            </w:pPr>
+            <w:r>
+              <w:rPr>
+                <w:b/>
+                <w:bCs/>
+                <w:lang w:val="es-ES"/>
+              </w:rPr>
+              <w:t>Materializado / Mitigado</w:t>
+            </w:r>
+          </w:p>
+        </w:tc>
+        <w:tc>
+          <w:tcPr>
+            <w:tcW w:w="0" w:type="auto"/>
+            <w:hideMark/>
+          </w:tcPr>
+          <w:p>
+            <w:pPr>
+              <w:spacing w:after="160" w:line="259" w:lineRule="auto"/>
+              <w:rPr>
+                <w:lang w:val="es-ES"/>
+              </w:rPr>
+            </w:pPr>
+            <w:r>
+              <w:rPr>
+                <w:b/>
+                <w:bCs/>
+                <w:lang w:val="es-ES"/>
+              </w:rPr>
+              <w:t>1.</w:t>
+            </w:r>
+            <w:r>
+              <w:rPr>
+                <w:lang w:val="es-ES"/>
+              </w:rPr>
+              <w:t xml:space="preserve"> Activación inmediata de la transferencia de conocimiento basada en la documentación diaria de Git.</w:t>
+            </w:r>
+            <w:r>
+              <w:rPr>
+                <w:b/>
+                <w:bCs/>
+                <w:lang w:val="es-ES"/>
+              </w:rPr>
+              <w:t>2.</w:t>
+            </w:r>
+            <w:r>
+              <w:rPr>
+                <w:lang w:val="es-ES"/>
+              </w:rPr>
+              <w:t xml:space="preserve"> Congelación temporal de tareas secundarias del Sprint 3.</w:t>
+            </w:r>
+            <w:r>
+              <w:rPr>
+                <w:b/>
+                <w:bCs/>
+                <w:lang w:val="es-ES"/>
+              </w:rPr>
+              <w:t>3.</w:t>
+            </w:r>
+            <w:r>
+              <w:rPr>
+                <w:lang w:val="es-ES"/>
+              </w:rPr>
+              <w:t xml:space="preserve"> Uso de la </w:t>
+            </w:r>
+            <w:r>
+              <w:rPr>
+                <w:b/>
+                <w:bCs/>
+                <w:lang w:val="es-ES"/>
+              </w:rPr>
+              <w:t>Reserva de Contingencia (5,000 Bs)</w:t>
+            </w:r>
+            <w:r>
+              <w:rPr>
+                <w:lang w:val="es-ES"/>
+              </w:rPr>
+              <w:t xml:space="preserve"> para la contratación </w:t>
+            </w:r>
+            <w:proofErr w:type="spellStart"/>
+            <w:r>
+              <w:rPr>
+                <w:lang w:val="es-ES"/>
+              </w:rPr>
+              <w:t>express</w:t>
+            </w:r>
+            <w:proofErr w:type="spellEnd"/>
+            <w:r>
+              <w:rPr>
+                <w:lang w:val="es-ES"/>
+              </w:rPr>
+              <w:t xml:space="preserve"> de </w:t>
+            </w:r>
+            <w:r>
+              <w:rPr>
+                <w:lang w:val="es-ES"/>
+              </w:rPr>
+              <w:lastRenderedPageBreak/>
+              <w:t xml:space="preserve">un consultor </w:t>
+            </w:r>
+            <w:proofErr w:type="spellStart"/>
+            <w:r>
+              <w:rPr>
+                <w:lang w:val="es-ES"/>
+              </w:rPr>
+              <w:t>Backend</w:t>
+            </w:r>
+            <w:proofErr w:type="spellEnd"/>
+            <w:r>
+              <w:rPr>
+                <w:lang w:val="es-ES"/>
+              </w:rPr>
+              <w:t xml:space="preserve"> por producto para cubrir la lógica de cobros.</w:t>
+            </w:r>
+          </w:p>
+        </w:tc>
+      </w:tr>
+      <w:tr>
+        <w:tc>
+          <w:tcPr>
+            <w:tcW w:w="704" w:type="dxa"/>
+            <w:hideMark/>
+          </w:tcPr>
+          <w:p>
+            <w:pPr>
+              <w:spacing w:after="160" w:line="259" w:lineRule="auto"/>
+              <w:rPr>
+                <w:lang w:val="es-ES"/>
+              </w:rPr>
+            </w:pPr>
+            <w:r>
+              <w:rPr>
+                <w:b/>
+                <w:bCs/>
+                <w:lang w:val="es-ES"/>
+              </w:rPr>
+              <w:lastRenderedPageBreak/>
+              <w:t>R-03</w:t>
+            </w:r>
+          </w:p>
+        </w:tc>
+        <w:tc>
+          <w:tcPr>
+            <w:tcW w:w="1873" w:type="dxa"/>
+            <w:hideMark/>
+          </w:tcPr>
+          <w:p>
+            <w:pPr>
+              <w:spacing w:after="160" w:line="259" w:lineRule="auto"/>
+              <w:rPr>
+                <w:lang w:val="es-ES"/>
+              </w:rPr>
+            </w:pPr>
+            <w:r>
+              <w:rPr>
+                <w:lang w:val="es-ES"/>
+              </w:rPr>
+              <w:t>Modificaciones en normativas de licencias sanitarias.</w:t>
+            </w:r>
+          </w:p>
+        </w:tc>
+        <w:tc>
+          <w:tcPr>
+            <w:tcW w:w="0" w:type="auto"/>
+            <w:hideMark/>
+          </w:tcPr>
+          <w:p>
+            <w:pPr>
+              <w:spacing w:after="160" w:line="259" w:lineRule="auto"/>
+              <w:rPr>
+                <w:lang w:val="es-ES"/>
+              </w:rPr>
+            </w:pPr>
+            <w:r>
+              <w:rPr>
+                <w:lang w:val="es-ES"/>
+              </w:rPr>
+              <w:t>Bajo</w:t>
+            </w:r>
+          </w:p>
+        </w:tc>
+        <w:tc>
+          <w:tcPr>
+            <w:tcW w:w="0" w:type="auto"/>
+            <w:hideMark/>
+          </w:tcPr>
+          <w:p>
+            <w:pPr>
+              <w:spacing w:after="160" w:line="259" w:lineRule="auto"/>
+              <w:rPr>
+                <w:lang w:val="es-ES"/>
+              </w:rPr>
+            </w:pPr>
+            <w:r>
+              <w:rPr>
+                <w:b/>
+                <w:bCs/>
+                <w:lang w:val="es-ES"/>
+              </w:rPr>
+              <w:t>Materializado / Controlado</w:t>
+            </w:r>
+          </w:p>
+        </w:tc>
+        <w:tc>
+          <w:tcPr>
+            <w:tcW w:w="0" w:type="auto"/>
+            <w:hideMark/>
+          </w:tcPr>
+          <w:p>
+            <w:pPr>
+              <w:spacing w:after="160" w:line="259" w:lineRule="auto"/>
+              <w:rPr>
+                <w:lang w:val="es-ES"/>
+              </w:rPr>
+            </w:pPr>
+            <w:r>
+              <w:rPr>
+                <w:lang w:val="es-ES"/>
+              </w:rPr>
+              <w:t>A mitad del proyecto surgieron cambios en la normativa. Gracias a las reuniones quincenales, el analista de requerimientos ya tenía mapeada la nueva estructura legal; se modificaron los campos del formulario sin impacto en el cronograma.</w:t>
+            </w:r>
+          </w:p>
+        </w:tc>
+      </w:tr>
+    </w:tbl>
+    <w:p>
+      <w:pPr>
+        <w:rPr>
+          <w:b/>
+          <w:bCs/>
+          <w:lang w:val="es-ES"/>
+        </w:rPr>
+      </w:pPr>
+    </w:p>
+    <w:p>
+      <w:pPr>
+        <w:pStyle w:val="Ttulo2"/>
+      </w:pPr>
+      <w:bookmarkStart w:id="50" w:name="_Toc232544657"/>
+      <w:r>
+        <w:t>Conclusión del Análisis de Riesgos Actualizado</w:t>
+      </w:r>
+      <w:bookmarkEnd w:id="50"/>
+    </w:p>
+    <w:p>
+      <w:pPr>
+        <w:ind w:left="708"/>
+        <w:rPr>
+          <w:lang w:val="es-ES"/>
+        </w:rPr>
+      </w:pPr>
+      <w:r>
+        <w:rPr>
+          <w:lang w:val="es-ES"/>
+        </w:rPr>
+        <w:t xml:space="preserve">El proyecto ha sufrido un impacto simultáneo en sus líneas base (Recursos Humanos y Alcance). Gracias a que el riesgo de deserción del </w:t>
+      </w:r>
+      <w:proofErr w:type="spellStart"/>
+      <w:r>
+        <w:rPr>
+          <w:lang w:val="es-ES"/>
+        </w:rPr>
+        <w:t>personal</w:t>
+      </w:r>
+      <w:proofErr w:type="spellEnd"/>
+      <w:r>
+        <w:rPr>
+          <w:lang w:val="es-ES"/>
+        </w:rPr>
+        <w:t xml:space="preserve"> ya estaba contemplado, la arquitectura de la base de datos se mantiene a salvo bajo el control del PM y el equipo remanente, evitando un retraso catastrófico en el motor de recaudación.</w:t>
+      </w:r>
     </w:p>
     <w:p>
       <w:pPr>

</xml_diff>

<commit_message>
doc13 / registro de incidencias
</commit_message>
<xml_diff>
--- a/DocumentoCompProyectoMercados_GCC.docx
+++ b/DocumentoCompProyectoMercados_GCC.docx
@@ -13674,6 +13674,525 @@
           <w:lang w:val="es-ES"/>
         </w:rPr>
       </w:pPr>
+    </w:p>
+    <w:p>
+      <w:pPr>
+        <w:pStyle w:val="Ttulo1"/>
+      </w:pPr>
+      <w:r>
+        <w:t>REGISTRO DE INCIDENCIAS</w:t>
+      </w:r>
+      <w:r>
+        <w:t xml:space="preserve"> (</w:t>
+      </w:r>
+      <w:proofErr w:type="spellStart"/>
+      <w:r>
+        <w:t>Issue</w:t>
+      </w:r>
+      <w:proofErr w:type="spellEnd"/>
+      <w:r>
+        <w:t xml:space="preserve"> Log)</w:t>
+      </w:r>
+    </w:p>
+    <w:p>
+      <w:pPr>
+        <w:rPr>
+          <w:rFonts w:ascii="Arial" w:hAnsi="Arial" w:cs="Arial"/>
+          <w:lang w:val="es-ES"/>
+        </w:rPr>
+      </w:pPr>
+      <w:r>
+        <w:rPr>
+          <w:rFonts w:ascii="Arial" w:hAnsi="Arial" w:cs="Arial"/>
+          <w:lang w:val="es-ES"/>
+        </w:rPr>
+        <w:t>Este documento registra los problemas o incidentes reales surgidos durante la ejecución del proyecto, detallando su impacto, solución y responsables.</w:t>
+      </w:r>
+    </w:p>
+    <w:p>
+      <w:pPr>
+        <w:pStyle w:val="Ttulo2"/>
+      </w:pPr>
+      <w:r>
+        <w:t>Registro de Incidencias Activas y Resueltas</w:t>
+      </w:r>
+    </w:p>
+    <w:p>
+      <w:pPr>
+        <w:ind w:left="360"/>
+        <w:rPr>
+          <w:rFonts w:ascii="Arial" w:hAnsi="Arial" w:cs="Arial"/>
+          <w:b/>
+          <w:bCs/>
+          <w:lang w:val="es-ES"/>
+        </w:rPr>
+      </w:pPr>
+      <w:r>
+        <w:rPr>
+          <w:rFonts w:ascii="Arial" w:hAnsi="Arial" w:cs="Arial"/>
+          <w:b/>
+          <w:bCs/>
+          <w:lang w:val="es-ES"/>
+        </w:rPr>
+        <w:t>Incidencia ID: INC-001</w:t>
+      </w:r>
+    </w:p>
+    <w:p>
+      <w:pPr>
+        <w:ind w:left="360"/>
+        <w:rPr>
+          <w:rFonts w:ascii="Arial" w:hAnsi="Arial" w:cs="Arial"/>
+          <w:lang w:val="es-ES"/>
+        </w:rPr>
+      </w:pPr>
+      <w:r>
+        <w:rPr>
+          <w:rFonts w:ascii="Arial" w:hAnsi="Arial" w:cs="Arial"/>
+          <w:b/>
+          <w:bCs/>
+          <w:lang w:val="es-ES"/>
+        </w:rPr>
+        <w:t>Fecha de Reporte:</w:t>
+      </w:r>
+      <w:r>
+        <w:rPr>
+          <w:rFonts w:ascii="Arial" w:hAnsi="Arial" w:cs="Arial"/>
+          <w:lang w:val="es-ES"/>
+        </w:rPr>
+        <w:t xml:space="preserve"> Lunes de la Semana 10</w:t>
+      </w:r>
+    </w:p>
+    <w:p>
+      <w:pPr>
+        <w:ind w:left="360"/>
+        <w:rPr>
+          <w:rFonts w:ascii="Arial" w:hAnsi="Arial" w:cs="Arial"/>
+          <w:lang w:val="es-ES"/>
+        </w:rPr>
+      </w:pPr>
+      <w:r>
+        <w:rPr>
+          <w:rFonts w:ascii="Arial" w:hAnsi="Arial" w:cs="Arial"/>
+          <w:b/>
+          <w:bCs/>
+          <w:lang w:val="es-ES"/>
+        </w:rPr>
+        <w:t>Descripción del Problema:</w:t>
+      </w:r>
+      <w:r>
+        <w:rPr>
+          <w:rFonts w:ascii="Arial" w:hAnsi="Arial" w:cs="Arial"/>
+          <w:lang w:val="es-ES"/>
+        </w:rPr>
+        <w:t xml:space="preserve"> Presentación formal de renuncia irrevocable por parte de los dos Desarrolladores Senior Clave del proyecto por ofertas externas.</w:t>
+      </w:r>
+    </w:p>
+    <w:p>
+      <w:pPr>
+        <w:ind w:left="360"/>
+        <w:rPr>
+          <w:rFonts w:ascii="Arial" w:hAnsi="Arial" w:cs="Arial"/>
+          <w:lang w:val="es-ES"/>
+        </w:rPr>
+      </w:pPr>
+      <w:r>
+        <w:rPr>
+          <w:rFonts w:ascii="Arial" w:hAnsi="Arial" w:cs="Arial"/>
+          <w:b/>
+          <w:bCs/>
+          <w:lang w:val="es-ES"/>
+        </w:rPr>
+        <w:t>Impacto en el Proyecto:</w:t>
+      </w:r>
+      <w:r>
+        <w:rPr>
+          <w:rFonts w:ascii="Arial" w:hAnsi="Arial" w:cs="Arial"/>
+          <w:lang w:val="es-ES"/>
+        </w:rPr>
+        <w:t xml:space="preserve"> Alto / Crítico. Paraliza el desarrollo del núcleo del Módulo de Cobros y Recaudación planificado para los </w:t>
+      </w:r>
+      <w:proofErr w:type="spellStart"/>
+      <w:r>
+        <w:rPr>
+          <w:rFonts w:ascii="Arial" w:hAnsi="Arial" w:cs="Arial"/>
+          <w:lang w:val="es-ES"/>
+        </w:rPr>
+        <w:t>Sprints</w:t>
+      </w:r>
+      <w:proofErr w:type="spellEnd"/>
+      <w:r>
+        <w:rPr>
+          <w:rFonts w:ascii="Arial" w:hAnsi="Arial" w:cs="Arial"/>
+          <w:lang w:val="es-ES"/>
+        </w:rPr>
+        <w:t xml:space="preserve"> 3 y 4. Riesgo inminente de retraso en la entrega final del MVP.</w:t>
+      </w:r>
+    </w:p>
+    <w:p>
+      <w:pPr>
+        <w:ind w:left="360"/>
+        <w:rPr>
+          <w:rFonts w:ascii="Arial" w:hAnsi="Arial" w:cs="Arial"/>
+          <w:lang w:val="es-ES"/>
+        </w:rPr>
+      </w:pPr>
+      <w:r>
+        <w:rPr>
+          <w:rFonts w:ascii="Arial" w:hAnsi="Arial" w:cs="Arial"/>
+          <w:b/>
+          <w:bCs/>
+          <w:lang w:val="es-ES"/>
+        </w:rPr>
+        <w:t>Acción de Resolución:</w:t>
+      </w:r>
+    </w:p>
+    <w:p>
+      <w:pPr>
+        <w:numPr>
+          <w:ilvl w:val="1"/>
+          <w:numId w:val="21"/>
+        </w:numPr>
+        <w:rPr>
+          <w:rFonts w:ascii="Arial" w:hAnsi="Arial" w:cs="Arial"/>
+          <w:lang w:val="es-ES"/>
+        </w:rPr>
+      </w:pPr>
+      <w:r>
+        <w:rPr>
+          <w:rFonts w:ascii="Arial" w:hAnsi="Arial" w:cs="Arial"/>
+          <w:lang w:val="es-ES"/>
+        </w:rPr>
+        <w:t xml:space="preserve">Se negoció una salida de 5 días con los desarrolladores salientes para realizar sesiones intensivas de </w:t>
+      </w:r>
+      <w:proofErr w:type="spellStart"/>
+      <w:r>
+        <w:rPr>
+          <w:rFonts w:ascii="Arial" w:hAnsi="Arial" w:cs="Arial"/>
+          <w:i/>
+          <w:iCs/>
+          <w:lang w:val="es-ES"/>
+        </w:rPr>
+        <w:t>Code</w:t>
+      </w:r>
+      <w:proofErr w:type="spellEnd"/>
+      <w:r>
+        <w:rPr>
+          <w:rFonts w:ascii="Arial" w:hAnsi="Arial" w:cs="Arial"/>
+          <w:i/>
+          <w:iCs/>
+          <w:lang w:val="es-ES"/>
+        </w:rPr>
+        <w:t xml:space="preserve"> </w:t>
+      </w:r>
+      <w:proofErr w:type="spellStart"/>
+      <w:r>
+        <w:rPr>
+          <w:rFonts w:ascii="Arial" w:hAnsi="Arial" w:cs="Arial"/>
+          <w:i/>
+          <w:iCs/>
+          <w:lang w:val="es-ES"/>
+        </w:rPr>
+        <w:t>Review</w:t>
+      </w:r>
+      <w:proofErr w:type="spellEnd"/>
+      <w:r>
+        <w:rPr>
+          <w:rFonts w:ascii="Arial" w:hAnsi="Arial" w:cs="Arial"/>
+          <w:lang w:val="es-ES"/>
+        </w:rPr>
+        <w:t xml:space="preserve"> y entrega de credenciales de servidores al PM.</w:t>
+      </w:r>
+    </w:p>
+    <w:p>
+      <w:pPr>
+        <w:numPr>
+          <w:ilvl w:val="1"/>
+          <w:numId w:val="21"/>
+        </w:numPr>
+        <w:rPr>
+          <w:rFonts w:ascii="Arial" w:hAnsi="Arial" w:cs="Arial"/>
+          <w:lang w:val="es-ES"/>
+        </w:rPr>
+      </w:pPr>
+      <w:r>
+        <w:rPr>
+          <w:rFonts w:ascii="Arial" w:hAnsi="Arial" w:cs="Arial"/>
+          <w:lang w:val="es-ES"/>
+        </w:rPr>
+        <w:t xml:space="preserve">Se reasignó al desarrollador </w:t>
+      </w:r>
+      <w:proofErr w:type="spellStart"/>
+      <w:r>
+        <w:rPr>
+          <w:rFonts w:ascii="Arial" w:hAnsi="Arial" w:cs="Arial"/>
+          <w:lang w:val="es-ES"/>
+        </w:rPr>
+        <w:t>Mid-Level</w:t>
+      </w:r>
+      <w:proofErr w:type="spellEnd"/>
+      <w:r>
+        <w:rPr>
+          <w:rFonts w:ascii="Arial" w:hAnsi="Arial" w:cs="Arial"/>
+          <w:lang w:val="es-ES"/>
+        </w:rPr>
+        <w:t xml:space="preserve"> para liderar temporalmente la continuidad del código.</w:t>
+      </w:r>
+    </w:p>
+    <w:p>
+      <w:pPr>
+        <w:numPr>
+          <w:ilvl w:val="1"/>
+          <w:numId w:val="21"/>
+        </w:numPr>
+        <w:rPr>
+          <w:rFonts w:ascii="Arial" w:hAnsi="Arial" w:cs="Arial"/>
+          <w:lang w:val="es-ES"/>
+        </w:rPr>
+      </w:pPr>
+      <w:r>
+        <w:rPr>
+          <w:rFonts w:ascii="Arial" w:hAnsi="Arial" w:cs="Arial"/>
+          <w:lang w:val="es-ES"/>
+        </w:rPr>
+        <w:t>Se inyectó el fondo de la reserva de contingencia para el pago de un programador externo por un periodo de 6 semanas.</w:t>
+      </w:r>
+    </w:p>
+    <w:p>
+      <w:pPr>
+        <w:ind w:left="360"/>
+        <w:rPr>
+          <w:rFonts w:ascii="Arial" w:hAnsi="Arial" w:cs="Arial"/>
+          <w:lang w:val="es-ES"/>
+        </w:rPr>
+      </w:pPr>
+      <w:r>
+        <w:rPr>
+          <w:rFonts w:ascii="Arial" w:hAnsi="Arial" w:cs="Arial"/>
+          <w:b/>
+          <w:bCs/>
+          <w:lang w:val="es-ES"/>
+        </w:rPr>
+        <w:t>Responsable:</w:t>
+      </w:r>
+      <w:r>
+        <w:rPr>
+          <w:rFonts w:ascii="Arial" w:hAnsi="Arial" w:cs="Arial"/>
+          <w:lang w:val="es-ES"/>
+        </w:rPr>
+        <w:t xml:space="preserve"> Gerente de Proyecto (PM)</w:t>
+      </w:r>
+    </w:p>
+    <w:p>
+      <w:pPr>
+        <w:ind w:left="360"/>
+        <w:rPr>
+          <w:rFonts w:ascii="Arial" w:hAnsi="Arial" w:cs="Arial"/>
+          <w:lang w:val="es-ES"/>
+        </w:rPr>
+      </w:pPr>
+      <w:r>
+        <w:rPr>
+          <w:rFonts w:ascii="Arial" w:hAnsi="Arial" w:cs="Arial"/>
+          <w:b/>
+          <w:bCs/>
+          <w:lang w:val="es-ES"/>
+        </w:rPr>
+        <w:lastRenderedPageBreak/>
+        <w:t>Estado:</w:t>
+      </w:r>
+      <w:r>
+        <w:rPr>
+          <w:rFonts w:ascii="Arial" w:hAnsi="Arial" w:cs="Arial"/>
+          <w:lang w:val="es-ES"/>
+        </w:rPr>
+        <w:t xml:space="preserve"> Cerrado (Mitigado)</w:t>
+      </w:r>
+    </w:p>
+    <w:p>
+      <w:pPr>
+        <w:ind w:left="360"/>
+        <w:rPr>
+          <w:rFonts w:ascii="Arial" w:hAnsi="Arial" w:cs="Arial"/>
+          <w:b/>
+          <w:bCs/>
+          <w:lang w:val="es-ES"/>
+        </w:rPr>
+      </w:pPr>
+      <w:r>
+        <w:rPr>
+          <w:rFonts w:ascii="Arial" w:hAnsi="Arial" w:cs="Arial"/>
+          <w:b/>
+          <w:bCs/>
+          <w:lang w:val="es-ES"/>
+        </w:rPr>
+        <w:t>Incidencia ID: INC-002</w:t>
+      </w:r>
+    </w:p>
+    <w:p>
+      <w:pPr>
+        <w:ind w:left="360"/>
+        <w:rPr>
+          <w:rFonts w:ascii="Arial" w:hAnsi="Arial" w:cs="Arial"/>
+          <w:lang w:val="es-ES"/>
+        </w:rPr>
+      </w:pPr>
+      <w:r>
+        <w:rPr>
+          <w:rFonts w:ascii="Arial" w:hAnsi="Arial" w:cs="Arial"/>
+          <w:b/>
+          <w:bCs/>
+          <w:lang w:val="es-ES"/>
+        </w:rPr>
+        <w:t>Fecha de Reporte:</w:t>
+      </w:r>
+      <w:r>
+        <w:rPr>
+          <w:rFonts w:ascii="Arial" w:hAnsi="Arial" w:cs="Arial"/>
+          <w:lang w:val="es-ES"/>
+        </w:rPr>
+        <w:t xml:space="preserve"> Miércoles de la Semana 10</w:t>
+      </w:r>
+    </w:p>
+    <w:p>
+      <w:pPr>
+        <w:ind w:left="360"/>
+        <w:rPr>
+          <w:rFonts w:ascii="Arial" w:hAnsi="Arial" w:cs="Arial"/>
+          <w:lang w:val="es-ES"/>
+        </w:rPr>
+      </w:pPr>
+      <w:r>
+        <w:rPr>
+          <w:rFonts w:ascii="Arial" w:hAnsi="Arial" w:cs="Arial"/>
+          <w:b/>
+          <w:bCs/>
+          <w:lang w:val="es-ES"/>
+        </w:rPr>
+        <w:t>Descripción del Problema:</w:t>
+      </w:r>
+      <w:r>
+        <w:rPr>
+          <w:rFonts w:ascii="Arial" w:hAnsi="Arial" w:cs="Arial"/>
+          <w:lang w:val="es-ES"/>
+        </w:rPr>
+        <w:t xml:space="preserve"> Notificación formal por parte de la Alcaldía sobre cambios de última hora en la normativa de Licencias Sanitarias Municipales, afectando los requisitos de validación técnica </w:t>
+      </w:r>
+      <w:proofErr w:type="spellStart"/>
+      <w:r>
+        <w:rPr>
+          <w:rFonts w:ascii="Arial" w:hAnsi="Arial" w:cs="Arial"/>
+          <w:lang w:val="es-ES"/>
+        </w:rPr>
+        <w:t>pre-acordados</w:t>
+      </w:r>
+      <w:proofErr w:type="spellEnd"/>
+      <w:r>
+        <w:rPr>
+          <w:rFonts w:ascii="Arial" w:hAnsi="Arial" w:cs="Arial"/>
+          <w:lang w:val="es-ES"/>
+        </w:rPr>
+        <w:t>.</w:t>
+      </w:r>
+    </w:p>
+    <w:p>
+      <w:pPr>
+        <w:ind w:left="360"/>
+        <w:rPr>
+          <w:rFonts w:ascii="Arial" w:hAnsi="Arial" w:cs="Arial"/>
+          <w:lang w:val="es-ES"/>
+        </w:rPr>
+      </w:pPr>
+      <w:r>
+        <w:rPr>
+          <w:rFonts w:ascii="Arial" w:hAnsi="Arial" w:cs="Arial"/>
+          <w:b/>
+          <w:bCs/>
+          <w:lang w:val="es-ES"/>
+        </w:rPr>
+        <w:t>Impacto en el Proyecto:</w:t>
+      </w:r>
+      <w:r>
+        <w:rPr>
+          <w:rFonts w:ascii="Arial" w:hAnsi="Arial" w:cs="Arial"/>
+          <w:lang w:val="es-ES"/>
+        </w:rPr>
+        <w:t xml:space="preserve"> Medio. Requiere modificar la validación de campos de la base de datos y los flujos de alerta del Módulo 3.</w:t>
+      </w:r>
+    </w:p>
+    <w:p>
+      <w:pPr>
+        <w:ind w:left="360"/>
+        <w:rPr>
+          <w:rFonts w:ascii="Arial" w:hAnsi="Arial" w:cs="Arial"/>
+          <w:lang w:val="es-ES"/>
+        </w:rPr>
+      </w:pPr>
+      <w:r>
+        <w:rPr>
+          <w:rFonts w:ascii="Arial" w:hAnsi="Arial" w:cs="Arial"/>
+          <w:b/>
+          <w:bCs/>
+          <w:lang w:val="es-ES"/>
+        </w:rPr>
+        <w:t>Acción de Resolución:</w:t>
+      </w:r>
+      <w:r>
+        <w:rPr>
+          <w:rFonts w:ascii="Arial" w:hAnsi="Arial" w:cs="Arial"/>
+          <w:lang w:val="es-ES"/>
+        </w:rPr>
+        <w:t xml:space="preserve"> Se actualizó el documento de Especificación de Requerimientos (05_especificacion_requerimientos.md) incorporando la nueva norma legal de Sucre. Al no estar desarrollado aún el módulo de licencias (programado para el Sprint 5), el impacto en el código fue de 0 horas.</w:t>
+      </w:r>
+    </w:p>
+    <w:p>
+      <w:pPr>
+        <w:ind w:left="360"/>
+        <w:rPr>
+          <w:rFonts w:ascii="Arial" w:hAnsi="Arial" w:cs="Arial"/>
+          <w:lang w:val="es-ES"/>
+        </w:rPr>
+      </w:pPr>
+      <w:r>
+        <w:rPr>
+          <w:rFonts w:ascii="Arial" w:hAnsi="Arial" w:cs="Arial"/>
+          <w:b/>
+          <w:bCs/>
+          <w:lang w:val="es-ES"/>
+        </w:rPr>
+        <w:t>Responsable:</w:t>
+      </w:r>
+      <w:r>
+        <w:rPr>
+          <w:rFonts w:ascii="Arial" w:hAnsi="Arial" w:cs="Arial"/>
+          <w:lang w:val="es-ES"/>
+        </w:rPr>
+        <w:t xml:space="preserve"> Analista de Requerimientos / PM</w:t>
+      </w:r>
+    </w:p>
+    <w:p>
+      <w:pPr>
+        <w:ind w:left="360"/>
+        <w:rPr>
+          <w:rFonts w:ascii="Arial" w:hAnsi="Arial" w:cs="Arial"/>
+          <w:lang w:val="es-ES"/>
+        </w:rPr>
+      </w:pPr>
+      <w:r>
+        <w:rPr>
+          <w:rFonts w:ascii="Arial" w:hAnsi="Arial" w:cs="Arial"/>
+          <w:b/>
+          <w:bCs/>
+          <w:lang w:val="es-ES"/>
+        </w:rPr>
+        <w:t>Estado:</w:t>
+      </w:r>
+      <w:r>
+        <w:rPr>
+          <w:rFonts w:ascii="Arial" w:hAnsi="Arial" w:cs="Arial"/>
+          <w:lang w:val="es-ES"/>
+        </w:rPr>
+        <w:t xml:space="preserve"> Cerrado</w:t>
+      </w:r>
     </w:p>
     <w:p>
       <w:pPr>
@@ -14441,6 +14960,155 @@
     </w:lvl>
   </w:abstractNum>
   <w:abstractNum w:abstractNumId="5" w15:restartNumberingAfterBreak="0">
+    <w:nsid w:val="1BE426AA"/>
+    <w:multiLevelType w:val="multilevel"/>
+    <w:tmpl w:val="13642572"/>
+    <w:lvl w:ilvl="0">
+      <w:start w:val="1"/>
+      <w:numFmt w:val="bullet"/>
+      <w:lvlText w:val=""/>
+      <w:lvlJc w:val="left"/>
+      <w:pPr>
+        <w:tabs>
+          <w:tab w:val="num" w:pos="720"/>
+        </w:tabs>
+        <w:ind w:left="720" w:hanging="360"/>
+      </w:pPr>
+      <w:rPr>
+        <w:rFonts w:ascii="Symbol" w:hAnsi="Symbol" w:hint="default"/>
+        <w:sz w:val="20"/>
+      </w:rPr>
+    </w:lvl>
+    <w:lvl w:ilvl="1">
+      <w:start w:val="1"/>
+      <w:numFmt w:val="bullet"/>
+      <w:lvlText w:val="o"/>
+      <w:lvlJc w:val="left"/>
+      <w:pPr>
+        <w:tabs>
+          <w:tab w:val="num" w:pos="1440"/>
+        </w:tabs>
+        <w:ind w:left="1440" w:hanging="360"/>
+      </w:pPr>
+      <w:rPr>
+        <w:rFonts w:ascii="Courier New" w:hAnsi="Courier New" w:hint="default"/>
+        <w:sz w:val="20"/>
+      </w:rPr>
+    </w:lvl>
+    <w:lvl w:ilvl="2" w:tentative="1">
+      <w:start w:val="1"/>
+      <w:numFmt w:val="bullet"/>
+      <w:lvlText w:val=""/>
+      <w:lvlJc w:val="left"/>
+      <w:pPr>
+        <w:tabs>
+          <w:tab w:val="num" w:pos="2160"/>
+        </w:tabs>
+        <w:ind w:left="2160" w:hanging="360"/>
+      </w:pPr>
+      <w:rPr>
+        <w:rFonts w:ascii="Wingdings" w:hAnsi="Wingdings" w:hint="default"/>
+        <w:sz w:val="20"/>
+      </w:rPr>
+    </w:lvl>
+    <w:lvl w:ilvl="3" w:tentative="1">
+      <w:start w:val="1"/>
+      <w:numFmt w:val="bullet"/>
+      <w:lvlText w:val=""/>
+      <w:lvlJc w:val="left"/>
+      <w:pPr>
+        <w:tabs>
+          <w:tab w:val="num" w:pos="2880"/>
+        </w:tabs>
+        <w:ind w:left="2880" w:hanging="360"/>
+      </w:pPr>
+      <w:rPr>
+        <w:rFonts w:ascii="Wingdings" w:hAnsi="Wingdings" w:hint="default"/>
+        <w:sz w:val="20"/>
+      </w:rPr>
+    </w:lvl>
+    <w:lvl w:ilvl="4" w:tentative="1">
+      <w:start w:val="1"/>
+      <w:numFmt w:val="bullet"/>
+      <w:lvlText w:val=""/>
+      <w:lvlJc w:val="left"/>
+      <w:pPr>
+        <w:tabs>
+          <w:tab w:val="num" w:pos="3600"/>
+        </w:tabs>
+        <w:ind w:left="3600" w:hanging="360"/>
+      </w:pPr>
+      <w:rPr>
+        <w:rFonts w:ascii="Wingdings" w:hAnsi="Wingdings" w:hint="default"/>
+        <w:sz w:val="20"/>
+      </w:rPr>
+    </w:lvl>
+    <w:lvl w:ilvl="5" w:tentative="1">
+      <w:start w:val="1"/>
+      <w:numFmt w:val="bullet"/>
+      <w:lvlText w:val=""/>
+      <w:lvlJc w:val="left"/>
+      <w:pPr>
+        <w:tabs>
+          <w:tab w:val="num" w:pos="4320"/>
+        </w:tabs>
+        <w:ind w:left="4320" w:hanging="360"/>
+      </w:pPr>
+      <w:rPr>
+        <w:rFonts w:ascii="Wingdings" w:hAnsi="Wingdings" w:hint="default"/>
+        <w:sz w:val="20"/>
+      </w:rPr>
+    </w:lvl>
+    <w:lvl w:ilvl="6" w:tentative="1">
+      <w:start w:val="1"/>
+      <w:numFmt w:val="bullet"/>
+      <w:lvlText w:val=""/>
+      <w:lvlJc w:val="left"/>
+      <w:pPr>
+        <w:tabs>
+          <w:tab w:val="num" w:pos="5040"/>
+        </w:tabs>
+        <w:ind w:left="5040" w:hanging="360"/>
+      </w:pPr>
+      <w:rPr>
+        <w:rFonts w:ascii="Wingdings" w:hAnsi="Wingdings" w:hint="default"/>
+        <w:sz w:val="20"/>
+      </w:rPr>
+    </w:lvl>
+    <w:lvl w:ilvl="7" w:tentative="1">
+      <w:start w:val="1"/>
+      <w:numFmt w:val="bullet"/>
+      <w:lvlText w:val=""/>
+      <w:lvlJc w:val="left"/>
+      <w:pPr>
+        <w:tabs>
+          <w:tab w:val="num" w:pos="5760"/>
+        </w:tabs>
+        <w:ind w:left="5760" w:hanging="360"/>
+      </w:pPr>
+      <w:rPr>
+        <w:rFonts w:ascii="Wingdings" w:hAnsi="Wingdings" w:hint="default"/>
+        <w:sz w:val="20"/>
+      </w:rPr>
+    </w:lvl>
+    <w:lvl w:ilvl="8" w:tentative="1">
+      <w:start w:val="1"/>
+      <w:numFmt w:val="bullet"/>
+      <w:lvlText w:val=""/>
+      <w:lvlJc w:val="left"/>
+      <w:pPr>
+        <w:tabs>
+          <w:tab w:val="num" w:pos="6480"/>
+        </w:tabs>
+        <w:ind w:left="6480" w:hanging="360"/>
+      </w:pPr>
+      <w:rPr>
+        <w:rFonts w:ascii="Wingdings" w:hAnsi="Wingdings" w:hint="default"/>
+        <w:sz w:val="20"/>
+      </w:rPr>
+    </w:lvl>
+  </w:abstractNum>
+  <w:abstractNum w:abstractNumId="6" w15:restartNumberingAfterBreak="0">
     <w:nsid w:val="351225BE"/>
     <w:multiLevelType w:val="multilevel"/>
     <w:tmpl w:val="420C3678"/>
@@ -14553,7 +15221,7 @@
       </w:pPr>
     </w:lvl>
   </w:abstractNum>
-  <w:abstractNum w:abstractNumId="6" w15:restartNumberingAfterBreak="0">
+  <w:abstractNum w:abstractNumId="7" w15:restartNumberingAfterBreak="0">
     <w:nsid w:val="3D9C5985"/>
     <w:multiLevelType w:val="multilevel"/>
     <w:tmpl w:val="277AD260"/>
@@ -14666,7 +15334,7 @@
       </w:pPr>
     </w:lvl>
   </w:abstractNum>
-  <w:abstractNum w:abstractNumId="7" w15:restartNumberingAfterBreak="0">
+  <w:abstractNum w:abstractNumId="8" w15:restartNumberingAfterBreak="0">
     <w:nsid w:val="415521CD"/>
     <w:multiLevelType w:val="multilevel"/>
     <w:tmpl w:val="E0AA99D4"/>
@@ -14815,7 +15483,7 @@
       </w:rPr>
     </w:lvl>
   </w:abstractNum>
-  <w:abstractNum w:abstractNumId="8" w15:restartNumberingAfterBreak="0">
+  <w:abstractNum w:abstractNumId="9" w15:restartNumberingAfterBreak="0">
     <w:nsid w:val="41DA779B"/>
     <w:multiLevelType w:val="multilevel"/>
     <w:tmpl w:val="8FFAF41A"/>
@@ -14928,7 +15596,7 @@
       </w:pPr>
     </w:lvl>
   </w:abstractNum>
-  <w:abstractNum w:abstractNumId="9" w15:restartNumberingAfterBreak="0">
+  <w:abstractNum w:abstractNumId="10" w15:restartNumberingAfterBreak="0">
     <w:nsid w:val="444D03FA"/>
     <w:multiLevelType w:val="hybridMultilevel"/>
     <w:tmpl w:val="80EC6116"/>
@@ -15041,7 +15709,7 @@
       </w:rPr>
     </w:lvl>
   </w:abstractNum>
-  <w:abstractNum w:abstractNumId="10" w15:restartNumberingAfterBreak="0">
+  <w:abstractNum w:abstractNumId="11" w15:restartNumberingAfterBreak="0">
     <w:nsid w:val="45632781"/>
     <w:multiLevelType w:val="hybridMultilevel"/>
     <w:tmpl w:val="7C28A2BA"/>
@@ -15154,7 +15822,7 @@
       </w:rPr>
     </w:lvl>
   </w:abstractNum>
-  <w:abstractNum w:abstractNumId="11" w15:restartNumberingAfterBreak="0">
+  <w:abstractNum w:abstractNumId="12" w15:restartNumberingAfterBreak="0">
     <w:nsid w:val="50DF3A72"/>
     <w:multiLevelType w:val="multilevel"/>
     <w:tmpl w:val="66C2A37E"/>
@@ -15241,7 +15909,7 @@
       </w:pPr>
     </w:lvl>
   </w:abstractNum>
-  <w:abstractNum w:abstractNumId="12" w15:restartNumberingAfterBreak="0">
+  <w:abstractNum w:abstractNumId="13" w15:restartNumberingAfterBreak="0">
     <w:nsid w:val="53790B1E"/>
     <w:multiLevelType w:val="hybridMultilevel"/>
     <w:tmpl w:val="7A06AD96"/>
@@ -15354,7 +16022,7 @@
       </w:rPr>
     </w:lvl>
   </w:abstractNum>
-  <w:abstractNum w:abstractNumId="13" w15:restartNumberingAfterBreak="0">
+  <w:abstractNum w:abstractNumId="14" w15:restartNumberingAfterBreak="0">
     <w:nsid w:val="65FE7B33"/>
     <w:multiLevelType w:val="multilevel"/>
     <w:tmpl w:val="19F407F2"/>
@@ -15499,7 +16167,7 @@
       </w:rPr>
     </w:lvl>
   </w:abstractNum>
-  <w:abstractNum w:abstractNumId="14" w15:restartNumberingAfterBreak="0">
+  <w:abstractNum w:abstractNumId="15" w15:restartNumberingAfterBreak="0">
     <w:nsid w:val="66824B31"/>
     <w:multiLevelType w:val="hybridMultilevel"/>
     <w:tmpl w:val="FB76797A"/>
@@ -15585,7 +16253,7 @@
       </w:pPr>
     </w:lvl>
   </w:abstractNum>
-  <w:abstractNum w:abstractNumId="15" w15:restartNumberingAfterBreak="0">
+  <w:abstractNum w:abstractNumId="16" w15:restartNumberingAfterBreak="0">
     <w:nsid w:val="675D26CC"/>
     <w:multiLevelType w:val="multilevel"/>
     <w:tmpl w:val="4C4C901C"/>
@@ -15734,7 +16402,7 @@
       </w:rPr>
     </w:lvl>
   </w:abstractNum>
-  <w:abstractNum w:abstractNumId="16" w15:restartNumberingAfterBreak="0">
+  <w:abstractNum w:abstractNumId="17" w15:restartNumberingAfterBreak="0">
     <w:nsid w:val="6D9E2373"/>
     <w:multiLevelType w:val="multilevel"/>
     <w:tmpl w:val="7798721C"/>
@@ -15883,7 +16551,7 @@
       </w:rPr>
     </w:lvl>
   </w:abstractNum>
-  <w:abstractNum w:abstractNumId="17" w15:restartNumberingAfterBreak="0">
+  <w:abstractNum w:abstractNumId="18" w15:restartNumberingAfterBreak="0">
     <w:nsid w:val="7CB5752A"/>
     <w:multiLevelType w:val="hybridMultilevel"/>
     <w:tmpl w:val="3E8855C0"/>
@@ -15996,7 +16664,7 @@
       </w:rPr>
     </w:lvl>
   </w:abstractNum>
-  <w:abstractNum w:abstractNumId="18" w15:restartNumberingAfterBreak="0">
+  <w:abstractNum w:abstractNumId="19" w15:restartNumberingAfterBreak="0">
     <w:nsid w:val="7D905054"/>
     <w:multiLevelType w:val="hybridMultilevel"/>
     <w:tmpl w:val="9CB40FDE"/>
@@ -16109,7 +16777,7 @@
       </w:rPr>
     </w:lvl>
   </w:abstractNum>
-  <w:abstractNum w:abstractNumId="19" w15:restartNumberingAfterBreak="0">
+  <w:abstractNum w:abstractNumId="20" w15:restartNumberingAfterBreak="0">
     <w:nsid w:val="7E764224"/>
     <w:multiLevelType w:val="multilevel"/>
     <w:tmpl w:val="5248F0BA"/>
@@ -16262,7 +16930,7 @@
     <w:abstractNumId w:val="0"/>
   </w:num>
   <w:num w:numId="2">
-    <w:abstractNumId w:val="11"/>
+    <w:abstractNumId w:val="12"/>
     <w:lvlOverride w:ilvl="0">
       <w:startOverride w:val="1"/>
     </w:lvlOverride>
@@ -16292,7 +16960,7 @@
     </w:lvlOverride>
   </w:num>
   <w:num w:numId="3">
-    <w:abstractNumId w:val="5"/>
+    <w:abstractNumId w:val="6"/>
     <w:lvlOverride w:ilvl="0">
       <w:startOverride w:val="1"/>
     </w:lvlOverride>
@@ -16322,10 +16990,10 @@
     </w:lvlOverride>
   </w:num>
   <w:num w:numId="4">
-    <w:abstractNumId w:val="7"/>
+    <w:abstractNumId w:val="8"/>
   </w:num>
   <w:num w:numId="5">
-    <w:abstractNumId w:val="16"/>
+    <w:abstractNumId w:val="17"/>
   </w:num>
   <w:num w:numId="6">
     <w:abstractNumId w:val="4"/>
@@ -16334,45 +17002,48 @@
     <w:abstractNumId w:val="1"/>
   </w:num>
   <w:num w:numId="8">
+    <w:abstractNumId w:val="11"/>
+  </w:num>
+  <w:num w:numId="9">
+    <w:abstractNumId w:val="18"/>
+  </w:num>
+  <w:num w:numId="10">
+    <w:abstractNumId w:val="9"/>
+  </w:num>
+  <w:num w:numId="11">
+    <w:abstractNumId w:val="20"/>
+  </w:num>
+  <w:num w:numId="12">
     <w:abstractNumId w:val="10"/>
   </w:num>
-  <w:num w:numId="9">
-    <w:abstractNumId w:val="17"/>
-  </w:num>
-  <w:num w:numId="10">
-    <w:abstractNumId w:val="8"/>
-  </w:num>
-  <w:num w:numId="11">
-    <w:abstractNumId w:val="19"/>
-  </w:num>
-  <w:num w:numId="12">
-    <w:abstractNumId w:val="9"/>
-  </w:num>
   <w:num w:numId="13">
-    <w:abstractNumId w:val="12"/>
+    <w:abstractNumId w:val="13"/>
   </w:num>
   <w:num w:numId="14">
     <w:abstractNumId w:val="3"/>
   </w:num>
   <w:num w:numId="15">
-    <w:abstractNumId w:val="18"/>
+    <w:abstractNumId w:val="19"/>
   </w:num>
   <w:num w:numId="16">
-    <w:abstractNumId w:val="6"/>
+    <w:abstractNumId w:val="7"/>
   </w:num>
   <w:num w:numId="17">
+    <w:abstractNumId w:val="15"/>
+  </w:num>
+  <w:num w:numId="18">
     <w:abstractNumId w:val="14"/>
   </w:num>
-  <w:num w:numId="18">
-    <w:abstractNumId w:val="13"/>
-  </w:num>
   <w:num w:numId="19">
-    <w:abstractNumId w:val="15"/>
+    <w:abstractNumId w:val="16"/>
   </w:num>
   <w:num w:numId="20">
     <w:abstractNumId w:val="2"/>
   </w:num>
-  <w:numIdMacAtCleanup w:val="20"/>
+  <w:num w:numId="21">
+    <w:abstractNumId w:val="5"/>
+  </w:num>
+  <w:numIdMacAtCleanup w:val="21"/>
 </w:numbering>
 </file>
 

</xml_diff>

<commit_message>
doc14 / informe de avance semanal
</commit_message>
<xml_diff>
--- a/DocumentoCompProyectoMercados_GCC.docx
+++ b/DocumentoCompProyectoMercados_GCC.docx
@@ -448,7 +448,7 @@
           <w:r>
             <w:fldChar w:fldCharType="separate"/>
           </w:r>
-          <w:hyperlink w:anchor="_Toc232544607" w:history="1">
+          <w:hyperlink w:anchor="_Toc232544988" w:history="1">
             <w:r>
               <w:rPr>
                 <w:rStyle w:val="Hipervnculo"/>
@@ -490,7 +490,7 @@
                 <w:noProof/>
                 <w:webHidden/>
               </w:rPr>
-              <w:instrText xml:space="preserve"> PAGEREF _Toc232544607 \h </w:instrText>
+              <w:instrText xml:space="preserve"> PAGEREF _Toc232544988 \h </w:instrText>
             </w:r>
             <w:r>
               <w:rPr>
@@ -534,7 +534,7 @@
               <w:lang w:val="es-ES" w:eastAsia="es-ES"/>
             </w:rPr>
           </w:pPr>
-          <w:hyperlink w:anchor="_Toc232544608" w:history="1">
+          <w:hyperlink w:anchor="_Toc232544989" w:history="1">
             <w:r>
               <w:rPr>
                 <w:rStyle w:val="Hipervnculo"/>
@@ -576,7 +576,7 @@
                 <w:noProof/>
                 <w:webHidden/>
               </w:rPr>
-              <w:instrText xml:space="preserve"> PAGEREF _Toc232544608 \h </w:instrText>
+              <w:instrText xml:space="preserve"> PAGEREF _Toc232544989 \h </w:instrText>
             </w:r>
             <w:r>
               <w:rPr>
@@ -620,7 +620,7 @@
               <w:lang w:val="es-ES" w:eastAsia="es-ES"/>
             </w:rPr>
           </w:pPr>
-          <w:hyperlink w:anchor="_Toc232544609" w:history="1">
+          <w:hyperlink w:anchor="_Toc232544990" w:history="1">
             <w:r>
               <w:rPr>
                 <w:rStyle w:val="Hipervnculo"/>
@@ -662,7 +662,7 @@
                 <w:noProof/>
                 <w:webHidden/>
               </w:rPr>
-              <w:instrText xml:space="preserve"> PAGEREF _Toc232544609 \h </w:instrText>
+              <w:instrText xml:space="preserve"> PAGEREF _Toc232544990 \h </w:instrText>
             </w:r>
             <w:r>
               <w:rPr>
@@ -706,7 +706,7 @@
               <w:lang w:val="es-ES" w:eastAsia="es-ES"/>
             </w:rPr>
           </w:pPr>
-          <w:hyperlink w:anchor="_Toc232544610" w:history="1">
+          <w:hyperlink w:anchor="_Toc232544991" w:history="1">
             <w:r>
               <w:rPr>
                 <w:rStyle w:val="Hipervnculo"/>
@@ -748,7 +748,7 @@
                 <w:noProof/>
                 <w:webHidden/>
               </w:rPr>
-              <w:instrText xml:space="preserve"> PAGEREF _Toc232544610 \h </w:instrText>
+              <w:instrText xml:space="preserve"> PAGEREF _Toc232544991 \h </w:instrText>
             </w:r>
             <w:r>
               <w:rPr>
@@ -792,7 +792,7 @@
               <w:lang w:val="es-ES" w:eastAsia="es-ES"/>
             </w:rPr>
           </w:pPr>
-          <w:hyperlink w:anchor="_Toc232544611" w:history="1">
+          <w:hyperlink w:anchor="_Toc232544992" w:history="1">
             <w:r>
               <w:rPr>
                 <w:rStyle w:val="Hipervnculo"/>
@@ -834,7 +834,7 @@
                 <w:noProof/>
                 <w:webHidden/>
               </w:rPr>
-              <w:instrText xml:space="preserve"> PAGEREF _Toc232544611 \h </w:instrText>
+              <w:instrText xml:space="preserve"> PAGEREF _Toc232544992 \h </w:instrText>
             </w:r>
             <w:r>
               <w:rPr>
@@ -878,7 +878,7 @@
               <w:lang w:val="es-ES" w:eastAsia="es-ES"/>
             </w:rPr>
           </w:pPr>
-          <w:hyperlink w:anchor="_Toc232544612" w:history="1">
+          <w:hyperlink w:anchor="_Toc232544993" w:history="1">
             <w:r>
               <w:rPr>
                 <w:rStyle w:val="Hipervnculo"/>
@@ -920,7 +920,7 @@
                 <w:noProof/>
                 <w:webHidden/>
               </w:rPr>
-              <w:instrText xml:space="preserve"> PAGEREF _Toc232544612 \h </w:instrText>
+              <w:instrText xml:space="preserve"> PAGEREF _Toc232544993 \h </w:instrText>
             </w:r>
             <w:r>
               <w:rPr>
@@ -964,7 +964,7 @@
               <w:lang w:val="es-ES" w:eastAsia="es-ES"/>
             </w:rPr>
           </w:pPr>
-          <w:hyperlink w:anchor="_Toc232544613" w:history="1">
+          <w:hyperlink w:anchor="_Toc232544994" w:history="1">
             <w:r>
               <w:rPr>
                 <w:rStyle w:val="Hipervnculo"/>
@@ -1006,7 +1006,7 @@
                 <w:noProof/>
                 <w:webHidden/>
               </w:rPr>
-              <w:instrText xml:space="preserve"> PAGEREF _Toc232544613 \h </w:instrText>
+              <w:instrText xml:space="preserve"> PAGEREF _Toc232544994 \h </w:instrText>
             </w:r>
             <w:r>
               <w:rPr>
@@ -1050,7 +1050,7 @@
               <w:lang w:val="es-ES" w:eastAsia="es-ES"/>
             </w:rPr>
           </w:pPr>
-          <w:hyperlink w:anchor="_Toc232544614" w:history="1">
+          <w:hyperlink w:anchor="_Toc232544995" w:history="1">
             <w:r>
               <w:rPr>
                 <w:rStyle w:val="Hipervnculo"/>
@@ -1092,7 +1092,7 @@
                 <w:noProof/>
                 <w:webHidden/>
               </w:rPr>
-              <w:instrText xml:space="preserve"> PAGEREF _Toc232544614 \h </w:instrText>
+              <w:instrText xml:space="preserve"> PAGEREF _Toc232544995 \h </w:instrText>
             </w:r>
             <w:r>
               <w:rPr>
@@ -1136,7 +1136,7 @@
               <w:lang w:val="es-ES" w:eastAsia="es-ES"/>
             </w:rPr>
           </w:pPr>
-          <w:hyperlink w:anchor="_Toc232544615" w:history="1">
+          <w:hyperlink w:anchor="_Toc232544996" w:history="1">
             <w:r>
               <w:rPr>
                 <w:rStyle w:val="Hipervnculo"/>
@@ -1178,7 +1178,7 @@
                 <w:noProof/>
                 <w:webHidden/>
               </w:rPr>
-              <w:instrText xml:space="preserve"> PAGEREF _Toc232544615 \h </w:instrText>
+              <w:instrText xml:space="preserve"> PAGEREF _Toc232544996 \h </w:instrText>
             </w:r>
             <w:r>
               <w:rPr>
@@ -1222,7 +1222,7 @@
               <w:lang w:val="es-ES" w:eastAsia="es-ES"/>
             </w:rPr>
           </w:pPr>
-          <w:hyperlink w:anchor="_Toc232544616" w:history="1">
+          <w:hyperlink w:anchor="_Toc232544997" w:history="1">
             <w:r>
               <w:rPr>
                 <w:rStyle w:val="Hipervnculo"/>
@@ -1264,7 +1264,7 @@
                 <w:noProof/>
                 <w:webHidden/>
               </w:rPr>
-              <w:instrText xml:space="preserve"> PAGEREF _Toc232544616 \h </w:instrText>
+              <w:instrText xml:space="preserve"> PAGEREF _Toc232544997 \h </w:instrText>
             </w:r>
             <w:r>
               <w:rPr>
@@ -1308,7 +1308,7 @@
               <w:lang w:val="es-ES" w:eastAsia="es-ES"/>
             </w:rPr>
           </w:pPr>
-          <w:hyperlink w:anchor="_Toc232544617" w:history="1">
+          <w:hyperlink w:anchor="_Toc232544998" w:history="1">
             <w:r>
               <w:rPr>
                 <w:rStyle w:val="Hipervnculo"/>
@@ -1350,7 +1350,7 @@
                 <w:noProof/>
                 <w:webHidden/>
               </w:rPr>
-              <w:instrText xml:space="preserve"> PAGEREF _Toc232544617 \h </w:instrText>
+              <w:instrText xml:space="preserve"> PAGEREF _Toc232544998 \h </w:instrText>
             </w:r>
             <w:r>
               <w:rPr>
@@ -1394,7 +1394,7 @@
               <w:lang w:val="es-ES" w:eastAsia="es-ES"/>
             </w:rPr>
           </w:pPr>
-          <w:hyperlink w:anchor="_Toc232544618" w:history="1">
+          <w:hyperlink w:anchor="_Toc232544999" w:history="1">
             <w:r>
               <w:rPr>
                 <w:rStyle w:val="Hipervnculo"/>
@@ -1436,7 +1436,7 @@
                 <w:noProof/>
                 <w:webHidden/>
               </w:rPr>
-              <w:instrText xml:space="preserve"> PAGEREF _Toc232544618 \h </w:instrText>
+              <w:instrText xml:space="preserve"> PAGEREF _Toc232544999 \h </w:instrText>
             </w:r>
             <w:r>
               <w:rPr>
@@ -1480,7 +1480,7 @@
               <w:lang w:val="es-ES" w:eastAsia="es-ES"/>
             </w:rPr>
           </w:pPr>
-          <w:hyperlink w:anchor="_Toc232544619" w:history="1">
+          <w:hyperlink w:anchor="_Toc232545000" w:history="1">
             <w:r>
               <w:rPr>
                 <w:rStyle w:val="Hipervnculo"/>
@@ -1522,7 +1522,7 @@
                 <w:noProof/>
                 <w:webHidden/>
               </w:rPr>
-              <w:instrText xml:space="preserve"> PAGEREF _Toc232544619 \h </w:instrText>
+              <w:instrText xml:space="preserve"> PAGEREF _Toc232545000 \h </w:instrText>
             </w:r>
             <w:r>
               <w:rPr>
@@ -1566,7 +1566,7 @@
               <w:lang w:val="es-ES" w:eastAsia="es-ES"/>
             </w:rPr>
           </w:pPr>
-          <w:hyperlink w:anchor="_Toc232544620" w:history="1">
+          <w:hyperlink w:anchor="_Toc232545001" w:history="1">
             <w:r>
               <w:rPr>
                 <w:rStyle w:val="Hipervnculo"/>
@@ -1608,7 +1608,7 @@
                 <w:noProof/>
                 <w:webHidden/>
               </w:rPr>
-              <w:instrText xml:space="preserve"> PAGEREF _Toc232544620 \h </w:instrText>
+              <w:instrText xml:space="preserve"> PAGEREF _Toc232545001 \h </w:instrText>
             </w:r>
             <w:r>
               <w:rPr>
@@ -1652,7 +1652,7 @@
               <w:lang w:val="es-ES" w:eastAsia="es-ES"/>
             </w:rPr>
           </w:pPr>
-          <w:hyperlink w:anchor="_Toc232544621" w:history="1">
+          <w:hyperlink w:anchor="_Toc232545002" w:history="1">
             <w:r>
               <w:rPr>
                 <w:rStyle w:val="Hipervnculo"/>
@@ -1694,7 +1694,7 @@
                 <w:noProof/>
                 <w:webHidden/>
               </w:rPr>
-              <w:instrText xml:space="preserve"> PAGEREF _Toc232544621 \h </w:instrText>
+              <w:instrText xml:space="preserve"> PAGEREF _Toc232545002 \h </w:instrText>
             </w:r>
             <w:r>
               <w:rPr>
@@ -1738,7 +1738,7 @@
               <w:lang w:val="es-ES" w:eastAsia="es-ES"/>
             </w:rPr>
           </w:pPr>
-          <w:hyperlink w:anchor="_Toc232544622" w:history="1">
+          <w:hyperlink w:anchor="_Toc232545003" w:history="1">
             <w:r>
               <w:rPr>
                 <w:rStyle w:val="Hipervnculo"/>
@@ -1780,7 +1780,7 @@
                 <w:noProof/>
                 <w:webHidden/>
               </w:rPr>
-              <w:instrText xml:space="preserve"> PAGEREF _Toc232544622 \h </w:instrText>
+              <w:instrText xml:space="preserve"> PAGEREF _Toc232545003 \h </w:instrText>
             </w:r>
             <w:r>
               <w:rPr>
@@ -1824,7 +1824,7 @@
               <w:lang w:val="es-ES" w:eastAsia="es-ES"/>
             </w:rPr>
           </w:pPr>
-          <w:hyperlink w:anchor="_Toc232544623" w:history="1">
+          <w:hyperlink w:anchor="_Toc232545004" w:history="1">
             <w:r>
               <w:rPr>
                 <w:rStyle w:val="Hipervnculo"/>
@@ -1866,7 +1866,7 @@
                 <w:noProof/>
                 <w:webHidden/>
               </w:rPr>
-              <w:instrText xml:space="preserve"> PAGEREF _Toc232544623 \h </w:instrText>
+              <w:instrText xml:space="preserve"> PAGEREF _Toc232545004 \h </w:instrText>
             </w:r>
             <w:r>
               <w:rPr>
@@ -1910,7 +1910,7 @@
               <w:lang w:val="es-ES" w:eastAsia="es-ES"/>
             </w:rPr>
           </w:pPr>
-          <w:hyperlink w:anchor="_Toc232544624" w:history="1">
+          <w:hyperlink w:anchor="_Toc232545005" w:history="1">
             <w:r>
               <w:rPr>
                 <w:rStyle w:val="Hipervnculo"/>
@@ -1952,7 +1952,7 @@
                 <w:noProof/>
                 <w:webHidden/>
               </w:rPr>
-              <w:instrText xml:space="preserve"> PAGEREF _Toc232544624 \h </w:instrText>
+              <w:instrText xml:space="preserve"> PAGEREF _Toc232545005 \h </w:instrText>
             </w:r>
             <w:r>
               <w:rPr>
@@ -1996,7 +1996,7 @@
               <w:lang w:val="es-ES" w:eastAsia="es-ES"/>
             </w:rPr>
           </w:pPr>
-          <w:hyperlink w:anchor="_Toc232544625" w:history="1">
+          <w:hyperlink w:anchor="_Toc232545006" w:history="1">
             <w:r>
               <w:rPr>
                 <w:rStyle w:val="Hipervnculo"/>
@@ -2038,7 +2038,7 @@
                 <w:noProof/>
                 <w:webHidden/>
               </w:rPr>
-              <w:instrText xml:space="preserve"> PAGEREF _Toc232544625 \h </w:instrText>
+              <w:instrText xml:space="preserve"> PAGEREF _Toc232545006 \h </w:instrText>
             </w:r>
             <w:r>
               <w:rPr>
@@ -2082,7 +2082,7 @@
               <w:lang w:val="es-ES" w:eastAsia="es-ES"/>
             </w:rPr>
           </w:pPr>
-          <w:hyperlink w:anchor="_Toc232544626" w:history="1">
+          <w:hyperlink w:anchor="_Toc232545007" w:history="1">
             <w:r>
               <w:rPr>
                 <w:rStyle w:val="Hipervnculo"/>
@@ -2124,7 +2124,7 @@
                 <w:noProof/>
                 <w:webHidden/>
               </w:rPr>
-              <w:instrText xml:space="preserve"> PAGEREF _Toc232544626 \h </w:instrText>
+              <w:instrText xml:space="preserve"> PAGEREF _Toc232545007 \h </w:instrText>
             </w:r>
             <w:r>
               <w:rPr>
@@ -2168,7 +2168,7 @@
               <w:lang w:val="es-ES" w:eastAsia="es-ES"/>
             </w:rPr>
           </w:pPr>
-          <w:hyperlink w:anchor="_Toc232544627" w:history="1">
+          <w:hyperlink w:anchor="_Toc232545008" w:history="1">
             <w:r>
               <w:rPr>
                 <w:rStyle w:val="Hipervnculo"/>
@@ -2210,7 +2210,7 @@
                 <w:noProof/>
                 <w:webHidden/>
               </w:rPr>
-              <w:instrText xml:space="preserve"> PAGEREF _Toc232544627 \h </w:instrText>
+              <w:instrText xml:space="preserve"> PAGEREF _Toc232545008 \h </w:instrText>
             </w:r>
             <w:r>
               <w:rPr>
@@ -2254,7 +2254,7 @@
               <w:lang w:val="es-ES" w:eastAsia="es-ES"/>
             </w:rPr>
           </w:pPr>
-          <w:hyperlink w:anchor="_Toc232544628" w:history="1">
+          <w:hyperlink w:anchor="_Toc232545009" w:history="1">
             <w:r>
               <w:rPr>
                 <w:rStyle w:val="Hipervnculo"/>
@@ -2296,7 +2296,7 @@
                 <w:noProof/>
                 <w:webHidden/>
               </w:rPr>
-              <w:instrText xml:space="preserve"> PAGEREF _Toc232544628 \h </w:instrText>
+              <w:instrText xml:space="preserve"> PAGEREF _Toc232545009 \h </w:instrText>
             </w:r>
             <w:r>
               <w:rPr>
@@ -2340,7 +2340,7 @@
               <w:lang w:val="es-ES" w:eastAsia="es-ES"/>
             </w:rPr>
           </w:pPr>
-          <w:hyperlink w:anchor="_Toc232544629" w:history="1">
+          <w:hyperlink w:anchor="_Toc232545010" w:history="1">
             <w:r>
               <w:rPr>
                 <w:rStyle w:val="Hipervnculo"/>
@@ -2382,7 +2382,7 @@
                 <w:noProof/>
                 <w:webHidden/>
               </w:rPr>
-              <w:instrText xml:space="preserve"> PAGEREF _Toc232544629 \h </w:instrText>
+              <w:instrText xml:space="preserve"> PAGEREF _Toc232545010 \h </w:instrText>
             </w:r>
             <w:r>
               <w:rPr>
@@ -2426,7 +2426,7 @@
               <w:lang w:val="es-ES" w:eastAsia="es-ES"/>
             </w:rPr>
           </w:pPr>
-          <w:hyperlink w:anchor="_Toc232544630" w:history="1">
+          <w:hyperlink w:anchor="_Toc232545011" w:history="1">
             <w:r>
               <w:rPr>
                 <w:rStyle w:val="Hipervnculo"/>
@@ -2468,7 +2468,7 @@
                 <w:noProof/>
                 <w:webHidden/>
               </w:rPr>
-              <w:instrText xml:space="preserve"> PAGEREF _Toc232544630 \h </w:instrText>
+              <w:instrText xml:space="preserve"> PAGEREF _Toc232545011 \h </w:instrText>
             </w:r>
             <w:r>
               <w:rPr>
@@ -2512,7 +2512,7 @@
               <w:lang w:val="es-ES" w:eastAsia="es-ES"/>
             </w:rPr>
           </w:pPr>
-          <w:hyperlink w:anchor="_Toc232544631" w:history="1">
+          <w:hyperlink w:anchor="_Toc232545012" w:history="1">
             <w:r>
               <w:rPr>
                 <w:rStyle w:val="Hipervnculo"/>
@@ -2554,7 +2554,7 @@
                 <w:noProof/>
                 <w:webHidden/>
               </w:rPr>
-              <w:instrText xml:space="preserve"> PAGEREF _Toc232544631 \h </w:instrText>
+              <w:instrText xml:space="preserve"> PAGEREF _Toc232545012 \h </w:instrText>
             </w:r>
             <w:r>
               <w:rPr>
@@ -2598,7 +2598,7 @@
               <w:lang w:val="es-ES" w:eastAsia="es-ES"/>
             </w:rPr>
           </w:pPr>
-          <w:hyperlink w:anchor="_Toc232544632" w:history="1">
+          <w:hyperlink w:anchor="_Toc232545013" w:history="1">
             <w:r>
               <w:rPr>
                 <w:rStyle w:val="Hipervnculo"/>
@@ -2640,7 +2640,7 @@
                 <w:noProof/>
                 <w:webHidden/>
               </w:rPr>
-              <w:instrText xml:space="preserve"> PAGEREF _Toc232544632 \h </w:instrText>
+              <w:instrText xml:space="preserve"> PAGEREF _Toc232545013 \h </w:instrText>
             </w:r>
             <w:r>
               <w:rPr>
@@ -2684,7 +2684,7 @@
               <w:lang w:val="es-ES" w:eastAsia="es-ES"/>
             </w:rPr>
           </w:pPr>
-          <w:hyperlink w:anchor="_Toc232544633" w:history="1">
+          <w:hyperlink w:anchor="_Toc232545014" w:history="1">
             <w:r>
               <w:rPr>
                 <w:rStyle w:val="Hipervnculo"/>
@@ -2726,7 +2726,7 @@
                 <w:noProof/>
                 <w:webHidden/>
               </w:rPr>
-              <w:instrText xml:space="preserve"> PAGEREF _Toc232544633 \h </w:instrText>
+              <w:instrText xml:space="preserve"> PAGEREF _Toc232545014 \h </w:instrText>
             </w:r>
             <w:r>
               <w:rPr>
@@ -2770,7 +2770,7 @@
               <w:lang w:val="es-ES" w:eastAsia="es-ES"/>
             </w:rPr>
           </w:pPr>
-          <w:hyperlink w:anchor="_Toc232544634" w:history="1">
+          <w:hyperlink w:anchor="_Toc232545015" w:history="1">
             <w:r>
               <w:rPr>
                 <w:rStyle w:val="Hipervnculo"/>
@@ -2812,7 +2812,7 @@
                 <w:noProof/>
                 <w:webHidden/>
               </w:rPr>
-              <w:instrText xml:space="preserve"> PAGEREF _Toc232544634 \h </w:instrText>
+              <w:instrText xml:space="preserve"> PAGEREF _Toc232545015 \h </w:instrText>
             </w:r>
             <w:r>
               <w:rPr>
@@ -2856,7 +2856,7 @@
               <w:lang w:val="es-ES" w:eastAsia="es-ES"/>
             </w:rPr>
           </w:pPr>
-          <w:hyperlink w:anchor="_Toc232544635" w:history="1">
+          <w:hyperlink w:anchor="_Toc232545016" w:history="1">
             <w:r>
               <w:rPr>
                 <w:rStyle w:val="Hipervnculo"/>
@@ -2898,7 +2898,7 @@
                 <w:noProof/>
                 <w:webHidden/>
               </w:rPr>
-              <w:instrText xml:space="preserve"> PAGEREF _Toc232544635 \h </w:instrText>
+              <w:instrText xml:space="preserve"> PAGEREF _Toc232545016 \h </w:instrText>
             </w:r>
             <w:r>
               <w:rPr>
@@ -2942,7 +2942,7 @@
               <w:lang w:val="es-ES" w:eastAsia="es-ES"/>
             </w:rPr>
           </w:pPr>
-          <w:hyperlink w:anchor="_Toc232544636" w:history="1">
+          <w:hyperlink w:anchor="_Toc232545017" w:history="1">
             <w:r>
               <w:rPr>
                 <w:rStyle w:val="Hipervnculo"/>
@@ -2984,7 +2984,7 @@
                 <w:noProof/>
                 <w:webHidden/>
               </w:rPr>
-              <w:instrText xml:space="preserve"> PAGEREF _Toc232544636 \h </w:instrText>
+              <w:instrText xml:space="preserve"> PAGEREF _Toc232545017 \h </w:instrText>
             </w:r>
             <w:r>
               <w:rPr>
@@ -3028,7 +3028,7 @@
               <w:lang w:val="es-ES" w:eastAsia="es-ES"/>
             </w:rPr>
           </w:pPr>
-          <w:hyperlink w:anchor="_Toc232544637" w:history="1">
+          <w:hyperlink w:anchor="_Toc232545018" w:history="1">
             <w:r>
               <w:rPr>
                 <w:rStyle w:val="Hipervnculo"/>
@@ -3070,7 +3070,7 @@
                 <w:noProof/>
                 <w:webHidden/>
               </w:rPr>
-              <w:instrText xml:space="preserve"> PAGEREF _Toc232544637 \h </w:instrText>
+              <w:instrText xml:space="preserve"> PAGEREF _Toc232545018 \h </w:instrText>
             </w:r>
             <w:r>
               <w:rPr>
@@ -3114,7 +3114,7 @@
               <w:lang w:val="es-ES" w:eastAsia="es-ES"/>
             </w:rPr>
           </w:pPr>
-          <w:hyperlink w:anchor="_Toc232544638" w:history="1">
+          <w:hyperlink w:anchor="_Toc232545019" w:history="1">
             <w:r>
               <w:rPr>
                 <w:rStyle w:val="Hipervnculo"/>
@@ -3240,7 +3240,7 @@
                 <w:noProof/>
                 <w:webHidden/>
               </w:rPr>
-              <w:instrText xml:space="preserve"> PAGEREF _Toc232544638 \h </w:instrText>
+              <w:instrText xml:space="preserve"> PAGEREF _Toc232545019 \h </w:instrText>
             </w:r>
             <w:r>
               <w:rPr>
@@ -3284,7 +3284,7 @@
               <w:lang w:val="es-ES" w:eastAsia="es-ES"/>
             </w:rPr>
           </w:pPr>
-          <w:hyperlink w:anchor="_Toc232544639" w:history="1">
+          <w:hyperlink w:anchor="_Toc232545020" w:history="1">
             <w:r>
               <w:rPr>
                 <w:rStyle w:val="Hipervnculo"/>
@@ -3326,7 +3326,7 @@
                 <w:noProof/>
                 <w:webHidden/>
               </w:rPr>
-              <w:instrText xml:space="preserve"> PAGEREF _Toc232544639 \h </w:instrText>
+              <w:instrText xml:space="preserve"> PAGEREF _Toc232545020 \h </w:instrText>
             </w:r>
             <w:r>
               <w:rPr>
@@ -3370,7 +3370,7 @@
               <w:lang w:val="es-ES" w:eastAsia="es-ES"/>
             </w:rPr>
           </w:pPr>
-          <w:hyperlink w:anchor="_Toc232544640" w:history="1">
+          <w:hyperlink w:anchor="_Toc232545021" w:history="1">
             <w:r>
               <w:rPr>
                 <w:rStyle w:val="Hipervnculo"/>
@@ -3412,7 +3412,7 @@
                 <w:noProof/>
                 <w:webHidden/>
               </w:rPr>
-              <w:instrText xml:space="preserve"> PAGEREF _Toc232544640 \h </w:instrText>
+              <w:instrText xml:space="preserve"> PAGEREF _Toc232545021 \h </w:instrText>
             </w:r>
             <w:r>
               <w:rPr>
@@ -3456,7 +3456,7 @@
               <w:lang w:val="es-ES" w:eastAsia="es-ES"/>
             </w:rPr>
           </w:pPr>
-          <w:hyperlink w:anchor="_Toc232544641" w:history="1">
+          <w:hyperlink w:anchor="_Toc232545022" w:history="1">
             <w:r>
               <w:rPr>
                 <w:rStyle w:val="Hipervnculo"/>
@@ -3498,7 +3498,7 @@
                 <w:noProof/>
                 <w:webHidden/>
               </w:rPr>
-              <w:instrText xml:space="preserve"> PAGEREF _Toc232544641 \h </w:instrText>
+              <w:instrText xml:space="preserve"> PAGEREF _Toc232545022 \h </w:instrText>
             </w:r>
             <w:r>
               <w:rPr>
@@ -3542,7 +3542,7 @@
               <w:lang w:val="es-ES" w:eastAsia="es-ES"/>
             </w:rPr>
           </w:pPr>
-          <w:hyperlink w:anchor="_Toc232544642" w:history="1">
+          <w:hyperlink w:anchor="_Toc232545023" w:history="1">
             <w:r>
               <w:rPr>
                 <w:rStyle w:val="Hipervnculo"/>
@@ -3584,7 +3584,7 @@
                 <w:noProof/>
                 <w:webHidden/>
               </w:rPr>
-              <w:instrText xml:space="preserve"> PAGEREF _Toc232544642 \h </w:instrText>
+              <w:instrText xml:space="preserve"> PAGEREF _Toc232545023 \h </w:instrText>
             </w:r>
             <w:r>
               <w:rPr>
@@ -3628,7 +3628,7 @@
               <w:lang w:val="es-ES" w:eastAsia="es-ES"/>
             </w:rPr>
           </w:pPr>
-          <w:hyperlink w:anchor="_Toc232544643" w:history="1">
+          <w:hyperlink w:anchor="_Toc232545024" w:history="1">
             <w:r>
               <w:rPr>
                 <w:rStyle w:val="Hipervnculo"/>
@@ -3670,7 +3670,7 @@
                 <w:noProof/>
                 <w:webHidden/>
               </w:rPr>
-              <w:instrText xml:space="preserve"> PAGEREF _Toc232544643 \h </w:instrText>
+              <w:instrText xml:space="preserve"> PAGEREF _Toc232545024 \h </w:instrText>
             </w:r>
             <w:r>
               <w:rPr>
@@ -3714,7 +3714,7 @@
               <w:lang w:val="es-ES" w:eastAsia="es-ES"/>
             </w:rPr>
           </w:pPr>
-          <w:hyperlink w:anchor="_Toc232544644" w:history="1">
+          <w:hyperlink w:anchor="_Toc232545025" w:history="1">
             <w:r>
               <w:rPr>
                 <w:rStyle w:val="Hipervnculo"/>
@@ -3756,7 +3756,7 @@
                 <w:noProof/>
                 <w:webHidden/>
               </w:rPr>
-              <w:instrText xml:space="preserve"> PAGEREF _Toc232544644 \h </w:instrText>
+              <w:instrText xml:space="preserve"> PAGEREF _Toc232545025 \h </w:instrText>
             </w:r>
             <w:r>
               <w:rPr>
@@ -3800,7 +3800,7 @@
               <w:lang w:val="es-ES" w:eastAsia="es-ES"/>
             </w:rPr>
           </w:pPr>
-          <w:hyperlink w:anchor="_Toc232544645" w:history="1">
+          <w:hyperlink w:anchor="_Toc232545026" w:history="1">
             <w:r>
               <w:rPr>
                 <w:rStyle w:val="Hipervnculo"/>
@@ -3842,7 +3842,7 @@
                 <w:noProof/>
                 <w:webHidden/>
               </w:rPr>
-              <w:instrText xml:space="preserve"> PAGEREF _Toc232544645 \h </w:instrText>
+              <w:instrText xml:space="preserve"> PAGEREF _Toc232545026 \h </w:instrText>
             </w:r>
             <w:r>
               <w:rPr>
@@ -3886,7 +3886,7 @@
               <w:lang w:val="es-ES" w:eastAsia="es-ES"/>
             </w:rPr>
           </w:pPr>
-          <w:hyperlink w:anchor="_Toc232544646" w:history="1">
+          <w:hyperlink w:anchor="_Toc232545027" w:history="1">
             <w:r>
               <w:rPr>
                 <w:rStyle w:val="Hipervnculo"/>
@@ -3928,7 +3928,7 @@
                 <w:noProof/>
                 <w:webHidden/>
               </w:rPr>
-              <w:instrText xml:space="preserve"> PAGEREF _Toc232544646 \h </w:instrText>
+              <w:instrText xml:space="preserve"> PAGEREF _Toc232545027 \h </w:instrText>
             </w:r>
             <w:r>
               <w:rPr>
@@ -3972,7 +3972,7 @@
               <w:lang w:val="es-ES" w:eastAsia="es-ES"/>
             </w:rPr>
           </w:pPr>
-          <w:hyperlink w:anchor="_Toc232544647" w:history="1">
+          <w:hyperlink w:anchor="_Toc232545028" w:history="1">
             <w:r>
               <w:rPr>
                 <w:rStyle w:val="Hipervnculo"/>
@@ -4014,7 +4014,7 @@
                 <w:noProof/>
                 <w:webHidden/>
               </w:rPr>
-              <w:instrText xml:space="preserve"> PAGEREF _Toc232544647 \h </w:instrText>
+              <w:instrText xml:space="preserve"> PAGEREF _Toc232545028 \h </w:instrText>
             </w:r>
             <w:r>
               <w:rPr>
@@ -4058,7 +4058,7 @@
               <w:lang w:val="es-ES" w:eastAsia="es-ES"/>
             </w:rPr>
           </w:pPr>
-          <w:hyperlink w:anchor="_Toc232544648" w:history="1">
+          <w:hyperlink w:anchor="_Toc232545029" w:history="1">
             <w:r>
               <w:rPr>
                 <w:rStyle w:val="Hipervnculo"/>
@@ -4108,7 +4108,7 @@
                 <w:noProof/>
                 <w:webHidden/>
               </w:rPr>
-              <w:instrText xml:space="preserve"> PAGEREF _Toc232544648 \h </w:instrText>
+              <w:instrText xml:space="preserve"> PAGEREF _Toc232545029 \h </w:instrText>
             </w:r>
             <w:r>
               <w:rPr>
@@ -4152,7 +4152,7 @@
               <w:lang w:val="es-ES" w:eastAsia="es-ES"/>
             </w:rPr>
           </w:pPr>
-          <w:hyperlink w:anchor="_Toc232544649" w:history="1">
+          <w:hyperlink w:anchor="_Toc232545030" w:history="1">
             <w:r>
               <w:rPr>
                 <w:rStyle w:val="Hipervnculo"/>
@@ -4194,7 +4194,7 @@
                 <w:noProof/>
                 <w:webHidden/>
               </w:rPr>
-              <w:instrText xml:space="preserve"> PAGEREF _Toc232544649 \h </w:instrText>
+              <w:instrText xml:space="preserve"> PAGEREF _Toc232545030 \h </w:instrText>
             </w:r>
             <w:r>
               <w:rPr>
@@ -4238,7 +4238,7 @@
               <w:lang w:val="es-ES" w:eastAsia="es-ES"/>
             </w:rPr>
           </w:pPr>
-          <w:hyperlink w:anchor="_Toc232544650" w:history="1">
+          <w:hyperlink w:anchor="_Toc232545031" w:history="1">
             <w:r>
               <w:rPr>
                 <w:rStyle w:val="Hipervnculo"/>
@@ -4280,7 +4280,7 @@
                 <w:noProof/>
                 <w:webHidden/>
               </w:rPr>
-              <w:instrText xml:space="preserve"> PAGEREF _Toc232544650 \h </w:instrText>
+              <w:instrText xml:space="preserve"> PAGEREF _Toc232545031 \h </w:instrText>
             </w:r>
             <w:r>
               <w:rPr>
@@ -4324,7 +4324,7 @@
               <w:lang w:val="es-ES" w:eastAsia="es-ES"/>
             </w:rPr>
           </w:pPr>
-          <w:hyperlink w:anchor="_Toc232544651" w:history="1">
+          <w:hyperlink w:anchor="_Toc232545032" w:history="1">
             <w:r>
               <w:rPr>
                 <w:rStyle w:val="Hipervnculo"/>
@@ -4366,7 +4366,7 @@
                 <w:noProof/>
                 <w:webHidden/>
               </w:rPr>
-              <w:instrText xml:space="preserve"> PAGEREF _Toc232544651 \h </w:instrText>
+              <w:instrText xml:space="preserve"> PAGEREF _Toc232545032 \h </w:instrText>
             </w:r>
             <w:r>
               <w:rPr>
@@ -4410,7 +4410,7 @@
               <w:lang w:val="es-ES" w:eastAsia="es-ES"/>
             </w:rPr>
           </w:pPr>
-          <w:hyperlink w:anchor="_Toc232544652" w:history="1">
+          <w:hyperlink w:anchor="_Toc232545033" w:history="1">
             <w:r>
               <w:rPr>
                 <w:rStyle w:val="Hipervnculo"/>
@@ -4452,7 +4452,7 @@
                 <w:noProof/>
                 <w:webHidden/>
               </w:rPr>
-              <w:instrText xml:space="preserve"> PAGEREF _Toc232544652 \h </w:instrText>
+              <w:instrText xml:space="preserve"> PAGEREF _Toc232545033 \h </w:instrText>
             </w:r>
             <w:r>
               <w:rPr>
@@ -4496,7 +4496,7 @@
               <w:lang w:val="es-ES" w:eastAsia="es-ES"/>
             </w:rPr>
           </w:pPr>
-          <w:hyperlink w:anchor="_Toc232544653" w:history="1">
+          <w:hyperlink w:anchor="_Toc232545034" w:history="1">
             <w:r>
               <w:rPr>
                 <w:rStyle w:val="Hipervnculo"/>
@@ -4538,7 +4538,7 @@
                 <w:noProof/>
                 <w:webHidden/>
               </w:rPr>
-              <w:instrText xml:space="preserve"> PAGEREF _Toc232544653 \h </w:instrText>
+              <w:instrText xml:space="preserve"> PAGEREF _Toc232545034 \h </w:instrText>
             </w:r>
             <w:r>
               <w:rPr>
@@ -4582,7 +4582,7 @@
               <w:lang w:val="es-ES" w:eastAsia="es-ES"/>
             </w:rPr>
           </w:pPr>
-          <w:hyperlink w:anchor="_Toc232544654" w:history="1">
+          <w:hyperlink w:anchor="_Toc232545035" w:history="1">
             <w:r>
               <w:rPr>
                 <w:rStyle w:val="Hipervnculo"/>
@@ -4624,7 +4624,7 @@
                 <w:noProof/>
                 <w:webHidden/>
               </w:rPr>
-              <w:instrText xml:space="preserve"> PAGEREF _Toc232544654 \h </w:instrText>
+              <w:instrText xml:space="preserve"> PAGEREF _Toc232545035 \h </w:instrText>
             </w:r>
             <w:r>
               <w:rPr>
@@ -4668,7 +4668,7 @@
               <w:lang w:val="es-ES" w:eastAsia="es-ES"/>
             </w:rPr>
           </w:pPr>
-          <w:hyperlink w:anchor="_Toc232544655" w:history="1">
+          <w:hyperlink w:anchor="_Toc232545036" w:history="1">
             <w:r>
               <w:rPr>
                 <w:rStyle w:val="Hipervnculo"/>
@@ -4710,7 +4710,7 @@
                 <w:noProof/>
                 <w:webHidden/>
               </w:rPr>
-              <w:instrText xml:space="preserve"> PAGEREF _Toc232544655 \h </w:instrText>
+              <w:instrText xml:space="preserve"> PAGEREF _Toc232545036 \h </w:instrText>
             </w:r>
             <w:r>
               <w:rPr>
@@ -4754,7 +4754,7 @@
               <w:lang w:val="es-ES" w:eastAsia="es-ES"/>
             </w:rPr>
           </w:pPr>
-          <w:hyperlink w:anchor="_Toc232544656" w:history="1">
+          <w:hyperlink w:anchor="_Toc232545037" w:history="1">
             <w:r>
               <w:rPr>
                 <w:rStyle w:val="Hipervnculo"/>
@@ -4796,7 +4796,7 @@
                 <w:noProof/>
                 <w:webHidden/>
               </w:rPr>
-              <w:instrText xml:space="preserve"> PAGEREF _Toc232544656 \h </w:instrText>
+              <w:instrText xml:space="preserve"> PAGEREF _Toc232545037 \h </w:instrText>
             </w:r>
             <w:r>
               <w:rPr>
@@ -4840,7 +4840,7 @@
               <w:lang w:val="es-ES" w:eastAsia="es-ES"/>
             </w:rPr>
           </w:pPr>
-          <w:hyperlink w:anchor="_Toc232544657" w:history="1">
+          <w:hyperlink w:anchor="_Toc232545038" w:history="1">
             <w:r>
               <w:rPr>
                 <w:rStyle w:val="Hipervnculo"/>
@@ -4882,7 +4882,179 @@
                 <w:noProof/>
                 <w:webHidden/>
               </w:rPr>
-              <w:instrText xml:space="preserve"> PAGEREF _Toc232544657 \h </w:instrText>
+              <w:instrText xml:space="preserve"> PAGEREF _Toc232545038 \h </w:instrText>
+            </w:r>
+            <w:r>
+              <w:rPr>
+                <w:noProof/>
+                <w:webHidden/>
+              </w:rPr>
+            </w:r>
+            <w:r>
+              <w:rPr>
+                <w:noProof/>
+                <w:webHidden/>
+              </w:rPr>
+              <w:fldChar w:fldCharType="separate"/>
+            </w:r>
+            <w:r>
+              <w:rPr>
+                <w:noProof/>
+                <w:webHidden/>
+              </w:rPr>
+              <w:t>19</w:t>
+            </w:r>
+            <w:r>
+              <w:rPr>
+                <w:noProof/>
+                <w:webHidden/>
+              </w:rPr>
+              <w:fldChar w:fldCharType="end"/>
+            </w:r>
+          </w:hyperlink>
+        </w:p>
+        <w:p>
+          <w:pPr>
+            <w:pStyle w:val="TDC1"/>
+            <w:tabs>
+              <w:tab w:val="left" w:pos="660"/>
+              <w:tab w:val="right" w:leader="dot" w:pos="9395"/>
+            </w:tabs>
+            <w:rPr>
+              <w:rFonts w:eastAsiaTheme="minorEastAsia"/>
+              <w:noProof/>
+              <w:lang w:val="es-ES" w:eastAsia="es-ES"/>
+            </w:rPr>
+          </w:pPr>
+          <w:hyperlink w:anchor="_Toc232545039" w:history="1">
+            <w:r>
+              <w:rPr>
+                <w:rStyle w:val="Hipervnculo"/>
+                <w:noProof/>
+              </w:rPr>
+              <w:t>13.</w:t>
+            </w:r>
+            <w:r>
+              <w:rPr>
+                <w:rFonts w:eastAsiaTheme="minorEastAsia"/>
+                <w:noProof/>
+                <w:lang w:val="es-ES" w:eastAsia="es-ES"/>
+              </w:rPr>
+              <w:tab/>
+            </w:r>
+            <w:r>
+              <w:rPr>
+                <w:rStyle w:val="Hipervnculo"/>
+                <w:noProof/>
+              </w:rPr>
+              <w:t>REGISTRO DE INCIDENCIAS (Issue Log)</w:t>
+            </w:r>
+            <w:r>
+              <w:rPr>
+                <w:noProof/>
+                <w:webHidden/>
+              </w:rPr>
+              <w:tab/>
+            </w:r>
+            <w:r>
+              <w:rPr>
+                <w:noProof/>
+                <w:webHidden/>
+              </w:rPr>
+              <w:fldChar w:fldCharType="begin"/>
+            </w:r>
+            <w:r>
+              <w:rPr>
+                <w:noProof/>
+                <w:webHidden/>
+              </w:rPr>
+              <w:instrText xml:space="preserve"> PAGEREF _Toc232545039 \h </w:instrText>
+            </w:r>
+            <w:r>
+              <w:rPr>
+                <w:noProof/>
+                <w:webHidden/>
+              </w:rPr>
+            </w:r>
+            <w:r>
+              <w:rPr>
+                <w:noProof/>
+                <w:webHidden/>
+              </w:rPr>
+              <w:fldChar w:fldCharType="separate"/>
+            </w:r>
+            <w:r>
+              <w:rPr>
+                <w:noProof/>
+                <w:webHidden/>
+              </w:rPr>
+              <w:t>19</w:t>
+            </w:r>
+            <w:r>
+              <w:rPr>
+                <w:noProof/>
+                <w:webHidden/>
+              </w:rPr>
+              <w:fldChar w:fldCharType="end"/>
+            </w:r>
+          </w:hyperlink>
+        </w:p>
+        <w:p>
+          <w:pPr>
+            <w:pStyle w:val="TDC2"/>
+            <w:tabs>
+              <w:tab w:val="left" w:pos="1100"/>
+              <w:tab w:val="right" w:leader="dot" w:pos="9395"/>
+            </w:tabs>
+            <w:rPr>
+              <w:rFonts w:eastAsiaTheme="minorEastAsia"/>
+              <w:noProof/>
+              <w:lang w:val="es-ES" w:eastAsia="es-ES"/>
+            </w:rPr>
+          </w:pPr>
+          <w:hyperlink w:anchor="_Toc232545040" w:history="1">
+            <w:r>
+              <w:rPr>
+                <w:rStyle w:val="Hipervnculo"/>
+                <w:noProof/>
+              </w:rPr>
+              <w:t>13.1.</w:t>
+            </w:r>
+            <w:r>
+              <w:rPr>
+                <w:rFonts w:eastAsiaTheme="minorEastAsia"/>
+                <w:noProof/>
+                <w:lang w:val="es-ES" w:eastAsia="es-ES"/>
+              </w:rPr>
+              <w:tab/>
+            </w:r>
+            <w:r>
+              <w:rPr>
+                <w:rStyle w:val="Hipervnculo"/>
+                <w:noProof/>
+              </w:rPr>
+              <w:t>Registro de Incidencias Activas y Resueltas</w:t>
+            </w:r>
+            <w:r>
+              <w:rPr>
+                <w:noProof/>
+                <w:webHidden/>
+              </w:rPr>
+              <w:tab/>
+            </w:r>
+            <w:r>
+              <w:rPr>
+                <w:noProof/>
+                <w:webHidden/>
+              </w:rPr>
+              <w:fldChar w:fldCharType="begin"/>
+            </w:r>
+            <w:r>
+              <w:rPr>
+                <w:noProof/>
+                <w:webHidden/>
+              </w:rPr>
+              <w:instrText xml:space="preserve"> PAGEREF _Toc232545040 \h </w:instrText>
             </w:r>
             <w:r>
               <w:rPr>
@@ -4950,7 +5122,7 @@
       <w:pPr>
         <w:pStyle w:val="Ttulo1"/>
       </w:pPr>
-      <w:bookmarkStart w:id="0" w:name="_Toc232544607"/>
+      <w:bookmarkStart w:id="0" w:name="_Toc232544988"/>
       <w:r>
         <w:t>ACTA DE CONSTITUCIÓN DEL PROYECTO</w:t>
       </w:r>
@@ -4960,7 +5132,7 @@
       <w:pPr>
         <w:pStyle w:val="Ttulo2"/>
       </w:pPr>
-      <w:bookmarkStart w:id="1" w:name="_Toc232544608"/>
+      <w:bookmarkStart w:id="1" w:name="_Toc232544989"/>
       <w:r>
         <w:t>Información General del Proyecto</w:t>
       </w:r>
@@ -5059,7 +5231,7 @@
       <w:pPr>
         <w:pStyle w:val="Ttulo2"/>
       </w:pPr>
-      <w:bookmarkStart w:id="2" w:name="_Toc232544609"/>
+      <w:bookmarkStart w:id="2" w:name="_Toc232544990"/>
       <w:r>
         <w:t>Propósito y Justificación del Proyecto</w:t>
       </w:r>
@@ -5115,7 +5287,7 @@
       <w:pPr>
         <w:pStyle w:val="Ttulo2"/>
       </w:pPr>
-      <w:bookmarkStart w:id="3" w:name="_Toc232544610"/>
+      <w:bookmarkStart w:id="3" w:name="_Toc232544991"/>
       <w:r>
         <w:t>Objetivos del Proyecto</w:t>
       </w:r>
@@ -5125,7 +5297,7 @@
       <w:pPr>
         <w:pStyle w:val="Ttulo3"/>
       </w:pPr>
-      <w:bookmarkStart w:id="4" w:name="_Toc232544611"/>
+      <w:bookmarkStart w:id="4" w:name="_Toc232544992"/>
       <w:r>
         <w:t>Objetivo General</w:t>
       </w:r>
@@ -5153,7 +5325,7 @@
       <w:pPr>
         <w:pStyle w:val="Ttulo3"/>
       </w:pPr>
-      <w:bookmarkStart w:id="5" w:name="_Toc232544612"/>
+      <w:bookmarkStart w:id="5" w:name="_Toc232544993"/>
       <w:r>
         <w:t>Objetivos Específicos</w:t>
       </w:r>
@@ -5270,7 +5442,7 @@
       <w:pPr>
         <w:pStyle w:val="Ttulo2"/>
       </w:pPr>
-      <w:bookmarkStart w:id="6" w:name="_Toc232544613"/>
+      <w:bookmarkStart w:id="6" w:name="_Toc232544994"/>
       <w:r>
         <w:t>Alcance Inicial del Proyecto</w:t>
       </w:r>
@@ -5383,7 +5555,7 @@
       <w:pPr>
         <w:pStyle w:val="Ttulo3"/>
       </w:pPr>
-      <w:bookmarkStart w:id="7" w:name="_Toc232544614"/>
+      <w:bookmarkStart w:id="7" w:name="_Toc232544995"/>
       <w:r>
         <w:t>Módulos Incluidos en el MVP</w:t>
       </w:r>
@@ -5585,7 +5757,7 @@
       <w:pPr>
         <w:pStyle w:val="Ttulo2"/>
       </w:pPr>
-      <w:bookmarkStart w:id="8" w:name="_Toc232544615"/>
+      <w:bookmarkStart w:id="8" w:name="_Toc232544996"/>
       <w:r>
         <w:t>Restricciones y Supuestos</w:t>
       </w:r>
@@ -5595,7 +5767,7 @@
       <w:pPr>
         <w:pStyle w:val="Ttulo3"/>
       </w:pPr>
-      <w:bookmarkStart w:id="9" w:name="_Toc232544616"/>
+      <w:bookmarkStart w:id="9" w:name="_Toc232544997"/>
       <w:r>
         <w:t>Restricciones</w:t>
       </w:r>
@@ -5681,7 +5853,7 @@
       <w:pPr>
         <w:pStyle w:val="Ttulo3"/>
       </w:pPr>
-      <w:bookmarkStart w:id="10" w:name="_Toc232544617"/>
+      <w:bookmarkStart w:id="10" w:name="_Toc232544998"/>
       <w:r>
         <w:t>Supuestos</w:t>
       </w:r>
@@ -5773,7 +5945,7 @@
       <w:pPr>
         <w:pStyle w:val="Ttulo2"/>
       </w:pPr>
-      <w:bookmarkStart w:id="11" w:name="_Toc232544618"/>
+      <w:bookmarkStart w:id="11" w:name="_Toc232544999"/>
       <w:r>
         <w:t>Presupuesto y Recursos Iniciales</w:t>
       </w:r>
@@ -5816,23 +5988,7 @@
           <w:rFonts w:ascii="Arial" w:hAnsi="Arial" w:cs="Arial"/>
           <w:lang w:val="es-ES"/>
         </w:rPr>
-        <w:t xml:space="preserve">70.000 </w:t>
-      </w:r>
-      <w:proofErr w:type="gramStart"/>
-      <w:r>
-        <w:rPr>
-          <w:rFonts w:ascii="Arial" w:hAnsi="Arial" w:cs="Arial"/>
-          <w:lang w:val="es-ES"/>
-        </w:rPr>
-        <w:t>Bolivianos</w:t>
-      </w:r>
-      <w:proofErr w:type="gramEnd"/>
-      <w:r>
-        <w:rPr>
-          <w:rFonts w:ascii="Arial" w:hAnsi="Arial" w:cs="Arial"/>
-          <w:lang w:val="es-ES"/>
-        </w:rPr>
-        <w:t xml:space="preserve"> (Bs.)</w:t>
+        <w:t>70.000 Bolivianos (Bs.)</w:t>
       </w:r>
     </w:p>
     <w:p>
@@ -6001,7 +6157,7 @@
         <w:pStyle w:val="Ttulo1"/>
         <w:jc w:val="both"/>
       </w:pPr>
-      <w:bookmarkStart w:id="12" w:name="_Toc232544619"/>
+      <w:bookmarkStart w:id="12" w:name="_Toc232545000"/>
       <w:r>
         <w:t>DOCUMENTO DE METODOLOGÍA DE DESARROLLO</w:t>
       </w:r>
@@ -6012,7 +6168,7 @@
         <w:pStyle w:val="Ttulo2"/>
         <w:jc w:val="both"/>
       </w:pPr>
-      <w:bookmarkStart w:id="13" w:name="_Toc232544620"/>
+      <w:bookmarkStart w:id="13" w:name="_Toc232545001"/>
       <w:r>
         <w:t>Enfoque Seleccionado: Metodología Híbrida</w:t>
       </w:r>
@@ -6041,7 +6197,7 @@
         <w:pStyle w:val="Ttulo2"/>
         <w:jc w:val="both"/>
       </w:pPr>
-      <w:bookmarkStart w:id="14" w:name="_Toc232544621"/>
+      <w:bookmarkStart w:id="14" w:name="_Toc232545002"/>
       <w:r>
         <w:t>Justificación del Enfoque Híbrido</w:t>
       </w:r>
@@ -6138,7 +6294,7 @@
         <w:pStyle w:val="Ttulo1"/>
         <w:jc w:val="both"/>
       </w:pPr>
-      <w:bookmarkStart w:id="15" w:name="_Toc232544622"/>
+      <w:bookmarkStart w:id="15" w:name="_Toc232545003"/>
       <w:r>
         <w:t>SOLICITUD DE PROYECTO</w:t>
       </w:r>
@@ -6149,7 +6305,7 @@
         <w:pStyle w:val="Ttulo2"/>
         <w:jc w:val="both"/>
       </w:pPr>
-      <w:bookmarkStart w:id="16" w:name="_Toc232544623"/>
+      <w:bookmarkStart w:id="16" w:name="_Toc232545004"/>
       <w:r>
         <w:t>Información del Solicitante</w:t>
       </w:r>
@@ -6207,23 +6363,7 @@
           <w:lang w:val="es-ES"/>
         </w:rPr>
         <w:lastRenderedPageBreak/>
-        <w:t xml:space="preserve">Fecha de Solicitud: 15 de </w:t>
-      </w:r>
-      <w:proofErr w:type="gramStart"/>
-      <w:r>
-        <w:rPr>
-          <w:rFonts w:ascii="Arial" w:hAnsi="Arial" w:cs="Arial"/>
-          <w:lang w:val="es-ES"/>
-        </w:rPr>
-        <w:t>Enero</w:t>
-      </w:r>
-      <w:proofErr w:type="gramEnd"/>
-      <w:r>
-        <w:rPr>
-          <w:rFonts w:ascii="Arial" w:hAnsi="Arial" w:cs="Arial"/>
-          <w:lang w:val="es-ES"/>
-        </w:rPr>
-        <w:t xml:space="preserve"> de 2026</w:t>
+        <w:t>Fecha de Solicitud: 15 de Enero de 2026</w:t>
       </w:r>
     </w:p>
     <w:p>
@@ -6249,7 +6389,7 @@
         <w:pStyle w:val="Ttulo2"/>
         <w:jc w:val="both"/>
       </w:pPr>
-      <w:bookmarkStart w:id="17" w:name="_Toc232544624"/>
+      <w:bookmarkStart w:id="17" w:name="_Toc232545005"/>
       <w:r>
         <w:t>Descripción del Problema u Oportunidad</w:t>
       </w:r>
@@ -6324,7 +6464,7 @@
         <w:pStyle w:val="Ttulo2"/>
         <w:jc w:val="both"/>
       </w:pPr>
-      <w:bookmarkStart w:id="18" w:name="_Toc232544625"/>
+      <w:bookmarkStart w:id="18" w:name="_Toc232545006"/>
       <w:r>
         <w:t>Descripción de la Solución Propuesta</w:t>
       </w:r>
@@ -6353,7 +6493,7 @@
         <w:pStyle w:val="Ttulo2"/>
         <w:jc w:val="both"/>
       </w:pPr>
-      <w:bookmarkStart w:id="19" w:name="_Toc232544626"/>
+      <w:bookmarkStart w:id="19" w:name="_Toc232545007"/>
       <w:r>
         <w:t>Beneficios Esperados</w:t>
       </w:r>
@@ -6452,7 +6592,7 @@
         <w:pStyle w:val="Ttulo2"/>
         <w:jc w:val="both"/>
       </w:pPr>
-      <w:bookmarkStart w:id="20" w:name="_Toc232544627"/>
+      <w:bookmarkStart w:id="20" w:name="_Toc232545008"/>
       <w:r>
         <w:t>Restricciones Iniciales Conocidas</w:t>
       </w:r>
@@ -6529,7 +6669,7 @@
       <w:pPr>
         <w:pStyle w:val="Ttulo1"/>
       </w:pPr>
-      <w:bookmarkStart w:id="21" w:name="_Toc232544628"/>
+      <w:bookmarkStart w:id="21" w:name="_Toc232545009"/>
       <w:r>
         <w:t>DOCUMENTO</w:t>
       </w:r>
@@ -6579,7 +6719,7 @@
       <w:pPr>
         <w:pStyle w:val="Ttulo2"/>
       </w:pPr>
-      <w:bookmarkStart w:id="22" w:name="_Toc232544629"/>
+      <w:bookmarkStart w:id="22" w:name="_Toc232545010"/>
       <w:r>
         <w:t>El Ascensor (</w:t>
       </w:r>
@@ -6614,7 +6754,7 @@
       <w:pPr>
         <w:pStyle w:val="Ttulo2"/>
       </w:pPr>
-      <w:bookmarkStart w:id="23" w:name="_Toc232544630"/>
+      <w:bookmarkStart w:id="23" w:name="_Toc232545011"/>
       <w:r>
         <w:t>La Caja del Producto (</w:t>
       </w:r>
@@ -6785,7 +6925,7 @@
       <w:pPr>
         <w:pStyle w:val="Ttulo2"/>
       </w:pPr>
-      <w:bookmarkStart w:id="24" w:name="_Toc232544631"/>
+      <w:bookmarkStart w:id="24" w:name="_Toc232545012"/>
       <w:r>
         <w:lastRenderedPageBreak/>
         <w:t>Lista de "Lo que es" y "Lo que NO es"</w:t>
@@ -7056,7 +7196,7 @@
       <w:pPr>
         <w:pStyle w:val="Ttulo2"/>
       </w:pPr>
-      <w:bookmarkStart w:id="25" w:name="_Toc232544632"/>
+      <w:bookmarkStart w:id="25" w:name="_Toc232545013"/>
       <w:r>
         <w:t>Vecinos Cercanos (Interfases e Integraciones)</w:t>
       </w:r>
@@ -7178,7 +7318,7 @@
       <w:pPr>
         <w:pStyle w:val="Ttulo1"/>
       </w:pPr>
-      <w:bookmarkStart w:id="26" w:name="_Toc232544633"/>
+      <w:bookmarkStart w:id="26" w:name="_Toc232545014"/>
       <w:r>
         <w:t>ESPECIFICACIÓN DE</w:t>
       </w:r>
@@ -7209,7 +7349,7 @@
       <w:pPr>
         <w:pStyle w:val="Ttulo2"/>
       </w:pPr>
-      <w:bookmarkStart w:id="27" w:name="_Toc232544634"/>
+      <w:bookmarkStart w:id="27" w:name="_Toc232545015"/>
       <w:r>
         <w:t>Requerimientos Funcionales (RF)</w:t>
       </w:r>
@@ -7608,7 +7748,7 @@
       <w:pPr>
         <w:pStyle w:val="Ttulo2"/>
       </w:pPr>
-      <w:bookmarkStart w:id="28" w:name="_Toc232544635"/>
+      <w:bookmarkStart w:id="28" w:name="_Toc232545016"/>
       <w:r>
         <w:t>Requerimientos No Funcionales (RNF)</w:t>
       </w:r>
@@ -7779,7 +7919,7 @@
       <w:pPr>
         <w:pStyle w:val="Ttulo1"/>
       </w:pPr>
-      <w:bookmarkStart w:id="29" w:name="_Toc232544636"/>
+      <w:bookmarkStart w:id="29" w:name="_Toc232545017"/>
       <w:r>
         <w:t>Matriz de Priorización de Requerimientos</w:t>
       </w:r>
@@ -7820,7 +7960,7 @@
       <w:pPr>
         <w:pStyle w:val="Ttulo2"/>
       </w:pPr>
-      <w:bookmarkStart w:id="30" w:name="_Toc232544637"/>
+      <w:bookmarkStart w:id="30" w:name="_Toc232545018"/>
       <w:r>
         <w:t xml:space="preserve">Cuadro de Priorización </w:t>
       </w:r>
@@ -8356,7 +8496,7 @@
           <w:lang w:val="es-ES"/>
         </w:rPr>
       </w:pPr>
-      <w:bookmarkStart w:id="31" w:name="_Toc232544638"/>
+      <w:bookmarkStart w:id="31" w:name="_Toc232545019"/>
       <w:r>
         <w:rPr>
           <w:rStyle w:val="Ttulo1Car"/>
@@ -8504,7 +8644,7 @@
       <w:pPr>
         <w:pStyle w:val="Ttulo2"/>
       </w:pPr>
-      <w:bookmarkStart w:id="32" w:name="_Toc232544639"/>
+      <w:bookmarkStart w:id="32" w:name="_Toc232545020"/>
       <w:r>
         <w:t>Cronograma</w:t>
       </w:r>
@@ -9328,7 +9468,7 @@
       <w:pPr>
         <w:pStyle w:val="Ttulo2"/>
       </w:pPr>
-      <w:bookmarkStart w:id="33" w:name="_Toc232544640"/>
+      <w:bookmarkStart w:id="33" w:name="_Toc232545021"/>
       <w:r>
         <w:lastRenderedPageBreak/>
         <w:t xml:space="preserve">Estructura de </w:t>
@@ -9611,7 +9751,7 @@
       <w:pPr>
         <w:pStyle w:val="Ttulo1"/>
       </w:pPr>
-      <w:bookmarkStart w:id="34" w:name="_Toc232544641"/>
+      <w:bookmarkStart w:id="34" w:name="_Toc232545022"/>
       <w:r>
         <w:t>PRESUPUESTO</w:t>
       </w:r>
@@ -9651,17 +9791,8 @@
           <w:rFonts w:ascii="Arial" w:hAnsi="Arial" w:cs="Arial"/>
           <w:lang w:val="es-ES"/>
         </w:rPr>
-        <w:t xml:space="preserve">El presupuesto total asignado por el Gobierno Autónomo Municipal de Sucre es de 70,000 </w:t>
-      </w:r>
-      <w:proofErr w:type="gramStart"/>
-      <w:r>
-        <w:rPr>
-          <w:rFonts w:ascii="Arial" w:hAnsi="Arial" w:cs="Arial"/>
-          <w:lang w:val="es-ES"/>
-        </w:rPr>
-        <w:t>Bolivianos</w:t>
-      </w:r>
-      <w:proofErr w:type="gramEnd"/>
+        <w:t>El presupuesto total asignado por el Gobierno Autónomo Municipal de Sucre es de 70,000 Bolivianos</w:t>
+      </w:r>
       <w:r>
         <w:rPr>
           <w:rFonts w:ascii="Arial" w:hAnsi="Arial" w:cs="Arial"/>
@@ -9683,7 +9814,7 @@
       <w:pPr>
         <w:pStyle w:val="Ttulo2"/>
       </w:pPr>
-      <w:bookmarkStart w:id="35" w:name="_Toc232544642"/>
+      <w:bookmarkStart w:id="35" w:name="_Toc232545023"/>
       <w:r>
         <w:t>Desglose de Costos del Proyecto</w:t>
       </w:r>
@@ -10684,7 +10815,7 @@
       <w:pPr>
         <w:pStyle w:val="Ttulo2"/>
       </w:pPr>
-      <w:bookmarkStart w:id="36" w:name="_Toc232544643"/>
+      <w:bookmarkStart w:id="36" w:name="_Toc232545024"/>
       <w:r>
         <w:t>Reglas de Control Financiero</w:t>
       </w:r>
@@ -10758,7 +10889,7 @@
       <w:pPr>
         <w:pStyle w:val="Ttulo1"/>
       </w:pPr>
-      <w:bookmarkStart w:id="37" w:name="_Toc232544644"/>
+      <w:bookmarkStart w:id="37" w:name="_Toc232545025"/>
       <w:r>
         <w:t>PLAN</w:t>
       </w:r>
@@ -10825,7 +10956,7 @@
       <w:pPr>
         <w:pStyle w:val="Ttulo2"/>
       </w:pPr>
-      <w:bookmarkStart w:id="38" w:name="_Toc232544645"/>
+      <w:bookmarkStart w:id="38" w:name="_Toc232545026"/>
       <w:r>
         <w:t>Roles, Responsabilidades y Distribución del Salario Inicial</w:t>
       </w:r>
@@ -11091,7 +11222,7 @@
       <w:pPr>
         <w:pStyle w:val="Ttulo1"/>
       </w:pPr>
-      <w:bookmarkStart w:id="39" w:name="_Toc232544646"/>
+      <w:bookmarkStart w:id="39" w:name="_Toc232545027"/>
       <w:r>
         <w:t>REGISTRO</w:t>
       </w:r>
@@ -11150,7 +11281,7 @@
       <w:pPr>
         <w:pStyle w:val="Ttulo2"/>
       </w:pPr>
-      <w:bookmarkStart w:id="40" w:name="_Toc232544647"/>
+      <w:bookmarkStart w:id="40" w:name="_Toc232545028"/>
       <w:r>
         <w:t>Matriz de Riesgos Inicial</w:t>
       </w:r>
@@ -12049,7 +12180,7 @@
       <w:pPr>
         <w:pStyle w:val="Ttulo2"/>
       </w:pPr>
-      <w:bookmarkStart w:id="41" w:name="_Toc232544648"/>
+      <w:bookmarkStart w:id="41" w:name="_Toc232545029"/>
       <w:r>
         <w:t>E</w:t>
       </w:r>
@@ -12240,7 +12371,7 @@
       <w:pPr>
         <w:pStyle w:val="Ttulo1"/>
       </w:pPr>
-      <w:bookmarkStart w:id="42" w:name="_Toc232544649"/>
+      <w:bookmarkStart w:id="42" w:name="_Toc232545030"/>
       <w:r>
         <w:t>SOLICITUD</w:t>
       </w:r>
@@ -12327,23 +12458,7 @@
           <w:rFonts w:ascii="Arial" w:hAnsi="Arial" w:cs="Arial"/>
           <w:lang w:val="es-ES"/>
         </w:rPr>
-        <w:t xml:space="preserve"> Semana 10 (</w:t>
-      </w:r>
-      <w:proofErr w:type="gramStart"/>
-      <w:r>
-        <w:rPr>
-          <w:rFonts w:ascii="Arial" w:hAnsi="Arial" w:cs="Arial"/>
-          <w:lang w:val="es-ES"/>
-        </w:rPr>
-        <w:t>Junio</w:t>
-      </w:r>
-      <w:proofErr w:type="gramEnd"/>
-      <w:r>
-        <w:rPr>
-          <w:rFonts w:ascii="Arial" w:hAnsi="Arial" w:cs="Arial"/>
-          <w:lang w:val="es-ES"/>
-        </w:rPr>
-        <w:t xml:space="preserve"> de 2026)</w:t>
+        <w:t xml:space="preserve"> Semana 10 (Junio de 2026)</w:t>
       </w:r>
     </w:p>
     <w:p>
@@ -12414,7 +12529,7 @@
       <w:pPr>
         <w:pStyle w:val="Ttulo2"/>
       </w:pPr>
-      <w:bookmarkStart w:id="43" w:name="_Toc232544650"/>
+      <w:bookmarkStart w:id="43" w:name="_Toc232545031"/>
       <w:r>
         <w:lastRenderedPageBreak/>
         <w:t>Descripción del Cambio Solicitado</w:t>
@@ -12441,7 +12556,7 @@
       <w:pPr>
         <w:pStyle w:val="Ttulo2"/>
       </w:pPr>
-      <w:bookmarkStart w:id="44" w:name="_Toc232544651"/>
+      <w:bookmarkStart w:id="44" w:name="_Toc232545032"/>
       <w:r>
         <w:t>Justificación del Cambio</w:t>
       </w:r>
@@ -12467,7 +12582,7 @@
       <w:pPr>
         <w:pStyle w:val="Ttulo2"/>
       </w:pPr>
-      <w:bookmarkStart w:id="45" w:name="_Toc232544652"/>
+      <w:bookmarkStart w:id="45" w:name="_Toc232545033"/>
       <w:r>
         <w:t>Evaluación de Impacto (Análisis del Project Manager)</w:t>
       </w:r>
@@ -12688,7 +12803,7 @@
       <w:pPr>
         <w:pStyle w:val="Ttulo2"/>
       </w:pPr>
-      <w:bookmarkStart w:id="46" w:name="_Toc232544653"/>
+      <w:bookmarkStart w:id="46" w:name="_Toc232545034"/>
       <w:r>
         <w:t>Proceso Formal de Gestión y Resolución Sugerida</w:t>
       </w:r>
@@ -12937,7 +13052,7 @@
       <w:pPr>
         <w:pStyle w:val="Ttulo2"/>
       </w:pPr>
-      <w:bookmarkStart w:id="47" w:name="_Toc232544654"/>
+      <w:bookmarkStart w:id="47" w:name="_Toc232545035"/>
       <w:r>
         <w:t>Roles Involucrados en la Decisión</w:t>
       </w:r>
@@ -12986,7 +13101,7 @@
       <w:pPr>
         <w:pStyle w:val="Ttulo1"/>
       </w:pPr>
-      <w:bookmarkStart w:id="48" w:name="_Toc232544655"/>
+      <w:bookmarkStart w:id="48" w:name="_Toc232545036"/>
       <w:r>
         <w:t>REGISTRO DE RIESGOS ACTUALIZADO</w:t>
       </w:r>
@@ -13014,21 +13129,7 @@
         <w:rPr>
           <w:lang w:val="es-ES"/>
         </w:rPr>
-        <w:t xml:space="preserve"> Semana 10 (</w:t>
-      </w:r>
-      <w:proofErr w:type="gramStart"/>
-      <w:r>
-        <w:rPr>
-          <w:lang w:val="es-ES"/>
-        </w:rPr>
-        <w:t>Junio</w:t>
-      </w:r>
-      <w:proofErr w:type="gramEnd"/>
-      <w:r>
-        <w:rPr>
-          <w:lang w:val="es-ES"/>
-        </w:rPr>
-        <w:t xml:space="preserve"> de 2026)</w:t>
+        <w:t xml:space="preserve"> Semana 10 (Junio de 2026)</w:t>
       </w:r>
     </w:p>
     <w:p>
@@ -13071,7 +13172,7 @@
       <w:pPr>
         <w:pStyle w:val="Ttulo2"/>
       </w:pPr>
-      <w:bookmarkStart w:id="49" w:name="_Toc232544656"/>
+      <w:bookmarkStart w:id="49" w:name="_Toc232545037"/>
       <w:r>
         <w:t>Modificación del Estado de Riesgos</w:t>
       </w:r>
@@ -13634,7 +13735,7 @@
       <w:pPr>
         <w:pStyle w:val="Ttulo2"/>
       </w:pPr>
-      <w:bookmarkStart w:id="50" w:name="_Toc232544657"/>
+      <w:bookmarkStart w:id="50" w:name="_Toc232545038"/>
       <w:r>
         <w:t>Conclusión del Análisis de Riesgos Actualizado</w:t>
       </w:r>
@@ -13679,6 +13780,7 @@
       <w:pPr>
         <w:pStyle w:val="Ttulo1"/>
       </w:pPr>
+      <w:bookmarkStart w:id="51" w:name="_Toc232545039"/>
       <w:r>
         <w:t>REGISTRO DE INCIDENCIAS</w:t>
       </w:r>
@@ -13693,6 +13795,7 @@
       <w:r>
         <w:t xml:space="preserve"> Log)</w:t>
       </w:r>
+      <w:bookmarkEnd w:id="51"/>
     </w:p>
     <w:p>
       <w:pPr>
@@ -13713,9 +13816,11 @@
       <w:pPr>
         <w:pStyle w:val="Ttulo2"/>
       </w:pPr>
+      <w:bookmarkStart w:id="52" w:name="_Toc232545040"/>
       <w:r>
         <w:t>Registro de Incidencias Activas y Resueltas</w:t>
       </w:r>
+      <w:bookmarkEnd w:id="52"/>
     </w:p>
     <w:p>
       <w:pPr>
@@ -14192,6 +14297,482 @@
           <w:lang w:val="es-ES"/>
         </w:rPr>
         <w:t xml:space="preserve"> Cerrado</w:t>
+      </w:r>
+    </w:p>
+    <w:p>
+      <w:pPr>
+        <w:rPr>
+          <w:lang w:val="es-ES"/>
+        </w:rPr>
+      </w:pPr>
+    </w:p>
+    <w:p>
+      <w:pPr>
+        <w:rPr>
+          <w:lang w:val="es-ES"/>
+        </w:rPr>
+      </w:pPr>
+    </w:p>
+    <w:p>
+      <w:pPr>
+        <w:pStyle w:val="Ttulo1"/>
+      </w:pPr>
+      <w:r>
+        <w:t>INFORME</w:t>
+      </w:r>
+      <w:r>
+        <w:t xml:space="preserve"> </w:t>
+      </w:r>
+      <w:r>
+        <w:t>DE</w:t>
+      </w:r>
+      <w:r>
+        <w:t xml:space="preserve"> E</w:t>
+      </w:r>
+      <w:r>
+        <w:t>STADO</w:t>
+      </w:r>
+      <w:r>
+        <w:t xml:space="preserve"> </w:t>
+      </w:r>
+      <w:r>
+        <w:t>DE</w:t>
+      </w:r>
+      <w:r>
+        <w:t xml:space="preserve"> A</w:t>
+      </w:r>
+      <w:r>
+        <w:t>VANCE</w:t>
+      </w:r>
+      <w:r>
+        <w:t xml:space="preserve"> S</w:t>
+      </w:r>
+      <w:r>
+        <w:t>EMANAL</w:t>
+      </w:r>
+      <w:r>
+        <w:t xml:space="preserve"> (Dirección de Ingresos)</w:t>
+      </w:r>
+    </w:p>
+    <w:p>
+      <w:pPr>
+        <w:rPr>
+          <w:rFonts w:ascii="Arial" w:hAnsi="Arial" w:cs="Arial"/>
+          <w:lang w:val="es-ES"/>
+        </w:rPr>
+      </w:pPr>
+      <w:r>
+        <w:rPr>
+          <w:rFonts w:ascii="Arial" w:hAnsi="Arial" w:cs="Arial"/>
+          <w:b/>
+          <w:bCs/>
+          <w:lang w:val="es-ES"/>
+        </w:rPr>
+        <w:t>Destinatario:</w:t>
+      </w:r>
+      <w:r>
+        <w:rPr>
+          <w:rFonts w:ascii="Arial" w:hAnsi="Arial" w:cs="Arial"/>
+          <w:lang w:val="es-ES"/>
+        </w:rPr>
+        <w:t xml:space="preserve"> Dirección de Ingresos - Gobierno Autónomo Municipal de Sucre</w:t>
+      </w:r>
+    </w:p>
+    <w:p>
+      <w:pPr>
+        <w:rPr>
+          <w:rFonts w:ascii="Arial" w:hAnsi="Arial" w:cs="Arial"/>
+          <w:lang w:val="es-ES"/>
+        </w:rPr>
+      </w:pPr>
+      <w:r>
+        <w:rPr>
+          <w:rFonts w:ascii="Arial" w:hAnsi="Arial" w:cs="Arial"/>
+          <w:b/>
+          <w:bCs/>
+          <w:lang w:val="es-ES"/>
+        </w:rPr>
+        <w:t>Emitido por:</w:t>
+      </w:r>
+      <w:r>
+        <w:rPr>
+          <w:rFonts w:ascii="Arial" w:hAnsi="Arial" w:cs="Arial"/>
+          <w:lang w:val="es-ES"/>
+        </w:rPr>
+        <w:t xml:space="preserve"> Gerente de Proyecto / Dirección Técnica del Proyecto</w:t>
+      </w:r>
+    </w:p>
+    <w:p>
+      <w:pPr>
+        <w:rPr>
+          <w:rFonts w:ascii="Arial" w:hAnsi="Arial" w:cs="Arial"/>
+          <w:lang w:val="es-ES"/>
+        </w:rPr>
+      </w:pPr>
+      <w:r>
+        <w:rPr>
+          <w:rFonts w:ascii="Arial" w:hAnsi="Arial" w:cs="Arial"/>
+          <w:b/>
+          <w:bCs/>
+          <w:lang w:val="es-ES"/>
+        </w:rPr>
+        <w:t>Periodo del Informe:</w:t>
+      </w:r>
+      <w:r>
+        <w:rPr>
+          <w:rFonts w:ascii="Arial" w:hAnsi="Arial" w:cs="Arial"/>
+          <w:lang w:val="es-ES"/>
+        </w:rPr>
+        <w:t xml:space="preserve"> Semana 10 de Ejecución</w:t>
+      </w:r>
+    </w:p>
+    <w:p>
+      <w:pPr>
+        <w:pStyle w:val="Ttulo2"/>
+      </w:pPr>
+      <w:r>
+        <w:t>Resumen Ejecutivo de Estado</w:t>
+      </w:r>
+    </w:p>
+    <w:p>
+      <w:pPr>
+        <w:ind w:left="708"/>
+        <w:rPr>
+          <w:rFonts w:ascii="Arial" w:hAnsi="Arial" w:cs="Arial"/>
+          <w:lang w:val="es-ES"/>
+        </w:rPr>
+      </w:pPr>
+      <w:r>
+        <w:rPr>
+          <w:rFonts w:ascii="Arial" w:hAnsi="Arial" w:cs="Arial"/>
+          <w:lang w:val="es-ES"/>
+        </w:rPr>
+        <w:t>El proyecto Sistema de Gestión para Mercados Municipales se encuentra actualmente en Estado: Alerta Amarilla. Durante esta semana se completó con éxito el hito del Módulo de Registro para los mercados Central, Campesino y Entre Ríos. Sin embargo, el proyecto enfrenta dos desviaciones críticas: una solicitud de aumento de alcance (Módulo de Geolocalización) y la baja imprevista de dos ingenieros de software senior. Se han activado los planes de contingencia para salvaguardar el presupuesto de 70,000 Bs y el plazo de entrega.</w:t>
+      </w:r>
+    </w:p>
+    <w:p>
+      <w:pPr>
+        <w:pStyle w:val="Ttulo2"/>
+      </w:pPr>
+      <w:r>
+        <w:t>Estado de Avance de las Líneas Base</w:t>
+      </w:r>
+    </w:p>
+    <w:p>
+      <w:pPr>
+        <w:ind w:left="708"/>
+        <w:rPr>
+          <w:rFonts w:ascii="Arial" w:hAnsi="Arial" w:cs="Arial"/>
+          <w:lang w:val="es-ES"/>
+        </w:rPr>
+      </w:pPr>
+      <w:r>
+        <w:rPr>
+          <w:rFonts w:ascii="Arial" w:hAnsi="Arial" w:cs="Arial"/>
+          <w:b/>
+          <w:bCs/>
+          <w:lang w:val="es-ES"/>
+        </w:rPr>
+        <w:t>Progreso Físico Planificado:</w:t>
+      </w:r>
+      <w:r>
+        <w:rPr>
+          <w:rFonts w:ascii="Arial" w:hAnsi="Arial" w:cs="Arial"/>
+          <w:lang w:val="es-ES"/>
+        </w:rPr>
+        <w:t xml:space="preserve"> 42%</w:t>
+      </w:r>
+    </w:p>
+    <w:p>
+      <w:pPr>
+        <w:ind w:left="708"/>
+        <w:rPr>
+          <w:rFonts w:ascii="Arial" w:hAnsi="Arial" w:cs="Arial"/>
+          <w:lang w:val="es-ES"/>
+        </w:rPr>
+      </w:pPr>
+      <w:r>
+        <w:rPr>
+          <w:rFonts w:ascii="Arial" w:hAnsi="Arial" w:cs="Arial"/>
+          <w:b/>
+          <w:bCs/>
+          <w:lang w:val="es-ES"/>
+        </w:rPr>
+        <w:t>Progreso Físico Real:</w:t>
+      </w:r>
+      <w:r>
+        <w:rPr>
+          <w:rFonts w:ascii="Arial" w:hAnsi="Arial" w:cs="Arial"/>
+          <w:lang w:val="es-ES"/>
+        </w:rPr>
+        <w:t xml:space="preserve"> 39% (Desviación menor del -3% debido a la transición de personal)</w:t>
+      </w:r>
+    </w:p>
+    <w:p>
+      <w:pPr>
+        <w:ind w:left="708"/>
+        <w:rPr>
+          <w:rFonts w:ascii="Arial" w:hAnsi="Arial" w:cs="Arial"/>
+          <w:lang w:val="es-ES"/>
+        </w:rPr>
+      </w:pPr>
+      <w:r>
+        <w:rPr>
+          <w:rFonts w:ascii="Arial" w:hAnsi="Arial" w:cs="Arial"/>
+          <w:b/>
+          <w:bCs/>
+          <w:lang w:val="es-ES"/>
+        </w:rPr>
+        <w:t>Progreso Financiero Ejecutado:</w:t>
+      </w:r>
+      <w:r>
+        <w:rPr>
+          <w:rFonts w:ascii="Arial" w:hAnsi="Arial" w:cs="Arial"/>
+          <w:lang w:val="es-ES"/>
+        </w:rPr>
+        <w:t xml:space="preserve"> 28,500 Bs (Dentro de la línea base del presupuesto)</w:t>
+      </w:r>
+    </w:p>
+    <w:p>
+      <w:pPr>
+        <w:ind w:left="708"/>
+        <w:rPr>
+          <w:rFonts w:ascii="Arial" w:hAnsi="Arial" w:cs="Arial"/>
+          <w:lang w:val="es-ES"/>
+        </w:rPr>
+      </w:pPr>
+    </w:p>
+    <w:p>
+      <w:pPr>
+        <w:pStyle w:val="Ttulo2"/>
+      </w:pPr>
+      <w:r>
+        <w:lastRenderedPageBreak/>
+        <w:t>Hitos y Actividades de la Semana</w:t>
+      </w:r>
+    </w:p>
+    <w:p>
+      <w:pPr>
+        <w:ind w:left="708"/>
+        <w:rPr>
+          <w:rFonts w:ascii="Arial" w:hAnsi="Arial" w:cs="Arial"/>
+          <w:b/>
+          <w:bCs/>
+          <w:lang w:val="es-ES"/>
+        </w:rPr>
+      </w:pPr>
+      <w:r>
+        <w:rPr>
+          <w:rFonts w:ascii="Arial" w:hAnsi="Arial" w:cs="Arial"/>
+          <w:b/>
+          <w:bCs/>
+          <w:lang w:val="es-ES"/>
+        </w:rPr>
+        <w:t>Logros Alcanzados (Semanas 8 a 10):</w:t>
+      </w:r>
+    </w:p>
+    <w:p>
+      <w:pPr>
+        <w:ind w:left="708"/>
+        <w:rPr>
+          <w:rFonts w:ascii="Arial" w:hAnsi="Arial" w:cs="Arial"/>
+          <w:lang w:val="es-ES"/>
+        </w:rPr>
+      </w:pPr>
+      <w:r>
+        <w:rPr>
+          <w:rFonts w:ascii="Arial" w:hAnsi="Arial" w:cs="Arial"/>
+          <w:b/>
+          <w:bCs/>
+          <w:lang w:val="es-ES"/>
+        </w:rPr>
+        <w:t>Finalizado al 100%:</w:t>
+      </w:r>
+      <w:r>
+        <w:rPr>
+          <w:rFonts w:ascii="Arial" w:hAnsi="Arial" w:cs="Arial"/>
+          <w:lang w:val="es-ES"/>
+        </w:rPr>
+        <w:t xml:space="preserve"> Base de datos estructurada con el censo completo de comerciantes y puestos virtuales sectorizados por mercado.</w:t>
+      </w:r>
+    </w:p>
+    <w:p>
+      <w:pPr>
+        <w:ind w:left="708"/>
+        <w:rPr>
+          <w:rFonts w:ascii="Arial" w:hAnsi="Arial" w:cs="Arial"/>
+          <w:lang w:val="es-ES"/>
+        </w:rPr>
+      </w:pPr>
+      <w:r>
+        <w:rPr>
+          <w:rFonts w:ascii="Arial" w:hAnsi="Arial" w:cs="Arial"/>
+          <w:b/>
+          <w:bCs/>
+          <w:lang w:val="es-ES"/>
+        </w:rPr>
+        <w:t>Finalizado al 100%:</w:t>
+      </w:r>
+      <w:r>
+        <w:rPr>
+          <w:rFonts w:ascii="Arial" w:hAnsi="Arial" w:cs="Arial"/>
+          <w:lang w:val="es-ES"/>
+        </w:rPr>
+        <w:t xml:space="preserve"> Interfaces de usuario (UI) aprobadas para el registro de datos administrativos.</w:t>
+      </w:r>
+    </w:p>
+    <w:p>
+      <w:pPr>
+        <w:ind w:left="708"/>
+        <w:rPr>
+          <w:rFonts w:ascii="Arial" w:hAnsi="Arial" w:cs="Arial"/>
+          <w:b/>
+          <w:bCs/>
+          <w:lang w:val="es-ES"/>
+        </w:rPr>
+      </w:pPr>
+      <w:r>
+        <w:rPr>
+          <w:rFonts w:ascii="Arial" w:hAnsi="Arial" w:cs="Arial"/>
+          <w:b/>
+          <w:bCs/>
+          <w:lang w:val="es-ES"/>
+        </w:rPr>
+        <w:t>Tareas Críticas en Curso (Próximas 2 Semanas):</w:t>
+      </w:r>
+    </w:p>
+    <w:p>
+      <w:pPr>
+        <w:ind w:left="708"/>
+        <w:rPr>
+          <w:rFonts w:ascii="Arial" w:hAnsi="Arial" w:cs="Arial"/>
+          <w:lang w:val="es-ES"/>
+        </w:rPr>
+      </w:pPr>
+      <w:r>
+        <w:rPr>
+          <w:rFonts w:ascii="Arial" w:hAnsi="Arial" w:cs="Arial"/>
+          <w:lang w:val="es-ES"/>
+        </w:rPr>
+        <w:t>Inicio del desarrollo del Módulo de Cobros y emisión de comprobantes digitales (</w:t>
+      </w:r>
+      <w:proofErr w:type="spellStart"/>
+      <w:r>
+        <w:rPr>
+          <w:rFonts w:ascii="Arial" w:hAnsi="Arial" w:cs="Arial"/>
+          <w:lang w:val="es-ES"/>
+        </w:rPr>
+        <w:t>Sprints</w:t>
+      </w:r>
+      <w:proofErr w:type="spellEnd"/>
+      <w:r>
+        <w:rPr>
+          <w:rFonts w:ascii="Arial" w:hAnsi="Arial" w:cs="Arial"/>
+          <w:lang w:val="es-ES"/>
+        </w:rPr>
+        <w:t xml:space="preserve"> 3 y 4).</w:t>
+      </w:r>
+    </w:p>
+    <w:p>
+      <w:pPr>
+        <w:ind w:left="708"/>
+        <w:rPr>
+          <w:rFonts w:ascii="Arial" w:hAnsi="Arial" w:cs="Arial"/>
+          <w:lang w:val="es-ES"/>
+        </w:rPr>
+      </w:pPr>
+      <w:r>
+        <w:rPr>
+          <w:rFonts w:ascii="Arial" w:hAnsi="Arial" w:cs="Arial"/>
+          <w:lang w:val="es-ES"/>
+        </w:rPr>
+        <w:t xml:space="preserve">Inducción técnica del nuevo desarrollador </w:t>
+      </w:r>
+      <w:proofErr w:type="spellStart"/>
+      <w:r>
+        <w:rPr>
+          <w:rFonts w:ascii="Arial" w:hAnsi="Arial" w:cs="Arial"/>
+          <w:lang w:val="es-ES"/>
+        </w:rPr>
+        <w:t>backend</w:t>
+      </w:r>
+      <w:proofErr w:type="spellEnd"/>
+      <w:r>
+        <w:rPr>
+          <w:rFonts w:ascii="Arial" w:hAnsi="Arial" w:cs="Arial"/>
+          <w:lang w:val="es-ES"/>
+        </w:rPr>
+        <w:t xml:space="preserve"> de reemplazo financiado con el fondo de contingencia.</w:t>
+      </w:r>
+    </w:p>
+    <w:p>
+      <w:pPr>
+        <w:pStyle w:val="Ttulo2"/>
+      </w:pPr>
+      <w:r>
+        <w:t>Alertas y Puntos de Decisión para la Dirección de Ingresos</w:t>
+      </w:r>
+    </w:p>
+    <w:p>
+      <w:pPr>
+        <w:numPr>
+          <w:ilvl w:val="0"/>
+          <w:numId w:val="22"/>
+        </w:numPr>
+        <w:tabs>
+          <w:tab w:val="num" w:pos="720"/>
+        </w:tabs>
+        <w:rPr>
+          <w:rFonts w:ascii="Arial" w:hAnsi="Arial" w:cs="Arial"/>
+          <w:lang w:val="es-ES"/>
+        </w:rPr>
+      </w:pPr>
+      <w:r>
+        <w:rPr>
+          <w:rFonts w:ascii="Arial" w:hAnsi="Arial" w:cs="Arial"/>
+          <w:b/>
+          <w:bCs/>
+          <w:lang w:val="es-ES"/>
+        </w:rPr>
+        <w:t>Solicitud de Geolocalización (CRF-001):</w:t>
+      </w:r>
+      <w:r>
+        <w:rPr>
+          <w:rFonts w:ascii="Arial" w:hAnsi="Arial" w:cs="Arial"/>
+          <w:lang w:val="es-ES"/>
+        </w:rPr>
+        <w:t xml:space="preserve"> Reiteramos a la Dirección de Ingresos que, para no poner en riesgo el motor de cobros y el cumplimiento de los 6 meses de plazo con el equipo actual, se recomienda formalmente aprobar este requerimiento para su implementación inmediata en una Fase 2, una vez entregado el MVP funcional.</w:t>
+      </w:r>
+    </w:p>
+    <w:p>
+      <w:pPr>
+        <w:numPr>
+          <w:ilvl w:val="0"/>
+          <w:numId w:val="22"/>
+        </w:numPr>
+        <w:tabs>
+          <w:tab w:val="num" w:pos="720"/>
+        </w:tabs>
+        <w:rPr>
+          <w:rFonts w:ascii="Arial" w:hAnsi="Arial" w:cs="Arial"/>
+          <w:lang w:val="es-ES"/>
+        </w:rPr>
+      </w:pPr>
+      <w:r>
+        <w:rPr>
+          <w:rFonts w:ascii="Arial" w:hAnsi="Arial" w:cs="Arial"/>
+          <w:b/>
+          <w:bCs/>
+          <w:lang w:val="es-ES"/>
+        </w:rPr>
+        <w:t>Mitigación de Bajas:</w:t>
+      </w:r>
+      <w:r>
+        <w:rPr>
+          <w:rFonts w:ascii="Arial" w:hAnsi="Arial" w:cs="Arial"/>
+          <w:lang w:val="es-ES"/>
+        </w:rPr>
+        <w:t xml:space="preserve"> Se informa que el equipo se encuentra estabilizado gracias al uso de las reservas de contingencia previstas en el plan original. No se requiere financiamiento adicional por parte de la Alcaldía.</w:t>
       </w:r>
     </w:p>
     <w:p>
@@ -16403,6 +16984,119 @@
     </w:lvl>
   </w:abstractNum>
   <w:abstractNum w:abstractNumId="17" w15:restartNumberingAfterBreak="0">
+    <w:nsid w:val="6A405E4F"/>
+    <w:multiLevelType w:val="multilevel"/>
+    <w:tmpl w:val="19F407F2"/>
+    <w:lvl w:ilvl="0">
+      <w:start w:val="1"/>
+      <w:numFmt w:val="decimal"/>
+      <w:lvlText w:val="%1."/>
+      <w:lvlJc w:val="left"/>
+      <w:pPr>
+        <w:tabs>
+          <w:tab w:val="num" w:pos="1068"/>
+        </w:tabs>
+        <w:ind w:left="1068" w:hanging="360"/>
+      </w:pPr>
+    </w:lvl>
+    <w:lvl w:ilvl="1" w:tentative="1">
+      <w:start w:val="1"/>
+      <w:numFmt w:val="decimal"/>
+      <w:lvlText w:val="%2."/>
+      <w:lvlJc w:val="left"/>
+      <w:pPr>
+        <w:tabs>
+          <w:tab w:val="num" w:pos="1788"/>
+        </w:tabs>
+        <w:ind w:left="1788" w:hanging="360"/>
+      </w:pPr>
+    </w:lvl>
+    <w:lvl w:ilvl="2" w:tentative="1">
+      <w:start w:val="1"/>
+      <w:numFmt w:val="decimal"/>
+      <w:lvlText w:val="%3."/>
+      <w:lvlJc w:val="left"/>
+      <w:pPr>
+        <w:tabs>
+          <w:tab w:val="num" w:pos="2508"/>
+        </w:tabs>
+        <w:ind w:left="2508" w:hanging="360"/>
+      </w:pPr>
+    </w:lvl>
+    <w:lvl w:ilvl="3" w:tentative="1">
+      <w:start w:val="1"/>
+      <w:numFmt w:val="decimal"/>
+      <w:lvlText w:val="%4."/>
+      <w:lvlJc w:val="left"/>
+      <w:pPr>
+        <w:tabs>
+          <w:tab w:val="num" w:pos="3228"/>
+        </w:tabs>
+        <w:ind w:left="3228" w:hanging="360"/>
+      </w:pPr>
+    </w:lvl>
+    <w:lvl w:ilvl="4" w:tentative="1">
+      <w:start w:val="1"/>
+      <w:numFmt w:val="decimal"/>
+      <w:lvlText w:val="%5."/>
+      <w:lvlJc w:val="left"/>
+      <w:pPr>
+        <w:tabs>
+          <w:tab w:val="num" w:pos="3948"/>
+        </w:tabs>
+        <w:ind w:left="3948" w:hanging="360"/>
+      </w:pPr>
+    </w:lvl>
+    <w:lvl w:ilvl="5" w:tentative="1">
+      <w:start w:val="1"/>
+      <w:numFmt w:val="decimal"/>
+      <w:lvlText w:val="%6."/>
+      <w:lvlJc w:val="left"/>
+      <w:pPr>
+        <w:tabs>
+          <w:tab w:val="num" w:pos="4668"/>
+        </w:tabs>
+        <w:ind w:left="4668" w:hanging="360"/>
+      </w:pPr>
+    </w:lvl>
+    <w:lvl w:ilvl="6" w:tentative="1">
+      <w:start w:val="1"/>
+      <w:numFmt w:val="decimal"/>
+      <w:lvlText w:val="%7."/>
+      <w:lvlJc w:val="left"/>
+      <w:pPr>
+        <w:tabs>
+          <w:tab w:val="num" w:pos="5388"/>
+        </w:tabs>
+        <w:ind w:left="5388" w:hanging="360"/>
+      </w:pPr>
+    </w:lvl>
+    <w:lvl w:ilvl="7" w:tentative="1">
+      <w:start w:val="1"/>
+      <w:numFmt w:val="decimal"/>
+      <w:lvlText w:val="%8."/>
+      <w:lvlJc w:val="left"/>
+      <w:pPr>
+        <w:tabs>
+          <w:tab w:val="num" w:pos="6108"/>
+        </w:tabs>
+        <w:ind w:left="6108" w:hanging="360"/>
+      </w:pPr>
+    </w:lvl>
+    <w:lvl w:ilvl="8" w:tentative="1">
+      <w:start w:val="1"/>
+      <w:numFmt w:val="decimal"/>
+      <w:lvlText w:val="%9."/>
+      <w:lvlJc w:val="left"/>
+      <w:pPr>
+        <w:tabs>
+          <w:tab w:val="num" w:pos="6828"/>
+        </w:tabs>
+        <w:ind w:left="6828" w:hanging="360"/>
+      </w:pPr>
+    </w:lvl>
+  </w:abstractNum>
+  <w:abstractNum w:abstractNumId="18" w15:restartNumberingAfterBreak="0">
     <w:nsid w:val="6D9E2373"/>
     <w:multiLevelType w:val="multilevel"/>
     <w:tmpl w:val="7798721C"/>
@@ -16551,7 +17245,7 @@
       </w:rPr>
     </w:lvl>
   </w:abstractNum>
-  <w:abstractNum w:abstractNumId="18" w15:restartNumberingAfterBreak="0">
+  <w:abstractNum w:abstractNumId="19" w15:restartNumberingAfterBreak="0">
     <w:nsid w:val="7CB5752A"/>
     <w:multiLevelType w:val="hybridMultilevel"/>
     <w:tmpl w:val="3E8855C0"/>
@@ -16664,7 +17358,7 @@
       </w:rPr>
     </w:lvl>
   </w:abstractNum>
-  <w:abstractNum w:abstractNumId="19" w15:restartNumberingAfterBreak="0">
+  <w:abstractNum w:abstractNumId="20" w15:restartNumberingAfterBreak="0">
     <w:nsid w:val="7D905054"/>
     <w:multiLevelType w:val="hybridMultilevel"/>
     <w:tmpl w:val="9CB40FDE"/>
@@ -16777,7 +17471,7 @@
       </w:rPr>
     </w:lvl>
   </w:abstractNum>
-  <w:abstractNum w:abstractNumId="20" w15:restartNumberingAfterBreak="0">
+  <w:abstractNum w:abstractNumId="21" w15:restartNumberingAfterBreak="0">
     <w:nsid w:val="7E764224"/>
     <w:multiLevelType w:val="multilevel"/>
     <w:tmpl w:val="5248F0BA"/>
@@ -16993,7 +17687,7 @@
     <w:abstractNumId w:val="8"/>
   </w:num>
   <w:num w:numId="5">
-    <w:abstractNumId w:val="17"/>
+    <w:abstractNumId w:val="18"/>
   </w:num>
   <w:num w:numId="6">
     <w:abstractNumId w:val="4"/>
@@ -17005,13 +17699,13 @@
     <w:abstractNumId w:val="11"/>
   </w:num>
   <w:num w:numId="9">
-    <w:abstractNumId w:val="18"/>
+    <w:abstractNumId w:val="19"/>
   </w:num>
   <w:num w:numId="10">
     <w:abstractNumId w:val="9"/>
   </w:num>
   <w:num w:numId="11">
-    <w:abstractNumId w:val="20"/>
+    <w:abstractNumId w:val="21"/>
   </w:num>
   <w:num w:numId="12">
     <w:abstractNumId w:val="10"/>
@@ -17023,7 +17717,7 @@
     <w:abstractNumId w:val="3"/>
   </w:num>
   <w:num w:numId="15">
-    <w:abstractNumId w:val="19"/>
+    <w:abstractNumId w:val="20"/>
   </w:num>
   <w:num w:numId="16">
     <w:abstractNumId w:val="7"/>
@@ -17043,7 +17737,10 @@
   <w:num w:numId="21">
     <w:abstractNumId w:val="5"/>
   </w:num>
-  <w:numIdMacAtCleanup w:val="21"/>
+  <w:num w:numId="22">
+    <w:abstractNumId w:val="17"/>
+  </w:num>
+  <w:numIdMacAtCleanup w:val="22"/>
 </w:numbering>
 </file>
 

</xml_diff>

<commit_message>
doc15 / tablero kpi
</commit_message>
<xml_diff>
--- a/DocumentoCompProyectoMercados_GCC.docx
+++ b/DocumentoCompProyectoMercados_GCC.docx
@@ -448,7 +448,7 @@
           <w:r>
             <w:fldChar w:fldCharType="separate"/>
           </w:r>
-          <w:hyperlink w:anchor="_Toc232544988" w:history="1">
+          <w:hyperlink w:anchor="_Toc232546301" w:history="1">
             <w:r>
               <w:rPr>
                 <w:rStyle w:val="Hipervnculo"/>
@@ -490,7 +490,7 @@
                 <w:noProof/>
                 <w:webHidden/>
               </w:rPr>
-              <w:instrText xml:space="preserve"> PAGEREF _Toc232544988 \h </w:instrText>
+              <w:instrText xml:space="preserve"> PAGEREF _Toc232546301 \h </w:instrText>
             </w:r>
             <w:r>
               <w:rPr>
@@ -534,7 +534,7 @@
               <w:lang w:val="es-ES" w:eastAsia="es-ES"/>
             </w:rPr>
           </w:pPr>
-          <w:hyperlink w:anchor="_Toc232544989" w:history="1">
+          <w:hyperlink w:anchor="_Toc232546302" w:history="1">
             <w:r>
               <w:rPr>
                 <w:rStyle w:val="Hipervnculo"/>
@@ -576,7 +576,7 @@
                 <w:noProof/>
                 <w:webHidden/>
               </w:rPr>
-              <w:instrText xml:space="preserve"> PAGEREF _Toc232544989 \h </w:instrText>
+              <w:instrText xml:space="preserve"> PAGEREF _Toc232546302 \h </w:instrText>
             </w:r>
             <w:r>
               <w:rPr>
@@ -620,7 +620,7 @@
               <w:lang w:val="es-ES" w:eastAsia="es-ES"/>
             </w:rPr>
           </w:pPr>
-          <w:hyperlink w:anchor="_Toc232544990" w:history="1">
+          <w:hyperlink w:anchor="_Toc232546303" w:history="1">
             <w:r>
               <w:rPr>
                 <w:rStyle w:val="Hipervnculo"/>
@@ -662,7 +662,7 @@
                 <w:noProof/>
                 <w:webHidden/>
               </w:rPr>
-              <w:instrText xml:space="preserve"> PAGEREF _Toc232544990 \h </w:instrText>
+              <w:instrText xml:space="preserve"> PAGEREF _Toc232546303 \h </w:instrText>
             </w:r>
             <w:r>
               <w:rPr>
@@ -706,7 +706,7 @@
               <w:lang w:val="es-ES" w:eastAsia="es-ES"/>
             </w:rPr>
           </w:pPr>
-          <w:hyperlink w:anchor="_Toc232544991" w:history="1">
+          <w:hyperlink w:anchor="_Toc232546304" w:history="1">
             <w:r>
               <w:rPr>
                 <w:rStyle w:val="Hipervnculo"/>
@@ -748,7 +748,7 @@
                 <w:noProof/>
                 <w:webHidden/>
               </w:rPr>
-              <w:instrText xml:space="preserve"> PAGEREF _Toc232544991 \h </w:instrText>
+              <w:instrText xml:space="preserve"> PAGEREF _Toc232546304 \h </w:instrText>
             </w:r>
             <w:r>
               <w:rPr>
@@ -792,7 +792,7 @@
               <w:lang w:val="es-ES" w:eastAsia="es-ES"/>
             </w:rPr>
           </w:pPr>
-          <w:hyperlink w:anchor="_Toc232544992" w:history="1">
+          <w:hyperlink w:anchor="_Toc232546305" w:history="1">
             <w:r>
               <w:rPr>
                 <w:rStyle w:val="Hipervnculo"/>
@@ -834,7 +834,7 @@
                 <w:noProof/>
                 <w:webHidden/>
               </w:rPr>
-              <w:instrText xml:space="preserve"> PAGEREF _Toc232544992 \h </w:instrText>
+              <w:instrText xml:space="preserve"> PAGEREF _Toc232546305 \h </w:instrText>
             </w:r>
             <w:r>
               <w:rPr>
@@ -878,7 +878,7 @@
               <w:lang w:val="es-ES" w:eastAsia="es-ES"/>
             </w:rPr>
           </w:pPr>
-          <w:hyperlink w:anchor="_Toc232544993" w:history="1">
+          <w:hyperlink w:anchor="_Toc232546306" w:history="1">
             <w:r>
               <w:rPr>
                 <w:rStyle w:val="Hipervnculo"/>
@@ -920,7 +920,7 @@
                 <w:noProof/>
                 <w:webHidden/>
               </w:rPr>
-              <w:instrText xml:space="preserve"> PAGEREF _Toc232544993 \h </w:instrText>
+              <w:instrText xml:space="preserve"> PAGEREF _Toc232546306 \h </w:instrText>
             </w:r>
             <w:r>
               <w:rPr>
@@ -964,7 +964,7 @@
               <w:lang w:val="es-ES" w:eastAsia="es-ES"/>
             </w:rPr>
           </w:pPr>
-          <w:hyperlink w:anchor="_Toc232544994" w:history="1">
+          <w:hyperlink w:anchor="_Toc232546307" w:history="1">
             <w:r>
               <w:rPr>
                 <w:rStyle w:val="Hipervnculo"/>
@@ -1006,7 +1006,7 @@
                 <w:noProof/>
                 <w:webHidden/>
               </w:rPr>
-              <w:instrText xml:space="preserve"> PAGEREF _Toc232544994 \h </w:instrText>
+              <w:instrText xml:space="preserve"> PAGEREF _Toc232546307 \h </w:instrText>
             </w:r>
             <w:r>
               <w:rPr>
@@ -1050,7 +1050,7 @@
               <w:lang w:val="es-ES" w:eastAsia="es-ES"/>
             </w:rPr>
           </w:pPr>
-          <w:hyperlink w:anchor="_Toc232544995" w:history="1">
+          <w:hyperlink w:anchor="_Toc232546308" w:history="1">
             <w:r>
               <w:rPr>
                 <w:rStyle w:val="Hipervnculo"/>
@@ -1092,7 +1092,7 @@
                 <w:noProof/>
                 <w:webHidden/>
               </w:rPr>
-              <w:instrText xml:space="preserve"> PAGEREF _Toc232544995 \h </w:instrText>
+              <w:instrText xml:space="preserve"> PAGEREF _Toc232546308 \h </w:instrText>
             </w:r>
             <w:r>
               <w:rPr>
@@ -1136,7 +1136,7 @@
               <w:lang w:val="es-ES" w:eastAsia="es-ES"/>
             </w:rPr>
           </w:pPr>
-          <w:hyperlink w:anchor="_Toc232544996" w:history="1">
+          <w:hyperlink w:anchor="_Toc232546309" w:history="1">
             <w:r>
               <w:rPr>
                 <w:rStyle w:val="Hipervnculo"/>
@@ -1178,7 +1178,7 @@
                 <w:noProof/>
                 <w:webHidden/>
               </w:rPr>
-              <w:instrText xml:space="preserve"> PAGEREF _Toc232544996 \h </w:instrText>
+              <w:instrText xml:space="preserve"> PAGEREF _Toc232546309 \h </w:instrText>
             </w:r>
             <w:r>
               <w:rPr>
@@ -1222,7 +1222,7 @@
               <w:lang w:val="es-ES" w:eastAsia="es-ES"/>
             </w:rPr>
           </w:pPr>
-          <w:hyperlink w:anchor="_Toc232544997" w:history="1">
+          <w:hyperlink w:anchor="_Toc232546310" w:history="1">
             <w:r>
               <w:rPr>
                 <w:rStyle w:val="Hipervnculo"/>
@@ -1264,7 +1264,7 @@
                 <w:noProof/>
                 <w:webHidden/>
               </w:rPr>
-              <w:instrText xml:space="preserve"> PAGEREF _Toc232544997 \h </w:instrText>
+              <w:instrText xml:space="preserve"> PAGEREF _Toc232546310 \h </w:instrText>
             </w:r>
             <w:r>
               <w:rPr>
@@ -1308,7 +1308,7 @@
               <w:lang w:val="es-ES" w:eastAsia="es-ES"/>
             </w:rPr>
           </w:pPr>
-          <w:hyperlink w:anchor="_Toc232544998" w:history="1">
+          <w:hyperlink w:anchor="_Toc232546311" w:history="1">
             <w:r>
               <w:rPr>
                 <w:rStyle w:val="Hipervnculo"/>
@@ -1350,7 +1350,7 @@
                 <w:noProof/>
                 <w:webHidden/>
               </w:rPr>
-              <w:instrText xml:space="preserve"> PAGEREF _Toc232544998 \h </w:instrText>
+              <w:instrText xml:space="preserve"> PAGEREF _Toc232546311 \h </w:instrText>
             </w:r>
             <w:r>
               <w:rPr>
@@ -1394,7 +1394,7 @@
               <w:lang w:val="es-ES" w:eastAsia="es-ES"/>
             </w:rPr>
           </w:pPr>
-          <w:hyperlink w:anchor="_Toc232544999" w:history="1">
+          <w:hyperlink w:anchor="_Toc232546312" w:history="1">
             <w:r>
               <w:rPr>
                 <w:rStyle w:val="Hipervnculo"/>
@@ -1436,7 +1436,7 @@
                 <w:noProof/>
                 <w:webHidden/>
               </w:rPr>
-              <w:instrText xml:space="preserve"> PAGEREF _Toc232544999 \h </w:instrText>
+              <w:instrText xml:space="preserve"> PAGEREF _Toc232546312 \h </w:instrText>
             </w:r>
             <w:r>
               <w:rPr>
@@ -1480,7 +1480,7 @@
               <w:lang w:val="es-ES" w:eastAsia="es-ES"/>
             </w:rPr>
           </w:pPr>
-          <w:hyperlink w:anchor="_Toc232545000" w:history="1">
+          <w:hyperlink w:anchor="_Toc232546313" w:history="1">
             <w:r>
               <w:rPr>
                 <w:rStyle w:val="Hipervnculo"/>
@@ -1522,7 +1522,7 @@
                 <w:noProof/>
                 <w:webHidden/>
               </w:rPr>
-              <w:instrText xml:space="preserve"> PAGEREF _Toc232545000 \h </w:instrText>
+              <w:instrText xml:space="preserve"> PAGEREF _Toc232546313 \h </w:instrText>
             </w:r>
             <w:r>
               <w:rPr>
@@ -1566,7 +1566,7 @@
               <w:lang w:val="es-ES" w:eastAsia="es-ES"/>
             </w:rPr>
           </w:pPr>
-          <w:hyperlink w:anchor="_Toc232545001" w:history="1">
+          <w:hyperlink w:anchor="_Toc232546314" w:history="1">
             <w:r>
               <w:rPr>
                 <w:rStyle w:val="Hipervnculo"/>
@@ -1608,7 +1608,7 @@
                 <w:noProof/>
                 <w:webHidden/>
               </w:rPr>
-              <w:instrText xml:space="preserve"> PAGEREF _Toc232545001 \h </w:instrText>
+              <w:instrText xml:space="preserve"> PAGEREF _Toc232546314 \h </w:instrText>
             </w:r>
             <w:r>
               <w:rPr>
@@ -1652,7 +1652,7 @@
               <w:lang w:val="es-ES" w:eastAsia="es-ES"/>
             </w:rPr>
           </w:pPr>
-          <w:hyperlink w:anchor="_Toc232545002" w:history="1">
+          <w:hyperlink w:anchor="_Toc232546315" w:history="1">
             <w:r>
               <w:rPr>
                 <w:rStyle w:val="Hipervnculo"/>
@@ -1694,7 +1694,7 @@
                 <w:noProof/>
                 <w:webHidden/>
               </w:rPr>
-              <w:instrText xml:space="preserve"> PAGEREF _Toc232545002 \h </w:instrText>
+              <w:instrText xml:space="preserve"> PAGEREF _Toc232546315 \h </w:instrText>
             </w:r>
             <w:r>
               <w:rPr>
@@ -1738,7 +1738,7 @@
               <w:lang w:val="es-ES" w:eastAsia="es-ES"/>
             </w:rPr>
           </w:pPr>
-          <w:hyperlink w:anchor="_Toc232545003" w:history="1">
+          <w:hyperlink w:anchor="_Toc232546316" w:history="1">
             <w:r>
               <w:rPr>
                 <w:rStyle w:val="Hipervnculo"/>
@@ -1780,7 +1780,7 @@
                 <w:noProof/>
                 <w:webHidden/>
               </w:rPr>
-              <w:instrText xml:space="preserve"> PAGEREF _Toc232545003 \h </w:instrText>
+              <w:instrText xml:space="preserve"> PAGEREF _Toc232546316 \h </w:instrText>
             </w:r>
             <w:r>
               <w:rPr>
@@ -1824,7 +1824,7 @@
               <w:lang w:val="es-ES" w:eastAsia="es-ES"/>
             </w:rPr>
           </w:pPr>
-          <w:hyperlink w:anchor="_Toc232545004" w:history="1">
+          <w:hyperlink w:anchor="_Toc232546317" w:history="1">
             <w:r>
               <w:rPr>
                 <w:rStyle w:val="Hipervnculo"/>
@@ -1866,7 +1866,7 @@
                 <w:noProof/>
                 <w:webHidden/>
               </w:rPr>
-              <w:instrText xml:space="preserve"> PAGEREF _Toc232545004 \h </w:instrText>
+              <w:instrText xml:space="preserve"> PAGEREF _Toc232546317 \h </w:instrText>
             </w:r>
             <w:r>
               <w:rPr>
@@ -1910,7 +1910,7 @@
               <w:lang w:val="es-ES" w:eastAsia="es-ES"/>
             </w:rPr>
           </w:pPr>
-          <w:hyperlink w:anchor="_Toc232545005" w:history="1">
+          <w:hyperlink w:anchor="_Toc232546318" w:history="1">
             <w:r>
               <w:rPr>
                 <w:rStyle w:val="Hipervnculo"/>
@@ -1952,7 +1952,7 @@
                 <w:noProof/>
                 <w:webHidden/>
               </w:rPr>
-              <w:instrText xml:space="preserve"> PAGEREF _Toc232545005 \h </w:instrText>
+              <w:instrText xml:space="preserve"> PAGEREF _Toc232546318 \h </w:instrText>
             </w:r>
             <w:r>
               <w:rPr>
@@ -1996,7 +1996,7 @@
               <w:lang w:val="es-ES" w:eastAsia="es-ES"/>
             </w:rPr>
           </w:pPr>
-          <w:hyperlink w:anchor="_Toc232545006" w:history="1">
+          <w:hyperlink w:anchor="_Toc232546319" w:history="1">
             <w:r>
               <w:rPr>
                 <w:rStyle w:val="Hipervnculo"/>
@@ -2038,7 +2038,7 @@
                 <w:noProof/>
                 <w:webHidden/>
               </w:rPr>
-              <w:instrText xml:space="preserve"> PAGEREF _Toc232545006 \h </w:instrText>
+              <w:instrText xml:space="preserve"> PAGEREF _Toc232546319 \h </w:instrText>
             </w:r>
             <w:r>
               <w:rPr>
@@ -2082,7 +2082,7 @@
               <w:lang w:val="es-ES" w:eastAsia="es-ES"/>
             </w:rPr>
           </w:pPr>
-          <w:hyperlink w:anchor="_Toc232545007" w:history="1">
+          <w:hyperlink w:anchor="_Toc232546320" w:history="1">
             <w:r>
               <w:rPr>
                 <w:rStyle w:val="Hipervnculo"/>
@@ -2124,7 +2124,7 @@
                 <w:noProof/>
                 <w:webHidden/>
               </w:rPr>
-              <w:instrText xml:space="preserve"> PAGEREF _Toc232545007 \h </w:instrText>
+              <w:instrText xml:space="preserve"> PAGEREF _Toc232546320 \h </w:instrText>
             </w:r>
             <w:r>
               <w:rPr>
@@ -2168,7 +2168,7 @@
               <w:lang w:val="es-ES" w:eastAsia="es-ES"/>
             </w:rPr>
           </w:pPr>
-          <w:hyperlink w:anchor="_Toc232545008" w:history="1">
+          <w:hyperlink w:anchor="_Toc232546321" w:history="1">
             <w:r>
               <w:rPr>
                 <w:rStyle w:val="Hipervnculo"/>
@@ -2210,7 +2210,7 @@
                 <w:noProof/>
                 <w:webHidden/>
               </w:rPr>
-              <w:instrText xml:space="preserve"> PAGEREF _Toc232545008 \h </w:instrText>
+              <w:instrText xml:space="preserve"> PAGEREF _Toc232546321 \h </w:instrText>
             </w:r>
             <w:r>
               <w:rPr>
@@ -2254,7 +2254,7 @@
               <w:lang w:val="es-ES" w:eastAsia="es-ES"/>
             </w:rPr>
           </w:pPr>
-          <w:hyperlink w:anchor="_Toc232545009" w:history="1">
+          <w:hyperlink w:anchor="_Toc232546322" w:history="1">
             <w:r>
               <w:rPr>
                 <w:rStyle w:val="Hipervnculo"/>
@@ -2296,7 +2296,7 @@
                 <w:noProof/>
                 <w:webHidden/>
               </w:rPr>
-              <w:instrText xml:space="preserve"> PAGEREF _Toc232545009 \h </w:instrText>
+              <w:instrText xml:space="preserve"> PAGEREF _Toc232546322 \h </w:instrText>
             </w:r>
             <w:r>
               <w:rPr>
@@ -2340,7 +2340,7 @@
               <w:lang w:val="es-ES" w:eastAsia="es-ES"/>
             </w:rPr>
           </w:pPr>
-          <w:hyperlink w:anchor="_Toc232545010" w:history="1">
+          <w:hyperlink w:anchor="_Toc232546323" w:history="1">
             <w:r>
               <w:rPr>
                 <w:rStyle w:val="Hipervnculo"/>
@@ -2382,7 +2382,7 @@
                 <w:noProof/>
                 <w:webHidden/>
               </w:rPr>
-              <w:instrText xml:space="preserve"> PAGEREF _Toc232545010 \h </w:instrText>
+              <w:instrText xml:space="preserve"> PAGEREF _Toc232546323 \h </w:instrText>
             </w:r>
             <w:r>
               <w:rPr>
@@ -2426,7 +2426,7 @@
               <w:lang w:val="es-ES" w:eastAsia="es-ES"/>
             </w:rPr>
           </w:pPr>
-          <w:hyperlink w:anchor="_Toc232545011" w:history="1">
+          <w:hyperlink w:anchor="_Toc232546324" w:history="1">
             <w:r>
               <w:rPr>
                 <w:rStyle w:val="Hipervnculo"/>
@@ -2468,7 +2468,7 @@
                 <w:noProof/>
                 <w:webHidden/>
               </w:rPr>
-              <w:instrText xml:space="preserve"> PAGEREF _Toc232545011 \h </w:instrText>
+              <w:instrText xml:space="preserve"> PAGEREF _Toc232546324 \h </w:instrText>
             </w:r>
             <w:r>
               <w:rPr>
@@ -2512,7 +2512,7 @@
               <w:lang w:val="es-ES" w:eastAsia="es-ES"/>
             </w:rPr>
           </w:pPr>
-          <w:hyperlink w:anchor="_Toc232545012" w:history="1">
+          <w:hyperlink w:anchor="_Toc232546325" w:history="1">
             <w:r>
               <w:rPr>
                 <w:rStyle w:val="Hipervnculo"/>
@@ -2554,7 +2554,7 @@
                 <w:noProof/>
                 <w:webHidden/>
               </w:rPr>
-              <w:instrText xml:space="preserve"> PAGEREF _Toc232545012 \h </w:instrText>
+              <w:instrText xml:space="preserve"> PAGEREF _Toc232546325 \h </w:instrText>
             </w:r>
             <w:r>
               <w:rPr>
@@ -2598,7 +2598,7 @@
               <w:lang w:val="es-ES" w:eastAsia="es-ES"/>
             </w:rPr>
           </w:pPr>
-          <w:hyperlink w:anchor="_Toc232545013" w:history="1">
+          <w:hyperlink w:anchor="_Toc232546326" w:history="1">
             <w:r>
               <w:rPr>
                 <w:rStyle w:val="Hipervnculo"/>
@@ -2640,7 +2640,7 @@
                 <w:noProof/>
                 <w:webHidden/>
               </w:rPr>
-              <w:instrText xml:space="preserve"> PAGEREF _Toc232545013 \h </w:instrText>
+              <w:instrText xml:space="preserve"> PAGEREF _Toc232546326 \h </w:instrText>
             </w:r>
             <w:r>
               <w:rPr>
@@ -2684,7 +2684,7 @@
               <w:lang w:val="es-ES" w:eastAsia="es-ES"/>
             </w:rPr>
           </w:pPr>
-          <w:hyperlink w:anchor="_Toc232545014" w:history="1">
+          <w:hyperlink w:anchor="_Toc232546327" w:history="1">
             <w:r>
               <w:rPr>
                 <w:rStyle w:val="Hipervnculo"/>
@@ -2726,7 +2726,7 @@
                 <w:noProof/>
                 <w:webHidden/>
               </w:rPr>
-              <w:instrText xml:space="preserve"> PAGEREF _Toc232545014 \h </w:instrText>
+              <w:instrText xml:space="preserve"> PAGEREF _Toc232546327 \h </w:instrText>
             </w:r>
             <w:r>
               <w:rPr>
@@ -2770,7 +2770,7 @@
               <w:lang w:val="es-ES" w:eastAsia="es-ES"/>
             </w:rPr>
           </w:pPr>
-          <w:hyperlink w:anchor="_Toc232545015" w:history="1">
+          <w:hyperlink w:anchor="_Toc232546328" w:history="1">
             <w:r>
               <w:rPr>
                 <w:rStyle w:val="Hipervnculo"/>
@@ -2812,7 +2812,7 @@
                 <w:noProof/>
                 <w:webHidden/>
               </w:rPr>
-              <w:instrText xml:space="preserve"> PAGEREF _Toc232545015 \h </w:instrText>
+              <w:instrText xml:space="preserve"> PAGEREF _Toc232546328 \h </w:instrText>
             </w:r>
             <w:r>
               <w:rPr>
@@ -2856,7 +2856,7 @@
               <w:lang w:val="es-ES" w:eastAsia="es-ES"/>
             </w:rPr>
           </w:pPr>
-          <w:hyperlink w:anchor="_Toc232545016" w:history="1">
+          <w:hyperlink w:anchor="_Toc232546329" w:history="1">
             <w:r>
               <w:rPr>
                 <w:rStyle w:val="Hipervnculo"/>
@@ -2898,7 +2898,7 @@
                 <w:noProof/>
                 <w:webHidden/>
               </w:rPr>
-              <w:instrText xml:space="preserve"> PAGEREF _Toc232545016 \h </w:instrText>
+              <w:instrText xml:space="preserve"> PAGEREF _Toc232546329 \h </w:instrText>
             </w:r>
             <w:r>
               <w:rPr>
@@ -2942,7 +2942,7 @@
               <w:lang w:val="es-ES" w:eastAsia="es-ES"/>
             </w:rPr>
           </w:pPr>
-          <w:hyperlink w:anchor="_Toc232545017" w:history="1">
+          <w:hyperlink w:anchor="_Toc232546330" w:history="1">
             <w:r>
               <w:rPr>
                 <w:rStyle w:val="Hipervnculo"/>
@@ -2984,7 +2984,7 @@
                 <w:noProof/>
                 <w:webHidden/>
               </w:rPr>
-              <w:instrText xml:space="preserve"> PAGEREF _Toc232545017 \h </w:instrText>
+              <w:instrText xml:space="preserve"> PAGEREF _Toc232546330 \h </w:instrText>
             </w:r>
             <w:r>
               <w:rPr>
@@ -3028,7 +3028,7 @@
               <w:lang w:val="es-ES" w:eastAsia="es-ES"/>
             </w:rPr>
           </w:pPr>
-          <w:hyperlink w:anchor="_Toc232545018" w:history="1">
+          <w:hyperlink w:anchor="_Toc232546331" w:history="1">
             <w:r>
               <w:rPr>
                 <w:rStyle w:val="Hipervnculo"/>
@@ -3070,7 +3070,7 @@
                 <w:noProof/>
                 <w:webHidden/>
               </w:rPr>
-              <w:instrText xml:space="preserve"> PAGEREF _Toc232545018 \h </w:instrText>
+              <w:instrText xml:space="preserve"> PAGEREF _Toc232546331 \h </w:instrText>
             </w:r>
             <w:r>
               <w:rPr>
@@ -3114,7 +3114,7 @@
               <w:lang w:val="es-ES" w:eastAsia="es-ES"/>
             </w:rPr>
           </w:pPr>
-          <w:hyperlink w:anchor="_Toc232545019" w:history="1">
+          <w:hyperlink w:anchor="_Toc232546332" w:history="1">
             <w:r>
               <w:rPr>
                 <w:rStyle w:val="Hipervnculo"/>
@@ -3240,7 +3240,7 @@
                 <w:noProof/>
                 <w:webHidden/>
               </w:rPr>
-              <w:instrText xml:space="preserve"> PAGEREF _Toc232545019 \h </w:instrText>
+              <w:instrText xml:space="preserve"> PAGEREF _Toc232546332 \h </w:instrText>
             </w:r>
             <w:r>
               <w:rPr>
@@ -3284,7 +3284,7 @@
               <w:lang w:val="es-ES" w:eastAsia="es-ES"/>
             </w:rPr>
           </w:pPr>
-          <w:hyperlink w:anchor="_Toc232545020" w:history="1">
+          <w:hyperlink w:anchor="_Toc232546333" w:history="1">
             <w:r>
               <w:rPr>
                 <w:rStyle w:val="Hipervnculo"/>
@@ -3326,7 +3326,7 @@
                 <w:noProof/>
                 <w:webHidden/>
               </w:rPr>
-              <w:instrText xml:space="preserve"> PAGEREF _Toc232545020 \h </w:instrText>
+              <w:instrText xml:space="preserve"> PAGEREF _Toc232546333 \h </w:instrText>
             </w:r>
             <w:r>
               <w:rPr>
@@ -3370,7 +3370,7 @@
               <w:lang w:val="es-ES" w:eastAsia="es-ES"/>
             </w:rPr>
           </w:pPr>
-          <w:hyperlink w:anchor="_Toc232545021" w:history="1">
+          <w:hyperlink w:anchor="_Toc232546334" w:history="1">
             <w:r>
               <w:rPr>
                 <w:rStyle w:val="Hipervnculo"/>
@@ -3412,7 +3412,7 @@
                 <w:noProof/>
                 <w:webHidden/>
               </w:rPr>
-              <w:instrText xml:space="preserve"> PAGEREF _Toc232545021 \h </w:instrText>
+              <w:instrText xml:space="preserve"> PAGEREF _Toc232546334 \h </w:instrText>
             </w:r>
             <w:r>
               <w:rPr>
@@ -3456,7 +3456,7 @@
               <w:lang w:val="es-ES" w:eastAsia="es-ES"/>
             </w:rPr>
           </w:pPr>
-          <w:hyperlink w:anchor="_Toc232545022" w:history="1">
+          <w:hyperlink w:anchor="_Toc232546335" w:history="1">
             <w:r>
               <w:rPr>
                 <w:rStyle w:val="Hipervnculo"/>
@@ -3498,7 +3498,7 @@
                 <w:noProof/>
                 <w:webHidden/>
               </w:rPr>
-              <w:instrText xml:space="preserve"> PAGEREF _Toc232545022 \h </w:instrText>
+              <w:instrText xml:space="preserve"> PAGEREF _Toc232546335 \h </w:instrText>
             </w:r>
             <w:r>
               <w:rPr>
@@ -3542,7 +3542,7 @@
               <w:lang w:val="es-ES" w:eastAsia="es-ES"/>
             </w:rPr>
           </w:pPr>
-          <w:hyperlink w:anchor="_Toc232545023" w:history="1">
+          <w:hyperlink w:anchor="_Toc232546336" w:history="1">
             <w:r>
               <w:rPr>
                 <w:rStyle w:val="Hipervnculo"/>
@@ -3584,7 +3584,7 @@
                 <w:noProof/>
                 <w:webHidden/>
               </w:rPr>
-              <w:instrText xml:space="preserve"> PAGEREF _Toc232545023 \h </w:instrText>
+              <w:instrText xml:space="preserve"> PAGEREF _Toc232546336 \h </w:instrText>
             </w:r>
             <w:r>
               <w:rPr>
@@ -3628,7 +3628,7 @@
               <w:lang w:val="es-ES" w:eastAsia="es-ES"/>
             </w:rPr>
           </w:pPr>
-          <w:hyperlink w:anchor="_Toc232545024" w:history="1">
+          <w:hyperlink w:anchor="_Toc232546337" w:history="1">
             <w:r>
               <w:rPr>
                 <w:rStyle w:val="Hipervnculo"/>
@@ -3670,7 +3670,7 @@
                 <w:noProof/>
                 <w:webHidden/>
               </w:rPr>
-              <w:instrText xml:space="preserve"> PAGEREF _Toc232545024 \h </w:instrText>
+              <w:instrText xml:space="preserve"> PAGEREF _Toc232546337 \h </w:instrText>
             </w:r>
             <w:r>
               <w:rPr>
@@ -3714,7 +3714,7 @@
               <w:lang w:val="es-ES" w:eastAsia="es-ES"/>
             </w:rPr>
           </w:pPr>
-          <w:hyperlink w:anchor="_Toc232545025" w:history="1">
+          <w:hyperlink w:anchor="_Toc232546338" w:history="1">
             <w:r>
               <w:rPr>
                 <w:rStyle w:val="Hipervnculo"/>
@@ -3756,7 +3756,7 @@
                 <w:noProof/>
                 <w:webHidden/>
               </w:rPr>
-              <w:instrText xml:space="preserve"> PAGEREF _Toc232545025 \h </w:instrText>
+              <w:instrText xml:space="preserve"> PAGEREF _Toc232546338 \h </w:instrText>
             </w:r>
             <w:r>
               <w:rPr>
@@ -3800,7 +3800,7 @@
               <w:lang w:val="es-ES" w:eastAsia="es-ES"/>
             </w:rPr>
           </w:pPr>
-          <w:hyperlink w:anchor="_Toc232545026" w:history="1">
+          <w:hyperlink w:anchor="_Toc232546339" w:history="1">
             <w:r>
               <w:rPr>
                 <w:rStyle w:val="Hipervnculo"/>
@@ -3842,7 +3842,7 @@
                 <w:noProof/>
                 <w:webHidden/>
               </w:rPr>
-              <w:instrText xml:space="preserve"> PAGEREF _Toc232545026 \h </w:instrText>
+              <w:instrText xml:space="preserve"> PAGEREF _Toc232546339 \h </w:instrText>
             </w:r>
             <w:r>
               <w:rPr>
@@ -3886,7 +3886,7 @@
               <w:lang w:val="es-ES" w:eastAsia="es-ES"/>
             </w:rPr>
           </w:pPr>
-          <w:hyperlink w:anchor="_Toc232545027" w:history="1">
+          <w:hyperlink w:anchor="_Toc232546340" w:history="1">
             <w:r>
               <w:rPr>
                 <w:rStyle w:val="Hipervnculo"/>
@@ -3928,7 +3928,7 @@
                 <w:noProof/>
                 <w:webHidden/>
               </w:rPr>
-              <w:instrText xml:space="preserve"> PAGEREF _Toc232545027 \h </w:instrText>
+              <w:instrText xml:space="preserve"> PAGEREF _Toc232546340 \h </w:instrText>
             </w:r>
             <w:r>
               <w:rPr>
@@ -3972,7 +3972,7 @@
               <w:lang w:val="es-ES" w:eastAsia="es-ES"/>
             </w:rPr>
           </w:pPr>
-          <w:hyperlink w:anchor="_Toc232545028" w:history="1">
+          <w:hyperlink w:anchor="_Toc232546341" w:history="1">
             <w:r>
               <w:rPr>
                 <w:rStyle w:val="Hipervnculo"/>
@@ -4014,7 +4014,7 @@
                 <w:noProof/>
                 <w:webHidden/>
               </w:rPr>
-              <w:instrText xml:space="preserve"> PAGEREF _Toc232545028 \h </w:instrText>
+              <w:instrText xml:space="preserve"> PAGEREF _Toc232546341 \h </w:instrText>
             </w:r>
             <w:r>
               <w:rPr>
@@ -4058,7 +4058,7 @@
               <w:lang w:val="es-ES" w:eastAsia="es-ES"/>
             </w:rPr>
           </w:pPr>
-          <w:hyperlink w:anchor="_Toc232545029" w:history="1">
+          <w:hyperlink w:anchor="_Toc232546342" w:history="1">
             <w:r>
               <w:rPr>
                 <w:rStyle w:val="Hipervnculo"/>
@@ -4108,7 +4108,7 @@
                 <w:noProof/>
                 <w:webHidden/>
               </w:rPr>
-              <w:instrText xml:space="preserve"> PAGEREF _Toc232545029 \h </w:instrText>
+              <w:instrText xml:space="preserve"> PAGEREF _Toc232546342 \h </w:instrText>
             </w:r>
             <w:r>
               <w:rPr>
@@ -4152,7 +4152,7 @@
               <w:lang w:val="es-ES" w:eastAsia="es-ES"/>
             </w:rPr>
           </w:pPr>
-          <w:hyperlink w:anchor="_Toc232545030" w:history="1">
+          <w:hyperlink w:anchor="_Toc232546343" w:history="1">
             <w:r>
               <w:rPr>
                 <w:rStyle w:val="Hipervnculo"/>
@@ -4194,7 +4194,7 @@
                 <w:noProof/>
                 <w:webHidden/>
               </w:rPr>
-              <w:instrText xml:space="preserve"> PAGEREF _Toc232545030 \h </w:instrText>
+              <w:instrText xml:space="preserve"> PAGEREF _Toc232546343 \h </w:instrText>
             </w:r>
             <w:r>
               <w:rPr>
@@ -4238,7 +4238,7 @@
               <w:lang w:val="es-ES" w:eastAsia="es-ES"/>
             </w:rPr>
           </w:pPr>
-          <w:hyperlink w:anchor="_Toc232545031" w:history="1">
+          <w:hyperlink w:anchor="_Toc232546344" w:history="1">
             <w:r>
               <w:rPr>
                 <w:rStyle w:val="Hipervnculo"/>
@@ -4280,7 +4280,7 @@
                 <w:noProof/>
                 <w:webHidden/>
               </w:rPr>
-              <w:instrText xml:space="preserve"> PAGEREF _Toc232545031 \h </w:instrText>
+              <w:instrText xml:space="preserve"> PAGEREF _Toc232546344 \h </w:instrText>
             </w:r>
             <w:r>
               <w:rPr>
@@ -4324,7 +4324,7 @@
               <w:lang w:val="es-ES" w:eastAsia="es-ES"/>
             </w:rPr>
           </w:pPr>
-          <w:hyperlink w:anchor="_Toc232545032" w:history="1">
+          <w:hyperlink w:anchor="_Toc232546345" w:history="1">
             <w:r>
               <w:rPr>
                 <w:rStyle w:val="Hipervnculo"/>
@@ -4366,7 +4366,7 @@
                 <w:noProof/>
                 <w:webHidden/>
               </w:rPr>
-              <w:instrText xml:space="preserve"> PAGEREF _Toc232545032 \h </w:instrText>
+              <w:instrText xml:space="preserve"> PAGEREF _Toc232546345 \h </w:instrText>
             </w:r>
             <w:r>
               <w:rPr>
@@ -4410,7 +4410,7 @@
               <w:lang w:val="es-ES" w:eastAsia="es-ES"/>
             </w:rPr>
           </w:pPr>
-          <w:hyperlink w:anchor="_Toc232545033" w:history="1">
+          <w:hyperlink w:anchor="_Toc232546346" w:history="1">
             <w:r>
               <w:rPr>
                 <w:rStyle w:val="Hipervnculo"/>
@@ -4452,7 +4452,7 @@
                 <w:noProof/>
                 <w:webHidden/>
               </w:rPr>
-              <w:instrText xml:space="preserve"> PAGEREF _Toc232545033 \h </w:instrText>
+              <w:instrText xml:space="preserve"> PAGEREF _Toc232546346 \h </w:instrText>
             </w:r>
             <w:r>
               <w:rPr>
@@ -4496,7 +4496,7 @@
               <w:lang w:val="es-ES" w:eastAsia="es-ES"/>
             </w:rPr>
           </w:pPr>
-          <w:hyperlink w:anchor="_Toc232545034" w:history="1">
+          <w:hyperlink w:anchor="_Toc232546347" w:history="1">
             <w:r>
               <w:rPr>
                 <w:rStyle w:val="Hipervnculo"/>
@@ -4538,7 +4538,7 @@
                 <w:noProof/>
                 <w:webHidden/>
               </w:rPr>
-              <w:instrText xml:space="preserve"> PAGEREF _Toc232545034 \h </w:instrText>
+              <w:instrText xml:space="preserve"> PAGEREF _Toc232546347 \h </w:instrText>
             </w:r>
             <w:r>
               <w:rPr>
@@ -4582,7 +4582,7 @@
               <w:lang w:val="es-ES" w:eastAsia="es-ES"/>
             </w:rPr>
           </w:pPr>
-          <w:hyperlink w:anchor="_Toc232545035" w:history="1">
+          <w:hyperlink w:anchor="_Toc232546348" w:history="1">
             <w:r>
               <w:rPr>
                 <w:rStyle w:val="Hipervnculo"/>
@@ -4624,7 +4624,7 @@
                 <w:noProof/>
                 <w:webHidden/>
               </w:rPr>
-              <w:instrText xml:space="preserve"> PAGEREF _Toc232545035 \h </w:instrText>
+              <w:instrText xml:space="preserve"> PAGEREF _Toc232546348 \h </w:instrText>
             </w:r>
             <w:r>
               <w:rPr>
@@ -4668,7 +4668,7 @@
               <w:lang w:val="es-ES" w:eastAsia="es-ES"/>
             </w:rPr>
           </w:pPr>
-          <w:hyperlink w:anchor="_Toc232545036" w:history="1">
+          <w:hyperlink w:anchor="_Toc232546349" w:history="1">
             <w:r>
               <w:rPr>
                 <w:rStyle w:val="Hipervnculo"/>
@@ -4710,7 +4710,7 @@
                 <w:noProof/>
                 <w:webHidden/>
               </w:rPr>
-              <w:instrText xml:space="preserve"> PAGEREF _Toc232545036 \h </w:instrText>
+              <w:instrText xml:space="preserve"> PAGEREF _Toc232546349 \h </w:instrText>
             </w:r>
             <w:r>
               <w:rPr>
@@ -4754,7 +4754,7 @@
               <w:lang w:val="es-ES" w:eastAsia="es-ES"/>
             </w:rPr>
           </w:pPr>
-          <w:hyperlink w:anchor="_Toc232545037" w:history="1">
+          <w:hyperlink w:anchor="_Toc232546350" w:history="1">
             <w:r>
               <w:rPr>
                 <w:rStyle w:val="Hipervnculo"/>
@@ -4796,7 +4796,7 @@
                 <w:noProof/>
                 <w:webHidden/>
               </w:rPr>
-              <w:instrText xml:space="preserve"> PAGEREF _Toc232545037 \h </w:instrText>
+              <w:instrText xml:space="preserve"> PAGEREF _Toc232546350 \h </w:instrText>
             </w:r>
             <w:r>
               <w:rPr>
@@ -4840,7 +4840,7 @@
               <w:lang w:val="es-ES" w:eastAsia="es-ES"/>
             </w:rPr>
           </w:pPr>
-          <w:hyperlink w:anchor="_Toc232545038" w:history="1">
+          <w:hyperlink w:anchor="_Toc232546351" w:history="1">
             <w:r>
               <w:rPr>
                 <w:rStyle w:val="Hipervnculo"/>
@@ -4882,7 +4882,7 @@
                 <w:noProof/>
                 <w:webHidden/>
               </w:rPr>
-              <w:instrText xml:space="preserve"> PAGEREF _Toc232545038 \h </w:instrText>
+              <w:instrText xml:space="preserve"> PAGEREF _Toc232546351 \h </w:instrText>
             </w:r>
             <w:r>
               <w:rPr>
@@ -4926,7 +4926,7 @@
               <w:lang w:val="es-ES" w:eastAsia="es-ES"/>
             </w:rPr>
           </w:pPr>
-          <w:hyperlink w:anchor="_Toc232545039" w:history="1">
+          <w:hyperlink w:anchor="_Toc232546352" w:history="1">
             <w:r>
               <w:rPr>
                 <w:rStyle w:val="Hipervnculo"/>
@@ -4968,7 +4968,7 @@
                 <w:noProof/>
                 <w:webHidden/>
               </w:rPr>
-              <w:instrText xml:space="preserve"> PAGEREF _Toc232545039 \h </w:instrText>
+              <w:instrText xml:space="preserve"> PAGEREF _Toc232546352 \h </w:instrText>
             </w:r>
             <w:r>
               <w:rPr>
@@ -5012,7 +5012,7 @@
               <w:lang w:val="es-ES" w:eastAsia="es-ES"/>
             </w:rPr>
           </w:pPr>
-          <w:hyperlink w:anchor="_Toc232545040" w:history="1">
+          <w:hyperlink w:anchor="_Toc232546353" w:history="1">
             <w:r>
               <w:rPr>
                 <w:rStyle w:val="Hipervnculo"/>
@@ -5054,7 +5054,7 @@
                 <w:noProof/>
                 <w:webHidden/>
               </w:rPr>
-              <w:instrText xml:space="preserve"> PAGEREF _Toc232545040 \h </w:instrText>
+              <w:instrText xml:space="preserve"> PAGEREF _Toc232546353 \h </w:instrText>
             </w:r>
             <w:r>
               <w:rPr>
@@ -5075,6 +5075,866 @@
                 <w:webHidden/>
               </w:rPr>
               <w:t>19</w:t>
+            </w:r>
+            <w:r>
+              <w:rPr>
+                <w:noProof/>
+                <w:webHidden/>
+              </w:rPr>
+              <w:fldChar w:fldCharType="end"/>
+            </w:r>
+          </w:hyperlink>
+        </w:p>
+        <w:p>
+          <w:pPr>
+            <w:pStyle w:val="TDC1"/>
+            <w:tabs>
+              <w:tab w:val="left" w:pos="660"/>
+              <w:tab w:val="right" w:leader="dot" w:pos="9395"/>
+            </w:tabs>
+            <w:rPr>
+              <w:rFonts w:eastAsiaTheme="minorEastAsia"/>
+              <w:noProof/>
+              <w:lang w:val="es-ES" w:eastAsia="es-ES"/>
+            </w:rPr>
+          </w:pPr>
+          <w:hyperlink w:anchor="_Toc232546354" w:history="1">
+            <w:r>
+              <w:rPr>
+                <w:rStyle w:val="Hipervnculo"/>
+                <w:noProof/>
+              </w:rPr>
+              <w:t>14.</w:t>
+            </w:r>
+            <w:r>
+              <w:rPr>
+                <w:rFonts w:eastAsiaTheme="minorEastAsia"/>
+                <w:noProof/>
+                <w:lang w:val="es-ES" w:eastAsia="es-ES"/>
+              </w:rPr>
+              <w:tab/>
+            </w:r>
+            <w:r>
+              <w:rPr>
+                <w:rStyle w:val="Hipervnculo"/>
+                <w:noProof/>
+              </w:rPr>
+              <w:t>INFORME DE ESTADO DE AVANCE SEMANAL (Dirección de Ingresos)</w:t>
+            </w:r>
+            <w:r>
+              <w:rPr>
+                <w:noProof/>
+                <w:webHidden/>
+              </w:rPr>
+              <w:tab/>
+            </w:r>
+            <w:r>
+              <w:rPr>
+                <w:noProof/>
+                <w:webHidden/>
+              </w:rPr>
+              <w:fldChar w:fldCharType="begin"/>
+            </w:r>
+            <w:r>
+              <w:rPr>
+                <w:noProof/>
+                <w:webHidden/>
+              </w:rPr>
+              <w:instrText xml:space="preserve"> PAGEREF _Toc232546354 \h </w:instrText>
+            </w:r>
+            <w:r>
+              <w:rPr>
+                <w:noProof/>
+                <w:webHidden/>
+              </w:rPr>
+            </w:r>
+            <w:r>
+              <w:rPr>
+                <w:noProof/>
+                <w:webHidden/>
+              </w:rPr>
+              <w:fldChar w:fldCharType="separate"/>
+            </w:r>
+            <w:r>
+              <w:rPr>
+                <w:noProof/>
+                <w:webHidden/>
+              </w:rPr>
+              <w:t>20</w:t>
+            </w:r>
+            <w:r>
+              <w:rPr>
+                <w:noProof/>
+                <w:webHidden/>
+              </w:rPr>
+              <w:fldChar w:fldCharType="end"/>
+            </w:r>
+          </w:hyperlink>
+        </w:p>
+        <w:p>
+          <w:pPr>
+            <w:pStyle w:val="TDC2"/>
+            <w:tabs>
+              <w:tab w:val="left" w:pos="1100"/>
+              <w:tab w:val="right" w:leader="dot" w:pos="9395"/>
+            </w:tabs>
+            <w:rPr>
+              <w:rFonts w:eastAsiaTheme="minorEastAsia"/>
+              <w:noProof/>
+              <w:lang w:val="es-ES" w:eastAsia="es-ES"/>
+            </w:rPr>
+          </w:pPr>
+          <w:hyperlink w:anchor="_Toc232546355" w:history="1">
+            <w:r>
+              <w:rPr>
+                <w:rStyle w:val="Hipervnculo"/>
+                <w:noProof/>
+              </w:rPr>
+              <w:t>14.1.</w:t>
+            </w:r>
+            <w:r>
+              <w:rPr>
+                <w:rFonts w:eastAsiaTheme="minorEastAsia"/>
+                <w:noProof/>
+                <w:lang w:val="es-ES" w:eastAsia="es-ES"/>
+              </w:rPr>
+              <w:tab/>
+            </w:r>
+            <w:r>
+              <w:rPr>
+                <w:rStyle w:val="Hipervnculo"/>
+                <w:noProof/>
+              </w:rPr>
+              <w:t>Resumen Ejecutivo de Estado</w:t>
+            </w:r>
+            <w:r>
+              <w:rPr>
+                <w:noProof/>
+                <w:webHidden/>
+              </w:rPr>
+              <w:tab/>
+            </w:r>
+            <w:r>
+              <w:rPr>
+                <w:noProof/>
+                <w:webHidden/>
+              </w:rPr>
+              <w:fldChar w:fldCharType="begin"/>
+            </w:r>
+            <w:r>
+              <w:rPr>
+                <w:noProof/>
+                <w:webHidden/>
+              </w:rPr>
+              <w:instrText xml:space="preserve"> PAGEREF _Toc232546355 \h </w:instrText>
+            </w:r>
+            <w:r>
+              <w:rPr>
+                <w:noProof/>
+                <w:webHidden/>
+              </w:rPr>
+            </w:r>
+            <w:r>
+              <w:rPr>
+                <w:noProof/>
+                <w:webHidden/>
+              </w:rPr>
+              <w:fldChar w:fldCharType="separate"/>
+            </w:r>
+            <w:r>
+              <w:rPr>
+                <w:noProof/>
+                <w:webHidden/>
+              </w:rPr>
+              <w:t>20</w:t>
+            </w:r>
+            <w:r>
+              <w:rPr>
+                <w:noProof/>
+                <w:webHidden/>
+              </w:rPr>
+              <w:fldChar w:fldCharType="end"/>
+            </w:r>
+          </w:hyperlink>
+        </w:p>
+        <w:p>
+          <w:pPr>
+            <w:pStyle w:val="TDC2"/>
+            <w:tabs>
+              <w:tab w:val="left" w:pos="1100"/>
+              <w:tab w:val="right" w:leader="dot" w:pos="9395"/>
+            </w:tabs>
+            <w:rPr>
+              <w:rFonts w:eastAsiaTheme="minorEastAsia"/>
+              <w:noProof/>
+              <w:lang w:val="es-ES" w:eastAsia="es-ES"/>
+            </w:rPr>
+          </w:pPr>
+          <w:hyperlink w:anchor="_Toc232546356" w:history="1">
+            <w:r>
+              <w:rPr>
+                <w:rStyle w:val="Hipervnculo"/>
+                <w:noProof/>
+              </w:rPr>
+              <w:t>14.2.</w:t>
+            </w:r>
+            <w:r>
+              <w:rPr>
+                <w:rFonts w:eastAsiaTheme="minorEastAsia"/>
+                <w:noProof/>
+                <w:lang w:val="es-ES" w:eastAsia="es-ES"/>
+              </w:rPr>
+              <w:tab/>
+            </w:r>
+            <w:r>
+              <w:rPr>
+                <w:rStyle w:val="Hipervnculo"/>
+                <w:noProof/>
+              </w:rPr>
+              <w:t>Estado de Avance de las Líneas Base</w:t>
+            </w:r>
+            <w:r>
+              <w:rPr>
+                <w:noProof/>
+                <w:webHidden/>
+              </w:rPr>
+              <w:tab/>
+            </w:r>
+            <w:r>
+              <w:rPr>
+                <w:noProof/>
+                <w:webHidden/>
+              </w:rPr>
+              <w:fldChar w:fldCharType="begin"/>
+            </w:r>
+            <w:r>
+              <w:rPr>
+                <w:noProof/>
+                <w:webHidden/>
+              </w:rPr>
+              <w:instrText xml:space="preserve"> PAGEREF _Toc232546356 \h </w:instrText>
+            </w:r>
+            <w:r>
+              <w:rPr>
+                <w:noProof/>
+                <w:webHidden/>
+              </w:rPr>
+            </w:r>
+            <w:r>
+              <w:rPr>
+                <w:noProof/>
+                <w:webHidden/>
+              </w:rPr>
+              <w:fldChar w:fldCharType="separate"/>
+            </w:r>
+            <w:r>
+              <w:rPr>
+                <w:noProof/>
+                <w:webHidden/>
+              </w:rPr>
+              <w:t>20</w:t>
+            </w:r>
+            <w:r>
+              <w:rPr>
+                <w:noProof/>
+                <w:webHidden/>
+              </w:rPr>
+              <w:fldChar w:fldCharType="end"/>
+            </w:r>
+          </w:hyperlink>
+        </w:p>
+        <w:p>
+          <w:pPr>
+            <w:pStyle w:val="TDC2"/>
+            <w:tabs>
+              <w:tab w:val="left" w:pos="1100"/>
+              <w:tab w:val="right" w:leader="dot" w:pos="9395"/>
+            </w:tabs>
+            <w:rPr>
+              <w:rFonts w:eastAsiaTheme="minorEastAsia"/>
+              <w:noProof/>
+              <w:lang w:val="es-ES" w:eastAsia="es-ES"/>
+            </w:rPr>
+          </w:pPr>
+          <w:hyperlink w:anchor="_Toc232546357" w:history="1">
+            <w:r>
+              <w:rPr>
+                <w:rStyle w:val="Hipervnculo"/>
+                <w:noProof/>
+              </w:rPr>
+              <w:t>14.3.</w:t>
+            </w:r>
+            <w:r>
+              <w:rPr>
+                <w:rFonts w:eastAsiaTheme="minorEastAsia"/>
+                <w:noProof/>
+                <w:lang w:val="es-ES" w:eastAsia="es-ES"/>
+              </w:rPr>
+              <w:tab/>
+            </w:r>
+            <w:r>
+              <w:rPr>
+                <w:rStyle w:val="Hipervnculo"/>
+                <w:noProof/>
+              </w:rPr>
+              <w:t>Hitos y Actividades de la Semana</w:t>
+            </w:r>
+            <w:r>
+              <w:rPr>
+                <w:noProof/>
+                <w:webHidden/>
+              </w:rPr>
+              <w:tab/>
+            </w:r>
+            <w:r>
+              <w:rPr>
+                <w:noProof/>
+                <w:webHidden/>
+              </w:rPr>
+              <w:fldChar w:fldCharType="begin"/>
+            </w:r>
+            <w:r>
+              <w:rPr>
+                <w:noProof/>
+                <w:webHidden/>
+              </w:rPr>
+              <w:instrText xml:space="preserve"> PAGEREF _Toc232546357 \h </w:instrText>
+            </w:r>
+            <w:r>
+              <w:rPr>
+                <w:noProof/>
+                <w:webHidden/>
+              </w:rPr>
+            </w:r>
+            <w:r>
+              <w:rPr>
+                <w:noProof/>
+                <w:webHidden/>
+              </w:rPr>
+              <w:fldChar w:fldCharType="separate"/>
+            </w:r>
+            <w:r>
+              <w:rPr>
+                <w:noProof/>
+                <w:webHidden/>
+              </w:rPr>
+              <w:t>21</w:t>
+            </w:r>
+            <w:r>
+              <w:rPr>
+                <w:noProof/>
+                <w:webHidden/>
+              </w:rPr>
+              <w:fldChar w:fldCharType="end"/>
+            </w:r>
+          </w:hyperlink>
+        </w:p>
+        <w:p>
+          <w:pPr>
+            <w:pStyle w:val="TDC2"/>
+            <w:tabs>
+              <w:tab w:val="left" w:pos="1100"/>
+              <w:tab w:val="right" w:leader="dot" w:pos="9395"/>
+            </w:tabs>
+            <w:rPr>
+              <w:rFonts w:eastAsiaTheme="minorEastAsia"/>
+              <w:noProof/>
+              <w:lang w:val="es-ES" w:eastAsia="es-ES"/>
+            </w:rPr>
+          </w:pPr>
+          <w:hyperlink w:anchor="_Toc232546358" w:history="1">
+            <w:r>
+              <w:rPr>
+                <w:rStyle w:val="Hipervnculo"/>
+                <w:noProof/>
+              </w:rPr>
+              <w:t>14.4.</w:t>
+            </w:r>
+            <w:r>
+              <w:rPr>
+                <w:rFonts w:eastAsiaTheme="minorEastAsia"/>
+                <w:noProof/>
+                <w:lang w:val="es-ES" w:eastAsia="es-ES"/>
+              </w:rPr>
+              <w:tab/>
+            </w:r>
+            <w:r>
+              <w:rPr>
+                <w:rStyle w:val="Hipervnculo"/>
+                <w:noProof/>
+              </w:rPr>
+              <w:t>Alertas y Puntos de Decisión para la Dirección de Ingresos</w:t>
+            </w:r>
+            <w:r>
+              <w:rPr>
+                <w:noProof/>
+                <w:webHidden/>
+              </w:rPr>
+              <w:tab/>
+            </w:r>
+            <w:r>
+              <w:rPr>
+                <w:noProof/>
+                <w:webHidden/>
+              </w:rPr>
+              <w:fldChar w:fldCharType="begin"/>
+            </w:r>
+            <w:r>
+              <w:rPr>
+                <w:noProof/>
+                <w:webHidden/>
+              </w:rPr>
+              <w:instrText xml:space="preserve"> PAGEREF _Toc232546358 \h </w:instrText>
+            </w:r>
+            <w:r>
+              <w:rPr>
+                <w:noProof/>
+                <w:webHidden/>
+              </w:rPr>
+            </w:r>
+            <w:r>
+              <w:rPr>
+                <w:noProof/>
+                <w:webHidden/>
+              </w:rPr>
+              <w:fldChar w:fldCharType="separate"/>
+            </w:r>
+            <w:r>
+              <w:rPr>
+                <w:noProof/>
+                <w:webHidden/>
+              </w:rPr>
+              <w:t>21</w:t>
+            </w:r>
+            <w:r>
+              <w:rPr>
+                <w:noProof/>
+                <w:webHidden/>
+              </w:rPr>
+              <w:fldChar w:fldCharType="end"/>
+            </w:r>
+          </w:hyperlink>
+        </w:p>
+        <w:p>
+          <w:pPr>
+            <w:pStyle w:val="TDC1"/>
+            <w:tabs>
+              <w:tab w:val="left" w:pos="660"/>
+              <w:tab w:val="right" w:leader="dot" w:pos="9395"/>
+            </w:tabs>
+            <w:rPr>
+              <w:rFonts w:eastAsiaTheme="minorEastAsia"/>
+              <w:noProof/>
+              <w:lang w:val="es-ES" w:eastAsia="es-ES"/>
+            </w:rPr>
+          </w:pPr>
+          <w:hyperlink w:anchor="_Toc232546359" w:history="1">
+            <w:r>
+              <w:rPr>
+                <w:rStyle w:val="Hipervnculo"/>
+                <w:noProof/>
+              </w:rPr>
+              <w:t>15.</w:t>
+            </w:r>
+            <w:r>
+              <w:rPr>
+                <w:rFonts w:eastAsiaTheme="minorEastAsia"/>
+                <w:noProof/>
+                <w:lang w:val="es-ES" w:eastAsia="es-ES"/>
+              </w:rPr>
+              <w:tab/>
+            </w:r>
+            <w:r>
+              <w:rPr>
+                <w:rStyle w:val="Hipervnculo"/>
+                <w:noProof/>
+              </w:rPr>
+              <w:t>TABLERO DE SEQUIMIENTO Y KPIs DEL PROYECTO</w:t>
+            </w:r>
+            <w:r>
+              <w:rPr>
+                <w:noProof/>
+                <w:webHidden/>
+              </w:rPr>
+              <w:tab/>
+            </w:r>
+            <w:r>
+              <w:rPr>
+                <w:noProof/>
+                <w:webHidden/>
+              </w:rPr>
+              <w:fldChar w:fldCharType="begin"/>
+            </w:r>
+            <w:r>
+              <w:rPr>
+                <w:noProof/>
+                <w:webHidden/>
+              </w:rPr>
+              <w:instrText xml:space="preserve"> PAGEREF _Toc232546359 \h </w:instrText>
+            </w:r>
+            <w:r>
+              <w:rPr>
+                <w:noProof/>
+                <w:webHidden/>
+              </w:rPr>
+            </w:r>
+            <w:r>
+              <w:rPr>
+                <w:noProof/>
+                <w:webHidden/>
+              </w:rPr>
+              <w:fldChar w:fldCharType="separate"/>
+            </w:r>
+            <w:r>
+              <w:rPr>
+                <w:noProof/>
+                <w:webHidden/>
+              </w:rPr>
+              <w:t>21</w:t>
+            </w:r>
+            <w:r>
+              <w:rPr>
+                <w:noProof/>
+                <w:webHidden/>
+              </w:rPr>
+              <w:fldChar w:fldCharType="end"/>
+            </w:r>
+          </w:hyperlink>
+        </w:p>
+        <w:p>
+          <w:pPr>
+            <w:pStyle w:val="TDC2"/>
+            <w:tabs>
+              <w:tab w:val="left" w:pos="1100"/>
+              <w:tab w:val="right" w:leader="dot" w:pos="9395"/>
+            </w:tabs>
+            <w:rPr>
+              <w:rFonts w:eastAsiaTheme="minorEastAsia"/>
+              <w:noProof/>
+              <w:lang w:val="es-ES" w:eastAsia="es-ES"/>
+            </w:rPr>
+          </w:pPr>
+          <w:hyperlink w:anchor="_Toc232546360" w:history="1">
+            <w:r>
+              <w:rPr>
+                <w:rStyle w:val="Hipervnculo"/>
+                <w:noProof/>
+              </w:rPr>
+              <w:t>15.1.</w:t>
+            </w:r>
+            <w:r>
+              <w:rPr>
+                <w:rFonts w:eastAsiaTheme="minorEastAsia"/>
+                <w:noProof/>
+                <w:lang w:val="es-ES" w:eastAsia="es-ES"/>
+              </w:rPr>
+              <w:tab/>
+            </w:r>
+            <w:r>
+              <w:rPr>
+                <w:rStyle w:val="Hipervnculo"/>
+                <w:noProof/>
+              </w:rPr>
+              <w:t>KPIs Financieros y de Cronograma (Gestión del Valor Ganado - EVM)</w:t>
+            </w:r>
+            <w:r>
+              <w:rPr>
+                <w:noProof/>
+                <w:webHidden/>
+              </w:rPr>
+              <w:tab/>
+            </w:r>
+            <w:r>
+              <w:rPr>
+                <w:noProof/>
+                <w:webHidden/>
+              </w:rPr>
+              <w:fldChar w:fldCharType="begin"/>
+            </w:r>
+            <w:r>
+              <w:rPr>
+                <w:noProof/>
+                <w:webHidden/>
+              </w:rPr>
+              <w:instrText xml:space="preserve"> PAGEREF _Toc232546360 \h </w:instrText>
+            </w:r>
+            <w:r>
+              <w:rPr>
+                <w:noProof/>
+                <w:webHidden/>
+              </w:rPr>
+            </w:r>
+            <w:r>
+              <w:rPr>
+                <w:noProof/>
+                <w:webHidden/>
+              </w:rPr>
+              <w:fldChar w:fldCharType="separate"/>
+            </w:r>
+            <w:r>
+              <w:rPr>
+                <w:noProof/>
+                <w:webHidden/>
+              </w:rPr>
+              <w:t>21</w:t>
+            </w:r>
+            <w:r>
+              <w:rPr>
+                <w:noProof/>
+                <w:webHidden/>
+              </w:rPr>
+              <w:fldChar w:fldCharType="end"/>
+            </w:r>
+          </w:hyperlink>
+        </w:p>
+        <w:p>
+          <w:pPr>
+            <w:pStyle w:val="TDC2"/>
+            <w:tabs>
+              <w:tab w:val="left" w:pos="1100"/>
+              <w:tab w:val="right" w:leader="dot" w:pos="9395"/>
+            </w:tabs>
+            <w:rPr>
+              <w:rFonts w:eastAsiaTheme="minorEastAsia"/>
+              <w:noProof/>
+              <w:lang w:val="es-ES" w:eastAsia="es-ES"/>
+            </w:rPr>
+          </w:pPr>
+          <w:hyperlink w:anchor="_Toc232546361" w:history="1">
+            <w:r>
+              <w:rPr>
+                <w:rStyle w:val="Hipervnculo"/>
+                <w:noProof/>
+              </w:rPr>
+              <w:t>15.2.</w:t>
+            </w:r>
+            <w:r>
+              <w:rPr>
+                <w:rFonts w:eastAsiaTheme="minorEastAsia"/>
+                <w:noProof/>
+                <w:lang w:val="es-ES" w:eastAsia="es-ES"/>
+              </w:rPr>
+              <w:tab/>
+            </w:r>
+            <w:r>
+              <w:rPr>
+                <w:rStyle w:val="Hipervnculo"/>
+                <w:noProof/>
+              </w:rPr>
+              <w:t>KPIs de Desarrollo Ágil (Rendimiento del Equipo)</w:t>
+            </w:r>
+            <w:r>
+              <w:rPr>
+                <w:noProof/>
+                <w:webHidden/>
+              </w:rPr>
+              <w:tab/>
+            </w:r>
+            <w:r>
+              <w:rPr>
+                <w:noProof/>
+                <w:webHidden/>
+              </w:rPr>
+              <w:fldChar w:fldCharType="begin"/>
+            </w:r>
+            <w:r>
+              <w:rPr>
+                <w:noProof/>
+                <w:webHidden/>
+              </w:rPr>
+              <w:instrText xml:space="preserve"> PAGEREF _Toc232546361 \h </w:instrText>
+            </w:r>
+            <w:r>
+              <w:rPr>
+                <w:noProof/>
+                <w:webHidden/>
+              </w:rPr>
+            </w:r>
+            <w:r>
+              <w:rPr>
+                <w:noProof/>
+                <w:webHidden/>
+              </w:rPr>
+              <w:fldChar w:fldCharType="separate"/>
+            </w:r>
+            <w:r>
+              <w:rPr>
+                <w:noProof/>
+                <w:webHidden/>
+              </w:rPr>
+              <w:t>22</w:t>
+            </w:r>
+            <w:r>
+              <w:rPr>
+                <w:noProof/>
+                <w:webHidden/>
+              </w:rPr>
+              <w:fldChar w:fldCharType="end"/>
+            </w:r>
+          </w:hyperlink>
+        </w:p>
+        <w:p>
+          <w:pPr>
+            <w:pStyle w:val="TDC2"/>
+            <w:tabs>
+              <w:tab w:val="left" w:pos="1100"/>
+              <w:tab w:val="right" w:leader="dot" w:pos="9395"/>
+            </w:tabs>
+            <w:rPr>
+              <w:rFonts w:eastAsiaTheme="minorEastAsia"/>
+              <w:noProof/>
+              <w:lang w:val="es-ES" w:eastAsia="es-ES"/>
+            </w:rPr>
+          </w:pPr>
+          <w:hyperlink w:anchor="_Toc232546362" w:history="1">
+            <w:r>
+              <w:rPr>
+                <w:rStyle w:val="Hipervnculo"/>
+                <w:noProof/>
+              </w:rPr>
+              <w:t>15.3.</w:t>
+            </w:r>
+            <w:r>
+              <w:rPr>
+                <w:rFonts w:eastAsiaTheme="minorEastAsia"/>
+                <w:noProof/>
+                <w:lang w:val="es-ES" w:eastAsia="es-ES"/>
+              </w:rPr>
+              <w:tab/>
+            </w:r>
+            <w:r>
+              <w:rPr>
+                <w:rStyle w:val="Hipervnculo"/>
+                <w:noProof/>
+              </w:rPr>
+              <w:t>KPIs de Calidad de Software (Aseguramiento de Calidad - QA)</w:t>
+            </w:r>
+            <w:r>
+              <w:rPr>
+                <w:noProof/>
+                <w:webHidden/>
+              </w:rPr>
+              <w:tab/>
+            </w:r>
+            <w:r>
+              <w:rPr>
+                <w:noProof/>
+                <w:webHidden/>
+              </w:rPr>
+              <w:fldChar w:fldCharType="begin"/>
+            </w:r>
+            <w:r>
+              <w:rPr>
+                <w:noProof/>
+                <w:webHidden/>
+              </w:rPr>
+              <w:instrText xml:space="preserve"> PAGEREF _Toc232546362 \h </w:instrText>
+            </w:r>
+            <w:r>
+              <w:rPr>
+                <w:noProof/>
+                <w:webHidden/>
+              </w:rPr>
+            </w:r>
+            <w:r>
+              <w:rPr>
+                <w:noProof/>
+                <w:webHidden/>
+              </w:rPr>
+              <w:fldChar w:fldCharType="separate"/>
+            </w:r>
+            <w:r>
+              <w:rPr>
+                <w:noProof/>
+                <w:webHidden/>
+              </w:rPr>
+              <w:t>22</w:t>
+            </w:r>
+            <w:r>
+              <w:rPr>
+                <w:noProof/>
+                <w:webHidden/>
+              </w:rPr>
+              <w:fldChar w:fldCharType="end"/>
+            </w:r>
+          </w:hyperlink>
+        </w:p>
+        <w:p>
+          <w:pPr>
+            <w:pStyle w:val="TDC2"/>
+            <w:tabs>
+              <w:tab w:val="left" w:pos="1100"/>
+              <w:tab w:val="right" w:leader="dot" w:pos="9395"/>
+            </w:tabs>
+            <w:rPr>
+              <w:rFonts w:eastAsiaTheme="minorEastAsia"/>
+              <w:noProof/>
+              <w:lang w:val="es-ES" w:eastAsia="es-ES"/>
+            </w:rPr>
+          </w:pPr>
+          <w:hyperlink w:anchor="_Toc232546363" w:history="1">
+            <w:r>
+              <w:rPr>
+                <w:rStyle w:val="Hipervnculo"/>
+                <w:noProof/>
+              </w:rPr>
+              <w:t>15.4.</w:t>
+            </w:r>
+            <w:r>
+              <w:rPr>
+                <w:rFonts w:eastAsiaTheme="minorEastAsia"/>
+                <w:noProof/>
+                <w:lang w:val="es-ES" w:eastAsia="es-ES"/>
+              </w:rPr>
+              <w:tab/>
+            </w:r>
+            <w:r>
+              <w:rPr>
+                <w:rStyle w:val="Hipervnculo"/>
+                <w:noProof/>
+              </w:rPr>
+              <w:t>Resumen Visual de Alertas Gerenciales</w:t>
+            </w:r>
+            <w:r>
+              <w:rPr>
+                <w:noProof/>
+                <w:webHidden/>
+              </w:rPr>
+              <w:tab/>
+            </w:r>
+            <w:r>
+              <w:rPr>
+                <w:noProof/>
+                <w:webHidden/>
+              </w:rPr>
+              <w:fldChar w:fldCharType="begin"/>
+            </w:r>
+            <w:r>
+              <w:rPr>
+                <w:noProof/>
+                <w:webHidden/>
+              </w:rPr>
+              <w:instrText xml:space="preserve"> PAGEREF _Toc232546363 \h </w:instrText>
+            </w:r>
+            <w:r>
+              <w:rPr>
+                <w:noProof/>
+                <w:webHidden/>
+              </w:rPr>
+            </w:r>
+            <w:r>
+              <w:rPr>
+                <w:noProof/>
+                <w:webHidden/>
+              </w:rPr>
+              <w:fldChar w:fldCharType="separate"/>
+            </w:r>
+            <w:r>
+              <w:rPr>
+                <w:noProof/>
+                <w:webHidden/>
+              </w:rPr>
+              <w:t>23</w:t>
             </w:r>
             <w:r>
               <w:rPr>
@@ -5122,7 +5982,7 @@
       <w:pPr>
         <w:pStyle w:val="Ttulo1"/>
       </w:pPr>
-      <w:bookmarkStart w:id="0" w:name="_Toc232544988"/>
+      <w:bookmarkStart w:id="0" w:name="_Toc232546301"/>
       <w:r>
         <w:t>ACTA DE CONSTITUCIÓN DEL PROYECTO</w:t>
       </w:r>
@@ -5132,7 +5992,7 @@
       <w:pPr>
         <w:pStyle w:val="Ttulo2"/>
       </w:pPr>
-      <w:bookmarkStart w:id="1" w:name="_Toc232544989"/>
+      <w:bookmarkStart w:id="1" w:name="_Toc232546302"/>
       <w:r>
         <w:t>Información General del Proyecto</w:t>
       </w:r>
@@ -5231,7 +6091,7 @@
       <w:pPr>
         <w:pStyle w:val="Ttulo2"/>
       </w:pPr>
-      <w:bookmarkStart w:id="2" w:name="_Toc232544990"/>
+      <w:bookmarkStart w:id="2" w:name="_Toc232546303"/>
       <w:r>
         <w:t>Propósito y Justificación del Proyecto</w:t>
       </w:r>
@@ -5287,7 +6147,7 @@
       <w:pPr>
         <w:pStyle w:val="Ttulo2"/>
       </w:pPr>
-      <w:bookmarkStart w:id="3" w:name="_Toc232544991"/>
+      <w:bookmarkStart w:id="3" w:name="_Toc232546304"/>
       <w:r>
         <w:t>Objetivos del Proyecto</w:t>
       </w:r>
@@ -5297,7 +6157,7 @@
       <w:pPr>
         <w:pStyle w:val="Ttulo3"/>
       </w:pPr>
-      <w:bookmarkStart w:id="4" w:name="_Toc232544992"/>
+      <w:bookmarkStart w:id="4" w:name="_Toc232546305"/>
       <w:r>
         <w:t>Objetivo General</w:t>
       </w:r>
@@ -5325,7 +6185,7 @@
       <w:pPr>
         <w:pStyle w:val="Ttulo3"/>
       </w:pPr>
-      <w:bookmarkStart w:id="5" w:name="_Toc232544993"/>
+      <w:bookmarkStart w:id="5" w:name="_Toc232546306"/>
       <w:r>
         <w:t>Objetivos Específicos</w:t>
       </w:r>
@@ -5442,7 +6302,7 @@
       <w:pPr>
         <w:pStyle w:val="Ttulo2"/>
       </w:pPr>
-      <w:bookmarkStart w:id="6" w:name="_Toc232544994"/>
+      <w:bookmarkStart w:id="6" w:name="_Toc232546307"/>
       <w:r>
         <w:t>Alcance Inicial del Proyecto</w:t>
       </w:r>
@@ -5555,7 +6415,7 @@
       <w:pPr>
         <w:pStyle w:val="Ttulo3"/>
       </w:pPr>
-      <w:bookmarkStart w:id="7" w:name="_Toc232544995"/>
+      <w:bookmarkStart w:id="7" w:name="_Toc232546308"/>
       <w:r>
         <w:t>Módulos Incluidos en el MVP</w:t>
       </w:r>
@@ -5757,7 +6617,7 @@
       <w:pPr>
         <w:pStyle w:val="Ttulo2"/>
       </w:pPr>
-      <w:bookmarkStart w:id="8" w:name="_Toc232544996"/>
+      <w:bookmarkStart w:id="8" w:name="_Toc232546309"/>
       <w:r>
         <w:t>Restricciones y Supuestos</w:t>
       </w:r>
@@ -5767,7 +6627,7 @@
       <w:pPr>
         <w:pStyle w:val="Ttulo3"/>
       </w:pPr>
-      <w:bookmarkStart w:id="9" w:name="_Toc232544997"/>
+      <w:bookmarkStart w:id="9" w:name="_Toc232546310"/>
       <w:r>
         <w:t>Restricciones</w:t>
       </w:r>
@@ -5853,7 +6713,7 @@
       <w:pPr>
         <w:pStyle w:val="Ttulo3"/>
       </w:pPr>
-      <w:bookmarkStart w:id="10" w:name="_Toc232544998"/>
+      <w:bookmarkStart w:id="10" w:name="_Toc232546311"/>
       <w:r>
         <w:t>Supuestos</w:t>
       </w:r>
@@ -5945,7 +6805,7 @@
       <w:pPr>
         <w:pStyle w:val="Ttulo2"/>
       </w:pPr>
-      <w:bookmarkStart w:id="11" w:name="_Toc232544999"/>
+      <w:bookmarkStart w:id="11" w:name="_Toc232546312"/>
       <w:r>
         <w:t>Presupuesto y Recursos Iniciales</w:t>
       </w:r>
@@ -5988,7 +6848,23 @@
           <w:rFonts w:ascii="Arial" w:hAnsi="Arial" w:cs="Arial"/>
           <w:lang w:val="es-ES"/>
         </w:rPr>
-        <w:t>70.000 Bolivianos (Bs.)</w:t>
+        <w:t xml:space="preserve">70.000 </w:t>
+      </w:r>
+      <w:proofErr w:type="gramStart"/>
+      <w:r>
+        <w:rPr>
+          <w:rFonts w:ascii="Arial" w:hAnsi="Arial" w:cs="Arial"/>
+          <w:lang w:val="es-ES"/>
+        </w:rPr>
+        <w:t>Bolivianos</w:t>
+      </w:r>
+      <w:proofErr w:type="gramEnd"/>
+      <w:r>
+        <w:rPr>
+          <w:rFonts w:ascii="Arial" w:hAnsi="Arial" w:cs="Arial"/>
+          <w:lang w:val="es-ES"/>
+        </w:rPr>
+        <w:t xml:space="preserve"> (Bs.)</w:t>
       </w:r>
     </w:p>
     <w:p>
@@ -6157,7 +7033,7 @@
         <w:pStyle w:val="Ttulo1"/>
         <w:jc w:val="both"/>
       </w:pPr>
-      <w:bookmarkStart w:id="12" w:name="_Toc232545000"/>
+      <w:bookmarkStart w:id="12" w:name="_Toc232546313"/>
       <w:r>
         <w:t>DOCUMENTO DE METODOLOGÍA DE DESARROLLO</w:t>
       </w:r>
@@ -6168,7 +7044,7 @@
         <w:pStyle w:val="Ttulo2"/>
         <w:jc w:val="both"/>
       </w:pPr>
-      <w:bookmarkStart w:id="13" w:name="_Toc232545001"/>
+      <w:bookmarkStart w:id="13" w:name="_Toc232546314"/>
       <w:r>
         <w:t>Enfoque Seleccionado: Metodología Híbrida</w:t>
       </w:r>
@@ -6197,7 +7073,7 @@
         <w:pStyle w:val="Ttulo2"/>
         <w:jc w:val="both"/>
       </w:pPr>
-      <w:bookmarkStart w:id="14" w:name="_Toc232545002"/>
+      <w:bookmarkStart w:id="14" w:name="_Toc232546315"/>
       <w:r>
         <w:t>Justificación del Enfoque Híbrido</w:t>
       </w:r>
@@ -6294,7 +7170,7 @@
         <w:pStyle w:val="Ttulo1"/>
         <w:jc w:val="both"/>
       </w:pPr>
-      <w:bookmarkStart w:id="15" w:name="_Toc232545003"/>
+      <w:bookmarkStart w:id="15" w:name="_Toc232546316"/>
       <w:r>
         <w:t>SOLICITUD DE PROYECTO</w:t>
       </w:r>
@@ -6305,7 +7181,7 @@
         <w:pStyle w:val="Ttulo2"/>
         <w:jc w:val="both"/>
       </w:pPr>
-      <w:bookmarkStart w:id="16" w:name="_Toc232545004"/>
+      <w:bookmarkStart w:id="16" w:name="_Toc232546317"/>
       <w:r>
         <w:t>Información del Solicitante</w:t>
       </w:r>
@@ -6363,7 +7239,23 @@
           <w:lang w:val="es-ES"/>
         </w:rPr>
         <w:lastRenderedPageBreak/>
-        <w:t>Fecha de Solicitud: 15 de Enero de 2026</w:t>
+        <w:t xml:space="preserve">Fecha de Solicitud: 15 de </w:t>
+      </w:r>
+      <w:proofErr w:type="gramStart"/>
+      <w:r>
+        <w:rPr>
+          <w:rFonts w:ascii="Arial" w:hAnsi="Arial" w:cs="Arial"/>
+          <w:lang w:val="es-ES"/>
+        </w:rPr>
+        <w:t>Enero</w:t>
+      </w:r>
+      <w:proofErr w:type="gramEnd"/>
+      <w:r>
+        <w:rPr>
+          <w:rFonts w:ascii="Arial" w:hAnsi="Arial" w:cs="Arial"/>
+          <w:lang w:val="es-ES"/>
+        </w:rPr>
+        <w:t xml:space="preserve"> de 2026</w:t>
       </w:r>
     </w:p>
     <w:p>
@@ -6389,7 +7281,7 @@
         <w:pStyle w:val="Ttulo2"/>
         <w:jc w:val="both"/>
       </w:pPr>
-      <w:bookmarkStart w:id="17" w:name="_Toc232545005"/>
+      <w:bookmarkStart w:id="17" w:name="_Toc232546318"/>
       <w:r>
         <w:t>Descripción del Problema u Oportunidad</w:t>
       </w:r>
@@ -6464,7 +7356,7 @@
         <w:pStyle w:val="Ttulo2"/>
         <w:jc w:val="both"/>
       </w:pPr>
-      <w:bookmarkStart w:id="18" w:name="_Toc232545006"/>
+      <w:bookmarkStart w:id="18" w:name="_Toc232546319"/>
       <w:r>
         <w:t>Descripción de la Solución Propuesta</w:t>
       </w:r>
@@ -6493,7 +7385,7 @@
         <w:pStyle w:val="Ttulo2"/>
         <w:jc w:val="both"/>
       </w:pPr>
-      <w:bookmarkStart w:id="19" w:name="_Toc232545007"/>
+      <w:bookmarkStart w:id="19" w:name="_Toc232546320"/>
       <w:r>
         <w:t>Beneficios Esperados</w:t>
       </w:r>
@@ -6592,7 +7484,7 @@
         <w:pStyle w:val="Ttulo2"/>
         <w:jc w:val="both"/>
       </w:pPr>
-      <w:bookmarkStart w:id="20" w:name="_Toc232545008"/>
+      <w:bookmarkStart w:id="20" w:name="_Toc232546321"/>
       <w:r>
         <w:t>Restricciones Iniciales Conocidas</w:t>
       </w:r>
@@ -6669,7 +7561,7 @@
       <w:pPr>
         <w:pStyle w:val="Ttulo1"/>
       </w:pPr>
-      <w:bookmarkStart w:id="21" w:name="_Toc232545009"/>
+      <w:bookmarkStart w:id="21" w:name="_Toc232546322"/>
       <w:r>
         <w:t>DOCUMENTO</w:t>
       </w:r>
@@ -6719,7 +7611,7 @@
       <w:pPr>
         <w:pStyle w:val="Ttulo2"/>
       </w:pPr>
-      <w:bookmarkStart w:id="22" w:name="_Toc232545010"/>
+      <w:bookmarkStart w:id="22" w:name="_Toc232546323"/>
       <w:r>
         <w:t>El Ascensor (</w:t>
       </w:r>
@@ -6754,7 +7646,7 @@
       <w:pPr>
         <w:pStyle w:val="Ttulo2"/>
       </w:pPr>
-      <w:bookmarkStart w:id="23" w:name="_Toc232545011"/>
+      <w:bookmarkStart w:id="23" w:name="_Toc232546324"/>
       <w:r>
         <w:t>La Caja del Producto (</w:t>
       </w:r>
@@ -6925,7 +7817,7 @@
       <w:pPr>
         <w:pStyle w:val="Ttulo2"/>
       </w:pPr>
-      <w:bookmarkStart w:id="24" w:name="_Toc232545012"/>
+      <w:bookmarkStart w:id="24" w:name="_Toc232546325"/>
       <w:r>
         <w:lastRenderedPageBreak/>
         <w:t>Lista de "Lo que es" y "Lo que NO es"</w:t>
@@ -7196,7 +8088,7 @@
       <w:pPr>
         <w:pStyle w:val="Ttulo2"/>
       </w:pPr>
-      <w:bookmarkStart w:id="25" w:name="_Toc232545013"/>
+      <w:bookmarkStart w:id="25" w:name="_Toc232546326"/>
       <w:r>
         <w:t>Vecinos Cercanos (Interfases e Integraciones)</w:t>
       </w:r>
@@ -7318,7 +8210,7 @@
       <w:pPr>
         <w:pStyle w:val="Ttulo1"/>
       </w:pPr>
-      <w:bookmarkStart w:id="26" w:name="_Toc232545014"/>
+      <w:bookmarkStart w:id="26" w:name="_Toc232546327"/>
       <w:r>
         <w:t>ESPECIFICACIÓN DE</w:t>
       </w:r>
@@ -7349,7 +8241,7 @@
       <w:pPr>
         <w:pStyle w:val="Ttulo2"/>
       </w:pPr>
-      <w:bookmarkStart w:id="27" w:name="_Toc232545015"/>
+      <w:bookmarkStart w:id="27" w:name="_Toc232546328"/>
       <w:r>
         <w:t>Requerimientos Funcionales (RF)</w:t>
       </w:r>
@@ -7748,7 +8640,7 @@
       <w:pPr>
         <w:pStyle w:val="Ttulo2"/>
       </w:pPr>
-      <w:bookmarkStart w:id="28" w:name="_Toc232545016"/>
+      <w:bookmarkStart w:id="28" w:name="_Toc232546329"/>
       <w:r>
         <w:t>Requerimientos No Funcionales (RNF)</w:t>
       </w:r>
@@ -7919,7 +8811,7 @@
       <w:pPr>
         <w:pStyle w:val="Ttulo1"/>
       </w:pPr>
-      <w:bookmarkStart w:id="29" w:name="_Toc232545017"/>
+      <w:bookmarkStart w:id="29" w:name="_Toc232546330"/>
       <w:r>
         <w:t>Matriz de Priorización de Requerimientos</w:t>
       </w:r>
@@ -7960,7 +8852,7 @@
       <w:pPr>
         <w:pStyle w:val="Ttulo2"/>
       </w:pPr>
-      <w:bookmarkStart w:id="30" w:name="_Toc232545018"/>
+      <w:bookmarkStart w:id="30" w:name="_Toc232546331"/>
       <w:r>
         <w:t xml:space="preserve">Cuadro de Priorización </w:t>
       </w:r>
@@ -8496,7 +9388,7 @@
           <w:lang w:val="es-ES"/>
         </w:rPr>
       </w:pPr>
-      <w:bookmarkStart w:id="31" w:name="_Toc232545019"/>
+      <w:bookmarkStart w:id="31" w:name="_Toc232546332"/>
       <w:r>
         <w:rPr>
           <w:rStyle w:val="Ttulo1Car"/>
@@ -8644,7 +9536,7 @@
       <w:pPr>
         <w:pStyle w:val="Ttulo2"/>
       </w:pPr>
-      <w:bookmarkStart w:id="32" w:name="_Toc232545020"/>
+      <w:bookmarkStart w:id="32" w:name="_Toc232546333"/>
       <w:r>
         <w:t>Cronograma</w:t>
       </w:r>
@@ -9468,7 +10360,7 @@
       <w:pPr>
         <w:pStyle w:val="Ttulo2"/>
       </w:pPr>
-      <w:bookmarkStart w:id="33" w:name="_Toc232545021"/>
+      <w:bookmarkStart w:id="33" w:name="_Toc232546334"/>
       <w:r>
         <w:lastRenderedPageBreak/>
         <w:t xml:space="preserve">Estructura de </w:t>
@@ -9751,7 +10643,7 @@
       <w:pPr>
         <w:pStyle w:val="Ttulo1"/>
       </w:pPr>
-      <w:bookmarkStart w:id="34" w:name="_Toc232545022"/>
+      <w:bookmarkStart w:id="34" w:name="_Toc232546335"/>
       <w:r>
         <w:t>PRESUPUESTO</w:t>
       </w:r>
@@ -9791,8 +10683,17 @@
           <w:rFonts w:ascii="Arial" w:hAnsi="Arial" w:cs="Arial"/>
           <w:lang w:val="es-ES"/>
         </w:rPr>
-        <w:t>El presupuesto total asignado por el Gobierno Autónomo Municipal de Sucre es de 70,000 Bolivianos</w:t>
-      </w:r>
+        <w:t xml:space="preserve">El presupuesto total asignado por el Gobierno Autónomo Municipal de Sucre es de 70,000 </w:t>
+      </w:r>
+      <w:proofErr w:type="gramStart"/>
+      <w:r>
+        <w:rPr>
+          <w:rFonts w:ascii="Arial" w:hAnsi="Arial" w:cs="Arial"/>
+          <w:lang w:val="es-ES"/>
+        </w:rPr>
+        <w:t>Bolivianos</w:t>
+      </w:r>
+      <w:proofErr w:type="gramEnd"/>
       <w:r>
         <w:rPr>
           <w:rFonts w:ascii="Arial" w:hAnsi="Arial" w:cs="Arial"/>
@@ -9814,7 +10715,7 @@
       <w:pPr>
         <w:pStyle w:val="Ttulo2"/>
       </w:pPr>
-      <w:bookmarkStart w:id="35" w:name="_Toc232545023"/>
+      <w:bookmarkStart w:id="35" w:name="_Toc232546336"/>
       <w:r>
         <w:t>Desglose de Costos del Proyecto</w:t>
       </w:r>
@@ -10815,7 +11716,7 @@
       <w:pPr>
         <w:pStyle w:val="Ttulo2"/>
       </w:pPr>
-      <w:bookmarkStart w:id="36" w:name="_Toc232545024"/>
+      <w:bookmarkStart w:id="36" w:name="_Toc232546337"/>
       <w:r>
         <w:t>Reglas de Control Financiero</w:t>
       </w:r>
@@ -10889,7 +11790,7 @@
       <w:pPr>
         <w:pStyle w:val="Ttulo1"/>
       </w:pPr>
-      <w:bookmarkStart w:id="37" w:name="_Toc232545025"/>
+      <w:bookmarkStart w:id="37" w:name="_Toc232546338"/>
       <w:r>
         <w:t>PLAN</w:t>
       </w:r>
@@ -10956,7 +11857,7 @@
       <w:pPr>
         <w:pStyle w:val="Ttulo2"/>
       </w:pPr>
-      <w:bookmarkStart w:id="38" w:name="_Toc232545026"/>
+      <w:bookmarkStart w:id="38" w:name="_Toc232546339"/>
       <w:r>
         <w:t>Roles, Responsabilidades y Distribución del Salario Inicial</w:t>
       </w:r>
@@ -11222,7 +12123,7 @@
       <w:pPr>
         <w:pStyle w:val="Ttulo1"/>
       </w:pPr>
-      <w:bookmarkStart w:id="39" w:name="_Toc232545027"/>
+      <w:bookmarkStart w:id="39" w:name="_Toc232546340"/>
       <w:r>
         <w:t>REGISTRO</w:t>
       </w:r>
@@ -11281,7 +12182,7 @@
       <w:pPr>
         <w:pStyle w:val="Ttulo2"/>
       </w:pPr>
-      <w:bookmarkStart w:id="40" w:name="_Toc232545028"/>
+      <w:bookmarkStart w:id="40" w:name="_Toc232546341"/>
       <w:r>
         <w:t>Matriz de Riesgos Inicial</w:t>
       </w:r>
@@ -12180,7 +13081,7 @@
       <w:pPr>
         <w:pStyle w:val="Ttulo2"/>
       </w:pPr>
-      <w:bookmarkStart w:id="41" w:name="_Toc232545029"/>
+      <w:bookmarkStart w:id="41" w:name="_Toc232546342"/>
       <w:r>
         <w:t>E</w:t>
       </w:r>
@@ -12371,7 +13272,7 @@
       <w:pPr>
         <w:pStyle w:val="Ttulo1"/>
       </w:pPr>
-      <w:bookmarkStart w:id="42" w:name="_Toc232545030"/>
+      <w:bookmarkStart w:id="42" w:name="_Toc232546343"/>
       <w:r>
         <w:t>SOLICITUD</w:t>
       </w:r>
@@ -12458,7 +13359,23 @@
           <w:rFonts w:ascii="Arial" w:hAnsi="Arial" w:cs="Arial"/>
           <w:lang w:val="es-ES"/>
         </w:rPr>
-        <w:t xml:space="preserve"> Semana 10 (Junio de 2026)</w:t>
+        <w:t xml:space="preserve"> Semana 10 (</w:t>
+      </w:r>
+      <w:proofErr w:type="gramStart"/>
+      <w:r>
+        <w:rPr>
+          <w:rFonts w:ascii="Arial" w:hAnsi="Arial" w:cs="Arial"/>
+          <w:lang w:val="es-ES"/>
+        </w:rPr>
+        <w:t>Junio</w:t>
+      </w:r>
+      <w:proofErr w:type="gramEnd"/>
+      <w:r>
+        <w:rPr>
+          <w:rFonts w:ascii="Arial" w:hAnsi="Arial" w:cs="Arial"/>
+          <w:lang w:val="es-ES"/>
+        </w:rPr>
+        <w:t xml:space="preserve"> de 2026)</w:t>
       </w:r>
     </w:p>
     <w:p>
@@ -12529,7 +13446,7 @@
       <w:pPr>
         <w:pStyle w:val="Ttulo2"/>
       </w:pPr>
-      <w:bookmarkStart w:id="43" w:name="_Toc232545031"/>
+      <w:bookmarkStart w:id="43" w:name="_Toc232546344"/>
       <w:r>
         <w:lastRenderedPageBreak/>
         <w:t>Descripción del Cambio Solicitado</w:t>
@@ -12556,7 +13473,7 @@
       <w:pPr>
         <w:pStyle w:val="Ttulo2"/>
       </w:pPr>
-      <w:bookmarkStart w:id="44" w:name="_Toc232545032"/>
+      <w:bookmarkStart w:id="44" w:name="_Toc232546345"/>
       <w:r>
         <w:t>Justificación del Cambio</w:t>
       </w:r>
@@ -12582,7 +13499,7 @@
       <w:pPr>
         <w:pStyle w:val="Ttulo2"/>
       </w:pPr>
-      <w:bookmarkStart w:id="45" w:name="_Toc232545033"/>
+      <w:bookmarkStart w:id="45" w:name="_Toc232546346"/>
       <w:r>
         <w:t>Evaluación de Impacto (Análisis del Project Manager)</w:t>
       </w:r>
@@ -12803,7 +13720,7 @@
       <w:pPr>
         <w:pStyle w:val="Ttulo2"/>
       </w:pPr>
-      <w:bookmarkStart w:id="46" w:name="_Toc232545034"/>
+      <w:bookmarkStart w:id="46" w:name="_Toc232546347"/>
       <w:r>
         <w:t>Proceso Formal de Gestión y Resolución Sugerida</w:t>
       </w:r>
@@ -13052,7 +13969,7 @@
       <w:pPr>
         <w:pStyle w:val="Ttulo2"/>
       </w:pPr>
-      <w:bookmarkStart w:id="47" w:name="_Toc232545035"/>
+      <w:bookmarkStart w:id="47" w:name="_Toc232546348"/>
       <w:r>
         <w:t>Roles Involucrados en la Decisión</w:t>
       </w:r>
@@ -13101,7 +14018,7 @@
       <w:pPr>
         <w:pStyle w:val="Ttulo1"/>
       </w:pPr>
-      <w:bookmarkStart w:id="48" w:name="_Toc232545036"/>
+      <w:bookmarkStart w:id="48" w:name="_Toc232546349"/>
       <w:r>
         <w:t>REGISTRO DE RIESGOS ACTUALIZADO</w:t>
       </w:r>
@@ -13129,7 +14046,21 @@
         <w:rPr>
           <w:lang w:val="es-ES"/>
         </w:rPr>
-        <w:t xml:space="preserve"> Semana 10 (Junio de 2026)</w:t>
+        <w:t xml:space="preserve"> Semana 10 (</w:t>
+      </w:r>
+      <w:proofErr w:type="gramStart"/>
+      <w:r>
+        <w:rPr>
+          <w:lang w:val="es-ES"/>
+        </w:rPr>
+        <w:t>Junio</w:t>
+      </w:r>
+      <w:proofErr w:type="gramEnd"/>
+      <w:r>
+        <w:rPr>
+          <w:lang w:val="es-ES"/>
+        </w:rPr>
+        <w:t xml:space="preserve"> de 2026)</w:t>
       </w:r>
     </w:p>
     <w:p>
@@ -13172,7 +14103,7 @@
       <w:pPr>
         <w:pStyle w:val="Ttulo2"/>
       </w:pPr>
-      <w:bookmarkStart w:id="49" w:name="_Toc232545037"/>
+      <w:bookmarkStart w:id="49" w:name="_Toc232546350"/>
       <w:r>
         <w:t>Modificación del Estado de Riesgos</w:t>
       </w:r>
@@ -13735,7 +14666,7 @@
       <w:pPr>
         <w:pStyle w:val="Ttulo2"/>
       </w:pPr>
-      <w:bookmarkStart w:id="50" w:name="_Toc232545038"/>
+      <w:bookmarkStart w:id="50" w:name="_Toc232546351"/>
       <w:r>
         <w:t>Conclusión del Análisis de Riesgos Actualizado</w:t>
       </w:r>
@@ -13780,7 +14711,7 @@
       <w:pPr>
         <w:pStyle w:val="Ttulo1"/>
       </w:pPr>
-      <w:bookmarkStart w:id="51" w:name="_Toc232545039"/>
+      <w:bookmarkStart w:id="51" w:name="_Toc232546352"/>
       <w:r>
         <w:t>REGISTRO DE INCIDENCIAS</w:t>
       </w:r>
@@ -13816,7 +14747,7 @@
       <w:pPr>
         <w:pStyle w:val="Ttulo2"/>
       </w:pPr>
-      <w:bookmarkStart w:id="52" w:name="_Toc232545040"/>
+      <w:bookmarkStart w:id="52" w:name="_Toc232546353"/>
       <w:r>
         <w:t>Registro de Incidencias Activas y Resueltas</w:t>
       </w:r>
@@ -14317,6 +15248,7 @@
       <w:pPr>
         <w:pStyle w:val="Ttulo1"/>
       </w:pPr>
+      <w:bookmarkStart w:id="53" w:name="_Toc232546354"/>
       <w:r>
         <w:t>INFORME</w:t>
       </w:r>
@@ -14353,6 +15285,7 @@
       <w:r>
         <w:t xml:space="preserve"> (Dirección de Ingresos)</w:t>
       </w:r>
+      <w:bookmarkEnd w:id="53"/>
     </w:p>
     <w:p>
       <w:pPr>
@@ -14430,9 +15363,11 @@
       <w:pPr>
         <w:pStyle w:val="Ttulo2"/>
       </w:pPr>
+      <w:bookmarkStart w:id="54" w:name="_Toc232546355"/>
       <w:r>
         <w:t>Resumen Ejecutivo de Estado</w:t>
       </w:r>
+      <w:bookmarkEnd w:id="54"/>
     </w:p>
     <w:p>
       <w:pPr>
@@ -14454,9 +15389,11 @@
       <w:pPr>
         <w:pStyle w:val="Ttulo2"/>
       </w:pPr>
+      <w:bookmarkStart w:id="55" w:name="_Toc232546356"/>
       <w:r>
         <w:t>Estado de Avance de las Líneas Base</w:t>
       </w:r>
+      <w:bookmarkEnd w:id="55"/>
     </w:p>
     <w:p>
       <w:pPr>
@@ -14546,10 +15483,12 @@
       <w:pPr>
         <w:pStyle w:val="Ttulo2"/>
       </w:pPr>
+      <w:bookmarkStart w:id="56" w:name="_Toc232546357"/>
       <w:r>
         <w:lastRenderedPageBreak/>
         <w:t>Hitos y Actividades de la Semana</w:t>
       </w:r>
+      <w:bookmarkEnd w:id="56"/>
     </w:p>
     <w:p>
       <w:pPr>
@@ -14709,9 +15648,11 @@
       <w:pPr>
         <w:pStyle w:val="Ttulo2"/>
       </w:pPr>
+      <w:bookmarkStart w:id="57" w:name="_Toc232546358"/>
       <w:r>
         <w:t>Alertas y Puntos de Decisión para la Dirección de Ingresos</w:t>
       </w:r>
+      <w:bookmarkEnd w:id="57"/>
     </w:p>
     <w:p>
       <w:pPr>
@@ -14773,6 +15714,1552 @@
           <w:lang w:val="es-ES"/>
         </w:rPr>
         <w:t xml:space="preserve"> Se informa que el equipo se encuentra estabilizado gracias al uso de las reservas de contingencia previstas en el plan original. No se requiere financiamiento adicional por parte de la Alcaldía.</w:t>
+      </w:r>
+    </w:p>
+    <w:p>
+      <w:pPr>
+        <w:rPr>
+          <w:lang w:val="es-ES"/>
+        </w:rPr>
+      </w:pPr>
+    </w:p>
+    <w:p>
+      <w:pPr>
+        <w:pStyle w:val="Ttulo1"/>
+      </w:pPr>
+      <w:bookmarkStart w:id="58" w:name="_Toc232546359"/>
+      <w:r>
+        <w:t>TABLERO</w:t>
+      </w:r>
+      <w:r>
+        <w:t xml:space="preserve"> </w:t>
+      </w:r>
+      <w:r>
+        <w:t>DE</w:t>
+      </w:r>
+      <w:r>
+        <w:t xml:space="preserve"> S</w:t>
+      </w:r>
+      <w:r>
+        <w:t>EQUIMIENTO</w:t>
+      </w:r>
+      <w:r>
+        <w:t xml:space="preserve"> </w:t>
+      </w:r>
+      <w:r>
+        <w:t>Y</w:t>
+      </w:r>
+      <w:r>
+        <w:t xml:space="preserve"> </w:t>
+      </w:r>
+      <w:proofErr w:type="spellStart"/>
+      <w:r>
+        <w:t>KPIs</w:t>
+      </w:r>
+      <w:proofErr w:type="spellEnd"/>
+      <w:r>
+        <w:t xml:space="preserve"> </w:t>
+      </w:r>
+      <w:r>
+        <w:t>DEL</w:t>
+      </w:r>
+      <w:r>
+        <w:t xml:space="preserve"> P</w:t>
+      </w:r>
+      <w:r>
+        <w:t>ROYECTO</w:t>
+      </w:r>
+      <w:bookmarkEnd w:id="58"/>
+    </w:p>
+    <w:p>
+      <w:pPr>
+        <w:rPr>
+          <w:lang w:val="es-ES"/>
+        </w:rPr>
+      </w:pPr>
+      <w:r>
+        <w:rPr>
+          <w:lang w:val="es-ES"/>
+        </w:rPr>
+        <w:t>Este tablero centraliza los Indicadores Clave de Rendimiento (</w:t>
+      </w:r>
+      <w:proofErr w:type="spellStart"/>
+      <w:r>
+        <w:rPr>
+          <w:lang w:val="es-ES"/>
+        </w:rPr>
+        <w:t>KPIs</w:t>
+      </w:r>
+      <w:proofErr w:type="spellEnd"/>
+      <w:r>
+        <w:rPr>
+          <w:lang w:val="es-ES"/>
+        </w:rPr>
+        <w:t xml:space="preserve">) utilizados por el </w:t>
+      </w:r>
+      <w:proofErr w:type="gramStart"/>
+      <w:r>
+        <w:rPr>
+          <w:lang w:val="es-ES"/>
+        </w:rPr>
+        <w:t>Jefe</w:t>
+      </w:r>
+      <w:proofErr w:type="gramEnd"/>
+      <w:r>
+        <w:rPr>
+          <w:lang w:val="es-ES"/>
+        </w:rPr>
+        <w:t xml:space="preserve"> de Proyecto para monitorear la salud técnica, financiera y operativa del desarrollo en la Semana 10.</w:t>
+      </w:r>
+    </w:p>
+    <w:p>
+      <w:pPr>
+        <w:pStyle w:val="Ttulo2"/>
+      </w:pPr>
+      <w:bookmarkStart w:id="59" w:name="_Toc232546360"/>
+      <w:proofErr w:type="spellStart"/>
+      <w:r>
+        <w:t>KPIs</w:t>
+      </w:r>
+      <w:proofErr w:type="spellEnd"/>
+      <w:r>
+        <w:t xml:space="preserve"> Financieros y de Cronograma (Gestión del Valor Ganado - EVM)</w:t>
+      </w:r>
+      <w:bookmarkEnd w:id="59"/>
+    </w:p>
+    <w:p>
+      <w:pPr>
+        <w:ind w:left="708"/>
+        <w:rPr>
+          <w:lang w:val="es-ES"/>
+        </w:rPr>
+      </w:pPr>
+      <w:r>
+        <w:rPr>
+          <w:lang w:val="es-ES"/>
+        </w:rPr>
+        <w:t xml:space="preserve">Para rendir cuentas de manera exacta a la Dirección de Ingresos de la Alcaldía de Sucre sobre los </w:t>
+      </w:r>
+      <w:r>
+        <w:rPr>
+          <w:b/>
+          <w:bCs/>
+          <w:lang w:val="es-ES"/>
+        </w:rPr>
+        <w:t>70,000 Bs</w:t>
+      </w:r>
+      <w:r>
+        <w:rPr>
+          <w:lang w:val="es-ES"/>
+        </w:rPr>
+        <w:t>, se calculan los siguientes índices cuantitativos:</w:t>
+      </w:r>
+    </w:p>
+    <w:tbl>
+      <w:tblPr>
+        <w:tblStyle w:val="Tablaconcuadrcula"/>
+        <w:tblW w:w="0" w:type="auto"/>
+        <w:tblLook w:val="04A0" w:firstRow="1" w:lastRow="0" w:firstColumn="1" w:lastColumn="0" w:noHBand="0" w:noVBand="1"/>
+      </w:tblPr>
+      <w:tblGrid>
+        <w:gridCol w:w="1833"/>
+        <w:gridCol w:w="1946"/>
+        <w:gridCol w:w="954"/>
+        <w:gridCol w:w="3752"/>
+        <w:gridCol w:w="865"/>
+      </w:tblGrid>
+      <w:tr>
+        <w:tc>
+          <w:tcPr>
+            <w:tcW w:w="0" w:type="auto"/>
+            <w:hideMark/>
+          </w:tcPr>
+          <w:p>
+            <w:pPr>
+              <w:spacing w:after="160" w:line="259" w:lineRule="auto"/>
+              <w:rPr>
+                <w:b/>
+                <w:bCs/>
+                <w:lang w:val="es-ES"/>
+              </w:rPr>
+            </w:pPr>
+            <w:r>
+              <w:rPr>
+                <w:b/>
+                <w:bCs/>
+                <w:lang w:val="es-ES"/>
+              </w:rPr>
+              <w:t>Métrica</w:t>
+            </w:r>
+          </w:p>
+        </w:tc>
+        <w:tc>
+          <w:tcPr>
+            <w:tcW w:w="0" w:type="auto"/>
+            <w:hideMark/>
+          </w:tcPr>
+          <w:p>
+            <w:pPr>
+              <w:spacing w:after="160" w:line="259" w:lineRule="auto"/>
+              <w:rPr>
+                <w:b/>
+                <w:bCs/>
+                <w:lang w:val="es-ES"/>
+              </w:rPr>
+            </w:pPr>
+            <w:r>
+              <w:rPr>
+                <w:b/>
+                <w:bCs/>
+                <w:lang w:val="es-ES"/>
+              </w:rPr>
+              <w:t>Nombre Técnico</w:t>
+            </w:r>
+          </w:p>
+        </w:tc>
+        <w:tc>
+          <w:tcPr>
+            <w:tcW w:w="0" w:type="auto"/>
+            <w:hideMark/>
+          </w:tcPr>
+          <w:p>
+            <w:pPr>
+              <w:spacing w:after="160" w:line="259" w:lineRule="auto"/>
+              <w:rPr>
+                <w:b/>
+                <w:bCs/>
+                <w:lang w:val="es-ES"/>
+              </w:rPr>
+            </w:pPr>
+            <w:r>
+              <w:rPr>
+                <w:b/>
+                <w:bCs/>
+                <w:lang w:val="es-ES"/>
+              </w:rPr>
+              <w:t>Valor Actual</w:t>
+            </w:r>
+          </w:p>
+        </w:tc>
+        <w:tc>
+          <w:tcPr>
+            <w:tcW w:w="0" w:type="auto"/>
+            <w:hideMark/>
+          </w:tcPr>
+          <w:p>
+            <w:pPr>
+              <w:spacing w:after="160" w:line="259" w:lineRule="auto"/>
+              <w:rPr>
+                <w:b/>
+                <w:bCs/>
+                <w:lang w:val="es-ES"/>
+              </w:rPr>
+            </w:pPr>
+            <w:r>
+              <w:rPr>
+                <w:b/>
+                <w:bCs/>
+                <w:lang w:val="es-ES"/>
+              </w:rPr>
+              <w:t>Interpretación Técnica</w:t>
+            </w:r>
+          </w:p>
+        </w:tc>
+        <w:tc>
+          <w:tcPr>
+            <w:tcW w:w="0" w:type="auto"/>
+            <w:hideMark/>
+          </w:tcPr>
+          <w:p>
+            <w:pPr>
+              <w:spacing w:after="160" w:line="259" w:lineRule="auto"/>
+              <w:rPr>
+                <w:b/>
+                <w:bCs/>
+                <w:lang w:val="es-ES"/>
+              </w:rPr>
+            </w:pPr>
+            <w:r>
+              <w:rPr>
+                <w:b/>
+                <w:bCs/>
+                <w:lang w:val="es-ES"/>
+              </w:rPr>
+              <w:t>Status</w:t>
+            </w:r>
+          </w:p>
+        </w:tc>
+      </w:tr>
+      <w:tr>
+        <w:tc>
+          <w:tcPr>
+            <w:tcW w:w="0" w:type="auto"/>
+            <w:hideMark/>
+          </w:tcPr>
+          <w:p>
+            <w:pPr>
+              <w:spacing w:after="160" w:line="259" w:lineRule="auto"/>
+              <w:rPr>
+                <w:lang w:val="es-ES"/>
+              </w:rPr>
+            </w:pPr>
+            <w:r>
+              <w:rPr>
+                <w:b/>
+                <w:bCs/>
+                <w:lang w:val="es-ES"/>
+              </w:rPr>
+              <w:t>PV</w:t>
+            </w:r>
+            <w:r>
+              <w:rPr>
+                <w:lang w:val="es-ES"/>
+              </w:rPr>
+              <w:t xml:space="preserve"> (</w:t>
+            </w:r>
+            <w:proofErr w:type="spellStart"/>
+            <w:r>
+              <w:rPr>
+                <w:lang w:val="es-ES"/>
+              </w:rPr>
+              <w:t>Planned</w:t>
+            </w:r>
+            <w:proofErr w:type="spellEnd"/>
+            <w:r>
+              <w:rPr>
+                <w:lang w:val="es-ES"/>
+              </w:rPr>
+              <w:t xml:space="preserve"> </w:t>
+            </w:r>
+            <w:proofErr w:type="spellStart"/>
+            <w:r>
+              <w:rPr>
+                <w:lang w:val="es-ES"/>
+              </w:rPr>
+              <w:t>Value</w:t>
+            </w:r>
+            <w:proofErr w:type="spellEnd"/>
+            <w:r>
+              <w:rPr>
+                <w:lang w:val="es-ES"/>
+              </w:rPr>
+              <w:t>)</w:t>
+            </w:r>
+          </w:p>
+        </w:tc>
+        <w:tc>
+          <w:tcPr>
+            <w:tcW w:w="0" w:type="auto"/>
+            <w:hideMark/>
+          </w:tcPr>
+          <w:p>
+            <w:pPr>
+              <w:spacing w:after="160" w:line="259" w:lineRule="auto"/>
+              <w:rPr>
+                <w:lang w:val="es-ES"/>
+              </w:rPr>
+            </w:pPr>
+            <w:r>
+              <w:rPr>
+                <w:lang w:val="es-ES"/>
+              </w:rPr>
+              <w:t>Valor Planificado</w:t>
+            </w:r>
+          </w:p>
+        </w:tc>
+        <w:tc>
+          <w:tcPr>
+            <w:tcW w:w="0" w:type="auto"/>
+            <w:hideMark/>
+          </w:tcPr>
+          <w:p>
+            <w:pPr>
+              <w:spacing w:after="160" w:line="259" w:lineRule="auto"/>
+              <w:rPr>
+                <w:lang w:val="es-ES"/>
+              </w:rPr>
+            </w:pPr>
+            <w:r>
+              <w:rPr>
+                <w:lang w:val="es-ES"/>
+              </w:rPr>
+              <w:t>29,400 Bs</w:t>
+            </w:r>
+          </w:p>
+        </w:tc>
+        <w:tc>
+          <w:tcPr>
+            <w:tcW w:w="0" w:type="auto"/>
+            <w:hideMark/>
+          </w:tcPr>
+          <w:p>
+            <w:pPr>
+              <w:spacing w:after="160" w:line="259" w:lineRule="auto"/>
+              <w:rPr>
+                <w:lang w:val="es-ES"/>
+              </w:rPr>
+            </w:pPr>
+            <w:r>
+              <w:rPr>
+                <w:lang w:val="es-ES"/>
+              </w:rPr>
+              <w:t>Presupuesto que se debió haber invertido hasta la semana 10 según el plan.</w:t>
+            </w:r>
+          </w:p>
+        </w:tc>
+        <w:tc>
+          <w:tcPr>
+            <w:tcW w:w="0" w:type="auto"/>
+            <w:hideMark/>
+          </w:tcPr>
+          <w:p>
+            <w:pPr>
+              <w:spacing w:after="160" w:line="259" w:lineRule="auto"/>
+              <w:rPr>
+                <w:lang w:val="es-ES"/>
+              </w:rPr>
+            </w:pPr>
+            <w:r>
+              <w:rPr>
+                <w:lang w:val="es-ES"/>
+              </w:rPr>
+              <w:t>-</w:t>
+            </w:r>
+          </w:p>
+        </w:tc>
+      </w:tr>
+      <w:tr>
+        <w:tc>
+          <w:tcPr>
+            <w:tcW w:w="0" w:type="auto"/>
+            <w:hideMark/>
+          </w:tcPr>
+          <w:p>
+            <w:pPr>
+              <w:spacing w:after="160" w:line="259" w:lineRule="auto"/>
+              <w:rPr>
+                <w:lang w:val="es-ES"/>
+              </w:rPr>
+            </w:pPr>
+            <w:r>
+              <w:rPr>
+                <w:b/>
+                <w:bCs/>
+                <w:lang w:val="es-ES"/>
+              </w:rPr>
+              <w:lastRenderedPageBreak/>
+              <w:t>EV</w:t>
+            </w:r>
+            <w:r>
+              <w:rPr>
+                <w:lang w:val="es-ES"/>
+              </w:rPr>
+              <w:t xml:space="preserve"> (</w:t>
+            </w:r>
+            <w:proofErr w:type="spellStart"/>
+            <w:r>
+              <w:rPr>
+                <w:lang w:val="es-ES"/>
+              </w:rPr>
+              <w:t>Earned</w:t>
+            </w:r>
+            <w:proofErr w:type="spellEnd"/>
+            <w:r>
+              <w:rPr>
+                <w:lang w:val="es-ES"/>
+              </w:rPr>
+              <w:t xml:space="preserve"> </w:t>
+            </w:r>
+            <w:proofErr w:type="spellStart"/>
+            <w:r>
+              <w:rPr>
+                <w:lang w:val="es-ES"/>
+              </w:rPr>
+              <w:t>Value</w:t>
+            </w:r>
+            <w:proofErr w:type="spellEnd"/>
+            <w:r>
+              <w:rPr>
+                <w:lang w:val="es-ES"/>
+              </w:rPr>
+              <w:t>)</w:t>
+            </w:r>
+          </w:p>
+        </w:tc>
+        <w:tc>
+          <w:tcPr>
+            <w:tcW w:w="0" w:type="auto"/>
+            <w:hideMark/>
+          </w:tcPr>
+          <w:p>
+            <w:pPr>
+              <w:spacing w:after="160" w:line="259" w:lineRule="auto"/>
+              <w:rPr>
+                <w:lang w:val="es-ES"/>
+              </w:rPr>
+            </w:pPr>
+            <w:r>
+              <w:rPr>
+                <w:lang w:val="es-ES"/>
+              </w:rPr>
+              <w:t>Valor Ganado</w:t>
+            </w:r>
+          </w:p>
+        </w:tc>
+        <w:tc>
+          <w:tcPr>
+            <w:tcW w:w="0" w:type="auto"/>
+            <w:hideMark/>
+          </w:tcPr>
+          <w:p>
+            <w:pPr>
+              <w:spacing w:after="160" w:line="259" w:lineRule="auto"/>
+              <w:rPr>
+                <w:lang w:val="es-ES"/>
+              </w:rPr>
+            </w:pPr>
+            <w:r>
+              <w:rPr>
+                <w:lang w:val="es-ES"/>
+              </w:rPr>
+              <w:t>27,300 Bs</w:t>
+            </w:r>
+          </w:p>
+        </w:tc>
+        <w:tc>
+          <w:tcPr>
+            <w:tcW w:w="0" w:type="auto"/>
+            <w:hideMark/>
+          </w:tcPr>
+          <w:p>
+            <w:pPr>
+              <w:spacing w:after="160" w:line="259" w:lineRule="auto"/>
+              <w:rPr>
+                <w:lang w:val="es-ES"/>
+              </w:rPr>
+            </w:pPr>
+            <w:r>
+              <w:rPr>
+                <w:lang w:val="es-ES"/>
+              </w:rPr>
+              <w:t>Valor real del software desarrollado hasta el momento (39% de avance del MVP).</w:t>
+            </w:r>
+          </w:p>
+        </w:tc>
+        <w:tc>
+          <w:tcPr>
+            <w:tcW w:w="0" w:type="auto"/>
+            <w:hideMark/>
+          </w:tcPr>
+          <w:p>
+            <w:pPr>
+              <w:spacing w:after="160" w:line="259" w:lineRule="auto"/>
+              <w:rPr>
+                <w:lang w:val="es-ES"/>
+              </w:rPr>
+            </w:pPr>
+            <w:r>
+              <w:rPr>
+                <w:lang w:val="es-ES"/>
+              </w:rPr>
+              <w:t>-</w:t>
+            </w:r>
+          </w:p>
+        </w:tc>
+      </w:tr>
+      <w:tr>
+        <w:tc>
+          <w:tcPr>
+            <w:tcW w:w="0" w:type="auto"/>
+            <w:hideMark/>
+          </w:tcPr>
+          <w:p>
+            <w:pPr>
+              <w:spacing w:after="160" w:line="259" w:lineRule="auto"/>
+              <w:rPr>
+                <w:lang w:val="es-ES"/>
+              </w:rPr>
+            </w:pPr>
+            <w:r>
+              <w:rPr>
+                <w:b/>
+                <w:bCs/>
+                <w:lang w:val="es-ES"/>
+              </w:rPr>
+              <w:t>AC</w:t>
+            </w:r>
+            <w:r>
+              <w:rPr>
+                <w:lang w:val="es-ES"/>
+              </w:rPr>
+              <w:t xml:space="preserve"> (Actual </w:t>
+            </w:r>
+            <w:proofErr w:type="spellStart"/>
+            <w:r>
+              <w:rPr>
+                <w:lang w:val="es-ES"/>
+              </w:rPr>
+              <w:t>Cost</w:t>
+            </w:r>
+            <w:proofErr w:type="spellEnd"/>
+            <w:r>
+              <w:rPr>
+                <w:lang w:val="es-ES"/>
+              </w:rPr>
+              <w:t>)</w:t>
+            </w:r>
+          </w:p>
+        </w:tc>
+        <w:tc>
+          <w:tcPr>
+            <w:tcW w:w="0" w:type="auto"/>
+            <w:hideMark/>
+          </w:tcPr>
+          <w:p>
+            <w:pPr>
+              <w:spacing w:after="160" w:line="259" w:lineRule="auto"/>
+              <w:rPr>
+                <w:lang w:val="es-ES"/>
+              </w:rPr>
+            </w:pPr>
+            <w:r>
+              <w:rPr>
+                <w:lang w:val="es-ES"/>
+              </w:rPr>
+              <w:t>Costo Real</w:t>
+            </w:r>
+          </w:p>
+        </w:tc>
+        <w:tc>
+          <w:tcPr>
+            <w:tcW w:w="0" w:type="auto"/>
+            <w:hideMark/>
+          </w:tcPr>
+          <w:p>
+            <w:pPr>
+              <w:spacing w:after="160" w:line="259" w:lineRule="auto"/>
+              <w:rPr>
+                <w:lang w:val="es-ES"/>
+              </w:rPr>
+            </w:pPr>
+            <w:r>
+              <w:rPr>
+                <w:lang w:val="es-ES"/>
+              </w:rPr>
+              <w:t>28,500 Bs</w:t>
+            </w:r>
+          </w:p>
+        </w:tc>
+        <w:tc>
+          <w:tcPr>
+            <w:tcW w:w="0" w:type="auto"/>
+            <w:hideMark/>
+          </w:tcPr>
+          <w:p>
+            <w:pPr>
+              <w:spacing w:after="160" w:line="259" w:lineRule="auto"/>
+              <w:rPr>
+                <w:lang w:val="es-ES"/>
+              </w:rPr>
+            </w:pPr>
+            <w:r>
+              <w:rPr>
+                <w:lang w:val="es-ES"/>
+              </w:rPr>
+              <w:t>Lo gastado en total (incluye planilla y el inicio de la contingencia).</w:t>
+            </w:r>
+          </w:p>
+        </w:tc>
+        <w:tc>
+          <w:tcPr>
+            <w:tcW w:w="0" w:type="auto"/>
+            <w:hideMark/>
+          </w:tcPr>
+          <w:p>
+            <w:pPr>
+              <w:spacing w:after="160" w:line="259" w:lineRule="auto"/>
+              <w:rPr>
+                <w:lang w:val="es-ES"/>
+              </w:rPr>
+            </w:pPr>
+            <w:r>
+              <w:rPr>
+                <w:lang w:val="es-ES"/>
+              </w:rPr>
+              <w:t>-</w:t>
+            </w:r>
+          </w:p>
+        </w:tc>
+      </w:tr>
+      <w:tr>
+        <w:tc>
+          <w:tcPr>
+            <w:tcW w:w="0" w:type="auto"/>
+            <w:hideMark/>
+          </w:tcPr>
+          <w:p>
+            <w:pPr>
+              <w:spacing w:after="160" w:line="259" w:lineRule="auto"/>
+              <w:rPr>
+                <w:lang w:val="es-ES"/>
+              </w:rPr>
+            </w:pPr>
+            <w:r>
+              <w:rPr>
+                <w:b/>
+                <w:bCs/>
+                <w:lang w:val="es-ES"/>
+              </w:rPr>
+              <w:t>SPI</w:t>
+            </w:r>
+            <w:r>
+              <w:rPr>
+                <w:lang w:val="es-ES"/>
+              </w:rPr>
+              <w:t xml:space="preserve"> (Schedule Performance </w:t>
+            </w:r>
+            <w:proofErr w:type="spellStart"/>
+            <w:r>
+              <w:rPr>
+                <w:lang w:val="es-ES"/>
+              </w:rPr>
+              <w:t>Index</w:t>
+            </w:r>
+            <w:proofErr w:type="spellEnd"/>
+            <w:r>
+              <w:rPr>
+                <w:lang w:val="es-ES"/>
+              </w:rPr>
+              <w:t>)</w:t>
+            </w:r>
+          </w:p>
+        </w:tc>
+        <w:tc>
+          <w:tcPr>
+            <w:tcW w:w="0" w:type="auto"/>
+            <w:hideMark/>
+          </w:tcPr>
+          <w:p>
+            <w:pPr>
+              <w:spacing w:after="160" w:line="259" w:lineRule="auto"/>
+              <w:rPr>
+                <w:lang w:val="es-ES"/>
+              </w:rPr>
+            </w:pPr>
+            <w:r>
+              <w:rPr>
+                <w:lang w:val="es-ES"/>
+              </w:rPr>
+              <w:t>Índice de Rendimiento del Cronograma</w:t>
+            </w:r>
+          </w:p>
+        </w:tc>
+        <w:tc>
+          <w:tcPr>
+            <w:tcW w:w="0" w:type="auto"/>
+            <w:hideMark/>
+          </w:tcPr>
+          <w:p>
+            <w:pPr>
+              <w:spacing w:after="160" w:line="259" w:lineRule="auto"/>
+              <w:rPr>
+                <w:lang w:val="es-ES"/>
+              </w:rPr>
+            </w:pPr>
+            <w:r>
+              <w:rPr>
+                <w:b/>
+                <w:bCs/>
+                <w:lang w:val="es-ES"/>
+              </w:rPr>
+              <w:t>0.93</w:t>
+            </w:r>
+          </w:p>
+        </w:tc>
+        <w:tc>
+          <w:tcPr>
+            <w:tcW w:w="0" w:type="auto"/>
+            <w:hideMark/>
+          </w:tcPr>
+          <w:p>
+            <w:pPr>
+              <w:spacing w:after="160" w:line="259" w:lineRule="auto"/>
+              <w:rPr>
+                <w:lang w:val="es-ES"/>
+              </w:rPr>
+            </w:pPr>
+            <w:r>
+              <w:rPr>
+                <w:lang w:val="es-ES"/>
+              </w:rPr>
+              <w:t>$SPI = \</w:t>
+            </w:r>
+            <w:proofErr w:type="gramStart"/>
+            <w:r>
+              <w:rPr>
+                <w:lang w:val="es-ES"/>
+              </w:rPr>
+              <w:t>frac{</w:t>
+            </w:r>
+            <w:proofErr w:type="gramEnd"/>
+            <w:r>
+              <w:rPr>
+                <w:lang w:val="es-ES"/>
+              </w:rPr>
+              <w:t>EV}{PV}$. Al ser menor a 1.0, indica un ligero retraso del 7% debido a las renuncias.</w:t>
+            </w:r>
+          </w:p>
+        </w:tc>
+        <w:tc>
+          <w:tcPr>
+            <w:tcW w:w="0" w:type="auto"/>
+            <w:hideMark/>
+          </w:tcPr>
+          <w:p>
+            <w:pPr>
+              <w:spacing w:after="160" w:line="259" w:lineRule="auto"/>
+              <w:rPr>
+                <w:lang w:val="es-ES"/>
+              </w:rPr>
+            </w:pPr>
+            <w:r>
+              <w:rPr>
+                <w:lang w:val="es-ES"/>
+              </w:rPr>
+              <w:t>Alerta</w:t>
+            </w:r>
+          </w:p>
+        </w:tc>
+      </w:tr>
+      <w:tr>
+        <w:tc>
+          <w:tcPr>
+            <w:tcW w:w="0" w:type="auto"/>
+            <w:hideMark/>
+          </w:tcPr>
+          <w:p>
+            <w:pPr>
+              <w:spacing w:after="160" w:line="259" w:lineRule="auto"/>
+              <w:rPr>
+                <w:lang w:val="es-ES"/>
+              </w:rPr>
+            </w:pPr>
+            <w:r>
+              <w:rPr>
+                <w:b/>
+                <w:bCs/>
+                <w:lang w:val="es-ES"/>
+              </w:rPr>
+              <w:t>CPI</w:t>
+            </w:r>
+            <w:r>
+              <w:rPr>
+                <w:lang w:val="es-ES"/>
+              </w:rPr>
+              <w:t xml:space="preserve"> (</w:t>
+            </w:r>
+            <w:proofErr w:type="spellStart"/>
+            <w:r>
+              <w:rPr>
+                <w:lang w:val="es-ES"/>
+              </w:rPr>
+              <w:t>Cost</w:t>
+            </w:r>
+            <w:proofErr w:type="spellEnd"/>
+            <w:r>
+              <w:rPr>
+                <w:lang w:val="es-ES"/>
+              </w:rPr>
+              <w:t xml:space="preserve"> Performance </w:t>
+            </w:r>
+            <w:proofErr w:type="spellStart"/>
+            <w:r>
+              <w:rPr>
+                <w:lang w:val="es-ES"/>
+              </w:rPr>
+              <w:t>Index</w:t>
+            </w:r>
+            <w:proofErr w:type="spellEnd"/>
+            <w:r>
+              <w:rPr>
+                <w:lang w:val="es-ES"/>
+              </w:rPr>
+              <w:t>)</w:t>
+            </w:r>
+          </w:p>
+        </w:tc>
+        <w:tc>
+          <w:tcPr>
+            <w:tcW w:w="0" w:type="auto"/>
+            <w:hideMark/>
+          </w:tcPr>
+          <w:p>
+            <w:pPr>
+              <w:spacing w:after="160" w:line="259" w:lineRule="auto"/>
+              <w:rPr>
+                <w:lang w:val="es-ES"/>
+              </w:rPr>
+            </w:pPr>
+            <w:r>
+              <w:rPr>
+                <w:lang w:val="es-ES"/>
+              </w:rPr>
+              <w:t>Índice de Rendimiento del Costo</w:t>
+            </w:r>
+          </w:p>
+        </w:tc>
+        <w:tc>
+          <w:tcPr>
+            <w:tcW w:w="0" w:type="auto"/>
+            <w:hideMark/>
+          </w:tcPr>
+          <w:p>
+            <w:pPr>
+              <w:spacing w:after="160" w:line="259" w:lineRule="auto"/>
+              <w:rPr>
+                <w:lang w:val="es-ES"/>
+              </w:rPr>
+            </w:pPr>
+            <w:r>
+              <w:rPr>
+                <w:b/>
+                <w:bCs/>
+                <w:lang w:val="es-ES"/>
+              </w:rPr>
+              <w:t>0.96</w:t>
+            </w:r>
+          </w:p>
+        </w:tc>
+        <w:tc>
+          <w:tcPr>
+            <w:tcW w:w="0" w:type="auto"/>
+            <w:hideMark/>
+          </w:tcPr>
+          <w:p>
+            <w:pPr>
+              <w:spacing w:after="160" w:line="259" w:lineRule="auto"/>
+              <w:rPr>
+                <w:lang w:val="es-ES"/>
+              </w:rPr>
+            </w:pPr>
+            <w:r>
+              <w:rPr>
+                <w:lang w:val="es-ES"/>
+              </w:rPr>
+              <w:t>$CPI = \</w:t>
+            </w:r>
+            <w:proofErr w:type="gramStart"/>
+            <w:r>
+              <w:rPr>
+                <w:lang w:val="es-ES"/>
+              </w:rPr>
+              <w:t>frac{</w:t>
+            </w:r>
+            <w:proofErr w:type="gramEnd"/>
+            <w:r>
+              <w:rPr>
+                <w:lang w:val="es-ES"/>
+              </w:rPr>
+              <w:t>EV}{AC}$. Al ser menor a 1.0, indica un leve sobrecosto temporal por el uso del fondo de contingencia.</w:t>
+            </w:r>
+          </w:p>
+        </w:tc>
+        <w:tc>
+          <w:tcPr>
+            <w:tcW w:w="0" w:type="auto"/>
+            <w:hideMark/>
+          </w:tcPr>
+          <w:p>
+            <w:pPr>
+              <w:spacing w:after="160" w:line="259" w:lineRule="auto"/>
+              <w:rPr>
+                <w:lang w:val="es-ES"/>
+              </w:rPr>
+            </w:pPr>
+            <w:r>
+              <w:rPr>
+                <w:lang w:val="es-ES"/>
+              </w:rPr>
+              <w:t>Estable</w:t>
+            </w:r>
+          </w:p>
+        </w:tc>
+      </w:tr>
+    </w:tbl>
+    <w:p>
+      <w:pPr>
+        <w:rPr>
+          <w:b/>
+          <w:bCs/>
+          <w:lang w:val="es-ES"/>
+        </w:rPr>
+      </w:pPr>
+    </w:p>
+    <w:p>
+      <w:pPr>
+        <w:pStyle w:val="Ttulo2"/>
+      </w:pPr>
+      <w:bookmarkStart w:id="60" w:name="_Toc232546361"/>
+      <w:proofErr w:type="spellStart"/>
+      <w:r>
+        <w:t>KPIs</w:t>
+      </w:r>
+      <w:proofErr w:type="spellEnd"/>
+      <w:r>
+        <w:t xml:space="preserve"> de Desarrollo Ágil (Rendimiento del Equipo)</w:t>
+      </w:r>
+      <w:bookmarkEnd w:id="60"/>
+    </w:p>
+    <w:p>
+      <w:pPr>
+        <w:ind w:left="708"/>
+        <w:rPr>
+          <w:lang w:val="es-ES"/>
+        </w:rPr>
+      </w:pPr>
+      <w:r>
+        <w:rPr>
+          <w:lang w:val="es-ES"/>
+        </w:rPr>
+        <w:t xml:space="preserve">Métricas utilizadas internamente en los </w:t>
+      </w:r>
+      <w:proofErr w:type="spellStart"/>
+      <w:r>
+        <w:rPr>
+          <w:lang w:val="es-ES"/>
+        </w:rPr>
+        <w:t>Sprints</w:t>
+      </w:r>
+      <w:proofErr w:type="spellEnd"/>
+      <w:r>
+        <w:rPr>
+          <w:lang w:val="es-ES"/>
+        </w:rPr>
+        <w:t xml:space="preserve"> de 2 semanas para medir la adaptación tras la baja de los 2 desarrolladores clave:</w:t>
+      </w:r>
+    </w:p>
+    <w:p>
+      <w:pPr>
+        <w:numPr>
+          <w:ilvl w:val="0"/>
+          <w:numId w:val="23"/>
+        </w:numPr>
+        <w:tabs>
+          <w:tab w:val="clear" w:pos="720"/>
+          <w:tab w:val="num" w:pos="1428"/>
+        </w:tabs>
+        <w:ind w:left="1428"/>
+        <w:rPr>
+          <w:lang w:val="es-ES"/>
+        </w:rPr>
+      </w:pPr>
+      <w:r>
+        <w:rPr>
+          <w:b/>
+          <w:bCs/>
+          <w:lang w:val="es-ES"/>
+        </w:rPr>
+        <w:t xml:space="preserve">Velocidad del Equipo (Sprint </w:t>
+      </w:r>
+      <w:proofErr w:type="spellStart"/>
+      <w:r>
+        <w:rPr>
+          <w:b/>
+          <w:bCs/>
+          <w:lang w:val="es-ES"/>
+        </w:rPr>
+        <w:t>Velocity</w:t>
+      </w:r>
+      <w:proofErr w:type="spellEnd"/>
+      <w:r>
+        <w:rPr>
+          <w:b/>
+          <w:bCs/>
+          <w:lang w:val="es-ES"/>
+        </w:rPr>
+        <w:t>):</w:t>
+      </w:r>
+    </w:p>
+    <w:p>
+      <w:pPr>
+        <w:numPr>
+          <w:ilvl w:val="1"/>
+          <w:numId w:val="23"/>
+        </w:numPr>
+        <w:tabs>
+          <w:tab w:val="clear" w:pos="1440"/>
+          <w:tab w:val="num" w:pos="2148"/>
+        </w:tabs>
+        <w:ind w:left="2148"/>
+        <w:rPr>
+          <w:lang w:val="es-ES"/>
+        </w:rPr>
+      </w:pPr>
+      <w:proofErr w:type="spellStart"/>
+      <w:r>
+        <w:rPr>
+          <w:i/>
+          <w:iCs/>
+          <w:lang w:val="es-ES"/>
+        </w:rPr>
+        <w:t>Sprints</w:t>
+      </w:r>
+      <w:proofErr w:type="spellEnd"/>
+      <w:r>
+        <w:rPr>
+          <w:i/>
+          <w:iCs/>
+          <w:lang w:val="es-ES"/>
+        </w:rPr>
+        <w:t xml:space="preserve"> 1 y 2 (Línea base con equipo completo):</w:t>
+      </w:r>
+      <w:r>
+        <w:rPr>
+          <w:lang w:val="es-ES"/>
+        </w:rPr>
+        <w:t xml:space="preserve"> 35 Puntos de Historia (SP) promedio por Sprint.</w:t>
+      </w:r>
+    </w:p>
+    <w:p>
+      <w:pPr>
+        <w:numPr>
+          <w:ilvl w:val="1"/>
+          <w:numId w:val="23"/>
+        </w:numPr>
+        <w:tabs>
+          <w:tab w:val="clear" w:pos="1440"/>
+          <w:tab w:val="num" w:pos="2148"/>
+        </w:tabs>
+        <w:ind w:left="2148"/>
+        <w:rPr>
+          <w:lang w:val="es-ES"/>
+        </w:rPr>
+      </w:pPr>
+      <w:r>
+        <w:rPr>
+          <w:i/>
+          <w:iCs/>
+          <w:lang w:val="es-ES"/>
+        </w:rPr>
+        <w:t>Sprint 3 (Semana 10 - crisis de personal):</w:t>
+      </w:r>
+      <w:r>
+        <w:rPr>
+          <w:lang w:val="es-ES"/>
+        </w:rPr>
+        <w:t xml:space="preserve"> Cayó a </w:t>
+      </w:r>
+      <w:r>
+        <w:rPr>
+          <w:b/>
+          <w:bCs/>
+          <w:lang w:val="es-ES"/>
+        </w:rPr>
+        <w:t>18 Puntos de Historia (SP)</w:t>
+      </w:r>
+      <w:r>
+        <w:rPr>
+          <w:lang w:val="es-ES"/>
+        </w:rPr>
+        <w:t>.</w:t>
+      </w:r>
+    </w:p>
+    <w:p>
+      <w:pPr>
+        <w:numPr>
+          <w:ilvl w:val="1"/>
+          <w:numId w:val="23"/>
+        </w:numPr>
+        <w:tabs>
+          <w:tab w:val="clear" w:pos="1440"/>
+          <w:tab w:val="num" w:pos="2148"/>
+        </w:tabs>
+        <w:ind w:left="2148"/>
+        <w:rPr>
+          <w:lang w:val="es-ES"/>
+        </w:rPr>
+      </w:pPr>
+      <w:r>
+        <w:rPr>
+          <w:i/>
+          <w:iCs/>
+          <w:lang w:val="es-ES"/>
+        </w:rPr>
+        <w:t>Meta de estabilización (Sprint 4):</w:t>
+      </w:r>
+      <w:r>
+        <w:rPr>
+          <w:lang w:val="es-ES"/>
+        </w:rPr>
+        <w:t xml:space="preserve"> 25 SP (con el consultor </w:t>
+      </w:r>
+      <w:proofErr w:type="spellStart"/>
+      <w:r>
+        <w:rPr>
+          <w:lang w:val="es-ES"/>
+        </w:rPr>
+        <w:t>backend</w:t>
+      </w:r>
+      <w:proofErr w:type="spellEnd"/>
+      <w:r>
+        <w:rPr>
+          <w:lang w:val="es-ES"/>
+        </w:rPr>
+        <w:t xml:space="preserve"> externo integrado).</w:t>
+      </w:r>
+    </w:p>
+    <w:p>
+      <w:pPr>
+        <w:numPr>
+          <w:ilvl w:val="0"/>
+          <w:numId w:val="23"/>
+        </w:numPr>
+        <w:tabs>
+          <w:tab w:val="clear" w:pos="720"/>
+          <w:tab w:val="num" w:pos="1428"/>
+        </w:tabs>
+        <w:ind w:left="1428"/>
+        <w:rPr>
+          <w:lang w:val="es-ES"/>
+        </w:rPr>
+      </w:pPr>
+      <w:r>
+        <w:rPr>
+          <w:b/>
+          <w:bCs/>
+          <w:lang w:val="es-ES"/>
+        </w:rPr>
+        <w:t xml:space="preserve">Cumplimiento de Compromiso del Sprint (Sprint </w:t>
+      </w:r>
+      <w:proofErr w:type="spellStart"/>
+      <w:r>
+        <w:rPr>
+          <w:b/>
+          <w:bCs/>
+          <w:lang w:val="es-ES"/>
+        </w:rPr>
+        <w:t>Burnup</w:t>
+      </w:r>
+      <w:proofErr w:type="spellEnd"/>
+      <w:r>
+        <w:rPr>
+          <w:b/>
+          <w:bCs/>
+          <w:lang w:val="es-ES"/>
+        </w:rPr>
+        <w:t>):</w:t>
+      </w:r>
+      <w:r>
+        <w:rPr>
+          <w:lang w:val="es-ES"/>
+        </w:rPr>
+        <w:t xml:space="preserve"> </w:t>
+      </w:r>
+      <w:r>
+        <w:rPr>
+          <w:b/>
+          <w:bCs/>
+          <w:lang w:val="es-ES"/>
+        </w:rPr>
+        <w:t>76%</w:t>
+      </w:r>
+      <w:r>
+        <w:rPr>
+          <w:lang w:val="es-ES"/>
+        </w:rPr>
+        <w:t xml:space="preserve"> de las historias de usuario planificadas para el Sprint 3 fueron terminadas a tiempo. El 24% restante (módulo de cobros avanzado) se movió al Sprint 4 debido a la transición técnica.</w:t>
+      </w:r>
+    </w:p>
+    <w:p>
+      <w:pPr>
+        <w:pStyle w:val="Ttulo2"/>
+      </w:pPr>
+      <w:bookmarkStart w:id="61" w:name="_Toc232546362"/>
+      <w:proofErr w:type="spellStart"/>
+      <w:r>
+        <w:t>KPIs</w:t>
+      </w:r>
+      <w:proofErr w:type="spellEnd"/>
+      <w:r>
+        <w:t xml:space="preserve"> de Calidad de Software (Aseguramiento de Calidad - QA)</w:t>
+      </w:r>
+      <w:bookmarkEnd w:id="61"/>
+    </w:p>
+    <w:p>
+      <w:pPr>
+        <w:ind w:left="708"/>
+        <w:rPr>
+          <w:lang w:val="es-ES"/>
+        </w:rPr>
+      </w:pPr>
+      <w:r>
+        <w:rPr>
+          <w:lang w:val="es-ES"/>
+        </w:rPr>
+        <w:t>Garantizan que el sistema web para los mercados Central, Campesino y Entre Ríos sea seguro y libre de fraudes fiscales antes de su entrega:</w:t>
+      </w:r>
+    </w:p>
+    <w:p>
+      <w:pPr>
+        <w:numPr>
+          <w:ilvl w:val="0"/>
+          <w:numId w:val="24"/>
+        </w:numPr>
+        <w:tabs>
+          <w:tab w:val="clear" w:pos="720"/>
+          <w:tab w:val="num" w:pos="1428"/>
+        </w:tabs>
+        <w:ind w:left="1428"/>
+        <w:rPr>
+          <w:lang w:val="es-ES"/>
+        </w:rPr>
+      </w:pPr>
+      <w:r>
+        <w:rPr>
+          <w:b/>
+          <w:bCs/>
+          <w:lang w:val="es-ES"/>
+        </w:rPr>
+        <w:t>Densidad de Defectos (Bugs Abiertos):</w:t>
+      </w:r>
+      <w:r>
+        <w:rPr>
+          <w:lang w:val="es-ES"/>
+        </w:rPr>
+        <w:t xml:space="preserve"> 4 bugs críticos detectados en pruebas internas de integración del Módulo de Registro (todos en proceso de resolución por el equipo remanente).</w:t>
+      </w:r>
+    </w:p>
+    <w:p>
+      <w:pPr>
+        <w:numPr>
+          <w:ilvl w:val="0"/>
+          <w:numId w:val="24"/>
+        </w:numPr>
+        <w:tabs>
+          <w:tab w:val="clear" w:pos="720"/>
+          <w:tab w:val="num" w:pos="1428"/>
+        </w:tabs>
+        <w:ind w:left="1428"/>
+        <w:rPr>
+          <w:lang w:val="es-ES"/>
+        </w:rPr>
+      </w:pPr>
+      <w:r>
+        <w:rPr>
+          <w:b/>
+          <w:bCs/>
+          <w:lang w:val="es-ES"/>
+        </w:rPr>
+        <w:t>Cobertura de Pruebas Unitarias (</w:t>
+      </w:r>
+      <w:proofErr w:type="spellStart"/>
+      <w:r>
+        <w:rPr>
+          <w:b/>
+          <w:bCs/>
+          <w:lang w:val="es-ES"/>
+        </w:rPr>
+        <w:t>Code</w:t>
+      </w:r>
+      <w:proofErr w:type="spellEnd"/>
+      <w:r>
+        <w:rPr>
+          <w:b/>
+          <w:bCs/>
+          <w:lang w:val="es-ES"/>
+        </w:rPr>
+        <w:t xml:space="preserve"> </w:t>
+      </w:r>
+      <w:proofErr w:type="spellStart"/>
+      <w:r>
+        <w:rPr>
+          <w:b/>
+          <w:bCs/>
+          <w:lang w:val="es-ES"/>
+        </w:rPr>
+        <w:t>Coverage</w:t>
+      </w:r>
+      <w:proofErr w:type="spellEnd"/>
+      <w:r>
+        <w:rPr>
+          <w:b/>
+          <w:bCs/>
+          <w:lang w:val="es-ES"/>
+        </w:rPr>
+        <w:t>):</w:t>
+      </w:r>
+      <w:r>
+        <w:rPr>
+          <w:lang w:val="es-ES"/>
+        </w:rPr>
+        <w:t xml:space="preserve"> </w:t>
+      </w:r>
+      <w:r>
+        <w:rPr>
+          <w:b/>
+          <w:bCs/>
+          <w:lang w:val="es-ES"/>
+        </w:rPr>
+        <w:t>78%</w:t>
+      </w:r>
+      <w:r>
+        <w:rPr>
+          <w:lang w:val="es-ES"/>
+        </w:rPr>
+        <w:t xml:space="preserve"> del código fuente cuenta con pruebas automatizadas, asegurando que el cambio en la lógica de las licencias sanitarias no rompa otras funcionalidades del sistema.</w:t>
+      </w:r>
+    </w:p>
+    <w:p>
+      <w:pPr>
+        <w:numPr>
+          <w:ilvl w:val="0"/>
+          <w:numId w:val="24"/>
+        </w:numPr>
+        <w:tabs>
+          <w:tab w:val="clear" w:pos="720"/>
+          <w:tab w:val="num" w:pos="1428"/>
+        </w:tabs>
+        <w:ind w:left="1428"/>
+        <w:rPr>
+          <w:lang w:val="es-ES"/>
+        </w:rPr>
+      </w:pPr>
+      <w:r>
+        <w:rPr>
+          <w:b/>
+          <w:bCs/>
+          <w:lang w:val="es-ES"/>
+        </w:rPr>
+        <w:t>Índice de Deuda Técnica:</w:t>
+      </w:r>
+      <w:r>
+        <w:rPr>
+          <w:lang w:val="es-ES"/>
+        </w:rPr>
+        <w:t xml:space="preserve"> 4.2% (Tiempo estimado de refactorización de código crítico dejado por los programadores salientes).</w:t>
+      </w:r>
+    </w:p>
+    <w:p>
+      <w:pPr>
+        <w:pStyle w:val="Ttulo2"/>
+      </w:pPr>
+      <w:bookmarkStart w:id="62" w:name="_Toc232546363"/>
+      <w:r>
+        <w:lastRenderedPageBreak/>
+        <w:t>Resumen Visual de Alertas Gerenciales</w:t>
+      </w:r>
+      <w:bookmarkEnd w:id="62"/>
+    </w:p>
+    <w:p>
+      <w:pPr>
+        <w:ind w:left="708"/>
+        <w:rPr>
+          <w:lang w:val="es-ES"/>
+        </w:rPr>
+      </w:pPr>
+      <w:r>
+        <w:rPr>
+          <w:lang w:val="es-ES"/>
+        </w:rPr>
+        <w:t>ALCANCE (Geolocalización</w:t>
+      </w:r>
+      <w:proofErr w:type="gramStart"/>
+      <w:r>
+        <w:rPr>
+          <w:lang w:val="es-ES"/>
+        </w:rPr>
+        <w:t>) :</w:t>
+      </w:r>
+      <w:proofErr w:type="gramEnd"/>
+      <w:r>
+        <w:rPr>
+          <w:lang w:val="es-ES"/>
+        </w:rPr>
+        <w:t xml:space="preserve"> En Proceso de Negociación (CRF-001)</w:t>
+      </w:r>
+    </w:p>
+    <w:p>
+      <w:pPr>
+        <w:ind w:left="708"/>
+        <w:rPr>
+          <w:lang w:val="es-ES"/>
+        </w:rPr>
+      </w:pPr>
+      <w:r>
+        <w:rPr>
+          <w:lang w:val="es-ES"/>
+        </w:rPr>
+        <w:t>TIEMPO (</w:t>
+      </w:r>
+      <w:proofErr w:type="gramStart"/>
+      <w:r>
+        <w:rPr>
+          <w:lang w:val="es-ES"/>
+        </w:rPr>
+        <w:t xml:space="preserve">Cronograma)   </w:t>
+      </w:r>
+      <w:proofErr w:type="gramEnd"/>
+      <w:r>
+        <w:rPr>
+          <w:lang w:val="es-ES"/>
+        </w:rPr>
+        <w:t xml:space="preserve">    : SPI 0.93 (7% de retraso acumulado)</w:t>
+      </w:r>
+    </w:p>
+    <w:p>
+      <w:pPr>
+        <w:ind w:left="708"/>
+        <w:rPr>
+          <w:lang w:val="es-ES"/>
+        </w:rPr>
+      </w:pPr>
+      <w:r>
+        <w:rPr>
+          <w:lang w:val="es-ES"/>
+        </w:rPr>
+        <w:t>COSTO (</w:t>
+      </w:r>
+      <w:proofErr w:type="gramStart"/>
+      <w:r>
+        <w:rPr>
+          <w:lang w:val="es-ES"/>
+        </w:rPr>
+        <w:t xml:space="preserve">Presupuesto)   </w:t>
+      </w:r>
+      <w:proofErr w:type="gramEnd"/>
+      <w:r>
+        <w:rPr>
+          <w:lang w:val="es-ES"/>
+        </w:rPr>
+        <w:t xml:space="preserve">    : CPI 0.96 (Ajustado dentro de los 70,000 Bs)</w:t>
+      </w:r>
+    </w:p>
+    <w:p>
+      <w:pPr>
+        <w:ind w:left="708"/>
+        <w:rPr>
+          <w:lang w:val="es-ES"/>
+        </w:rPr>
+      </w:pPr>
+      <w:r>
+        <w:rPr>
+          <w:lang w:val="es-ES"/>
+        </w:rPr>
+        <w:t xml:space="preserve">RECURSOS HUMANOS        </w:t>
+      </w:r>
+      <w:proofErr w:type="gramStart"/>
+      <w:r>
+        <w:rPr>
+          <w:lang w:val="es-ES"/>
+        </w:rPr>
+        <w:t xml:space="preserve">  :</w:t>
+      </w:r>
+      <w:proofErr w:type="gramEnd"/>
+      <w:r>
+        <w:rPr>
+          <w:lang w:val="es-ES"/>
+        </w:rPr>
+        <w:t xml:space="preserve"> 2 Bajas Críticas (Contingencia Ejecutada)</w:t>
       </w:r>
     </w:p>
     <w:p>
@@ -16404,6 +18891,155 @@
     </w:lvl>
   </w:abstractNum>
   <w:abstractNum w:abstractNumId="12" w15:restartNumberingAfterBreak="0">
+    <w:nsid w:val="495B7061"/>
+    <w:multiLevelType w:val="multilevel"/>
+    <w:tmpl w:val="2850F8E2"/>
+    <w:lvl w:ilvl="0">
+      <w:start w:val="1"/>
+      <w:numFmt w:val="bullet"/>
+      <w:lvlText w:val=""/>
+      <w:lvlJc w:val="left"/>
+      <w:pPr>
+        <w:tabs>
+          <w:tab w:val="num" w:pos="720"/>
+        </w:tabs>
+        <w:ind w:left="720" w:hanging="360"/>
+      </w:pPr>
+      <w:rPr>
+        <w:rFonts w:ascii="Symbol" w:hAnsi="Symbol" w:hint="default"/>
+        <w:sz w:val="20"/>
+      </w:rPr>
+    </w:lvl>
+    <w:lvl w:ilvl="1">
+      <w:start w:val="1"/>
+      <w:numFmt w:val="bullet"/>
+      <w:lvlText w:val="o"/>
+      <w:lvlJc w:val="left"/>
+      <w:pPr>
+        <w:tabs>
+          <w:tab w:val="num" w:pos="1440"/>
+        </w:tabs>
+        <w:ind w:left="1440" w:hanging="360"/>
+      </w:pPr>
+      <w:rPr>
+        <w:rFonts w:ascii="Courier New" w:hAnsi="Courier New" w:hint="default"/>
+        <w:sz w:val="20"/>
+      </w:rPr>
+    </w:lvl>
+    <w:lvl w:ilvl="2" w:tentative="1">
+      <w:start w:val="1"/>
+      <w:numFmt w:val="bullet"/>
+      <w:lvlText w:val=""/>
+      <w:lvlJc w:val="left"/>
+      <w:pPr>
+        <w:tabs>
+          <w:tab w:val="num" w:pos="2160"/>
+        </w:tabs>
+        <w:ind w:left="2160" w:hanging="360"/>
+      </w:pPr>
+      <w:rPr>
+        <w:rFonts w:ascii="Wingdings" w:hAnsi="Wingdings" w:hint="default"/>
+        <w:sz w:val="20"/>
+      </w:rPr>
+    </w:lvl>
+    <w:lvl w:ilvl="3" w:tentative="1">
+      <w:start w:val="1"/>
+      <w:numFmt w:val="bullet"/>
+      <w:lvlText w:val=""/>
+      <w:lvlJc w:val="left"/>
+      <w:pPr>
+        <w:tabs>
+          <w:tab w:val="num" w:pos="2880"/>
+        </w:tabs>
+        <w:ind w:left="2880" w:hanging="360"/>
+      </w:pPr>
+      <w:rPr>
+        <w:rFonts w:ascii="Wingdings" w:hAnsi="Wingdings" w:hint="default"/>
+        <w:sz w:val="20"/>
+      </w:rPr>
+    </w:lvl>
+    <w:lvl w:ilvl="4" w:tentative="1">
+      <w:start w:val="1"/>
+      <w:numFmt w:val="bullet"/>
+      <w:lvlText w:val=""/>
+      <w:lvlJc w:val="left"/>
+      <w:pPr>
+        <w:tabs>
+          <w:tab w:val="num" w:pos="3600"/>
+        </w:tabs>
+        <w:ind w:left="3600" w:hanging="360"/>
+      </w:pPr>
+      <w:rPr>
+        <w:rFonts w:ascii="Wingdings" w:hAnsi="Wingdings" w:hint="default"/>
+        <w:sz w:val="20"/>
+      </w:rPr>
+    </w:lvl>
+    <w:lvl w:ilvl="5" w:tentative="1">
+      <w:start w:val="1"/>
+      <w:numFmt w:val="bullet"/>
+      <w:lvlText w:val=""/>
+      <w:lvlJc w:val="left"/>
+      <w:pPr>
+        <w:tabs>
+          <w:tab w:val="num" w:pos="4320"/>
+        </w:tabs>
+        <w:ind w:left="4320" w:hanging="360"/>
+      </w:pPr>
+      <w:rPr>
+        <w:rFonts w:ascii="Wingdings" w:hAnsi="Wingdings" w:hint="default"/>
+        <w:sz w:val="20"/>
+      </w:rPr>
+    </w:lvl>
+    <w:lvl w:ilvl="6" w:tentative="1">
+      <w:start w:val="1"/>
+      <w:numFmt w:val="bullet"/>
+      <w:lvlText w:val=""/>
+      <w:lvlJc w:val="left"/>
+      <w:pPr>
+        <w:tabs>
+          <w:tab w:val="num" w:pos="5040"/>
+        </w:tabs>
+        <w:ind w:left="5040" w:hanging="360"/>
+      </w:pPr>
+      <w:rPr>
+        <w:rFonts w:ascii="Wingdings" w:hAnsi="Wingdings" w:hint="default"/>
+        <w:sz w:val="20"/>
+      </w:rPr>
+    </w:lvl>
+    <w:lvl w:ilvl="7" w:tentative="1">
+      <w:start w:val="1"/>
+      <w:numFmt w:val="bullet"/>
+      <w:lvlText w:val=""/>
+      <w:lvlJc w:val="left"/>
+      <w:pPr>
+        <w:tabs>
+          <w:tab w:val="num" w:pos="5760"/>
+        </w:tabs>
+        <w:ind w:left="5760" w:hanging="360"/>
+      </w:pPr>
+      <w:rPr>
+        <w:rFonts w:ascii="Wingdings" w:hAnsi="Wingdings" w:hint="default"/>
+        <w:sz w:val="20"/>
+      </w:rPr>
+    </w:lvl>
+    <w:lvl w:ilvl="8" w:tentative="1">
+      <w:start w:val="1"/>
+      <w:numFmt w:val="bullet"/>
+      <w:lvlText w:val=""/>
+      <w:lvlJc w:val="left"/>
+      <w:pPr>
+        <w:tabs>
+          <w:tab w:val="num" w:pos="6480"/>
+        </w:tabs>
+        <w:ind w:left="6480" w:hanging="360"/>
+      </w:pPr>
+      <w:rPr>
+        <w:rFonts w:ascii="Wingdings" w:hAnsi="Wingdings" w:hint="default"/>
+        <w:sz w:val="20"/>
+      </w:rPr>
+    </w:lvl>
+  </w:abstractNum>
+  <w:abstractNum w:abstractNumId="13" w15:restartNumberingAfterBreak="0">
     <w:nsid w:val="50DF3A72"/>
     <w:multiLevelType w:val="multilevel"/>
     <w:tmpl w:val="66C2A37E"/>
@@ -16490,7 +19126,7 @@
       </w:pPr>
     </w:lvl>
   </w:abstractNum>
-  <w:abstractNum w:abstractNumId="13" w15:restartNumberingAfterBreak="0">
+  <w:abstractNum w:abstractNumId="14" w15:restartNumberingAfterBreak="0">
     <w:nsid w:val="53790B1E"/>
     <w:multiLevelType w:val="hybridMultilevel"/>
     <w:tmpl w:val="7A06AD96"/>
@@ -16603,7 +19239,156 @@
       </w:rPr>
     </w:lvl>
   </w:abstractNum>
-  <w:abstractNum w:abstractNumId="14" w15:restartNumberingAfterBreak="0">
+  <w:abstractNum w:abstractNumId="15" w15:restartNumberingAfterBreak="0">
+    <w:nsid w:val="60F26A67"/>
+    <w:multiLevelType w:val="multilevel"/>
+    <w:tmpl w:val="89307AC4"/>
+    <w:lvl w:ilvl="0">
+      <w:start w:val="1"/>
+      <w:numFmt w:val="bullet"/>
+      <w:lvlText w:val=""/>
+      <w:lvlJc w:val="left"/>
+      <w:pPr>
+        <w:tabs>
+          <w:tab w:val="num" w:pos="720"/>
+        </w:tabs>
+        <w:ind w:left="720" w:hanging="360"/>
+      </w:pPr>
+      <w:rPr>
+        <w:rFonts w:ascii="Symbol" w:hAnsi="Symbol" w:hint="default"/>
+        <w:sz w:val="20"/>
+      </w:rPr>
+    </w:lvl>
+    <w:lvl w:ilvl="1" w:tentative="1">
+      <w:start w:val="1"/>
+      <w:numFmt w:val="bullet"/>
+      <w:lvlText w:val="o"/>
+      <w:lvlJc w:val="left"/>
+      <w:pPr>
+        <w:tabs>
+          <w:tab w:val="num" w:pos="1440"/>
+        </w:tabs>
+        <w:ind w:left="1440" w:hanging="360"/>
+      </w:pPr>
+      <w:rPr>
+        <w:rFonts w:ascii="Courier New" w:hAnsi="Courier New" w:hint="default"/>
+        <w:sz w:val="20"/>
+      </w:rPr>
+    </w:lvl>
+    <w:lvl w:ilvl="2" w:tentative="1">
+      <w:start w:val="1"/>
+      <w:numFmt w:val="bullet"/>
+      <w:lvlText w:val=""/>
+      <w:lvlJc w:val="left"/>
+      <w:pPr>
+        <w:tabs>
+          <w:tab w:val="num" w:pos="2160"/>
+        </w:tabs>
+        <w:ind w:left="2160" w:hanging="360"/>
+      </w:pPr>
+      <w:rPr>
+        <w:rFonts w:ascii="Wingdings" w:hAnsi="Wingdings" w:hint="default"/>
+        <w:sz w:val="20"/>
+      </w:rPr>
+    </w:lvl>
+    <w:lvl w:ilvl="3" w:tentative="1">
+      <w:start w:val="1"/>
+      <w:numFmt w:val="bullet"/>
+      <w:lvlText w:val=""/>
+      <w:lvlJc w:val="left"/>
+      <w:pPr>
+        <w:tabs>
+          <w:tab w:val="num" w:pos="2880"/>
+        </w:tabs>
+        <w:ind w:left="2880" w:hanging="360"/>
+      </w:pPr>
+      <w:rPr>
+        <w:rFonts w:ascii="Wingdings" w:hAnsi="Wingdings" w:hint="default"/>
+        <w:sz w:val="20"/>
+      </w:rPr>
+    </w:lvl>
+    <w:lvl w:ilvl="4" w:tentative="1">
+      <w:start w:val="1"/>
+      <w:numFmt w:val="bullet"/>
+      <w:lvlText w:val=""/>
+      <w:lvlJc w:val="left"/>
+      <w:pPr>
+        <w:tabs>
+          <w:tab w:val="num" w:pos="3600"/>
+        </w:tabs>
+        <w:ind w:left="3600" w:hanging="360"/>
+      </w:pPr>
+      <w:rPr>
+        <w:rFonts w:ascii="Wingdings" w:hAnsi="Wingdings" w:hint="default"/>
+        <w:sz w:val="20"/>
+      </w:rPr>
+    </w:lvl>
+    <w:lvl w:ilvl="5" w:tentative="1">
+      <w:start w:val="1"/>
+      <w:numFmt w:val="bullet"/>
+      <w:lvlText w:val=""/>
+      <w:lvlJc w:val="left"/>
+      <w:pPr>
+        <w:tabs>
+          <w:tab w:val="num" w:pos="4320"/>
+        </w:tabs>
+        <w:ind w:left="4320" w:hanging="360"/>
+      </w:pPr>
+      <w:rPr>
+        <w:rFonts w:ascii="Wingdings" w:hAnsi="Wingdings" w:hint="default"/>
+        <w:sz w:val="20"/>
+      </w:rPr>
+    </w:lvl>
+    <w:lvl w:ilvl="6" w:tentative="1">
+      <w:start w:val="1"/>
+      <w:numFmt w:val="bullet"/>
+      <w:lvlText w:val=""/>
+      <w:lvlJc w:val="left"/>
+      <w:pPr>
+        <w:tabs>
+          <w:tab w:val="num" w:pos="5040"/>
+        </w:tabs>
+        <w:ind w:left="5040" w:hanging="360"/>
+      </w:pPr>
+      <w:rPr>
+        <w:rFonts w:ascii="Wingdings" w:hAnsi="Wingdings" w:hint="default"/>
+        <w:sz w:val="20"/>
+      </w:rPr>
+    </w:lvl>
+    <w:lvl w:ilvl="7" w:tentative="1">
+      <w:start w:val="1"/>
+      <w:numFmt w:val="bullet"/>
+      <w:lvlText w:val=""/>
+      <w:lvlJc w:val="left"/>
+      <w:pPr>
+        <w:tabs>
+          <w:tab w:val="num" w:pos="5760"/>
+        </w:tabs>
+        <w:ind w:left="5760" w:hanging="360"/>
+      </w:pPr>
+      <w:rPr>
+        <w:rFonts w:ascii="Wingdings" w:hAnsi="Wingdings" w:hint="default"/>
+        <w:sz w:val="20"/>
+      </w:rPr>
+    </w:lvl>
+    <w:lvl w:ilvl="8" w:tentative="1">
+      <w:start w:val="1"/>
+      <w:numFmt w:val="bullet"/>
+      <w:lvlText w:val=""/>
+      <w:lvlJc w:val="left"/>
+      <w:pPr>
+        <w:tabs>
+          <w:tab w:val="num" w:pos="6480"/>
+        </w:tabs>
+        <w:ind w:left="6480" w:hanging="360"/>
+      </w:pPr>
+      <w:rPr>
+        <w:rFonts w:ascii="Wingdings" w:hAnsi="Wingdings" w:hint="default"/>
+        <w:sz w:val="20"/>
+      </w:rPr>
+    </w:lvl>
+  </w:abstractNum>
+  <w:abstractNum w:abstractNumId="16" w15:restartNumberingAfterBreak="0">
     <w:nsid w:val="65FE7B33"/>
     <w:multiLevelType w:val="multilevel"/>
     <w:tmpl w:val="19F407F2"/>
@@ -16748,7 +19533,7 @@
       </w:rPr>
     </w:lvl>
   </w:abstractNum>
-  <w:abstractNum w:abstractNumId="15" w15:restartNumberingAfterBreak="0">
+  <w:abstractNum w:abstractNumId="17" w15:restartNumberingAfterBreak="0">
     <w:nsid w:val="66824B31"/>
     <w:multiLevelType w:val="hybridMultilevel"/>
     <w:tmpl w:val="FB76797A"/>
@@ -16834,7 +19619,7 @@
       </w:pPr>
     </w:lvl>
   </w:abstractNum>
-  <w:abstractNum w:abstractNumId="16" w15:restartNumberingAfterBreak="0">
+  <w:abstractNum w:abstractNumId="18" w15:restartNumberingAfterBreak="0">
     <w:nsid w:val="675D26CC"/>
     <w:multiLevelType w:val="multilevel"/>
     <w:tmpl w:val="4C4C901C"/>
@@ -16983,7 +19768,7 @@
       </w:rPr>
     </w:lvl>
   </w:abstractNum>
-  <w:abstractNum w:abstractNumId="17" w15:restartNumberingAfterBreak="0">
+  <w:abstractNum w:abstractNumId="19" w15:restartNumberingAfterBreak="0">
     <w:nsid w:val="6A405E4F"/>
     <w:multiLevelType w:val="multilevel"/>
     <w:tmpl w:val="19F407F2"/>
@@ -17096,7 +19881,7 @@
       </w:pPr>
     </w:lvl>
   </w:abstractNum>
-  <w:abstractNum w:abstractNumId="18" w15:restartNumberingAfterBreak="0">
+  <w:abstractNum w:abstractNumId="20" w15:restartNumberingAfterBreak="0">
     <w:nsid w:val="6D9E2373"/>
     <w:multiLevelType w:val="multilevel"/>
     <w:tmpl w:val="7798721C"/>
@@ -17245,7 +20030,7 @@
       </w:rPr>
     </w:lvl>
   </w:abstractNum>
-  <w:abstractNum w:abstractNumId="19" w15:restartNumberingAfterBreak="0">
+  <w:abstractNum w:abstractNumId="21" w15:restartNumberingAfterBreak="0">
     <w:nsid w:val="7CB5752A"/>
     <w:multiLevelType w:val="hybridMultilevel"/>
     <w:tmpl w:val="3E8855C0"/>
@@ -17358,7 +20143,7 @@
       </w:rPr>
     </w:lvl>
   </w:abstractNum>
-  <w:abstractNum w:abstractNumId="20" w15:restartNumberingAfterBreak="0">
+  <w:abstractNum w:abstractNumId="22" w15:restartNumberingAfterBreak="0">
     <w:nsid w:val="7D905054"/>
     <w:multiLevelType w:val="hybridMultilevel"/>
     <w:tmpl w:val="9CB40FDE"/>
@@ -17471,7 +20256,7 @@
       </w:rPr>
     </w:lvl>
   </w:abstractNum>
-  <w:abstractNum w:abstractNumId="21" w15:restartNumberingAfterBreak="0">
+  <w:abstractNum w:abstractNumId="23" w15:restartNumberingAfterBreak="0">
     <w:nsid w:val="7E764224"/>
     <w:multiLevelType w:val="multilevel"/>
     <w:tmpl w:val="5248F0BA"/>
@@ -17624,7 +20409,7 @@
     <w:abstractNumId w:val="0"/>
   </w:num>
   <w:num w:numId="2">
-    <w:abstractNumId w:val="12"/>
+    <w:abstractNumId w:val="13"/>
     <w:lvlOverride w:ilvl="0">
       <w:startOverride w:val="1"/>
     </w:lvlOverride>
@@ -17687,7 +20472,7 @@
     <w:abstractNumId w:val="8"/>
   </w:num>
   <w:num w:numId="5">
-    <w:abstractNumId w:val="18"/>
+    <w:abstractNumId w:val="20"/>
   </w:num>
   <w:num w:numId="6">
     <w:abstractNumId w:val="4"/>
@@ -17699,37 +20484,37 @@
     <w:abstractNumId w:val="11"/>
   </w:num>
   <w:num w:numId="9">
-    <w:abstractNumId w:val="19"/>
+    <w:abstractNumId w:val="21"/>
   </w:num>
   <w:num w:numId="10">
     <w:abstractNumId w:val="9"/>
   </w:num>
   <w:num w:numId="11">
-    <w:abstractNumId w:val="21"/>
+    <w:abstractNumId w:val="23"/>
   </w:num>
   <w:num w:numId="12">
     <w:abstractNumId w:val="10"/>
   </w:num>
   <w:num w:numId="13">
-    <w:abstractNumId w:val="13"/>
+    <w:abstractNumId w:val="14"/>
   </w:num>
   <w:num w:numId="14">
     <w:abstractNumId w:val="3"/>
   </w:num>
   <w:num w:numId="15">
-    <w:abstractNumId w:val="20"/>
+    <w:abstractNumId w:val="22"/>
   </w:num>
   <w:num w:numId="16">
     <w:abstractNumId w:val="7"/>
   </w:num>
   <w:num w:numId="17">
-    <w:abstractNumId w:val="15"/>
+    <w:abstractNumId w:val="17"/>
   </w:num>
   <w:num w:numId="18">
-    <w:abstractNumId w:val="14"/>
+    <w:abstractNumId w:val="16"/>
   </w:num>
   <w:num w:numId="19">
-    <w:abstractNumId w:val="16"/>
+    <w:abstractNumId w:val="18"/>
   </w:num>
   <w:num w:numId="20">
     <w:abstractNumId w:val="2"/>
@@ -17738,9 +20523,15 @@
     <w:abstractNumId w:val="5"/>
   </w:num>
   <w:num w:numId="22">
-    <w:abstractNumId w:val="17"/>
+    <w:abstractNumId w:val="19"/>
   </w:num>
-  <w:numIdMacAtCleanup w:val="22"/>
+  <w:num w:numId="23">
+    <w:abstractNumId w:val="12"/>
+  </w:num>
+  <w:num w:numId="24">
+    <w:abstractNumId w:val="15"/>
+  </w:num>
+  <w:numIdMacAtCleanup w:val="24"/>
 </w:numbering>
 </file>
 

</xml_diff>